<commit_message>
end of régression linéaire simple course
</commit_message>
<xml_diff>
--- a/Plan.docx
+++ b/Plan.docx
@@ -1970,7 +1970,7 @@
           <w:kern w:val="0"/>
           <w:sz w:val="27"/>
           <w:szCs w:val="27"/>
-          <w:lang w:eastAsia="fr-FR"/>
+          <w:lang w:val="en-US" w:eastAsia="fr-FR"/>
           <w14:ligatures w14:val="none"/>
         </w:rPr>
       </w:pPr>
@@ -1982,13 +1982,11 @@
           <w:kern w:val="0"/>
           <w:sz w:val="27"/>
           <w:szCs w:val="27"/>
-          <w:lang w:eastAsia="fr-FR"/>
-          <w14:ligatures w14:val="none"/>
-        </w:rPr>
-        <w:lastRenderedPageBreak/>
-        <w:t>Days 26–</w:t>
-      </w:r>
-      <w:proofErr w:type="gramStart"/>
+          <w:lang w:val="en-US" w:eastAsia="fr-FR"/>
+          <w14:ligatures w14:val="none"/>
+        </w:rPr>
+        <w:t>Days 26–30: Linear Regression</w:t>
+      </w:r>
       <w:r>
         <w:rPr>
           <w:rFonts w:ascii="Times New Roman" w:eastAsia="Times New Roman" w:hAnsi="Times New Roman" w:cs="Times New Roman"/>
@@ -1997,12 +1995,11 @@
           <w:kern w:val="0"/>
           <w:sz w:val="27"/>
           <w:szCs w:val="27"/>
-          <w:lang w:eastAsia="fr-FR"/>
-          <w14:ligatures w14:val="none"/>
-        </w:rPr>
-        <w:t>30:</w:t>
-      </w:r>
-      <w:proofErr w:type="gramEnd"/>
+          <w:lang w:val="en-US" w:eastAsia="fr-FR"/>
+          <w14:ligatures w14:val="none"/>
+        </w:rPr>
+        <w:t xml:space="preserve"> Simple a</w:t>
+      </w:r>
       <w:r>
         <w:rPr>
           <w:rFonts w:ascii="Times New Roman" w:eastAsia="Times New Roman" w:hAnsi="Times New Roman" w:cs="Times New Roman"/>
@@ -2011,54 +2008,11 @@
           <w:kern w:val="0"/>
           <w:sz w:val="27"/>
           <w:szCs w:val="27"/>
-          <w:lang w:eastAsia="fr-FR"/>
-          <w14:ligatures w14:val="none"/>
-        </w:rPr>
-        <w:t xml:space="preserve"> </w:t>
-      </w:r>
-      <w:proofErr w:type="spellStart"/>
-      <w:r>
-        <w:rPr>
-          <w:rFonts w:ascii="Times New Roman" w:eastAsia="Times New Roman" w:hAnsi="Times New Roman" w:cs="Times New Roman"/>
-          <w:b/>
-          <w:bCs/>
-          <w:kern w:val="0"/>
-          <w:sz w:val="27"/>
-          <w:szCs w:val="27"/>
-          <w:lang w:eastAsia="fr-FR"/>
-          <w14:ligatures w14:val="none"/>
-        </w:rPr>
-        <w:t>Linear</w:t>
-      </w:r>
-      <w:proofErr w:type="spellEnd"/>
-      <w:r>
-        <w:rPr>
-          <w:rFonts w:ascii="Times New Roman" w:eastAsia="Times New Roman" w:hAnsi="Times New Roman" w:cs="Times New Roman"/>
-          <w:b/>
-          <w:bCs/>
-          <w:kern w:val="0"/>
-          <w:sz w:val="27"/>
-          <w:szCs w:val="27"/>
-          <w:lang w:eastAsia="fr-FR"/>
-          <w14:ligatures w14:val="none"/>
-        </w:rPr>
-        <w:t xml:space="preserve"> </w:t>
-      </w:r>
-      <w:proofErr w:type="spellStart"/>
-      <w:r>
-        <w:rPr>
-          <w:rFonts w:ascii="Times New Roman" w:eastAsia="Times New Roman" w:hAnsi="Times New Roman" w:cs="Times New Roman"/>
-          <w:b/>
-          <w:bCs/>
-          <w:kern w:val="0"/>
-          <w:sz w:val="27"/>
-          <w:szCs w:val="27"/>
-          <w:lang w:eastAsia="fr-FR"/>
-          <w14:ligatures w14:val="none"/>
-        </w:rPr>
-        <w:t>Regression</w:t>
-      </w:r>
-      <w:proofErr w:type="spellEnd"/>
+          <w:lang w:val="en-US" w:eastAsia="fr-FR"/>
+          <w14:ligatures w14:val="none"/>
+        </w:rPr>
+        <w:t>nd Multiple</w:t>
+      </w:r>
     </w:p>
     <w:p>
       <w:pPr>
@@ -2072,16 +2026,119 @@
           <w:kern w:val="0"/>
           <w:sz w:val="24"/>
           <w:szCs w:val="24"/>
-          <w:lang w:val="en-US" w:eastAsia="fr-FR"/>
-          <w14:ligatures w14:val="none"/>
-        </w:rPr>
-      </w:pPr>
-      <w:r>
-        <w:rPr>
-          <w:rFonts w:ascii="Times New Roman" w:eastAsia="Times New Roman" w:hAnsi="Times New Roman" w:cs="Times New Roman"/>
-          <w:kern w:val="0"/>
-          <w:sz w:val="24"/>
-          <w:szCs w:val="24"/>
+          <w:highlight w:val="yellow"/>
+          <w:lang w:val="en-US" w:eastAsia="fr-FR"/>
+          <w14:ligatures w14:val="none"/>
+        </w:rPr>
+      </w:pPr>
+      <w:r>
+        <w:rPr>
+          <w:rFonts w:ascii="Times New Roman" w:eastAsia="Times New Roman" w:hAnsi="Times New Roman" w:cs="Times New Roman"/>
+          <w:b/>
+          <w:bCs/>
+          <w:noProof/>
+          <w:kern w:val="0"/>
+          <w:sz w:val="27"/>
+          <w:szCs w:val="27"/>
+          <w:lang w:val="en-US" w:eastAsia="fr-FR"/>
+        </w:rPr>
+        <mc:AlternateContent>
+          <mc:Choice Requires="wps">
+            <w:drawing>
+              <wp:anchor distT="0" distB="0" distL="114300" distR="114300" simplePos="0" relativeHeight="251659264" behindDoc="0" locked="0" layoutInCell="1" allowOverlap="1" wp14:anchorId="345F8495" wp14:editId="59A82F61">
+                <wp:simplePos x="0" y="0"/>
+                <wp:positionH relativeFrom="column">
+                  <wp:posOffset>3621405</wp:posOffset>
+                </wp:positionH>
+                <wp:positionV relativeFrom="paragraph">
+                  <wp:posOffset>7620</wp:posOffset>
+                </wp:positionV>
+                <wp:extent cx="247650" cy="908050"/>
+                <wp:effectExtent l="0" t="19050" r="19050" b="25400"/>
+                <wp:wrapNone/>
+                <wp:docPr id="713875041" name="Accolade ouvrante 1"/>
+                <wp:cNvGraphicFramePr/>
+                <a:graphic xmlns:a="http://schemas.openxmlformats.org/drawingml/2006/main">
+                  <a:graphicData uri="http://schemas.microsoft.com/office/word/2010/wordprocessingShape">
+                    <wps:wsp>
+                      <wps:cNvSpPr/>
+                      <wps:spPr>
+                        <a:xfrm rot="10800000">
+                          <a:off x="0" y="0"/>
+                          <a:ext cx="247650" cy="908050"/>
+                        </a:xfrm>
+                        <a:prstGeom prst="leftBrace">
+                          <a:avLst/>
+                        </a:prstGeom>
+                        <a:ln w="28575">
+                          <a:solidFill>
+                            <a:srgbClr val="EE0000"/>
+                          </a:solidFill>
+                        </a:ln>
+                      </wps:spPr>
+                      <wps:style>
+                        <a:lnRef idx="1">
+                          <a:schemeClr val="accent1"/>
+                        </a:lnRef>
+                        <a:fillRef idx="0">
+                          <a:schemeClr val="accent1"/>
+                        </a:fillRef>
+                        <a:effectRef idx="0">
+                          <a:schemeClr val="accent1"/>
+                        </a:effectRef>
+                        <a:fontRef idx="minor">
+                          <a:schemeClr val="tx1"/>
+                        </a:fontRef>
+                      </wps:style>
+                      <wps:bodyPr rot="0" spcFirstLastPara="0" vertOverflow="overflow" horzOverflow="overflow" vert="horz" wrap="square" lIns="91440" tIns="45720" rIns="91440" bIns="45720" numCol="1" spcCol="0" rtlCol="0" fromWordArt="0" anchor="ctr" anchorCtr="0" forceAA="0" compatLnSpc="1">
+                        <a:prstTxWarp prst="textNoShape">
+                          <a:avLst/>
+                        </a:prstTxWarp>
+                        <a:noAutofit/>
+                      </wps:bodyPr>
+                    </wps:wsp>
+                  </a:graphicData>
+                </a:graphic>
+              </wp:anchor>
+            </w:drawing>
+          </mc:Choice>
+          <mc:Fallback>
+            <w:pict>
+              <v:shapetype w14:anchorId="74D4BD47" id="_x0000_t87" coordsize="21600,21600" o:spt="87" adj="1800,10800" path="m21600,qx10800@0l10800@2qy0@11,10800@3l10800@1qy21600,21600e" filled="f">
+                <v:formulas>
+                  <v:f eqn="val #0"/>
+                  <v:f eqn="sum 21600 0 #0"/>
+                  <v:f eqn="sum #1 0 #0"/>
+                  <v:f eqn="sum #1 #0 0"/>
+                  <v:f eqn="prod #0 9598 32768"/>
+                  <v:f eqn="sum 21600 0 @4"/>
+                  <v:f eqn="sum 21600 0 #1"/>
+                  <v:f eqn="min #1 @6"/>
+                  <v:f eqn="prod @7 1 2"/>
+                  <v:f eqn="prod #0 2 1"/>
+                  <v:f eqn="sum 21600 0 @9"/>
+                  <v:f eqn="val #1"/>
+                </v:formulas>
+                <v:path arrowok="t" o:connecttype="custom" o:connectlocs="21600,0;0,10800;21600,21600" textboxrect="13963,@4,21600,@5"/>
+                <v:handles>
+                  <v:h position="center,#0" yrange="0,@8"/>
+                  <v:h position="topLeft,#1" yrange="@9,@10"/>
+                </v:handles>
+              </v:shapetype>
+              <v:shape id="Accolade ouvrante 1" o:spid="_x0000_s1026" type="#_x0000_t87" style="position:absolute;margin-left:285.15pt;margin-top:.6pt;width:19.5pt;height:71.5pt;rotation:180;z-index:251659264;visibility:visible;mso-wrap-style:square;mso-wrap-distance-left:9pt;mso-wrap-distance-top:0;mso-wrap-distance-right:9pt;mso-wrap-distance-bottom:0;mso-position-horizontal:absolute;mso-position-horizontal-relative:text;mso-position-vertical:absolute;mso-position-vertical-relative:text;v-text-anchor:middle" o:gfxdata="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" adj="491" strokecolor="#e00" strokeweight="2.25pt">
+                <v:stroke joinstyle="miter"/>
+              </v:shape>
+            </w:pict>
+          </mc:Fallback>
+        </mc:AlternateContent>
+      </w:r>
+      <w:r>
+        <w:rPr>
+          <w:rFonts w:ascii="Times New Roman" w:eastAsia="Times New Roman" w:hAnsi="Times New Roman" w:cs="Times New Roman"/>
+          <w:kern w:val="0"/>
+          <w:sz w:val="24"/>
+          <w:szCs w:val="24"/>
+          <w:highlight w:val="yellow"/>
           <w:lang w:val="en-US" w:eastAsia="fr-FR"/>
           <w14:ligatures w14:val="none"/>
         </w:rPr>
@@ -2107,6 +2164,102 @@
       <w:r>
         <w:rPr>
           <w:rFonts w:ascii="Times New Roman" w:eastAsia="Times New Roman" w:hAnsi="Times New Roman" w:cs="Times New Roman"/>
+          <w:noProof/>
+          <w:kern w:val="0"/>
+          <w:sz w:val="24"/>
+          <w:szCs w:val="24"/>
+          <w:lang w:eastAsia="fr-FR"/>
+        </w:rPr>
+        <mc:AlternateContent>
+          <mc:Choice Requires="wps">
+            <w:drawing>
+              <wp:anchor distT="0" distB="0" distL="114300" distR="114300" simplePos="0" relativeHeight="251660288" behindDoc="0" locked="0" layoutInCell="1" allowOverlap="1" wp14:anchorId="022FBBED" wp14:editId="3BA1453B">
+                <wp:simplePos x="0" y="0"/>
+                <wp:positionH relativeFrom="column">
+                  <wp:posOffset>4205605</wp:posOffset>
+                </wp:positionH>
+                <wp:positionV relativeFrom="paragraph">
+                  <wp:posOffset>67945</wp:posOffset>
+                </wp:positionV>
+                <wp:extent cx="2044700" cy="463550"/>
+                <wp:effectExtent l="0" t="0" r="12700" b="12700"/>
+                <wp:wrapNone/>
+                <wp:docPr id="10017642" name="Rectangle 2"/>
+                <wp:cNvGraphicFramePr/>
+                <a:graphic xmlns:a="http://schemas.openxmlformats.org/drawingml/2006/main">
+                  <a:graphicData uri="http://schemas.microsoft.com/office/word/2010/wordprocessingShape">
+                    <wps:wsp>
+                      <wps:cNvSpPr/>
+                      <wps:spPr>
+                        <a:xfrm>
+                          <a:off x="0" y="0"/>
+                          <a:ext cx="2044700" cy="463550"/>
+                        </a:xfrm>
+                        <a:prstGeom prst="rect">
+                          <a:avLst/>
+                        </a:prstGeom>
+                      </wps:spPr>
+                      <wps:style>
+                        <a:lnRef idx="2">
+                          <a:schemeClr val="accent6"/>
+                        </a:lnRef>
+                        <a:fillRef idx="1">
+                          <a:schemeClr val="lt1"/>
+                        </a:fillRef>
+                        <a:effectRef idx="0">
+                          <a:schemeClr val="accent6"/>
+                        </a:effectRef>
+                        <a:fontRef idx="minor">
+                          <a:schemeClr val="dk1"/>
+                        </a:fontRef>
+                      </wps:style>
+                      <wps:txbx>
+                        <w:txbxContent>
+                          <w:p>
+                            <w:pPr>
+                              <w:jc w:val="center"/>
+                            </w:pPr>
+                            <w:r>
+                              <w:t>Régression simple</w:t>
+                            </w:r>
+                          </w:p>
+                        </w:txbxContent>
+                      </wps:txbx>
+                      <wps:bodyPr rot="0" spcFirstLastPara="0" vertOverflow="overflow" horzOverflow="overflow" vert="horz" wrap="square" lIns="91440" tIns="45720" rIns="91440" bIns="45720" numCol="1" spcCol="0" rtlCol="0" fromWordArt="0" anchor="ctr" anchorCtr="0" forceAA="0" compatLnSpc="1">
+                        <a:prstTxWarp prst="textNoShape">
+                          <a:avLst/>
+                        </a:prstTxWarp>
+                        <a:noAutofit/>
+                      </wps:bodyPr>
+                    </wps:wsp>
+                  </a:graphicData>
+                </a:graphic>
+              </wp:anchor>
+            </w:drawing>
+          </mc:Choice>
+          <mc:Fallback>
+            <w:pict>
+              <v:rect w14:anchorId="022FBBED" id="Rectangle 2" o:spid="_x0000_s1026" style="position:absolute;left:0;text-align:left;margin-left:331.15pt;margin-top:5.35pt;width:161pt;height:36.5pt;z-index:251660288;visibility:visible;mso-wrap-style:square;mso-wrap-distance-left:9pt;mso-wrap-distance-top:0;mso-wrap-distance-right:9pt;mso-wrap-distance-bottom:0;mso-position-horizontal:absolute;mso-position-horizontal-relative:text;mso-position-vertical:absolute;mso-position-vertical-relative:text;v-text-anchor:middle" o:gfxdata="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" fillcolor="white [3201]" strokecolor="#70ad47 [3209]" strokeweight="1pt">
+                <v:textbox>
+                  <w:txbxContent>
+                    <w:p>
+                      <w:pPr>
+                        <w:jc w:val="center"/>
+                      </w:pPr>
+                      <w:r>
+                        <w:t>Régression simple</w:t>
+                      </w:r>
+                    </w:p>
+                  </w:txbxContent>
+                </v:textbox>
+              </v:rect>
+            </w:pict>
+          </mc:Fallback>
+        </mc:AlternateContent>
+      </w:r>
+      <w:r>
+        <w:rPr>
+          <w:rFonts w:ascii="Times New Roman" w:eastAsia="Times New Roman" w:hAnsi="Times New Roman" w:cs="Times New Roman"/>
           <w:kern w:val="0"/>
           <w:sz w:val="24"/>
           <w:szCs w:val="24"/>
@@ -2128,92 +2281,22 @@
           <w:kern w:val="0"/>
           <w:sz w:val="24"/>
           <w:szCs w:val="24"/>
-          <w:lang w:eastAsia="fr-FR"/>
-          <w14:ligatures w14:val="none"/>
-        </w:rPr>
-      </w:pPr>
-      <w:r>
-        <w:rPr>
-          <w:rFonts w:ascii="Times New Roman" w:eastAsia="Times New Roman" w:hAnsi="Times New Roman" w:cs="Times New Roman"/>
-          <w:kern w:val="0"/>
-          <w:sz w:val="24"/>
-          <w:szCs w:val="24"/>
-          <w:lang w:eastAsia="fr-FR"/>
-          <w14:ligatures w14:val="none"/>
-        </w:rPr>
-        <w:t xml:space="preserve">Day </w:t>
-      </w:r>
-      <w:proofErr w:type="gramStart"/>
-      <w:r>
-        <w:rPr>
-          <w:rFonts w:ascii="Times New Roman" w:eastAsia="Times New Roman" w:hAnsi="Times New Roman" w:cs="Times New Roman"/>
-          <w:kern w:val="0"/>
-          <w:sz w:val="24"/>
-          <w:szCs w:val="24"/>
-          <w:lang w:eastAsia="fr-FR"/>
-          <w14:ligatures w14:val="none"/>
-        </w:rPr>
-        <w:t>28:</w:t>
-      </w:r>
-      <w:proofErr w:type="gramEnd"/>
-      <w:r>
-        <w:rPr>
-          <w:rFonts w:ascii="Times New Roman" w:eastAsia="Times New Roman" w:hAnsi="Times New Roman" w:cs="Times New Roman"/>
-          <w:kern w:val="0"/>
-          <w:sz w:val="24"/>
-          <w:szCs w:val="24"/>
-          <w:lang w:eastAsia="fr-FR"/>
-          <w14:ligatures w14:val="none"/>
-        </w:rPr>
-        <w:t xml:space="preserve"> </w:t>
-      </w:r>
-      <w:proofErr w:type="spellStart"/>
-      <w:r>
-        <w:rPr>
-          <w:rFonts w:ascii="Times New Roman" w:eastAsia="Times New Roman" w:hAnsi="Times New Roman" w:cs="Times New Roman"/>
-          <w:kern w:val="0"/>
-          <w:sz w:val="24"/>
-          <w:szCs w:val="24"/>
-          <w:lang w:eastAsia="fr-FR"/>
-          <w14:ligatures w14:val="none"/>
-        </w:rPr>
-        <w:t>Scikit</w:t>
-      </w:r>
-      <w:proofErr w:type="spellEnd"/>
-      <w:r>
-        <w:rPr>
-          <w:rFonts w:ascii="Times New Roman" w:eastAsia="Times New Roman" w:hAnsi="Times New Roman" w:cs="Times New Roman"/>
-          <w:kern w:val="0"/>
-          <w:sz w:val="24"/>
-          <w:szCs w:val="24"/>
-          <w:lang w:eastAsia="fr-FR"/>
-          <w14:ligatures w14:val="none"/>
-        </w:rPr>
-        <w:t xml:space="preserve">-learn </w:t>
-      </w:r>
-      <w:proofErr w:type="spellStart"/>
-      <w:r>
-        <w:rPr>
-          <w:rFonts w:ascii="Times New Roman" w:eastAsia="Times New Roman" w:hAnsi="Times New Roman" w:cs="Times New Roman"/>
-          <w:kern w:val="0"/>
-          <w:sz w:val="24"/>
-          <w:szCs w:val="24"/>
-          <w:lang w:eastAsia="fr-FR"/>
-          <w14:ligatures w14:val="none"/>
-        </w:rPr>
-        <w:t>regression</w:t>
-      </w:r>
-      <w:proofErr w:type="spellEnd"/>
-      <w:r>
-        <w:rPr>
-          <w:rFonts w:ascii="Times New Roman" w:eastAsia="Times New Roman" w:hAnsi="Times New Roman" w:cs="Times New Roman"/>
-          <w:kern w:val="0"/>
-          <w:sz w:val="24"/>
-          <w:szCs w:val="24"/>
-          <w:lang w:eastAsia="fr-FR"/>
-          <w14:ligatures w14:val="none"/>
-        </w:rPr>
-        <w:t xml:space="preserve"> model</w:t>
+          <w:highlight w:val="yellow"/>
+          <w:lang w:val="en-US" w:eastAsia="fr-FR"/>
+          <w14:ligatures w14:val="none"/>
+        </w:rPr>
+      </w:pPr>
+      <w:r>
+        <w:rPr>
+          <w:rFonts w:ascii="Times New Roman" w:eastAsia="Times New Roman" w:hAnsi="Times New Roman" w:cs="Times New Roman"/>
+          <w:kern w:val="0"/>
+          <w:sz w:val="24"/>
+          <w:szCs w:val="24"/>
+          <w:highlight w:val="yellow"/>
+          <w:lang w:val="en-US" w:eastAsia="fr-FR"/>
+          <w14:ligatures w14:val="none"/>
+        </w:rPr>
+        <w:t>Day 28: Scikit-learn regression model</w:t>
       </w:r>
     </w:p>
     <w:p>
@@ -2228,16 +2311,18 @@
           <w:kern w:val="0"/>
           <w:sz w:val="24"/>
           <w:szCs w:val="24"/>
-          <w:lang w:val="en-US" w:eastAsia="fr-FR"/>
-          <w14:ligatures w14:val="none"/>
-        </w:rPr>
-      </w:pPr>
-      <w:r>
-        <w:rPr>
-          <w:rFonts w:ascii="Times New Roman" w:eastAsia="Times New Roman" w:hAnsi="Times New Roman" w:cs="Times New Roman"/>
-          <w:kern w:val="0"/>
-          <w:sz w:val="24"/>
-          <w:szCs w:val="24"/>
+          <w:highlight w:val="yellow"/>
+          <w:lang w:val="en-US" w:eastAsia="fr-FR"/>
+          <w14:ligatures w14:val="none"/>
+        </w:rPr>
+      </w:pPr>
+      <w:r>
+        <w:rPr>
+          <w:rFonts w:ascii="Times New Roman" w:eastAsia="Times New Roman" w:hAnsi="Times New Roman" w:cs="Times New Roman"/>
+          <w:kern w:val="0"/>
+          <w:sz w:val="24"/>
+          <w:szCs w:val="24"/>
+          <w:highlight w:val="yellow"/>
           <w:lang w:val="en-US" w:eastAsia="fr-FR"/>
           <w14:ligatures w14:val="none"/>
         </w:rPr>
@@ -2256,16 +2341,18 @@
           <w:kern w:val="0"/>
           <w:sz w:val="24"/>
           <w:szCs w:val="24"/>
-          <w:lang w:val="en-US" w:eastAsia="fr-FR"/>
-          <w14:ligatures w14:val="none"/>
-        </w:rPr>
-      </w:pPr>
-      <w:r>
-        <w:rPr>
-          <w:rFonts w:ascii="Times New Roman" w:eastAsia="Times New Roman" w:hAnsi="Times New Roman" w:cs="Times New Roman"/>
-          <w:kern w:val="0"/>
-          <w:sz w:val="24"/>
-          <w:szCs w:val="24"/>
+          <w:highlight w:val="cyan"/>
+          <w:lang w:val="en-US" w:eastAsia="fr-FR"/>
+          <w14:ligatures w14:val="none"/>
+        </w:rPr>
+      </w:pPr>
+      <w:r>
+        <w:rPr>
+          <w:rFonts w:ascii="Times New Roman" w:eastAsia="Times New Roman" w:hAnsi="Times New Roman" w:cs="Times New Roman"/>
+          <w:kern w:val="0"/>
+          <w:sz w:val="24"/>
+          <w:szCs w:val="24"/>
+          <w:highlight w:val="cyan"/>
           <w:lang w:val="en-US" w:eastAsia="fr-FR"/>
           <w14:ligatures w14:val="none"/>
         </w:rPr>
@@ -3328,6 +3415,7 @@
           <w:lang w:eastAsia="fr-FR"/>
           <w14:ligatures w14:val="none"/>
         </w:rPr>
+        <w:lastRenderedPageBreak/>
         <w:t>Days 46–</w:t>
       </w:r>
       <w:proofErr w:type="gramStart"/>
@@ -5684,6 +5772,682 @@
         <w:pict w14:anchorId="20A46BD9">
           <v:rect id="_x0000_i1027" style="width:0;height:1.5pt" o:hralign="center" o:hrstd="t" o:hr="t" fillcolor="#a0a0a0" stroked="f"/>
         </w:pict>
+      </w:r>
+    </w:p>
+    <w:p/>
+    <w:p>
+      <w:pPr>
+        <w:pStyle w:val="Titre1"/>
+        <w:rPr>
+          <w:b/>
+          <w:bCs/>
+          <w:color w:val="FFC000" w:themeColor="accent4"/>
+          <w:sz w:val="56"/>
+          <w:szCs w:val="56"/>
+          <w14:textOutline w14:w="0" w14:cap="flat" w14:cmpd="sng" w14:algn="ctr">
+            <w14:noFill/>
+            <w14:prstDash w14:val="solid"/>
+            <w14:round/>
+          </w14:textOutline>
+          <w14:props3d w14:extrusionH="57150" w14:contourW="0" w14:prstMaterial="softEdge">
+            <w14:bevelT w14:w="25400" w14:h="38100" w14:prst="circle"/>
+          </w14:props3d>
+        </w:rPr>
+      </w:pPr>
+      <w:r>
+        <w:rPr>
+          <w:b/>
+          <w:bCs/>
+          <w:color w:val="FFC000" w:themeColor="accent4"/>
+          <w:sz w:val="56"/>
+          <w:szCs w:val="56"/>
+          <w14:textOutline w14:w="0" w14:cap="flat" w14:cmpd="sng" w14:algn="ctr">
+            <w14:noFill/>
+            <w14:prstDash w14:val="solid"/>
+            <w14:round/>
+          </w14:textOutline>
+          <w14:props3d w14:extrusionH="57150" w14:contourW="0" w14:prstMaterial="softEdge">
+            <w14:bevelT w14:w="25400" w14:h="38100" w14:prst="circle"/>
+          </w14:props3d>
+        </w:rPr>
+        <w:t>BONUS !</w:t>
+      </w:r>
+    </w:p>
+    <w:p>
+      <w:r>
+        <w:pict w14:anchorId="54CD4654">
+          <v:rect id="_x0000_i1028" style="width:0;height:1.5pt" o:hralign="center" o:hrstd="t" o:hr="t" fillcolor="#a0a0a0" stroked="f"/>
+        </w:pict>
+      </w:r>
+    </w:p>
+    <w:p>
+      <w:pPr>
+        <w:pStyle w:val="Titre2"/>
+        <w:numPr>
+          <w:ilvl w:val="0"/>
+          <w:numId w:val="24"/>
+        </w:numPr>
+        <w:rPr>
+          <w:b/>
+          <w:bCs/>
+          <w:color w:val="A20000"/>
+          <w:sz w:val="36"/>
+          <w:szCs w:val="36"/>
+          <w:highlight w:val="cyan"/>
+          <w:u w:val="single"/>
+        </w:rPr>
+      </w:pPr>
+      <w:r>
+        <w:rPr>
+          <w:b/>
+          <w:bCs/>
+          <w:color w:val="A20000"/>
+          <w:sz w:val="36"/>
+          <w:szCs w:val="36"/>
+          <w:highlight w:val="cyan"/>
+          <w:u w:val="single"/>
+        </w:rPr>
+        <w:t>Régression</w:t>
+      </w:r>
+    </w:p>
+    <w:p>
+      <w:pPr>
+        <w:rPr>
+          <w:b/>
+          <w:bCs/>
+        </w:rPr>
+      </w:pPr>
+      <w:r>
+        <w:rPr>
+          <w:rFonts w:ascii="Segoe UI Emoji" w:hAnsi="Segoe UI Emoji" w:cs="Segoe UI Emoji"/>
+          <w:b/>
+          <w:bCs/>
+        </w:rPr>
+        <w:t>🔹</w:t>
+      </w:r>
+      <w:r>
+        <w:rPr>
+          <w:b/>
+          <w:bCs/>
+        </w:rPr>
+        <w:t xml:space="preserve"> Régressions linéaires (extensions directes)</w:t>
+      </w:r>
+    </w:p>
+    <w:p>
+      <w:pPr>
+        <w:numPr>
+          <w:ilvl w:val="0"/>
+          <w:numId w:val="20"/>
+        </w:numPr>
+      </w:pPr>
+      <w:r>
+        <w:t xml:space="preserve">Régression linéaire </w:t>
+      </w:r>
+      <w:r>
+        <w:rPr>
+          <w:b/>
+          <w:bCs/>
+        </w:rPr>
+        <w:t>multiple</w:t>
+      </w:r>
+    </w:p>
+    <w:p>
+      <w:pPr>
+        <w:numPr>
+          <w:ilvl w:val="0"/>
+          <w:numId w:val="20"/>
+        </w:numPr>
+      </w:pPr>
+      <w:r>
+        <w:t xml:space="preserve">Régression </w:t>
+      </w:r>
+      <w:r>
+        <w:rPr>
+          <w:b/>
+          <w:bCs/>
+        </w:rPr>
+        <w:t>polynomiale</w:t>
+      </w:r>
+    </w:p>
+    <w:p>
+      <w:pPr>
+        <w:numPr>
+          <w:ilvl w:val="0"/>
+          <w:numId w:val="20"/>
+        </w:numPr>
+      </w:pPr>
+      <w:r>
+        <w:t xml:space="preserve">Régression </w:t>
+      </w:r>
+      <w:proofErr w:type="spellStart"/>
+      <w:r>
+        <w:rPr>
+          <w:b/>
+          <w:bCs/>
+        </w:rPr>
+        <w:t>ridge</w:t>
+      </w:r>
+      <w:proofErr w:type="spellEnd"/>
+      <w:r>
+        <w:rPr>
+          <w:b/>
+          <w:bCs/>
+        </w:rPr>
+        <w:t xml:space="preserve"> (L2)</w:t>
+      </w:r>
+    </w:p>
+    <w:p>
+      <w:pPr>
+        <w:numPr>
+          <w:ilvl w:val="0"/>
+          <w:numId w:val="20"/>
+        </w:numPr>
+      </w:pPr>
+      <w:r>
+        <w:t xml:space="preserve">Régression </w:t>
+      </w:r>
+      <w:r>
+        <w:rPr>
+          <w:b/>
+          <w:bCs/>
+        </w:rPr>
+        <w:t>lasso (L1)</w:t>
+      </w:r>
+    </w:p>
+    <w:p>
+      <w:pPr>
+        <w:numPr>
+          <w:ilvl w:val="0"/>
+          <w:numId w:val="20"/>
+        </w:numPr>
+      </w:pPr>
+      <w:r>
+        <w:t xml:space="preserve">Régression </w:t>
+      </w:r>
+      <w:proofErr w:type="spellStart"/>
+      <w:r>
+        <w:rPr>
+          <w:b/>
+          <w:bCs/>
+        </w:rPr>
+        <w:t>Elastic</w:t>
+      </w:r>
+      <w:proofErr w:type="spellEnd"/>
+      <w:r>
+        <w:rPr>
+          <w:b/>
+          <w:bCs/>
+        </w:rPr>
+        <w:t xml:space="preserve"> Net</w:t>
+      </w:r>
+    </w:p>
+    <w:p>
+      <w:pPr>
+        <w:numPr>
+          <w:ilvl w:val="0"/>
+          <w:numId w:val="20"/>
+        </w:numPr>
+      </w:pPr>
+      <w:r>
+        <w:t xml:space="preserve">Régression </w:t>
+      </w:r>
+      <w:proofErr w:type="spellStart"/>
+      <w:r>
+        <w:rPr>
+          <w:b/>
+          <w:bCs/>
+        </w:rPr>
+        <w:t>stepwise</w:t>
+      </w:r>
+      <w:proofErr w:type="spellEnd"/>
+      <w:r>
+        <w:rPr>
+          <w:b/>
+          <w:bCs/>
+        </w:rPr>
+        <w:t xml:space="preserve"> (sélection de variables pas à pas)</w:t>
+      </w:r>
+    </w:p>
+    <w:p>
+      <w:r>
+        <w:pict w14:anchorId="620FDA75">
+          <v:rect id="_x0000_i1029" style="width:0;height:1.5pt" o:hralign="center" o:hrstd="t" o:hr="t" fillcolor="#a0a0a0" stroked="f"/>
+        </w:pict>
+      </w:r>
+    </w:p>
+    <w:p>
+      <w:pPr>
+        <w:rPr>
+          <w:b/>
+          <w:bCs/>
+        </w:rPr>
+      </w:pPr>
+      <w:r>
+        <w:rPr>
+          <w:rFonts w:ascii="Segoe UI Emoji" w:hAnsi="Segoe UI Emoji" w:cs="Segoe UI Emoji"/>
+          <w:b/>
+          <w:bCs/>
+        </w:rPr>
+        <w:t>🔹</w:t>
+      </w:r>
+      <w:r>
+        <w:rPr>
+          <w:b/>
+          <w:bCs/>
+        </w:rPr>
+        <w:t xml:space="preserve"> Régressions non linéaires</w:t>
+      </w:r>
+    </w:p>
+    <w:p>
+      <w:pPr>
+        <w:numPr>
+          <w:ilvl w:val="0"/>
+          <w:numId w:val="21"/>
+        </w:numPr>
+      </w:pPr>
+      <w:r>
+        <w:t xml:space="preserve">Régression </w:t>
+      </w:r>
+      <w:r>
+        <w:rPr>
+          <w:b/>
+          <w:bCs/>
+        </w:rPr>
+        <w:t>logarithmique</w:t>
+      </w:r>
+    </w:p>
+    <w:p>
+      <w:pPr>
+        <w:numPr>
+          <w:ilvl w:val="0"/>
+          <w:numId w:val="21"/>
+        </w:numPr>
+      </w:pPr>
+      <w:r>
+        <w:t xml:space="preserve">Régression </w:t>
+      </w:r>
+      <w:r>
+        <w:rPr>
+          <w:b/>
+          <w:bCs/>
+        </w:rPr>
+        <w:t>exponentielle</w:t>
+      </w:r>
+    </w:p>
+    <w:p>
+      <w:pPr>
+        <w:numPr>
+          <w:ilvl w:val="0"/>
+          <w:numId w:val="21"/>
+        </w:numPr>
+      </w:pPr>
+      <w:r>
+        <w:t xml:space="preserve">Régression </w:t>
+      </w:r>
+      <w:r>
+        <w:rPr>
+          <w:b/>
+          <w:bCs/>
+        </w:rPr>
+        <w:t xml:space="preserve">puissance (power </w:t>
+      </w:r>
+      <w:proofErr w:type="spellStart"/>
+      <w:r>
+        <w:rPr>
+          <w:b/>
+          <w:bCs/>
+        </w:rPr>
+        <w:t>law</w:t>
+      </w:r>
+      <w:proofErr w:type="spellEnd"/>
+      <w:r>
+        <w:rPr>
+          <w:b/>
+          <w:bCs/>
+        </w:rPr>
+        <w:t>)</w:t>
+      </w:r>
+    </w:p>
+    <w:p>
+      <w:pPr>
+        <w:numPr>
+          <w:ilvl w:val="0"/>
+          <w:numId w:val="21"/>
+        </w:numPr>
+      </w:pPr>
+      <w:r>
+        <w:t xml:space="preserve">Régression </w:t>
+      </w:r>
+      <w:r>
+        <w:rPr>
+          <w:b/>
+          <w:bCs/>
+        </w:rPr>
+        <w:t>sigmoïde / logistique</w:t>
+      </w:r>
+      <w:r>
+        <w:t xml:space="preserve"> (pour classification binaire)</w:t>
+      </w:r>
+    </w:p>
+    <w:p>
+      <w:pPr>
+        <w:numPr>
+          <w:ilvl w:val="0"/>
+          <w:numId w:val="21"/>
+        </w:numPr>
+      </w:pPr>
+      <w:r>
+        <w:t xml:space="preserve">Régression </w:t>
+      </w:r>
+      <w:r>
+        <w:rPr>
+          <w:b/>
+          <w:bCs/>
+        </w:rPr>
+        <w:t>gaussienne / non linéaire générale</w:t>
+      </w:r>
+    </w:p>
+    <w:p>
+      <w:r>
+        <w:pict w14:anchorId="153CA175">
+          <v:rect id="_x0000_i1030" style="width:0;height:1.5pt" o:hralign="center" o:hrstd="t" o:hr="t" fillcolor="#a0a0a0" stroked="f"/>
+        </w:pict>
+      </w:r>
+    </w:p>
+    <w:p>
+      <w:pPr>
+        <w:rPr>
+          <w:b/>
+          <w:bCs/>
+        </w:rPr>
+      </w:pPr>
+      <w:r>
+        <w:rPr>
+          <w:rFonts w:ascii="Segoe UI Emoji" w:hAnsi="Segoe UI Emoji" w:cs="Segoe UI Emoji"/>
+          <w:b/>
+          <w:bCs/>
+        </w:rPr>
+        <w:t>🔹</w:t>
+      </w:r>
+      <w:r>
+        <w:rPr>
+          <w:b/>
+          <w:bCs/>
+        </w:rPr>
+        <w:t xml:space="preserve"> Régressions pour cas spécifiques</w:t>
+      </w:r>
+    </w:p>
+    <w:p>
+      <w:pPr>
+        <w:numPr>
+          <w:ilvl w:val="0"/>
+          <w:numId w:val="22"/>
+        </w:numPr>
+      </w:pPr>
+      <w:r>
+        <w:t xml:space="preserve">Régression </w:t>
+      </w:r>
+      <w:r>
+        <w:rPr>
+          <w:b/>
+          <w:bCs/>
+        </w:rPr>
+        <w:t>polynomiale de haut degré (</w:t>
+      </w:r>
+      <w:proofErr w:type="spellStart"/>
+      <w:r>
+        <w:rPr>
+          <w:b/>
+          <w:bCs/>
+        </w:rPr>
+        <w:t>spline</w:t>
+      </w:r>
+      <w:proofErr w:type="spellEnd"/>
+      <w:r>
+        <w:rPr>
+          <w:b/>
+          <w:bCs/>
+        </w:rPr>
+        <w:t>)</w:t>
+      </w:r>
+    </w:p>
+    <w:p>
+      <w:pPr>
+        <w:numPr>
+          <w:ilvl w:val="0"/>
+          <w:numId w:val="22"/>
+        </w:numPr>
+      </w:pPr>
+      <w:r>
+        <w:t xml:space="preserve">Régression </w:t>
+      </w:r>
+      <w:r>
+        <w:rPr>
+          <w:b/>
+          <w:bCs/>
+        </w:rPr>
+        <w:t>quantile</w:t>
+      </w:r>
+    </w:p>
+    <w:p>
+      <w:pPr>
+        <w:numPr>
+          <w:ilvl w:val="0"/>
+          <w:numId w:val="22"/>
+        </w:numPr>
+      </w:pPr>
+      <w:r>
+        <w:t xml:space="preserve">Régression </w:t>
+      </w:r>
+      <w:r>
+        <w:rPr>
+          <w:b/>
+          <w:bCs/>
+        </w:rPr>
+        <w:t>robuste</w:t>
+      </w:r>
+      <w:r>
+        <w:t xml:space="preserve"> (ex. RANSAC, Huber)</w:t>
+      </w:r>
+    </w:p>
+    <w:p>
+      <w:pPr>
+        <w:numPr>
+          <w:ilvl w:val="0"/>
+          <w:numId w:val="22"/>
+        </w:numPr>
+      </w:pPr>
+      <w:r>
+        <w:t xml:space="preserve">Régression </w:t>
+      </w:r>
+      <w:r>
+        <w:rPr>
+          <w:b/>
+          <w:bCs/>
+        </w:rPr>
+        <w:t>PCR / PLS (réduction dimensionnelle)</w:t>
+      </w:r>
+    </w:p>
+    <w:p>
+      <w:pPr>
+        <w:numPr>
+          <w:ilvl w:val="0"/>
+          <w:numId w:val="22"/>
+        </w:numPr>
+      </w:pPr>
+      <w:r>
+        <w:t xml:space="preserve">Régression </w:t>
+      </w:r>
+      <w:r>
+        <w:rPr>
+          <w:b/>
+          <w:bCs/>
+        </w:rPr>
+        <w:t>Bayésienne</w:t>
+      </w:r>
+    </w:p>
+    <w:p>
+      <w:pPr>
+        <w:numPr>
+          <w:ilvl w:val="0"/>
+          <w:numId w:val="22"/>
+        </w:numPr>
+      </w:pPr>
+      <w:r>
+        <w:t xml:space="preserve">Régression </w:t>
+      </w:r>
+      <w:r>
+        <w:rPr>
+          <w:b/>
+          <w:bCs/>
+        </w:rPr>
+        <w:t>Poisson / Gamma</w:t>
+      </w:r>
+      <w:r>
+        <w:t xml:space="preserve"> (modèles linéaires généralisés, GLM)</w:t>
+      </w:r>
+    </w:p>
+    <w:p>
+      <w:r>
+        <w:pict w14:anchorId="520ACF02">
+          <v:rect id="_x0000_i1031" style="width:0;height:1.5pt" o:hralign="center" o:hrstd="t" o:hr="t" fillcolor="#a0a0a0" stroked="f"/>
+        </w:pict>
+      </w:r>
+    </w:p>
+    <w:p>
+      <w:pPr>
+        <w:rPr>
+          <w:b/>
+          <w:bCs/>
+        </w:rPr>
+      </w:pPr>
+      <w:r>
+        <w:rPr>
+          <w:rFonts w:ascii="Segoe UI Emoji" w:hAnsi="Segoe UI Emoji" w:cs="Segoe UI Emoji"/>
+          <w:b/>
+          <w:bCs/>
+        </w:rPr>
+        <w:t>🔹</w:t>
+      </w:r>
+      <w:r>
+        <w:rPr>
+          <w:b/>
+          <w:bCs/>
+        </w:rPr>
+        <w:t xml:space="preserve"> Régressions avancées / modernes</w:t>
+      </w:r>
+    </w:p>
+    <w:p>
+      <w:pPr>
+        <w:numPr>
+          <w:ilvl w:val="0"/>
+          <w:numId w:val="23"/>
+        </w:numPr>
+      </w:pPr>
+      <w:r>
+        <w:t xml:space="preserve">Régression </w:t>
+      </w:r>
+      <w:r>
+        <w:rPr>
+          <w:b/>
+          <w:bCs/>
+        </w:rPr>
+        <w:t>logistique multinomiale</w:t>
+      </w:r>
+      <w:r>
+        <w:t xml:space="preserve"> (multi-classes)</w:t>
+      </w:r>
+    </w:p>
+    <w:p>
+      <w:pPr>
+        <w:numPr>
+          <w:ilvl w:val="0"/>
+          <w:numId w:val="23"/>
+        </w:numPr>
+      </w:pPr>
+      <w:r>
+        <w:t xml:space="preserve">Régression </w:t>
+      </w:r>
+      <w:r>
+        <w:rPr>
+          <w:b/>
+          <w:bCs/>
+        </w:rPr>
+        <w:t>ordinal / multiniveau (hiérarchique)</w:t>
+      </w:r>
+    </w:p>
+    <w:p>
+      <w:pPr>
+        <w:numPr>
+          <w:ilvl w:val="0"/>
+          <w:numId w:val="23"/>
+        </w:numPr>
+      </w:pPr>
+      <w:r>
+        <w:t xml:space="preserve">Régression </w:t>
+      </w:r>
+      <w:r>
+        <w:rPr>
+          <w:b/>
+          <w:bCs/>
+        </w:rPr>
+        <w:t xml:space="preserve">par arbres de décision / forêts / </w:t>
+      </w:r>
+      <w:proofErr w:type="spellStart"/>
+      <w:r>
+        <w:rPr>
+          <w:b/>
+          <w:bCs/>
+        </w:rPr>
+        <w:t>boosting</w:t>
+      </w:r>
+      <w:proofErr w:type="spellEnd"/>
+    </w:p>
+    <w:p>
+      <w:pPr>
+        <w:numPr>
+          <w:ilvl w:val="0"/>
+          <w:numId w:val="23"/>
+        </w:numPr>
+      </w:pPr>
+      <w:r>
+        <w:t xml:space="preserve">Régression </w:t>
+      </w:r>
+      <w:r>
+        <w:rPr>
+          <w:b/>
+          <w:bCs/>
+        </w:rPr>
+        <w:t>avec réseaux de neurones</w:t>
+      </w:r>
+    </w:p>
+    <w:p>
+      <w:pPr>
+        <w:numPr>
+          <w:ilvl w:val="0"/>
+          <w:numId w:val="23"/>
+        </w:numPr>
+      </w:pPr>
+      <w:r>
+        <w:t xml:space="preserve">Régression </w:t>
+      </w:r>
+      <w:r>
+        <w:rPr>
+          <w:b/>
+          <w:bCs/>
+        </w:rPr>
+        <w:t>sur séries temporelles</w:t>
+      </w:r>
+      <w:r>
+        <w:t xml:space="preserve"> (ARIMA, SARIMA, </w:t>
+      </w:r>
+      <w:proofErr w:type="spellStart"/>
+      <w:r>
+        <w:t>Prophet</w:t>
+      </w:r>
+      <w:proofErr w:type="spellEnd"/>
+      <w:r>
+        <w:t>, etc.)</w:t>
       </w:r>
     </w:p>
     <w:p/>
@@ -6445,6 +7209,539 @@
     </w:lvl>
   </w:abstractNum>
   <w:abstractNum w:abstractNumId="5" w15:restartNumberingAfterBreak="0">
+    <w:nsid w:val="2A6D4F8F"/>
+    <w:multiLevelType w:val="multilevel"/>
+    <w:tmpl w:val="CA8E2F6C"/>
+    <w:lvl w:ilvl="0">
+      <w:start w:val="1"/>
+      <w:numFmt w:val="bullet"/>
+      <w:lvlText w:val=""/>
+      <w:lvlJc w:val="left"/>
+      <w:pPr>
+        <w:tabs>
+          <w:tab w:val="num" w:pos="720"/>
+        </w:tabs>
+        <w:ind w:left="720" w:hanging="360"/>
+      </w:pPr>
+      <w:rPr>
+        <w:rFonts w:ascii="Symbol" w:hAnsi="Symbol" w:hint="default"/>
+        <w:sz w:val="20"/>
+      </w:rPr>
+    </w:lvl>
+    <w:lvl w:ilvl="1" w:tentative="1">
+      <w:start w:val="1"/>
+      <w:numFmt w:val="bullet"/>
+      <w:lvlText w:val="o"/>
+      <w:lvlJc w:val="left"/>
+      <w:pPr>
+        <w:tabs>
+          <w:tab w:val="num" w:pos="1440"/>
+        </w:tabs>
+        <w:ind w:left="1440" w:hanging="360"/>
+      </w:pPr>
+      <w:rPr>
+        <w:rFonts w:ascii="Courier New" w:hAnsi="Courier New" w:hint="default"/>
+        <w:sz w:val="20"/>
+      </w:rPr>
+    </w:lvl>
+    <w:lvl w:ilvl="2" w:tentative="1">
+      <w:start w:val="1"/>
+      <w:numFmt w:val="bullet"/>
+      <w:lvlText w:val=""/>
+      <w:lvlJc w:val="left"/>
+      <w:pPr>
+        <w:tabs>
+          <w:tab w:val="num" w:pos="2160"/>
+        </w:tabs>
+        <w:ind w:left="2160" w:hanging="360"/>
+      </w:pPr>
+      <w:rPr>
+        <w:rFonts w:ascii="Wingdings" w:hAnsi="Wingdings" w:hint="default"/>
+        <w:sz w:val="20"/>
+      </w:rPr>
+    </w:lvl>
+    <w:lvl w:ilvl="3" w:tentative="1">
+      <w:start w:val="1"/>
+      <w:numFmt w:val="bullet"/>
+      <w:lvlText w:val=""/>
+      <w:lvlJc w:val="left"/>
+      <w:pPr>
+        <w:tabs>
+          <w:tab w:val="num" w:pos="2880"/>
+        </w:tabs>
+        <w:ind w:left="2880" w:hanging="360"/>
+      </w:pPr>
+      <w:rPr>
+        <w:rFonts w:ascii="Wingdings" w:hAnsi="Wingdings" w:hint="default"/>
+        <w:sz w:val="20"/>
+      </w:rPr>
+    </w:lvl>
+    <w:lvl w:ilvl="4" w:tentative="1">
+      <w:start w:val="1"/>
+      <w:numFmt w:val="bullet"/>
+      <w:lvlText w:val=""/>
+      <w:lvlJc w:val="left"/>
+      <w:pPr>
+        <w:tabs>
+          <w:tab w:val="num" w:pos="3600"/>
+        </w:tabs>
+        <w:ind w:left="3600" w:hanging="360"/>
+      </w:pPr>
+      <w:rPr>
+        <w:rFonts w:ascii="Wingdings" w:hAnsi="Wingdings" w:hint="default"/>
+        <w:sz w:val="20"/>
+      </w:rPr>
+    </w:lvl>
+    <w:lvl w:ilvl="5" w:tentative="1">
+      <w:start w:val="1"/>
+      <w:numFmt w:val="bullet"/>
+      <w:lvlText w:val=""/>
+      <w:lvlJc w:val="left"/>
+      <w:pPr>
+        <w:tabs>
+          <w:tab w:val="num" w:pos="4320"/>
+        </w:tabs>
+        <w:ind w:left="4320" w:hanging="360"/>
+      </w:pPr>
+      <w:rPr>
+        <w:rFonts w:ascii="Wingdings" w:hAnsi="Wingdings" w:hint="default"/>
+        <w:sz w:val="20"/>
+      </w:rPr>
+    </w:lvl>
+    <w:lvl w:ilvl="6" w:tentative="1">
+      <w:start w:val="1"/>
+      <w:numFmt w:val="bullet"/>
+      <w:lvlText w:val=""/>
+      <w:lvlJc w:val="left"/>
+      <w:pPr>
+        <w:tabs>
+          <w:tab w:val="num" w:pos="5040"/>
+        </w:tabs>
+        <w:ind w:left="5040" w:hanging="360"/>
+      </w:pPr>
+      <w:rPr>
+        <w:rFonts w:ascii="Wingdings" w:hAnsi="Wingdings" w:hint="default"/>
+        <w:sz w:val="20"/>
+      </w:rPr>
+    </w:lvl>
+    <w:lvl w:ilvl="7" w:tentative="1">
+      <w:start w:val="1"/>
+      <w:numFmt w:val="bullet"/>
+      <w:lvlText w:val=""/>
+      <w:lvlJc w:val="left"/>
+      <w:pPr>
+        <w:tabs>
+          <w:tab w:val="num" w:pos="5760"/>
+        </w:tabs>
+        <w:ind w:left="5760" w:hanging="360"/>
+      </w:pPr>
+      <w:rPr>
+        <w:rFonts w:ascii="Wingdings" w:hAnsi="Wingdings" w:hint="default"/>
+        <w:sz w:val="20"/>
+      </w:rPr>
+    </w:lvl>
+    <w:lvl w:ilvl="8" w:tentative="1">
+      <w:start w:val="1"/>
+      <w:numFmt w:val="bullet"/>
+      <w:lvlText w:val=""/>
+      <w:lvlJc w:val="left"/>
+      <w:pPr>
+        <w:tabs>
+          <w:tab w:val="num" w:pos="6480"/>
+        </w:tabs>
+        <w:ind w:left="6480" w:hanging="360"/>
+      </w:pPr>
+      <w:rPr>
+        <w:rFonts w:ascii="Wingdings" w:hAnsi="Wingdings" w:hint="default"/>
+        <w:sz w:val="20"/>
+      </w:rPr>
+    </w:lvl>
+  </w:abstractNum>
+  <w:abstractNum w:abstractNumId="6" w15:restartNumberingAfterBreak="0">
+    <w:nsid w:val="2C85342D"/>
+    <w:multiLevelType w:val="multilevel"/>
+    <w:tmpl w:val="BD120FD8"/>
+    <w:lvl w:ilvl="0">
+      <w:start w:val="1"/>
+      <w:numFmt w:val="bullet"/>
+      <w:lvlText w:val=""/>
+      <w:lvlJc w:val="left"/>
+      <w:pPr>
+        <w:tabs>
+          <w:tab w:val="num" w:pos="720"/>
+        </w:tabs>
+        <w:ind w:left="720" w:hanging="360"/>
+      </w:pPr>
+      <w:rPr>
+        <w:rFonts w:ascii="Symbol" w:hAnsi="Symbol" w:hint="default"/>
+        <w:sz w:val="20"/>
+      </w:rPr>
+    </w:lvl>
+    <w:lvl w:ilvl="1" w:tentative="1">
+      <w:start w:val="1"/>
+      <w:numFmt w:val="bullet"/>
+      <w:lvlText w:val="o"/>
+      <w:lvlJc w:val="left"/>
+      <w:pPr>
+        <w:tabs>
+          <w:tab w:val="num" w:pos="1440"/>
+        </w:tabs>
+        <w:ind w:left="1440" w:hanging="360"/>
+      </w:pPr>
+      <w:rPr>
+        <w:rFonts w:ascii="Courier New" w:hAnsi="Courier New" w:hint="default"/>
+        <w:sz w:val="20"/>
+      </w:rPr>
+    </w:lvl>
+    <w:lvl w:ilvl="2" w:tentative="1">
+      <w:start w:val="1"/>
+      <w:numFmt w:val="bullet"/>
+      <w:lvlText w:val=""/>
+      <w:lvlJc w:val="left"/>
+      <w:pPr>
+        <w:tabs>
+          <w:tab w:val="num" w:pos="2160"/>
+        </w:tabs>
+        <w:ind w:left="2160" w:hanging="360"/>
+      </w:pPr>
+      <w:rPr>
+        <w:rFonts w:ascii="Wingdings" w:hAnsi="Wingdings" w:hint="default"/>
+        <w:sz w:val="20"/>
+      </w:rPr>
+    </w:lvl>
+    <w:lvl w:ilvl="3" w:tentative="1">
+      <w:start w:val="1"/>
+      <w:numFmt w:val="bullet"/>
+      <w:lvlText w:val=""/>
+      <w:lvlJc w:val="left"/>
+      <w:pPr>
+        <w:tabs>
+          <w:tab w:val="num" w:pos="2880"/>
+        </w:tabs>
+        <w:ind w:left="2880" w:hanging="360"/>
+      </w:pPr>
+      <w:rPr>
+        <w:rFonts w:ascii="Wingdings" w:hAnsi="Wingdings" w:hint="default"/>
+        <w:sz w:val="20"/>
+      </w:rPr>
+    </w:lvl>
+    <w:lvl w:ilvl="4" w:tentative="1">
+      <w:start w:val="1"/>
+      <w:numFmt w:val="bullet"/>
+      <w:lvlText w:val=""/>
+      <w:lvlJc w:val="left"/>
+      <w:pPr>
+        <w:tabs>
+          <w:tab w:val="num" w:pos="3600"/>
+        </w:tabs>
+        <w:ind w:left="3600" w:hanging="360"/>
+      </w:pPr>
+      <w:rPr>
+        <w:rFonts w:ascii="Wingdings" w:hAnsi="Wingdings" w:hint="default"/>
+        <w:sz w:val="20"/>
+      </w:rPr>
+    </w:lvl>
+    <w:lvl w:ilvl="5" w:tentative="1">
+      <w:start w:val="1"/>
+      <w:numFmt w:val="bullet"/>
+      <w:lvlText w:val=""/>
+      <w:lvlJc w:val="left"/>
+      <w:pPr>
+        <w:tabs>
+          <w:tab w:val="num" w:pos="4320"/>
+        </w:tabs>
+        <w:ind w:left="4320" w:hanging="360"/>
+      </w:pPr>
+      <w:rPr>
+        <w:rFonts w:ascii="Wingdings" w:hAnsi="Wingdings" w:hint="default"/>
+        <w:sz w:val="20"/>
+      </w:rPr>
+    </w:lvl>
+    <w:lvl w:ilvl="6" w:tentative="1">
+      <w:start w:val="1"/>
+      <w:numFmt w:val="bullet"/>
+      <w:lvlText w:val=""/>
+      <w:lvlJc w:val="left"/>
+      <w:pPr>
+        <w:tabs>
+          <w:tab w:val="num" w:pos="5040"/>
+        </w:tabs>
+        <w:ind w:left="5040" w:hanging="360"/>
+      </w:pPr>
+      <w:rPr>
+        <w:rFonts w:ascii="Wingdings" w:hAnsi="Wingdings" w:hint="default"/>
+        <w:sz w:val="20"/>
+      </w:rPr>
+    </w:lvl>
+    <w:lvl w:ilvl="7" w:tentative="1">
+      <w:start w:val="1"/>
+      <w:numFmt w:val="bullet"/>
+      <w:lvlText w:val=""/>
+      <w:lvlJc w:val="left"/>
+      <w:pPr>
+        <w:tabs>
+          <w:tab w:val="num" w:pos="5760"/>
+        </w:tabs>
+        <w:ind w:left="5760" w:hanging="360"/>
+      </w:pPr>
+      <w:rPr>
+        <w:rFonts w:ascii="Wingdings" w:hAnsi="Wingdings" w:hint="default"/>
+        <w:sz w:val="20"/>
+      </w:rPr>
+    </w:lvl>
+    <w:lvl w:ilvl="8" w:tentative="1">
+      <w:start w:val="1"/>
+      <w:numFmt w:val="bullet"/>
+      <w:lvlText w:val=""/>
+      <w:lvlJc w:val="left"/>
+      <w:pPr>
+        <w:tabs>
+          <w:tab w:val="num" w:pos="6480"/>
+        </w:tabs>
+        <w:ind w:left="6480" w:hanging="360"/>
+      </w:pPr>
+      <w:rPr>
+        <w:rFonts w:ascii="Wingdings" w:hAnsi="Wingdings" w:hint="default"/>
+        <w:sz w:val="20"/>
+      </w:rPr>
+    </w:lvl>
+  </w:abstractNum>
+  <w:abstractNum w:abstractNumId="7" w15:restartNumberingAfterBreak="0">
+    <w:nsid w:val="2CFD0F6F"/>
+    <w:multiLevelType w:val="multilevel"/>
+    <w:tmpl w:val="95241BD0"/>
+    <w:lvl w:ilvl="0">
+      <w:start w:val="1"/>
+      <w:numFmt w:val="bullet"/>
+      <w:lvlText w:val=""/>
+      <w:lvlJc w:val="left"/>
+      <w:pPr>
+        <w:tabs>
+          <w:tab w:val="num" w:pos="720"/>
+        </w:tabs>
+        <w:ind w:left="720" w:hanging="360"/>
+      </w:pPr>
+      <w:rPr>
+        <w:rFonts w:ascii="Symbol" w:hAnsi="Symbol" w:hint="default"/>
+        <w:sz w:val="20"/>
+      </w:rPr>
+    </w:lvl>
+    <w:lvl w:ilvl="1" w:tentative="1">
+      <w:start w:val="1"/>
+      <w:numFmt w:val="bullet"/>
+      <w:lvlText w:val="o"/>
+      <w:lvlJc w:val="left"/>
+      <w:pPr>
+        <w:tabs>
+          <w:tab w:val="num" w:pos="1440"/>
+        </w:tabs>
+        <w:ind w:left="1440" w:hanging="360"/>
+      </w:pPr>
+      <w:rPr>
+        <w:rFonts w:ascii="Courier New" w:hAnsi="Courier New" w:hint="default"/>
+        <w:sz w:val="20"/>
+      </w:rPr>
+    </w:lvl>
+    <w:lvl w:ilvl="2" w:tentative="1">
+      <w:start w:val="1"/>
+      <w:numFmt w:val="bullet"/>
+      <w:lvlText w:val=""/>
+      <w:lvlJc w:val="left"/>
+      <w:pPr>
+        <w:tabs>
+          <w:tab w:val="num" w:pos="2160"/>
+        </w:tabs>
+        <w:ind w:left="2160" w:hanging="360"/>
+      </w:pPr>
+      <w:rPr>
+        <w:rFonts w:ascii="Wingdings" w:hAnsi="Wingdings" w:hint="default"/>
+        <w:sz w:val="20"/>
+      </w:rPr>
+    </w:lvl>
+    <w:lvl w:ilvl="3" w:tentative="1">
+      <w:start w:val="1"/>
+      <w:numFmt w:val="bullet"/>
+      <w:lvlText w:val=""/>
+      <w:lvlJc w:val="left"/>
+      <w:pPr>
+        <w:tabs>
+          <w:tab w:val="num" w:pos="2880"/>
+        </w:tabs>
+        <w:ind w:left="2880" w:hanging="360"/>
+      </w:pPr>
+      <w:rPr>
+        <w:rFonts w:ascii="Wingdings" w:hAnsi="Wingdings" w:hint="default"/>
+        <w:sz w:val="20"/>
+      </w:rPr>
+    </w:lvl>
+    <w:lvl w:ilvl="4" w:tentative="1">
+      <w:start w:val="1"/>
+      <w:numFmt w:val="bullet"/>
+      <w:lvlText w:val=""/>
+      <w:lvlJc w:val="left"/>
+      <w:pPr>
+        <w:tabs>
+          <w:tab w:val="num" w:pos="3600"/>
+        </w:tabs>
+        <w:ind w:left="3600" w:hanging="360"/>
+      </w:pPr>
+      <w:rPr>
+        <w:rFonts w:ascii="Wingdings" w:hAnsi="Wingdings" w:hint="default"/>
+        <w:sz w:val="20"/>
+      </w:rPr>
+    </w:lvl>
+    <w:lvl w:ilvl="5" w:tentative="1">
+      <w:start w:val="1"/>
+      <w:numFmt w:val="bullet"/>
+      <w:lvlText w:val=""/>
+      <w:lvlJc w:val="left"/>
+      <w:pPr>
+        <w:tabs>
+          <w:tab w:val="num" w:pos="4320"/>
+        </w:tabs>
+        <w:ind w:left="4320" w:hanging="360"/>
+      </w:pPr>
+      <w:rPr>
+        <w:rFonts w:ascii="Wingdings" w:hAnsi="Wingdings" w:hint="default"/>
+        <w:sz w:val="20"/>
+      </w:rPr>
+    </w:lvl>
+    <w:lvl w:ilvl="6" w:tentative="1">
+      <w:start w:val="1"/>
+      <w:numFmt w:val="bullet"/>
+      <w:lvlText w:val=""/>
+      <w:lvlJc w:val="left"/>
+      <w:pPr>
+        <w:tabs>
+          <w:tab w:val="num" w:pos="5040"/>
+        </w:tabs>
+        <w:ind w:left="5040" w:hanging="360"/>
+      </w:pPr>
+      <w:rPr>
+        <w:rFonts w:ascii="Wingdings" w:hAnsi="Wingdings" w:hint="default"/>
+        <w:sz w:val="20"/>
+      </w:rPr>
+    </w:lvl>
+    <w:lvl w:ilvl="7" w:tentative="1">
+      <w:start w:val="1"/>
+      <w:numFmt w:val="bullet"/>
+      <w:lvlText w:val=""/>
+      <w:lvlJc w:val="left"/>
+      <w:pPr>
+        <w:tabs>
+          <w:tab w:val="num" w:pos="5760"/>
+        </w:tabs>
+        <w:ind w:left="5760" w:hanging="360"/>
+      </w:pPr>
+      <w:rPr>
+        <w:rFonts w:ascii="Wingdings" w:hAnsi="Wingdings" w:hint="default"/>
+        <w:sz w:val="20"/>
+      </w:rPr>
+    </w:lvl>
+    <w:lvl w:ilvl="8" w:tentative="1">
+      <w:start w:val="1"/>
+      <w:numFmt w:val="bullet"/>
+      <w:lvlText w:val=""/>
+      <w:lvlJc w:val="left"/>
+      <w:pPr>
+        <w:tabs>
+          <w:tab w:val="num" w:pos="6480"/>
+        </w:tabs>
+        <w:ind w:left="6480" w:hanging="360"/>
+      </w:pPr>
+      <w:rPr>
+        <w:rFonts w:ascii="Wingdings" w:hAnsi="Wingdings" w:hint="default"/>
+        <w:sz w:val="20"/>
+      </w:rPr>
+    </w:lvl>
+  </w:abstractNum>
+  <w:abstractNum w:abstractNumId="8" w15:restartNumberingAfterBreak="0">
+    <w:nsid w:val="319E2522"/>
+    <w:multiLevelType w:val="hybridMultilevel"/>
+    <w:tmpl w:val="A4C46684"/>
+    <w:lvl w:ilvl="0" w:tplc="040C0013">
+      <w:start w:val="1"/>
+      <w:numFmt w:val="upperRoman"/>
+      <w:lvlText w:val="%1."/>
+      <w:lvlJc w:val="right"/>
+      <w:pPr>
+        <w:ind w:left="720" w:hanging="360"/>
+      </w:pPr>
+    </w:lvl>
+    <w:lvl w:ilvl="1" w:tplc="040C0019" w:tentative="1">
+      <w:start w:val="1"/>
+      <w:numFmt w:val="lowerLetter"/>
+      <w:lvlText w:val="%2."/>
+      <w:lvlJc w:val="left"/>
+      <w:pPr>
+        <w:ind w:left="1440" w:hanging="360"/>
+      </w:pPr>
+    </w:lvl>
+    <w:lvl w:ilvl="2" w:tplc="040C001B" w:tentative="1">
+      <w:start w:val="1"/>
+      <w:numFmt w:val="lowerRoman"/>
+      <w:lvlText w:val="%3."/>
+      <w:lvlJc w:val="right"/>
+      <w:pPr>
+        <w:ind w:left="2160" w:hanging="180"/>
+      </w:pPr>
+    </w:lvl>
+    <w:lvl w:ilvl="3" w:tplc="040C000F" w:tentative="1">
+      <w:start w:val="1"/>
+      <w:numFmt w:val="decimal"/>
+      <w:lvlText w:val="%4."/>
+      <w:lvlJc w:val="left"/>
+      <w:pPr>
+        <w:ind w:left="2880" w:hanging="360"/>
+      </w:pPr>
+    </w:lvl>
+    <w:lvl w:ilvl="4" w:tplc="040C0019" w:tentative="1">
+      <w:start w:val="1"/>
+      <w:numFmt w:val="lowerLetter"/>
+      <w:lvlText w:val="%5."/>
+      <w:lvlJc w:val="left"/>
+      <w:pPr>
+        <w:ind w:left="3600" w:hanging="360"/>
+      </w:pPr>
+    </w:lvl>
+    <w:lvl w:ilvl="5" w:tplc="040C001B" w:tentative="1">
+      <w:start w:val="1"/>
+      <w:numFmt w:val="lowerRoman"/>
+      <w:lvlText w:val="%6."/>
+      <w:lvlJc w:val="right"/>
+      <w:pPr>
+        <w:ind w:left="4320" w:hanging="180"/>
+      </w:pPr>
+    </w:lvl>
+    <w:lvl w:ilvl="6" w:tplc="040C000F" w:tentative="1">
+      <w:start w:val="1"/>
+      <w:numFmt w:val="decimal"/>
+      <w:lvlText w:val="%7."/>
+      <w:lvlJc w:val="left"/>
+      <w:pPr>
+        <w:ind w:left="5040" w:hanging="360"/>
+      </w:pPr>
+    </w:lvl>
+    <w:lvl w:ilvl="7" w:tplc="040C0019" w:tentative="1">
+      <w:start w:val="1"/>
+      <w:numFmt w:val="lowerLetter"/>
+      <w:lvlText w:val="%8."/>
+      <w:lvlJc w:val="left"/>
+      <w:pPr>
+        <w:ind w:left="5760" w:hanging="360"/>
+      </w:pPr>
+    </w:lvl>
+    <w:lvl w:ilvl="8" w:tplc="040C001B" w:tentative="1">
+      <w:start w:val="1"/>
+      <w:numFmt w:val="lowerRoman"/>
+      <w:lvlText w:val="%9."/>
+      <w:lvlJc w:val="right"/>
+      <w:pPr>
+        <w:ind w:left="6480" w:hanging="180"/>
+      </w:pPr>
+    </w:lvl>
+  </w:abstractNum>
+  <w:abstractNum w:abstractNumId="9" w15:restartNumberingAfterBreak="0">
     <w:nsid w:val="32314E43"/>
     <w:multiLevelType w:val="multilevel"/>
     <w:tmpl w:val="6DFE445C"/>
@@ -6593,7 +7890,7 @@
       </w:rPr>
     </w:lvl>
   </w:abstractNum>
-  <w:abstractNum w:abstractNumId="6" w15:restartNumberingAfterBreak="0">
+  <w:abstractNum w:abstractNumId="10" w15:restartNumberingAfterBreak="0">
     <w:nsid w:val="37306EE6"/>
     <w:multiLevelType w:val="multilevel"/>
     <w:tmpl w:val="58B45C42"/>
@@ -6742,7 +8039,7 @@
       </w:rPr>
     </w:lvl>
   </w:abstractNum>
-  <w:abstractNum w:abstractNumId="7" w15:restartNumberingAfterBreak="0">
+  <w:abstractNum w:abstractNumId="11" w15:restartNumberingAfterBreak="0">
     <w:nsid w:val="39C038B1"/>
     <w:multiLevelType w:val="multilevel"/>
     <w:tmpl w:val="2BA83B04"/>
@@ -6891,7 +8188,7 @@
       </w:rPr>
     </w:lvl>
   </w:abstractNum>
-  <w:abstractNum w:abstractNumId="8" w15:restartNumberingAfterBreak="0">
+  <w:abstractNum w:abstractNumId="12" w15:restartNumberingAfterBreak="0">
     <w:nsid w:val="3D6F0EA4"/>
     <w:multiLevelType w:val="multilevel"/>
     <w:tmpl w:val="BDF03F3C"/>
@@ -7040,7 +8337,7 @@
       </w:rPr>
     </w:lvl>
   </w:abstractNum>
-  <w:abstractNum w:abstractNumId="9" w15:restartNumberingAfterBreak="0">
+  <w:abstractNum w:abstractNumId="13" w15:restartNumberingAfterBreak="0">
     <w:nsid w:val="3E7013D6"/>
     <w:multiLevelType w:val="multilevel"/>
     <w:tmpl w:val="74A45D22"/>
@@ -7189,7 +8486,7 @@
       </w:rPr>
     </w:lvl>
   </w:abstractNum>
-  <w:abstractNum w:abstractNumId="10" w15:restartNumberingAfterBreak="0">
+  <w:abstractNum w:abstractNumId="14" w15:restartNumberingAfterBreak="0">
     <w:nsid w:val="403C08E2"/>
     <w:multiLevelType w:val="multilevel"/>
     <w:tmpl w:val="FB6288E0"/>
@@ -7338,7 +8635,7 @@
       </w:rPr>
     </w:lvl>
   </w:abstractNum>
-  <w:abstractNum w:abstractNumId="11" w15:restartNumberingAfterBreak="0">
+  <w:abstractNum w:abstractNumId="15" w15:restartNumberingAfterBreak="0">
     <w:nsid w:val="46A85515"/>
     <w:multiLevelType w:val="multilevel"/>
     <w:tmpl w:val="8D6CE70C"/>
@@ -7487,7 +8784,156 @@
       </w:rPr>
     </w:lvl>
   </w:abstractNum>
-  <w:abstractNum w:abstractNumId="12" w15:restartNumberingAfterBreak="0">
+  <w:abstractNum w:abstractNumId="16" w15:restartNumberingAfterBreak="0">
+    <w:nsid w:val="48425E02"/>
+    <w:multiLevelType w:val="multilevel"/>
+    <w:tmpl w:val="9DBA5C14"/>
+    <w:lvl w:ilvl="0">
+      <w:start w:val="1"/>
+      <w:numFmt w:val="bullet"/>
+      <w:lvlText w:val=""/>
+      <w:lvlJc w:val="left"/>
+      <w:pPr>
+        <w:tabs>
+          <w:tab w:val="num" w:pos="720"/>
+        </w:tabs>
+        <w:ind w:left="720" w:hanging="360"/>
+      </w:pPr>
+      <w:rPr>
+        <w:rFonts w:ascii="Symbol" w:hAnsi="Symbol" w:hint="default"/>
+        <w:sz w:val="20"/>
+      </w:rPr>
+    </w:lvl>
+    <w:lvl w:ilvl="1" w:tentative="1">
+      <w:start w:val="1"/>
+      <w:numFmt w:val="bullet"/>
+      <w:lvlText w:val="o"/>
+      <w:lvlJc w:val="left"/>
+      <w:pPr>
+        <w:tabs>
+          <w:tab w:val="num" w:pos="1440"/>
+        </w:tabs>
+        <w:ind w:left="1440" w:hanging="360"/>
+      </w:pPr>
+      <w:rPr>
+        <w:rFonts w:ascii="Courier New" w:hAnsi="Courier New" w:hint="default"/>
+        <w:sz w:val="20"/>
+      </w:rPr>
+    </w:lvl>
+    <w:lvl w:ilvl="2" w:tentative="1">
+      <w:start w:val="1"/>
+      <w:numFmt w:val="bullet"/>
+      <w:lvlText w:val=""/>
+      <w:lvlJc w:val="left"/>
+      <w:pPr>
+        <w:tabs>
+          <w:tab w:val="num" w:pos="2160"/>
+        </w:tabs>
+        <w:ind w:left="2160" w:hanging="360"/>
+      </w:pPr>
+      <w:rPr>
+        <w:rFonts w:ascii="Wingdings" w:hAnsi="Wingdings" w:hint="default"/>
+        <w:sz w:val="20"/>
+      </w:rPr>
+    </w:lvl>
+    <w:lvl w:ilvl="3" w:tentative="1">
+      <w:start w:val="1"/>
+      <w:numFmt w:val="bullet"/>
+      <w:lvlText w:val=""/>
+      <w:lvlJc w:val="left"/>
+      <w:pPr>
+        <w:tabs>
+          <w:tab w:val="num" w:pos="2880"/>
+        </w:tabs>
+        <w:ind w:left="2880" w:hanging="360"/>
+      </w:pPr>
+      <w:rPr>
+        <w:rFonts w:ascii="Wingdings" w:hAnsi="Wingdings" w:hint="default"/>
+        <w:sz w:val="20"/>
+      </w:rPr>
+    </w:lvl>
+    <w:lvl w:ilvl="4" w:tentative="1">
+      <w:start w:val="1"/>
+      <w:numFmt w:val="bullet"/>
+      <w:lvlText w:val=""/>
+      <w:lvlJc w:val="left"/>
+      <w:pPr>
+        <w:tabs>
+          <w:tab w:val="num" w:pos="3600"/>
+        </w:tabs>
+        <w:ind w:left="3600" w:hanging="360"/>
+      </w:pPr>
+      <w:rPr>
+        <w:rFonts w:ascii="Wingdings" w:hAnsi="Wingdings" w:hint="default"/>
+        <w:sz w:val="20"/>
+      </w:rPr>
+    </w:lvl>
+    <w:lvl w:ilvl="5" w:tentative="1">
+      <w:start w:val="1"/>
+      <w:numFmt w:val="bullet"/>
+      <w:lvlText w:val=""/>
+      <w:lvlJc w:val="left"/>
+      <w:pPr>
+        <w:tabs>
+          <w:tab w:val="num" w:pos="4320"/>
+        </w:tabs>
+        <w:ind w:left="4320" w:hanging="360"/>
+      </w:pPr>
+      <w:rPr>
+        <w:rFonts w:ascii="Wingdings" w:hAnsi="Wingdings" w:hint="default"/>
+        <w:sz w:val="20"/>
+      </w:rPr>
+    </w:lvl>
+    <w:lvl w:ilvl="6" w:tentative="1">
+      <w:start w:val="1"/>
+      <w:numFmt w:val="bullet"/>
+      <w:lvlText w:val=""/>
+      <w:lvlJc w:val="left"/>
+      <w:pPr>
+        <w:tabs>
+          <w:tab w:val="num" w:pos="5040"/>
+        </w:tabs>
+        <w:ind w:left="5040" w:hanging="360"/>
+      </w:pPr>
+      <w:rPr>
+        <w:rFonts w:ascii="Wingdings" w:hAnsi="Wingdings" w:hint="default"/>
+        <w:sz w:val="20"/>
+      </w:rPr>
+    </w:lvl>
+    <w:lvl w:ilvl="7" w:tentative="1">
+      <w:start w:val="1"/>
+      <w:numFmt w:val="bullet"/>
+      <w:lvlText w:val=""/>
+      <w:lvlJc w:val="left"/>
+      <w:pPr>
+        <w:tabs>
+          <w:tab w:val="num" w:pos="5760"/>
+        </w:tabs>
+        <w:ind w:left="5760" w:hanging="360"/>
+      </w:pPr>
+      <w:rPr>
+        <w:rFonts w:ascii="Wingdings" w:hAnsi="Wingdings" w:hint="default"/>
+        <w:sz w:val="20"/>
+      </w:rPr>
+    </w:lvl>
+    <w:lvl w:ilvl="8" w:tentative="1">
+      <w:start w:val="1"/>
+      <w:numFmt w:val="bullet"/>
+      <w:lvlText w:val=""/>
+      <w:lvlJc w:val="left"/>
+      <w:pPr>
+        <w:tabs>
+          <w:tab w:val="num" w:pos="6480"/>
+        </w:tabs>
+        <w:ind w:left="6480" w:hanging="360"/>
+      </w:pPr>
+      <w:rPr>
+        <w:rFonts w:ascii="Wingdings" w:hAnsi="Wingdings" w:hint="default"/>
+        <w:sz w:val="20"/>
+      </w:rPr>
+    </w:lvl>
+  </w:abstractNum>
+  <w:abstractNum w:abstractNumId="17" w15:restartNumberingAfterBreak="0">
     <w:nsid w:val="4A765645"/>
     <w:multiLevelType w:val="multilevel"/>
     <w:tmpl w:val="C4AA6924"/>
@@ -7636,7 +9082,7 @@
       </w:rPr>
     </w:lvl>
   </w:abstractNum>
-  <w:abstractNum w:abstractNumId="13" w15:restartNumberingAfterBreak="0">
+  <w:abstractNum w:abstractNumId="18" w15:restartNumberingAfterBreak="0">
     <w:nsid w:val="4E414EC2"/>
     <w:multiLevelType w:val="multilevel"/>
     <w:tmpl w:val="6BBA3D38"/>
@@ -7785,7 +9231,7 @@
       </w:rPr>
     </w:lvl>
   </w:abstractNum>
-  <w:abstractNum w:abstractNumId="14" w15:restartNumberingAfterBreak="0">
+  <w:abstractNum w:abstractNumId="19" w15:restartNumberingAfterBreak="0">
     <w:nsid w:val="5443533E"/>
     <w:multiLevelType w:val="multilevel"/>
     <w:tmpl w:val="8446EBBC"/>
@@ -7934,7 +9380,7 @@
       </w:rPr>
     </w:lvl>
   </w:abstractNum>
-  <w:abstractNum w:abstractNumId="15" w15:restartNumberingAfterBreak="0">
+  <w:abstractNum w:abstractNumId="20" w15:restartNumberingAfterBreak="0">
     <w:nsid w:val="5E953EED"/>
     <w:multiLevelType w:val="multilevel"/>
     <w:tmpl w:val="A71ECE4C"/>
@@ -8083,7 +9529,7 @@
       </w:rPr>
     </w:lvl>
   </w:abstractNum>
-  <w:abstractNum w:abstractNumId="16" w15:restartNumberingAfterBreak="0">
+  <w:abstractNum w:abstractNumId="21" w15:restartNumberingAfterBreak="0">
     <w:nsid w:val="609C14FA"/>
     <w:multiLevelType w:val="multilevel"/>
     <w:tmpl w:val="DB1A14BA"/>
@@ -8232,7 +9678,7 @@
       </w:rPr>
     </w:lvl>
   </w:abstractNum>
-  <w:abstractNum w:abstractNumId="17" w15:restartNumberingAfterBreak="0">
+  <w:abstractNum w:abstractNumId="22" w15:restartNumberingAfterBreak="0">
     <w:nsid w:val="69F818B0"/>
     <w:multiLevelType w:val="multilevel"/>
     <w:tmpl w:val="997E2736"/>
@@ -8381,7 +9827,7 @@
       </w:rPr>
     </w:lvl>
   </w:abstractNum>
-  <w:abstractNum w:abstractNumId="18" w15:restartNumberingAfterBreak="0">
+  <w:abstractNum w:abstractNumId="23" w15:restartNumberingAfterBreak="0">
     <w:nsid w:val="7C576E51"/>
     <w:multiLevelType w:val="multilevel"/>
     <w:tmpl w:val="B64ACDBC"/>
@@ -8534,58 +9980,73 @@
     <w:abstractNumId w:val="2"/>
   </w:num>
   <w:num w:numId="2" w16cid:durableId="1586569769">
-    <w:abstractNumId w:val="6"/>
+    <w:abstractNumId w:val="10"/>
   </w:num>
   <w:num w:numId="3" w16cid:durableId="1779371563">
     <w:abstractNumId w:val="4"/>
   </w:num>
   <w:num w:numId="4" w16cid:durableId="1204370127">
-    <w:abstractNumId w:val="10"/>
+    <w:abstractNumId w:val="14"/>
   </w:num>
   <w:num w:numId="5" w16cid:durableId="1751196124">
-    <w:abstractNumId w:val="17"/>
+    <w:abstractNumId w:val="22"/>
   </w:num>
   <w:num w:numId="6" w16cid:durableId="1074426143">
-    <w:abstractNumId w:val="9"/>
+    <w:abstractNumId w:val="13"/>
   </w:num>
   <w:num w:numId="7" w16cid:durableId="57048577">
     <w:abstractNumId w:val="1"/>
   </w:num>
   <w:num w:numId="8" w16cid:durableId="815874802">
-    <w:abstractNumId w:val="7"/>
+    <w:abstractNumId w:val="11"/>
   </w:num>
   <w:num w:numId="9" w16cid:durableId="92941787">
     <w:abstractNumId w:val="0"/>
   </w:num>
   <w:num w:numId="10" w16cid:durableId="669068450">
-    <w:abstractNumId w:val="14"/>
+    <w:abstractNumId w:val="19"/>
   </w:num>
   <w:num w:numId="11" w16cid:durableId="667290534">
-    <w:abstractNumId w:val="18"/>
+    <w:abstractNumId w:val="23"/>
   </w:num>
   <w:num w:numId="12" w16cid:durableId="226839535">
     <w:abstractNumId w:val="3"/>
   </w:num>
   <w:num w:numId="13" w16cid:durableId="2059235817">
+    <w:abstractNumId w:val="17"/>
+  </w:num>
+  <w:num w:numId="14" w16cid:durableId="829562467">
     <w:abstractNumId w:val="12"/>
   </w:num>
-  <w:num w:numId="14" w16cid:durableId="829562467">
-    <w:abstractNumId w:val="8"/>
+  <w:num w:numId="15" w16cid:durableId="1148400394">
+    <w:abstractNumId w:val="21"/>
   </w:num>
-  <w:num w:numId="15" w16cid:durableId="1148400394">
+  <w:num w:numId="16" w16cid:durableId="1835878333">
+    <w:abstractNumId w:val="18"/>
+  </w:num>
+  <w:num w:numId="17" w16cid:durableId="1793818157">
+    <w:abstractNumId w:val="20"/>
+  </w:num>
+  <w:num w:numId="18" w16cid:durableId="916941765">
+    <w:abstractNumId w:val="15"/>
+  </w:num>
+  <w:num w:numId="19" w16cid:durableId="1829982507">
+    <w:abstractNumId w:val="9"/>
+  </w:num>
+  <w:num w:numId="20" w16cid:durableId="1882934644">
     <w:abstractNumId w:val="16"/>
   </w:num>
-  <w:num w:numId="16" w16cid:durableId="1835878333">
-    <w:abstractNumId w:val="13"/>
+  <w:num w:numId="21" w16cid:durableId="324482125">
+    <w:abstractNumId w:val="6"/>
   </w:num>
-  <w:num w:numId="17" w16cid:durableId="1793818157">
-    <w:abstractNumId w:val="15"/>
+  <w:num w:numId="22" w16cid:durableId="1477064731">
+    <w:abstractNumId w:val="5"/>
   </w:num>
-  <w:num w:numId="18" w16cid:durableId="916941765">
-    <w:abstractNumId w:val="11"/>
+  <w:num w:numId="23" w16cid:durableId="850295434">
+    <w:abstractNumId w:val="7"/>
   </w:num>
-  <w:num w:numId="19" w16cid:durableId="1829982507">
-    <w:abstractNumId w:val="5"/>
+  <w:num w:numId="24" w16cid:durableId="657005186">
+    <w:abstractNumId w:val="8"/>
   </w:num>
 </w:numbering>
 </file>
@@ -9018,7 +10479,6 @@
     <w:next w:val="Normal"/>
     <w:link w:val="Titre2Car"/>
     <w:uiPriority w:val="9"/>
-    <w:semiHidden/>
     <w:unhideWhenUsed/>
     <w:qFormat/>
     <w:rsid w:val="00AA1A56"/>
@@ -9235,7 +10695,6 @@
     <w:basedOn w:val="Policepardfaut"/>
     <w:link w:val="Titre2"/>
     <w:uiPriority w:val="9"/>
-    <w:semiHidden/>
     <w:rsid w:val="00AA1A56"/>
     <w:rPr>
       <w:rFonts w:asciiTheme="majorHAnsi" w:eastAsiaTheme="majorEastAsia" w:hAnsiTheme="majorHAnsi" w:cstheme="majorBidi"/>

</xml_diff>

<commit_message>
added multiple linear regression project california housing
</commit_message>
<xml_diff>
--- a/Plan.docx
+++ b/Plan.docx
@@ -1985,6 +1985,7 @@
           <w:lang w:val="en-US" w:eastAsia="fr-FR"/>
           <w14:ligatures w14:val="none"/>
         </w:rPr>
+        <w:lastRenderedPageBreak/>
         <w:t>Days 26–30: Linear Regression</w:t>
       </w:r>
       <w:r>
@@ -2157,6 +2158,7 @@
           <w:kern w:val="0"/>
           <w:sz w:val="24"/>
           <w:szCs w:val="24"/>
+          <w:highlight w:val="yellow"/>
           <w:lang w:val="en-US" w:eastAsia="fr-FR"/>
           <w14:ligatures w14:val="none"/>
         </w:rPr>
@@ -2168,6 +2170,7 @@
           <w:kern w:val="0"/>
           <w:sz w:val="24"/>
           <w:szCs w:val="24"/>
+          <w:highlight w:val="yellow"/>
           <w:lang w:eastAsia="fr-FR"/>
         </w:rPr>
         <mc:AlternateContent>
@@ -2220,7 +2223,13 @@
                               <w:jc w:val="center"/>
                             </w:pPr>
                             <w:r>
-                              <w:t>Régression simple</w:t>
+                              <w:t>Régression</w:t>
+                            </w:r>
+                            <w:r>
+                              <w:t xml:space="preserve"> linéaire</w:t>
+                            </w:r>
+                            <w:r>
+                              <w:t xml:space="preserve"> simple</w:t>
                             </w:r>
                           </w:p>
                         </w:txbxContent>
@@ -2247,7 +2256,13 @@
                         <w:jc w:val="center"/>
                       </w:pPr>
                       <w:r>
-                        <w:t>Régression simple</w:t>
+                        <w:t>Régression</w:t>
+                      </w:r>
+                      <w:r>
+                        <w:t xml:space="preserve"> linéaire</w:t>
+                      </w:r>
+                      <w:r>
+                        <w:t xml:space="preserve"> simple</w:t>
                       </w:r>
                     </w:p>
                   </w:txbxContent>
@@ -2263,6 +2278,7 @@
           <w:kern w:val="0"/>
           <w:sz w:val="24"/>
           <w:szCs w:val="24"/>
+          <w:highlight w:val="yellow"/>
           <w:lang w:val="en-US" w:eastAsia="fr-FR"/>
           <w14:ligatures w14:val="none"/>
         </w:rPr>
@@ -2362,6 +2378,457 @@
     <w:p>
       <w:pPr>
         <w:spacing w:before="100" w:beforeAutospacing="1" w:after="100" w:afterAutospacing="1" w:line="240" w:lineRule="auto"/>
+        <w:rPr>
+          <w:rFonts w:ascii="Times New Roman" w:eastAsia="Times New Roman" w:hAnsi="Times New Roman" w:cs="Times New Roman"/>
+          <w:kern w:val="0"/>
+          <w:sz w:val="24"/>
+          <w:szCs w:val="24"/>
+          <w:highlight w:val="cyan"/>
+          <w:lang w:val="en-US" w:eastAsia="fr-FR"/>
+          <w14:ligatures w14:val="none"/>
+        </w:rPr>
+      </w:pPr>
+      <w:r>
+        <w:rPr>
+          <w:rFonts w:ascii="Times New Roman" w:eastAsia="Times New Roman" w:hAnsi="Times New Roman" w:cs="Times New Roman"/>
+          <w:noProof/>
+          <w:kern w:val="0"/>
+          <w:sz w:val="24"/>
+          <w:szCs w:val="24"/>
+          <w:lang w:val="en-US" w:eastAsia="fr-FR"/>
+        </w:rPr>
+        <mc:AlternateContent>
+          <mc:Choice Requires="wps">
+            <w:drawing>
+              <wp:anchor distT="0" distB="0" distL="114300" distR="114300" simplePos="0" relativeHeight="251661312" behindDoc="0" locked="0" layoutInCell="1" allowOverlap="1" wp14:anchorId="49A4DA9D" wp14:editId="7C646A05">
+                <wp:simplePos x="0" y="0"/>
+                <wp:positionH relativeFrom="column">
+                  <wp:posOffset>389255</wp:posOffset>
+                </wp:positionH>
+                <wp:positionV relativeFrom="paragraph">
+                  <wp:posOffset>27305</wp:posOffset>
+                </wp:positionV>
+                <wp:extent cx="5022850" cy="0"/>
+                <wp:effectExtent l="0" t="19050" r="25400" b="19050"/>
+                <wp:wrapNone/>
+                <wp:docPr id="769074546" name="Connecteur droit 3"/>
+                <wp:cNvGraphicFramePr/>
+                <a:graphic xmlns:a="http://schemas.openxmlformats.org/drawingml/2006/main">
+                  <a:graphicData uri="http://schemas.microsoft.com/office/word/2010/wordprocessingShape">
+                    <wps:wsp>
+                      <wps:cNvCnPr/>
+                      <wps:spPr>
+                        <a:xfrm>
+                          <a:off x="0" y="0"/>
+                          <a:ext cx="5022850" cy="0"/>
+                        </a:xfrm>
+                        <a:prstGeom prst="line">
+                          <a:avLst/>
+                        </a:prstGeom>
+                        <a:ln w="38100">
+                          <a:solidFill>
+                            <a:srgbClr val="7030A0"/>
+                          </a:solidFill>
+                          <a:prstDash val="solid"/>
+                        </a:ln>
+                      </wps:spPr>
+                      <wps:style>
+                        <a:lnRef idx="1">
+                          <a:schemeClr val="accent1"/>
+                        </a:lnRef>
+                        <a:fillRef idx="0">
+                          <a:schemeClr val="accent1"/>
+                        </a:fillRef>
+                        <a:effectRef idx="0">
+                          <a:schemeClr val="accent1"/>
+                        </a:effectRef>
+                        <a:fontRef idx="minor">
+                          <a:schemeClr val="tx1"/>
+                        </a:fontRef>
+                      </wps:style>
+                      <wps:bodyPr/>
+                    </wps:wsp>
+                  </a:graphicData>
+                </a:graphic>
+                <wp14:sizeRelH relativeFrom="margin">
+                  <wp14:pctWidth>0</wp14:pctWidth>
+                </wp14:sizeRelH>
+                <wp14:sizeRelV relativeFrom="margin">
+                  <wp14:pctHeight>0</wp14:pctHeight>
+                </wp14:sizeRelV>
+              </wp:anchor>
+            </w:drawing>
+          </mc:Choice>
+          <mc:Fallback>
+            <w:pict>
+              <v:line w14:anchorId="12AAB504" id="Connecteur droit 3" o:spid="_x0000_s1026" style="position:absolute;z-index:251661312;visibility:visible;mso-wrap-style:square;mso-width-percent:0;mso-height-percent:0;mso-wrap-distance-left:9pt;mso-wrap-distance-top:0;mso-wrap-distance-right:9pt;mso-wrap-distance-bottom:0;mso-position-horizontal:absolute;mso-position-horizontal-relative:text;mso-position-vertical:absolute;mso-position-vertical-relative:text;mso-width-percent:0;mso-height-percent:0;mso-width-relative:margin;mso-height-relative:margin" from="30.65pt,2.15pt" to="426.15pt,2.15pt" o:gfxdata="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" strokecolor="#7030a0" strokeweight="3pt">
+                <v:stroke joinstyle="miter"/>
+              </v:line>
+            </w:pict>
+          </mc:Fallback>
+        </mc:AlternateContent>
+      </w:r>
+    </w:p>
+    <w:p>
+      <w:pPr>
+        <w:numPr>
+          <w:ilvl w:val="0"/>
+          <w:numId w:val="6"/>
+        </w:numPr>
+        <w:spacing w:before="100" w:beforeAutospacing="1" w:after="100" w:afterAutospacing="1" w:line="240" w:lineRule="auto"/>
+        <w:rPr>
+          <w:rFonts w:ascii="Times New Roman" w:eastAsia="Times New Roman" w:hAnsi="Times New Roman" w:cs="Times New Roman"/>
+          <w:kern w:val="0"/>
+          <w:sz w:val="24"/>
+          <w:szCs w:val="24"/>
+          <w:lang w:val="en-US" w:eastAsia="fr-FR"/>
+          <w14:ligatures w14:val="none"/>
+        </w:rPr>
+      </w:pPr>
+      <w:r>
+        <w:rPr>
+          <w:rFonts w:ascii="Times New Roman" w:eastAsia="Times New Roman" w:hAnsi="Times New Roman" w:cs="Times New Roman"/>
+          <w:b/>
+          <w:bCs/>
+          <w:noProof/>
+          <w:kern w:val="0"/>
+          <w:sz w:val="27"/>
+          <w:szCs w:val="27"/>
+          <w:lang w:val="en-US" w:eastAsia="fr-FR"/>
+        </w:rPr>
+        <mc:AlternateContent>
+          <mc:Choice Requires="wps">
+            <w:drawing>
+              <wp:anchor distT="0" distB="0" distL="114300" distR="114300" simplePos="0" relativeHeight="251663360" behindDoc="0" locked="0" layoutInCell="1" allowOverlap="1" wp14:anchorId="648BB4EE" wp14:editId="5EA8EC1F">
+                <wp:simplePos x="0" y="0"/>
+                <wp:positionH relativeFrom="column">
+                  <wp:posOffset>3621405</wp:posOffset>
+                </wp:positionH>
+                <wp:positionV relativeFrom="paragraph">
+                  <wp:posOffset>7620</wp:posOffset>
+                </wp:positionV>
+                <wp:extent cx="247650" cy="908050"/>
+                <wp:effectExtent l="0" t="19050" r="19050" b="25400"/>
+                <wp:wrapNone/>
+                <wp:docPr id="1656916188" name="Accolade ouvrante 1"/>
+                <wp:cNvGraphicFramePr/>
+                <a:graphic xmlns:a="http://schemas.openxmlformats.org/drawingml/2006/main">
+                  <a:graphicData uri="http://schemas.microsoft.com/office/word/2010/wordprocessingShape">
+                    <wps:wsp>
+                      <wps:cNvSpPr/>
+                      <wps:spPr>
+                        <a:xfrm rot="10800000">
+                          <a:off x="0" y="0"/>
+                          <a:ext cx="247650" cy="908050"/>
+                        </a:xfrm>
+                        <a:prstGeom prst="leftBrace">
+                          <a:avLst/>
+                        </a:prstGeom>
+                        <a:ln w="28575">
+                          <a:solidFill>
+                            <a:srgbClr val="EE0000"/>
+                          </a:solidFill>
+                        </a:ln>
+                      </wps:spPr>
+                      <wps:style>
+                        <a:lnRef idx="1">
+                          <a:schemeClr val="accent1"/>
+                        </a:lnRef>
+                        <a:fillRef idx="0">
+                          <a:schemeClr val="accent1"/>
+                        </a:fillRef>
+                        <a:effectRef idx="0">
+                          <a:schemeClr val="accent1"/>
+                        </a:effectRef>
+                        <a:fontRef idx="minor">
+                          <a:schemeClr val="tx1"/>
+                        </a:fontRef>
+                      </wps:style>
+                      <wps:bodyPr rot="0" spcFirstLastPara="0" vertOverflow="overflow" horzOverflow="overflow" vert="horz" wrap="square" lIns="91440" tIns="45720" rIns="91440" bIns="45720" numCol="1" spcCol="0" rtlCol="0" fromWordArt="0" anchor="ctr" anchorCtr="0" forceAA="0" compatLnSpc="1">
+                        <a:prstTxWarp prst="textNoShape">
+                          <a:avLst/>
+                        </a:prstTxWarp>
+                        <a:noAutofit/>
+                      </wps:bodyPr>
+                    </wps:wsp>
+                  </a:graphicData>
+                </a:graphic>
+              </wp:anchor>
+            </w:drawing>
+          </mc:Choice>
+          <mc:Fallback>
+            <w:pict>
+              <v:shapetype w14:anchorId="60129C38" id="_x0000_t87" coordsize="21600,21600" o:spt="87" adj="1800,10800" path="m21600,qx10800@0l10800@2qy0@11,10800@3l10800@1qy21600,21600e" filled="f">
+                <v:formulas>
+                  <v:f eqn="val #0"/>
+                  <v:f eqn="sum 21600 0 #0"/>
+                  <v:f eqn="sum #1 0 #0"/>
+                  <v:f eqn="sum #1 #0 0"/>
+                  <v:f eqn="prod #0 9598 32768"/>
+                  <v:f eqn="sum 21600 0 @4"/>
+                  <v:f eqn="sum 21600 0 #1"/>
+                  <v:f eqn="min #1 @6"/>
+                  <v:f eqn="prod @7 1 2"/>
+                  <v:f eqn="prod #0 2 1"/>
+                  <v:f eqn="sum 21600 0 @9"/>
+                  <v:f eqn="val #1"/>
+                </v:formulas>
+                <v:path arrowok="t" o:connecttype="custom" o:connectlocs="21600,0;0,10800;21600,21600" textboxrect="13963,@4,21600,@5"/>
+                <v:handles>
+                  <v:h position="center,#0" yrange="0,@8"/>
+                  <v:h position="topLeft,#1" yrange="@9,@10"/>
+                </v:handles>
+              </v:shapetype>
+              <v:shape id="Accolade ouvrante 1" o:spid="_x0000_s1026" type="#_x0000_t87" style="position:absolute;margin-left:285.15pt;margin-top:.6pt;width:19.5pt;height:71.5pt;rotation:180;z-index:251663360;visibility:visible;mso-wrap-style:square;mso-wrap-distance-left:9pt;mso-wrap-distance-top:0;mso-wrap-distance-right:9pt;mso-wrap-distance-bottom:0;mso-position-horizontal:absolute;mso-position-horizontal-relative:text;mso-position-vertical:absolute;mso-position-vertical-relative:text;v-text-anchor:middle" o:gfxdata="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" adj="491" strokecolor="#e00" strokeweight="2.25pt">
+                <v:stroke joinstyle="miter"/>
+              </v:shape>
+            </w:pict>
+          </mc:Fallback>
+        </mc:AlternateContent>
+      </w:r>
+      <w:r>
+        <w:rPr>
+          <w:rFonts w:ascii="Times New Roman" w:eastAsia="Times New Roman" w:hAnsi="Times New Roman" w:cs="Times New Roman"/>
+          <w:kern w:val="0"/>
+          <w:sz w:val="24"/>
+          <w:szCs w:val="24"/>
+          <w:lang w:val="en-US" w:eastAsia="fr-FR"/>
+          <w14:ligatures w14:val="none"/>
+        </w:rPr>
+        <w:t>Theory – cost function, gradient descent</w:t>
+      </w:r>
+    </w:p>
+    <w:p>
+      <w:pPr>
+        <w:numPr>
+          <w:ilvl w:val="0"/>
+          <w:numId w:val="6"/>
+        </w:numPr>
+        <w:spacing w:before="100" w:beforeAutospacing="1" w:after="100" w:afterAutospacing="1" w:line="240" w:lineRule="auto"/>
+        <w:rPr>
+          <w:rFonts w:ascii="Times New Roman" w:eastAsia="Times New Roman" w:hAnsi="Times New Roman" w:cs="Times New Roman"/>
+          <w:kern w:val="0"/>
+          <w:sz w:val="24"/>
+          <w:szCs w:val="24"/>
+          <w:lang w:val="en-US" w:eastAsia="fr-FR"/>
+          <w14:ligatures w14:val="none"/>
+        </w:rPr>
+      </w:pPr>
+      <w:r>
+        <w:rPr>
+          <w:rFonts w:ascii="Times New Roman" w:eastAsia="Times New Roman" w:hAnsi="Times New Roman" w:cs="Times New Roman"/>
+          <w:noProof/>
+          <w:kern w:val="0"/>
+          <w:sz w:val="24"/>
+          <w:szCs w:val="24"/>
+          <w:lang w:eastAsia="fr-FR"/>
+        </w:rPr>
+        <mc:AlternateContent>
+          <mc:Choice Requires="wps">
+            <w:drawing>
+              <wp:anchor distT="0" distB="0" distL="114300" distR="114300" simplePos="0" relativeHeight="251664384" behindDoc="0" locked="0" layoutInCell="1" allowOverlap="1" wp14:anchorId="11773D0D" wp14:editId="266DE2C2">
+                <wp:simplePos x="0" y="0"/>
+                <wp:positionH relativeFrom="column">
+                  <wp:posOffset>4205605</wp:posOffset>
+                </wp:positionH>
+                <wp:positionV relativeFrom="paragraph">
+                  <wp:posOffset>67945</wp:posOffset>
+                </wp:positionV>
+                <wp:extent cx="2044700" cy="463550"/>
+                <wp:effectExtent l="0" t="0" r="12700" b="12700"/>
+                <wp:wrapNone/>
+                <wp:docPr id="811500658" name="Rectangle 2"/>
+                <wp:cNvGraphicFramePr/>
+                <a:graphic xmlns:a="http://schemas.openxmlformats.org/drawingml/2006/main">
+                  <a:graphicData uri="http://schemas.microsoft.com/office/word/2010/wordprocessingShape">
+                    <wps:wsp>
+                      <wps:cNvSpPr/>
+                      <wps:spPr>
+                        <a:xfrm>
+                          <a:off x="0" y="0"/>
+                          <a:ext cx="2044700" cy="463550"/>
+                        </a:xfrm>
+                        <a:prstGeom prst="rect">
+                          <a:avLst/>
+                        </a:prstGeom>
+                      </wps:spPr>
+                      <wps:style>
+                        <a:lnRef idx="2">
+                          <a:schemeClr val="accent6"/>
+                        </a:lnRef>
+                        <a:fillRef idx="1">
+                          <a:schemeClr val="lt1"/>
+                        </a:fillRef>
+                        <a:effectRef idx="0">
+                          <a:schemeClr val="accent6"/>
+                        </a:effectRef>
+                        <a:fontRef idx="minor">
+                          <a:schemeClr val="dk1"/>
+                        </a:fontRef>
+                      </wps:style>
+                      <wps:txbx>
+                        <w:txbxContent>
+                          <w:p>
+                            <w:pPr>
+                              <w:jc w:val="center"/>
+                            </w:pPr>
+                            <w:r>
+                              <w:t xml:space="preserve">Régression </w:t>
+                            </w:r>
+                            <w:r>
+                              <w:t>linéaire multiple</w:t>
+                            </w:r>
+                          </w:p>
+                        </w:txbxContent>
+                      </wps:txbx>
+                      <wps:bodyPr rot="0" spcFirstLastPara="0" vertOverflow="overflow" horzOverflow="overflow" vert="horz" wrap="square" lIns="91440" tIns="45720" rIns="91440" bIns="45720" numCol="1" spcCol="0" rtlCol="0" fromWordArt="0" anchor="ctr" anchorCtr="0" forceAA="0" compatLnSpc="1">
+                        <a:prstTxWarp prst="textNoShape">
+                          <a:avLst/>
+                        </a:prstTxWarp>
+                        <a:noAutofit/>
+                      </wps:bodyPr>
+                    </wps:wsp>
+                  </a:graphicData>
+                </a:graphic>
+              </wp:anchor>
+            </w:drawing>
+          </mc:Choice>
+          <mc:Fallback>
+            <w:pict>
+              <v:rect w14:anchorId="11773D0D" id="_x0000_s1027" style="position:absolute;left:0;text-align:left;margin-left:331.15pt;margin-top:5.35pt;width:161pt;height:36.5pt;z-index:251664384;visibility:visible;mso-wrap-style:square;mso-wrap-distance-left:9pt;mso-wrap-distance-top:0;mso-wrap-distance-right:9pt;mso-wrap-distance-bottom:0;mso-position-horizontal:absolute;mso-position-horizontal-relative:text;mso-position-vertical:absolute;mso-position-vertical-relative:text;v-text-anchor:middle" o:gfxdata="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" fillcolor="white [3201]" strokecolor="#70ad47 [3209]" strokeweight="1pt">
+                <v:textbox>
+                  <w:txbxContent>
+                    <w:p>
+                      <w:pPr>
+                        <w:jc w:val="center"/>
+                      </w:pPr>
+                      <w:r>
+                        <w:t xml:space="preserve">Régression </w:t>
+                      </w:r>
+                      <w:r>
+                        <w:t>linéaire multiple</w:t>
+                      </w:r>
+                    </w:p>
+                  </w:txbxContent>
+                </v:textbox>
+              </v:rect>
+            </w:pict>
+          </mc:Fallback>
+        </mc:AlternateContent>
+      </w:r>
+      <w:r>
+        <w:rPr>
+          <w:rFonts w:ascii="Times New Roman" w:eastAsia="Times New Roman" w:hAnsi="Times New Roman" w:cs="Times New Roman"/>
+          <w:kern w:val="0"/>
+          <w:sz w:val="24"/>
+          <w:szCs w:val="24"/>
+          <w:lang w:val="en-US" w:eastAsia="fr-FR"/>
+          <w14:ligatures w14:val="none"/>
+        </w:rPr>
+        <w:t>Implement from scratch (using NumPy)</w:t>
+      </w:r>
+    </w:p>
+    <w:p>
+      <w:pPr>
+        <w:numPr>
+          <w:ilvl w:val="0"/>
+          <w:numId w:val="6"/>
+        </w:numPr>
+        <w:spacing w:before="100" w:beforeAutospacing="1" w:after="100" w:afterAutospacing="1" w:line="240" w:lineRule="auto"/>
+        <w:rPr>
+          <w:rFonts w:ascii="Times New Roman" w:eastAsia="Times New Roman" w:hAnsi="Times New Roman" w:cs="Times New Roman"/>
+          <w:kern w:val="0"/>
+          <w:sz w:val="24"/>
+          <w:szCs w:val="24"/>
+          <w:lang w:val="en-US" w:eastAsia="fr-FR"/>
+          <w14:ligatures w14:val="none"/>
+        </w:rPr>
+      </w:pPr>
+      <w:r>
+        <w:rPr>
+          <w:rFonts w:ascii="Times New Roman" w:eastAsia="Times New Roman" w:hAnsi="Times New Roman" w:cs="Times New Roman"/>
+          <w:kern w:val="0"/>
+          <w:sz w:val="24"/>
+          <w:szCs w:val="24"/>
+          <w:lang w:val="en-US" w:eastAsia="fr-FR"/>
+          <w14:ligatures w14:val="none"/>
+        </w:rPr>
+        <w:t>Scikit-learn regression model</w:t>
+      </w:r>
+    </w:p>
+    <w:p>
+      <w:pPr>
+        <w:numPr>
+          <w:ilvl w:val="0"/>
+          <w:numId w:val="6"/>
+        </w:numPr>
+        <w:spacing w:before="100" w:beforeAutospacing="1" w:after="100" w:afterAutospacing="1" w:line="240" w:lineRule="auto"/>
+        <w:rPr>
+          <w:rFonts w:ascii="Times New Roman" w:eastAsia="Times New Roman" w:hAnsi="Times New Roman" w:cs="Times New Roman"/>
+          <w:kern w:val="0"/>
+          <w:sz w:val="24"/>
+          <w:szCs w:val="24"/>
+          <w:lang w:val="en-US" w:eastAsia="fr-FR"/>
+          <w14:ligatures w14:val="none"/>
+        </w:rPr>
+      </w:pPr>
+      <w:r>
+        <w:rPr>
+          <w:rFonts w:ascii="Times New Roman" w:eastAsia="Times New Roman" w:hAnsi="Times New Roman" w:cs="Times New Roman"/>
+          <w:kern w:val="0"/>
+          <w:sz w:val="24"/>
+          <w:szCs w:val="24"/>
+          <w:lang w:val="en-US" w:eastAsia="fr-FR"/>
+          <w14:ligatures w14:val="none"/>
+        </w:rPr>
+        <w:t>Evaluation: MSE, R², residual plots</w:t>
+      </w:r>
+    </w:p>
+    <w:p>
+      <w:pPr>
+        <w:numPr>
+          <w:ilvl w:val="0"/>
+          <w:numId w:val="6"/>
+        </w:numPr>
+        <w:spacing w:before="100" w:beforeAutospacing="1" w:after="100" w:afterAutospacing="1" w:line="240" w:lineRule="auto"/>
+        <w:rPr>
+          <w:rFonts w:ascii="Times New Roman" w:eastAsia="Times New Roman" w:hAnsi="Times New Roman" w:cs="Times New Roman"/>
+          <w:kern w:val="0"/>
+          <w:sz w:val="24"/>
+          <w:szCs w:val="24"/>
+          <w:lang w:val="en-US" w:eastAsia="fr-FR"/>
+          <w14:ligatures w14:val="none"/>
+        </w:rPr>
+      </w:pPr>
+      <w:r>
+        <w:rPr>
+          <w:rFonts w:ascii="Times New Roman" w:eastAsia="Times New Roman" w:hAnsi="Times New Roman" w:cs="Times New Roman"/>
+          <w:kern w:val="0"/>
+          <w:sz w:val="24"/>
+          <w:szCs w:val="24"/>
+          <w:lang w:val="en-US" w:eastAsia="fr-FR"/>
+          <w14:ligatures w14:val="none"/>
+        </w:rPr>
+        <w:t>Mini project: Predict house prices</w:t>
+      </w:r>
+    </w:p>
+    <w:p>
+      <w:pPr>
+        <w:spacing w:before="100" w:beforeAutospacing="1" w:after="100" w:afterAutospacing="1" w:line="240" w:lineRule="auto"/>
+        <w:rPr>
+          <w:rFonts w:ascii="Times New Roman" w:eastAsia="Times New Roman" w:hAnsi="Times New Roman" w:cs="Times New Roman"/>
+          <w:kern w:val="0"/>
+          <w:sz w:val="24"/>
+          <w:szCs w:val="24"/>
+          <w:highlight w:val="cyan"/>
+          <w:lang w:val="en-US" w:eastAsia="fr-FR"/>
+          <w14:ligatures w14:val="none"/>
+        </w:rPr>
+      </w:pPr>
+    </w:p>
+    <w:p>
+      <w:pPr>
+        <w:spacing w:before="100" w:beforeAutospacing="1" w:after="100" w:afterAutospacing="1" w:line="240" w:lineRule="auto"/>
         <w:outlineLvl w:val="2"/>
         <w:rPr>
           <w:rFonts w:ascii="Times New Roman" w:eastAsia="Times New Roman" w:hAnsi="Times New Roman" w:cs="Times New Roman"/>
@@ -3415,7 +3882,6 @@
           <w:lang w:eastAsia="fr-FR"/>
           <w14:ligatures w14:val="none"/>
         </w:rPr>
-        <w:lastRenderedPageBreak/>
         <w:t>Days 46–</w:t>
       </w:r>
       <w:proofErr w:type="gramStart"/>
@@ -6247,7 +6713,18 @@
         <w:t>robuste</w:t>
       </w:r>
       <w:r>
-        <w:t xml:space="preserve"> (ex. RANSAC, Huber)</w:t>
+        <w:t xml:space="preserve"> (ex. RANSAC, </w:t>
+      </w:r>
+      <w:r>
+        <w:rPr>
+          <w:b/>
+          <w:bCs/>
+          <w:color w:val="EE0000"/>
+          <w:sz w:val="32"/>
+          <w:szCs w:val="32"/>
+          <w:highlight w:val="yellow"/>
+        </w:rPr>
+        <w:t>Huber)</w:t>
       </w:r>
     </w:p>
     <w:p>

</xml_diff>

<commit_message>
added polynomial regression project
</commit_message>
<xml_diff>
--- a/Plan.docx
+++ b/Plan.docx
@@ -1998,10 +1998,7 @@
                               <w:jc w:val="center"/>
                             </w:pPr>
                             <w:r>
-                              <w:t xml:space="preserve">Régression linéaire </w:t>
-                            </w:r>
-                            <w:r>
-                              <w:t>multiple</w:t>
+                              <w:t>Régression linéaire multiple</w:t>
                             </w:r>
                           </w:p>
                         </w:txbxContent>
@@ -2028,10 +2025,7 @@
                         <w:jc w:val="center"/>
                       </w:pPr>
                       <w:r>
-                        <w:t xml:space="preserve">Régression linéaire </w:t>
-                      </w:r>
-                      <w:r>
-                        <w:t>multiple</w:t>
+                        <w:t>Régression linéaire multiple</w:t>
                       </w:r>
                     </w:p>
                   </w:txbxContent>
@@ -2081,7 +2075,7 @@
           <w:lang w:val="en-US" w:eastAsia="fr-FR"/>
           <w14:ligatures w14:val="none"/>
         </w:rPr>
-        <w:t>Evaluation: MSE, R², residual plots</w:t>
+        <w:t>Evaluation: MSE, R²</w:t>
       </w:r>
     </w:p>
     <w:p>
@@ -2113,6 +2107,451 @@
         </w:rPr>
         <w:t>Mini project: Predict house prices</w:t>
       </w:r>
+    </w:p>
+    <w:p>
+      <w:pPr>
+        <w:spacing w:before="100" w:beforeAutospacing="1" w:after="100" w:afterAutospacing="1" w:line="240" w:lineRule="auto"/>
+        <w:rPr>
+          <w:rFonts w:ascii="Times New Roman" w:eastAsia="Times New Roman" w:hAnsi="Times New Roman" w:cs="Times New Roman"/>
+          <w:kern w:val="0"/>
+          <w:sz w:val="24"/>
+          <w:szCs w:val="24"/>
+          <w:highlight w:val="cyan"/>
+          <w:lang w:val="en-US" w:eastAsia="fr-FR"/>
+          <w14:ligatures w14:val="none"/>
+        </w:rPr>
+      </w:pPr>
+      <w:r>
+        <w:rPr>
+          <w:rFonts w:ascii="Times New Roman" w:eastAsia="Times New Roman" w:hAnsi="Times New Roman" w:cs="Times New Roman"/>
+          <w:noProof/>
+          <w:kern w:val="0"/>
+          <w:sz w:val="24"/>
+          <w:szCs w:val="24"/>
+          <w:lang w:val="en-US" w:eastAsia="fr-FR"/>
+        </w:rPr>
+        <mc:AlternateContent>
+          <mc:Choice Requires="wps">
+            <w:drawing>
+              <wp:anchor distT="0" distB="0" distL="114300" distR="114300" simplePos="0" relativeHeight="251670528" behindDoc="0" locked="0" layoutInCell="1" allowOverlap="1" wp14:anchorId="38BABF21" wp14:editId="5192E7B7">
+                <wp:simplePos x="0" y="0"/>
+                <wp:positionH relativeFrom="column">
+                  <wp:posOffset>348846</wp:posOffset>
+                </wp:positionH>
+                <wp:positionV relativeFrom="paragraph">
+                  <wp:posOffset>172331</wp:posOffset>
+                </wp:positionV>
+                <wp:extent cx="5022850" cy="0"/>
+                <wp:effectExtent l="0" t="19050" r="25400" b="19050"/>
+                <wp:wrapNone/>
+                <wp:docPr id="1851018417" name="Connecteur droit 3"/>
+                <wp:cNvGraphicFramePr/>
+                <a:graphic xmlns:a="http://schemas.openxmlformats.org/drawingml/2006/main">
+                  <a:graphicData uri="http://schemas.microsoft.com/office/word/2010/wordprocessingShape">
+                    <wps:wsp>
+                      <wps:cNvCnPr/>
+                      <wps:spPr>
+                        <a:xfrm>
+                          <a:off x="0" y="0"/>
+                          <a:ext cx="5022850" cy="0"/>
+                        </a:xfrm>
+                        <a:prstGeom prst="line">
+                          <a:avLst/>
+                        </a:prstGeom>
+                        <a:ln w="38100">
+                          <a:solidFill>
+                            <a:srgbClr val="7030A0"/>
+                          </a:solidFill>
+                          <a:prstDash val="solid"/>
+                        </a:ln>
+                      </wps:spPr>
+                      <wps:style>
+                        <a:lnRef idx="1">
+                          <a:schemeClr val="accent1"/>
+                        </a:lnRef>
+                        <a:fillRef idx="0">
+                          <a:schemeClr val="accent1"/>
+                        </a:fillRef>
+                        <a:effectRef idx="0">
+                          <a:schemeClr val="accent1"/>
+                        </a:effectRef>
+                        <a:fontRef idx="minor">
+                          <a:schemeClr val="tx1"/>
+                        </a:fontRef>
+                      </wps:style>
+                      <wps:bodyPr/>
+                    </wps:wsp>
+                  </a:graphicData>
+                </a:graphic>
+                <wp14:sizeRelH relativeFrom="margin">
+                  <wp14:pctWidth>0</wp14:pctWidth>
+                </wp14:sizeRelH>
+                <wp14:sizeRelV relativeFrom="margin">
+                  <wp14:pctHeight>0</wp14:pctHeight>
+                </wp14:sizeRelV>
+              </wp:anchor>
+            </w:drawing>
+          </mc:Choice>
+          <mc:Fallback>
+            <w:pict>
+              <v:line w14:anchorId="5906D361" id="Connecteur droit 3" o:spid="_x0000_s1026" style="position:absolute;z-index:251670528;visibility:visible;mso-wrap-style:square;mso-width-percent:0;mso-height-percent:0;mso-wrap-distance-left:9pt;mso-wrap-distance-top:0;mso-wrap-distance-right:9pt;mso-wrap-distance-bottom:0;mso-position-horizontal:absolute;mso-position-horizontal-relative:text;mso-position-vertical:absolute;mso-position-vertical-relative:text;mso-width-percent:0;mso-height-percent:0;mso-width-relative:margin;mso-height-relative:margin" from="27.45pt,13.55pt" to="422.95pt,13.55pt" o:gfxdata="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" strokecolor="#7030a0" strokeweight="3pt">
+                <v:stroke joinstyle="miter"/>
+              </v:line>
+            </w:pict>
+          </mc:Fallback>
+        </mc:AlternateContent>
+      </w:r>
+    </w:p>
+    <w:p>
+      <w:pPr>
+        <w:numPr>
+          <w:ilvl w:val="0"/>
+          <w:numId w:val="6"/>
+        </w:numPr>
+        <w:spacing w:before="100" w:beforeAutospacing="1" w:after="100" w:afterAutospacing="1" w:line="240" w:lineRule="auto"/>
+        <w:rPr>
+          <w:rFonts w:ascii="Times New Roman" w:eastAsia="Times New Roman" w:hAnsi="Times New Roman" w:cs="Times New Roman"/>
+          <w:kern w:val="0"/>
+          <w:sz w:val="24"/>
+          <w:szCs w:val="24"/>
+          <w:highlight w:val="yellow"/>
+          <w:lang w:val="en-US" w:eastAsia="fr-FR"/>
+          <w14:ligatures w14:val="none"/>
+        </w:rPr>
+      </w:pPr>
+      <w:r>
+        <w:rPr>
+          <w:rFonts w:ascii="Times New Roman" w:eastAsia="Times New Roman" w:hAnsi="Times New Roman" w:cs="Times New Roman"/>
+          <w:b/>
+          <w:bCs/>
+          <w:noProof/>
+          <w:kern w:val="0"/>
+          <w:sz w:val="27"/>
+          <w:szCs w:val="27"/>
+          <w:highlight w:val="yellow"/>
+          <w:lang w:val="en-US" w:eastAsia="fr-FR"/>
+        </w:rPr>
+        <mc:AlternateContent>
+          <mc:Choice Requires="wps">
+            <w:drawing>
+              <wp:anchor distT="0" distB="0" distL="114300" distR="114300" simplePos="0" relativeHeight="251667456" behindDoc="0" locked="0" layoutInCell="1" allowOverlap="1" wp14:anchorId="57A289B7" wp14:editId="118A0794">
+                <wp:simplePos x="0" y="0"/>
+                <wp:positionH relativeFrom="column">
+                  <wp:posOffset>3621405</wp:posOffset>
+                </wp:positionH>
+                <wp:positionV relativeFrom="paragraph">
+                  <wp:posOffset>7620</wp:posOffset>
+                </wp:positionV>
+                <wp:extent cx="247650" cy="908050"/>
+                <wp:effectExtent l="0" t="19050" r="19050" b="25400"/>
+                <wp:wrapNone/>
+                <wp:docPr id="1944351233" name="Accolade ouvrante 1"/>
+                <wp:cNvGraphicFramePr/>
+                <a:graphic xmlns:a="http://schemas.openxmlformats.org/drawingml/2006/main">
+                  <a:graphicData uri="http://schemas.microsoft.com/office/word/2010/wordprocessingShape">
+                    <wps:wsp>
+                      <wps:cNvSpPr/>
+                      <wps:spPr>
+                        <a:xfrm rot="10800000">
+                          <a:off x="0" y="0"/>
+                          <a:ext cx="247650" cy="908050"/>
+                        </a:xfrm>
+                        <a:prstGeom prst="leftBrace">
+                          <a:avLst/>
+                        </a:prstGeom>
+                        <a:ln w="28575">
+                          <a:solidFill>
+                            <a:srgbClr val="EE0000"/>
+                          </a:solidFill>
+                        </a:ln>
+                      </wps:spPr>
+                      <wps:style>
+                        <a:lnRef idx="1">
+                          <a:schemeClr val="accent1"/>
+                        </a:lnRef>
+                        <a:fillRef idx="0">
+                          <a:schemeClr val="accent1"/>
+                        </a:fillRef>
+                        <a:effectRef idx="0">
+                          <a:schemeClr val="accent1"/>
+                        </a:effectRef>
+                        <a:fontRef idx="minor">
+                          <a:schemeClr val="tx1"/>
+                        </a:fontRef>
+                      </wps:style>
+                      <wps:bodyPr rot="0" spcFirstLastPara="0" vertOverflow="overflow" horzOverflow="overflow" vert="horz" wrap="square" lIns="91440" tIns="45720" rIns="91440" bIns="45720" numCol="1" spcCol="0" rtlCol="0" fromWordArt="0" anchor="ctr" anchorCtr="0" forceAA="0" compatLnSpc="1">
+                        <a:prstTxWarp prst="textNoShape">
+                          <a:avLst/>
+                        </a:prstTxWarp>
+                        <a:noAutofit/>
+                      </wps:bodyPr>
+                    </wps:wsp>
+                  </a:graphicData>
+                </a:graphic>
+              </wp:anchor>
+            </w:drawing>
+          </mc:Choice>
+          <mc:Fallback>
+            <w:pict>
+              <v:shapetype w14:anchorId="07690786" id="_x0000_t87" coordsize="21600,21600" o:spt="87" adj="1800,10800" path="m21600,qx10800@0l10800@2qy0@11,10800@3l10800@1qy21600,21600e" filled="f">
+                <v:formulas>
+                  <v:f eqn="val #0"/>
+                  <v:f eqn="sum 21600 0 #0"/>
+                  <v:f eqn="sum #1 0 #0"/>
+                  <v:f eqn="sum #1 #0 0"/>
+                  <v:f eqn="prod #0 9598 32768"/>
+                  <v:f eqn="sum 21600 0 @4"/>
+                  <v:f eqn="sum 21600 0 #1"/>
+                  <v:f eqn="min #1 @6"/>
+                  <v:f eqn="prod @7 1 2"/>
+                  <v:f eqn="prod #0 2 1"/>
+                  <v:f eqn="sum 21600 0 @9"/>
+                  <v:f eqn="val #1"/>
+                </v:formulas>
+                <v:path arrowok="t" o:connecttype="custom" o:connectlocs="21600,0;0,10800;21600,21600" textboxrect="13963,@4,21600,@5"/>
+                <v:handles>
+                  <v:h position="center,#0" yrange="0,@8"/>
+                  <v:h position="topLeft,#1" yrange="@9,@10"/>
+                </v:handles>
+              </v:shapetype>
+              <v:shape id="Accolade ouvrante 1" o:spid="_x0000_s1026" type="#_x0000_t87" style="position:absolute;margin-left:285.15pt;margin-top:.6pt;width:19.5pt;height:71.5pt;rotation:180;z-index:251667456;visibility:visible;mso-wrap-style:square;mso-wrap-distance-left:9pt;mso-wrap-distance-top:0;mso-wrap-distance-right:9pt;mso-wrap-distance-bottom:0;mso-position-horizontal:absolute;mso-position-horizontal-relative:text;mso-position-vertical:absolute;mso-position-vertical-relative:text;v-text-anchor:middle" o:gfxdata="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" adj="491" strokecolor="#e00" strokeweight="2.25pt">
+                <v:stroke joinstyle="miter"/>
+              </v:shape>
+            </w:pict>
+          </mc:Fallback>
+        </mc:AlternateContent>
+      </w:r>
+      <w:r>
+        <w:rPr>
+          <w:rFonts w:ascii="Times New Roman" w:eastAsia="Times New Roman" w:hAnsi="Times New Roman" w:cs="Times New Roman"/>
+          <w:kern w:val="0"/>
+          <w:sz w:val="24"/>
+          <w:szCs w:val="24"/>
+          <w:highlight w:val="yellow"/>
+          <w:lang w:val="en-US" w:eastAsia="fr-FR"/>
+          <w14:ligatures w14:val="none"/>
+        </w:rPr>
+        <w:t>Theory – cost function, gradient descent</w:t>
+      </w:r>
+    </w:p>
+    <w:p>
+      <w:pPr>
+        <w:numPr>
+          <w:ilvl w:val="0"/>
+          <w:numId w:val="6"/>
+        </w:numPr>
+        <w:spacing w:before="100" w:beforeAutospacing="1" w:after="100" w:afterAutospacing="1" w:line="240" w:lineRule="auto"/>
+        <w:rPr>
+          <w:rFonts w:ascii="Times New Roman" w:eastAsia="Times New Roman" w:hAnsi="Times New Roman" w:cs="Times New Roman"/>
+          <w:kern w:val="0"/>
+          <w:sz w:val="24"/>
+          <w:szCs w:val="24"/>
+          <w:highlight w:val="yellow"/>
+          <w:lang w:val="en-US" w:eastAsia="fr-FR"/>
+          <w14:ligatures w14:val="none"/>
+        </w:rPr>
+      </w:pPr>
+      <w:r>
+        <w:rPr>
+          <w:rFonts w:ascii="Times New Roman" w:eastAsia="Times New Roman" w:hAnsi="Times New Roman" w:cs="Times New Roman"/>
+          <w:noProof/>
+          <w:kern w:val="0"/>
+          <w:sz w:val="24"/>
+          <w:szCs w:val="24"/>
+          <w:highlight w:val="yellow"/>
+          <w:lang w:eastAsia="fr-FR"/>
+        </w:rPr>
+        <mc:AlternateContent>
+          <mc:Choice Requires="wps">
+            <w:drawing>
+              <wp:anchor distT="0" distB="0" distL="114300" distR="114300" simplePos="0" relativeHeight="251668480" behindDoc="0" locked="0" layoutInCell="1" allowOverlap="1" wp14:anchorId="775177ED" wp14:editId="0B72C406">
+                <wp:simplePos x="0" y="0"/>
+                <wp:positionH relativeFrom="column">
+                  <wp:posOffset>4121150</wp:posOffset>
+                </wp:positionH>
+                <wp:positionV relativeFrom="paragraph">
+                  <wp:posOffset>13970</wp:posOffset>
+                </wp:positionV>
+                <wp:extent cx="2044700" cy="463550"/>
+                <wp:effectExtent l="0" t="0" r="12700" b="12700"/>
+                <wp:wrapNone/>
+                <wp:docPr id="81035718" name="Rectangle 2"/>
+                <wp:cNvGraphicFramePr/>
+                <a:graphic xmlns:a="http://schemas.openxmlformats.org/drawingml/2006/main">
+                  <a:graphicData uri="http://schemas.microsoft.com/office/word/2010/wordprocessingShape">
+                    <wps:wsp>
+                      <wps:cNvSpPr/>
+                      <wps:spPr>
+                        <a:xfrm>
+                          <a:off x="0" y="0"/>
+                          <a:ext cx="2044700" cy="463550"/>
+                        </a:xfrm>
+                        <a:prstGeom prst="rect">
+                          <a:avLst/>
+                        </a:prstGeom>
+                      </wps:spPr>
+                      <wps:style>
+                        <a:lnRef idx="2">
+                          <a:schemeClr val="accent6"/>
+                        </a:lnRef>
+                        <a:fillRef idx="1">
+                          <a:schemeClr val="lt1"/>
+                        </a:fillRef>
+                        <a:effectRef idx="0">
+                          <a:schemeClr val="accent6"/>
+                        </a:effectRef>
+                        <a:fontRef idx="minor">
+                          <a:schemeClr val="dk1"/>
+                        </a:fontRef>
+                      </wps:style>
+                      <wps:txbx>
+                        <w:txbxContent>
+                          <w:p>
+                            <w:pPr>
+                              <w:jc w:val="center"/>
+                            </w:pPr>
+                            <w:r>
+                              <w:t xml:space="preserve">Régression </w:t>
+                            </w:r>
+                            <w:r>
+                              <w:t>Polynomiale simple et multiple</w:t>
+                            </w:r>
+                          </w:p>
+                        </w:txbxContent>
+                      </wps:txbx>
+                      <wps:bodyPr rot="0" spcFirstLastPara="0" vertOverflow="overflow" horzOverflow="overflow" vert="horz" wrap="square" lIns="91440" tIns="45720" rIns="91440" bIns="45720" numCol="1" spcCol="0" rtlCol="0" fromWordArt="0" anchor="ctr" anchorCtr="0" forceAA="0" compatLnSpc="1">
+                        <a:prstTxWarp prst="textNoShape">
+                          <a:avLst/>
+                        </a:prstTxWarp>
+                        <a:noAutofit/>
+                      </wps:bodyPr>
+                    </wps:wsp>
+                  </a:graphicData>
+                </a:graphic>
+              </wp:anchor>
+            </w:drawing>
+          </mc:Choice>
+          <mc:Fallback>
+            <w:pict>
+              <v:rect w14:anchorId="775177ED" id="_x0000_s1028" style="position:absolute;left:0;text-align:left;margin-left:324.5pt;margin-top:1.1pt;width:161pt;height:36.5pt;z-index:251668480;visibility:visible;mso-wrap-style:square;mso-wrap-distance-left:9pt;mso-wrap-distance-top:0;mso-wrap-distance-right:9pt;mso-wrap-distance-bottom:0;mso-position-horizontal:absolute;mso-position-horizontal-relative:text;mso-position-vertical:absolute;mso-position-vertical-relative:text;v-text-anchor:middle" o:gfxdata="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" fillcolor="white [3201]" strokecolor="#70ad47 [3209]" strokeweight="1pt">
+                <v:textbox>
+                  <w:txbxContent>
+                    <w:p>
+                      <w:pPr>
+                        <w:jc w:val="center"/>
+                      </w:pPr>
+                      <w:r>
+                        <w:t xml:space="preserve">Régression </w:t>
+                      </w:r>
+                      <w:r>
+                        <w:t>Polynomiale simple et multiple</w:t>
+                      </w:r>
+                    </w:p>
+                  </w:txbxContent>
+                </v:textbox>
+              </v:rect>
+            </w:pict>
+          </mc:Fallback>
+        </mc:AlternateContent>
+      </w:r>
+      <w:r>
+        <w:rPr>
+          <w:rFonts w:ascii="Times New Roman" w:eastAsia="Times New Roman" w:hAnsi="Times New Roman" w:cs="Times New Roman"/>
+          <w:kern w:val="0"/>
+          <w:sz w:val="24"/>
+          <w:szCs w:val="24"/>
+          <w:highlight w:val="yellow"/>
+          <w:lang w:val="en-US" w:eastAsia="fr-FR"/>
+          <w14:ligatures w14:val="none"/>
+        </w:rPr>
+        <w:t>Scikit-learn regression model</w:t>
+      </w:r>
+    </w:p>
+    <w:p>
+      <w:pPr>
+        <w:numPr>
+          <w:ilvl w:val="0"/>
+          <w:numId w:val="6"/>
+        </w:numPr>
+        <w:spacing w:before="100" w:beforeAutospacing="1" w:after="100" w:afterAutospacing="1" w:line="240" w:lineRule="auto"/>
+        <w:rPr>
+          <w:rFonts w:ascii="Times New Roman" w:eastAsia="Times New Roman" w:hAnsi="Times New Roman" w:cs="Times New Roman"/>
+          <w:kern w:val="0"/>
+          <w:sz w:val="24"/>
+          <w:szCs w:val="24"/>
+          <w:highlight w:val="yellow"/>
+          <w:lang w:val="en-US" w:eastAsia="fr-FR"/>
+          <w14:ligatures w14:val="none"/>
+        </w:rPr>
+      </w:pPr>
+      <w:r>
+        <w:rPr>
+          <w:rFonts w:ascii="Times New Roman" w:eastAsia="Times New Roman" w:hAnsi="Times New Roman" w:cs="Times New Roman"/>
+          <w:kern w:val="0"/>
+          <w:sz w:val="24"/>
+          <w:szCs w:val="24"/>
+          <w:highlight w:val="yellow"/>
+          <w:lang w:val="en-US" w:eastAsia="fr-FR"/>
+          <w14:ligatures w14:val="none"/>
+        </w:rPr>
+        <w:t>Evaluation: MSE, R²</w:t>
+      </w:r>
+    </w:p>
+    <w:p>
+      <w:pPr>
+        <w:numPr>
+          <w:ilvl w:val="0"/>
+          <w:numId w:val="6"/>
+        </w:numPr>
+        <w:spacing w:before="100" w:beforeAutospacing="1" w:after="100" w:afterAutospacing="1" w:line="240" w:lineRule="auto"/>
+        <w:rPr>
+          <w:rFonts w:ascii="Times New Roman" w:eastAsia="Times New Roman" w:hAnsi="Times New Roman" w:cs="Times New Roman"/>
+          <w:kern w:val="0"/>
+          <w:sz w:val="24"/>
+          <w:szCs w:val="24"/>
+          <w:highlight w:val="cyan"/>
+          <w:lang w:val="en-US" w:eastAsia="fr-FR"/>
+          <w14:ligatures w14:val="none"/>
+        </w:rPr>
+      </w:pPr>
+      <w:r>
+        <w:rPr>
+          <w:rFonts w:ascii="Times New Roman" w:eastAsia="Times New Roman" w:hAnsi="Times New Roman" w:cs="Times New Roman"/>
+          <w:kern w:val="0"/>
+          <w:sz w:val="24"/>
+          <w:szCs w:val="24"/>
+          <w:highlight w:val="cyan"/>
+          <w:lang w:val="en-US" w:eastAsia="fr-FR"/>
+          <w14:ligatures w14:val="none"/>
+        </w:rPr>
+        <w:t xml:space="preserve">Mini project: Predict </w:t>
+      </w:r>
+      <w:r>
+        <w:rPr>
+          <w:rFonts w:ascii="Times New Roman" w:eastAsia="Times New Roman" w:hAnsi="Times New Roman" w:cs="Times New Roman"/>
+          <w:kern w:val="0"/>
+          <w:sz w:val="24"/>
+          <w:szCs w:val="24"/>
+          <w:highlight w:val="cyan"/>
+          <w:lang w:val="en-US" w:eastAsia="fr-FR"/>
+          <w14:ligatures w14:val="none"/>
+        </w:rPr>
+        <w:t>Position Salaries</w:t>
+      </w:r>
+    </w:p>
+    <w:p>
+      <w:pPr>
+        <w:spacing w:before="100" w:beforeAutospacing="1" w:after="100" w:afterAutospacing="1" w:line="240" w:lineRule="auto"/>
+        <w:rPr>
+          <w:rFonts w:ascii="Times New Roman" w:eastAsia="Times New Roman" w:hAnsi="Times New Roman" w:cs="Times New Roman"/>
+          <w:kern w:val="0"/>
+          <w:sz w:val="24"/>
+          <w:szCs w:val="24"/>
+          <w:highlight w:val="cyan"/>
+          <w:lang w:val="en-US" w:eastAsia="fr-FR"/>
+          <w14:ligatures w14:val="none"/>
+        </w:rPr>
+      </w:pPr>
     </w:p>
     <w:p>
       <w:pPr>
@@ -3859,14 +4298,21 @@
           <w:ilvl w:val="0"/>
           <w:numId w:val="20"/>
         </w:numPr>
-      </w:pPr>
-      <w:r>
+        <w:rPr>
+          <w:highlight w:val="yellow"/>
+        </w:rPr>
+      </w:pPr>
+      <w:r>
+        <w:rPr>
+          <w:highlight w:val="yellow"/>
+        </w:rPr>
         <w:t xml:space="preserve">Régression linéaire </w:t>
       </w:r>
       <w:r>
         <w:rPr>
           <w:b/>
           <w:bCs/>
+          <w:highlight w:val="yellow"/>
         </w:rPr>
         <w:t>multiple</w:t>
       </w:r>
@@ -3877,14 +4323,21 @@
           <w:ilvl w:val="0"/>
           <w:numId w:val="20"/>
         </w:numPr>
-      </w:pPr>
-      <w:r>
+        <w:rPr>
+          <w:highlight w:val="yellow"/>
+        </w:rPr>
+      </w:pPr>
+      <w:r>
+        <w:rPr>
+          <w:highlight w:val="yellow"/>
+        </w:rPr>
         <w:t xml:space="preserve">Régression </w:t>
       </w:r>
       <w:r>
         <w:rPr>
           <w:b/>
           <w:bCs/>
+          <w:highlight w:val="yellow"/>
         </w:rPr>
         <w:t>polynomiale</w:t>
       </w:r>

</xml_diff>

<commit_message>
added breast cancer detection project
</commit_message>
<xml_diff>
--- a/Plan.docx
+++ b/Plan.docx
@@ -98,35 +98,7 @@
           <w:lang w:eastAsia="fr-FR"/>
           <w14:ligatures w14:val="none"/>
         </w:rPr>
-        <w:t>Days 1–</w:t>
-      </w:r>
-      <w:proofErr w:type="gramStart"/>
-      <w:r>
-        <w:rPr>
-          <w:rFonts w:ascii="Times New Roman" w:eastAsia="Times New Roman" w:hAnsi="Times New Roman" w:cs="Times New Roman"/>
-          <w:b/>
-          <w:bCs/>
-          <w:kern w:val="0"/>
-          <w:sz w:val="27"/>
-          <w:szCs w:val="27"/>
-          <w:lang w:eastAsia="fr-FR"/>
-          <w14:ligatures w14:val="none"/>
-        </w:rPr>
-        <w:t>5:</w:t>
-      </w:r>
-      <w:proofErr w:type="gramEnd"/>
-      <w:r>
-        <w:rPr>
-          <w:rFonts w:ascii="Times New Roman" w:eastAsia="Times New Roman" w:hAnsi="Times New Roman" w:cs="Times New Roman"/>
-          <w:b/>
-          <w:bCs/>
-          <w:kern w:val="0"/>
-          <w:sz w:val="27"/>
-          <w:szCs w:val="27"/>
-          <w:lang w:eastAsia="fr-FR"/>
-          <w14:ligatures w14:val="none"/>
-        </w:rPr>
-        <w:t xml:space="preserve"> Python for Data Science</w:t>
+        <w:t>Days 1–5: Python for Data Science</w:t>
       </w:r>
     </w:p>
     <w:p>
@@ -186,33 +158,7 @@
           <w:lang w:eastAsia="fr-FR"/>
           <w14:ligatures w14:val="none"/>
         </w:rPr>
-        <w:t xml:space="preserve">Day </w:t>
-      </w:r>
-      <w:proofErr w:type="gramStart"/>
-      <w:r>
-        <w:rPr>
-          <w:rFonts w:ascii="Times New Roman" w:eastAsia="Times New Roman" w:hAnsi="Times New Roman" w:cs="Times New Roman"/>
-          <w:kern w:val="0"/>
-          <w:sz w:val="24"/>
-          <w:szCs w:val="24"/>
-          <w:highlight w:val="yellow"/>
-          <w:lang w:eastAsia="fr-FR"/>
-          <w14:ligatures w14:val="none"/>
-        </w:rPr>
-        <w:t>2:</w:t>
-      </w:r>
-      <w:proofErr w:type="gramEnd"/>
-      <w:r>
-        <w:rPr>
-          <w:rFonts w:ascii="Times New Roman" w:eastAsia="Times New Roman" w:hAnsi="Times New Roman" w:cs="Times New Roman"/>
-          <w:kern w:val="0"/>
-          <w:sz w:val="24"/>
-          <w:szCs w:val="24"/>
-          <w:highlight w:val="yellow"/>
-          <w:lang w:eastAsia="fr-FR"/>
-          <w14:ligatures w14:val="none"/>
-        </w:rPr>
-        <w:t xml:space="preserve"> </w:t>
+        <w:t xml:space="preserve">Day 2: </w:t>
       </w:r>
       <w:proofErr w:type="spellStart"/>
       <w:r>
@@ -423,35 +369,7 @@
           <w:lang w:eastAsia="fr-FR"/>
           <w14:ligatures w14:val="none"/>
         </w:rPr>
-        <w:t>Days 6–</w:t>
-      </w:r>
-      <w:proofErr w:type="gramStart"/>
-      <w:r>
-        <w:rPr>
-          <w:rFonts w:ascii="Times New Roman" w:eastAsia="Times New Roman" w:hAnsi="Times New Roman" w:cs="Times New Roman"/>
-          <w:b/>
-          <w:bCs/>
-          <w:kern w:val="0"/>
-          <w:sz w:val="27"/>
-          <w:szCs w:val="27"/>
-          <w:lang w:eastAsia="fr-FR"/>
-          <w14:ligatures w14:val="none"/>
-        </w:rPr>
-        <w:t>10:</w:t>
-      </w:r>
-      <w:proofErr w:type="gramEnd"/>
-      <w:r>
-        <w:rPr>
-          <w:rFonts w:ascii="Times New Roman" w:eastAsia="Times New Roman" w:hAnsi="Times New Roman" w:cs="Times New Roman"/>
-          <w:b/>
-          <w:bCs/>
-          <w:kern w:val="0"/>
-          <w:sz w:val="27"/>
-          <w:szCs w:val="27"/>
-          <w:lang w:eastAsia="fr-FR"/>
-          <w14:ligatures w14:val="none"/>
-        </w:rPr>
-        <w:t xml:space="preserve"> </w:t>
+        <w:t xml:space="preserve">Days 6–10: </w:t>
       </w:r>
       <w:proofErr w:type="spellStart"/>
       <w:r>
@@ -509,33 +427,7 @@
           <w:lang w:eastAsia="fr-FR"/>
           <w14:ligatures w14:val="none"/>
         </w:rPr>
-        <w:t xml:space="preserve">Day </w:t>
-      </w:r>
-      <w:proofErr w:type="gramStart"/>
-      <w:r>
-        <w:rPr>
-          <w:rFonts w:ascii="Times New Roman" w:eastAsia="Times New Roman" w:hAnsi="Times New Roman" w:cs="Times New Roman"/>
-          <w:kern w:val="0"/>
-          <w:sz w:val="24"/>
-          <w:szCs w:val="24"/>
-          <w:highlight w:val="yellow"/>
-          <w:lang w:eastAsia="fr-FR"/>
-          <w14:ligatures w14:val="none"/>
-        </w:rPr>
-        <w:t>6:</w:t>
-      </w:r>
-      <w:proofErr w:type="gramEnd"/>
-      <w:r>
-        <w:rPr>
-          <w:rFonts w:ascii="Times New Roman" w:eastAsia="Times New Roman" w:hAnsi="Times New Roman" w:cs="Times New Roman"/>
-          <w:kern w:val="0"/>
-          <w:sz w:val="24"/>
-          <w:szCs w:val="24"/>
-          <w:highlight w:val="yellow"/>
-          <w:lang w:eastAsia="fr-FR"/>
-          <w14:ligatures w14:val="none"/>
-        </w:rPr>
-        <w:t xml:space="preserve"> </w:t>
+        <w:t xml:space="preserve">Day 6: </w:t>
       </w:r>
       <w:proofErr w:type="spellStart"/>
       <w:r>
@@ -1045,33 +937,7 @@
           <w:lang w:eastAsia="fr-FR"/>
           <w14:ligatures w14:val="none"/>
         </w:rPr>
-        <w:t xml:space="preserve">Day </w:t>
-      </w:r>
-      <w:proofErr w:type="gramStart"/>
-      <w:r>
-        <w:rPr>
-          <w:rFonts w:ascii="Times New Roman" w:eastAsia="Times New Roman" w:hAnsi="Times New Roman" w:cs="Times New Roman"/>
-          <w:kern w:val="0"/>
-          <w:sz w:val="24"/>
-          <w:szCs w:val="24"/>
-          <w:highlight w:val="yellow"/>
-          <w:lang w:eastAsia="fr-FR"/>
-          <w14:ligatures w14:val="none"/>
-        </w:rPr>
-        <w:t>13:</w:t>
-      </w:r>
-      <w:proofErr w:type="gramEnd"/>
-      <w:r>
-        <w:rPr>
-          <w:rFonts w:ascii="Times New Roman" w:eastAsia="Times New Roman" w:hAnsi="Times New Roman" w:cs="Times New Roman"/>
-          <w:kern w:val="0"/>
-          <w:sz w:val="24"/>
-          <w:szCs w:val="24"/>
-          <w:highlight w:val="yellow"/>
-          <w:lang w:eastAsia="fr-FR"/>
-          <w14:ligatures w14:val="none"/>
-        </w:rPr>
-        <w:t xml:space="preserve"> Matrices and </w:t>
+        <w:t xml:space="preserve">Day 13: Matrices and </w:t>
       </w:r>
       <w:proofErr w:type="spellStart"/>
       <w:r>
@@ -1144,33 +1010,7 @@
           <w:lang w:eastAsia="fr-FR"/>
           <w14:ligatures w14:val="none"/>
         </w:rPr>
-        <w:t xml:space="preserve">Day </w:t>
-      </w:r>
-      <w:proofErr w:type="gramStart"/>
-      <w:r>
-        <w:rPr>
-          <w:rFonts w:ascii="Times New Roman" w:eastAsia="Times New Roman" w:hAnsi="Times New Roman" w:cs="Times New Roman"/>
-          <w:kern w:val="0"/>
-          <w:sz w:val="24"/>
-          <w:szCs w:val="24"/>
-          <w:highlight w:val="yellow"/>
-          <w:lang w:eastAsia="fr-FR"/>
-          <w14:ligatures w14:val="none"/>
-        </w:rPr>
-        <w:t>15:</w:t>
-      </w:r>
-      <w:proofErr w:type="gramEnd"/>
-      <w:r>
-        <w:rPr>
-          <w:rFonts w:ascii="Times New Roman" w:eastAsia="Times New Roman" w:hAnsi="Times New Roman" w:cs="Times New Roman"/>
-          <w:kern w:val="0"/>
-          <w:sz w:val="24"/>
-          <w:szCs w:val="24"/>
-          <w:highlight w:val="yellow"/>
-          <w:lang w:eastAsia="fr-FR"/>
-          <w14:ligatures w14:val="none"/>
-        </w:rPr>
-        <w:t xml:space="preserve"> </w:t>
+        <w:t xml:space="preserve">Day 15: </w:t>
       </w:r>
       <w:proofErr w:type="spellStart"/>
       <w:r>
@@ -1291,35 +1131,7 @@
           <w:lang w:eastAsia="fr-FR"/>
           <w14:ligatures w14:val="none"/>
         </w:rPr>
-        <w:t>Days 16–</w:t>
-      </w:r>
-      <w:proofErr w:type="gramStart"/>
-      <w:r>
-        <w:rPr>
-          <w:rFonts w:ascii="Times New Roman" w:eastAsia="Times New Roman" w:hAnsi="Times New Roman" w:cs="Times New Roman"/>
-          <w:b/>
-          <w:bCs/>
-          <w:kern w:val="0"/>
-          <w:sz w:val="27"/>
-          <w:szCs w:val="27"/>
-          <w:lang w:eastAsia="fr-FR"/>
-          <w14:ligatures w14:val="none"/>
-        </w:rPr>
-        <w:t>20:</w:t>
-      </w:r>
-      <w:proofErr w:type="gramEnd"/>
-      <w:r>
-        <w:rPr>
-          <w:rFonts w:ascii="Times New Roman" w:eastAsia="Times New Roman" w:hAnsi="Times New Roman" w:cs="Times New Roman"/>
-          <w:b/>
-          <w:bCs/>
-          <w:kern w:val="0"/>
-          <w:sz w:val="27"/>
-          <w:szCs w:val="27"/>
-          <w:lang w:eastAsia="fr-FR"/>
-          <w14:ligatures w14:val="none"/>
-        </w:rPr>
-        <w:t xml:space="preserve"> Data </w:t>
+        <w:t xml:space="preserve">Days 16–20: Data </w:t>
       </w:r>
       <w:proofErr w:type="spellStart"/>
       <w:r>
@@ -1466,20 +1278,7 @@
           <w:lang w:val="en-US" w:eastAsia="fr-FR"/>
           <w14:ligatures w14:val="none"/>
         </w:rPr>
-        <w:t xml:space="preserve">Day 19: </w:t>
-      </w:r>
-      <w:proofErr w:type="gramStart"/>
-      <w:r>
-        <w:rPr>
-          <w:rFonts w:ascii="Times New Roman" w:eastAsia="Times New Roman" w:hAnsi="Times New Roman" w:cs="Times New Roman"/>
-          <w:kern w:val="0"/>
-          <w:sz w:val="24"/>
-          <w:szCs w:val="24"/>
-          <w:highlight w:val="yellow"/>
-          <w:lang w:val="en-US" w:eastAsia="fr-FR"/>
-          <w14:ligatures w14:val="none"/>
-        </w:rPr>
-        <w:t>Correlation</w:t>
+        <w:t>Day 19: Correlation</w:t>
       </w:r>
       <w:r>
         <w:rPr>
@@ -1493,7 +1292,6 @@
         </w:rPr>
         <w:t>(</w:t>
       </w:r>
-      <w:proofErr w:type="gramEnd"/>
       <w:r>
         <w:rPr>
           <w:rFonts w:ascii="Times New Roman" w:eastAsia="Times New Roman" w:hAnsi="Times New Roman" w:cs="Times New Roman"/>
@@ -1619,9 +1417,8 @@
           <w:lang w:val="en-US" w:eastAsia="fr-FR"/>
           <w14:ligatures w14:val="none"/>
         </w:rPr>
-        <w:t xml:space="preserve">Day 20: Mini project: Full EDA on Titanic </w:t>
-      </w:r>
-      <w:proofErr w:type="gramStart"/>
+        <w:t>Day 20: Mini project: Full EDA on Titanic dataset</w:t>
+      </w:r>
       <w:r>
         <w:rPr>
           <w:rFonts w:ascii="Times New Roman" w:eastAsia="Times New Roman" w:hAnsi="Times New Roman" w:cs="Times New Roman"/>
@@ -1632,32 +1429,7 @@
           <w:lang w:val="en-US" w:eastAsia="fr-FR"/>
           <w14:ligatures w14:val="none"/>
         </w:rPr>
-        <w:t>dataset</w:t>
-      </w:r>
-      <w:r>
-        <w:rPr>
-          <w:rFonts w:ascii="Times New Roman" w:eastAsia="Times New Roman" w:hAnsi="Times New Roman" w:cs="Times New Roman"/>
-          <w:kern w:val="0"/>
-          <w:sz w:val="24"/>
-          <w:szCs w:val="24"/>
-          <w:highlight w:val="cyan"/>
-          <w:lang w:val="en-US" w:eastAsia="fr-FR"/>
-          <w14:ligatures w14:val="none"/>
-        </w:rPr>
-        <w:t>(</w:t>
-      </w:r>
-      <w:proofErr w:type="gramEnd"/>
-      <w:r>
-        <w:rPr>
-          <w:rFonts w:ascii="Times New Roman" w:eastAsia="Times New Roman" w:hAnsi="Times New Roman" w:cs="Times New Roman"/>
-          <w:kern w:val="0"/>
-          <w:sz w:val="24"/>
-          <w:szCs w:val="24"/>
-          <w:highlight w:val="cyan"/>
-          <w:lang w:val="en-US" w:eastAsia="fr-FR"/>
-          <w14:ligatures w14:val="none"/>
-        </w:rPr>
-        <w:t>done day 18)</w:t>
+        <w:t>(done day 18)</w:t>
       </w:r>
     </w:p>
     <w:p>
@@ -1725,35 +1497,7 @@
           <w:lang w:val="en-US" w:eastAsia="fr-FR"/>
           <w14:ligatures w14:val="none"/>
         </w:rPr>
-        <w:t xml:space="preserve"> Phase </w:t>
-      </w:r>
-      <w:proofErr w:type="gramStart"/>
-      <w:r>
-        <w:rPr>
-          <w:rFonts w:ascii="Times New Roman" w:eastAsia="Times New Roman" w:hAnsi="Times New Roman" w:cs="Times New Roman"/>
-          <w:b/>
-          <w:bCs/>
-          <w:kern w:val="0"/>
-          <w:sz w:val="36"/>
-          <w:szCs w:val="36"/>
-          <w:lang w:val="en-US" w:eastAsia="fr-FR"/>
-          <w14:ligatures w14:val="none"/>
-        </w:rPr>
-        <w:t>2:</w:t>
-      </w:r>
-      <w:proofErr w:type="gramEnd"/>
-      <w:r>
-        <w:rPr>
-          <w:rFonts w:ascii="Times New Roman" w:eastAsia="Times New Roman" w:hAnsi="Times New Roman" w:cs="Times New Roman"/>
-          <w:b/>
-          <w:bCs/>
-          <w:kern w:val="0"/>
-          <w:sz w:val="36"/>
-          <w:szCs w:val="36"/>
-          <w:lang w:val="en-US" w:eastAsia="fr-FR"/>
-          <w14:ligatures w14:val="none"/>
-        </w:rPr>
-        <w:t xml:space="preserve"> Machine Learning Basics (Days 21–50)</w:t>
+        <w:t xml:space="preserve"> Phase 2: Machine Learning Basics (Days 21–50)</w:t>
       </w:r>
     </w:p>
     <w:p>
@@ -1985,6 +1729,7 @@
           <w:lang w:val="en-US" w:eastAsia="fr-FR"/>
           <w14:ligatures w14:val="none"/>
         </w:rPr>
+        <w:lastRenderedPageBreak/>
         <w:t>Days 26–30: Linear Regression</w:t>
       </w:r>
       <w:r>
@@ -3266,35 +3011,7 @@
           <w:lang w:eastAsia="fr-FR"/>
           <w14:ligatures w14:val="none"/>
         </w:rPr>
-        <w:t>Days 31–</w:t>
-      </w:r>
-      <w:proofErr w:type="gramStart"/>
-      <w:r>
-        <w:rPr>
-          <w:rFonts w:ascii="Times New Roman" w:eastAsia="Times New Roman" w:hAnsi="Times New Roman" w:cs="Times New Roman"/>
-          <w:b/>
-          <w:bCs/>
-          <w:kern w:val="0"/>
-          <w:sz w:val="27"/>
-          <w:szCs w:val="27"/>
-          <w:lang w:eastAsia="fr-FR"/>
-          <w14:ligatures w14:val="none"/>
-        </w:rPr>
-        <w:t>35:</w:t>
-      </w:r>
-      <w:proofErr w:type="gramEnd"/>
-      <w:r>
-        <w:rPr>
-          <w:rFonts w:ascii="Times New Roman" w:eastAsia="Times New Roman" w:hAnsi="Times New Roman" w:cs="Times New Roman"/>
-          <w:b/>
-          <w:bCs/>
-          <w:kern w:val="0"/>
-          <w:sz w:val="27"/>
-          <w:szCs w:val="27"/>
-          <w:lang w:eastAsia="fr-FR"/>
-          <w14:ligatures w14:val="none"/>
-        </w:rPr>
-        <w:t xml:space="preserve"> Classification – </w:t>
+        <w:t xml:space="preserve">Days 31–35: Classification – </w:t>
       </w:r>
       <w:proofErr w:type="spellStart"/>
       <w:r>
@@ -3432,16 +3149,18 @@
           <w:kern w:val="0"/>
           <w:sz w:val="24"/>
           <w:szCs w:val="24"/>
-          <w:lang w:val="en-US" w:eastAsia="fr-FR"/>
-          <w14:ligatures w14:val="none"/>
-        </w:rPr>
-      </w:pPr>
-      <w:r>
-        <w:rPr>
-          <w:rFonts w:ascii="Times New Roman" w:eastAsia="Times New Roman" w:hAnsi="Times New Roman" w:cs="Times New Roman"/>
-          <w:kern w:val="0"/>
-          <w:sz w:val="24"/>
-          <w:szCs w:val="24"/>
+          <w:highlight w:val="yellow"/>
+          <w:lang w:val="en-US" w:eastAsia="fr-FR"/>
+          <w14:ligatures w14:val="none"/>
+        </w:rPr>
+      </w:pPr>
+      <w:r>
+        <w:rPr>
+          <w:rFonts w:ascii="Times New Roman" w:eastAsia="Times New Roman" w:hAnsi="Times New Roman" w:cs="Times New Roman"/>
+          <w:kern w:val="0"/>
+          <w:sz w:val="24"/>
+          <w:szCs w:val="24"/>
+          <w:highlight w:val="yellow"/>
           <w:lang w:val="en-US" w:eastAsia="fr-FR"/>
           <w14:ligatures w14:val="none"/>
         </w:rPr>
@@ -3460,16 +3179,18 @@
           <w:kern w:val="0"/>
           <w:sz w:val="24"/>
           <w:szCs w:val="24"/>
-          <w:lang w:eastAsia="fr-FR"/>
-          <w14:ligatures w14:val="none"/>
-        </w:rPr>
-      </w:pPr>
-      <w:r>
-        <w:rPr>
-          <w:rFonts w:ascii="Times New Roman" w:eastAsia="Times New Roman" w:hAnsi="Times New Roman" w:cs="Times New Roman"/>
-          <w:kern w:val="0"/>
-          <w:sz w:val="24"/>
-          <w:szCs w:val="24"/>
+          <w:highlight w:val="yellow"/>
+          <w:lang w:eastAsia="fr-FR"/>
+          <w14:ligatures w14:val="none"/>
+        </w:rPr>
+      </w:pPr>
+      <w:r>
+        <w:rPr>
+          <w:rFonts w:ascii="Times New Roman" w:eastAsia="Times New Roman" w:hAnsi="Times New Roman" w:cs="Times New Roman"/>
+          <w:kern w:val="0"/>
+          <w:sz w:val="24"/>
+          <w:szCs w:val="24"/>
+          <w:highlight w:val="yellow"/>
           <w:lang w:eastAsia="fr-FR"/>
           <w14:ligatures w14:val="none"/>
         </w:rPr>
@@ -3482,6 +3203,7 @@
           <w:kern w:val="0"/>
           <w:sz w:val="24"/>
           <w:szCs w:val="24"/>
+          <w:highlight w:val="yellow"/>
           <w:lang w:eastAsia="fr-FR"/>
           <w14:ligatures w14:val="none"/>
         </w:rPr>
@@ -3494,6 +3216,7 @@
           <w:kern w:val="0"/>
           <w:sz w:val="24"/>
           <w:szCs w:val="24"/>
+          <w:highlight w:val="yellow"/>
           <w:lang w:eastAsia="fr-FR"/>
           <w14:ligatures w14:val="none"/>
         </w:rPr>
@@ -3506,6 +3229,7 @@
           <w:kern w:val="0"/>
           <w:sz w:val="24"/>
           <w:szCs w:val="24"/>
+          <w:highlight w:val="yellow"/>
           <w:lang w:eastAsia="fr-FR"/>
           <w14:ligatures w14:val="none"/>
         </w:rPr>
@@ -3518,6 +3242,7 @@
           <w:kern w:val="0"/>
           <w:sz w:val="24"/>
           <w:szCs w:val="24"/>
+          <w:highlight w:val="yellow"/>
           <w:lang w:eastAsia="fr-FR"/>
           <w14:ligatures w14:val="none"/>
         </w:rPr>
@@ -3530,6 +3255,7 @@
           <w:kern w:val="0"/>
           <w:sz w:val="24"/>
           <w:szCs w:val="24"/>
+          <w:highlight w:val="yellow"/>
           <w:lang w:eastAsia="fr-FR"/>
           <w14:ligatures w14:val="none"/>
         </w:rPr>
@@ -3690,7 +3416,6 @@
           <w:lang w:val="en-US" w:eastAsia="fr-FR"/>
           <w14:ligatures w14:val="none"/>
         </w:rPr>
-        <w:lastRenderedPageBreak/>
         <w:t>Day 36: Theory – how trees split, Gini/entropy</w:t>
       </w:r>
     </w:p>

</xml_diff>

<commit_message>
added digits classification project
</commit_message>
<xml_diff>
--- a/Plan.docx
+++ b/Plan.docx
@@ -3011,9 +3011,9 @@
           <w:lang w:eastAsia="fr-FR"/>
           <w14:ligatures w14:val="none"/>
         </w:rPr>
-        <w:t xml:space="preserve">Days 31–35: Classification – </w:t>
-      </w:r>
-      <w:proofErr w:type="spellStart"/>
+        <w:t>Days 31–</w:t>
+      </w:r>
+      <w:proofErr w:type="gramStart"/>
       <w:r>
         <w:rPr>
           <w:rFonts w:ascii="Times New Roman" w:eastAsia="Times New Roman" w:hAnsi="Times New Roman" w:cs="Times New Roman"/>
@@ -3025,9 +3025,9 @@
           <w:lang w:eastAsia="fr-FR"/>
           <w14:ligatures w14:val="none"/>
         </w:rPr>
-        <w:t>Logistic</w:t>
-      </w:r>
-      <w:proofErr w:type="spellEnd"/>
+        <w:t>35:</w:t>
+      </w:r>
+      <w:proofErr w:type="gramEnd"/>
       <w:r>
         <w:rPr>
           <w:rFonts w:ascii="Times New Roman" w:eastAsia="Times New Roman" w:hAnsi="Times New Roman" w:cs="Times New Roman"/>
@@ -3039,7 +3039,7 @@
           <w:lang w:eastAsia="fr-FR"/>
           <w14:ligatures w14:val="none"/>
         </w:rPr>
-        <w:t xml:space="preserve"> </w:t>
+        <w:t xml:space="preserve"> Classification – </w:t>
       </w:r>
       <w:proofErr w:type="spellStart"/>
       <w:r>
@@ -3053,7 +3053,130 @@
           <w:lang w:eastAsia="fr-FR"/>
           <w14:ligatures w14:val="none"/>
         </w:rPr>
-        <w:t>Regression</w:t>
+        <w:t>Logistic</w:t>
+      </w:r>
+      <w:proofErr w:type="spellEnd"/>
+      <w:r>
+        <w:rPr>
+          <w:rFonts w:ascii="Times New Roman" w:eastAsia="Times New Roman" w:hAnsi="Times New Roman" w:cs="Times New Roman"/>
+          <w:b/>
+          <w:bCs/>
+          <w:kern w:val="0"/>
+          <w:sz w:val="27"/>
+          <w:szCs w:val="27"/>
+          <w:lang w:eastAsia="fr-FR"/>
+          <w14:ligatures w14:val="none"/>
+        </w:rPr>
+        <w:t xml:space="preserve"> </w:t>
+      </w:r>
+      <w:proofErr w:type="spellStart"/>
+      <w:r>
+        <w:rPr>
+          <w:rFonts w:ascii="Times New Roman" w:eastAsia="Times New Roman" w:hAnsi="Times New Roman" w:cs="Times New Roman"/>
+          <w:b/>
+          <w:bCs/>
+          <w:kern w:val="0"/>
+          <w:sz w:val="27"/>
+          <w:szCs w:val="27"/>
+          <w:lang w:eastAsia="fr-FR"/>
+          <w14:ligatures w14:val="none"/>
+        </w:rPr>
+        <w:t>Regressio</w:t>
+      </w:r>
+      <w:r>
+        <w:rPr>
+          <w:rFonts w:ascii="Times New Roman" w:eastAsia="Times New Roman" w:hAnsi="Times New Roman" w:cs="Times New Roman"/>
+          <w:b/>
+          <w:bCs/>
+          <w:kern w:val="0"/>
+          <w:sz w:val="27"/>
+          <w:szCs w:val="27"/>
+          <w:lang w:eastAsia="fr-FR"/>
+          <w14:ligatures w14:val="none"/>
+        </w:rPr>
+        <w:t>n</w:t>
+      </w:r>
+      <w:proofErr w:type="spellEnd"/>
+      <w:r>
+        <w:rPr>
+          <w:rFonts w:ascii="Times New Roman" w:eastAsia="Times New Roman" w:hAnsi="Times New Roman" w:cs="Times New Roman"/>
+          <w:b/>
+          <w:bCs/>
+          <w:kern w:val="0"/>
+          <w:sz w:val="27"/>
+          <w:szCs w:val="27"/>
+          <w:lang w:eastAsia="fr-FR"/>
+          <w14:ligatures w14:val="none"/>
+        </w:rPr>
+        <w:t xml:space="preserve"> : </w:t>
+      </w:r>
+      <w:r>
+        <w:rPr>
+          <w:rFonts w:ascii="Times New Roman" w:eastAsia="Times New Roman" w:hAnsi="Times New Roman" w:cs="Times New Roman"/>
+          <w:b/>
+          <w:bCs/>
+          <w:kern w:val="0"/>
+          <w:sz w:val="27"/>
+          <w:szCs w:val="27"/>
+          <w:lang w:eastAsia="fr-FR"/>
+          <w14:ligatures w14:val="none"/>
+        </w:rPr>
+        <w:t xml:space="preserve">Binaire, </w:t>
+      </w:r>
+      <w:proofErr w:type="spellStart"/>
+      <w:r>
+        <w:rPr>
+          <w:rFonts w:ascii="Times New Roman" w:eastAsia="Times New Roman" w:hAnsi="Times New Roman" w:cs="Times New Roman"/>
+          <w:b/>
+          <w:bCs/>
+          <w:kern w:val="0"/>
+          <w:sz w:val="27"/>
+          <w:szCs w:val="27"/>
+          <w:lang w:eastAsia="fr-FR"/>
+          <w14:ligatures w14:val="none"/>
+        </w:rPr>
+        <w:t>multicla</w:t>
+      </w:r>
+      <w:r>
+        <w:rPr>
+          <w:rFonts w:ascii="Times New Roman" w:eastAsia="Times New Roman" w:hAnsi="Times New Roman" w:cs="Times New Roman"/>
+          <w:b/>
+          <w:bCs/>
+          <w:kern w:val="0"/>
+          <w:sz w:val="27"/>
+          <w:szCs w:val="27"/>
+          <w:lang w:eastAsia="fr-FR"/>
+          <w14:ligatures w14:val="none"/>
+        </w:rPr>
+        <w:t>sse</w:t>
+      </w:r>
+      <w:proofErr w:type="spellEnd"/>
+      <w:r>
+        <w:rPr>
+          <w:rFonts w:ascii="Times New Roman" w:eastAsia="Times New Roman" w:hAnsi="Times New Roman" w:cs="Times New Roman"/>
+          <w:b/>
+          <w:bCs/>
+          <w:kern w:val="0"/>
+          <w:sz w:val="27"/>
+          <w:szCs w:val="27"/>
+          <w:lang w:eastAsia="fr-FR"/>
+          <w14:ligatures w14:val="none"/>
+        </w:rPr>
+        <w:t xml:space="preserve">, </w:t>
+      </w:r>
+      <w:proofErr w:type="spellStart"/>
+      <w:r>
+        <w:rPr>
+          <w:rFonts w:ascii="Times New Roman" w:eastAsia="Times New Roman" w:hAnsi="Times New Roman" w:cs="Times New Roman"/>
+          <w:b/>
+          <w:bCs/>
+          <w:kern w:val="0"/>
+          <w:sz w:val="27"/>
+          <w:szCs w:val="27"/>
+          <w:lang w:eastAsia="fr-FR"/>
+          <w14:ligatures w14:val="none"/>
+        </w:rPr>
+        <w:t>ordianle</w:t>
       </w:r>
       <w:proofErr w:type="spellEnd"/>
     </w:p>
@@ -3083,30 +3206,31 @@
           <w:lang w:val="en-US" w:eastAsia="fr-FR"/>
           <w14:ligatures w14:val="none"/>
         </w:rPr>
-        <w:t>Day 31: Sigmoid function,</w:t>
-      </w:r>
-      <w:r>
-        <w:rPr>
-          <w:rFonts w:ascii="Times New Roman" w:eastAsia="Times New Roman" w:hAnsi="Times New Roman" w:cs="Times New Roman"/>
-          <w:kern w:val="0"/>
-          <w:sz w:val="24"/>
-          <w:szCs w:val="24"/>
-          <w:lang w:val="en-US" w:eastAsia="fr-FR"/>
-          <w14:ligatures w14:val="none"/>
-        </w:rPr>
-        <w:t xml:space="preserve"> loss, </w:t>
-      </w:r>
-      <w:r>
-        <w:rPr>
-          <w:rFonts w:ascii="Times New Roman" w:eastAsia="Times New Roman" w:hAnsi="Times New Roman" w:cs="Times New Roman"/>
-          <w:kern w:val="0"/>
-          <w:sz w:val="24"/>
-          <w:szCs w:val="24"/>
-          <w:highlight w:val="yellow"/>
-          <w:lang w:val="en-US" w:eastAsia="fr-FR"/>
-          <w14:ligatures w14:val="none"/>
-        </w:rPr>
-        <w:t>decision boundary</w:t>
+        <w:t>Day 31: Sigmoid function</w:t>
+      </w:r>
+      <w:r>
+        <w:rPr>
+          <w:rFonts w:ascii="Times New Roman" w:eastAsia="Times New Roman" w:hAnsi="Times New Roman" w:cs="Times New Roman"/>
+          <w:kern w:val="0"/>
+          <w:sz w:val="24"/>
+          <w:szCs w:val="24"/>
+          <w:highlight w:val="yellow"/>
+          <w:lang w:val="en-US" w:eastAsia="fr-FR"/>
+          <w14:ligatures w14:val="none"/>
+        </w:rPr>
+        <w:t xml:space="preserve">, loss, decision </w:t>
+      </w:r>
+      <w:r>
+        <w:rPr>
+          <w:rFonts w:ascii="Times New Roman" w:eastAsia="Times New Roman" w:hAnsi="Times New Roman" w:cs="Times New Roman"/>
+          <w:kern w:val="0"/>
+          <w:sz w:val="24"/>
+          <w:szCs w:val="24"/>
+          <w:highlight w:val="yellow"/>
+          <w:lang w:val="en-US" w:eastAsia="fr-FR"/>
+          <w14:ligatures w14:val="none"/>
+        </w:rPr>
+        <w:t>boundary</w:t>
       </w:r>
     </w:p>
     <w:p>
@@ -3275,20 +3399,34 @@
           <w:kern w:val="0"/>
           <w:sz w:val="24"/>
           <w:szCs w:val="24"/>
-          <w:lang w:val="en-US" w:eastAsia="fr-FR"/>
-          <w14:ligatures w14:val="none"/>
-        </w:rPr>
-      </w:pPr>
-      <w:r>
-        <w:rPr>
-          <w:rFonts w:ascii="Times New Roman" w:eastAsia="Times New Roman" w:hAnsi="Times New Roman" w:cs="Times New Roman"/>
-          <w:kern w:val="0"/>
-          <w:sz w:val="24"/>
-          <w:szCs w:val="24"/>
-          <w:lang w:val="en-US" w:eastAsia="fr-FR"/>
-          <w14:ligatures w14:val="none"/>
-        </w:rPr>
-        <w:t>Day 35: Mini project: Classify iris or diabetes dataset</w:t>
+          <w:highlight w:val="cyan"/>
+          <w:lang w:val="en-US" w:eastAsia="fr-FR"/>
+          <w14:ligatures w14:val="none"/>
+        </w:rPr>
+      </w:pPr>
+      <w:r>
+        <w:rPr>
+          <w:rFonts w:ascii="Times New Roman" w:eastAsia="Times New Roman" w:hAnsi="Times New Roman" w:cs="Times New Roman"/>
+          <w:kern w:val="0"/>
+          <w:sz w:val="24"/>
+          <w:szCs w:val="24"/>
+          <w:highlight w:val="cyan"/>
+          <w:lang w:val="en-US" w:eastAsia="fr-FR"/>
+          <w14:ligatures w14:val="none"/>
+        </w:rPr>
+        <w:t xml:space="preserve">Day 35: Mini project: Classify </w:t>
+      </w:r>
+      <w:r>
+        <w:rPr>
+          <w:rFonts w:ascii="Times New Roman" w:eastAsia="Times New Roman" w:hAnsi="Times New Roman" w:cs="Times New Roman"/>
+          <w:kern w:val="0"/>
+          <w:sz w:val="24"/>
+          <w:szCs w:val="24"/>
+          <w:highlight w:val="cyan"/>
+          <w:lang w:val="en-US" w:eastAsia="fr-FR"/>
+          <w14:ligatures w14:val="none"/>
+        </w:rPr>
+        <w:t>cancer dataset + digits dataset</w:t>
       </w:r>
     </w:p>
     <w:p>

</xml_diff>

<commit_message>
added seconf project for decision tree classifier
</commit_message>
<xml_diff>
--- a/Plan.docx
+++ b/Plan.docx
@@ -3192,45 +3192,22 @@
           <w:kern w:val="0"/>
           <w:sz w:val="24"/>
           <w:szCs w:val="24"/>
-          <w:lang w:val="en-US" w:eastAsia="fr-FR"/>
-          <w14:ligatures w14:val="none"/>
-        </w:rPr>
-      </w:pPr>
-      <w:r>
-        <w:rPr>
-          <w:rFonts w:ascii="Times New Roman" w:eastAsia="Times New Roman" w:hAnsi="Times New Roman" w:cs="Times New Roman"/>
-          <w:kern w:val="0"/>
-          <w:sz w:val="24"/>
-          <w:szCs w:val="24"/>
-          <w:highlight w:val="yellow"/>
-          <w:lang w:val="en-US" w:eastAsia="fr-FR"/>
-          <w14:ligatures w14:val="none"/>
-        </w:rPr>
-        <w:t>Day 31: Sigmoid function</w:t>
-      </w:r>
-      <w:r>
-        <w:rPr>
-          <w:rFonts w:ascii="Times New Roman" w:eastAsia="Times New Roman" w:hAnsi="Times New Roman" w:cs="Times New Roman"/>
-          <w:kern w:val="0"/>
-          <w:sz w:val="24"/>
-          <w:szCs w:val="24"/>
-          <w:highlight w:val="yellow"/>
-          <w:lang w:val="en-US" w:eastAsia="fr-FR"/>
-          <w14:ligatures w14:val="none"/>
-        </w:rPr>
-        <w:t xml:space="preserve">, loss, decision </w:t>
-      </w:r>
-      <w:r>
-        <w:rPr>
-          <w:rFonts w:ascii="Times New Roman" w:eastAsia="Times New Roman" w:hAnsi="Times New Roman" w:cs="Times New Roman"/>
-          <w:kern w:val="0"/>
-          <w:sz w:val="24"/>
-          <w:szCs w:val="24"/>
-          <w:highlight w:val="yellow"/>
-          <w:lang w:val="en-US" w:eastAsia="fr-FR"/>
-          <w14:ligatures w14:val="none"/>
-        </w:rPr>
-        <w:t>boundary</w:t>
+          <w:highlight w:val="yellow"/>
+          <w:lang w:val="en-US" w:eastAsia="fr-FR"/>
+          <w14:ligatures w14:val="none"/>
+        </w:rPr>
+      </w:pPr>
+      <w:r>
+        <w:rPr>
+          <w:rFonts w:ascii="Times New Roman" w:eastAsia="Times New Roman" w:hAnsi="Times New Roman" w:cs="Times New Roman"/>
+          <w:kern w:val="0"/>
+          <w:sz w:val="24"/>
+          <w:szCs w:val="24"/>
+          <w:highlight w:val="yellow"/>
+          <w:lang w:val="en-US" w:eastAsia="fr-FR"/>
+          <w14:ligatures w14:val="none"/>
+        </w:rPr>
+        <w:t>Day 31: Sigmoid function, loss, decision boundary</w:t>
       </w:r>
     </w:p>
     <w:p>
@@ -3245,16 +3222,18 @@
           <w:kern w:val="0"/>
           <w:sz w:val="24"/>
           <w:szCs w:val="24"/>
-          <w:lang w:val="en-US" w:eastAsia="fr-FR"/>
-          <w14:ligatures w14:val="none"/>
-        </w:rPr>
-      </w:pPr>
-      <w:r>
-        <w:rPr>
-          <w:rFonts w:ascii="Times New Roman" w:eastAsia="Times New Roman" w:hAnsi="Times New Roman" w:cs="Times New Roman"/>
-          <w:kern w:val="0"/>
-          <w:sz w:val="24"/>
-          <w:szCs w:val="24"/>
+          <w:highlight w:val="yellow"/>
+          <w:lang w:val="en-US" w:eastAsia="fr-FR"/>
+          <w14:ligatures w14:val="none"/>
+        </w:rPr>
+      </w:pPr>
+      <w:r>
+        <w:rPr>
+          <w:rFonts w:ascii="Times New Roman" w:eastAsia="Times New Roman" w:hAnsi="Times New Roman" w:cs="Times New Roman"/>
+          <w:kern w:val="0"/>
+          <w:sz w:val="24"/>
+          <w:szCs w:val="24"/>
+          <w:highlight w:val="yellow"/>
           <w:lang w:val="en-US" w:eastAsia="fr-FR"/>
           <w14:ligatures w14:val="none"/>
         </w:rPr>
@@ -3440,7 +3419,7 @@
           <w:kern w:val="0"/>
           <w:sz w:val="27"/>
           <w:szCs w:val="27"/>
-          <w:lang w:eastAsia="fr-FR"/>
+          <w:lang w:val="en-US" w:eastAsia="fr-FR"/>
           <w14:ligatures w14:val="none"/>
         </w:rPr>
       </w:pPr>
@@ -3452,12 +3431,11 @@
           <w:kern w:val="0"/>
           <w:sz w:val="27"/>
           <w:szCs w:val="27"/>
-          <w:lang w:eastAsia="fr-FR"/>
-          <w14:ligatures w14:val="none"/>
-        </w:rPr>
-        <w:t>Days 36–</w:t>
-      </w:r>
-      <w:proofErr w:type="gramStart"/>
+          <w:lang w:val="en-US" w:eastAsia="fr-FR"/>
+          <w14:ligatures w14:val="none"/>
+        </w:rPr>
+        <w:t>Days 36–40: Decision Trees</w:t>
+      </w:r>
       <w:r>
         <w:rPr>
           <w:rFonts w:ascii="Times New Roman" w:eastAsia="Times New Roman" w:hAnsi="Times New Roman" w:cs="Times New Roman"/>
@@ -3466,12 +3444,11 @@
           <w:kern w:val="0"/>
           <w:sz w:val="27"/>
           <w:szCs w:val="27"/>
-          <w:lang w:eastAsia="fr-FR"/>
-          <w14:ligatures w14:val="none"/>
-        </w:rPr>
-        <w:t>40:</w:t>
-      </w:r>
-      <w:proofErr w:type="gramEnd"/>
+          <w:lang w:val="en-US" w:eastAsia="fr-FR"/>
+          <w14:ligatures w14:val="none"/>
+        </w:rPr>
+        <w:t xml:space="preserve"> (Classification a</w:t>
+      </w:r>
       <w:r>
         <w:rPr>
           <w:rFonts w:ascii="Times New Roman" w:eastAsia="Times New Roman" w:hAnsi="Times New Roman" w:cs="Times New Roman"/>
@@ -3480,54 +3457,11 @@
           <w:kern w:val="0"/>
           <w:sz w:val="27"/>
           <w:szCs w:val="27"/>
-          <w:lang w:eastAsia="fr-FR"/>
-          <w14:ligatures w14:val="none"/>
-        </w:rPr>
-        <w:t xml:space="preserve"> </w:t>
-      </w:r>
-      <w:proofErr w:type="spellStart"/>
-      <w:r>
-        <w:rPr>
-          <w:rFonts w:ascii="Times New Roman" w:eastAsia="Times New Roman" w:hAnsi="Times New Roman" w:cs="Times New Roman"/>
-          <w:b/>
-          <w:bCs/>
-          <w:kern w:val="0"/>
-          <w:sz w:val="27"/>
-          <w:szCs w:val="27"/>
-          <w:lang w:eastAsia="fr-FR"/>
-          <w14:ligatures w14:val="none"/>
-        </w:rPr>
-        <w:t>Decision</w:t>
-      </w:r>
-      <w:proofErr w:type="spellEnd"/>
-      <w:r>
-        <w:rPr>
-          <w:rFonts w:ascii="Times New Roman" w:eastAsia="Times New Roman" w:hAnsi="Times New Roman" w:cs="Times New Roman"/>
-          <w:b/>
-          <w:bCs/>
-          <w:kern w:val="0"/>
-          <w:sz w:val="27"/>
-          <w:szCs w:val="27"/>
-          <w:lang w:eastAsia="fr-FR"/>
-          <w14:ligatures w14:val="none"/>
-        </w:rPr>
-        <w:t xml:space="preserve"> </w:t>
-      </w:r>
-      <w:proofErr w:type="spellStart"/>
-      <w:r>
-        <w:rPr>
-          <w:rFonts w:ascii="Times New Roman" w:eastAsia="Times New Roman" w:hAnsi="Times New Roman" w:cs="Times New Roman"/>
-          <w:b/>
-          <w:bCs/>
-          <w:kern w:val="0"/>
-          <w:sz w:val="27"/>
-          <w:szCs w:val="27"/>
-          <w:lang w:eastAsia="fr-FR"/>
-          <w14:ligatures w14:val="none"/>
-        </w:rPr>
-        <w:t>Trees</w:t>
-      </w:r>
-      <w:proofErr w:type="spellEnd"/>
+          <w:lang w:val="en-US" w:eastAsia="fr-FR"/>
+          <w14:ligatures w14:val="none"/>
+        </w:rPr>
+        <w:t>nd Regression)</w:t>
+      </w:r>
     </w:p>
     <w:p>
       <w:pPr>
@@ -3541,16 +3475,18 @@
           <w:kern w:val="0"/>
           <w:sz w:val="24"/>
           <w:szCs w:val="24"/>
-          <w:lang w:val="en-US" w:eastAsia="fr-FR"/>
-          <w14:ligatures w14:val="none"/>
-        </w:rPr>
-      </w:pPr>
-      <w:r>
-        <w:rPr>
-          <w:rFonts w:ascii="Times New Roman" w:eastAsia="Times New Roman" w:hAnsi="Times New Roman" w:cs="Times New Roman"/>
-          <w:kern w:val="0"/>
-          <w:sz w:val="24"/>
-          <w:szCs w:val="24"/>
+          <w:highlight w:val="yellow"/>
+          <w:lang w:val="en-US" w:eastAsia="fr-FR"/>
+          <w14:ligatures w14:val="none"/>
+        </w:rPr>
+      </w:pPr>
+      <w:r>
+        <w:rPr>
+          <w:rFonts w:ascii="Times New Roman" w:eastAsia="Times New Roman" w:hAnsi="Times New Roman" w:cs="Times New Roman"/>
+          <w:kern w:val="0"/>
+          <w:sz w:val="24"/>
+          <w:szCs w:val="24"/>
+          <w:highlight w:val="yellow"/>
           <w:lang w:val="en-US" w:eastAsia="fr-FR"/>
           <w14:ligatures w14:val="none"/>
         </w:rPr>
@@ -3569,20 +3505,34 @@
           <w:kern w:val="0"/>
           <w:sz w:val="24"/>
           <w:szCs w:val="24"/>
-          <w:lang w:val="en-US" w:eastAsia="fr-FR"/>
-          <w14:ligatures w14:val="none"/>
-        </w:rPr>
-      </w:pPr>
-      <w:r>
-        <w:rPr>
-          <w:rFonts w:ascii="Times New Roman" w:eastAsia="Times New Roman" w:hAnsi="Times New Roman" w:cs="Times New Roman"/>
-          <w:kern w:val="0"/>
-          <w:sz w:val="24"/>
-          <w:szCs w:val="24"/>
+          <w:highlight w:val="yellow"/>
+          <w:lang w:val="en-US" w:eastAsia="fr-FR"/>
+          <w14:ligatures w14:val="none"/>
+        </w:rPr>
+      </w:pPr>
+      <w:r>
+        <w:rPr>
+          <w:rFonts w:ascii="Times New Roman" w:eastAsia="Times New Roman" w:hAnsi="Times New Roman" w:cs="Times New Roman"/>
+          <w:kern w:val="0"/>
+          <w:sz w:val="24"/>
+          <w:szCs w:val="24"/>
+          <w:highlight w:val="yellow"/>
           <w:lang w:val="en-US" w:eastAsia="fr-FR"/>
           <w14:ligatures w14:val="none"/>
         </w:rPr>
         <w:t>Day 37: Build a decision tree classifier</w:t>
+      </w:r>
+      <w:r>
+        <w:rPr>
+          <w:rFonts w:ascii="Times New Roman" w:eastAsia="Times New Roman" w:hAnsi="Times New Roman" w:cs="Times New Roman"/>
+          <w:kern w:val="0"/>
+          <w:sz w:val="24"/>
+          <w:szCs w:val="24"/>
+          <w:highlight w:val="yellow"/>
+          <w:lang w:val="en-US" w:eastAsia="fr-FR"/>
+          <w14:ligatures w14:val="none"/>
+        </w:rPr>
+        <w:t xml:space="preserve"> with scikit learn</w:t>
       </w:r>
     </w:p>
     <w:p>
@@ -3597,82 +3547,21 @@
           <w:kern w:val="0"/>
           <w:sz w:val="24"/>
           <w:szCs w:val="24"/>
-          <w:lang w:eastAsia="fr-FR"/>
-          <w14:ligatures w14:val="none"/>
-        </w:rPr>
-      </w:pPr>
-      <w:r>
-        <w:rPr>
-          <w:rFonts w:ascii="Times New Roman" w:eastAsia="Times New Roman" w:hAnsi="Times New Roman" w:cs="Times New Roman"/>
-          <w:kern w:val="0"/>
-          <w:sz w:val="24"/>
-          <w:szCs w:val="24"/>
-          <w:lang w:eastAsia="fr-FR"/>
-          <w14:ligatures w14:val="none"/>
-        </w:rPr>
-        <w:t xml:space="preserve">Day </w:t>
-      </w:r>
-      <w:proofErr w:type="gramStart"/>
-      <w:r>
-        <w:rPr>
-          <w:rFonts w:ascii="Times New Roman" w:eastAsia="Times New Roman" w:hAnsi="Times New Roman" w:cs="Times New Roman"/>
-          <w:kern w:val="0"/>
-          <w:sz w:val="24"/>
-          <w:szCs w:val="24"/>
-          <w:lang w:eastAsia="fr-FR"/>
-          <w14:ligatures w14:val="none"/>
-        </w:rPr>
-        <w:t>38:</w:t>
-      </w:r>
-      <w:proofErr w:type="gramEnd"/>
-      <w:r>
-        <w:rPr>
-          <w:rFonts w:ascii="Times New Roman" w:eastAsia="Times New Roman" w:hAnsi="Times New Roman" w:cs="Times New Roman"/>
-          <w:kern w:val="0"/>
-          <w:sz w:val="24"/>
-          <w:szCs w:val="24"/>
-          <w:lang w:eastAsia="fr-FR"/>
-          <w14:ligatures w14:val="none"/>
-        </w:rPr>
-        <w:t xml:space="preserve"> </w:t>
-      </w:r>
-      <w:proofErr w:type="spellStart"/>
-      <w:r>
-        <w:rPr>
-          <w:rFonts w:ascii="Times New Roman" w:eastAsia="Times New Roman" w:hAnsi="Times New Roman" w:cs="Times New Roman"/>
-          <w:kern w:val="0"/>
-          <w:sz w:val="24"/>
-          <w:szCs w:val="24"/>
-          <w:lang w:eastAsia="fr-FR"/>
-          <w14:ligatures w14:val="none"/>
-        </w:rPr>
-        <w:t>Overfitting</w:t>
-      </w:r>
-      <w:proofErr w:type="spellEnd"/>
-      <w:r>
-        <w:rPr>
-          <w:rFonts w:ascii="Times New Roman" w:eastAsia="Times New Roman" w:hAnsi="Times New Roman" w:cs="Times New Roman"/>
-          <w:kern w:val="0"/>
-          <w:sz w:val="24"/>
-          <w:szCs w:val="24"/>
-          <w:lang w:eastAsia="fr-FR"/>
-          <w14:ligatures w14:val="none"/>
-        </w:rPr>
-        <w:t xml:space="preserve"> and </w:t>
-      </w:r>
-      <w:proofErr w:type="spellStart"/>
-      <w:r>
-        <w:rPr>
-          <w:rFonts w:ascii="Times New Roman" w:eastAsia="Times New Roman" w:hAnsi="Times New Roman" w:cs="Times New Roman"/>
-          <w:kern w:val="0"/>
-          <w:sz w:val="24"/>
-          <w:szCs w:val="24"/>
-          <w:lang w:eastAsia="fr-FR"/>
-          <w14:ligatures w14:val="none"/>
-        </w:rPr>
-        <w:t>pruning</w:t>
-      </w:r>
-      <w:proofErr w:type="spellEnd"/>
+          <w:lang w:val="en-US" w:eastAsia="fr-FR"/>
+          <w14:ligatures w14:val="none"/>
+        </w:rPr>
+      </w:pPr>
+      <w:r>
+        <w:rPr>
+          <w:rFonts w:ascii="Times New Roman" w:eastAsia="Times New Roman" w:hAnsi="Times New Roman" w:cs="Times New Roman"/>
+          <w:kern w:val="0"/>
+          <w:sz w:val="24"/>
+          <w:szCs w:val="24"/>
+          <w:lang w:val="en-US" w:eastAsia="fr-FR"/>
+          <w14:ligatures w14:val="none"/>
+        </w:rPr>
+        <w:t>Day 37: Build a decision tree regressor with scikit learn</w:t>
+      </w:r>
     </w:p>
     <w:p>
       <w:pPr>
@@ -3711,6 +3600,98 @@
           <w:lang w:eastAsia="fr-FR"/>
           <w14:ligatures w14:val="none"/>
         </w:rPr>
+        <w:t>38:</w:t>
+      </w:r>
+      <w:proofErr w:type="gramEnd"/>
+      <w:r>
+        <w:rPr>
+          <w:rFonts w:ascii="Times New Roman" w:eastAsia="Times New Roman" w:hAnsi="Times New Roman" w:cs="Times New Roman"/>
+          <w:kern w:val="0"/>
+          <w:sz w:val="24"/>
+          <w:szCs w:val="24"/>
+          <w:lang w:eastAsia="fr-FR"/>
+          <w14:ligatures w14:val="none"/>
+        </w:rPr>
+        <w:t xml:space="preserve"> </w:t>
+      </w:r>
+      <w:proofErr w:type="spellStart"/>
+      <w:r>
+        <w:rPr>
+          <w:rFonts w:ascii="Times New Roman" w:eastAsia="Times New Roman" w:hAnsi="Times New Roman" w:cs="Times New Roman"/>
+          <w:kern w:val="0"/>
+          <w:sz w:val="24"/>
+          <w:szCs w:val="24"/>
+          <w:lang w:eastAsia="fr-FR"/>
+          <w14:ligatures w14:val="none"/>
+        </w:rPr>
+        <w:t>Overfitting</w:t>
+      </w:r>
+      <w:proofErr w:type="spellEnd"/>
+      <w:r>
+        <w:rPr>
+          <w:rFonts w:ascii="Times New Roman" w:eastAsia="Times New Roman" w:hAnsi="Times New Roman" w:cs="Times New Roman"/>
+          <w:kern w:val="0"/>
+          <w:sz w:val="24"/>
+          <w:szCs w:val="24"/>
+          <w:lang w:eastAsia="fr-FR"/>
+          <w14:ligatures w14:val="none"/>
+        </w:rPr>
+        <w:t xml:space="preserve"> and </w:t>
+      </w:r>
+      <w:proofErr w:type="spellStart"/>
+      <w:r>
+        <w:rPr>
+          <w:rFonts w:ascii="Times New Roman" w:eastAsia="Times New Roman" w:hAnsi="Times New Roman" w:cs="Times New Roman"/>
+          <w:kern w:val="0"/>
+          <w:sz w:val="24"/>
+          <w:szCs w:val="24"/>
+          <w:lang w:eastAsia="fr-FR"/>
+          <w14:ligatures w14:val="none"/>
+        </w:rPr>
+        <w:t>pruning</w:t>
+      </w:r>
+      <w:proofErr w:type="spellEnd"/>
+    </w:p>
+    <w:p>
+      <w:pPr>
+        <w:numPr>
+          <w:ilvl w:val="0"/>
+          <w:numId w:val="8"/>
+        </w:numPr>
+        <w:spacing w:before="100" w:beforeAutospacing="1" w:after="100" w:afterAutospacing="1" w:line="240" w:lineRule="auto"/>
+        <w:rPr>
+          <w:rFonts w:ascii="Times New Roman" w:eastAsia="Times New Roman" w:hAnsi="Times New Roman" w:cs="Times New Roman"/>
+          <w:kern w:val="0"/>
+          <w:sz w:val="24"/>
+          <w:szCs w:val="24"/>
+          <w:highlight w:val="yellow"/>
+          <w:lang w:eastAsia="fr-FR"/>
+          <w14:ligatures w14:val="none"/>
+        </w:rPr>
+      </w:pPr>
+      <w:r>
+        <w:rPr>
+          <w:rFonts w:ascii="Times New Roman" w:eastAsia="Times New Roman" w:hAnsi="Times New Roman" w:cs="Times New Roman"/>
+          <w:kern w:val="0"/>
+          <w:sz w:val="24"/>
+          <w:szCs w:val="24"/>
+          <w:highlight w:val="yellow"/>
+          <w:lang w:eastAsia="fr-FR"/>
+          <w14:ligatures w14:val="none"/>
+        </w:rPr>
+        <w:t xml:space="preserve">Day </w:t>
+      </w:r>
+      <w:proofErr w:type="gramStart"/>
+      <w:r>
+        <w:rPr>
+          <w:rFonts w:ascii="Times New Roman" w:eastAsia="Times New Roman" w:hAnsi="Times New Roman" w:cs="Times New Roman"/>
+          <w:kern w:val="0"/>
+          <w:sz w:val="24"/>
+          <w:szCs w:val="24"/>
+          <w:highlight w:val="yellow"/>
+          <w:lang w:eastAsia="fr-FR"/>
+          <w14:ligatures w14:val="none"/>
+        </w:rPr>
         <w:t>39:</w:t>
       </w:r>
       <w:proofErr w:type="gramEnd"/>
@@ -3720,6 +3701,7 @@
           <w:kern w:val="0"/>
           <w:sz w:val="24"/>
           <w:szCs w:val="24"/>
+          <w:highlight w:val="yellow"/>
           <w:lang w:eastAsia="fr-FR"/>
           <w14:ligatures w14:val="none"/>
         </w:rPr>
@@ -3732,6 +3714,7 @@
           <w:kern w:val="0"/>
           <w:sz w:val="24"/>
           <w:szCs w:val="24"/>
+          <w:highlight w:val="yellow"/>
           <w:lang w:eastAsia="fr-FR"/>
           <w14:ligatures w14:val="none"/>
         </w:rPr>
@@ -3744,6 +3727,7 @@
           <w:kern w:val="0"/>
           <w:sz w:val="24"/>
           <w:szCs w:val="24"/>
+          <w:highlight w:val="yellow"/>
           <w:lang w:eastAsia="fr-FR"/>
           <w14:ligatures w14:val="none"/>
         </w:rPr>
@@ -3756,6 +3740,7 @@
           <w:kern w:val="0"/>
           <w:sz w:val="24"/>
           <w:szCs w:val="24"/>
+          <w:highlight w:val="yellow"/>
           <w:lang w:eastAsia="fr-FR"/>
           <w14:ligatures w14:val="none"/>
         </w:rPr>
@@ -3768,6 +3753,7 @@
           <w:kern w:val="0"/>
           <w:sz w:val="24"/>
           <w:szCs w:val="24"/>
+          <w:highlight w:val="yellow"/>
           <w:lang w:eastAsia="fr-FR"/>
           <w14:ligatures w14:val="none"/>
         </w:rPr>
@@ -3780,6 +3766,7 @@
           <w:kern w:val="0"/>
           <w:sz w:val="24"/>
           <w:szCs w:val="24"/>
+          <w:highlight w:val="yellow"/>
           <w:lang w:eastAsia="fr-FR"/>
           <w14:ligatures w14:val="none"/>
         </w:rPr>

</xml_diff>

<commit_message>
added classification of iris dataset using decison trees
</commit_message>
<xml_diff>
--- a/Plan.docx
+++ b/Plan.docx
@@ -3547,16 +3547,18 @@
           <w:kern w:val="0"/>
           <w:sz w:val="24"/>
           <w:szCs w:val="24"/>
-          <w:lang w:val="en-US" w:eastAsia="fr-FR"/>
-          <w14:ligatures w14:val="none"/>
-        </w:rPr>
-      </w:pPr>
-      <w:r>
-        <w:rPr>
-          <w:rFonts w:ascii="Times New Roman" w:eastAsia="Times New Roman" w:hAnsi="Times New Roman" w:cs="Times New Roman"/>
-          <w:kern w:val="0"/>
-          <w:sz w:val="24"/>
-          <w:szCs w:val="24"/>
+          <w:highlight w:val="yellow"/>
+          <w:lang w:val="en-US" w:eastAsia="fr-FR"/>
+          <w14:ligatures w14:val="none"/>
+        </w:rPr>
+      </w:pPr>
+      <w:r>
+        <w:rPr>
+          <w:rFonts w:ascii="Times New Roman" w:eastAsia="Times New Roman" w:hAnsi="Times New Roman" w:cs="Times New Roman"/>
+          <w:kern w:val="0"/>
+          <w:sz w:val="24"/>
+          <w:szCs w:val="24"/>
+          <w:highlight w:val="yellow"/>
           <w:lang w:val="en-US" w:eastAsia="fr-FR"/>
           <w14:ligatures w14:val="none"/>
         </w:rPr>
@@ -3575,16 +3577,18 @@
           <w:kern w:val="0"/>
           <w:sz w:val="24"/>
           <w:szCs w:val="24"/>
-          <w:lang w:eastAsia="fr-FR"/>
-          <w14:ligatures w14:val="none"/>
-        </w:rPr>
-      </w:pPr>
-      <w:r>
-        <w:rPr>
-          <w:rFonts w:ascii="Times New Roman" w:eastAsia="Times New Roman" w:hAnsi="Times New Roman" w:cs="Times New Roman"/>
-          <w:kern w:val="0"/>
-          <w:sz w:val="24"/>
-          <w:szCs w:val="24"/>
+          <w:highlight w:val="yellow"/>
+          <w:lang w:eastAsia="fr-FR"/>
+          <w14:ligatures w14:val="none"/>
+        </w:rPr>
+      </w:pPr>
+      <w:r>
+        <w:rPr>
+          <w:rFonts w:ascii="Times New Roman" w:eastAsia="Times New Roman" w:hAnsi="Times New Roman" w:cs="Times New Roman"/>
+          <w:kern w:val="0"/>
+          <w:sz w:val="24"/>
+          <w:szCs w:val="24"/>
+          <w:highlight w:val="yellow"/>
           <w:lang w:eastAsia="fr-FR"/>
           <w14:ligatures w14:val="none"/>
         </w:rPr>
@@ -3597,6 +3601,7 @@
           <w:kern w:val="0"/>
           <w:sz w:val="24"/>
           <w:szCs w:val="24"/>
+          <w:highlight w:val="yellow"/>
           <w:lang w:eastAsia="fr-FR"/>
           <w14:ligatures w14:val="none"/>
         </w:rPr>
@@ -3609,6 +3614,7 @@
           <w:kern w:val="0"/>
           <w:sz w:val="24"/>
           <w:szCs w:val="24"/>
+          <w:highlight w:val="yellow"/>
           <w:lang w:eastAsia="fr-FR"/>
           <w14:ligatures w14:val="none"/>
         </w:rPr>
@@ -3621,6 +3627,7 @@
           <w:kern w:val="0"/>
           <w:sz w:val="24"/>
           <w:szCs w:val="24"/>
+          <w:highlight w:val="yellow"/>
           <w:lang w:eastAsia="fr-FR"/>
           <w14:ligatures w14:val="none"/>
         </w:rPr>
@@ -3633,6 +3640,7 @@
           <w:kern w:val="0"/>
           <w:sz w:val="24"/>
           <w:szCs w:val="24"/>
+          <w:highlight w:val="yellow"/>
           <w:lang w:eastAsia="fr-FR"/>
           <w14:ligatures w14:val="none"/>
         </w:rPr>
@@ -3645,6 +3653,7 @@
           <w:kern w:val="0"/>
           <w:sz w:val="24"/>
           <w:szCs w:val="24"/>
+          <w:highlight w:val="yellow"/>
           <w:lang w:eastAsia="fr-FR"/>
           <w14:ligatures w14:val="none"/>
         </w:rPr>

</xml_diff>

<commit_message>
project about random forest classifier on breast cancer
</commit_message>
<xml_diff>
--- a/Plan.docx
+++ b/Plan.docx
@@ -3795,20 +3795,34 @@
           <w:kern w:val="0"/>
           <w:sz w:val="24"/>
           <w:szCs w:val="24"/>
-          <w:lang w:val="en-US" w:eastAsia="fr-FR"/>
-          <w14:ligatures w14:val="none"/>
-        </w:rPr>
-      </w:pPr>
-      <w:r>
-        <w:rPr>
-          <w:rFonts w:ascii="Times New Roman" w:eastAsia="Times New Roman" w:hAnsi="Times New Roman" w:cs="Times New Roman"/>
-          <w:kern w:val="0"/>
-          <w:sz w:val="24"/>
-          <w:szCs w:val="24"/>
-          <w:lang w:val="en-US" w:eastAsia="fr-FR"/>
-          <w14:ligatures w14:val="none"/>
-        </w:rPr>
-        <w:t>Day 40: Mini project: Classify animals or customers</w:t>
+          <w:highlight w:val="yellow"/>
+          <w:lang w:val="en-US" w:eastAsia="fr-FR"/>
+          <w14:ligatures w14:val="none"/>
+        </w:rPr>
+      </w:pPr>
+      <w:r>
+        <w:rPr>
+          <w:rFonts w:ascii="Times New Roman" w:eastAsia="Times New Roman" w:hAnsi="Times New Roman" w:cs="Times New Roman"/>
+          <w:kern w:val="0"/>
+          <w:sz w:val="24"/>
+          <w:szCs w:val="24"/>
+          <w:highlight w:val="yellow"/>
+          <w:lang w:val="en-US" w:eastAsia="fr-FR"/>
+          <w14:ligatures w14:val="none"/>
+        </w:rPr>
+        <w:t xml:space="preserve">Day 40: Mini project: Classify </w:t>
+      </w:r>
+      <w:r>
+        <w:rPr>
+          <w:rFonts w:ascii="Times New Roman" w:eastAsia="Times New Roman" w:hAnsi="Times New Roman" w:cs="Times New Roman"/>
+          <w:kern w:val="0"/>
+          <w:sz w:val="24"/>
+          <w:szCs w:val="24"/>
+          <w:highlight w:val="yellow"/>
+          <w:lang w:val="en-US" w:eastAsia="fr-FR"/>
+          <w14:ligatures w14:val="none"/>
+        </w:rPr>
+        <w:t>iris</w:t>
       </w:r>
     </w:p>
     <w:p>
@@ -3880,20 +3894,22 @@
           <w:kern w:val="0"/>
           <w:sz w:val="24"/>
           <w:szCs w:val="24"/>
-          <w:lang w:eastAsia="fr-FR"/>
-          <w14:ligatures w14:val="none"/>
-        </w:rPr>
-      </w:pPr>
-      <w:r>
-        <w:rPr>
-          <w:rFonts w:ascii="Times New Roman" w:eastAsia="Times New Roman" w:hAnsi="Times New Roman" w:cs="Times New Roman"/>
-          <w:kern w:val="0"/>
-          <w:sz w:val="24"/>
-          <w:szCs w:val="24"/>
-          <w:lang w:eastAsia="fr-FR"/>
-          <w14:ligatures w14:val="none"/>
-        </w:rPr>
-        <w:t xml:space="preserve">Day </w:t>
+          <w:highlight w:val="yellow"/>
+          <w:lang w:val="en-US" w:eastAsia="fr-FR"/>
+          <w14:ligatures w14:val="none"/>
+        </w:rPr>
+      </w:pPr>
+      <w:r>
+        <w:rPr>
+          <w:rFonts w:ascii="Times New Roman" w:eastAsia="Times New Roman" w:hAnsi="Times New Roman" w:cs="Times New Roman"/>
+          <w:kern w:val="0"/>
+          <w:sz w:val="24"/>
+          <w:szCs w:val="24"/>
+          <w:highlight w:val="yellow"/>
+          <w:lang w:val="en-US" w:eastAsia="fr-FR"/>
+          <w14:ligatures w14:val="none"/>
+        </w:rPr>
+        <w:t xml:space="preserve">Day 41: Random Forest – </w:t>
       </w:r>
       <w:proofErr w:type="gramStart"/>
       <w:r>
@@ -3902,10 +3918,23 @@
           <w:kern w:val="0"/>
           <w:sz w:val="24"/>
           <w:szCs w:val="24"/>
-          <w:lang w:eastAsia="fr-FR"/>
-          <w14:ligatures w14:val="none"/>
-        </w:rPr>
-        <w:t>41:</w:t>
+          <w:highlight w:val="yellow"/>
+          <w:lang w:val="en-US" w:eastAsia="fr-FR"/>
+          <w14:ligatures w14:val="none"/>
+        </w:rPr>
+        <w:t>theory</w:t>
+      </w:r>
+      <w:r>
+        <w:rPr>
+          <w:rFonts w:ascii="Times New Roman" w:eastAsia="Times New Roman" w:hAnsi="Times New Roman" w:cs="Times New Roman"/>
+          <w:kern w:val="0"/>
+          <w:sz w:val="24"/>
+          <w:szCs w:val="24"/>
+          <w:highlight w:val="yellow"/>
+          <w:lang w:val="en-US" w:eastAsia="fr-FR"/>
+          <w14:ligatures w14:val="none"/>
+        </w:rPr>
+        <w:t>(</w:t>
       </w:r>
       <w:proofErr w:type="gramEnd"/>
       <w:r>
@@ -3914,48 +3943,24 @@
           <w:kern w:val="0"/>
           <w:sz w:val="24"/>
           <w:szCs w:val="24"/>
-          <w:lang w:eastAsia="fr-FR"/>
-          <w14:ligatures w14:val="none"/>
-        </w:rPr>
-        <w:t xml:space="preserve"> </w:t>
-      </w:r>
-      <w:proofErr w:type="spellStart"/>
-      <w:r>
-        <w:rPr>
-          <w:rFonts w:ascii="Times New Roman" w:eastAsia="Times New Roman" w:hAnsi="Times New Roman" w:cs="Times New Roman"/>
-          <w:kern w:val="0"/>
-          <w:sz w:val="24"/>
-          <w:szCs w:val="24"/>
-          <w:lang w:eastAsia="fr-FR"/>
-          <w14:ligatures w14:val="none"/>
-        </w:rPr>
-        <w:t>Random</w:t>
-      </w:r>
-      <w:proofErr w:type="spellEnd"/>
-      <w:r>
-        <w:rPr>
-          <w:rFonts w:ascii="Times New Roman" w:eastAsia="Times New Roman" w:hAnsi="Times New Roman" w:cs="Times New Roman"/>
-          <w:kern w:val="0"/>
-          <w:sz w:val="24"/>
-          <w:szCs w:val="24"/>
-          <w:lang w:eastAsia="fr-FR"/>
-          <w14:ligatures w14:val="none"/>
-        </w:rPr>
-        <w:t xml:space="preserve"> Forest – </w:t>
-      </w:r>
-      <w:proofErr w:type="spellStart"/>
-      <w:r>
-        <w:rPr>
-          <w:rFonts w:ascii="Times New Roman" w:eastAsia="Times New Roman" w:hAnsi="Times New Roman" w:cs="Times New Roman"/>
-          <w:kern w:val="0"/>
-          <w:sz w:val="24"/>
-          <w:szCs w:val="24"/>
-          <w:lang w:eastAsia="fr-FR"/>
-          <w14:ligatures w14:val="none"/>
-        </w:rPr>
-        <w:t>theory</w:t>
-      </w:r>
-      <w:proofErr w:type="spellEnd"/>
+          <w:highlight w:val="yellow"/>
+          <w:lang w:val="en-US" w:eastAsia="fr-FR"/>
+          <w14:ligatures w14:val="none"/>
+        </w:rPr>
+        <w:t>c</w:t>
+      </w:r>
+      <w:r>
+        <w:rPr>
+          <w:rFonts w:ascii="Times New Roman" w:eastAsia="Times New Roman" w:hAnsi="Times New Roman" w:cs="Times New Roman"/>
+          <w:kern w:val="0"/>
+          <w:sz w:val="24"/>
+          <w:szCs w:val="24"/>
+          <w:highlight w:val="yellow"/>
+          <w:lang w:val="en-US" w:eastAsia="fr-FR"/>
+          <w14:ligatures w14:val="none"/>
+        </w:rPr>
+        <w:t>lassification and regression)</w:t>
+      </w:r>
     </w:p>
     <w:p>
       <w:pPr>
@@ -3969,16 +3974,18 @@
           <w:kern w:val="0"/>
           <w:sz w:val="24"/>
           <w:szCs w:val="24"/>
-          <w:lang w:val="en-US" w:eastAsia="fr-FR"/>
-          <w14:ligatures w14:val="none"/>
-        </w:rPr>
-      </w:pPr>
-      <w:r>
-        <w:rPr>
-          <w:rFonts w:ascii="Times New Roman" w:eastAsia="Times New Roman" w:hAnsi="Times New Roman" w:cs="Times New Roman"/>
-          <w:kern w:val="0"/>
-          <w:sz w:val="24"/>
-          <w:szCs w:val="24"/>
+          <w:highlight w:val="yellow"/>
+          <w:lang w:val="en-US" w:eastAsia="fr-FR"/>
+          <w14:ligatures w14:val="none"/>
+        </w:rPr>
+      </w:pPr>
+      <w:r>
+        <w:rPr>
+          <w:rFonts w:ascii="Times New Roman" w:eastAsia="Times New Roman" w:hAnsi="Times New Roman" w:cs="Times New Roman"/>
+          <w:kern w:val="0"/>
+          <w:sz w:val="24"/>
+          <w:szCs w:val="24"/>
+          <w:highlight w:val="yellow"/>
           <w:lang w:val="en-US" w:eastAsia="fr-FR"/>
           <w14:ligatures w14:val="none"/>
         </w:rPr>
@@ -3991,12 +3998,28 @@
           <w:kern w:val="0"/>
           <w:sz w:val="24"/>
           <w:szCs w:val="24"/>
+          <w:highlight w:val="yellow"/>
           <w:lang w:val="en-US" w:eastAsia="fr-FR"/>
           <w14:ligatures w14:val="none"/>
         </w:rPr>
         <w:t>sklearn</w:t>
       </w:r>
       <w:proofErr w:type="spellEnd"/>
+    </w:p>
+    <w:p>
+      <w:pPr>
+        <w:spacing w:before="100" w:beforeAutospacing="1" w:after="100" w:afterAutospacing="1" w:line="240" w:lineRule="auto"/>
+        <w:ind w:left="720"/>
+        <w:rPr>
+          <w:rFonts w:ascii="Times New Roman" w:eastAsia="Times New Roman" w:hAnsi="Times New Roman" w:cs="Times New Roman"/>
+          <w:kern w:val="0"/>
+          <w:sz w:val="24"/>
+          <w:szCs w:val="24"/>
+          <w:highlight w:val="yellow"/>
+          <w:lang w:val="en-US" w:eastAsia="fr-FR"/>
+          <w14:ligatures w14:val="none"/>
+        </w:rPr>
+      </w:pPr>
     </w:p>
     <w:p>
       <w:pPr>

</xml_diff>

<commit_message>
xgboost classifier using make_classification
</commit_message>
<xml_diff>
--- a/Plan.docx
+++ b/Plan.docx
@@ -5167,16 +5167,18 @@
           <w:kern w:val="0"/>
           <w:sz w:val="24"/>
           <w:szCs w:val="24"/>
-          <w:lang w:val="en-US" w:eastAsia="fr-FR"/>
-          <w14:ligatures w14:val="none"/>
-        </w:rPr>
-      </w:pPr>
-      <w:r>
-        <w:rPr>
-          <w:rFonts w:ascii="Times New Roman" w:eastAsia="Times New Roman" w:hAnsi="Times New Roman" w:cs="Times New Roman"/>
-          <w:kern w:val="0"/>
-          <w:sz w:val="24"/>
-          <w:szCs w:val="24"/>
+          <w:highlight w:val="yellow"/>
+          <w:lang w:val="en-US" w:eastAsia="fr-FR"/>
+          <w14:ligatures w14:val="none"/>
+        </w:rPr>
+      </w:pPr>
+      <w:r>
+        <w:rPr>
+          <w:rFonts w:ascii="Times New Roman" w:eastAsia="Times New Roman" w:hAnsi="Times New Roman" w:cs="Times New Roman"/>
+          <w:kern w:val="0"/>
+          <w:sz w:val="24"/>
+          <w:szCs w:val="24"/>
+          <w:highlight w:val="yellow"/>
           <w:lang w:val="en-US" w:eastAsia="fr-FR"/>
           <w14:ligatures w14:val="none"/>
         </w:rPr>
@@ -5195,16 +5197,18 @@
           <w:kern w:val="0"/>
           <w:sz w:val="24"/>
           <w:szCs w:val="24"/>
-          <w:lang w:val="en-US" w:eastAsia="fr-FR"/>
-          <w14:ligatures w14:val="none"/>
-        </w:rPr>
-      </w:pPr>
-      <w:r>
-        <w:rPr>
-          <w:rFonts w:ascii="Times New Roman" w:eastAsia="Times New Roman" w:hAnsi="Times New Roman" w:cs="Times New Roman"/>
-          <w:kern w:val="0"/>
-          <w:sz w:val="24"/>
-          <w:szCs w:val="24"/>
+          <w:highlight w:val="yellow"/>
+          <w:lang w:val="en-US" w:eastAsia="fr-FR"/>
+          <w14:ligatures w14:val="none"/>
+        </w:rPr>
+      </w:pPr>
+      <w:r>
+        <w:rPr>
+          <w:rFonts w:ascii="Times New Roman" w:eastAsia="Times New Roman" w:hAnsi="Times New Roman" w:cs="Times New Roman"/>
+          <w:kern w:val="0"/>
+          <w:sz w:val="24"/>
+          <w:szCs w:val="24"/>
+          <w:highlight w:val="yellow"/>
           <w:lang w:val="en-US" w:eastAsia="fr-FR"/>
           <w14:ligatures w14:val="none"/>
         </w:rPr>
@@ -5312,16 +5316,18 @@
           <w:kern w:val="0"/>
           <w:sz w:val="24"/>
           <w:szCs w:val="24"/>
-          <w:lang w:eastAsia="fr-FR"/>
-          <w14:ligatures w14:val="none"/>
-        </w:rPr>
-      </w:pPr>
-      <w:r>
-        <w:rPr>
-          <w:rFonts w:ascii="Times New Roman" w:eastAsia="Times New Roman" w:hAnsi="Times New Roman" w:cs="Times New Roman"/>
-          <w:kern w:val="0"/>
-          <w:sz w:val="24"/>
-          <w:szCs w:val="24"/>
+          <w:highlight w:val="yellow"/>
+          <w:lang w:eastAsia="fr-FR"/>
+          <w14:ligatures w14:val="none"/>
+        </w:rPr>
+      </w:pPr>
+      <w:r>
+        <w:rPr>
+          <w:rFonts w:ascii="Times New Roman" w:eastAsia="Times New Roman" w:hAnsi="Times New Roman" w:cs="Times New Roman"/>
+          <w:kern w:val="0"/>
+          <w:sz w:val="24"/>
+          <w:szCs w:val="24"/>
+          <w:highlight w:val="yellow"/>
           <w:lang w:eastAsia="fr-FR"/>
           <w14:ligatures w14:val="none"/>
         </w:rPr>
@@ -5334,6 +5340,7 @@
           <w:kern w:val="0"/>
           <w:sz w:val="24"/>
           <w:szCs w:val="24"/>
+          <w:highlight w:val="yellow"/>
           <w:lang w:eastAsia="fr-FR"/>
           <w14:ligatures w14:val="none"/>
         </w:rPr>
@@ -5346,6 +5353,7 @@
           <w:kern w:val="0"/>
           <w:sz w:val="24"/>
           <w:szCs w:val="24"/>
+          <w:highlight w:val="yellow"/>
           <w:lang w:eastAsia="fr-FR"/>
           <w14:ligatures w14:val="none"/>
         </w:rPr>
@@ -5358,6 +5366,7 @@
           <w:kern w:val="0"/>
           <w:sz w:val="24"/>
           <w:szCs w:val="24"/>
+          <w:highlight w:val="yellow"/>
           <w:lang w:eastAsia="fr-FR"/>
           <w14:ligatures w14:val="none"/>
         </w:rPr>
@@ -5370,6 +5379,7 @@
           <w:kern w:val="0"/>
           <w:sz w:val="24"/>
           <w:szCs w:val="24"/>
+          <w:highlight w:val="yellow"/>
           <w:lang w:eastAsia="fr-FR"/>
           <w14:ligatures w14:val="none"/>
         </w:rPr>
@@ -5382,6 +5392,7 @@
           <w:kern w:val="0"/>
           <w:sz w:val="24"/>
           <w:szCs w:val="24"/>
+          <w:highlight w:val="yellow"/>
           <w:lang w:eastAsia="fr-FR"/>
           <w14:ligatures w14:val="none"/>
         </w:rPr>
@@ -5394,6 +5405,7 @@
           <w:kern w:val="0"/>
           <w:sz w:val="24"/>
           <w:szCs w:val="24"/>
+          <w:highlight w:val="yellow"/>
           <w:lang w:eastAsia="fr-FR"/>
           <w14:ligatures w14:val="none"/>
         </w:rPr>

</xml_diff>

<commit_message>
cross validation kfold, stratified kfold, loocv, lpocv, shufflesplit, timeseriessplit, groupkfold
</commit_message>
<xml_diff>
--- a/Plan.docx
+++ b/Plan.docx
@@ -98,7 +98,35 @@
           <w:lang w:eastAsia="fr-FR"/>
           <w14:ligatures w14:val="none"/>
         </w:rPr>
-        <w:t>Days 1–5: Python for Data Science</w:t>
+        <w:t>Days 1–</w:t>
+      </w:r>
+      <w:proofErr w:type="gramStart"/>
+      <w:r>
+        <w:rPr>
+          <w:rFonts w:ascii="Times New Roman" w:eastAsia="Times New Roman" w:hAnsi="Times New Roman" w:cs="Times New Roman"/>
+          <w:b/>
+          <w:bCs/>
+          <w:kern w:val="0"/>
+          <w:sz w:val="27"/>
+          <w:szCs w:val="27"/>
+          <w:lang w:eastAsia="fr-FR"/>
+          <w14:ligatures w14:val="none"/>
+        </w:rPr>
+        <w:t>5:</w:t>
+      </w:r>
+      <w:proofErr w:type="gramEnd"/>
+      <w:r>
+        <w:rPr>
+          <w:rFonts w:ascii="Times New Roman" w:eastAsia="Times New Roman" w:hAnsi="Times New Roman" w:cs="Times New Roman"/>
+          <w:b/>
+          <w:bCs/>
+          <w:kern w:val="0"/>
+          <w:sz w:val="27"/>
+          <w:szCs w:val="27"/>
+          <w:lang w:eastAsia="fr-FR"/>
+          <w14:ligatures w14:val="none"/>
+        </w:rPr>
+        <w:t xml:space="preserve"> Python for Data Science</w:t>
       </w:r>
     </w:p>
     <w:p>
@@ -158,7 +186,33 @@
           <w:lang w:eastAsia="fr-FR"/>
           <w14:ligatures w14:val="none"/>
         </w:rPr>
-        <w:t xml:space="preserve">Day 2: </w:t>
+        <w:t xml:space="preserve">Day </w:t>
+      </w:r>
+      <w:proofErr w:type="gramStart"/>
+      <w:r>
+        <w:rPr>
+          <w:rFonts w:ascii="Times New Roman" w:eastAsia="Times New Roman" w:hAnsi="Times New Roman" w:cs="Times New Roman"/>
+          <w:kern w:val="0"/>
+          <w:sz w:val="24"/>
+          <w:szCs w:val="24"/>
+          <w:highlight w:val="yellow"/>
+          <w:lang w:eastAsia="fr-FR"/>
+          <w14:ligatures w14:val="none"/>
+        </w:rPr>
+        <w:t>2:</w:t>
+      </w:r>
+      <w:proofErr w:type="gramEnd"/>
+      <w:r>
+        <w:rPr>
+          <w:rFonts w:ascii="Times New Roman" w:eastAsia="Times New Roman" w:hAnsi="Times New Roman" w:cs="Times New Roman"/>
+          <w:kern w:val="0"/>
+          <w:sz w:val="24"/>
+          <w:szCs w:val="24"/>
+          <w:highlight w:val="yellow"/>
+          <w:lang w:eastAsia="fr-FR"/>
+          <w14:ligatures w14:val="none"/>
+        </w:rPr>
+        <w:t xml:space="preserve"> </w:t>
       </w:r>
       <w:proofErr w:type="spellStart"/>
       <w:r>
@@ -369,7 +423,35 @@
           <w:lang w:eastAsia="fr-FR"/>
           <w14:ligatures w14:val="none"/>
         </w:rPr>
-        <w:t xml:space="preserve">Days 6–10: </w:t>
+        <w:t>Days 6–</w:t>
+      </w:r>
+      <w:proofErr w:type="gramStart"/>
+      <w:r>
+        <w:rPr>
+          <w:rFonts w:ascii="Times New Roman" w:eastAsia="Times New Roman" w:hAnsi="Times New Roman" w:cs="Times New Roman"/>
+          <w:b/>
+          <w:bCs/>
+          <w:kern w:val="0"/>
+          <w:sz w:val="27"/>
+          <w:szCs w:val="27"/>
+          <w:lang w:eastAsia="fr-FR"/>
+          <w14:ligatures w14:val="none"/>
+        </w:rPr>
+        <w:t>10:</w:t>
+      </w:r>
+      <w:proofErr w:type="gramEnd"/>
+      <w:r>
+        <w:rPr>
+          <w:rFonts w:ascii="Times New Roman" w:eastAsia="Times New Roman" w:hAnsi="Times New Roman" w:cs="Times New Roman"/>
+          <w:b/>
+          <w:bCs/>
+          <w:kern w:val="0"/>
+          <w:sz w:val="27"/>
+          <w:szCs w:val="27"/>
+          <w:lang w:eastAsia="fr-FR"/>
+          <w14:ligatures w14:val="none"/>
+        </w:rPr>
+        <w:t xml:space="preserve"> </w:t>
       </w:r>
       <w:proofErr w:type="spellStart"/>
       <w:r>
@@ -427,7 +509,33 @@
           <w:lang w:eastAsia="fr-FR"/>
           <w14:ligatures w14:val="none"/>
         </w:rPr>
-        <w:t xml:space="preserve">Day 6: </w:t>
+        <w:t xml:space="preserve">Day </w:t>
+      </w:r>
+      <w:proofErr w:type="gramStart"/>
+      <w:r>
+        <w:rPr>
+          <w:rFonts w:ascii="Times New Roman" w:eastAsia="Times New Roman" w:hAnsi="Times New Roman" w:cs="Times New Roman"/>
+          <w:kern w:val="0"/>
+          <w:sz w:val="24"/>
+          <w:szCs w:val="24"/>
+          <w:highlight w:val="yellow"/>
+          <w:lang w:eastAsia="fr-FR"/>
+          <w14:ligatures w14:val="none"/>
+        </w:rPr>
+        <w:t>6:</w:t>
+      </w:r>
+      <w:proofErr w:type="gramEnd"/>
+      <w:r>
+        <w:rPr>
+          <w:rFonts w:ascii="Times New Roman" w:eastAsia="Times New Roman" w:hAnsi="Times New Roman" w:cs="Times New Roman"/>
+          <w:kern w:val="0"/>
+          <w:sz w:val="24"/>
+          <w:szCs w:val="24"/>
+          <w:highlight w:val="yellow"/>
+          <w:lang w:eastAsia="fr-FR"/>
+          <w14:ligatures w14:val="none"/>
+        </w:rPr>
+        <w:t xml:space="preserve"> </w:t>
       </w:r>
       <w:proofErr w:type="spellStart"/>
       <w:r>
@@ -937,7 +1045,33 @@
           <w:lang w:eastAsia="fr-FR"/>
           <w14:ligatures w14:val="none"/>
         </w:rPr>
-        <w:t xml:space="preserve">Day 13: Matrices and </w:t>
+        <w:t xml:space="preserve">Day </w:t>
+      </w:r>
+      <w:proofErr w:type="gramStart"/>
+      <w:r>
+        <w:rPr>
+          <w:rFonts w:ascii="Times New Roman" w:eastAsia="Times New Roman" w:hAnsi="Times New Roman" w:cs="Times New Roman"/>
+          <w:kern w:val="0"/>
+          <w:sz w:val="24"/>
+          <w:szCs w:val="24"/>
+          <w:highlight w:val="yellow"/>
+          <w:lang w:eastAsia="fr-FR"/>
+          <w14:ligatures w14:val="none"/>
+        </w:rPr>
+        <w:t>13:</w:t>
+      </w:r>
+      <w:proofErr w:type="gramEnd"/>
+      <w:r>
+        <w:rPr>
+          <w:rFonts w:ascii="Times New Roman" w:eastAsia="Times New Roman" w:hAnsi="Times New Roman" w:cs="Times New Roman"/>
+          <w:kern w:val="0"/>
+          <w:sz w:val="24"/>
+          <w:szCs w:val="24"/>
+          <w:highlight w:val="yellow"/>
+          <w:lang w:eastAsia="fr-FR"/>
+          <w14:ligatures w14:val="none"/>
+        </w:rPr>
+        <w:t xml:space="preserve"> Matrices and </w:t>
       </w:r>
       <w:proofErr w:type="spellStart"/>
       <w:r>
@@ -1010,7 +1144,33 @@
           <w:lang w:eastAsia="fr-FR"/>
           <w14:ligatures w14:val="none"/>
         </w:rPr>
-        <w:t xml:space="preserve">Day 15: </w:t>
+        <w:t xml:space="preserve">Day </w:t>
+      </w:r>
+      <w:proofErr w:type="gramStart"/>
+      <w:r>
+        <w:rPr>
+          <w:rFonts w:ascii="Times New Roman" w:eastAsia="Times New Roman" w:hAnsi="Times New Roman" w:cs="Times New Roman"/>
+          <w:kern w:val="0"/>
+          <w:sz w:val="24"/>
+          <w:szCs w:val="24"/>
+          <w:highlight w:val="yellow"/>
+          <w:lang w:eastAsia="fr-FR"/>
+          <w14:ligatures w14:val="none"/>
+        </w:rPr>
+        <w:t>15:</w:t>
+      </w:r>
+      <w:proofErr w:type="gramEnd"/>
+      <w:r>
+        <w:rPr>
+          <w:rFonts w:ascii="Times New Roman" w:eastAsia="Times New Roman" w:hAnsi="Times New Roman" w:cs="Times New Roman"/>
+          <w:kern w:val="0"/>
+          <w:sz w:val="24"/>
+          <w:szCs w:val="24"/>
+          <w:highlight w:val="yellow"/>
+          <w:lang w:eastAsia="fr-FR"/>
+          <w14:ligatures w14:val="none"/>
+        </w:rPr>
+        <w:t xml:space="preserve"> </w:t>
       </w:r>
       <w:proofErr w:type="spellStart"/>
       <w:r>
@@ -1131,7 +1291,35 @@
           <w:lang w:eastAsia="fr-FR"/>
           <w14:ligatures w14:val="none"/>
         </w:rPr>
-        <w:t xml:space="preserve">Days 16–20: Data </w:t>
+        <w:t>Days 16–</w:t>
+      </w:r>
+      <w:proofErr w:type="gramStart"/>
+      <w:r>
+        <w:rPr>
+          <w:rFonts w:ascii="Times New Roman" w:eastAsia="Times New Roman" w:hAnsi="Times New Roman" w:cs="Times New Roman"/>
+          <w:b/>
+          <w:bCs/>
+          <w:kern w:val="0"/>
+          <w:sz w:val="27"/>
+          <w:szCs w:val="27"/>
+          <w:lang w:eastAsia="fr-FR"/>
+          <w14:ligatures w14:val="none"/>
+        </w:rPr>
+        <w:t>20:</w:t>
+      </w:r>
+      <w:proofErr w:type="gramEnd"/>
+      <w:r>
+        <w:rPr>
+          <w:rFonts w:ascii="Times New Roman" w:eastAsia="Times New Roman" w:hAnsi="Times New Roman" w:cs="Times New Roman"/>
+          <w:b/>
+          <w:bCs/>
+          <w:kern w:val="0"/>
+          <w:sz w:val="27"/>
+          <w:szCs w:val="27"/>
+          <w:lang w:eastAsia="fr-FR"/>
+          <w14:ligatures w14:val="none"/>
+        </w:rPr>
+        <w:t xml:space="preserve"> Data </w:t>
       </w:r>
       <w:proofErr w:type="spellStart"/>
       <w:r>
@@ -1278,7 +1466,20 @@
           <w:lang w:val="en-US" w:eastAsia="fr-FR"/>
           <w14:ligatures w14:val="none"/>
         </w:rPr>
-        <w:t>Day 19: Correlation</w:t>
+        <w:t xml:space="preserve">Day 19: </w:t>
+      </w:r>
+      <w:proofErr w:type="gramStart"/>
+      <w:r>
+        <w:rPr>
+          <w:rFonts w:ascii="Times New Roman" w:eastAsia="Times New Roman" w:hAnsi="Times New Roman" w:cs="Times New Roman"/>
+          <w:kern w:val="0"/>
+          <w:sz w:val="24"/>
+          <w:szCs w:val="24"/>
+          <w:highlight w:val="yellow"/>
+          <w:lang w:val="en-US" w:eastAsia="fr-FR"/>
+          <w14:ligatures w14:val="none"/>
+        </w:rPr>
+        <w:t>Correlation</w:t>
       </w:r>
       <w:r>
         <w:rPr>
@@ -1292,6 +1493,7 @@
         </w:rPr>
         <w:t>(</w:t>
       </w:r>
+      <w:proofErr w:type="gramEnd"/>
       <w:r>
         <w:rPr>
           <w:rFonts w:ascii="Times New Roman" w:eastAsia="Times New Roman" w:hAnsi="Times New Roman" w:cs="Times New Roman"/>
@@ -1417,8 +1619,9 @@
           <w:lang w:val="en-US" w:eastAsia="fr-FR"/>
           <w14:ligatures w14:val="none"/>
         </w:rPr>
-        <w:t>Day 20: Mini project: Full EDA on Titanic dataset</w:t>
-      </w:r>
+        <w:t xml:space="preserve">Day 20: Mini project: Full EDA on Titanic </w:t>
+      </w:r>
+      <w:proofErr w:type="gramStart"/>
       <w:r>
         <w:rPr>
           <w:rFonts w:ascii="Times New Roman" w:eastAsia="Times New Roman" w:hAnsi="Times New Roman" w:cs="Times New Roman"/>
@@ -1429,7 +1632,32 @@
           <w:lang w:val="en-US" w:eastAsia="fr-FR"/>
           <w14:ligatures w14:val="none"/>
         </w:rPr>
-        <w:t>(done day 18)</w:t>
+        <w:t>dataset</w:t>
+      </w:r>
+      <w:r>
+        <w:rPr>
+          <w:rFonts w:ascii="Times New Roman" w:eastAsia="Times New Roman" w:hAnsi="Times New Roman" w:cs="Times New Roman"/>
+          <w:kern w:val="0"/>
+          <w:sz w:val="24"/>
+          <w:szCs w:val="24"/>
+          <w:highlight w:val="cyan"/>
+          <w:lang w:val="en-US" w:eastAsia="fr-FR"/>
+          <w14:ligatures w14:val="none"/>
+        </w:rPr>
+        <w:t>(</w:t>
+      </w:r>
+      <w:proofErr w:type="gramEnd"/>
+      <w:r>
+        <w:rPr>
+          <w:rFonts w:ascii="Times New Roman" w:eastAsia="Times New Roman" w:hAnsi="Times New Roman" w:cs="Times New Roman"/>
+          <w:kern w:val="0"/>
+          <w:sz w:val="24"/>
+          <w:szCs w:val="24"/>
+          <w:highlight w:val="cyan"/>
+          <w:lang w:val="en-US" w:eastAsia="fr-FR"/>
+          <w14:ligatures w14:val="none"/>
+        </w:rPr>
+        <w:t>done day 18)</w:t>
       </w:r>
     </w:p>
     <w:p>
@@ -1497,7 +1725,35 @@
           <w:lang w:val="en-US" w:eastAsia="fr-FR"/>
           <w14:ligatures w14:val="none"/>
         </w:rPr>
-        <w:t xml:space="preserve"> Phase 2: Machine Learning Basics (Days 21–50)</w:t>
+        <w:t xml:space="preserve"> Phase </w:t>
+      </w:r>
+      <w:proofErr w:type="gramStart"/>
+      <w:r>
+        <w:rPr>
+          <w:rFonts w:ascii="Times New Roman" w:eastAsia="Times New Roman" w:hAnsi="Times New Roman" w:cs="Times New Roman"/>
+          <w:b/>
+          <w:bCs/>
+          <w:kern w:val="0"/>
+          <w:sz w:val="36"/>
+          <w:szCs w:val="36"/>
+          <w:lang w:val="en-US" w:eastAsia="fr-FR"/>
+          <w14:ligatures w14:val="none"/>
+        </w:rPr>
+        <w:t>2:</w:t>
+      </w:r>
+      <w:proofErr w:type="gramEnd"/>
+      <w:r>
+        <w:rPr>
+          <w:rFonts w:ascii="Times New Roman" w:eastAsia="Times New Roman" w:hAnsi="Times New Roman" w:cs="Times New Roman"/>
+          <w:b/>
+          <w:bCs/>
+          <w:kern w:val="0"/>
+          <w:sz w:val="36"/>
+          <w:szCs w:val="36"/>
+          <w:lang w:val="en-US" w:eastAsia="fr-FR"/>
+          <w14:ligatures w14:val="none"/>
+        </w:rPr>
+        <w:t xml:space="preserve"> Machine Learning Basics (Days 21–50)</w:t>
       </w:r>
     </w:p>
     <w:p>
@@ -4033,16 +4289,18 @@
           <w:kern w:val="0"/>
           <w:sz w:val="24"/>
           <w:szCs w:val="24"/>
-          <w:lang w:val="en-US" w:eastAsia="fr-FR"/>
-          <w14:ligatures w14:val="none"/>
-        </w:rPr>
-      </w:pPr>
-      <w:r>
-        <w:rPr>
-          <w:rFonts w:ascii="Times New Roman" w:eastAsia="Times New Roman" w:hAnsi="Times New Roman" w:cs="Times New Roman"/>
-          <w:kern w:val="0"/>
-          <w:sz w:val="24"/>
-          <w:szCs w:val="24"/>
+          <w:highlight w:val="yellow"/>
+          <w:lang w:val="en-US" w:eastAsia="fr-FR"/>
+          <w14:ligatures w14:val="none"/>
+        </w:rPr>
+      </w:pPr>
+      <w:r>
+        <w:rPr>
+          <w:rFonts w:ascii="Times New Roman" w:eastAsia="Times New Roman" w:hAnsi="Times New Roman" w:cs="Times New Roman"/>
+          <w:kern w:val="0"/>
+          <w:sz w:val="24"/>
+          <w:szCs w:val="24"/>
+          <w:highlight w:val="yellow"/>
           <w:lang w:val="en-US" w:eastAsia="fr-FR"/>
           <w14:ligatures w14:val="none"/>
         </w:rPr>
@@ -4055,6 +4313,7 @@
           <w:kern w:val="0"/>
           <w:sz w:val="24"/>
           <w:szCs w:val="24"/>
+          <w:highlight w:val="yellow"/>
           <w:lang w:val="en-US" w:eastAsia="fr-FR"/>
           <w14:ligatures w14:val="none"/>
         </w:rPr>
@@ -4067,6 +4326,7 @@
           <w:kern w:val="0"/>
           <w:sz w:val="24"/>
           <w:szCs w:val="24"/>
+          <w:highlight w:val="yellow"/>
           <w:lang w:val="en-US" w:eastAsia="fr-FR"/>
           <w14:ligatures w14:val="none"/>
         </w:rPr>
@@ -4085,16 +4345,18 @@
           <w:kern w:val="0"/>
           <w:sz w:val="24"/>
           <w:szCs w:val="24"/>
-          <w:lang w:eastAsia="fr-FR"/>
-          <w14:ligatures w14:val="none"/>
-        </w:rPr>
-      </w:pPr>
-      <w:r>
-        <w:rPr>
-          <w:rFonts w:ascii="Times New Roman" w:eastAsia="Times New Roman" w:hAnsi="Times New Roman" w:cs="Times New Roman"/>
-          <w:kern w:val="0"/>
-          <w:sz w:val="24"/>
-          <w:szCs w:val="24"/>
+          <w:highlight w:val="yellow"/>
+          <w:lang w:eastAsia="fr-FR"/>
+          <w14:ligatures w14:val="none"/>
+        </w:rPr>
+      </w:pPr>
+      <w:r>
+        <w:rPr>
+          <w:rFonts w:ascii="Times New Roman" w:eastAsia="Times New Roman" w:hAnsi="Times New Roman" w:cs="Times New Roman"/>
+          <w:kern w:val="0"/>
+          <w:sz w:val="24"/>
+          <w:szCs w:val="24"/>
+          <w:highlight w:val="yellow"/>
           <w:lang w:eastAsia="fr-FR"/>
           <w14:ligatures w14:val="none"/>
         </w:rPr>
@@ -4107,6 +4369,7 @@
           <w:kern w:val="0"/>
           <w:sz w:val="24"/>
           <w:szCs w:val="24"/>
+          <w:highlight w:val="yellow"/>
           <w:lang w:eastAsia="fr-FR"/>
           <w14:ligatures w14:val="none"/>
         </w:rPr>
@@ -4119,6 +4382,7 @@
           <w:kern w:val="0"/>
           <w:sz w:val="24"/>
           <w:szCs w:val="24"/>
+          <w:highlight w:val="yellow"/>
           <w:lang w:eastAsia="fr-FR"/>
           <w14:ligatures w14:val="none"/>
         </w:rPr>
@@ -4131,6 +4395,7 @@
           <w:kern w:val="0"/>
           <w:sz w:val="24"/>
           <w:szCs w:val="24"/>
+          <w:highlight w:val="yellow"/>
           <w:lang w:eastAsia="fr-FR"/>
           <w14:ligatures w14:val="none"/>
         </w:rPr>
@@ -4143,6 +4408,7 @@
           <w:kern w:val="0"/>
           <w:sz w:val="24"/>
           <w:szCs w:val="24"/>
+          <w:highlight w:val="yellow"/>
           <w:lang w:eastAsia="fr-FR"/>
           <w14:ligatures w14:val="none"/>
         </w:rPr>
@@ -4161,16 +4427,18 @@
           <w:kern w:val="0"/>
           <w:sz w:val="24"/>
           <w:szCs w:val="24"/>
-          <w:lang w:val="en-US" w:eastAsia="fr-FR"/>
-          <w14:ligatures w14:val="none"/>
-        </w:rPr>
-      </w:pPr>
-      <w:r>
-        <w:rPr>
-          <w:rFonts w:ascii="Times New Roman" w:eastAsia="Times New Roman" w:hAnsi="Times New Roman" w:cs="Times New Roman"/>
-          <w:kern w:val="0"/>
-          <w:sz w:val="24"/>
-          <w:szCs w:val="24"/>
+          <w:highlight w:val="yellow"/>
+          <w:lang w:val="en-US" w:eastAsia="fr-FR"/>
+          <w14:ligatures w14:val="none"/>
+        </w:rPr>
+      </w:pPr>
+      <w:r>
+        <w:rPr>
+          <w:rFonts w:ascii="Times New Roman" w:eastAsia="Times New Roman" w:hAnsi="Times New Roman" w:cs="Times New Roman"/>
+          <w:kern w:val="0"/>
+          <w:sz w:val="24"/>
+          <w:szCs w:val="24"/>
+          <w:highlight w:val="yellow"/>
           <w:lang w:val="en-US" w:eastAsia="fr-FR"/>
           <w14:ligatures w14:val="none"/>
         </w:rPr>
@@ -4232,6 +4500,148 @@
           <w14:ligatures w14:val="none"/>
         </w:rPr>
         <w:t xml:space="preserve"> Model Tuning &amp; Validation</w:t>
+      </w:r>
+    </w:p>
+    <w:p>
+      <w:pPr>
+        <w:spacing w:before="100" w:beforeAutospacing="1" w:after="100" w:afterAutospacing="1" w:line="240" w:lineRule="auto"/>
+        <w:outlineLvl w:val="2"/>
+        <w:rPr>
+          <w:rFonts w:ascii="Times New Roman" w:eastAsia="Times New Roman" w:hAnsi="Times New Roman" w:cs="Times New Roman"/>
+          <w:b/>
+          <w:bCs/>
+          <w:kern w:val="0"/>
+          <w:sz w:val="27"/>
+          <w:szCs w:val="27"/>
+          <w:lang w:eastAsia="fr-FR"/>
+          <w14:ligatures w14:val="none"/>
+        </w:rPr>
+      </w:pPr>
+      <w:r>
+        <w:rPr>
+          <w:rFonts w:ascii="Times New Roman" w:eastAsia="Times New Roman" w:hAnsi="Times New Roman" w:cs="Times New Roman"/>
+          <w:b/>
+          <w:bCs/>
+          <w:kern w:val="0"/>
+          <w:sz w:val="27"/>
+          <w:szCs w:val="27"/>
+          <w:lang w:eastAsia="fr-FR"/>
+          <w14:ligatures w14:val="none"/>
+        </w:rPr>
+        <w:t xml:space="preserve">Model </w:t>
+      </w:r>
+      <w:proofErr w:type="spellStart"/>
+      <w:r>
+        <w:rPr>
+          <w:rFonts w:ascii="Times New Roman" w:eastAsia="Times New Roman" w:hAnsi="Times New Roman" w:cs="Times New Roman"/>
+          <w:b/>
+          <w:bCs/>
+          <w:kern w:val="0"/>
+          <w:sz w:val="27"/>
+          <w:szCs w:val="27"/>
+          <w:lang w:eastAsia="fr-FR"/>
+          <w14:ligatures w14:val="none"/>
+        </w:rPr>
+        <w:t>tunning</w:t>
+      </w:r>
+      <w:proofErr w:type="spellEnd"/>
+      <w:r>
+        <w:rPr>
+          <w:rFonts w:ascii="Times New Roman" w:eastAsia="Times New Roman" w:hAnsi="Times New Roman" w:cs="Times New Roman"/>
+          <w:b/>
+          <w:bCs/>
+          <w:kern w:val="0"/>
+          <w:sz w:val="27"/>
+          <w:szCs w:val="27"/>
+          <w:lang w:eastAsia="fr-FR"/>
+          <w14:ligatures w14:val="none"/>
+        </w:rPr>
+        <w:t xml:space="preserve"> : optimiser les </w:t>
+      </w:r>
+      <w:proofErr w:type="spellStart"/>
+      <w:r>
+        <w:rPr>
+          <w:rFonts w:ascii="Times New Roman" w:eastAsia="Times New Roman" w:hAnsi="Times New Roman" w:cs="Times New Roman"/>
+          <w:b/>
+          <w:bCs/>
+          <w:kern w:val="0"/>
+          <w:sz w:val="27"/>
+          <w:szCs w:val="27"/>
+          <w:lang w:eastAsia="fr-FR"/>
+          <w14:ligatures w14:val="none"/>
+        </w:rPr>
+        <w:t>hyperparametres</w:t>
+      </w:r>
+      <w:proofErr w:type="spellEnd"/>
+      <w:r>
+        <w:rPr>
+          <w:rFonts w:ascii="Times New Roman" w:eastAsia="Times New Roman" w:hAnsi="Times New Roman" w:cs="Times New Roman"/>
+          <w:b/>
+          <w:bCs/>
+          <w:kern w:val="0"/>
+          <w:sz w:val="27"/>
+          <w:szCs w:val="27"/>
+          <w:lang w:eastAsia="fr-FR"/>
+          <w14:ligatures w14:val="none"/>
+        </w:rPr>
+        <w:t xml:space="preserve"> pour améliorer les performances du </w:t>
+      </w:r>
+      <w:proofErr w:type="spellStart"/>
+      <w:r>
+        <w:rPr>
+          <w:rFonts w:ascii="Times New Roman" w:eastAsia="Times New Roman" w:hAnsi="Times New Roman" w:cs="Times New Roman"/>
+          <w:b/>
+          <w:bCs/>
+          <w:kern w:val="0"/>
+          <w:sz w:val="27"/>
+          <w:szCs w:val="27"/>
+          <w:lang w:eastAsia="fr-FR"/>
+          <w14:ligatures w14:val="none"/>
+        </w:rPr>
+        <w:t>modele</w:t>
+      </w:r>
+      <w:proofErr w:type="spellEnd"/>
+      <w:r>
+        <w:rPr>
+          <w:rFonts w:ascii="Times New Roman" w:eastAsia="Times New Roman" w:hAnsi="Times New Roman" w:cs="Times New Roman"/>
+          <w:b/>
+          <w:bCs/>
+          <w:kern w:val="0"/>
+          <w:sz w:val="27"/>
+          <w:szCs w:val="27"/>
+          <w:lang w:eastAsia="fr-FR"/>
+          <w14:ligatures w14:val="none"/>
+        </w:rPr>
+        <w:t>.</w:t>
+      </w:r>
+    </w:p>
+    <w:p>
+      <w:pPr>
+        <w:spacing w:before="100" w:beforeAutospacing="1" w:after="100" w:afterAutospacing="1" w:line="240" w:lineRule="auto"/>
+        <w:outlineLvl w:val="2"/>
+        <w:rPr>
+          <w:rFonts w:ascii="Times New Roman" w:eastAsia="Times New Roman" w:hAnsi="Times New Roman" w:cs="Times New Roman"/>
+          <w:b/>
+          <w:bCs/>
+          <w:kern w:val="0"/>
+          <w:sz w:val="27"/>
+          <w:szCs w:val="27"/>
+          <w:lang w:eastAsia="fr-FR"/>
+          <w14:ligatures w14:val="none"/>
+        </w:rPr>
+      </w:pPr>
+      <w:r>
+        <w:rPr>
+          <w:rFonts w:ascii="Times New Roman" w:eastAsia="Times New Roman" w:hAnsi="Times New Roman" w:cs="Times New Roman"/>
+          <w:b/>
+          <w:bCs/>
+          <w:kern w:val="0"/>
+          <w:sz w:val="27"/>
+          <w:szCs w:val="27"/>
+          <w:lang w:eastAsia="fr-FR"/>
+          <w14:ligatures w14:val="none"/>
+        </w:rPr>
+        <w:t>Validation : Mesurer les performances du modèle sur des données non vues.</w:t>
       </w:r>
     </w:p>
     <w:p>
@@ -4246,20 +4656,350 @@
           <w:kern w:val="0"/>
           <w:sz w:val="24"/>
           <w:szCs w:val="24"/>
-          <w:lang w:val="en-US" w:eastAsia="fr-FR"/>
-          <w14:ligatures w14:val="none"/>
-        </w:rPr>
-      </w:pPr>
-      <w:r>
-        <w:rPr>
-          <w:rFonts w:ascii="Times New Roman" w:eastAsia="Times New Roman" w:hAnsi="Times New Roman" w:cs="Times New Roman"/>
-          <w:kern w:val="0"/>
-          <w:sz w:val="24"/>
-          <w:szCs w:val="24"/>
-          <w:lang w:val="en-US" w:eastAsia="fr-FR"/>
-          <w14:ligatures w14:val="none"/>
-        </w:rPr>
-        <w:t>Day 46: Cross-validation (K-fold)</w:t>
+          <w:highlight w:val="yellow"/>
+          <w:lang w:val="en-US" w:eastAsia="fr-FR"/>
+          <w14:ligatures w14:val="none"/>
+        </w:rPr>
+      </w:pPr>
+      <w:r>
+        <w:rPr>
+          <w:rFonts w:ascii="Times New Roman" w:eastAsia="Times New Roman" w:hAnsi="Times New Roman" w:cs="Times New Roman"/>
+          <w:kern w:val="0"/>
+          <w:sz w:val="24"/>
+          <w:szCs w:val="24"/>
+          <w:highlight w:val="yellow"/>
+          <w:lang w:val="en-US" w:eastAsia="fr-FR"/>
+          <w14:ligatures w14:val="none"/>
+        </w:rPr>
+        <w:t>Day 46: Cross-validation</w:t>
+      </w:r>
+      <w:r>
+        <w:rPr>
+          <w:rFonts w:ascii="Times New Roman" w:eastAsia="Times New Roman" w:hAnsi="Times New Roman" w:cs="Times New Roman"/>
+          <w:kern w:val="0"/>
+          <w:sz w:val="24"/>
+          <w:szCs w:val="24"/>
+          <w:highlight w:val="yellow"/>
+          <w:lang w:val="en-US" w:eastAsia="fr-FR"/>
+          <w14:ligatures w14:val="none"/>
+        </w:rPr>
+        <w:t>:</w:t>
+      </w:r>
+    </w:p>
+    <w:p>
+      <w:pPr>
+        <w:numPr>
+          <w:ilvl w:val="1"/>
+          <w:numId w:val="10"/>
+        </w:numPr>
+        <w:spacing w:before="100" w:beforeAutospacing="1" w:after="100" w:afterAutospacing="1" w:line="240" w:lineRule="auto"/>
+        <w:rPr>
+          <w:rFonts w:ascii="Times New Roman" w:eastAsia="Times New Roman" w:hAnsi="Times New Roman" w:cs="Times New Roman"/>
+          <w:b/>
+          <w:bCs/>
+          <w:kern w:val="0"/>
+          <w:sz w:val="24"/>
+          <w:szCs w:val="24"/>
+          <w:highlight w:val="green"/>
+          <w:lang w:val="en-US" w:eastAsia="fr-FR"/>
+          <w14:ligatures w14:val="none"/>
+        </w:rPr>
+      </w:pPr>
+      <w:r>
+        <w:rPr>
+          <w:rFonts w:ascii="Times New Roman" w:eastAsia="Times New Roman" w:hAnsi="Times New Roman" w:cs="Times New Roman"/>
+          <w:b/>
+          <w:bCs/>
+          <w:kern w:val="0"/>
+          <w:sz w:val="24"/>
+          <w:szCs w:val="24"/>
+          <w:highlight w:val="green"/>
+          <w:lang w:val="en-US" w:eastAsia="fr-FR"/>
+          <w14:ligatures w14:val="none"/>
+        </w:rPr>
+        <w:t xml:space="preserve">train/test split, </w:t>
+      </w:r>
+    </w:p>
+    <w:p>
+      <w:pPr>
+        <w:numPr>
+          <w:ilvl w:val="1"/>
+          <w:numId w:val="10"/>
+        </w:numPr>
+        <w:spacing w:before="100" w:beforeAutospacing="1" w:after="100" w:afterAutospacing="1" w:line="240" w:lineRule="auto"/>
+        <w:rPr>
+          <w:rFonts w:ascii="Times New Roman" w:eastAsia="Times New Roman" w:hAnsi="Times New Roman" w:cs="Times New Roman"/>
+          <w:b/>
+          <w:bCs/>
+          <w:kern w:val="0"/>
+          <w:sz w:val="24"/>
+          <w:szCs w:val="24"/>
+          <w:highlight w:val="green"/>
+          <w:lang w:val="en-US" w:eastAsia="fr-FR"/>
+          <w14:ligatures w14:val="none"/>
+        </w:rPr>
+      </w:pPr>
+      <w:r>
+        <w:rPr>
+          <w:rFonts w:ascii="Times New Roman" w:eastAsia="Times New Roman" w:hAnsi="Times New Roman" w:cs="Times New Roman"/>
+          <w:b/>
+          <w:bCs/>
+          <w:kern w:val="0"/>
+          <w:sz w:val="24"/>
+          <w:szCs w:val="24"/>
+          <w:highlight w:val="green"/>
+          <w:lang w:val="en-US" w:eastAsia="fr-FR"/>
+          <w14:ligatures w14:val="none"/>
+        </w:rPr>
+        <w:t>K-fold</w:t>
+      </w:r>
+      <w:r>
+        <w:rPr>
+          <w:rFonts w:ascii="Times New Roman" w:eastAsia="Times New Roman" w:hAnsi="Times New Roman" w:cs="Times New Roman"/>
+          <w:b/>
+          <w:bCs/>
+          <w:kern w:val="0"/>
+          <w:sz w:val="24"/>
+          <w:szCs w:val="24"/>
+          <w:highlight w:val="green"/>
+          <w:lang w:val="en-US" w:eastAsia="fr-FR"/>
+          <w14:ligatures w14:val="none"/>
+        </w:rPr>
+        <w:t xml:space="preserve">, </w:t>
+      </w:r>
+    </w:p>
+    <w:p>
+      <w:pPr>
+        <w:numPr>
+          <w:ilvl w:val="1"/>
+          <w:numId w:val="10"/>
+        </w:numPr>
+        <w:spacing w:before="100" w:beforeAutospacing="1" w:after="100" w:afterAutospacing="1" w:line="240" w:lineRule="auto"/>
+        <w:rPr>
+          <w:rFonts w:ascii="Times New Roman" w:eastAsia="Times New Roman" w:hAnsi="Times New Roman" w:cs="Times New Roman"/>
+          <w:b/>
+          <w:bCs/>
+          <w:kern w:val="0"/>
+          <w:sz w:val="24"/>
+          <w:szCs w:val="24"/>
+          <w:highlight w:val="green"/>
+          <w:lang w:val="en-US" w:eastAsia="fr-FR"/>
+          <w14:ligatures w14:val="none"/>
+        </w:rPr>
+      </w:pPr>
+      <w:proofErr w:type="spellStart"/>
+      <w:r>
+        <w:rPr>
+          <w:rFonts w:ascii="Times New Roman" w:eastAsia="Times New Roman" w:hAnsi="Times New Roman" w:cs="Times New Roman"/>
+          <w:b/>
+          <w:bCs/>
+          <w:kern w:val="0"/>
+          <w:sz w:val="24"/>
+          <w:szCs w:val="24"/>
+          <w:highlight w:val="green"/>
+          <w:lang w:val="en-US" w:eastAsia="fr-FR"/>
+          <w14:ligatures w14:val="none"/>
+        </w:rPr>
+        <w:t>stratisfied</w:t>
+      </w:r>
+      <w:proofErr w:type="spellEnd"/>
+      <w:r>
+        <w:rPr>
+          <w:rFonts w:ascii="Times New Roman" w:eastAsia="Times New Roman" w:hAnsi="Times New Roman" w:cs="Times New Roman"/>
+          <w:b/>
+          <w:bCs/>
+          <w:kern w:val="0"/>
+          <w:sz w:val="24"/>
+          <w:szCs w:val="24"/>
+          <w:highlight w:val="green"/>
+          <w:lang w:val="en-US" w:eastAsia="fr-FR"/>
+          <w14:ligatures w14:val="none"/>
+        </w:rPr>
+        <w:t xml:space="preserve"> k-fold, </w:t>
+      </w:r>
+    </w:p>
+    <w:p>
+      <w:pPr>
+        <w:numPr>
+          <w:ilvl w:val="1"/>
+          <w:numId w:val="10"/>
+        </w:numPr>
+        <w:spacing w:before="100" w:beforeAutospacing="1" w:after="100" w:afterAutospacing="1" w:line="240" w:lineRule="auto"/>
+        <w:rPr>
+          <w:rFonts w:ascii="Times New Roman" w:eastAsia="Times New Roman" w:hAnsi="Times New Roman" w:cs="Times New Roman"/>
+          <w:b/>
+          <w:bCs/>
+          <w:kern w:val="0"/>
+          <w:sz w:val="24"/>
+          <w:szCs w:val="24"/>
+          <w:highlight w:val="green"/>
+          <w:lang w:val="en-US" w:eastAsia="fr-FR"/>
+          <w14:ligatures w14:val="none"/>
+        </w:rPr>
+      </w:pPr>
+      <w:r>
+        <w:rPr>
+          <w:rFonts w:ascii="Times New Roman" w:eastAsia="Times New Roman" w:hAnsi="Times New Roman" w:cs="Times New Roman"/>
+          <w:b/>
+          <w:bCs/>
+          <w:kern w:val="0"/>
+          <w:sz w:val="24"/>
+          <w:szCs w:val="24"/>
+          <w:highlight w:val="green"/>
+          <w:lang w:val="en-US" w:eastAsia="fr-FR"/>
+          <w14:ligatures w14:val="none"/>
+        </w:rPr>
+        <w:t xml:space="preserve">leave-on-out cv LOOCV, </w:t>
+      </w:r>
+    </w:p>
+    <w:p>
+      <w:pPr>
+        <w:numPr>
+          <w:ilvl w:val="1"/>
+          <w:numId w:val="10"/>
+        </w:numPr>
+        <w:spacing w:before="100" w:beforeAutospacing="1" w:after="100" w:afterAutospacing="1" w:line="240" w:lineRule="auto"/>
+        <w:rPr>
+          <w:rFonts w:ascii="Times New Roman" w:eastAsia="Times New Roman" w:hAnsi="Times New Roman" w:cs="Times New Roman"/>
+          <w:b/>
+          <w:bCs/>
+          <w:kern w:val="0"/>
+          <w:sz w:val="24"/>
+          <w:szCs w:val="24"/>
+          <w:highlight w:val="green"/>
+          <w:lang w:val="en-US" w:eastAsia="fr-FR"/>
+          <w14:ligatures w14:val="none"/>
+        </w:rPr>
+      </w:pPr>
+      <w:r>
+        <w:rPr>
+          <w:rFonts w:ascii="Times New Roman" w:eastAsia="Times New Roman" w:hAnsi="Times New Roman" w:cs="Times New Roman"/>
+          <w:b/>
+          <w:bCs/>
+          <w:kern w:val="0"/>
+          <w:sz w:val="24"/>
+          <w:szCs w:val="24"/>
+          <w:highlight w:val="green"/>
+          <w:lang w:val="en-US" w:eastAsia="fr-FR"/>
+          <w14:ligatures w14:val="none"/>
+        </w:rPr>
+        <w:t xml:space="preserve">leave-p-out cv LPOCV, </w:t>
+      </w:r>
+    </w:p>
+    <w:p>
+      <w:pPr>
+        <w:numPr>
+          <w:ilvl w:val="1"/>
+          <w:numId w:val="10"/>
+        </w:numPr>
+        <w:spacing w:before="100" w:beforeAutospacing="1" w:after="100" w:afterAutospacing="1" w:line="240" w:lineRule="auto"/>
+        <w:rPr>
+          <w:rFonts w:ascii="Times New Roman" w:eastAsia="Times New Roman" w:hAnsi="Times New Roman" w:cs="Times New Roman"/>
+          <w:b/>
+          <w:bCs/>
+          <w:kern w:val="0"/>
+          <w:sz w:val="24"/>
+          <w:szCs w:val="24"/>
+          <w:highlight w:val="green"/>
+          <w:lang w:val="en-US" w:eastAsia="fr-FR"/>
+          <w14:ligatures w14:val="none"/>
+        </w:rPr>
+      </w:pPr>
+      <w:r>
+        <w:rPr>
+          <w:rFonts w:ascii="Times New Roman" w:eastAsia="Times New Roman" w:hAnsi="Times New Roman" w:cs="Times New Roman"/>
+          <w:b/>
+          <w:bCs/>
+          <w:kern w:val="0"/>
+          <w:sz w:val="24"/>
+          <w:szCs w:val="24"/>
+          <w:highlight w:val="green"/>
+          <w:lang w:val="en-US" w:eastAsia="fr-FR"/>
+          <w14:ligatures w14:val="none"/>
+        </w:rPr>
+        <w:t>shuffle split</w:t>
+      </w:r>
+      <w:r>
+        <w:rPr>
+          <w:rFonts w:ascii="Times New Roman" w:eastAsia="Times New Roman" w:hAnsi="Times New Roman" w:cs="Times New Roman"/>
+          <w:b/>
+          <w:bCs/>
+          <w:kern w:val="0"/>
+          <w:sz w:val="24"/>
+          <w:szCs w:val="24"/>
+          <w:highlight w:val="green"/>
+          <w:lang w:val="en-US" w:eastAsia="fr-FR"/>
+          <w14:ligatures w14:val="none"/>
+        </w:rPr>
+        <w:t xml:space="preserve">, </w:t>
+      </w:r>
+    </w:p>
+    <w:p>
+      <w:pPr>
+        <w:numPr>
+          <w:ilvl w:val="1"/>
+          <w:numId w:val="10"/>
+        </w:numPr>
+        <w:spacing w:before="100" w:beforeAutospacing="1" w:after="100" w:afterAutospacing="1" w:line="240" w:lineRule="auto"/>
+        <w:rPr>
+          <w:rFonts w:ascii="Times New Roman" w:eastAsia="Times New Roman" w:hAnsi="Times New Roman" w:cs="Times New Roman"/>
+          <w:b/>
+          <w:bCs/>
+          <w:kern w:val="0"/>
+          <w:sz w:val="24"/>
+          <w:szCs w:val="24"/>
+          <w:highlight w:val="green"/>
+          <w:lang w:val="en-US" w:eastAsia="fr-FR"/>
+          <w14:ligatures w14:val="none"/>
+        </w:rPr>
+      </w:pPr>
+      <w:r>
+        <w:rPr>
+          <w:rFonts w:ascii="Times New Roman" w:eastAsia="Times New Roman" w:hAnsi="Times New Roman" w:cs="Times New Roman"/>
+          <w:b/>
+          <w:bCs/>
+          <w:kern w:val="0"/>
+          <w:sz w:val="24"/>
+          <w:szCs w:val="24"/>
+          <w:highlight w:val="green"/>
+          <w:lang w:val="en-US" w:eastAsia="fr-FR"/>
+          <w14:ligatures w14:val="none"/>
+        </w:rPr>
+        <w:t>time series split</w:t>
+      </w:r>
+    </w:p>
+    <w:p>
+      <w:pPr>
+        <w:numPr>
+          <w:ilvl w:val="1"/>
+          <w:numId w:val="10"/>
+        </w:numPr>
+        <w:spacing w:before="100" w:beforeAutospacing="1" w:after="100" w:afterAutospacing="1" w:line="240" w:lineRule="auto"/>
+        <w:rPr>
+          <w:rFonts w:ascii="Times New Roman" w:eastAsia="Times New Roman" w:hAnsi="Times New Roman" w:cs="Times New Roman"/>
+          <w:b/>
+          <w:bCs/>
+          <w:kern w:val="0"/>
+          <w:sz w:val="24"/>
+          <w:szCs w:val="24"/>
+          <w:highlight w:val="green"/>
+          <w:lang w:val="en-US" w:eastAsia="fr-FR"/>
+          <w14:ligatures w14:val="none"/>
+        </w:rPr>
+      </w:pPr>
+      <w:r>
+        <w:rPr>
+          <w:rFonts w:ascii="Times New Roman" w:eastAsia="Times New Roman" w:hAnsi="Times New Roman" w:cs="Times New Roman"/>
+          <w:b/>
+          <w:bCs/>
+          <w:kern w:val="0"/>
+          <w:sz w:val="24"/>
+          <w:szCs w:val="24"/>
+          <w:highlight w:val="green"/>
+          <w:lang w:val="en-US" w:eastAsia="fr-FR"/>
+          <w14:ligatures w14:val="none"/>
+        </w:rPr>
+        <w:t xml:space="preserve">group k-fold </w:t>
       </w:r>
     </w:p>
     <w:p>
@@ -10075,7 +10815,7 @@
         <w:sz w:val="20"/>
       </w:rPr>
     </w:lvl>
-    <w:lvl w:ilvl="1" w:tentative="1">
+    <w:lvl w:ilvl="1">
       <w:start w:val="1"/>
       <w:numFmt w:val="bullet"/>
       <w:lvlText w:val="o"/>

</xml_diff>

<commit_message>
grid search randomized search
</commit_message>
<xml_diff>
--- a/Plan.docx
+++ b/Plan.docx
@@ -5014,16 +5014,18 @@
           <w:kern w:val="0"/>
           <w:sz w:val="24"/>
           <w:szCs w:val="24"/>
-          <w:lang w:eastAsia="fr-FR"/>
-          <w14:ligatures w14:val="none"/>
-        </w:rPr>
-      </w:pPr>
-      <w:r>
-        <w:rPr>
-          <w:rFonts w:ascii="Times New Roman" w:eastAsia="Times New Roman" w:hAnsi="Times New Roman" w:cs="Times New Roman"/>
-          <w:kern w:val="0"/>
-          <w:sz w:val="24"/>
-          <w:szCs w:val="24"/>
+          <w:highlight w:val="yellow"/>
+          <w:lang w:eastAsia="fr-FR"/>
+          <w14:ligatures w14:val="none"/>
+        </w:rPr>
+      </w:pPr>
+      <w:r>
+        <w:rPr>
+          <w:rFonts w:ascii="Times New Roman" w:eastAsia="Times New Roman" w:hAnsi="Times New Roman" w:cs="Times New Roman"/>
+          <w:kern w:val="0"/>
+          <w:sz w:val="24"/>
+          <w:szCs w:val="24"/>
+          <w:highlight w:val="yellow"/>
           <w:lang w:eastAsia="fr-FR"/>
           <w14:ligatures w14:val="none"/>
         </w:rPr>
@@ -5036,6 +5038,7 @@
           <w:kern w:val="0"/>
           <w:sz w:val="24"/>
           <w:szCs w:val="24"/>
+          <w:highlight w:val="yellow"/>
           <w:lang w:eastAsia="fr-FR"/>
           <w14:ligatures w14:val="none"/>
         </w:rPr>
@@ -5048,6 +5051,7 @@
           <w:kern w:val="0"/>
           <w:sz w:val="24"/>
           <w:szCs w:val="24"/>
+          <w:highlight w:val="yellow"/>
           <w:lang w:eastAsia="fr-FR"/>
           <w14:ligatures w14:val="none"/>
         </w:rPr>
@@ -5060,6 +5064,7 @@
           <w:kern w:val="0"/>
           <w:sz w:val="24"/>
           <w:szCs w:val="24"/>
+          <w:highlight w:val="yellow"/>
           <w:lang w:eastAsia="fr-FR"/>
           <w14:ligatures w14:val="none"/>
         </w:rPr>
@@ -5072,6 +5077,7 @@
           <w:kern w:val="0"/>
           <w:sz w:val="24"/>
           <w:szCs w:val="24"/>
+          <w:highlight w:val="yellow"/>
           <w:lang w:eastAsia="fr-FR"/>
           <w14:ligatures w14:val="none"/>
         </w:rPr>
@@ -5084,6 +5090,7 @@
           <w:kern w:val="0"/>
           <w:sz w:val="24"/>
           <w:szCs w:val="24"/>
+          <w:highlight w:val="yellow"/>
           <w:lang w:eastAsia="fr-FR"/>
           <w14:ligatures w14:val="none"/>
         </w:rPr>
@@ -5096,6 +5103,7 @@
           <w:kern w:val="0"/>
           <w:sz w:val="24"/>
           <w:szCs w:val="24"/>
+          <w:highlight w:val="yellow"/>
           <w:lang w:eastAsia="fr-FR"/>
           <w14:ligatures w14:val="none"/>
         </w:rPr>
@@ -5108,6 +5116,7 @@
           <w:kern w:val="0"/>
           <w:sz w:val="24"/>
           <w:szCs w:val="24"/>
+          <w:highlight w:val="yellow"/>
           <w:lang w:eastAsia="fr-FR"/>
           <w14:ligatures w14:val="none"/>
         </w:rPr>
@@ -5127,68 +5136,42 @@
           <w:kern w:val="0"/>
           <w:sz w:val="24"/>
           <w:szCs w:val="24"/>
-          <w:lang w:eastAsia="fr-FR"/>
-          <w14:ligatures w14:val="none"/>
-        </w:rPr>
-      </w:pPr>
-      <w:r>
-        <w:rPr>
-          <w:rFonts w:ascii="Times New Roman" w:eastAsia="Times New Roman" w:hAnsi="Times New Roman" w:cs="Times New Roman"/>
-          <w:kern w:val="0"/>
-          <w:sz w:val="24"/>
-          <w:szCs w:val="24"/>
-          <w:lang w:eastAsia="fr-FR"/>
-          <w14:ligatures w14:val="none"/>
-        </w:rPr>
-        <w:t xml:space="preserve">Day </w:t>
-      </w:r>
-      <w:proofErr w:type="gramStart"/>
-      <w:r>
-        <w:rPr>
-          <w:rFonts w:ascii="Times New Roman" w:eastAsia="Times New Roman" w:hAnsi="Times New Roman" w:cs="Times New Roman"/>
-          <w:kern w:val="0"/>
-          <w:sz w:val="24"/>
-          <w:szCs w:val="24"/>
-          <w:lang w:eastAsia="fr-FR"/>
-          <w14:ligatures w14:val="none"/>
-        </w:rPr>
-        <w:t>48:</w:t>
-      </w:r>
-      <w:proofErr w:type="gramEnd"/>
-      <w:r>
-        <w:rPr>
-          <w:rFonts w:ascii="Times New Roman" w:eastAsia="Times New Roman" w:hAnsi="Times New Roman" w:cs="Times New Roman"/>
-          <w:kern w:val="0"/>
-          <w:sz w:val="24"/>
-          <w:szCs w:val="24"/>
-          <w:lang w:eastAsia="fr-FR"/>
-          <w14:ligatures w14:val="none"/>
-        </w:rPr>
-        <w:t xml:space="preserve"> Pipelines in </w:t>
-      </w:r>
-      <w:proofErr w:type="spellStart"/>
-      <w:r>
-        <w:rPr>
-          <w:rFonts w:ascii="Times New Roman" w:eastAsia="Times New Roman" w:hAnsi="Times New Roman" w:cs="Times New Roman"/>
-          <w:kern w:val="0"/>
-          <w:sz w:val="24"/>
-          <w:szCs w:val="24"/>
-          <w:lang w:eastAsia="fr-FR"/>
-          <w14:ligatures w14:val="none"/>
-        </w:rPr>
-        <w:t>scikit</w:t>
-      </w:r>
-      <w:proofErr w:type="spellEnd"/>
-      <w:r>
-        <w:rPr>
-          <w:rFonts w:ascii="Times New Roman" w:eastAsia="Times New Roman" w:hAnsi="Times New Roman" w:cs="Times New Roman"/>
-          <w:kern w:val="0"/>
-          <w:sz w:val="24"/>
-          <w:szCs w:val="24"/>
-          <w:lang w:eastAsia="fr-FR"/>
-          <w14:ligatures w14:val="none"/>
-        </w:rPr>
-        <w:t>-learn</w:t>
+          <w:lang w:val="en-US" w:eastAsia="fr-FR"/>
+          <w14:ligatures w14:val="none"/>
+        </w:rPr>
+      </w:pPr>
+      <w:r>
+        <w:rPr>
+          <w:rFonts w:ascii="Times New Roman" w:eastAsia="Times New Roman" w:hAnsi="Times New Roman" w:cs="Times New Roman"/>
+          <w:kern w:val="0"/>
+          <w:sz w:val="24"/>
+          <w:szCs w:val="24"/>
+          <w:lang w:val="en-US" w:eastAsia="fr-FR"/>
+          <w14:ligatures w14:val="none"/>
+        </w:rPr>
+        <w:t>Day 48: Pipelines in scikit-learn</w:t>
+      </w:r>
+      <w:r>
+        <w:rPr>
+          <w:rFonts w:ascii="Times New Roman" w:eastAsia="Times New Roman" w:hAnsi="Times New Roman" w:cs="Times New Roman"/>
+          <w:kern w:val="0"/>
+          <w:sz w:val="24"/>
+          <w:szCs w:val="24"/>
+          <w:lang w:val="en-US" w:eastAsia="fr-FR"/>
+          <w14:ligatures w14:val="none"/>
+        </w:rPr>
+        <w:t xml:space="preserve">, </w:t>
+      </w:r>
+      <w:r>
+        <w:rPr>
+          <w:rFonts w:ascii="Times New Roman" w:eastAsia="Times New Roman" w:hAnsi="Times New Roman" w:cs="Times New Roman"/>
+          <w:kern w:val="0"/>
+          <w:sz w:val="24"/>
+          <w:szCs w:val="24"/>
+          <w:lang w:val="en-US" w:eastAsia="fr-FR"/>
+          <w14:ligatures w14:val="none"/>
+        </w:rPr>
+        <w:t>SelectFromModel</w:t>
       </w:r>
     </w:p>
     <w:p>
@@ -5203,82 +5186,21 @@
           <w:kern w:val="0"/>
           <w:sz w:val="24"/>
           <w:szCs w:val="24"/>
-          <w:lang w:eastAsia="fr-FR"/>
-          <w14:ligatures w14:val="none"/>
-        </w:rPr>
-      </w:pPr>
-      <w:r>
-        <w:rPr>
-          <w:rFonts w:ascii="Times New Roman" w:eastAsia="Times New Roman" w:hAnsi="Times New Roman" w:cs="Times New Roman"/>
-          <w:kern w:val="0"/>
-          <w:sz w:val="24"/>
-          <w:szCs w:val="24"/>
-          <w:lang w:eastAsia="fr-FR"/>
-          <w14:ligatures w14:val="none"/>
-        </w:rPr>
-        <w:t xml:space="preserve">Day </w:t>
-      </w:r>
-      <w:proofErr w:type="gramStart"/>
-      <w:r>
-        <w:rPr>
-          <w:rFonts w:ascii="Times New Roman" w:eastAsia="Times New Roman" w:hAnsi="Times New Roman" w:cs="Times New Roman"/>
-          <w:kern w:val="0"/>
-          <w:sz w:val="24"/>
-          <w:szCs w:val="24"/>
-          <w:lang w:eastAsia="fr-FR"/>
-          <w14:ligatures w14:val="none"/>
-        </w:rPr>
-        <w:t>49:</w:t>
-      </w:r>
-      <w:proofErr w:type="gramEnd"/>
-      <w:r>
-        <w:rPr>
-          <w:rFonts w:ascii="Times New Roman" w:eastAsia="Times New Roman" w:hAnsi="Times New Roman" w:cs="Times New Roman"/>
-          <w:kern w:val="0"/>
-          <w:sz w:val="24"/>
-          <w:szCs w:val="24"/>
-          <w:lang w:eastAsia="fr-FR"/>
-          <w14:ligatures w14:val="none"/>
-        </w:rPr>
-        <w:t xml:space="preserve"> Data </w:t>
-      </w:r>
-      <w:proofErr w:type="spellStart"/>
-      <w:r>
-        <w:rPr>
-          <w:rFonts w:ascii="Times New Roman" w:eastAsia="Times New Roman" w:hAnsi="Times New Roman" w:cs="Times New Roman"/>
-          <w:kern w:val="0"/>
-          <w:sz w:val="24"/>
-          <w:szCs w:val="24"/>
-          <w:lang w:eastAsia="fr-FR"/>
-          <w14:ligatures w14:val="none"/>
-        </w:rPr>
-        <w:t>leakage</w:t>
-      </w:r>
-      <w:proofErr w:type="spellEnd"/>
-      <w:r>
-        <w:rPr>
-          <w:rFonts w:ascii="Times New Roman" w:eastAsia="Times New Roman" w:hAnsi="Times New Roman" w:cs="Times New Roman"/>
-          <w:kern w:val="0"/>
-          <w:sz w:val="24"/>
-          <w:szCs w:val="24"/>
-          <w:lang w:eastAsia="fr-FR"/>
-          <w14:ligatures w14:val="none"/>
-        </w:rPr>
-        <w:t xml:space="preserve"> and </w:t>
-      </w:r>
-      <w:proofErr w:type="spellStart"/>
-      <w:r>
-        <w:rPr>
-          <w:rFonts w:ascii="Times New Roman" w:eastAsia="Times New Roman" w:hAnsi="Times New Roman" w:cs="Times New Roman"/>
-          <w:kern w:val="0"/>
-          <w:sz w:val="24"/>
-          <w:szCs w:val="24"/>
-          <w:lang w:eastAsia="fr-FR"/>
-          <w14:ligatures w14:val="none"/>
-        </w:rPr>
-        <w:t>scaling</w:t>
-      </w:r>
-      <w:proofErr w:type="spellEnd"/>
+          <w:lang w:val="en-US" w:eastAsia="fr-FR"/>
+          <w14:ligatures w14:val="none"/>
+        </w:rPr>
+      </w:pPr>
+      <w:r>
+        <w:rPr>
+          <w:rFonts w:ascii="Times New Roman" w:eastAsia="Times New Roman" w:hAnsi="Times New Roman" w:cs="Times New Roman"/>
+          <w:kern w:val="0"/>
+          <w:sz w:val="24"/>
+          <w:szCs w:val="24"/>
+          <w:lang w:val="en-US" w:eastAsia="fr-FR"/>
+          <w14:ligatures w14:val="none"/>
+        </w:rPr>
+        <w:t>Day 49: Data leakage and scaling</w:t>
+      </w:r>
     </w:p>
     <w:p>
       <w:pPr>
@@ -12826,4 +12748,16 @@
     </a:ext>
   </a:extLst>
 </a:theme>
+</file>
+
+<file path=customXml/item1.xml><?xml version="1.0" encoding="utf-8"?>
+<b:Sources xmlns:b="http://schemas.openxmlformats.org/officeDocument/2006/bibliography" xmlns="http://schemas.openxmlformats.org/officeDocument/2006/bibliography" SelectedStyle="\APASixthEditionOfficeOnline.xsl" StyleName="APA" Version="6"/>
+</file>
+
+<file path=customXml/itemProps1.xml><?xml version="1.0" encoding="utf-8"?>
+<ds:datastoreItem xmlns:ds="http://schemas.openxmlformats.org/officeDocument/2006/customXml" ds:itemID="{5CD10A0C-4D35-4D86-A1EC-507222B5900A}">
+  <ds:schemaRefs>
+    <ds:schemaRef ds:uri="http://schemas.openxmlformats.org/officeDocument/2006/bibliography"/>
+  </ds:schemaRefs>
+</ds:datastoreItem>
 </file>
</xml_diff>

<commit_message>
neural network and other stuff hh
</commit_message>
<xml_diff>
--- a/Plan.docx
+++ b/Plan.docx
@@ -5081,33 +5081,7 @@
           <w:lang w:eastAsia="fr-FR"/>
           <w14:ligatures w14:val="none"/>
         </w:rPr>
-        <w:t xml:space="preserve"> </w:t>
-      </w:r>
-      <w:proofErr w:type="spellStart"/>
-      <w:r>
-        <w:rPr>
-          <w:rFonts w:ascii="Times New Roman" w:eastAsia="Times New Roman" w:hAnsi="Times New Roman" w:cs="Times New Roman"/>
-          <w:kern w:val="0"/>
-          <w:sz w:val="24"/>
-          <w:szCs w:val="24"/>
-          <w:highlight w:val="yellow"/>
-          <w:lang w:eastAsia="fr-FR"/>
-          <w14:ligatures w14:val="none"/>
-        </w:rPr>
-        <w:t>Search</w:t>
-      </w:r>
-      <w:proofErr w:type="spellEnd"/>
-      <w:r>
-        <w:rPr>
-          <w:rFonts w:ascii="Times New Roman" w:eastAsia="Times New Roman" w:hAnsi="Times New Roman" w:cs="Times New Roman"/>
-          <w:kern w:val="0"/>
-          <w:sz w:val="24"/>
-          <w:szCs w:val="24"/>
-          <w:highlight w:val="yellow"/>
-          <w:lang w:eastAsia="fr-FR"/>
-          <w14:ligatures w14:val="none"/>
-        </w:rPr>
-        <w:t xml:space="preserve">, </w:t>
+        <w:t xml:space="preserve"> Search, </w:t>
       </w:r>
       <w:proofErr w:type="spellStart"/>
       <w:r>
@@ -5958,33 +5932,7 @@
           <w:lang w:eastAsia="fr-FR"/>
           <w14:ligatures w14:val="none"/>
         </w:rPr>
-        <w:t xml:space="preserve"> </w:t>
-      </w:r>
-      <w:proofErr w:type="spellStart"/>
-      <w:r>
-        <w:rPr>
-          <w:rFonts w:ascii="Times New Roman" w:eastAsia="Times New Roman" w:hAnsi="Times New Roman" w:cs="Times New Roman"/>
-          <w:kern w:val="0"/>
-          <w:sz w:val="24"/>
-          <w:szCs w:val="24"/>
-          <w:highlight w:val="yellow"/>
-          <w:lang w:eastAsia="fr-FR"/>
-          <w14:ligatures w14:val="none"/>
-        </w:rPr>
-        <w:t>Binning</w:t>
-      </w:r>
-      <w:proofErr w:type="spellEnd"/>
-      <w:r>
-        <w:rPr>
-          <w:rFonts w:ascii="Times New Roman" w:eastAsia="Times New Roman" w:hAnsi="Times New Roman" w:cs="Times New Roman"/>
-          <w:kern w:val="0"/>
-          <w:sz w:val="24"/>
-          <w:szCs w:val="24"/>
-          <w:highlight w:val="yellow"/>
-          <w:lang w:eastAsia="fr-FR"/>
-          <w14:ligatures w14:val="none"/>
-        </w:rPr>
-        <w:t xml:space="preserve">, interaction </w:t>
+        <w:t xml:space="preserve"> Binning, interaction </w:t>
       </w:r>
       <w:proofErr w:type="spellStart"/>
       <w:r>
@@ -6026,33 +5974,18 @@
           <w14:ligatures w14:val="none"/>
         </w:rPr>
       </w:pPr>
-      <w:proofErr w:type="spellStart"/>
-      <w:r>
-        <w:rPr>
-          <w:rFonts w:ascii="Times New Roman" w:eastAsia="Times New Roman" w:hAnsi="Times New Roman" w:cs="Times New Roman"/>
-          <w:b/>
-          <w:bCs/>
-          <w:kern w:val="0"/>
-          <w:sz w:val="24"/>
-          <w:szCs w:val="24"/>
-          <w:lang w:eastAsia="fr-FR"/>
-          <w14:ligatures w14:val="none"/>
-        </w:rPr>
-        <w:t>Binning</w:t>
-      </w:r>
-      <w:proofErr w:type="spellEnd"/>
-      <w:r>
-        <w:rPr>
-          <w:rFonts w:ascii="Times New Roman" w:eastAsia="Times New Roman" w:hAnsi="Times New Roman" w:cs="Times New Roman"/>
-          <w:b/>
-          <w:bCs/>
-          <w:kern w:val="0"/>
-          <w:sz w:val="24"/>
-          <w:szCs w:val="24"/>
-          <w:lang w:eastAsia="fr-FR"/>
-          <w14:ligatures w14:val="none"/>
-        </w:rPr>
-        <w:t xml:space="preserve"> </w:t>
+      <w:r>
+        <w:rPr>
+          <w:rFonts w:ascii="Times New Roman" w:eastAsia="Times New Roman" w:hAnsi="Times New Roman" w:cs="Times New Roman"/>
+          <w:b/>
+          <w:bCs/>
+          <w:kern w:val="0"/>
+          <w:sz w:val="24"/>
+          <w:szCs w:val="24"/>
+          <w:lang w:eastAsia="fr-FR"/>
+          <w14:ligatures w14:val="none"/>
+        </w:rPr>
+        <w:t xml:space="preserve">Binning </w:t>
       </w:r>
       <w:r>
         <w:rPr>
@@ -6757,25 +6690,114 @@
         </w:numPr>
         <w:spacing w:before="100" w:beforeAutospacing="1" w:after="100" w:afterAutospacing="1" w:line="240" w:lineRule="auto"/>
         <w:rPr>
-          <w:rFonts w:ascii="Times New Roman" w:eastAsia="Times New Roman" w:hAnsi="Times New Roman" w:cs="Times New Roman"/>
-          <w:kern w:val="0"/>
-          <w:sz w:val="24"/>
-          <w:szCs w:val="24"/>
-          <w:lang w:val="en-US" w:eastAsia="fr-FR"/>
-          <w14:ligatures w14:val="none"/>
-        </w:rPr>
-      </w:pPr>
-      <w:r>
-        <w:rPr>
-          <w:rFonts w:ascii="Times New Roman" w:eastAsia="Times New Roman" w:hAnsi="Times New Roman" w:cs="Times New Roman"/>
-          <w:kern w:val="0"/>
-          <w:sz w:val="24"/>
-          <w:szCs w:val="24"/>
-          <w:lang w:val="en-US" w:eastAsia="fr-FR"/>
-          <w14:ligatures w14:val="none"/>
-        </w:rPr>
-        <w:t>Day 65: Mini project: Forecast stock or temperature data</w:t>
-      </w:r>
+          <w:b/>
+          <w:bCs/>
+        </w:rPr>
+      </w:pPr>
+      <w:r>
+        <w:rPr>
+          <w:rFonts w:ascii="Times New Roman" w:eastAsia="Times New Roman" w:hAnsi="Times New Roman" w:cs="Times New Roman"/>
+          <w:kern w:val="0"/>
+          <w:sz w:val="24"/>
+          <w:szCs w:val="24"/>
+          <w:lang w:val="en-US" w:eastAsia="fr-FR"/>
+          <w14:ligatures w14:val="none"/>
+        </w:rPr>
+        <w:t xml:space="preserve">Day 65: Mini project: </w:t>
+      </w:r>
+    </w:p>
+    <w:p>
+      <w:pPr>
+        <w:spacing w:before="100" w:beforeAutospacing="1" w:after="100" w:afterAutospacing="1" w:line="240" w:lineRule="auto"/>
+        <w:ind w:left="720"/>
+        <w:rPr>
+          <w:b/>
+          <w:bCs/>
+        </w:rPr>
+      </w:pPr>
+      <w:r>
+        <w:rPr>
+          <w:b/>
+          <w:bCs/>
+        </w:rPr>
+        <w:t>1. Prévision de consommation électrique d’un foyer</w:t>
+      </w:r>
+    </w:p>
+    <w:p>
+      <w:pPr>
+        <w:ind w:left="360"/>
+        <w:rPr>
+          <w:lang w:val="en-US"/>
+        </w:rPr>
+      </w:pPr>
+      <w:proofErr w:type="gramStart"/>
+      <w:r>
+        <w:rPr>
+          <w:lang w:val="en-US"/>
+        </w:rPr>
+        <w:t>Données :</w:t>
+      </w:r>
+      <w:proofErr w:type="gramEnd"/>
+      <w:r>
+        <w:rPr>
+          <w:lang w:val="en-US"/>
+        </w:rPr>
+        <w:t xml:space="preserve"> Open Power System Data, UK Power Consumption, etc.</w:t>
+      </w:r>
+    </w:p>
+    <w:p>
+      <w:pPr>
+        <w:ind w:left="360"/>
+      </w:pPr>
+      <w:r>
+        <w:t>Tâche : Prévoir la consommation horaire sur 48h.</w:t>
+      </w:r>
+    </w:p>
+    <w:p>
+      <w:pPr>
+        <w:ind w:left="360"/>
+      </w:pPr>
+      <w:r>
+        <w:t xml:space="preserve">Plus-value : Série temporelle, météo → </w:t>
+      </w:r>
+      <w:proofErr w:type="spellStart"/>
+      <w:r>
+        <w:t>features</w:t>
+      </w:r>
+      <w:proofErr w:type="spellEnd"/>
+      <w:r>
+        <w:t xml:space="preserve"> externes.</w:t>
+      </w:r>
+    </w:p>
+    <w:p>
+      <w:pPr>
+        <w:ind w:left="360"/>
+      </w:pPr>
+      <w:r>
+        <w:t xml:space="preserve">Plus-value : Données spatio-temporelles → riche en </w:t>
+      </w:r>
+      <w:proofErr w:type="spellStart"/>
+      <w:r>
+        <w:t>feature</w:t>
+      </w:r>
+      <w:proofErr w:type="spellEnd"/>
+      <w:r>
+        <w:t xml:space="preserve"> engineering.</w:t>
+      </w:r>
+    </w:p>
+    <w:p>
+      <w:pPr>
+        <w:spacing w:before="100" w:beforeAutospacing="1" w:after="100" w:afterAutospacing="1" w:line="240" w:lineRule="auto"/>
+        <w:ind w:left="720"/>
+        <w:rPr>
+          <w:rFonts w:ascii="Times New Roman" w:eastAsia="Times New Roman" w:hAnsi="Times New Roman" w:cs="Times New Roman"/>
+          <w:kern w:val="0"/>
+          <w:sz w:val="24"/>
+          <w:szCs w:val="24"/>
+          <w:lang w:eastAsia="fr-FR"/>
+          <w14:ligatures w14:val="none"/>
+        </w:rPr>
+      </w:pPr>
     </w:p>
     <w:p>
       <w:pPr>
@@ -7213,16 +7235,18 @@
           <w:kern w:val="0"/>
           <w:sz w:val="24"/>
           <w:szCs w:val="24"/>
-          <w:lang w:eastAsia="fr-FR"/>
-          <w14:ligatures w14:val="none"/>
-        </w:rPr>
-      </w:pPr>
-      <w:r>
-        <w:rPr>
-          <w:rFonts w:ascii="Times New Roman" w:eastAsia="Times New Roman" w:hAnsi="Times New Roman" w:cs="Times New Roman"/>
-          <w:kern w:val="0"/>
-          <w:sz w:val="24"/>
-          <w:szCs w:val="24"/>
+          <w:highlight w:val="yellow"/>
+          <w:lang w:eastAsia="fr-FR"/>
+          <w14:ligatures w14:val="none"/>
+        </w:rPr>
+      </w:pPr>
+      <w:r>
+        <w:rPr>
+          <w:rFonts w:ascii="Times New Roman" w:eastAsia="Times New Roman" w:hAnsi="Times New Roman" w:cs="Times New Roman"/>
+          <w:kern w:val="0"/>
+          <w:sz w:val="24"/>
+          <w:szCs w:val="24"/>
+          <w:highlight w:val="yellow"/>
           <w:lang w:val="en-US" w:eastAsia="fr-FR"/>
           <w14:ligatures w14:val="none"/>
         </w:rPr>
@@ -7235,6 +7259,7 @@
           <w:kern w:val="0"/>
           <w:sz w:val="24"/>
           <w:szCs w:val="24"/>
+          <w:highlight w:val="yellow"/>
           <w:lang w:eastAsia="fr-FR"/>
           <w14:ligatures w14:val="none"/>
         </w:rPr>
@@ -7247,6 +7272,7 @@
           <w:kern w:val="0"/>
           <w:sz w:val="24"/>
           <w:szCs w:val="24"/>
+          <w:highlight w:val="yellow"/>
           <w:lang w:eastAsia="fr-FR"/>
           <w14:ligatures w14:val="none"/>
         </w:rPr>
@@ -7259,6 +7285,7 @@
           <w:kern w:val="0"/>
           <w:sz w:val="24"/>
           <w:szCs w:val="24"/>
+          <w:highlight w:val="yellow"/>
           <w:lang w:eastAsia="fr-FR"/>
           <w14:ligatures w14:val="none"/>
         </w:rPr>
@@ -7278,16 +7305,18 @@
           <w:kern w:val="0"/>
           <w:sz w:val="24"/>
           <w:szCs w:val="24"/>
-          <w:lang w:eastAsia="fr-FR"/>
-          <w14:ligatures w14:val="none"/>
-        </w:rPr>
-      </w:pPr>
-      <w:r>
-        <w:rPr>
-          <w:rFonts w:ascii="Times New Roman" w:eastAsia="Times New Roman" w:hAnsi="Times New Roman" w:cs="Times New Roman"/>
-          <w:kern w:val="0"/>
-          <w:sz w:val="24"/>
-          <w:szCs w:val="24"/>
+          <w:highlight w:val="yellow"/>
+          <w:lang w:eastAsia="fr-FR"/>
+          <w14:ligatures w14:val="none"/>
+        </w:rPr>
+      </w:pPr>
+      <w:r>
+        <w:rPr>
+          <w:rFonts w:ascii="Times New Roman" w:eastAsia="Times New Roman" w:hAnsi="Times New Roman" w:cs="Times New Roman"/>
+          <w:kern w:val="0"/>
+          <w:sz w:val="24"/>
+          <w:szCs w:val="24"/>
+          <w:highlight w:val="yellow"/>
           <w:lang w:eastAsia="fr-FR"/>
           <w14:ligatures w14:val="none"/>
         </w:rPr>
@@ -7300,6 +7329,7 @@
           <w:kern w:val="0"/>
           <w:sz w:val="24"/>
           <w:szCs w:val="24"/>
+          <w:highlight w:val="yellow"/>
           <w:lang w:eastAsia="fr-FR"/>
           <w14:ligatures w14:val="none"/>
         </w:rPr>
@@ -7312,6 +7342,7 @@
           <w:kern w:val="0"/>
           <w:sz w:val="24"/>
           <w:szCs w:val="24"/>
+          <w:highlight w:val="yellow"/>
           <w:lang w:eastAsia="fr-FR"/>
           <w14:ligatures w14:val="none"/>
         </w:rPr>
@@ -7324,6 +7355,7 @@
           <w:kern w:val="0"/>
           <w:sz w:val="24"/>
           <w:szCs w:val="24"/>
+          <w:highlight w:val="yellow"/>
           <w:lang w:eastAsia="fr-FR"/>
           <w14:ligatures w14:val="none"/>
         </w:rPr>
@@ -7343,16 +7375,18 @@
           <w:kern w:val="0"/>
           <w:sz w:val="24"/>
           <w:szCs w:val="24"/>
-          <w:lang w:val="en-US" w:eastAsia="fr-FR"/>
-          <w14:ligatures w14:val="none"/>
-        </w:rPr>
-      </w:pPr>
-      <w:r>
-        <w:rPr>
-          <w:rFonts w:ascii="Times New Roman" w:eastAsia="Times New Roman" w:hAnsi="Times New Roman" w:cs="Times New Roman"/>
-          <w:kern w:val="0"/>
-          <w:sz w:val="24"/>
-          <w:szCs w:val="24"/>
+          <w:highlight w:val="yellow"/>
+          <w:lang w:val="en-US" w:eastAsia="fr-FR"/>
+          <w14:ligatures w14:val="none"/>
+        </w:rPr>
+      </w:pPr>
+      <w:r>
+        <w:rPr>
+          <w:rFonts w:ascii="Times New Roman" w:eastAsia="Times New Roman" w:hAnsi="Times New Roman" w:cs="Times New Roman"/>
+          <w:kern w:val="0"/>
+          <w:sz w:val="24"/>
+          <w:szCs w:val="24"/>
+          <w:highlight w:val="yellow"/>
           <w:lang w:val="en-US" w:eastAsia="fr-FR"/>
           <w14:ligatures w14:val="none"/>
         </w:rPr>
@@ -7371,16 +7405,18 @@
           <w:kern w:val="0"/>
           <w:sz w:val="24"/>
           <w:szCs w:val="24"/>
-          <w:lang w:eastAsia="fr-FR"/>
-          <w14:ligatures w14:val="none"/>
-        </w:rPr>
-      </w:pPr>
-      <w:r>
-        <w:rPr>
-          <w:rFonts w:ascii="Times New Roman" w:eastAsia="Times New Roman" w:hAnsi="Times New Roman" w:cs="Times New Roman"/>
-          <w:kern w:val="0"/>
-          <w:sz w:val="24"/>
-          <w:szCs w:val="24"/>
+          <w:highlight w:val="yellow"/>
+          <w:lang w:eastAsia="fr-FR"/>
+          <w14:ligatures w14:val="none"/>
+        </w:rPr>
+      </w:pPr>
+      <w:r>
+        <w:rPr>
+          <w:rFonts w:ascii="Times New Roman" w:eastAsia="Times New Roman" w:hAnsi="Times New Roman" w:cs="Times New Roman"/>
+          <w:kern w:val="0"/>
+          <w:sz w:val="24"/>
+          <w:szCs w:val="24"/>
+          <w:highlight w:val="yellow"/>
           <w:lang w:eastAsia="fr-FR"/>
           <w14:ligatures w14:val="none"/>
         </w:rPr>
@@ -7393,6 +7429,7 @@
           <w:kern w:val="0"/>
           <w:sz w:val="24"/>
           <w:szCs w:val="24"/>
+          <w:highlight w:val="yellow"/>
           <w:lang w:eastAsia="fr-FR"/>
           <w14:ligatures w14:val="none"/>
         </w:rPr>
@@ -7405,6 +7442,7 @@
           <w:kern w:val="0"/>
           <w:sz w:val="24"/>
           <w:szCs w:val="24"/>
+          <w:highlight w:val="yellow"/>
           <w:lang w:eastAsia="fr-FR"/>
           <w14:ligatures w14:val="none"/>
         </w:rPr>
@@ -7417,6 +7455,7 @@
           <w:kern w:val="0"/>
           <w:sz w:val="24"/>
           <w:szCs w:val="24"/>
+          <w:highlight w:val="yellow"/>
           <w:lang w:eastAsia="fr-FR"/>
           <w14:ligatures w14:val="none"/>
         </w:rPr>
@@ -7429,6 +7468,7 @@
           <w:kern w:val="0"/>
           <w:sz w:val="24"/>
           <w:szCs w:val="24"/>
+          <w:highlight w:val="yellow"/>
           <w:lang w:eastAsia="fr-FR"/>
           <w14:ligatures w14:val="none"/>
         </w:rPr>
@@ -7441,6 +7481,7 @@
           <w:kern w:val="0"/>
           <w:sz w:val="24"/>
           <w:szCs w:val="24"/>
+          <w:highlight w:val="yellow"/>
           <w:lang w:eastAsia="fr-FR"/>
           <w14:ligatures w14:val="none"/>
         </w:rPr>
@@ -7460,16 +7501,18 @@
           <w:kern w:val="0"/>
           <w:sz w:val="24"/>
           <w:szCs w:val="24"/>
-          <w:lang w:eastAsia="fr-FR"/>
-          <w14:ligatures w14:val="none"/>
-        </w:rPr>
-      </w:pPr>
-      <w:r>
-        <w:rPr>
-          <w:rFonts w:ascii="Times New Roman" w:eastAsia="Times New Roman" w:hAnsi="Times New Roman" w:cs="Times New Roman"/>
-          <w:kern w:val="0"/>
-          <w:sz w:val="24"/>
-          <w:szCs w:val="24"/>
+          <w:highlight w:val="yellow"/>
+          <w:lang w:eastAsia="fr-FR"/>
+          <w14:ligatures w14:val="none"/>
+        </w:rPr>
+      </w:pPr>
+      <w:r>
+        <w:rPr>
+          <w:rFonts w:ascii="Times New Roman" w:eastAsia="Times New Roman" w:hAnsi="Times New Roman" w:cs="Times New Roman"/>
+          <w:kern w:val="0"/>
+          <w:sz w:val="24"/>
+          <w:szCs w:val="24"/>
+          <w:highlight w:val="yellow"/>
           <w:lang w:eastAsia="fr-FR"/>
           <w14:ligatures w14:val="none"/>
         </w:rPr>
@@ -7482,6 +7525,7 @@
           <w:kern w:val="0"/>
           <w:sz w:val="24"/>
           <w:szCs w:val="24"/>
+          <w:highlight w:val="yellow"/>
           <w:lang w:eastAsia="fr-FR"/>
           <w14:ligatures w14:val="none"/>
         </w:rPr>
@@ -7494,6 +7538,7 @@
           <w:kern w:val="0"/>
           <w:sz w:val="24"/>
           <w:szCs w:val="24"/>
+          <w:highlight w:val="yellow"/>
           <w:lang w:eastAsia="fr-FR"/>
           <w14:ligatures w14:val="none"/>
         </w:rPr>
@@ -7507,6 +7552,7 @@
           <w:kern w:val="0"/>
           <w:sz w:val="24"/>
           <w:szCs w:val="24"/>
+          <w:highlight w:val="yellow"/>
           <w:lang w:eastAsia="fr-FR"/>
           <w14:ligatures w14:val="none"/>
         </w:rPr>
@@ -7519,6 +7565,7 @@
           <w:kern w:val="0"/>
           <w:sz w:val="24"/>
           <w:szCs w:val="24"/>
+          <w:highlight w:val="yellow"/>
           <w:lang w:eastAsia="fr-FR"/>
           <w14:ligatures w14:val="none"/>
         </w:rPr>
@@ -7531,6 +7578,7 @@
           <w:kern w:val="0"/>
           <w:sz w:val="24"/>
           <w:szCs w:val="24"/>
+          <w:highlight w:val="yellow"/>
           <w:lang w:eastAsia="fr-FR"/>
           <w14:ligatures w14:val="none"/>
         </w:rPr>
@@ -7578,6 +7626,155 @@
 <file path=word/numbering.xml><?xml version="1.0" encoding="utf-8"?>
 <w:numbering xmlns:wpc="http://schemas.microsoft.com/office/word/2010/wordprocessingCanvas" xmlns:cx="http://schemas.microsoft.com/office/drawing/2014/chartex" xmlns:cx1="http://schemas.microsoft.com/office/drawing/2015/9/8/chartex" xmlns:cx2="http://schemas.microsoft.com/office/drawing/2015/10/21/chartex" xmlns:cx3="http://schemas.microsoft.com/office/drawing/2016/5/9/chartex" xmlns:cx4="http://schemas.microsoft.com/office/drawing/2016/5/10/chartex" xmlns:cx5="http://schemas.microsoft.com/office/drawing/2016/5/11/chartex" xmlns:cx6="http://schemas.microsoft.com/office/drawing/2016/5/12/chartex" xmlns:cx7="http://schemas.microsoft.com/office/drawing/2016/5/13/chartex" xmlns:cx8="http://schemas.microsoft.com/office/drawing/2016/5/14/chartex" xmlns:mc="http://schemas.openxmlformats.org/markup-compatibility/2006" xmlns:aink="http://schemas.microsoft.com/office/drawing/2016/ink" xmlns:am3d="http://schemas.microsoft.com/office/drawing/2017/model3d" xmlns:o="urn:schemas-microsoft-com:office:office" xmlns:oel="http://schemas.microsoft.com/office/2019/extlst" xmlns:r="http://schemas.openxmlformats.org/officeDocument/2006/relationships" xmlns:m="http://schemas.openxmlformats.org/officeDocument/2006/math" xmlns:v="urn:schemas-microsoft-com:vml" xmlns:wp14="http://schemas.microsoft.com/office/word/2010/wordprocessingDrawing" xmlns:wp="http://schemas.openxmlformats.org/drawingml/2006/wordprocessingDrawing" xmlns:w10="urn:schemas-microsoft-com:office:word" xmlns:w="http://schemas.openxmlformats.org/wordprocessingml/2006/main" xmlns:w14="http://schemas.microsoft.com/office/word/2010/wordml" xmlns:w15="http://schemas.microsoft.com/office/word/2012/wordml" xmlns:w16cex="http://schemas.microsoft.com/office/word/2018/wordml/cex" xmlns:w16cid="http://schemas.microsoft.com/office/word/2016/wordml/cid" xmlns:w16="http://schemas.microsoft.com/office/word/2018/wordml" xmlns:w16du="http://schemas.microsoft.com/office/word/2023/wordml/word16du" xmlns:w16sdtdh="http://schemas.microsoft.com/office/word/2020/wordml/sdtdatahash" xmlns:w16sdtfl="http://schemas.microsoft.com/office/word/2024/wordml/sdtformatlock" xmlns:w16se="http://schemas.microsoft.com/office/word/2015/wordml/symex" xmlns:wpg="http://schemas.microsoft.com/office/word/2010/wordprocessingGroup" xmlns:wpi="http://schemas.microsoft.com/office/word/2010/wordprocessingInk" xmlns:wne="http://schemas.microsoft.com/office/word/2006/wordml" xmlns:wps="http://schemas.microsoft.com/office/word/2010/wordprocessingShape" mc:Ignorable="w14 w15 w16se w16cid w16 w16cex w16sdtdh w16sdtfl w16du wp14">
   <w:abstractNum w:abstractNumId="0" w15:restartNumberingAfterBreak="0">
+    <w:nsid w:val="01570DD6"/>
+    <w:multiLevelType w:val="multilevel"/>
+    <w:tmpl w:val="F2A06D2C"/>
+    <w:lvl w:ilvl="0">
+      <w:start w:val="1"/>
+      <w:numFmt w:val="bullet"/>
+      <w:lvlText w:val=""/>
+      <w:lvlJc w:val="left"/>
+      <w:pPr>
+        <w:tabs>
+          <w:tab w:val="num" w:pos="720"/>
+        </w:tabs>
+        <w:ind w:left="720" w:hanging="360"/>
+      </w:pPr>
+      <w:rPr>
+        <w:rFonts w:ascii="Symbol" w:hAnsi="Symbol" w:hint="default"/>
+        <w:sz w:val="20"/>
+      </w:rPr>
+    </w:lvl>
+    <w:lvl w:ilvl="1" w:tentative="1">
+      <w:start w:val="1"/>
+      <w:numFmt w:val="bullet"/>
+      <w:lvlText w:val="o"/>
+      <w:lvlJc w:val="left"/>
+      <w:pPr>
+        <w:tabs>
+          <w:tab w:val="num" w:pos="1440"/>
+        </w:tabs>
+        <w:ind w:left="1440" w:hanging="360"/>
+      </w:pPr>
+      <w:rPr>
+        <w:rFonts w:ascii="Courier New" w:hAnsi="Courier New" w:hint="default"/>
+        <w:sz w:val="20"/>
+      </w:rPr>
+    </w:lvl>
+    <w:lvl w:ilvl="2" w:tentative="1">
+      <w:start w:val="1"/>
+      <w:numFmt w:val="bullet"/>
+      <w:lvlText w:val=""/>
+      <w:lvlJc w:val="left"/>
+      <w:pPr>
+        <w:tabs>
+          <w:tab w:val="num" w:pos="2160"/>
+        </w:tabs>
+        <w:ind w:left="2160" w:hanging="360"/>
+      </w:pPr>
+      <w:rPr>
+        <w:rFonts w:ascii="Wingdings" w:hAnsi="Wingdings" w:hint="default"/>
+        <w:sz w:val="20"/>
+      </w:rPr>
+    </w:lvl>
+    <w:lvl w:ilvl="3" w:tentative="1">
+      <w:start w:val="1"/>
+      <w:numFmt w:val="bullet"/>
+      <w:lvlText w:val=""/>
+      <w:lvlJc w:val="left"/>
+      <w:pPr>
+        <w:tabs>
+          <w:tab w:val="num" w:pos="2880"/>
+        </w:tabs>
+        <w:ind w:left="2880" w:hanging="360"/>
+      </w:pPr>
+      <w:rPr>
+        <w:rFonts w:ascii="Wingdings" w:hAnsi="Wingdings" w:hint="default"/>
+        <w:sz w:val="20"/>
+      </w:rPr>
+    </w:lvl>
+    <w:lvl w:ilvl="4" w:tentative="1">
+      <w:start w:val="1"/>
+      <w:numFmt w:val="bullet"/>
+      <w:lvlText w:val=""/>
+      <w:lvlJc w:val="left"/>
+      <w:pPr>
+        <w:tabs>
+          <w:tab w:val="num" w:pos="3600"/>
+        </w:tabs>
+        <w:ind w:left="3600" w:hanging="360"/>
+      </w:pPr>
+      <w:rPr>
+        <w:rFonts w:ascii="Wingdings" w:hAnsi="Wingdings" w:hint="default"/>
+        <w:sz w:val="20"/>
+      </w:rPr>
+    </w:lvl>
+    <w:lvl w:ilvl="5" w:tentative="1">
+      <w:start w:val="1"/>
+      <w:numFmt w:val="bullet"/>
+      <w:lvlText w:val=""/>
+      <w:lvlJc w:val="left"/>
+      <w:pPr>
+        <w:tabs>
+          <w:tab w:val="num" w:pos="4320"/>
+        </w:tabs>
+        <w:ind w:left="4320" w:hanging="360"/>
+      </w:pPr>
+      <w:rPr>
+        <w:rFonts w:ascii="Wingdings" w:hAnsi="Wingdings" w:hint="default"/>
+        <w:sz w:val="20"/>
+      </w:rPr>
+    </w:lvl>
+    <w:lvl w:ilvl="6" w:tentative="1">
+      <w:start w:val="1"/>
+      <w:numFmt w:val="bullet"/>
+      <w:lvlText w:val=""/>
+      <w:lvlJc w:val="left"/>
+      <w:pPr>
+        <w:tabs>
+          <w:tab w:val="num" w:pos="5040"/>
+        </w:tabs>
+        <w:ind w:left="5040" w:hanging="360"/>
+      </w:pPr>
+      <w:rPr>
+        <w:rFonts w:ascii="Wingdings" w:hAnsi="Wingdings" w:hint="default"/>
+        <w:sz w:val="20"/>
+      </w:rPr>
+    </w:lvl>
+    <w:lvl w:ilvl="7" w:tentative="1">
+      <w:start w:val="1"/>
+      <w:numFmt w:val="bullet"/>
+      <w:lvlText w:val=""/>
+      <w:lvlJc w:val="left"/>
+      <w:pPr>
+        <w:tabs>
+          <w:tab w:val="num" w:pos="5760"/>
+        </w:tabs>
+        <w:ind w:left="5760" w:hanging="360"/>
+      </w:pPr>
+      <w:rPr>
+        <w:rFonts w:ascii="Wingdings" w:hAnsi="Wingdings" w:hint="default"/>
+        <w:sz w:val="20"/>
+      </w:rPr>
+    </w:lvl>
+    <w:lvl w:ilvl="8" w:tentative="1">
+      <w:start w:val="1"/>
+      <w:numFmt w:val="bullet"/>
+      <w:lvlText w:val=""/>
+      <w:lvlJc w:val="left"/>
+      <w:pPr>
+        <w:tabs>
+          <w:tab w:val="num" w:pos="6480"/>
+        </w:tabs>
+        <w:ind w:left="6480" w:hanging="360"/>
+      </w:pPr>
+      <w:rPr>
+        <w:rFonts w:ascii="Wingdings" w:hAnsi="Wingdings" w:hint="default"/>
+        <w:sz w:val="20"/>
+      </w:rPr>
+    </w:lvl>
+  </w:abstractNum>
+  <w:abstractNum w:abstractNumId="1" w15:restartNumberingAfterBreak="0">
     <w:nsid w:val="01C3353D"/>
     <w:multiLevelType w:val="multilevel"/>
     <w:tmpl w:val="6018E2D0"/>
@@ -7726,7 +7923,156 @@
       </w:rPr>
     </w:lvl>
   </w:abstractNum>
-  <w:abstractNum w:abstractNumId="1" w15:restartNumberingAfterBreak="0">
+  <w:abstractNum w:abstractNumId="2" w15:restartNumberingAfterBreak="0">
+    <w:nsid w:val="06C901EE"/>
+    <w:multiLevelType w:val="multilevel"/>
+    <w:tmpl w:val="5BAAE654"/>
+    <w:lvl w:ilvl="0">
+      <w:start w:val="1"/>
+      <w:numFmt w:val="bullet"/>
+      <w:lvlText w:val=""/>
+      <w:lvlJc w:val="left"/>
+      <w:pPr>
+        <w:tabs>
+          <w:tab w:val="num" w:pos="720"/>
+        </w:tabs>
+        <w:ind w:left="720" w:hanging="360"/>
+      </w:pPr>
+      <w:rPr>
+        <w:rFonts w:ascii="Symbol" w:hAnsi="Symbol" w:hint="default"/>
+        <w:sz w:val="20"/>
+      </w:rPr>
+    </w:lvl>
+    <w:lvl w:ilvl="1" w:tentative="1">
+      <w:start w:val="1"/>
+      <w:numFmt w:val="bullet"/>
+      <w:lvlText w:val="o"/>
+      <w:lvlJc w:val="left"/>
+      <w:pPr>
+        <w:tabs>
+          <w:tab w:val="num" w:pos="1440"/>
+        </w:tabs>
+        <w:ind w:left="1440" w:hanging="360"/>
+      </w:pPr>
+      <w:rPr>
+        <w:rFonts w:ascii="Courier New" w:hAnsi="Courier New" w:hint="default"/>
+        <w:sz w:val="20"/>
+      </w:rPr>
+    </w:lvl>
+    <w:lvl w:ilvl="2" w:tentative="1">
+      <w:start w:val="1"/>
+      <w:numFmt w:val="bullet"/>
+      <w:lvlText w:val=""/>
+      <w:lvlJc w:val="left"/>
+      <w:pPr>
+        <w:tabs>
+          <w:tab w:val="num" w:pos="2160"/>
+        </w:tabs>
+        <w:ind w:left="2160" w:hanging="360"/>
+      </w:pPr>
+      <w:rPr>
+        <w:rFonts w:ascii="Wingdings" w:hAnsi="Wingdings" w:hint="default"/>
+        <w:sz w:val="20"/>
+      </w:rPr>
+    </w:lvl>
+    <w:lvl w:ilvl="3" w:tentative="1">
+      <w:start w:val="1"/>
+      <w:numFmt w:val="bullet"/>
+      <w:lvlText w:val=""/>
+      <w:lvlJc w:val="left"/>
+      <w:pPr>
+        <w:tabs>
+          <w:tab w:val="num" w:pos="2880"/>
+        </w:tabs>
+        <w:ind w:left="2880" w:hanging="360"/>
+      </w:pPr>
+      <w:rPr>
+        <w:rFonts w:ascii="Wingdings" w:hAnsi="Wingdings" w:hint="default"/>
+        <w:sz w:val="20"/>
+      </w:rPr>
+    </w:lvl>
+    <w:lvl w:ilvl="4" w:tentative="1">
+      <w:start w:val="1"/>
+      <w:numFmt w:val="bullet"/>
+      <w:lvlText w:val=""/>
+      <w:lvlJc w:val="left"/>
+      <w:pPr>
+        <w:tabs>
+          <w:tab w:val="num" w:pos="3600"/>
+        </w:tabs>
+        <w:ind w:left="3600" w:hanging="360"/>
+      </w:pPr>
+      <w:rPr>
+        <w:rFonts w:ascii="Wingdings" w:hAnsi="Wingdings" w:hint="default"/>
+        <w:sz w:val="20"/>
+      </w:rPr>
+    </w:lvl>
+    <w:lvl w:ilvl="5" w:tentative="1">
+      <w:start w:val="1"/>
+      <w:numFmt w:val="bullet"/>
+      <w:lvlText w:val=""/>
+      <w:lvlJc w:val="left"/>
+      <w:pPr>
+        <w:tabs>
+          <w:tab w:val="num" w:pos="4320"/>
+        </w:tabs>
+        <w:ind w:left="4320" w:hanging="360"/>
+      </w:pPr>
+      <w:rPr>
+        <w:rFonts w:ascii="Wingdings" w:hAnsi="Wingdings" w:hint="default"/>
+        <w:sz w:val="20"/>
+      </w:rPr>
+    </w:lvl>
+    <w:lvl w:ilvl="6" w:tentative="1">
+      <w:start w:val="1"/>
+      <w:numFmt w:val="bullet"/>
+      <w:lvlText w:val=""/>
+      <w:lvlJc w:val="left"/>
+      <w:pPr>
+        <w:tabs>
+          <w:tab w:val="num" w:pos="5040"/>
+        </w:tabs>
+        <w:ind w:left="5040" w:hanging="360"/>
+      </w:pPr>
+      <w:rPr>
+        <w:rFonts w:ascii="Wingdings" w:hAnsi="Wingdings" w:hint="default"/>
+        <w:sz w:val="20"/>
+      </w:rPr>
+    </w:lvl>
+    <w:lvl w:ilvl="7" w:tentative="1">
+      <w:start w:val="1"/>
+      <w:numFmt w:val="bullet"/>
+      <w:lvlText w:val=""/>
+      <w:lvlJc w:val="left"/>
+      <w:pPr>
+        <w:tabs>
+          <w:tab w:val="num" w:pos="5760"/>
+        </w:tabs>
+        <w:ind w:left="5760" w:hanging="360"/>
+      </w:pPr>
+      <w:rPr>
+        <w:rFonts w:ascii="Wingdings" w:hAnsi="Wingdings" w:hint="default"/>
+        <w:sz w:val="20"/>
+      </w:rPr>
+    </w:lvl>
+    <w:lvl w:ilvl="8" w:tentative="1">
+      <w:start w:val="1"/>
+      <w:numFmt w:val="bullet"/>
+      <w:lvlText w:val=""/>
+      <w:lvlJc w:val="left"/>
+      <w:pPr>
+        <w:tabs>
+          <w:tab w:val="num" w:pos="6480"/>
+        </w:tabs>
+        <w:ind w:left="6480" w:hanging="360"/>
+      </w:pPr>
+      <w:rPr>
+        <w:rFonts w:ascii="Wingdings" w:hAnsi="Wingdings" w:hint="default"/>
+        <w:sz w:val="20"/>
+      </w:rPr>
+    </w:lvl>
+  </w:abstractNum>
+  <w:abstractNum w:abstractNumId="3" w15:restartNumberingAfterBreak="0">
     <w:nsid w:val="09B062AD"/>
     <w:multiLevelType w:val="multilevel"/>
     <w:tmpl w:val="A8F8C7F8"/>
@@ -7875,7 +8221,7 @@
       </w:rPr>
     </w:lvl>
   </w:abstractNum>
-  <w:abstractNum w:abstractNumId="2" w15:restartNumberingAfterBreak="0">
+  <w:abstractNum w:abstractNumId="4" w15:restartNumberingAfterBreak="0">
     <w:nsid w:val="0A3F55FA"/>
     <w:multiLevelType w:val="multilevel"/>
     <w:tmpl w:val="56EC0A98"/>
@@ -8024,7 +8370,7 @@
       </w:rPr>
     </w:lvl>
   </w:abstractNum>
-  <w:abstractNum w:abstractNumId="3" w15:restartNumberingAfterBreak="0">
+  <w:abstractNum w:abstractNumId="5" w15:restartNumberingAfterBreak="0">
     <w:nsid w:val="1F3439CF"/>
     <w:multiLevelType w:val="multilevel"/>
     <w:tmpl w:val="03E251E4"/>
@@ -8173,7 +8519,7 @@
       </w:rPr>
     </w:lvl>
   </w:abstractNum>
-  <w:abstractNum w:abstractNumId="4" w15:restartNumberingAfterBreak="0">
+  <w:abstractNum w:abstractNumId="6" w15:restartNumberingAfterBreak="0">
     <w:nsid w:val="2A0B18EF"/>
     <w:multiLevelType w:val="multilevel"/>
     <w:tmpl w:val="A1FE297C"/>
@@ -8322,7 +8668,7 @@
       </w:rPr>
     </w:lvl>
   </w:abstractNum>
-  <w:abstractNum w:abstractNumId="5" w15:restartNumberingAfterBreak="0">
+  <w:abstractNum w:abstractNumId="7" w15:restartNumberingAfterBreak="0">
     <w:nsid w:val="2A6D4F8F"/>
     <w:multiLevelType w:val="multilevel"/>
     <w:tmpl w:val="CA8E2F6C"/>
@@ -8471,7 +8817,7 @@
       </w:rPr>
     </w:lvl>
   </w:abstractNum>
-  <w:abstractNum w:abstractNumId="6" w15:restartNumberingAfterBreak="0">
+  <w:abstractNum w:abstractNumId="8" w15:restartNumberingAfterBreak="0">
     <w:nsid w:val="2C85342D"/>
     <w:multiLevelType w:val="multilevel"/>
     <w:tmpl w:val="BD120FD8"/>
@@ -8620,7 +8966,7 @@
       </w:rPr>
     </w:lvl>
   </w:abstractNum>
-  <w:abstractNum w:abstractNumId="7" w15:restartNumberingAfterBreak="0">
+  <w:abstractNum w:abstractNumId="9" w15:restartNumberingAfterBreak="0">
     <w:nsid w:val="2CFD0F6F"/>
     <w:multiLevelType w:val="multilevel"/>
     <w:tmpl w:val="95241BD0"/>
@@ -8769,7 +9115,7 @@
       </w:rPr>
     </w:lvl>
   </w:abstractNum>
-  <w:abstractNum w:abstractNumId="8" w15:restartNumberingAfterBreak="0">
+  <w:abstractNum w:abstractNumId="10" w15:restartNumberingAfterBreak="0">
     <w:nsid w:val="319E2522"/>
     <w:multiLevelType w:val="hybridMultilevel"/>
     <w:tmpl w:val="A4C46684"/>
@@ -8855,7 +9201,7 @@
       </w:pPr>
     </w:lvl>
   </w:abstractNum>
-  <w:abstractNum w:abstractNumId="9" w15:restartNumberingAfterBreak="0">
+  <w:abstractNum w:abstractNumId="11" w15:restartNumberingAfterBreak="0">
     <w:nsid w:val="32314E43"/>
     <w:multiLevelType w:val="multilevel"/>
     <w:tmpl w:val="6DFE445C"/>
@@ -9004,7 +9350,7 @@
       </w:rPr>
     </w:lvl>
   </w:abstractNum>
-  <w:abstractNum w:abstractNumId="10" w15:restartNumberingAfterBreak="0">
+  <w:abstractNum w:abstractNumId="12" w15:restartNumberingAfterBreak="0">
     <w:nsid w:val="37306EE6"/>
     <w:multiLevelType w:val="multilevel"/>
     <w:tmpl w:val="58B45C42"/>
@@ -9153,7 +9499,7 @@
       </w:rPr>
     </w:lvl>
   </w:abstractNum>
-  <w:abstractNum w:abstractNumId="11" w15:restartNumberingAfterBreak="0">
+  <w:abstractNum w:abstractNumId="13" w15:restartNumberingAfterBreak="0">
     <w:nsid w:val="39C038B1"/>
     <w:multiLevelType w:val="multilevel"/>
     <w:tmpl w:val="2BA83B04"/>
@@ -9302,7 +9648,7 @@
       </w:rPr>
     </w:lvl>
   </w:abstractNum>
-  <w:abstractNum w:abstractNumId="12" w15:restartNumberingAfterBreak="0">
+  <w:abstractNum w:abstractNumId="14" w15:restartNumberingAfterBreak="0">
     <w:nsid w:val="3D6F0EA4"/>
     <w:multiLevelType w:val="multilevel"/>
     <w:tmpl w:val="BDF03F3C"/>
@@ -9451,7 +9797,7 @@
       </w:rPr>
     </w:lvl>
   </w:abstractNum>
-  <w:abstractNum w:abstractNumId="13" w15:restartNumberingAfterBreak="0">
+  <w:abstractNum w:abstractNumId="15" w15:restartNumberingAfterBreak="0">
     <w:nsid w:val="3E7013D6"/>
     <w:multiLevelType w:val="multilevel"/>
     <w:tmpl w:val="74A45D22"/>
@@ -9600,7 +9946,7 @@
       </w:rPr>
     </w:lvl>
   </w:abstractNum>
-  <w:abstractNum w:abstractNumId="14" w15:restartNumberingAfterBreak="0">
+  <w:abstractNum w:abstractNumId="16" w15:restartNumberingAfterBreak="0">
     <w:nsid w:val="403C08E2"/>
     <w:multiLevelType w:val="multilevel"/>
     <w:tmpl w:val="FB6288E0"/>
@@ -9749,7 +10095,7 @@
       </w:rPr>
     </w:lvl>
   </w:abstractNum>
-  <w:abstractNum w:abstractNumId="15" w15:restartNumberingAfterBreak="0">
+  <w:abstractNum w:abstractNumId="17" w15:restartNumberingAfterBreak="0">
     <w:nsid w:val="46A85515"/>
     <w:multiLevelType w:val="multilevel"/>
     <w:tmpl w:val="8D6CE70C"/>
@@ -9898,7 +10244,7 @@
       </w:rPr>
     </w:lvl>
   </w:abstractNum>
-  <w:abstractNum w:abstractNumId="16" w15:restartNumberingAfterBreak="0">
+  <w:abstractNum w:abstractNumId="18" w15:restartNumberingAfterBreak="0">
     <w:nsid w:val="48425E02"/>
     <w:multiLevelType w:val="multilevel"/>
     <w:tmpl w:val="9DBA5C14"/>
@@ -10047,7 +10393,7 @@
       </w:rPr>
     </w:lvl>
   </w:abstractNum>
-  <w:abstractNum w:abstractNumId="17" w15:restartNumberingAfterBreak="0">
+  <w:abstractNum w:abstractNumId="19" w15:restartNumberingAfterBreak="0">
     <w:nsid w:val="4A765645"/>
     <w:multiLevelType w:val="multilevel"/>
     <w:tmpl w:val="C4AA6924"/>
@@ -10196,7 +10542,7 @@
       </w:rPr>
     </w:lvl>
   </w:abstractNum>
-  <w:abstractNum w:abstractNumId="18" w15:restartNumberingAfterBreak="0">
+  <w:abstractNum w:abstractNumId="20" w15:restartNumberingAfterBreak="0">
     <w:nsid w:val="4E414EC2"/>
     <w:multiLevelType w:val="multilevel"/>
     <w:tmpl w:val="6BBA3D38"/>
@@ -10345,7 +10691,7 @@
       </w:rPr>
     </w:lvl>
   </w:abstractNum>
-  <w:abstractNum w:abstractNumId="19" w15:restartNumberingAfterBreak="0">
+  <w:abstractNum w:abstractNumId="21" w15:restartNumberingAfterBreak="0">
     <w:nsid w:val="5443533E"/>
     <w:multiLevelType w:val="multilevel"/>
     <w:tmpl w:val="8446EBBC"/>
@@ -10494,7 +10840,7 @@
       </w:rPr>
     </w:lvl>
   </w:abstractNum>
-  <w:abstractNum w:abstractNumId="20" w15:restartNumberingAfterBreak="0">
+  <w:abstractNum w:abstractNumId="22" w15:restartNumberingAfterBreak="0">
     <w:nsid w:val="5E953EED"/>
     <w:multiLevelType w:val="multilevel"/>
     <w:tmpl w:val="A71ECE4C"/>
@@ -10643,7 +10989,7 @@
       </w:rPr>
     </w:lvl>
   </w:abstractNum>
-  <w:abstractNum w:abstractNumId="21" w15:restartNumberingAfterBreak="0">
+  <w:abstractNum w:abstractNumId="23" w15:restartNumberingAfterBreak="0">
     <w:nsid w:val="609C14FA"/>
     <w:multiLevelType w:val="multilevel"/>
     <w:tmpl w:val="DB1A14BA"/>
@@ -10792,7 +11138,7 @@
       </w:rPr>
     </w:lvl>
   </w:abstractNum>
-  <w:abstractNum w:abstractNumId="22" w15:restartNumberingAfterBreak="0">
+  <w:abstractNum w:abstractNumId="24" w15:restartNumberingAfterBreak="0">
     <w:nsid w:val="69F818B0"/>
     <w:multiLevelType w:val="multilevel"/>
     <w:tmpl w:val="997E2736"/>
@@ -10941,7 +11287,7 @@
       </w:rPr>
     </w:lvl>
   </w:abstractNum>
-  <w:abstractNum w:abstractNumId="23" w15:restartNumberingAfterBreak="0">
+  <w:abstractNum w:abstractNumId="25" w15:restartNumberingAfterBreak="0">
     <w:nsid w:val="7C576E51"/>
     <w:multiLevelType w:val="multilevel"/>
     <w:tmpl w:val="B64ACDBC"/>
@@ -11091,76 +11437,82 @@
     </w:lvl>
   </w:abstractNum>
   <w:num w:numId="1" w16cid:durableId="1395618421">
+    <w:abstractNumId w:val="4"/>
+  </w:num>
+  <w:num w:numId="2" w16cid:durableId="1586569769">
+    <w:abstractNumId w:val="12"/>
+  </w:num>
+  <w:num w:numId="3" w16cid:durableId="1779371563">
+    <w:abstractNumId w:val="6"/>
+  </w:num>
+  <w:num w:numId="4" w16cid:durableId="1204370127">
+    <w:abstractNumId w:val="16"/>
+  </w:num>
+  <w:num w:numId="5" w16cid:durableId="1751196124">
+    <w:abstractNumId w:val="24"/>
+  </w:num>
+  <w:num w:numId="6" w16cid:durableId="1074426143">
+    <w:abstractNumId w:val="15"/>
+  </w:num>
+  <w:num w:numId="7" w16cid:durableId="57048577">
+    <w:abstractNumId w:val="3"/>
+  </w:num>
+  <w:num w:numId="8" w16cid:durableId="815874802">
+    <w:abstractNumId w:val="13"/>
+  </w:num>
+  <w:num w:numId="9" w16cid:durableId="92941787">
+    <w:abstractNumId w:val="1"/>
+  </w:num>
+  <w:num w:numId="10" w16cid:durableId="669068450">
+    <w:abstractNumId w:val="21"/>
+  </w:num>
+  <w:num w:numId="11" w16cid:durableId="667290534">
+    <w:abstractNumId w:val="25"/>
+  </w:num>
+  <w:num w:numId="12" w16cid:durableId="226839535">
+    <w:abstractNumId w:val="5"/>
+  </w:num>
+  <w:num w:numId="13" w16cid:durableId="2059235817">
+    <w:abstractNumId w:val="19"/>
+  </w:num>
+  <w:num w:numId="14" w16cid:durableId="829562467">
+    <w:abstractNumId w:val="14"/>
+  </w:num>
+  <w:num w:numId="15" w16cid:durableId="1148400394">
+    <w:abstractNumId w:val="23"/>
+  </w:num>
+  <w:num w:numId="16" w16cid:durableId="1835878333">
+    <w:abstractNumId w:val="20"/>
+  </w:num>
+  <w:num w:numId="17" w16cid:durableId="1793818157">
+    <w:abstractNumId w:val="22"/>
+  </w:num>
+  <w:num w:numId="18" w16cid:durableId="916941765">
+    <w:abstractNumId w:val="17"/>
+  </w:num>
+  <w:num w:numId="19" w16cid:durableId="1829982507">
+    <w:abstractNumId w:val="11"/>
+  </w:num>
+  <w:num w:numId="20" w16cid:durableId="1882934644">
+    <w:abstractNumId w:val="18"/>
+  </w:num>
+  <w:num w:numId="21" w16cid:durableId="324482125">
+    <w:abstractNumId w:val="8"/>
+  </w:num>
+  <w:num w:numId="22" w16cid:durableId="1477064731">
+    <w:abstractNumId w:val="7"/>
+  </w:num>
+  <w:num w:numId="23" w16cid:durableId="850295434">
+    <w:abstractNumId w:val="9"/>
+  </w:num>
+  <w:num w:numId="24" w16cid:durableId="657005186">
+    <w:abstractNumId w:val="10"/>
+  </w:num>
+  <w:num w:numId="25" w16cid:durableId="1349327198">
     <w:abstractNumId w:val="2"/>
   </w:num>
-  <w:num w:numId="2" w16cid:durableId="1586569769">
-    <w:abstractNumId w:val="10"/>
-  </w:num>
-  <w:num w:numId="3" w16cid:durableId="1779371563">
-    <w:abstractNumId w:val="4"/>
-  </w:num>
-  <w:num w:numId="4" w16cid:durableId="1204370127">
-    <w:abstractNumId w:val="14"/>
-  </w:num>
-  <w:num w:numId="5" w16cid:durableId="1751196124">
-    <w:abstractNumId w:val="22"/>
-  </w:num>
-  <w:num w:numId="6" w16cid:durableId="1074426143">
-    <w:abstractNumId w:val="13"/>
-  </w:num>
-  <w:num w:numId="7" w16cid:durableId="57048577">
-    <w:abstractNumId w:val="1"/>
-  </w:num>
-  <w:num w:numId="8" w16cid:durableId="815874802">
-    <w:abstractNumId w:val="11"/>
-  </w:num>
-  <w:num w:numId="9" w16cid:durableId="92941787">
+  <w:num w:numId="26" w16cid:durableId="1262639490">
     <w:abstractNumId w:val="0"/>
-  </w:num>
-  <w:num w:numId="10" w16cid:durableId="669068450">
-    <w:abstractNumId w:val="19"/>
-  </w:num>
-  <w:num w:numId="11" w16cid:durableId="667290534">
-    <w:abstractNumId w:val="23"/>
-  </w:num>
-  <w:num w:numId="12" w16cid:durableId="226839535">
-    <w:abstractNumId w:val="3"/>
-  </w:num>
-  <w:num w:numId="13" w16cid:durableId="2059235817">
-    <w:abstractNumId w:val="17"/>
-  </w:num>
-  <w:num w:numId="14" w16cid:durableId="829562467">
-    <w:abstractNumId w:val="12"/>
-  </w:num>
-  <w:num w:numId="15" w16cid:durableId="1148400394">
-    <w:abstractNumId w:val="21"/>
-  </w:num>
-  <w:num w:numId="16" w16cid:durableId="1835878333">
-    <w:abstractNumId w:val="18"/>
-  </w:num>
-  <w:num w:numId="17" w16cid:durableId="1793818157">
-    <w:abstractNumId w:val="20"/>
-  </w:num>
-  <w:num w:numId="18" w16cid:durableId="916941765">
-    <w:abstractNumId w:val="15"/>
-  </w:num>
-  <w:num w:numId="19" w16cid:durableId="1829982507">
-    <w:abstractNumId w:val="9"/>
-  </w:num>
-  <w:num w:numId="20" w16cid:durableId="1882934644">
-    <w:abstractNumId w:val="16"/>
-  </w:num>
-  <w:num w:numId="21" w16cid:durableId="324482125">
-    <w:abstractNumId w:val="6"/>
-  </w:num>
-  <w:num w:numId="22" w16cid:durableId="1477064731">
-    <w:abstractNumId w:val="5"/>
-  </w:num>
-  <w:num w:numId="23" w16cid:durableId="850295434">
-    <w:abstractNumId w:val="7"/>
-  </w:num>
-  <w:num w:numId="24" w16cid:durableId="657005186">
-    <w:abstractNumId w:val="8"/>
   </w:num>
 </w:numbering>
 </file>

</xml_diff>

<commit_message>
classification with pytorch fashionMnist and Mnist
</commit_message>
<xml_diff>
--- a/Plan.docx
+++ b/Plan.docx
@@ -41,35 +41,7 @@
           <w:lang w:val="en-US" w:eastAsia="fr-FR"/>
           <w14:ligatures w14:val="none"/>
         </w:rPr>
-        <w:t xml:space="preserve"> Phase </w:t>
-      </w:r>
-      <w:proofErr w:type="gramStart"/>
-      <w:r>
-        <w:rPr>
-          <w:rFonts w:ascii="Times New Roman" w:eastAsia="Times New Roman" w:hAnsi="Times New Roman" w:cs="Times New Roman"/>
-          <w:b/>
-          <w:bCs/>
-          <w:kern w:val="0"/>
-          <w:sz w:val="36"/>
-          <w:szCs w:val="36"/>
-          <w:lang w:val="en-US" w:eastAsia="fr-FR"/>
-          <w14:ligatures w14:val="none"/>
-        </w:rPr>
-        <w:t>1:</w:t>
-      </w:r>
-      <w:proofErr w:type="gramEnd"/>
-      <w:r>
-        <w:rPr>
-          <w:rFonts w:ascii="Times New Roman" w:eastAsia="Times New Roman" w:hAnsi="Times New Roman" w:cs="Times New Roman"/>
-          <w:b/>
-          <w:bCs/>
-          <w:kern w:val="0"/>
-          <w:sz w:val="36"/>
-          <w:szCs w:val="36"/>
-          <w:lang w:val="en-US" w:eastAsia="fr-FR"/>
-          <w14:ligatures w14:val="none"/>
-        </w:rPr>
-        <w:t xml:space="preserve"> Python &amp; Math Foundations (Days 1–20)</w:t>
+        <w:t xml:space="preserve"> Phase 1: Python &amp; Math Foundations (Days 1–20)</w:t>
       </w:r>
     </w:p>
     <w:p>
@@ -98,35 +70,7 @@
           <w:lang w:eastAsia="fr-FR"/>
           <w14:ligatures w14:val="none"/>
         </w:rPr>
-        <w:t>Days 1–</w:t>
-      </w:r>
-      <w:proofErr w:type="gramStart"/>
-      <w:r>
-        <w:rPr>
-          <w:rFonts w:ascii="Times New Roman" w:eastAsia="Times New Roman" w:hAnsi="Times New Roman" w:cs="Times New Roman"/>
-          <w:b/>
-          <w:bCs/>
-          <w:kern w:val="0"/>
-          <w:sz w:val="27"/>
-          <w:szCs w:val="27"/>
-          <w:lang w:eastAsia="fr-FR"/>
-          <w14:ligatures w14:val="none"/>
-        </w:rPr>
-        <w:t>5:</w:t>
-      </w:r>
-      <w:proofErr w:type="gramEnd"/>
-      <w:r>
-        <w:rPr>
-          <w:rFonts w:ascii="Times New Roman" w:eastAsia="Times New Roman" w:hAnsi="Times New Roman" w:cs="Times New Roman"/>
-          <w:b/>
-          <w:bCs/>
-          <w:kern w:val="0"/>
-          <w:sz w:val="27"/>
-          <w:szCs w:val="27"/>
-          <w:lang w:eastAsia="fr-FR"/>
-          <w14:ligatures w14:val="none"/>
-        </w:rPr>
-        <w:t xml:space="preserve"> Python for Data Science</w:t>
+        <w:t>Days 1–5: Python for Data Science</w:t>
       </w:r>
     </w:p>
     <w:p>
@@ -186,100 +130,8 @@
           <w:lang w:eastAsia="fr-FR"/>
           <w14:ligatures w14:val="none"/>
         </w:rPr>
-        <w:t xml:space="preserve">Day </w:t>
-      </w:r>
-      <w:proofErr w:type="gramStart"/>
-      <w:r>
-        <w:rPr>
-          <w:rFonts w:ascii="Times New Roman" w:eastAsia="Times New Roman" w:hAnsi="Times New Roman" w:cs="Times New Roman"/>
-          <w:kern w:val="0"/>
-          <w:sz w:val="24"/>
-          <w:szCs w:val="24"/>
-          <w:highlight w:val="yellow"/>
-          <w:lang w:eastAsia="fr-FR"/>
-          <w14:ligatures w14:val="none"/>
-        </w:rPr>
-        <w:t>2:</w:t>
-      </w:r>
-      <w:proofErr w:type="gramEnd"/>
-      <w:r>
-        <w:rPr>
-          <w:rFonts w:ascii="Times New Roman" w:eastAsia="Times New Roman" w:hAnsi="Times New Roman" w:cs="Times New Roman"/>
-          <w:kern w:val="0"/>
-          <w:sz w:val="24"/>
-          <w:szCs w:val="24"/>
-          <w:highlight w:val="yellow"/>
-          <w:lang w:eastAsia="fr-FR"/>
-          <w14:ligatures w14:val="none"/>
-        </w:rPr>
-        <w:t xml:space="preserve"> </w:t>
-      </w:r>
-      <w:proofErr w:type="spellStart"/>
-      <w:r>
-        <w:rPr>
-          <w:rFonts w:ascii="Times New Roman" w:eastAsia="Times New Roman" w:hAnsi="Times New Roman" w:cs="Times New Roman"/>
-          <w:kern w:val="0"/>
-          <w:sz w:val="24"/>
-          <w:szCs w:val="24"/>
-          <w:highlight w:val="yellow"/>
-          <w:lang w:eastAsia="fr-FR"/>
-          <w14:ligatures w14:val="none"/>
-        </w:rPr>
-        <w:t>Lists</w:t>
-      </w:r>
-      <w:proofErr w:type="spellEnd"/>
-      <w:r>
-        <w:rPr>
-          <w:rFonts w:ascii="Times New Roman" w:eastAsia="Times New Roman" w:hAnsi="Times New Roman" w:cs="Times New Roman"/>
-          <w:kern w:val="0"/>
-          <w:sz w:val="24"/>
-          <w:szCs w:val="24"/>
-          <w:highlight w:val="yellow"/>
-          <w:lang w:eastAsia="fr-FR"/>
-          <w14:ligatures w14:val="none"/>
-        </w:rPr>
-        <w:t xml:space="preserve">, </w:t>
-      </w:r>
-      <w:proofErr w:type="spellStart"/>
-      <w:r>
-        <w:rPr>
-          <w:rFonts w:ascii="Times New Roman" w:eastAsia="Times New Roman" w:hAnsi="Times New Roman" w:cs="Times New Roman"/>
-          <w:kern w:val="0"/>
-          <w:sz w:val="24"/>
-          <w:szCs w:val="24"/>
-          <w:highlight w:val="yellow"/>
-          <w:lang w:eastAsia="fr-FR"/>
-          <w14:ligatures w14:val="none"/>
-        </w:rPr>
-        <w:t>dictionaries</w:t>
-      </w:r>
-      <w:proofErr w:type="spellEnd"/>
-      <w:r>
-        <w:rPr>
-          <w:rFonts w:ascii="Times New Roman" w:eastAsia="Times New Roman" w:hAnsi="Times New Roman" w:cs="Times New Roman"/>
-          <w:kern w:val="0"/>
-          <w:sz w:val="24"/>
-          <w:szCs w:val="24"/>
-          <w:highlight w:val="yellow"/>
-          <w:lang w:eastAsia="fr-FR"/>
-          <w14:ligatures w14:val="none"/>
-        </w:rPr>
-        <w:t xml:space="preserve">, sets, tuples – practice </w:t>
-      </w:r>
-      <w:proofErr w:type="spellStart"/>
-      <w:r>
-        <w:rPr>
-          <w:rFonts w:ascii="Times New Roman" w:eastAsia="Times New Roman" w:hAnsi="Times New Roman" w:cs="Times New Roman"/>
-          <w:kern w:val="0"/>
-          <w:sz w:val="24"/>
-          <w:szCs w:val="24"/>
-          <w:highlight w:val="yellow"/>
-          <w:lang w:eastAsia="fr-FR"/>
-          <w14:ligatures w14:val="none"/>
-        </w:rPr>
-        <w:t>exercises</w:t>
-      </w:r>
-      <w:proofErr w:type="spellEnd"/>
+        <w:t>Day 2: Lists, dictionaries, sets, tuples – practice exercises</w:t>
+      </w:r>
     </w:p>
     <w:p>
       <w:pPr>
@@ -338,33 +190,7 @@
           <w:lang w:val="en-US" w:eastAsia="fr-FR"/>
           <w14:ligatures w14:val="none"/>
         </w:rPr>
-        <w:t xml:space="preserve">Day 4: File handling, modules, intro to </w:t>
-      </w:r>
-      <w:proofErr w:type="spellStart"/>
-      <w:r>
-        <w:rPr>
-          <w:rFonts w:ascii="Times New Roman" w:eastAsia="Times New Roman" w:hAnsi="Times New Roman" w:cs="Times New Roman"/>
-          <w:kern w:val="0"/>
-          <w:sz w:val="24"/>
-          <w:szCs w:val="24"/>
-          <w:highlight w:val="yellow"/>
-          <w:lang w:val="en-US" w:eastAsia="fr-FR"/>
-          <w14:ligatures w14:val="none"/>
-        </w:rPr>
-        <w:t>Jupyter</w:t>
-      </w:r>
-      <w:proofErr w:type="spellEnd"/>
-      <w:r>
-        <w:rPr>
-          <w:rFonts w:ascii="Times New Roman" w:eastAsia="Times New Roman" w:hAnsi="Times New Roman" w:cs="Times New Roman"/>
-          <w:kern w:val="0"/>
-          <w:sz w:val="24"/>
-          <w:szCs w:val="24"/>
-          <w:highlight w:val="yellow"/>
-          <w:lang w:val="en-US" w:eastAsia="fr-FR"/>
-          <w14:ligatures w14:val="none"/>
-        </w:rPr>
-        <w:t xml:space="preserve"> Notebook</w:t>
+        <w:t>Day 4: File handling, modules, intro to Jupyter Notebook</w:t>
       </w:r>
     </w:p>
     <w:p>
@@ -423,63 +249,7 @@
           <w:lang w:eastAsia="fr-FR"/>
           <w14:ligatures w14:val="none"/>
         </w:rPr>
-        <w:t>Days 6–</w:t>
-      </w:r>
-      <w:proofErr w:type="gramStart"/>
-      <w:r>
-        <w:rPr>
-          <w:rFonts w:ascii="Times New Roman" w:eastAsia="Times New Roman" w:hAnsi="Times New Roman" w:cs="Times New Roman"/>
-          <w:b/>
-          <w:bCs/>
-          <w:kern w:val="0"/>
-          <w:sz w:val="27"/>
-          <w:szCs w:val="27"/>
-          <w:lang w:eastAsia="fr-FR"/>
-          <w14:ligatures w14:val="none"/>
-        </w:rPr>
-        <w:t>10:</w:t>
-      </w:r>
-      <w:proofErr w:type="gramEnd"/>
-      <w:r>
-        <w:rPr>
-          <w:rFonts w:ascii="Times New Roman" w:eastAsia="Times New Roman" w:hAnsi="Times New Roman" w:cs="Times New Roman"/>
-          <w:b/>
-          <w:bCs/>
-          <w:kern w:val="0"/>
-          <w:sz w:val="27"/>
-          <w:szCs w:val="27"/>
-          <w:lang w:eastAsia="fr-FR"/>
-          <w14:ligatures w14:val="none"/>
-        </w:rPr>
-        <w:t xml:space="preserve"> </w:t>
-      </w:r>
-      <w:proofErr w:type="spellStart"/>
-      <w:r>
-        <w:rPr>
-          <w:rFonts w:ascii="Times New Roman" w:eastAsia="Times New Roman" w:hAnsi="Times New Roman" w:cs="Times New Roman"/>
-          <w:b/>
-          <w:bCs/>
-          <w:kern w:val="0"/>
-          <w:sz w:val="27"/>
-          <w:szCs w:val="27"/>
-          <w:lang w:eastAsia="fr-FR"/>
-          <w14:ligatures w14:val="none"/>
-        </w:rPr>
-        <w:t>Numpy</w:t>
-      </w:r>
-      <w:proofErr w:type="spellEnd"/>
-      <w:r>
-        <w:rPr>
-          <w:rFonts w:ascii="Times New Roman" w:eastAsia="Times New Roman" w:hAnsi="Times New Roman" w:cs="Times New Roman"/>
-          <w:b/>
-          <w:bCs/>
-          <w:kern w:val="0"/>
-          <w:sz w:val="27"/>
-          <w:szCs w:val="27"/>
-          <w:lang w:eastAsia="fr-FR"/>
-          <w14:ligatures w14:val="none"/>
-        </w:rPr>
-        <w:t xml:space="preserve"> &amp; Pandas</w:t>
+        <w:t>Days 6–10: Numpy &amp; Pandas</w:t>
       </w:r>
     </w:p>
     <w:p>
@@ -509,111 +279,7 @@
           <w:lang w:eastAsia="fr-FR"/>
           <w14:ligatures w14:val="none"/>
         </w:rPr>
-        <w:t xml:space="preserve">Day </w:t>
-      </w:r>
-      <w:proofErr w:type="gramStart"/>
-      <w:r>
-        <w:rPr>
-          <w:rFonts w:ascii="Times New Roman" w:eastAsia="Times New Roman" w:hAnsi="Times New Roman" w:cs="Times New Roman"/>
-          <w:kern w:val="0"/>
-          <w:sz w:val="24"/>
-          <w:szCs w:val="24"/>
-          <w:highlight w:val="yellow"/>
-          <w:lang w:eastAsia="fr-FR"/>
-          <w14:ligatures w14:val="none"/>
-        </w:rPr>
-        <w:t>6:</w:t>
-      </w:r>
-      <w:proofErr w:type="gramEnd"/>
-      <w:r>
-        <w:rPr>
-          <w:rFonts w:ascii="Times New Roman" w:eastAsia="Times New Roman" w:hAnsi="Times New Roman" w:cs="Times New Roman"/>
-          <w:kern w:val="0"/>
-          <w:sz w:val="24"/>
-          <w:szCs w:val="24"/>
-          <w:highlight w:val="yellow"/>
-          <w:lang w:eastAsia="fr-FR"/>
-          <w14:ligatures w14:val="none"/>
-        </w:rPr>
-        <w:t xml:space="preserve"> </w:t>
-      </w:r>
-      <w:proofErr w:type="spellStart"/>
-      <w:r>
-        <w:rPr>
-          <w:rFonts w:ascii="Times New Roman" w:eastAsia="Times New Roman" w:hAnsi="Times New Roman" w:cs="Times New Roman"/>
-          <w:kern w:val="0"/>
-          <w:sz w:val="24"/>
-          <w:szCs w:val="24"/>
-          <w:highlight w:val="yellow"/>
-          <w:lang w:eastAsia="fr-FR"/>
-          <w14:ligatures w14:val="none"/>
-        </w:rPr>
-        <w:t>NumPy</w:t>
-      </w:r>
-      <w:proofErr w:type="spellEnd"/>
-      <w:r>
-        <w:rPr>
-          <w:rFonts w:ascii="Times New Roman" w:eastAsia="Times New Roman" w:hAnsi="Times New Roman" w:cs="Times New Roman"/>
-          <w:kern w:val="0"/>
-          <w:sz w:val="24"/>
-          <w:szCs w:val="24"/>
-          <w:highlight w:val="yellow"/>
-          <w:lang w:eastAsia="fr-FR"/>
-          <w14:ligatures w14:val="none"/>
-        </w:rPr>
-        <w:t xml:space="preserve"> </w:t>
-      </w:r>
-      <w:proofErr w:type="spellStart"/>
-      <w:r>
-        <w:rPr>
-          <w:rFonts w:ascii="Times New Roman" w:eastAsia="Times New Roman" w:hAnsi="Times New Roman" w:cs="Times New Roman"/>
-          <w:kern w:val="0"/>
-          <w:sz w:val="24"/>
-          <w:szCs w:val="24"/>
-          <w:highlight w:val="yellow"/>
-          <w:lang w:eastAsia="fr-FR"/>
-          <w14:ligatures w14:val="none"/>
-        </w:rPr>
-        <w:t>arrays</w:t>
-      </w:r>
-      <w:proofErr w:type="spellEnd"/>
-      <w:r>
-        <w:rPr>
-          <w:rFonts w:ascii="Times New Roman" w:eastAsia="Times New Roman" w:hAnsi="Times New Roman" w:cs="Times New Roman"/>
-          <w:kern w:val="0"/>
-          <w:sz w:val="24"/>
-          <w:szCs w:val="24"/>
-          <w:highlight w:val="yellow"/>
-          <w:lang w:eastAsia="fr-FR"/>
-          <w14:ligatures w14:val="none"/>
-        </w:rPr>
-        <w:t xml:space="preserve">, </w:t>
-      </w:r>
-      <w:proofErr w:type="spellStart"/>
-      <w:r>
-        <w:rPr>
-          <w:rFonts w:ascii="Times New Roman" w:eastAsia="Times New Roman" w:hAnsi="Times New Roman" w:cs="Times New Roman"/>
-          <w:kern w:val="0"/>
-          <w:sz w:val="24"/>
-          <w:szCs w:val="24"/>
-          <w:highlight w:val="yellow"/>
-          <w:lang w:eastAsia="fr-FR"/>
-          <w14:ligatures w14:val="none"/>
-        </w:rPr>
-        <w:t>operations</w:t>
-      </w:r>
-      <w:proofErr w:type="spellEnd"/>
-      <w:r>
-        <w:rPr>
-          <w:rFonts w:ascii="Times New Roman" w:eastAsia="Times New Roman" w:hAnsi="Times New Roman" w:cs="Times New Roman"/>
-          <w:kern w:val="0"/>
-          <w:sz w:val="24"/>
-          <w:szCs w:val="24"/>
-          <w:highlight w:val="yellow"/>
-          <w:lang w:eastAsia="fr-FR"/>
-          <w14:ligatures w14:val="none"/>
-        </w:rPr>
-        <w:t>, broadcasting</w:t>
+        <w:t>Day 6: NumPy arrays, operations, broadcasting</w:t>
       </w:r>
     </w:p>
     <w:p>
@@ -678,66 +344,8 @@
           <w:lang w:val="en-US" w:eastAsia="fr-FR"/>
           <w14:ligatures w14:val="none"/>
         </w:rPr>
-        <w:t xml:space="preserve">+ </w:t>
-      </w:r>
-      <w:proofErr w:type="spellStart"/>
-      <w:r>
-        <w:rPr>
-          <w:rFonts w:ascii="Times New Roman" w:eastAsia="Times New Roman" w:hAnsi="Times New Roman" w:cs="Times New Roman"/>
-          <w:b/>
-          <w:bCs/>
-          <w:i/>
-          <w:iCs/>
-          <w:color w:val="EE0000"/>
-          <w:kern w:val="0"/>
-          <w:sz w:val="32"/>
-          <w:szCs w:val="32"/>
-          <w:highlight w:val="yellow"/>
-          <w:u w:val="single"/>
-          <w:lang w:val="en-US" w:eastAsia="fr-FR"/>
-          <w14:ligatures w14:val="none"/>
-        </w:rPr>
-        <w:t>Practise</w:t>
-      </w:r>
-      <w:proofErr w:type="spellEnd"/>
-      <w:r>
-        <w:rPr>
-          <w:rFonts w:ascii="Times New Roman" w:eastAsia="Times New Roman" w:hAnsi="Times New Roman" w:cs="Times New Roman"/>
-          <w:b/>
-          <w:bCs/>
-          <w:i/>
-          <w:iCs/>
-          <w:color w:val="EE0000"/>
-          <w:kern w:val="0"/>
-          <w:sz w:val="32"/>
-          <w:szCs w:val="32"/>
-          <w:highlight w:val="yellow"/>
-          <w:u w:val="single"/>
-          <w:lang w:val="en-US" w:eastAsia="fr-FR"/>
-          <w14:ligatures w14:val="none"/>
-        </w:rPr>
-        <w:t xml:space="preserve"> mini project of </w:t>
-      </w:r>
-      <w:proofErr w:type="spellStart"/>
-      <w:r>
-        <w:rPr>
-          <w:rFonts w:ascii="Times New Roman" w:eastAsia="Times New Roman" w:hAnsi="Times New Roman" w:cs="Times New Roman"/>
-          <w:b/>
-          <w:bCs/>
-          <w:i/>
-          <w:iCs/>
-          <w:color w:val="EE0000"/>
-          <w:kern w:val="0"/>
-          <w:sz w:val="32"/>
-          <w:szCs w:val="32"/>
-          <w:highlight w:val="yellow"/>
-          <w:u w:val="single"/>
-          <w:lang w:val="en-US" w:eastAsia="fr-FR"/>
-          <w14:ligatures w14:val="none"/>
-        </w:rPr>
-        <w:t>numpy</w:t>
-      </w:r>
-      <w:proofErr w:type="spellEnd"/>
+        <w:t>+ Practise mini project of numpy</w:t>
+      </w:r>
     </w:p>
     <w:p>
       <w:pPr>
@@ -766,33 +374,7 @@
           <w:lang w:val="en-US" w:eastAsia="fr-FR"/>
           <w14:ligatures w14:val="none"/>
         </w:rPr>
-        <w:t xml:space="preserve">Day 8: Pandas </w:t>
-      </w:r>
-      <w:proofErr w:type="spellStart"/>
-      <w:r>
-        <w:rPr>
-          <w:rFonts w:ascii="Times New Roman" w:eastAsia="Times New Roman" w:hAnsi="Times New Roman" w:cs="Times New Roman"/>
-          <w:kern w:val="0"/>
-          <w:sz w:val="24"/>
-          <w:szCs w:val="24"/>
-          <w:highlight w:val="yellow"/>
-          <w:lang w:val="en-US" w:eastAsia="fr-FR"/>
-          <w14:ligatures w14:val="none"/>
-        </w:rPr>
-        <w:t>DataFrames</w:t>
-      </w:r>
-      <w:proofErr w:type="spellEnd"/>
-      <w:r>
-        <w:rPr>
-          <w:rFonts w:ascii="Times New Roman" w:eastAsia="Times New Roman" w:hAnsi="Times New Roman" w:cs="Times New Roman"/>
-          <w:kern w:val="0"/>
-          <w:sz w:val="24"/>
-          <w:szCs w:val="24"/>
-          <w:highlight w:val="yellow"/>
-          <w:lang w:val="en-US" w:eastAsia="fr-FR"/>
-          <w14:ligatures w14:val="none"/>
-        </w:rPr>
-        <w:t xml:space="preserve"> – loading CSV, inspecting data</w:t>
+        <w:t>Day 8: Pandas DataFrames – loading CSV, inspecting data</w:t>
       </w:r>
     </w:p>
     <w:p>
@@ -989,22 +571,8 @@
           <w:lang w:val="en-US" w:eastAsia="fr-FR"/>
           <w14:ligatures w14:val="none"/>
         </w:rPr>
-        <w:t xml:space="preserve">, </w:t>
-      </w:r>
-      <w:proofErr w:type="spellStart"/>
-      <w:r>
-        <w:rPr>
-          <w:rFonts w:ascii="Times New Roman" w:eastAsia="Times New Roman" w:hAnsi="Times New Roman" w:cs="Times New Roman"/>
-          <w:kern w:val="0"/>
-          <w:sz w:val="24"/>
-          <w:szCs w:val="24"/>
-          <w:highlight w:val="yellow"/>
-          <w:lang w:val="en-US" w:eastAsia="fr-FR"/>
-          <w14:ligatures w14:val="none"/>
-        </w:rPr>
-        <w:t>pca</w:t>
-      </w:r>
-      <w:proofErr w:type="spellEnd"/>
+        <w:t>, pca</w:t>
+      </w:r>
       <w:r>
         <w:rPr>
           <w:rFonts w:ascii="Times New Roman" w:eastAsia="Times New Roman" w:hAnsi="Times New Roman" w:cs="Times New Roman"/>
@@ -1045,48 +613,8 @@
           <w:lang w:eastAsia="fr-FR"/>
           <w14:ligatures w14:val="none"/>
         </w:rPr>
-        <w:t xml:space="preserve">Day </w:t>
-      </w:r>
-      <w:proofErr w:type="gramStart"/>
-      <w:r>
-        <w:rPr>
-          <w:rFonts w:ascii="Times New Roman" w:eastAsia="Times New Roman" w:hAnsi="Times New Roman" w:cs="Times New Roman"/>
-          <w:kern w:val="0"/>
-          <w:sz w:val="24"/>
-          <w:szCs w:val="24"/>
-          <w:highlight w:val="yellow"/>
-          <w:lang w:eastAsia="fr-FR"/>
-          <w14:ligatures w14:val="none"/>
-        </w:rPr>
-        <w:t>13:</w:t>
-      </w:r>
-      <w:proofErr w:type="gramEnd"/>
-      <w:r>
-        <w:rPr>
-          <w:rFonts w:ascii="Times New Roman" w:eastAsia="Times New Roman" w:hAnsi="Times New Roman" w:cs="Times New Roman"/>
-          <w:kern w:val="0"/>
-          <w:sz w:val="24"/>
-          <w:szCs w:val="24"/>
-          <w:highlight w:val="yellow"/>
-          <w:lang w:eastAsia="fr-FR"/>
-          <w14:ligatures w14:val="none"/>
-        </w:rPr>
-        <w:t xml:space="preserve"> Matrices and </w:t>
-      </w:r>
-      <w:proofErr w:type="spellStart"/>
-      <w:r>
-        <w:rPr>
-          <w:rFonts w:ascii="Times New Roman" w:eastAsia="Times New Roman" w:hAnsi="Times New Roman" w:cs="Times New Roman"/>
-          <w:kern w:val="0"/>
-          <w:sz w:val="24"/>
-          <w:szCs w:val="24"/>
-          <w:highlight w:val="yellow"/>
-          <w:lang w:eastAsia="fr-FR"/>
-          <w14:ligatures w14:val="none"/>
-        </w:rPr>
-        <w:t>operations</w:t>
-      </w:r>
-      <w:proofErr w:type="spellEnd"/>
+        <w:t>Day 13: Matrices and operations</w:t>
+      </w:r>
     </w:p>
     <w:p>
       <w:pPr>
@@ -1144,87 +672,8 @@
           <w:lang w:eastAsia="fr-FR"/>
           <w14:ligatures w14:val="none"/>
         </w:rPr>
-        <w:t xml:space="preserve">Day </w:t>
-      </w:r>
-      <w:proofErr w:type="gramStart"/>
-      <w:r>
-        <w:rPr>
-          <w:rFonts w:ascii="Times New Roman" w:eastAsia="Times New Roman" w:hAnsi="Times New Roman" w:cs="Times New Roman"/>
-          <w:kern w:val="0"/>
-          <w:sz w:val="24"/>
-          <w:szCs w:val="24"/>
-          <w:highlight w:val="yellow"/>
-          <w:lang w:eastAsia="fr-FR"/>
-          <w14:ligatures w14:val="none"/>
-        </w:rPr>
-        <w:t>15:</w:t>
-      </w:r>
-      <w:proofErr w:type="gramEnd"/>
-      <w:r>
-        <w:rPr>
-          <w:rFonts w:ascii="Times New Roman" w:eastAsia="Times New Roman" w:hAnsi="Times New Roman" w:cs="Times New Roman"/>
-          <w:kern w:val="0"/>
-          <w:sz w:val="24"/>
-          <w:szCs w:val="24"/>
-          <w:highlight w:val="yellow"/>
-          <w:lang w:eastAsia="fr-FR"/>
-          <w14:ligatures w14:val="none"/>
-        </w:rPr>
-        <w:t xml:space="preserve"> </w:t>
-      </w:r>
-      <w:proofErr w:type="spellStart"/>
-      <w:r>
-        <w:rPr>
-          <w:rFonts w:ascii="Times New Roman" w:eastAsia="Times New Roman" w:hAnsi="Times New Roman" w:cs="Times New Roman"/>
-          <w:kern w:val="0"/>
-          <w:sz w:val="24"/>
-          <w:szCs w:val="24"/>
-          <w:highlight w:val="yellow"/>
-          <w:lang w:eastAsia="fr-FR"/>
-          <w14:ligatures w14:val="none"/>
-        </w:rPr>
-        <w:t>Plotting</w:t>
-      </w:r>
-      <w:proofErr w:type="spellEnd"/>
-      <w:r>
-        <w:rPr>
-          <w:rFonts w:ascii="Times New Roman" w:eastAsia="Times New Roman" w:hAnsi="Times New Roman" w:cs="Times New Roman"/>
-          <w:kern w:val="0"/>
-          <w:sz w:val="24"/>
-          <w:szCs w:val="24"/>
-          <w:highlight w:val="yellow"/>
-          <w:lang w:eastAsia="fr-FR"/>
-          <w14:ligatures w14:val="none"/>
-        </w:rPr>
-        <w:t xml:space="preserve"> </w:t>
-      </w:r>
-      <w:proofErr w:type="spellStart"/>
-      <w:r>
-        <w:rPr>
-          <w:rFonts w:ascii="Times New Roman" w:eastAsia="Times New Roman" w:hAnsi="Times New Roman" w:cs="Times New Roman"/>
-          <w:kern w:val="0"/>
-          <w:sz w:val="24"/>
-          <w:szCs w:val="24"/>
-          <w:highlight w:val="yellow"/>
-          <w:lang w:eastAsia="fr-FR"/>
-          <w14:ligatures w14:val="none"/>
-        </w:rPr>
-        <w:t>with</w:t>
-      </w:r>
-      <w:proofErr w:type="spellEnd"/>
-      <w:r>
-        <w:rPr>
-          <w:rFonts w:ascii="Times New Roman" w:eastAsia="Times New Roman" w:hAnsi="Times New Roman" w:cs="Times New Roman"/>
-          <w:kern w:val="0"/>
-          <w:sz w:val="24"/>
-          <w:szCs w:val="24"/>
-          <w:highlight w:val="yellow"/>
-          <w:lang w:eastAsia="fr-FR"/>
-          <w14:ligatures w14:val="none"/>
-        </w:rPr>
-        <w:t xml:space="preserve"> </w:t>
-      </w:r>
-      <w:proofErr w:type="spellStart"/>
+        <w:t xml:space="preserve">Day 15: Plotting with </w:t>
+      </w:r>
       <w:r>
         <w:rPr>
           <w:rFonts w:ascii="Courier New" w:eastAsia="Times New Roman" w:hAnsi="Courier New" w:cs="Courier New"/>
@@ -1237,7 +686,6 @@
         </w:rPr>
         <w:t>matplotlib</w:t>
       </w:r>
-      <w:proofErr w:type="spellEnd"/>
       <w:r>
         <w:rPr>
           <w:rFonts w:ascii="Times New Roman" w:eastAsia="Times New Roman" w:hAnsi="Times New Roman" w:cs="Times New Roman"/>
@@ -1250,7 +698,6 @@
         </w:rPr>
         <w:t xml:space="preserve"> &amp; </w:t>
       </w:r>
-      <w:proofErr w:type="spellStart"/>
       <w:r>
         <w:rPr>
           <w:rFonts w:ascii="Courier New" w:eastAsia="Times New Roman" w:hAnsi="Courier New" w:cs="Courier New"/>
@@ -1263,7 +710,6 @@
         </w:rPr>
         <w:t>seaborn</w:t>
       </w:r>
-      <w:proofErr w:type="spellEnd"/>
     </w:p>
     <w:p>
       <w:pPr>
@@ -1291,63 +737,7 @@
           <w:lang w:eastAsia="fr-FR"/>
           <w14:ligatures w14:val="none"/>
         </w:rPr>
-        <w:t>Days 16–</w:t>
-      </w:r>
-      <w:proofErr w:type="gramStart"/>
-      <w:r>
-        <w:rPr>
-          <w:rFonts w:ascii="Times New Roman" w:eastAsia="Times New Roman" w:hAnsi="Times New Roman" w:cs="Times New Roman"/>
-          <w:b/>
-          <w:bCs/>
-          <w:kern w:val="0"/>
-          <w:sz w:val="27"/>
-          <w:szCs w:val="27"/>
-          <w:lang w:eastAsia="fr-FR"/>
-          <w14:ligatures w14:val="none"/>
-        </w:rPr>
-        <w:t>20:</w:t>
-      </w:r>
-      <w:proofErr w:type="gramEnd"/>
-      <w:r>
-        <w:rPr>
-          <w:rFonts w:ascii="Times New Roman" w:eastAsia="Times New Roman" w:hAnsi="Times New Roman" w:cs="Times New Roman"/>
-          <w:b/>
-          <w:bCs/>
-          <w:kern w:val="0"/>
-          <w:sz w:val="27"/>
-          <w:szCs w:val="27"/>
-          <w:lang w:eastAsia="fr-FR"/>
-          <w14:ligatures w14:val="none"/>
-        </w:rPr>
-        <w:t xml:space="preserve"> Data </w:t>
-      </w:r>
-      <w:proofErr w:type="spellStart"/>
-      <w:r>
-        <w:rPr>
-          <w:rFonts w:ascii="Times New Roman" w:eastAsia="Times New Roman" w:hAnsi="Times New Roman" w:cs="Times New Roman"/>
-          <w:b/>
-          <w:bCs/>
-          <w:kern w:val="0"/>
-          <w:sz w:val="27"/>
-          <w:szCs w:val="27"/>
-          <w:lang w:eastAsia="fr-FR"/>
-          <w14:ligatures w14:val="none"/>
-        </w:rPr>
-        <w:t>Cleaning</w:t>
-      </w:r>
-      <w:proofErr w:type="spellEnd"/>
-      <w:r>
-        <w:rPr>
-          <w:rFonts w:ascii="Times New Roman" w:eastAsia="Times New Roman" w:hAnsi="Times New Roman" w:cs="Times New Roman"/>
-          <w:b/>
-          <w:bCs/>
-          <w:kern w:val="0"/>
-          <w:sz w:val="27"/>
-          <w:szCs w:val="27"/>
-          <w:lang w:eastAsia="fr-FR"/>
-          <w14:ligatures w14:val="none"/>
-        </w:rPr>
-        <w:t xml:space="preserve"> &amp; EDA</w:t>
+        <w:t>Days 16–20: Data Cleaning &amp; EDA</w:t>
       </w:r>
     </w:p>
     <w:p>
@@ -1466,20 +856,7 @@
           <w:lang w:val="en-US" w:eastAsia="fr-FR"/>
           <w14:ligatures w14:val="none"/>
         </w:rPr>
-        <w:t xml:space="preserve">Day 19: </w:t>
-      </w:r>
-      <w:proofErr w:type="gramStart"/>
-      <w:r>
-        <w:rPr>
-          <w:rFonts w:ascii="Times New Roman" w:eastAsia="Times New Roman" w:hAnsi="Times New Roman" w:cs="Times New Roman"/>
-          <w:kern w:val="0"/>
-          <w:sz w:val="24"/>
-          <w:szCs w:val="24"/>
-          <w:highlight w:val="yellow"/>
-          <w:lang w:val="en-US" w:eastAsia="fr-FR"/>
-          <w14:ligatures w14:val="none"/>
-        </w:rPr>
-        <w:t>Correlation</w:t>
+        <w:t>Day 19: Correlation</w:t>
       </w:r>
       <w:r>
         <w:rPr>
@@ -1493,7 +870,6 @@
         </w:rPr>
         <w:t>(</w:t>
       </w:r>
-      <w:proofErr w:type="gramEnd"/>
       <w:r>
         <w:rPr>
           <w:rFonts w:ascii="Times New Roman" w:eastAsia="Times New Roman" w:hAnsi="Times New Roman" w:cs="Times New Roman"/>
@@ -1577,7 +953,6 @@
         </w:rPr>
         <w:t xml:space="preserve"> </w:t>
       </w:r>
-      <w:proofErr w:type="spellStart"/>
       <w:r>
         <w:rPr>
           <w:rFonts w:ascii="Times New Roman" w:eastAsia="Times New Roman" w:hAnsi="Times New Roman" w:cs="Times New Roman"/>
@@ -1590,7 +965,6 @@
         </w:rPr>
         <w:t>groupby</w:t>
       </w:r>
-      <w:proofErr w:type="spellEnd"/>
     </w:p>
     <w:p>
       <w:pPr>
@@ -1619,9 +993,8 @@
           <w:lang w:val="en-US" w:eastAsia="fr-FR"/>
           <w14:ligatures w14:val="none"/>
         </w:rPr>
-        <w:t xml:space="preserve">Day 20: Mini project: Full EDA on Titanic </w:t>
-      </w:r>
-      <w:proofErr w:type="gramStart"/>
+        <w:t>Day 20: Mini project: Full EDA on Titanic dataset</w:t>
+      </w:r>
       <w:r>
         <w:rPr>
           <w:rFonts w:ascii="Times New Roman" w:eastAsia="Times New Roman" w:hAnsi="Times New Roman" w:cs="Times New Roman"/>
@@ -1632,32 +1005,7 @@
           <w:lang w:val="en-US" w:eastAsia="fr-FR"/>
           <w14:ligatures w14:val="none"/>
         </w:rPr>
-        <w:t>dataset</w:t>
-      </w:r>
-      <w:r>
-        <w:rPr>
-          <w:rFonts w:ascii="Times New Roman" w:eastAsia="Times New Roman" w:hAnsi="Times New Roman" w:cs="Times New Roman"/>
-          <w:kern w:val="0"/>
-          <w:sz w:val="24"/>
-          <w:szCs w:val="24"/>
-          <w:highlight w:val="cyan"/>
-          <w:lang w:val="en-US" w:eastAsia="fr-FR"/>
-          <w14:ligatures w14:val="none"/>
-        </w:rPr>
-        <w:t>(</w:t>
-      </w:r>
-      <w:proofErr w:type="gramEnd"/>
-      <w:r>
-        <w:rPr>
-          <w:rFonts w:ascii="Times New Roman" w:eastAsia="Times New Roman" w:hAnsi="Times New Roman" w:cs="Times New Roman"/>
-          <w:kern w:val="0"/>
-          <w:sz w:val="24"/>
-          <w:szCs w:val="24"/>
-          <w:highlight w:val="cyan"/>
-          <w:lang w:val="en-US" w:eastAsia="fr-FR"/>
-          <w14:ligatures w14:val="none"/>
-        </w:rPr>
-        <w:t>done day 18)</w:t>
+        <w:t>(done day 18)</w:t>
       </w:r>
     </w:p>
     <w:p>
@@ -1725,35 +1073,7 @@
           <w:lang w:val="en-US" w:eastAsia="fr-FR"/>
           <w14:ligatures w14:val="none"/>
         </w:rPr>
-        <w:t xml:space="preserve"> Phase </w:t>
-      </w:r>
-      <w:proofErr w:type="gramStart"/>
-      <w:r>
-        <w:rPr>
-          <w:rFonts w:ascii="Times New Roman" w:eastAsia="Times New Roman" w:hAnsi="Times New Roman" w:cs="Times New Roman"/>
-          <w:b/>
-          <w:bCs/>
-          <w:kern w:val="0"/>
-          <w:sz w:val="36"/>
-          <w:szCs w:val="36"/>
-          <w:lang w:val="en-US" w:eastAsia="fr-FR"/>
-          <w14:ligatures w14:val="none"/>
-        </w:rPr>
-        <w:t>2:</w:t>
-      </w:r>
-      <w:proofErr w:type="gramEnd"/>
-      <w:r>
-        <w:rPr>
-          <w:rFonts w:ascii="Times New Roman" w:eastAsia="Times New Roman" w:hAnsi="Times New Roman" w:cs="Times New Roman"/>
-          <w:b/>
-          <w:bCs/>
-          <w:kern w:val="0"/>
-          <w:sz w:val="36"/>
-          <w:szCs w:val="36"/>
-          <w:lang w:val="en-US" w:eastAsia="fr-FR"/>
-          <w14:ligatures w14:val="none"/>
-        </w:rPr>
-        <w:t xml:space="preserve"> Machine Learning Basics (Days 21–50)</w:t>
+        <w:t xml:space="preserve"> Phase 2: Machine Learning Basics (Days 21–50)</w:t>
       </w:r>
     </w:p>
     <w:p>
@@ -3267,9 +2587,8 @@
           <w:lang w:eastAsia="fr-FR"/>
           <w14:ligatures w14:val="none"/>
         </w:rPr>
-        <w:t>Days 31–</w:t>
-      </w:r>
-      <w:proofErr w:type="gramStart"/>
+        <w:t>Days 31–35: Classification – Logistic Regressio</w:t>
+      </w:r>
       <w:r>
         <w:rPr>
           <w:rFonts w:ascii="Times New Roman" w:eastAsia="Times New Roman" w:hAnsi="Times New Roman" w:cs="Times New Roman"/>
@@ -3281,9 +2600,8 @@
           <w:lang w:eastAsia="fr-FR"/>
           <w14:ligatures w14:val="none"/>
         </w:rPr>
-        <w:t>35:</w:t>
-      </w:r>
-      <w:proofErr w:type="gramEnd"/>
+        <w:t xml:space="preserve">n : </w:t>
+      </w:r>
       <w:r>
         <w:rPr>
           <w:rFonts w:ascii="Times New Roman" w:eastAsia="Times New Roman" w:hAnsi="Times New Roman" w:cs="Times New Roman"/>
@@ -3295,9 +2613,8 @@
           <w:lang w:eastAsia="fr-FR"/>
           <w14:ligatures w14:val="none"/>
         </w:rPr>
-        <w:t xml:space="preserve"> Classification – </w:t>
-      </w:r>
-      <w:proofErr w:type="spellStart"/>
+        <w:t>Binaire, multicla</w:t>
+      </w:r>
       <w:r>
         <w:rPr>
           <w:rFonts w:ascii="Times New Roman" w:eastAsia="Times New Roman" w:hAnsi="Times New Roman" w:cs="Times New Roman"/>
@@ -3309,132 +2626,8 @@
           <w:lang w:eastAsia="fr-FR"/>
           <w14:ligatures w14:val="none"/>
         </w:rPr>
-        <w:t>Logistic</w:t>
-      </w:r>
-      <w:proofErr w:type="spellEnd"/>
-      <w:r>
-        <w:rPr>
-          <w:rFonts w:ascii="Times New Roman" w:eastAsia="Times New Roman" w:hAnsi="Times New Roman" w:cs="Times New Roman"/>
-          <w:b/>
-          <w:bCs/>
-          <w:kern w:val="0"/>
-          <w:sz w:val="27"/>
-          <w:szCs w:val="27"/>
-          <w:lang w:eastAsia="fr-FR"/>
-          <w14:ligatures w14:val="none"/>
-        </w:rPr>
-        <w:t xml:space="preserve"> </w:t>
-      </w:r>
-      <w:proofErr w:type="spellStart"/>
-      <w:r>
-        <w:rPr>
-          <w:rFonts w:ascii="Times New Roman" w:eastAsia="Times New Roman" w:hAnsi="Times New Roman" w:cs="Times New Roman"/>
-          <w:b/>
-          <w:bCs/>
-          <w:kern w:val="0"/>
-          <w:sz w:val="27"/>
-          <w:szCs w:val="27"/>
-          <w:lang w:eastAsia="fr-FR"/>
-          <w14:ligatures w14:val="none"/>
-        </w:rPr>
-        <w:t>Regressio</w:t>
-      </w:r>
-      <w:r>
-        <w:rPr>
-          <w:rFonts w:ascii="Times New Roman" w:eastAsia="Times New Roman" w:hAnsi="Times New Roman" w:cs="Times New Roman"/>
-          <w:b/>
-          <w:bCs/>
-          <w:kern w:val="0"/>
-          <w:sz w:val="27"/>
-          <w:szCs w:val="27"/>
-          <w:lang w:eastAsia="fr-FR"/>
-          <w14:ligatures w14:val="none"/>
-        </w:rPr>
-        <w:t>n</w:t>
-      </w:r>
-      <w:proofErr w:type="spellEnd"/>
-      <w:r>
-        <w:rPr>
-          <w:rFonts w:ascii="Times New Roman" w:eastAsia="Times New Roman" w:hAnsi="Times New Roman" w:cs="Times New Roman"/>
-          <w:b/>
-          <w:bCs/>
-          <w:kern w:val="0"/>
-          <w:sz w:val="27"/>
-          <w:szCs w:val="27"/>
-          <w:lang w:eastAsia="fr-FR"/>
-          <w14:ligatures w14:val="none"/>
-        </w:rPr>
-        <w:t xml:space="preserve"> : </w:t>
-      </w:r>
-      <w:r>
-        <w:rPr>
-          <w:rFonts w:ascii="Times New Roman" w:eastAsia="Times New Roman" w:hAnsi="Times New Roman" w:cs="Times New Roman"/>
-          <w:b/>
-          <w:bCs/>
-          <w:kern w:val="0"/>
-          <w:sz w:val="27"/>
-          <w:szCs w:val="27"/>
-          <w:lang w:eastAsia="fr-FR"/>
-          <w14:ligatures w14:val="none"/>
-        </w:rPr>
-        <w:t xml:space="preserve">Binaire, </w:t>
-      </w:r>
-      <w:proofErr w:type="spellStart"/>
-      <w:r>
-        <w:rPr>
-          <w:rFonts w:ascii="Times New Roman" w:eastAsia="Times New Roman" w:hAnsi="Times New Roman" w:cs="Times New Roman"/>
-          <w:b/>
-          <w:bCs/>
-          <w:kern w:val="0"/>
-          <w:sz w:val="27"/>
-          <w:szCs w:val="27"/>
-          <w:lang w:eastAsia="fr-FR"/>
-          <w14:ligatures w14:val="none"/>
-        </w:rPr>
-        <w:t>multicla</w:t>
-      </w:r>
-      <w:r>
-        <w:rPr>
-          <w:rFonts w:ascii="Times New Roman" w:eastAsia="Times New Roman" w:hAnsi="Times New Roman" w:cs="Times New Roman"/>
-          <w:b/>
-          <w:bCs/>
-          <w:kern w:val="0"/>
-          <w:sz w:val="27"/>
-          <w:szCs w:val="27"/>
-          <w:lang w:eastAsia="fr-FR"/>
-          <w14:ligatures w14:val="none"/>
-        </w:rPr>
-        <w:t>sse</w:t>
-      </w:r>
-      <w:proofErr w:type="spellEnd"/>
-      <w:r>
-        <w:rPr>
-          <w:rFonts w:ascii="Times New Roman" w:eastAsia="Times New Roman" w:hAnsi="Times New Roman" w:cs="Times New Roman"/>
-          <w:b/>
-          <w:bCs/>
-          <w:kern w:val="0"/>
-          <w:sz w:val="27"/>
-          <w:szCs w:val="27"/>
-          <w:lang w:eastAsia="fr-FR"/>
-          <w14:ligatures w14:val="none"/>
-        </w:rPr>
-        <w:t xml:space="preserve">, </w:t>
-      </w:r>
-      <w:proofErr w:type="spellStart"/>
-      <w:r>
-        <w:rPr>
-          <w:rFonts w:ascii="Times New Roman" w:eastAsia="Times New Roman" w:hAnsi="Times New Roman" w:cs="Times New Roman"/>
-          <w:b/>
-          <w:bCs/>
-          <w:kern w:val="0"/>
-          <w:sz w:val="27"/>
-          <w:szCs w:val="27"/>
-          <w:lang w:eastAsia="fr-FR"/>
-          <w14:ligatures w14:val="none"/>
-        </w:rPr>
-        <w:t>ordianle</w:t>
-      </w:r>
-      <w:proofErr w:type="spellEnd"/>
+        <w:t>sse, ordianle</w:t>
+      </w:r>
     </w:p>
     <w:p>
       <w:pPr>
@@ -3553,74 +2746,8 @@
           <w:lang w:eastAsia="fr-FR"/>
           <w14:ligatures w14:val="none"/>
         </w:rPr>
-        <w:t xml:space="preserve">Day </w:t>
-      </w:r>
-      <w:proofErr w:type="gramStart"/>
-      <w:r>
-        <w:rPr>
-          <w:rFonts w:ascii="Times New Roman" w:eastAsia="Times New Roman" w:hAnsi="Times New Roman" w:cs="Times New Roman"/>
-          <w:kern w:val="0"/>
-          <w:sz w:val="24"/>
-          <w:szCs w:val="24"/>
-          <w:highlight w:val="yellow"/>
-          <w:lang w:eastAsia="fr-FR"/>
-          <w14:ligatures w14:val="none"/>
-        </w:rPr>
-        <w:t>34:</w:t>
-      </w:r>
-      <w:proofErr w:type="gramEnd"/>
-      <w:r>
-        <w:rPr>
-          <w:rFonts w:ascii="Times New Roman" w:eastAsia="Times New Roman" w:hAnsi="Times New Roman" w:cs="Times New Roman"/>
-          <w:kern w:val="0"/>
-          <w:sz w:val="24"/>
-          <w:szCs w:val="24"/>
-          <w:highlight w:val="yellow"/>
-          <w:lang w:eastAsia="fr-FR"/>
-          <w14:ligatures w14:val="none"/>
-        </w:rPr>
-        <w:t xml:space="preserve"> </w:t>
-      </w:r>
-      <w:proofErr w:type="gramStart"/>
-      <w:r>
-        <w:rPr>
-          <w:rFonts w:ascii="Times New Roman" w:eastAsia="Times New Roman" w:hAnsi="Times New Roman" w:cs="Times New Roman"/>
-          <w:kern w:val="0"/>
-          <w:sz w:val="24"/>
-          <w:szCs w:val="24"/>
-          <w:highlight w:val="yellow"/>
-          <w:lang w:eastAsia="fr-FR"/>
-          <w14:ligatures w14:val="none"/>
-        </w:rPr>
-        <w:t>Evaluation:</w:t>
-      </w:r>
-      <w:proofErr w:type="gramEnd"/>
-      <w:r>
-        <w:rPr>
-          <w:rFonts w:ascii="Times New Roman" w:eastAsia="Times New Roman" w:hAnsi="Times New Roman" w:cs="Times New Roman"/>
-          <w:kern w:val="0"/>
-          <w:sz w:val="24"/>
-          <w:szCs w:val="24"/>
-          <w:highlight w:val="yellow"/>
-          <w:lang w:eastAsia="fr-FR"/>
-          <w14:ligatures w14:val="none"/>
-        </w:rPr>
-        <w:t xml:space="preserve"> confusion matrix, ROC </w:t>
-      </w:r>
-      <w:proofErr w:type="spellStart"/>
-      <w:r>
-        <w:rPr>
-          <w:rFonts w:ascii="Times New Roman" w:eastAsia="Times New Roman" w:hAnsi="Times New Roman" w:cs="Times New Roman"/>
-          <w:kern w:val="0"/>
-          <w:sz w:val="24"/>
-          <w:szCs w:val="24"/>
-          <w:highlight w:val="yellow"/>
-          <w:lang w:eastAsia="fr-FR"/>
-          <w14:ligatures w14:val="none"/>
-        </w:rPr>
-        <w:t>curve</w:t>
-      </w:r>
-      <w:proofErr w:type="spellEnd"/>
+        <w:t>Day 34: Evaluation: confusion matrix, ROC curve</w:t>
+      </w:r>
     </w:p>
     <w:p>
       <w:pPr>
@@ -3848,74 +2975,8 @@
           <w:lang w:eastAsia="fr-FR"/>
           <w14:ligatures w14:val="none"/>
         </w:rPr>
-        <w:t xml:space="preserve">Day </w:t>
-      </w:r>
-      <w:proofErr w:type="gramStart"/>
-      <w:r>
-        <w:rPr>
-          <w:rFonts w:ascii="Times New Roman" w:eastAsia="Times New Roman" w:hAnsi="Times New Roman" w:cs="Times New Roman"/>
-          <w:kern w:val="0"/>
-          <w:sz w:val="24"/>
-          <w:szCs w:val="24"/>
-          <w:highlight w:val="yellow"/>
-          <w:lang w:eastAsia="fr-FR"/>
-          <w14:ligatures w14:val="none"/>
-        </w:rPr>
-        <w:t>38:</w:t>
-      </w:r>
-      <w:proofErr w:type="gramEnd"/>
-      <w:r>
-        <w:rPr>
-          <w:rFonts w:ascii="Times New Roman" w:eastAsia="Times New Roman" w:hAnsi="Times New Roman" w:cs="Times New Roman"/>
-          <w:kern w:val="0"/>
-          <w:sz w:val="24"/>
-          <w:szCs w:val="24"/>
-          <w:highlight w:val="yellow"/>
-          <w:lang w:eastAsia="fr-FR"/>
-          <w14:ligatures w14:val="none"/>
-        </w:rPr>
-        <w:t xml:space="preserve"> </w:t>
-      </w:r>
-      <w:proofErr w:type="spellStart"/>
-      <w:r>
-        <w:rPr>
-          <w:rFonts w:ascii="Times New Roman" w:eastAsia="Times New Roman" w:hAnsi="Times New Roman" w:cs="Times New Roman"/>
-          <w:kern w:val="0"/>
-          <w:sz w:val="24"/>
-          <w:szCs w:val="24"/>
-          <w:highlight w:val="yellow"/>
-          <w:lang w:eastAsia="fr-FR"/>
-          <w14:ligatures w14:val="none"/>
-        </w:rPr>
-        <w:t>Overfitting</w:t>
-      </w:r>
-      <w:proofErr w:type="spellEnd"/>
-      <w:r>
-        <w:rPr>
-          <w:rFonts w:ascii="Times New Roman" w:eastAsia="Times New Roman" w:hAnsi="Times New Roman" w:cs="Times New Roman"/>
-          <w:kern w:val="0"/>
-          <w:sz w:val="24"/>
-          <w:szCs w:val="24"/>
-          <w:highlight w:val="yellow"/>
-          <w:lang w:eastAsia="fr-FR"/>
-          <w14:ligatures w14:val="none"/>
-        </w:rPr>
-        <w:t xml:space="preserve"> and </w:t>
-      </w:r>
-      <w:proofErr w:type="spellStart"/>
-      <w:r>
-        <w:rPr>
-          <w:rFonts w:ascii="Times New Roman" w:eastAsia="Times New Roman" w:hAnsi="Times New Roman" w:cs="Times New Roman"/>
-          <w:kern w:val="0"/>
-          <w:sz w:val="24"/>
-          <w:szCs w:val="24"/>
-          <w:highlight w:val="yellow"/>
-          <w:lang w:eastAsia="fr-FR"/>
-          <w14:ligatures w14:val="none"/>
-        </w:rPr>
-        <w:t>pruning</w:t>
-      </w:r>
-      <w:proofErr w:type="spellEnd"/>
+        <w:t>Day 38: Overfitting and pruning</w:t>
+      </w:r>
     </w:p>
     <w:p>
       <w:pPr>
@@ -3944,100 +3005,8 @@
           <w:lang w:eastAsia="fr-FR"/>
           <w14:ligatures w14:val="none"/>
         </w:rPr>
-        <w:t xml:space="preserve">Day </w:t>
-      </w:r>
-      <w:proofErr w:type="gramStart"/>
-      <w:r>
-        <w:rPr>
-          <w:rFonts w:ascii="Times New Roman" w:eastAsia="Times New Roman" w:hAnsi="Times New Roman" w:cs="Times New Roman"/>
-          <w:kern w:val="0"/>
-          <w:sz w:val="24"/>
-          <w:szCs w:val="24"/>
-          <w:highlight w:val="yellow"/>
-          <w:lang w:eastAsia="fr-FR"/>
-          <w14:ligatures w14:val="none"/>
-        </w:rPr>
-        <w:t>39:</w:t>
-      </w:r>
-      <w:proofErr w:type="gramEnd"/>
-      <w:r>
-        <w:rPr>
-          <w:rFonts w:ascii="Times New Roman" w:eastAsia="Times New Roman" w:hAnsi="Times New Roman" w:cs="Times New Roman"/>
-          <w:kern w:val="0"/>
-          <w:sz w:val="24"/>
-          <w:szCs w:val="24"/>
-          <w:highlight w:val="yellow"/>
-          <w:lang w:eastAsia="fr-FR"/>
-          <w14:ligatures w14:val="none"/>
-        </w:rPr>
-        <w:t xml:space="preserve"> </w:t>
-      </w:r>
-      <w:proofErr w:type="spellStart"/>
-      <w:r>
-        <w:rPr>
-          <w:rFonts w:ascii="Times New Roman" w:eastAsia="Times New Roman" w:hAnsi="Times New Roman" w:cs="Times New Roman"/>
-          <w:kern w:val="0"/>
-          <w:sz w:val="24"/>
-          <w:szCs w:val="24"/>
-          <w:highlight w:val="yellow"/>
-          <w:lang w:eastAsia="fr-FR"/>
-          <w14:ligatures w14:val="none"/>
-        </w:rPr>
-        <w:t>Visualizing</w:t>
-      </w:r>
-      <w:proofErr w:type="spellEnd"/>
-      <w:r>
-        <w:rPr>
-          <w:rFonts w:ascii="Times New Roman" w:eastAsia="Times New Roman" w:hAnsi="Times New Roman" w:cs="Times New Roman"/>
-          <w:kern w:val="0"/>
-          <w:sz w:val="24"/>
-          <w:szCs w:val="24"/>
-          <w:highlight w:val="yellow"/>
-          <w:lang w:eastAsia="fr-FR"/>
-          <w14:ligatures w14:val="none"/>
-        </w:rPr>
-        <w:t xml:space="preserve"> </w:t>
-      </w:r>
-      <w:proofErr w:type="spellStart"/>
-      <w:r>
-        <w:rPr>
-          <w:rFonts w:ascii="Times New Roman" w:eastAsia="Times New Roman" w:hAnsi="Times New Roman" w:cs="Times New Roman"/>
-          <w:kern w:val="0"/>
-          <w:sz w:val="24"/>
-          <w:szCs w:val="24"/>
-          <w:highlight w:val="yellow"/>
-          <w:lang w:eastAsia="fr-FR"/>
-          <w14:ligatures w14:val="none"/>
-        </w:rPr>
-        <w:t>decision</w:t>
-      </w:r>
-      <w:proofErr w:type="spellEnd"/>
-      <w:r>
-        <w:rPr>
-          <w:rFonts w:ascii="Times New Roman" w:eastAsia="Times New Roman" w:hAnsi="Times New Roman" w:cs="Times New Roman"/>
-          <w:kern w:val="0"/>
-          <w:sz w:val="24"/>
-          <w:szCs w:val="24"/>
-          <w:highlight w:val="yellow"/>
-          <w:lang w:eastAsia="fr-FR"/>
-          <w14:ligatures w14:val="none"/>
-        </w:rPr>
-        <w:t xml:space="preserve"> </w:t>
-      </w:r>
-      <w:proofErr w:type="spellStart"/>
-      <w:r>
-        <w:rPr>
-          <w:rFonts w:ascii="Times New Roman" w:eastAsia="Times New Roman" w:hAnsi="Times New Roman" w:cs="Times New Roman"/>
-          <w:kern w:val="0"/>
-          <w:sz w:val="24"/>
-          <w:szCs w:val="24"/>
-          <w:highlight w:val="yellow"/>
-          <w:lang w:eastAsia="fr-FR"/>
-          <w14:ligatures w14:val="none"/>
-        </w:rPr>
-        <w:t>trees</w:t>
-      </w:r>
-      <w:proofErr w:type="spellEnd"/>
+        <w:t>Day 39: Visualizing decision trees</w:t>
+      </w:r>
     </w:p>
     <w:p>
       <w:pPr>
@@ -4107,35 +3076,7 @@
           <w:lang w:eastAsia="fr-FR"/>
           <w14:ligatures w14:val="none"/>
         </w:rPr>
-        <w:t>Days 41–</w:t>
-      </w:r>
-      <w:proofErr w:type="gramStart"/>
-      <w:r>
-        <w:rPr>
-          <w:rFonts w:ascii="Times New Roman" w:eastAsia="Times New Roman" w:hAnsi="Times New Roman" w:cs="Times New Roman"/>
-          <w:b/>
-          <w:bCs/>
-          <w:kern w:val="0"/>
-          <w:sz w:val="27"/>
-          <w:szCs w:val="27"/>
-          <w:lang w:eastAsia="fr-FR"/>
-          <w14:ligatures w14:val="none"/>
-        </w:rPr>
-        <w:t>45:</w:t>
-      </w:r>
-      <w:proofErr w:type="gramEnd"/>
-      <w:r>
-        <w:rPr>
-          <w:rFonts w:ascii="Times New Roman" w:eastAsia="Times New Roman" w:hAnsi="Times New Roman" w:cs="Times New Roman"/>
-          <w:b/>
-          <w:bCs/>
-          <w:kern w:val="0"/>
-          <w:sz w:val="27"/>
-          <w:szCs w:val="27"/>
-          <w:lang w:eastAsia="fr-FR"/>
-          <w14:ligatures w14:val="none"/>
-        </w:rPr>
-        <w:t xml:space="preserve"> Ensemble Methods</w:t>
+        <w:t>Days 41–45: Ensemble Methods</w:t>
       </w:r>
     </w:p>
     <w:p>
@@ -4165,45 +3106,19 @@
           <w:lang w:val="en-US" w:eastAsia="fr-FR"/>
           <w14:ligatures w14:val="none"/>
         </w:rPr>
-        <w:t xml:space="preserve">Day 41: Random Forest – </w:t>
-      </w:r>
-      <w:proofErr w:type="gramStart"/>
-      <w:r>
-        <w:rPr>
-          <w:rFonts w:ascii="Times New Roman" w:eastAsia="Times New Roman" w:hAnsi="Times New Roman" w:cs="Times New Roman"/>
-          <w:kern w:val="0"/>
-          <w:sz w:val="24"/>
-          <w:szCs w:val="24"/>
-          <w:highlight w:val="yellow"/>
-          <w:lang w:val="en-US" w:eastAsia="fr-FR"/>
-          <w14:ligatures w14:val="none"/>
-        </w:rPr>
-        <w:t>theory</w:t>
-      </w:r>
-      <w:r>
-        <w:rPr>
-          <w:rFonts w:ascii="Times New Roman" w:eastAsia="Times New Roman" w:hAnsi="Times New Roman" w:cs="Times New Roman"/>
-          <w:kern w:val="0"/>
-          <w:sz w:val="24"/>
-          <w:szCs w:val="24"/>
-          <w:highlight w:val="yellow"/>
-          <w:lang w:val="en-US" w:eastAsia="fr-FR"/>
-          <w14:ligatures w14:val="none"/>
-        </w:rPr>
-        <w:t>(</w:t>
-      </w:r>
-      <w:proofErr w:type="gramEnd"/>
-      <w:r>
-        <w:rPr>
-          <w:rFonts w:ascii="Times New Roman" w:eastAsia="Times New Roman" w:hAnsi="Times New Roman" w:cs="Times New Roman"/>
-          <w:kern w:val="0"/>
-          <w:sz w:val="24"/>
-          <w:szCs w:val="24"/>
-          <w:highlight w:val="yellow"/>
-          <w:lang w:val="en-US" w:eastAsia="fr-FR"/>
-          <w14:ligatures w14:val="none"/>
-        </w:rPr>
-        <w:t>c</w:t>
+        <w:t>Day 41: Random Forest – theory</w:t>
+      </w:r>
+      <w:r>
+        <w:rPr>
+          <w:rFonts w:ascii="Times New Roman" w:eastAsia="Times New Roman" w:hAnsi="Times New Roman" w:cs="Times New Roman"/>
+          <w:kern w:val="0"/>
+          <w:sz w:val="24"/>
+          <w:szCs w:val="24"/>
+          <w:highlight w:val="yellow"/>
+          <w:lang w:val="en-US" w:eastAsia="fr-FR"/>
+          <w14:ligatures w14:val="none"/>
+        </w:rPr>
+        <w:t>(c</w:t>
       </w:r>
       <w:r>
         <w:rPr>
@@ -4245,22 +3160,8 @@
           <w:lang w:val="en-US" w:eastAsia="fr-FR"/>
           <w14:ligatures w14:val="none"/>
         </w:rPr>
-        <w:t xml:space="preserve">Day 42: Implement Random Forest with </w:t>
-      </w:r>
-      <w:proofErr w:type="spellStart"/>
-      <w:r>
-        <w:rPr>
-          <w:rFonts w:ascii="Times New Roman" w:eastAsia="Times New Roman" w:hAnsi="Times New Roman" w:cs="Times New Roman"/>
-          <w:kern w:val="0"/>
-          <w:sz w:val="24"/>
-          <w:szCs w:val="24"/>
-          <w:highlight w:val="yellow"/>
-          <w:lang w:val="en-US" w:eastAsia="fr-FR"/>
-          <w14:ligatures w14:val="none"/>
-        </w:rPr>
-        <w:t>sklearn</w:t>
-      </w:r>
-      <w:proofErr w:type="spellEnd"/>
+        <w:t>Day 42: Implement Random Forest with sklearn</w:t>
+      </w:r>
     </w:p>
     <w:p>
       <w:pPr>
@@ -4304,33 +3205,7 @@
           <w:lang w:val="en-US" w:eastAsia="fr-FR"/>
           <w14:ligatures w14:val="none"/>
         </w:rPr>
-        <w:t xml:space="preserve">Day 43: Gradient Boosting (intro to </w:t>
-      </w:r>
-      <w:proofErr w:type="spellStart"/>
-      <w:r>
-        <w:rPr>
-          <w:rFonts w:ascii="Times New Roman" w:eastAsia="Times New Roman" w:hAnsi="Times New Roman" w:cs="Times New Roman"/>
-          <w:kern w:val="0"/>
-          <w:sz w:val="24"/>
-          <w:szCs w:val="24"/>
-          <w:highlight w:val="yellow"/>
-          <w:lang w:val="en-US" w:eastAsia="fr-FR"/>
-          <w14:ligatures w14:val="none"/>
-        </w:rPr>
-        <w:t>XGBoost</w:t>
-      </w:r>
-      <w:proofErr w:type="spellEnd"/>
-      <w:r>
-        <w:rPr>
-          <w:rFonts w:ascii="Times New Roman" w:eastAsia="Times New Roman" w:hAnsi="Times New Roman" w:cs="Times New Roman"/>
-          <w:kern w:val="0"/>
-          <w:sz w:val="24"/>
-          <w:szCs w:val="24"/>
-          <w:highlight w:val="yellow"/>
-          <w:lang w:val="en-US" w:eastAsia="fr-FR"/>
-          <w14:ligatures w14:val="none"/>
-        </w:rPr>
-        <w:t>)</w:t>
+        <w:t>Day 43: Gradient Boosting (intro to XGBoost)</w:t>
       </w:r>
     </w:p>
     <w:p>
@@ -4360,59 +3235,7 @@
           <w:lang w:eastAsia="fr-FR"/>
           <w14:ligatures w14:val="none"/>
         </w:rPr>
-        <w:t xml:space="preserve">Day </w:t>
-      </w:r>
-      <w:proofErr w:type="gramStart"/>
-      <w:r>
-        <w:rPr>
-          <w:rFonts w:ascii="Times New Roman" w:eastAsia="Times New Roman" w:hAnsi="Times New Roman" w:cs="Times New Roman"/>
-          <w:kern w:val="0"/>
-          <w:sz w:val="24"/>
-          <w:szCs w:val="24"/>
-          <w:highlight w:val="yellow"/>
-          <w:lang w:eastAsia="fr-FR"/>
-          <w14:ligatures w14:val="none"/>
-        </w:rPr>
-        <w:t>44:</w:t>
-      </w:r>
-      <w:proofErr w:type="gramEnd"/>
-      <w:r>
-        <w:rPr>
-          <w:rFonts w:ascii="Times New Roman" w:eastAsia="Times New Roman" w:hAnsi="Times New Roman" w:cs="Times New Roman"/>
-          <w:kern w:val="0"/>
-          <w:sz w:val="24"/>
-          <w:szCs w:val="24"/>
-          <w:highlight w:val="yellow"/>
-          <w:lang w:eastAsia="fr-FR"/>
-          <w14:ligatures w14:val="none"/>
-        </w:rPr>
-        <w:t xml:space="preserve"> </w:t>
-      </w:r>
-      <w:proofErr w:type="spellStart"/>
-      <w:r>
-        <w:rPr>
-          <w:rFonts w:ascii="Times New Roman" w:eastAsia="Times New Roman" w:hAnsi="Times New Roman" w:cs="Times New Roman"/>
-          <w:kern w:val="0"/>
-          <w:sz w:val="24"/>
-          <w:szCs w:val="24"/>
-          <w:highlight w:val="yellow"/>
-          <w:lang w:eastAsia="fr-FR"/>
-          <w14:ligatures w14:val="none"/>
-        </w:rPr>
-        <w:t>Feature</w:t>
-      </w:r>
-      <w:proofErr w:type="spellEnd"/>
-      <w:r>
-        <w:rPr>
-          <w:rFonts w:ascii="Times New Roman" w:eastAsia="Times New Roman" w:hAnsi="Times New Roman" w:cs="Times New Roman"/>
-          <w:kern w:val="0"/>
-          <w:sz w:val="24"/>
-          <w:szCs w:val="24"/>
-          <w:highlight w:val="yellow"/>
-          <w:lang w:eastAsia="fr-FR"/>
-          <w14:ligatures w14:val="none"/>
-        </w:rPr>
-        <w:t xml:space="preserve"> importance</w:t>
+        <w:t>Day 44: Feature importance</w:t>
       </w:r>
     </w:p>
     <w:p>
@@ -4471,175 +3294,31 @@
           <w:lang w:eastAsia="fr-FR"/>
           <w14:ligatures w14:val="none"/>
         </w:rPr>
-        <w:t>Days 46–</w:t>
-      </w:r>
-      <w:proofErr w:type="gramStart"/>
-      <w:r>
-        <w:rPr>
-          <w:rFonts w:ascii="Times New Roman" w:eastAsia="Times New Roman" w:hAnsi="Times New Roman" w:cs="Times New Roman"/>
-          <w:b/>
-          <w:bCs/>
-          <w:kern w:val="0"/>
-          <w:sz w:val="27"/>
-          <w:szCs w:val="27"/>
+        <w:t>Days 46–50: Model Tuning &amp; Validation</w:t>
+      </w:r>
+    </w:p>
+    <w:p>
+      <w:pPr>
+        <w:rPr>
           <w:lang w:eastAsia="fr-FR"/>
-          <w14:ligatures w14:val="none"/>
-        </w:rPr>
-        <w:t>50:</w:t>
-      </w:r>
-      <w:proofErr w:type="gramEnd"/>
-      <w:r>
-        <w:rPr>
-          <w:rFonts w:ascii="Times New Roman" w:eastAsia="Times New Roman" w:hAnsi="Times New Roman" w:cs="Times New Roman"/>
-          <w:b/>
-          <w:bCs/>
-          <w:kern w:val="0"/>
-          <w:sz w:val="27"/>
-          <w:szCs w:val="27"/>
+        </w:rPr>
+      </w:pPr>
+      <w:r>
+        <w:rPr>
           <w:lang w:eastAsia="fr-FR"/>
-          <w14:ligatures w14:val="none"/>
-        </w:rPr>
-        <w:t xml:space="preserve"> Model Tuning &amp; Validation</w:t>
-      </w:r>
-    </w:p>
-    <w:p>
-      <w:pPr>
-        <w:spacing w:before="100" w:beforeAutospacing="1" w:after="100" w:afterAutospacing="1" w:line="240" w:lineRule="auto"/>
-        <w:outlineLvl w:val="2"/>
-        <w:rPr>
-          <w:rFonts w:ascii="Times New Roman" w:eastAsia="Times New Roman" w:hAnsi="Times New Roman" w:cs="Times New Roman"/>
-          <w:b/>
-          <w:bCs/>
-          <w:kern w:val="0"/>
-          <w:sz w:val="27"/>
-          <w:szCs w:val="27"/>
+        </w:rPr>
+        <w:t>Model tunning : optimiser les hyperparametres pour améliorer les performances du modele.</w:t>
+      </w:r>
+    </w:p>
+    <w:p>
+      <w:pPr>
+        <w:rPr>
           <w:lang w:eastAsia="fr-FR"/>
-          <w14:ligatures w14:val="none"/>
-        </w:rPr>
-      </w:pPr>
-      <w:r>
-        <w:rPr>
-          <w:rFonts w:ascii="Times New Roman" w:eastAsia="Times New Roman" w:hAnsi="Times New Roman" w:cs="Times New Roman"/>
-          <w:b/>
-          <w:bCs/>
-          <w:kern w:val="0"/>
-          <w:sz w:val="27"/>
-          <w:szCs w:val="27"/>
+        </w:rPr>
+      </w:pPr>
+      <w:r>
+        <w:rPr>
           <w:lang w:eastAsia="fr-FR"/>
-          <w14:ligatures w14:val="none"/>
-        </w:rPr>
-        <w:t xml:space="preserve">Model </w:t>
-      </w:r>
-      <w:proofErr w:type="spellStart"/>
-      <w:r>
-        <w:rPr>
-          <w:rFonts w:ascii="Times New Roman" w:eastAsia="Times New Roman" w:hAnsi="Times New Roman" w:cs="Times New Roman"/>
-          <w:b/>
-          <w:bCs/>
-          <w:kern w:val="0"/>
-          <w:sz w:val="27"/>
-          <w:szCs w:val="27"/>
-          <w:lang w:eastAsia="fr-FR"/>
-          <w14:ligatures w14:val="none"/>
-        </w:rPr>
-        <w:t>tunning</w:t>
-      </w:r>
-      <w:proofErr w:type="spellEnd"/>
-      <w:r>
-        <w:rPr>
-          <w:rFonts w:ascii="Times New Roman" w:eastAsia="Times New Roman" w:hAnsi="Times New Roman" w:cs="Times New Roman"/>
-          <w:b/>
-          <w:bCs/>
-          <w:kern w:val="0"/>
-          <w:sz w:val="27"/>
-          <w:szCs w:val="27"/>
-          <w:lang w:eastAsia="fr-FR"/>
-          <w14:ligatures w14:val="none"/>
-        </w:rPr>
-        <w:t xml:space="preserve"> : optimiser les </w:t>
-      </w:r>
-      <w:proofErr w:type="spellStart"/>
-      <w:r>
-        <w:rPr>
-          <w:rFonts w:ascii="Times New Roman" w:eastAsia="Times New Roman" w:hAnsi="Times New Roman" w:cs="Times New Roman"/>
-          <w:b/>
-          <w:bCs/>
-          <w:kern w:val="0"/>
-          <w:sz w:val="27"/>
-          <w:szCs w:val="27"/>
-          <w:lang w:eastAsia="fr-FR"/>
-          <w14:ligatures w14:val="none"/>
-        </w:rPr>
-        <w:t>hyperparametres</w:t>
-      </w:r>
-      <w:proofErr w:type="spellEnd"/>
-      <w:r>
-        <w:rPr>
-          <w:rFonts w:ascii="Times New Roman" w:eastAsia="Times New Roman" w:hAnsi="Times New Roman" w:cs="Times New Roman"/>
-          <w:b/>
-          <w:bCs/>
-          <w:kern w:val="0"/>
-          <w:sz w:val="27"/>
-          <w:szCs w:val="27"/>
-          <w:lang w:eastAsia="fr-FR"/>
-          <w14:ligatures w14:val="none"/>
-        </w:rPr>
-        <w:t xml:space="preserve"> pour améliorer les performances du </w:t>
-      </w:r>
-      <w:proofErr w:type="spellStart"/>
-      <w:r>
-        <w:rPr>
-          <w:rFonts w:ascii="Times New Roman" w:eastAsia="Times New Roman" w:hAnsi="Times New Roman" w:cs="Times New Roman"/>
-          <w:b/>
-          <w:bCs/>
-          <w:kern w:val="0"/>
-          <w:sz w:val="27"/>
-          <w:szCs w:val="27"/>
-          <w:lang w:eastAsia="fr-FR"/>
-          <w14:ligatures w14:val="none"/>
-        </w:rPr>
-        <w:t>modele</w:t>
-      </w:r>
-      <w:proofErr w:type="spellEnd"/>
-      <w:r>
-        <w:rPr>
-          <w:rFonts w:ascii="Times New Roman" w:eastAsia="Times New Roman" w:hAnsi="Times New Roman" w:cs="Times New Roman"/>
-          <w:b/>
-          <w:bCs/>
-          <w:kern w:val="0"/>
-          <w:sz w:val="27"/>
-          <w:szCs w:val="27"/>
-          <w:lang w:eastAsia="fr-FR"/>
-          <w14:ligatures w14:val="none"/>
-        </w:rPr>
-        <w:t>.</w:t>
-      </w:r>
-    </w:p>
-    <w:p>
-      <w:pPr>
-        <w:spacing w:before="100" w:beforeAutospacing="1" w:after="100" w:afterAutospacing="1" w:line="240" w:lineRule="auto"/>
-        <w:outlineLvl w:val="2"/>
-        <w:rPr>
-          <w:rFonts w:ascii="Times New Roman" w:eastAsia="Times New Roman" w:hAnsi="Times New Roman" w:cs="Times New Roman"/>
-          <w:b/>
-          <w:bCs/>
-          <w:kern w:val="0"/>
-          <w:sz w:val="27"/>
-          <w:szCs w:val="27"/>
-          <w:lang w:eastAsia="fr-FR"/>
-          <w14:ligatures w14:val="none"/>
-        </w:rPr>
-      </w:pPr>
-      <w:r>
-        <w:rPr>
-          <w:rFonts w:ascii="Times New Roman" w:eastAsia="Times New Roman" w:hAnsi="Times New Roman" w:cs="Times New Roman"/>
-          <w:b/>
-          <w:bCs/>
-          <w:kern w:val="0"/>
-          <w:sz w:val="27"/>
-          <w:szCs w:val="27"/>
-          <w:lang w:eastAsia="fr-FR"/>
-          <w14:ligatures w14:val="none"/>
         </w:rPr>
         <w:t>Validation : Mesurer les performances du modèle sur des données non vues.</w:t>
       </w:r>
@@ -4787,7 +3466,6 @@
           <w14:ligatures w14:val="none"/>
         </w:rPr>
       </w:pPr>
-      <w:proofErr w:type="spellStart"/>
       <w:r>
         <w:rPr>
           <w:rFonts w:ascii="Times New Roman" w:eastAsia="Times New Roman" w:hAnsi="Times New Roman" w:cs="Times New Roman"/>
@@ -4800,22 +3478,7 @@
           <w:lang w:val="en-US" w:eastAsia="fr-FR"/>
           <w14:ligatures w14:val="none"/>
         </w:rPr>
-        <w:t>stratisfied</w:t>
-      </w:r>
-      <w:proofErr w:type="spellEnd"/>
-      <w:r>
-        <w:rPr>
-          <w:rFonts w:ascii="Times New Roman" w:eastAsia="Times New Roman" w:hAnsi="Times New Roman" w:cs="Times New Roman"/>
-          <w:b/>
-          <w:bCs/>
-          <w:kern w:val="0"/>
-          <w:sz w:val="24"/>
-          <w:szCs w:val="24"/>
-          <w:highlight w:val="green"/>
-          <w:lang w:val="en-US" w:eastAsia="fr-FR"/>
-          <w14:ligatures w14:val="none"/>
-        </w:rPr>
-        <w:t xml:space="preserve"> k-fold, </w:t>
+        <w:t xml:space="preserve">stratisfied k-fold, </w:t>
       </w:r>
     </w:p>
     <w:p>
@@ -5029,74 +3692,8 @@
           <w:lang w:eastAsia="fr-FR"/>
           <w14:ligatures w14:val="none"/>
         </w:rPr>
-        <w:t xml:space="preserve">Day </w:t>
-      </w:r>
-      <w:proofErr w:type="gramStart"/>
-      <w:r>
-        <w:rPr>
-          <w:rFonts w:ascii="Times New Roman" w:eastAsia="Times New Roman" w:hAnsi="Times New Roman" w:cs="Times New Roman"/>
-          <w:kern w:val="0"/>
-          <w:sz w:val="24"/>
-          <w:szCs w:val="24"/>
-          <w:highlight w:val="yellow"/>
-          <w:lang w:eastAsia="fr-FR"/>
-          <w14:ligatures w14:val="none"/>
-        </w:rPr>
-        <w:t>47:</w:t>
-      </w:r>
-      <w:proofErr w:type="gramEnd"/>
-      <w:r>
-        <w:rPr>
-          <w:rFonts w:ascii="Times New Roman" w:eastAsia="Times New Roman" w:hAnsi="Times New Roman" w:cs="Times New Roman"/>
-          <w:kern w:val="0"/>
-          <w:sz w:val="24"/>
-          <w:szCs w:val="24"/>
-          <w:highlight w:val="yellow"/>
-          <w:lang w:eastAsia="fr-FR"/>
-          <w14:ligatures w14:val="none"/>
-        </w:rPr>
-        <w:t xml:space="preserve"> </w:t>
-      </w:r>
-      <w:proofErr w:type="spellStart"/>
-      <w:r>
-        <w:rPr>
-          <w:rFonts w:ascii="Times New Roman" w:eastAsia="Times New Roman" w:hAnsi="Times New Roman" w:cs="Times New Roman"/>
-          <w:kern w:val="0"/>
-          <w:sz w:val="24"/>
-          <w:szCs w:val="24"/>
-          <w:highlight w:val="yellow"/>
-          <w:lang w:eastAsia="fr-FR"/>
-          <w14:ligatures w14:val="none"/>
-        </w:rPr>
-        <w:t>Grid</w:t>
-      </w:r>
-      <w:proofErr w:type="spellEnd"/>
-      <w:r>
-        <w:rPr>
-          <w:rFonts w:ascii="Times New Roman" w:eastAsia="Times New Roman" w:hAnsi="Times New Roman" w:cs="Times New Roman"/>
-          <w:kern w:val="0"/>
-          <w:sz w:val="24"/>
-          <w:szCs w:val="24"/>
-          <w:highlight w:val="yellow"/>
-          <w:lang w:eastAsia="fr-FR"/>
-          <w14:ligatures w14:val="none"/>
-        </w:rPr>
-        <w:t xml:space="preserve"> Search, </w:t>
-      </w:r>
-      <w:proofErr w:type="spellStart"/>
-      <w:r>
-        <w:rPr>
-          <w:rFonts w:ascii="Times New Roman" w:eastAsia="Times New Roman" w:hAnsi="Times New Roman" w:cs="Times New Roman"/>
-          <w:kern w:val="0"/>
-          <w:sz w:val="24"/>
-          <w:szCs w:val="24"/>
-          <w:highlight w:val="yellow"/>
-          <w:lang w:eastAsia="fr-FR"/>
-          <w14:ligatures w14:val="none"/>
-        </w:rPr>
-        <w:t>RandomizedSearch</w:t>
-      </w:r>
-      <w:proofErr w:type="spellEnd"/>
+        <w:t>Day 47: Grid Search, RandomizedSearch</w:t>
+      </w:r>
     </w:p>
     <w:p>
       <w:pPr>
@@ -5194,16 +3791,18 @@
           <w:kern w:val="0"/>
           <w:sz w:val="24"/>
           <w:szCs w:val="24"/>
-          <w:lang w:val="en-US" w:eastAsia="fr-FR"/>
-          <w14:ligatures w14:val="none"/>
-        </w:rPr>
-      </w:pPr>
-      <w:r>
-        <w:rPr>
-          <w:rFonts w:ascii="Times New Roman" w:eastAsia="Times New Roman" w:hAnsi="Times New Roman" w:cs="Times New Roman"/>
-          <w:kern w:val="0"/>
-          <w:sz w:val="24"/>
-          <w:szCs w:val="24"/>
+          <w:highlight w:val="yellow"/>
+          <w:lang w:val="en-US" w:eastAsia="fr-FR"/>
+          <w14:ligatures w14:val="none"/>
+        </w:rPr>
+      </w:pPr>
+      <w:r>
+        <w:rPr>
+          <w:rFonts w:ascii="Times New Roman" w:eastAsia="Times New Roman" w:hAnsi="Times New Roman" w:cs="Times New Roman"/>
+          <w:kern w:val="0"/>
+          <w:sz w:val="24"/>
+          <w:szCs w:val="24"/>
+          <w:highlight w:val="yellow"/>
           <w:lang w:val="en-US" w:eastAsia="fr-FR"/>
           <w14:ligatures w14:val="none"/>
         </w:rPr>
@@ -5275,35 +3874,7 @@
           <w:lang w:val="en-US" w:eastAsia="fr-FR"/>
           <w14:ligatures w14:val="none"/>
         </w:rPr>
-        <w:t xml:space="preserve"> Phase </w:t>
-      </w:r>
-      <w:proofErr w:type="gramStart"/>
-      <w:r>
-        <w:rPr>
-          <w:rFonts w:ascii="Times New Roman" w:eastAsia="Times New Roman" w:hAnsi="Times New Roman" w:cs="Times New Roman"/>
-          <w:b/>
-          <w:bCs/>
-          <w:kern w:val="0"/>
-          <w:sz w:val="36"/>
-          <w:szCs w:val="36"/>
-          <w:lang w:val="en-US" w:eastAsia="fr-FR"/>
-          <w14:ligatures w14:val="none"/>
-        </w:rPr>
-        <w:t>3:</w:t>
-      </w:r>
-      <w:proofErr w:type="gramEnd"/>
-      <w:r>
-        <w:rPr>
-          <w:rFonts w:ascii="Times New Roman" w:eastAsia="Times New Roman" w:hAnsi="Times New Roman" w:cs="Times New Roman"/>
-          <w:b/>
-          <w:bCs/>
-          <w:kern w:val="0"/>
-          <w:sz w:val="36"/>
-          <w:szCs w:val="36"/>
-          <w:lang w:val="en-US" w:eastAsia="fr-FR"/>
-          <w14:ligatures w14:val="none"/>
-        </w:rPr>
-        <w:t xml:space="preserve"> Intermediate Topics (Days 51–80)</w:t>
+        <w:t xml:space="preserve"> Phase 3: Intermediate Topics (Days 51–80)</w:t>
       </w:r>
     </w:p>
     <w:p>
@@ -5332,63 +3903,7 @@
           <w:lang w:eastAsia="fr-FR"/>
           <w14:ligatures w14:val="none"/>
         </w:rPr>
-        <w:t>Days 51–</w:t>
-      </w:r>
-      <w:proofErr w:type="gramStart"/>
-      <w:r>
-        <w:rPr>
-          <w:rFonts w:ascii="Times New Roman" w:eastAsia="Times New Roman" w:hAnsi="Times New Roman" w:cs="Times New Roman"/>
-          <w:b/>
-          <w:bCs/>
-          <w:kern w:val="0"/>
-          <w:sz w:val="27"/>
-          <w:szCs w:val="27"/>
-          <w:lang w:eastAsia="fr-FR"/>
-          <w14:ligatures w14:val="none"/>
-        </w:rPr>
-        <w:t>55:</w:t>
-      </w:r>
-      <w:proofErr w:type="gramEnd"/>
-      <w:r>
-        <w:rPr>
-          <w:rFonts w:ascii="Times New Roman" w:eastAsia="Times New Roman" w:hAnsi="Times New Roman" w:cs="Times New Roman"/>
-          <w:b/>
-          <w:bCs/>
-          <w:kern w:val="0"/>
-          <w:sz w:val="27"/>
-          <w:szCs w:val="27"/>
-          <w:lang w:eastAsia="fr-FR"/>
-          <w14:ligatures w14:val="none"/>
-        </w:rPr>
-        <w:t xml:space="preserve"> </w:t>
-      </w:r>
-      <w:proofErr w:type="spellStart"/>
-      <w:r>
-        <w:rPr>
-          <w:rFonts w:ascii="Times New Roman" w:eastAsia="Times New Roman" w:hAnsi="Times New Roman" w:cs="Times New Roman"/>
-          <w:b/>
-          <w:bCs/>
-          <w:kern w:val="0"/>
-          <w:sz w:val="27"/>
-          <w:szCs w:val="27"/>
-          <w:lang w:eastAsia="fr-FR"/>
-          <w14:ligatures w14:val="none"/>
-        </w:rPr>
-        <w:t>Unsupervised</w:t>
-      </w:r>
-      <w:proofErr w:type="spellEnd"/>
-      <w:r>
-        <w:rPr>
-          <w:rFonts w:ascii="Times New Roman" w:eastAsia="Times New Roman" w:hAnsi="Times New Roman" w:cs="Times New Roman"/>
-          <w:b/>
-          <w:bCs/>
-          <w:kern w:val="0"/>
-          <w:sz w:val="27"/>
-          <w:szCs w:val="27"/>
-          <w:lang w:eastAsia="fr-FR"/>
-          <w14:ligatures w14:val="none"/>
-        </w:rPr>
-        <w:t xml:space="preserve"> Learning</w:t>
+        <w:t>Days 51–55: Unsupervised Learning</w:t>
       </w:r>
     </w:p>
     <w:p>
@@ -5444,69 +3959,8 @@
           <w:lang w:eastAsia="fr-FR"/>
           <w14:ligatures w14:val="none"/>
         </w:rPr>
-        <w:t xml:space="preserve">Day </w:t>
-      </w:r>
-      <w:proofErr w:type="gramStart"/>
-      <w:r>
-        <w:rPr>
-          <w:rFonts w:ascii="Times New Roman" w:eastAsia="Times New Roman" w:hAnsi="Times New Roman" w:cs="Times New Roman"/>
-          <w:kern w:val="0"/>
-          <w:sz w:val="24"/>
-          <w:szCs w:val="24"/>
-          <w:lang w:eastAsia="fr-FR"/>
-          <w14:ligatures w14:val="none"/>
-        </w:rPr>
-        <w:t>52:</w:t>
-      </w:r>
-      <w:proofErr w:type="gramEnd"/>
-      <w:r>
-        <w:rPr>
-          <w:rFonts w:ascii="Times New Roman" w:eastAsia="Times New Roman" w:hAnsi="Times New Roman" w:cs="Times New Roman"/>
-          <w:kern w:val="0"/>
-          <w:sz w:val="24"/>
-          <w:szCs w:val="24"/>
-          <w:lang w:eastAsia="fr-FR"/>
-          <w14:ligatures w14:val="none"/>
-        </w:rPr>
-        <w:t xml:space="preserve"> K-</w:t>
-      </w:r>
-      <w:proofErr w:type="spellStart"/>
-      <w:r>
-        <w:rPr>
-          <w:rFonts w:ascii="Times New Roman" w:eastAsia="Times New Roman" w:hAnsi="Times New Roman" w:cs="Times New Roman"/>
-          <w:kern w:val="0"/>
-          <w:sz w:val="24"/>
-          <w:szCs w:val="24"/>
-          <w:lang w:eastAsia="fr-FR"/>
-          <w14:ligatures w14:val="none"/>
-        </w:rPr>
-        <w:t>means</w:t>
-      </w:r>
-      <w:proofErr w:type="spellEnd"/>
-      <w:r>
-        <w:rPr>
-          <w:rFonts w:ascii="Times New Roman" w:eastAsia="Times New Roman" w:hAnsi="Times New Roman" w:cs="Times New Roman"/>
-          <w:kern w:val="0"/>
-          <w:sz w:val="24"/>
-          <w:szCs w:val="24"/>
-          <w:lang w:eastAsia="fr-FR"/>
-          <w14:ligatures w14:val="none"/>
-        </w:rPr>
-        <w:t xml:space="preserve"> </w:t>
-      </w:r>
-      <w:proofErr w:type="spellStart"/>
-      <w:r>
-        <w:rPr>
-          <w:rFonts w:ascii="Times New Roman" w:eastAsia="Times New Roman" w:hAnsi="Times New Roman" w:cs="Times New Roman"/>
-          <w:kern w:val="0"/>
-          <w:sz w:val="24"/>
-          <w:szCs w:val="24"/>
-          <w:lang w:eastAsia="fr-FR"/>
-          <w14:ligatures w14:val="none"/>
-        </w:rPr>
-        <w:t>implementation</w:t>
-      </w:r>
-      <w:proofErr w:type="spellEnd"/>
+        <w:t>Day 52: K-means implementation</w:t>
+      </w:r>
     </w:p>
     <w:p>
       <w:pPr>
@@ -5533,55 +3987,7 @@
           <w:lang w:eastAsia="fr-FR"/>
           <w14:ligatures w14:val="none"/>
         </w:rPr>
-        <w:t xml:space="preserve">Day </w:t>
-      </w:r>
-      <w:proofErr w:type="gramStart"/>
-      <w:r>
-        <w:rPr>
-          <w:rFonts w:ascii="Times New Roman" w:eastAsia="Times New Roman" w:hAnsi="Times New Roman" w:cs="Times New Roman"/>
-          <w:kern w:val="0"/>
-          <w:sz w:val="24"/>
-          <w:szCs w:val="24"/>
-          <w:lang w:eastAsia="fr-FR"/>
-          <w14:ligatures w14:val="none"/>
-        </w:rPr>
-        <w:t>53:</w:t>
-      </w:r>
-      <w:proofErr w:type="gramEnd"/>
-      <w:r>
-        <w:rPr>
-          <w:rFonts w:ascii="Times New Roman" w:eastAsia="Times New Roman" w:hAnsi="Times New Roman" w:cs="Times New Roman"/>
-          <w:kern w:val="0"/>
-          <w:sz w:val="24"/>
-          <w:szCs w:val="24"/>
-          <w:lang w:eastAsia="fr-FR"/>
-          <w14:ligatures w14:val="none"/>
-        </w:rPr>
-        <w:t xml:space="preserve"> DBSCAN and </w:t>
-      </w:r>
-      <w:proofErr w:type="spellStart"/>
-      <w:r>
-        <w:rPr>
-          <w:rFonts w:ascii="Times New Roman" w:eastAsia="Times New Roman" w:hAnsi="Times New Roman" w:cs="Times New Roman"/>
-          <w:kern w:val="0"/>
-          <w:sz w:val="24"/>
-          <w:szCs w:val="24"/>
-          <w:lang w:eastAsia="fr-FR"/>
-          <w14:ligatures w14:val="none"/>
-        </w:rPr>
-        <w:t>hierarchical</w:t>
-      </w:r>
-      <w:proofErr w:type="spellEnd"/>
-      <w:r>
-        <w:rPr>
-          <w:rFonts w:ascii="Times New Roman" w:eastAsia="Times New Roman" w:hAnsi="Times New Roman" w:cs="Times New Roman"/>
-          <w:kern w:val="0"/>
-          <w:sz w:val="24"/>
-          <w:szCs w:val="24"/>
-          <w:lang w:eastAsia="fr-FR"/>
-          <w14:ligatures w14:val="none"/>
-        </w:rPr>
-        <w:t xml:space="preserve"> clustering</w:t>
+        <w:t>Day 53: DBSCAN and hierarchical clustering</w:t>
       </w:r>
     </w:p>
     <w:p>
@@ -5609,79 +4015,7 @@
           <w:lang w:eastAsia="fr-FR"/>
           <w14:ligatures w14:val="none"/>
         </w:rPr>
-        <w:t xml:space="preserve">Day </w:t>
-      </w:r>
-      <w:proofErr w:type="gramStart"/>
-      <w:r>
-        <w:rPr>
-          <w:rFonts w:ascii="Times New Roman" w:eastAsia="Times New Roman" w:hAnsi="Times New Roman" w:cs="Times New Roman"/>
-          <w:kern w:val="0"/>
-          <w:sz w:val="24"/>
-          <w:szCs w:val="24"/>
-          <w:lang w:eastAsia="fr-FR"/>
-          <w14:ligatures w14:val="none"/>
-        </w:rPr>
-        <w:t>54:</w:t>
-      </w:r>
-      <w:proofErr w:type="gramEnd"/>
-      <w:r>
-        <w:rPr>
-          <w:rFonts w:ascii="Times New Roman" w:eastAsia="Times New Roman" w:hAnsi="Times New Roman" w:cs="Times New Roman"/>
-          <w:kern w:val="0"/>
-          <w:sz w:val="24"/>
-          <w:szCs w:val="24"/>
-          <w:lang w:eastAsia="fr-FR"/>
-          <w14:ligatures w14:val="none"/>
-        </w:rPr>
-        <w:t xml:space="preserve"> </w:t>
-      </w:r>
-      <w:proofErr w:type="spellStart"/>
-      <w:r>
-        <w:rPr>
-          <w:rFonts w:ascii="Times New Roman" w:eastAsia="Times New Roman" w:hAnsi="Times New Roman" w:cs="Times New Roman"/>
-          <w:kern w:val="0"/>
-          <w:sz w:val="24"/>
-          <w:szCs w:val="24"/>
-          <w:lang w:eastAsia="fr-FR"/>
-          <w14:ligatures w14:val="none"/>
-        </w:rPr>
-        <w:t>Dimensionality</w:t>
-      </w:r>
-      <w:proofErr w:type="spellEnd"/>
-      <w:r>
-        <w:rPr>
-          <w:rFonts w:ascii="Times New Roman" w:eastAsia="Times New Roman" w:hAnsi="Times New Roman" w:cs="Times New Roman"/>
-          <w:kern w:val="0"/>
-          <w:sz w:val="24"/>
-          <w:szCs w:val="24"/>
-          <w:lang w:eastAsia="fr-FR"/>
-          <w14:ligatures w14:val="none"/>
-        </w:rPr>
-        <w:t xml:space="preserve"> </w:t>
-      </w:r>
-      <w:proofErr w:type="spellStart"/>
-      <w:r>
-        <w:rPr>
-          <w:rFonts w:ascii="Times New Roman" w:eastAsia="Times New Roman" w:hAnsi="Times New Roman" w:cs="Times New Roman"/>
-          <w:kern w:val="0"/>
-          <w:sz w:val="24"/>
-          <w:szCs w:val="24"/>
-          <w:lang w:eastAsia="fr-FR"/>
-          <w14:ligatures w14:val="none"/>
-        </w:rPr>
-        <w:t>reduction</w:t>
-      </w:r>
-      <w:proofErr w:type="spellEnd"/>
-      <w:r>
-        <w:rPr>
-          <w:rFonts w:ascii="Times New Roman" w:eastAsia="Times New Roman" w:hAnsi="Times New Roman" w:cs="Times New Roman"/>
-          <w:kern w:val="0"/>
-          <w:sz w:val="24"/>
-          <w:szCs w:val="24"/>
-          <w:lang w:eastAsia="fr-FR"/>
-          <w14:ligatures w14:val="none"/>
-        </w:rPr>
-        <w:t xml:space="preserve"> (PCA)</w:t>
+        <w:t>Day 54: Dimensionality reduction (PCA)</w:t>
       </w:r>
     </w:p>
     <w:p>
@@ -5760,63 +4094,7 @@
           <w:lang w:eastAsia="fr-FR"/>
           <w14:ligatures w14:val="none"/>
         </w:rPr>
-        <w:t>Days 56–</w:t>
-      </w:r>
-      <w:proofErr w:type="gramStart"/>
-      <w:r>
-        <w:rPr>
-          <w:rFonts w:ascii="Times New Roman" w:eastAsia="Times New Roman" w:hAnsi="Times New Roman" w:cs="Times New Roman"/>
-          <w:b/>
-          <w:bCs/>
-          <w:kern w:val="0"/>
-          <w:sz w:val="27"/>
-          <w:szCs w:val="27"/>
-          <w:lang w:eastAsia="fr-FR"/>
-          <w14:ligatures w14:val="none"/>
-        </w:rPr>
-        <w:t>60:</w:t>
-      </w:r>
-      <w:proofErr w:type="gramEnd"/>
-      <w:r>
-        <w:rPr>
-          <w:rFonts w:ascii="Times New Roman" w:eastAsia="Times New Roman" w:hAnsi="Times New Roman" w:cs="Times New Roman"/>
-          <w:b/>
-          <w:bCs/>
-          <w:kern w:val="0"/>
-          <w:sz w:val="27"/>
-          <w:szCs w:val="27"/>
-          <w:lang w:eastAsia="fr-FR"/>
-          <w14:ligatures w14:val="none"/>
-        </w:rPr>
-        <w:t xml:space="preserve"> </w:t>
-      </w:r>
-      <w:proofErr w:type="spellStart"/>
-      <w:r>
-        <w:rPr>
-          <w:rFonts w:ascii="Times New Roman" w:eastAsia="Times New Roman" w:hAnsi="Times New Roman" w:cs="Times New Roman"/>
-          <w:b/>
-          <w:bCs/>
-          <w:kern w:val="0"/>
-          <w:sz w:val="27"/>
-          <w:szCs w:val="27"/>
-          <w:lang w:eastAsia="fr-FR"/>
-          <w14:ligatures w14:val="none"/>
-        </w:rPr>
-        <w:t>Feature</w:t>
-      </w:r>
-      <w:proofErr w:type="spellEnd"/>
-      <w:r>
-        <w:rPr>
-          <w:rFonts w:ascii="Times New Roman" w:eastAsia="Times New Roman" w:hAnsi="Times New Roman" w:cs="Times New Roman"/>
-          <w:b/>
-          <w:bCs/>
-          <w:kern w:val="0"/>
-          <w:sz w:val="27"/>
-          <w:szCs w:val="27"/>
-          <w:lang w:eastAsia="fr-FR"/>
-          <w14:ligatures w14:val="none"/>
-        </w:rPr>
-        <w:t xml:space="preserve"> Engineering</w:t>
+        <w:t>Days 56–60: Feature Engineering</w:t>
       </w:r>
     </w:p>
     <w:p>
@@ -5906,48 +4184,8 @@
           <w:lang w:eastAsia="fr-FR"/>
           <w14:ligatures w14:val="none"/>
         </w:rPr>
-        <w:t xml:space="preserve">Day </w:t>
-      </w:r>
-      <w:proofErr w:type="gramStart"/>
-      <w:r>
-        <w:rPr>
-          <w:rFonts w:ascii="Times New Roman" w:eastAsia="Times New Roman" w:hAnsi="Times New Roman" w:cs="Times New Roman"/>
-          <w:kern w:val="0"/>
-          <w:sz w:val="24"/>
-          <w:szCs w:val="24"/>
-          <w:highlight w:val="yellow"/>
-          <w:lang w:eastAsia="fr-FR"/>
-          <w14:ligatures w14:val="none"/>
-        </w:rPr>
-        <w:t>58:</w:t>
-      </w:r>
-      <w:proofErr w:type="gramEnd"/>
-      <w:r>
-        <w:rPr>
-          <w:rFonts w:ascii="Times New Roman" w:eastAsia="Times New Roman" w:hAnsi="Times New Roman" w:cs="Times New Roman"/>
-          <w:kern w:val="0"/>
-          <w:sz w:val="24"/>
-          <w:szCs w:val="24"/>
-          <w:highlight w:val="yellow"/>
-          <w:lang w:eastAsia="fr-FR"/>
-          <w14:ligatures w14:val="none"/>
-        </w:rPr>
-        <w:t xml:space="preserve"> Binning, interaction </w:t>
-      </w:r>
-      <w:proofErr w:type="spellStart"/>
-      <w:r>
-        <w:rPr>
-          <w:rFonts w:ascii="Times New Roman" w:eastAsia="Times New Roman" w:hAnsi="Times New Roman" w:cs="Times New Roman"/>
-          <w:kern w:val="0"/>
-          <w:sz w:val="24"/>
-          <w:szCs w:val="24"/>
-          <w:highlight w:val="yellow"/>
-          <w:lang w:eastAsia="fr-FR"/>
-          <w14:ligatures w14:val="none"/>
-        </w:rPr>
-        <w:t>terms</w:t>
-      </w:r>
-      <w:proofErr w:type="spellEnd"/>
+        <w:t>Day 58: Binning, interaction terms</w:t>
+      </w:r>
       <w:r>
         <w:rPr>
           <w:rFonts w:ascii="Times New Roman" w:eastAsia="Times New Roman" w:hAnsi="Times New Roman" w:cs="Times New Roman"/>
@@ -5996,92 +4234,7 @@
           <w:lang w:eastAsia="fr-FR"/>
           <w14:ligatures w14:val="none"/>
         </w:rPr>
-        <w:t xml:space="preserve">c’est </w:t>
-      </w:r>
-      <w:proofErr w:type="spellStart"/>
-      <w:r>
-        <w:rPr>
-          <w:rFonts w:ascii="Times New Roman" w:eastAsia="Times New Roman" w:hAnsi="Times New Roman" w:cs="Times New Roman"/>
-          <w:kern w:val="0"/>
-          <w:sz w:val="24"/>
-          <w:szCs w:val="24"/>
-          <w:lang w:eastAsia="fr-FR"/>
-          <w14:ligatures w14:val="none"/>
-        </w:rPr>
-        <w:t>render</w:t>
-      </w:r>
-      <w:proofErr w:type="spellEnd"/>
-      <w:r>
-        <w:rPr>
-          <w:rFonts w:ascii="Times New Roman" w:eastAsia="Times New Roman" w:hAnsi="Times New Roman" w:cs="Times New Roman"/>
-          <w:kern w:val="0"/>
-          <w:sz w:val="24"/>
-          <w:szCs w:val="24"/>
-          <w:lang w:eastAsia="fr-FR"/>
-          <w14:ligatures w14:val="none"/>
-        </w:rPr>
-        <w:t xml:space="preserve"> une variable continue en catégorie par exemple </w:t>
-      </w:r>
-      <w:proofErr w:type="spellStart"/>
-      <w:r>
-        <w:rPr>
-          <w:rFonts w:ascii="Times New Roman" w:eastAsia="Times New Roman" w:hAnsi="Times New Roman" w:cs="Times New Roman"/>
-          <w:kern w:val="0"/>
-          <w:sz w:val="24"/>
-          <w:szCs w:val="24"/>
-          <w:lang w:eastAsia="fr-FR"/>
-          <w14:ligatures w14:val="none"/>
-        </w:rPr>
-        <w:t>age</w:t>
-      </w:r>
-      <w:proofErr w:type="spellEnd"/>
-      <w:r>
-        <w:rPr>
-          <w:rFonts w:ascii="Times New Roman" w:eastAsia="Times New Roman" w:hAnsi="Times New Roman" w:cs="Times New Roman"/>
-          <w:kern w:val="0"/>
-          <w:sz w:val="24"/>
-          <w:szCs w:val="24"/>
-          <w:lang w:eastAsia="fr-FR"/>
-          <w14:ligatures w14:val="none"/>
-        </w:rPr>
-        <w:t> : « jeune » = [0,20] « </w:t>
-      </w:r>
-      <w:proofErr w:type="spellStart"/>
-      <w:r>
-        <w:rPr>
-          <w:rFonts w:ascii="Times New Roman" w:eastAsia="Times New Roman" w:hAnsi="Times New Roman" w:cs="Times New Roman"/>
-          <w:kern w:val="0"/>
-          <w:sz w:val="24"/>
-          <w:szCs w:val="24"/>
-          <w:lang w:eastAsia="fr-FR"/>
-          <w14:ligatures w14:val="none"/>
-        </w:rPr>
-        <w:t>adult</w:t>
-      </w:r>
-      <w:proofErr w:type="spellEnd"/>
-      <w:proofErr w:type="gramStart"/>
-      <w:r>
-        <w:rPr>
-          <w:rFonts w:ascii="Times New Roman" w:eastAsia="Times New Roman" w:hAnsi="Times New Roman" w:cs="Times New Roman"/>
-          <w:kern w:val="0"/>
-          <w:sz w:val="24"/>
-          <w:szCs w:val="24"/>
-          <w:lang w:eastAsia="fr-FR"/>
-          <w14:ligatures w14:val="none"/>
-        </w:rPr>
-        <w:t> »=</w:t>
-      </w:r>
-      <w:proofErr w:type="gramEnd"/>
-      <w:r>
-        <w:rPr>
-          <w:rFonts w:ascii="Times New Roman" w:eastAsia="Times New Roman" w:hAnsi="Times New Roman" w:cs="Times New Roman"/>
-          <w:kern w:val="0"/>
-          <w:sz w:val="24"/>
-          <w:szCs w:val="24"/>
-          <w:lang w:eastAsia="fr-FR"/>
-          <w14:ligatures w14:val="none"/>
-        </w:rPr>
-        <w:t xml:space="preserve"> [21,40] « senior » = [41+]</w:t>
+        <w:t>c’est render une variable continue en catégorie par exemple age : « jeune » = [0,20] « adult »= [21,40] « senior » = [41+]</w:t>
       </w:r>
     </w:p>
     <w:p>
@@ -6108,70 +4261,18 @@
           <w:lang w:eastAsia="fr-FR"/>
           <w14:ligatures w14:val="none"/>
         </w:rPr>
-        <w:t xml:space="preserve">Interaction </w:t>
-      </w:r>
-      <w:proofErr w:type="spellStart"/>
-      <w:r>
-        <w:rPr>
-          <w:rFonts w:ascii="Times New Roman" w:eastAsia="Times New Roman" w:hAnsi="Times New Roman" w:cs="Times New Roman"/>
-          <w:b/>
-          <w:bCs/>
+        <w:t xml:space="preserve">Interaction terms </w:t>
+      </w:r>
+      <w:r>
+        <w:rPr>
+          <w:rFonts w:ascii="Times New Roman" w:eastAsia="Times New Roman" w:hAnsi="Times New Roman" w:cs="Times New Roman"/>
           <w:kern w:val="0"/>
           <w:sz w:val="24"/>
           <w:szCs w:val="24"/>
           <w:lang w:eastAsia="fr-FR"/>
           <w14:ligatures w14:val="none"/>
         </w:rPr>
-        <w:t>terms</w:t>
-      </w:r>
-      <w:proofErr w:type="spellEnd"/>
-      <w:r>
-        <w:rPr>
-          <w:rFonts w:ascii="Times New Roman" w:eastAsia="Times New Roman" w:hAnsi="Times New Roman" w:cs="Times New Roman"/>
-          <w:b/>
-          <w:bCs/>
-          <w:kern w:val="0"/>
-          <w:sz w:val="24"/>
-          <w:szCs w:val="24"/>
-          <w:lang w:eastAsia="fr-FR"/>
-          <w14:ligatures w14:val="none"/>
-        </w:rPr>
-        <w:t xml:space="preserve"> </w:t>
-      </w:r>
-      <w:r>
-        <w:rPr>
-          <w:rFonts w:ascii="Times New Roman" w:eastAsia="Times New Roman" w:hAnsi="Times New Roman" w:cs="Times New Roman"/>
-          <w:kern w:val="0"/>
-          <w:sz w:val="24"/>
-          <w:szCs w:val="24"/>
-          <w:lang w:eastAsia="fr-FR"/>
-          <w14:ligatures w14:val="none"/>
-        </w:rPr>
-        <w:t xml:space="preserve">c’est créer de nouvelles </w:t>
-      </w:r>
-      <w:proofErr w:type="spellStart"/>
-      <w:r>
-        <w:rPr>
-          <w:rFonts w:ascii="Times New Roman" w:eastAsia="Times New Roman" w:hAnsi="Times New Roman" w:cs="Times New Roman"/>
-          <w:kern w:val="0"/>
-          <w:sz w:val="24"/>
-          <w:szCs w:val="24"/>
-          <w:lang w:eastAsia="fr-FR"/>
-          <w14:ligatures w14:val="none"/>
-        </w:rPr>
-        <w:t>features</w:t>
-      </w:r>
-      <w:proofErr w:type="spellEnd"/>
-      <w:r>
-        <w:rPr>
-          <w:rFonts w:ascii="Times New Roman" w:eastAsia="Times New Roman" w:hAnsi="Times New Roman" w:cs="Times New Roman"/>
-          <w:kern w:val="0"/>
-          <w:sz w:val="24"/>
-          <w:szCs w:val="24"/>
-          <w:lang w:eastAsia="fr-FR"/>
-          <w14:ligatures w14:val="none"/>
-        </w:rPr>
-        <w:t xml:space="preserve"> par exemple </w:t>
+        <w:t xml:space="preserve">c’est créer de nouvelles features par exemple </w:t>
       </w:r>
     </w:p>
     <w:p>
@@ -6187,8 +4288,6 @@
           <w14:ligatures w14:val="none"/>
         </w:rPr>
       </w:pPr>
-      <w:proofErr w:type="spellStart"/>
-      <w:proofErr w:type="gramStart"/>
       <w:r>
         <w:rPr>
           <w:rFonts w:ascii="Times New Roman" w:eastAsia="Times New Roman" w:hAnsi="Times New Roman" w:cs="Times New Roman"/>
@@ -6198,31 +4297,7 @@
           <w:lang w:eastAsia="fr-FR"/>
           <w14:ligatures w14:val="none"/>
         </w:rPr>
-        <w:t>feature</w:t>
-      </w:r>
-      <w:proofErr w:type="gramEnd"/>
-      <w:r>
-        <w:rPr>
-          <w:rFonts w:ascii="Times New Roman" w:eastAsia="Times New Roman" w:hAnsi="Times New Roman" w:cs="Times New Roman"/>
-          <w:kern w:val="0"/>
-          <w:sz w:val="24"/>
-          <w:szCs w:val="24"/>
-          <w:lang w:eastAsia="fr-FR"/>
-          <w14:ligatures w14:val="none"/>
-        </w:rPr>
-        <w:t>_new</w:t>
-      </w:r>
-      <w:proofErr w:type="spellEnd"/>
-      <w:r>
-        <w:rPr>
-          <w:rFonts w:ascii="Times New Roman" w:eastAsia="Times New Roman" w:hAnsi="Times New Roman" w:cs="Times New Roman"/>
-          <w:kern w:val="0"/>
-          <w:sz w:val="24"/>
-          <w:szCs w:val="24"/>
-          <w:lang w:eastAsia="fr-FR"/>
-          <w14:ligatures w14:val="none"/>
-        </w:rPr>
-        <w:t xml:space="preserve"> = feature1 * feature2</w:t>
+        <w:t>feature_new = feature1 * feature2</w:t>
       </w:r>
     </w:p>
     <w:p>
@@ -6252,85 +4327,7 @@
           <w:lang w:eastAsia="fr-FR"/>
           <w14:ligatures w14:val="none"/>
         </w:rPr>
-        <w:t xml:space="preserve">Day </w:t>
-      </w:r>
-      <w:proofErr w:type="gramStart"/>
-      <w:r>
-        <w:rPr>
-          <w:rFonts w:ascii="Times New Roman" w:eastAsia="Times New Roman" w:hAnsi="Times New Roman" w:cs="Times New Roman"/>
-          <w:kern w:val="0"/>
-          <w:sz w:val="24"/>
-          <w:szCs w:val="24"/>
-          <w:highlight w:val="yellow"/>
-          <w:lang w:eastAsia="fr-FR"/>
-          <w14:ligatures w14:val="none"/>
-        </w:rPr>
-        <w:t>59:</w:t>
-      </w:r>
-      <w:proofErr w:type="gramEnd"/>
-      <w:r>
-        <w:rPr>
-          <w:rFonts w:ascii="Times New Roman" w:eastAsia="Times New Roman" w:hAnsi="Times New Roman" w:cs="Times New Roman"/>
-          <w:kern w:val="0"/>
-          <w:sz w:val="24"/>
-          <w:szCs w:val="24"/>
-          <w:highlight w:val="yellow"/>
-          <w:lang w:eastAsia="fr-FR"/>
-          <w14:ligatures w14:val="none"/>
-        </w:rPr>
-        <w:t xml:space="preserve"> </w:t>
-      </w:r>
-      <w:proofErr w:type="spellStart"/>
-      <w:r>
-        <w:rPr>
-          <w:rFonts w:ascii="Times New Roman" w:eastAsia="Times New Roman" w:hAnsi="Times New Roman" w:cs="Times New Roman"/>
-          <w:kern w:val="0"/>
-          <w:sz w:val="24"/>
-          <w:szCs w:val="24"/>
-          <w:highlight w:val="yellow"/>
-          <w:lang w:eastAsia="fr-FR"/>
-          <w14:ligatures w14:val="none"/>
-        </w:rPr>
-        <w:t>Feature</w:t>
-      </w:r>
-      <w:proofErr w:type="spellEnd"/>
-      <w:r>
-        <w:rPr>
-          <w:rFonts w:ascii="Times New Roman" w:eastAsia="Times New Roman" w:hAnsi="Times New Roman" w:cs="Times New Roman"/>
-          <w:kern w:val="0"/>
-          <w:sz w:val="24"/>
-          <w:szCs w:val="24"/>
-          <w:highlight w:val="yellow"/>
-          <w:lang w:eastAsia="fr-FR"/>
-          <w14:ligatures w14:val="none"/>
-        </w:rPr>
-        <w:t xml:space="preserve"> </w:t>
-      </w:r>
-      <w:proofErr w:type="spellStart"/>
-      <w:r>
-        <w:rPr>
-          <w:rFonts w:ascii="Times New Roman" w:eastAsia="Times New Roman" w:hAnsi="Times New Roman" w:cs="Times New Roman"/>
-          <w:kern w:val="0"/>
-          <w:sz w:val="24"/>
-          <w:szCs w:val="24"/>
-          <w:highlight w:val="yellow"/>
-          <w:lang w:eastAsia="fr-FR"/>
-          <w14:ligatures w14:val="none"/>
-        </w:rPr>
-        <w:t>selection</w:t>
-      </w:r>
-      <w:proofErr w:type="spellEnd"/>
-      <w:r>
-        <w:rPr>
-          <w:rFonts w:ascii="Times New Roman" w:eastAsia="Times New Roman" w:hAnsi="Times New Roman" w:cs="Times New Roman"/>
-          <w:kern w:val="0"/>
-          <w:sz w:val="24"/>
-          <w:szCs w:val="24"/>
-          <w:highlight w:val="yellow"/>
-          <w:lang w:eastAsia="fr-FR"/>
-          <w14:ligatures w14:val="none"/>
-        </w:rPr>
-        <w:t xml:space="preserve"> techniques</w:t>
+        <w:t>Day 59: Feature selection techniques</w:t>
       </w:r>
     </w:p>
     <w:p>
@@ -6389,63 +4386,7 @@
           <w:lang w:eastAsia="fr-FR"/>
           <w14:ligatures w14:val="none"/>
         </w:rPr>
-        <w:t>Days 61–</w:t>
-      </w:r>
-      <w:proofErr w:type="gramStart"/>
-      <w:r>
-        <w:rPr>
-          <w:rFonts w:ascii="Times New Roman" w:eastAsia="Times New Roman" w:hAnsi="Times New Roman" w:cs="Times New Roman"/>
-          <w:b/>
-          <w:bCs/>
-          <w:kern w:val="0"/>
-          <w:sz w:val="27"/>
-          <w:szCs w:val="27"/>
-          <w:lang w:eastAsia="fr-FR"/>
-          <w14:ligatures w14:val="none"/>
-        </w:rPr>
-        <w:t>65:</w:t>
-      </w:r>
-      <w:proofErr w:type="gramEnd"/>
-      <w:r>
-        <w:rPr>
-          <w:rFonts w:ascii="Times New Roman" w:eastAsia="Times New Roman" w:hAnsi="Times New Roman" w:cs="Times New Roman"/>
-          <w:b/>
-          <w:bCs/>
-          <w:kern w:val="0"/>
-          <w:sz w:val="27"/>
-          <w:szCs w:val="27"/>
-          <w:lang w:eastAsia="fr-FR"/>
-          <w14:ligatures w14:val="none"/>
-        </w:rPr>
-        <w:t xml:space="preserve"> Time </w:t>
-      </w:r>
-      <w:proofErr w:type="spellStart"/>
-      <w:r>
-        <w:rPr>
-          <w:rFonts w:ascii="Times New Roman" w:eastAsia="Times New Roman" w:hAnsi="Times New Roman" w:cs="Times New Roman"/>
-          <w:b/>
-          <w:bCs/>
-          <w:kern w:val="0"/>
-          <w:sz w:val="27"/>
-          <w:szCs w:val="27"/>
-          <w:lang w:eastAsia="fr-FR"/>
-          <w14:ligatures w14:val="none"/>
-        </w:rPr>
-        <w:t>Series</w:t>
-      </w:r>
-      <w:proofErr w:type="spellEnd"/>
-      <w:r>
-        <w:rPr>
-          <w:rFonts w:ascii="Times New Roman" w:eastAsia="Times New Roman" w:hAnsi="Times New Roman" w:cs="Times New Roman"/>
-          <w:b/>
-          <w:bCs/>
-          <w:kern w:val="0"/>
-          <w:sz w:val="27"/>
-          <w:szCs w:val="27"/>
-          <w:lang w:eastAsia="fr-FR"/>
-          <w14:ligatures w14:val="none"/>
-        </w:rPr>
-        <w:t xml:space="preserve"> Basics</w:t>
+        <w:t>Days 61–65: Time Series Basics</w:t>
       </w:r>
     </w:p>
     <w:p>
@@ -6529,69 +4470,8 @@
           <w:lang w:eastAsia="fr-FR"/>
           <w14:ligatures w14:val="none"/>
         </w:rPr>
-        <w:t xml:space="preserve">Day </w:t>
-      </w:r>
-      <w:proofErr w:type="gramStart"/>
-      <w:r>
-        <w:rPr>
-          <w:rFonts w:ascii="Times New Roman" w:eastAsia="Times New Roman" w:hAnsi="Times New Roman" w:cs="Times New Roman"/>
-          <w:kern w:val="0"/>
-          <w:sz w:val="24"/>
-          <w:szCs w:val="24"/>
-          <w:lang w:eastAsia="fr-FR"/>
-          <w14:ligatures w14:val="none"/>
-        </w:rPr>
-        <w:t>63:</w:t>
-      </w:r>
-      <w:proofErr w:type="gramEnd"/>
-      <w:r>
-        <w:rPr>
-          <w:rFonts w:ascii="Times New Roman" w:eastAsia="Times New Roman" w:hAnsi="Times New Roman" w:cs="Times New Roman"/>
-          <w:kern w:val="0"/>
-          <w:sz w:val="24"/>
-          <w:szCs w:val="24"/>
-          <w:lang w:eastAsia="fr-FR"/>
-          <w14:ligatures w14:val="none"/>
-        </w:rPr>
-        <w:t xml:space="preserve"> Moving </w:t>
-      </w:r>
-      <w:proofErr w:type="spellStart"/>
-      <w:r>
-        <w:rPr>
-          <w:rFonts w:ascii="Times New Roman" w:eastAsia="Times New Roman" w:hAnsi="Times New Roman" w:cs="Times New Roman"/>
-          <w:kern w:val="0"/>
-          <w:sz w:val="24"/>
-          <w:szCs w:val="24"/>
-          <w:lang w:eastAsia="fr-FR"/>
-          <w14:ligatures w14:val="none"/>
-        </w:rPr>
-        <w:t>averages</w:t>
-      </w:r>
-      <w:proofErr w:type="spellEnd"/>
-      <w:r>
-        <w:rPr>
-          <w:rFonts w:ascii="Times New Roman" w:eastAsia="Times New Roman" w:hAnsi="Times New Roman" w:cs="Times New Roman"/>
-          <w:kern w:val="0"/>
-          <w:sz w:val="24"/>
-          <w:szCs w:val="24"/>
-          <w:lang w:eastAsia="fr-FR"/>
-          <w14:ligatures w14:val="none"/>
-        </w:rPr>
-        <w:t xml:space="preserve">, </w:t>
-      </w:r>
-      <w:proofErr w:type="spellStart"/>
-      <w:r>
-        <w:rPr>
-          <w:rFonts w:ascii="Times New Roman" w:eastAsia="Times New Roman" w:hAnsi="Times New Roman" w:cs="Times New Roman"/>
-          <w:kern w:val="0"/>
-          <w:sz w:val="24"/>
-          <w:szCs w:val="24"/>
-          <w:lang w:eastAsia="fr-FR"/>
-          <w14:ligatures w14:val="none"/>
-        </w:rPr>
-        <w:t>differencing</w:t>
-      </w:r>
-      <w:proofErr w:type="spellEnd"/>
+        <w:t>Day 63: Moving averages, differencing</w:t>
+      </w:r>
     </w:p>
     <w:p>
       <w:pPr>
@@ -6618,69 +4498,8 @@
           <w:lang w:eastAsia="fr-FR"/>
           <w14:ligatures w14:val="none"/>
         </w:rPr>
-        <w:t xml:space="preserve">Day </w:t>
-      </w:r>
-      <w:proofErr w:type="gramStart"/>
-      <w:r>
-        <w:rPr>
-          <w:rFonts w:ascii="Times New Roman" w:eastAsia="Times New Roman" w:hAnsi="Times New Roman" w:cs="Times New Roman"/>
-          <w:kern w:val="0"/>
-          <w:sz w:val="24"/>
-          <w:szCs w:val="24"/>
-          <w:lang w:eastAsia="fr-FR"/>
-          <w14:ligatures w14:val="none"/>
-        </w:rPr>
-        <w:t>64:</w:t>
-      </w:r>
-      <w:proofErr w:type="gramEnd"/>
-      <w:r>
-        <w:rPr>
-          <w:rFonts w:ascii="Times New Roman" w:eastAsia="Times New Roman" w:hAnsi="Times New Roman" w:cs="Times New Roman"/>
-          <w:kern w:val="0"/>
-          <w:sz w:val="24"/>
-          <w:szCs w:val="24"/>
-          <w:lang w:eastAsia="fr-FR"/>
-          <w14:ligatures w14:val="none"/>
-        </w:rPr>
-        <w:t xml:space="preserve"> </w:t>
-      </w:r>
-      <w:proofErr w:type="spellStart"/>
-      <w:r>
-        <w:rPr>
-          <w:rFonts w:ascii="Times New Roman" w:eastAsia="Times New Roman" w:hAnsi="Times New Roman" w:cs="Times New Roman"/>
-          <w:kern w:val="0"/>
-          <w:sz w:val="24"/>
-          <w:szCs w:val="24"/>
-          <w:lang w:eastAsia="fr-FR"/>
-          <w14:ligatures w14:val="none"/>
-        </w:rPr>
-        <w:t>Autocorrelation</w:t>
-      </w:r>
-      <w:proofErr w:type="spellEnd"/>
-      <w:r>
-        <w:rPr>
-          <w:rFonts w:ascii="Times New Roman" w:eastAsia="Times New Roman" w:hAnsi="Times New Roman" w:cs="Times New Roman"/>
-          <w:kern w:val="0"/>
-          <w:sz w:val="24"/>
-          <w:szCs w:val="24"/>
-          <w:lang w:eastAsia="fr-FR"/>
-          <w14:ligatures w14:val="none"/>
-        </w:rPr>
-        <w:t xml:space="preserve">, </w:t>
-      </w:r>
-      <w:proofErr w:type="spellStart"/>
-      <w:r>
-        <w:rPr>
-          <w:rFonts w:ascii="Times New Roman" w:eastAsia="Times New Roman" w:hAnsi="Times New Roman" w:cs="Times New Roman"/>
-          <w:kern w:val="0"/>
-          <w:sz w:val="24"/>
-          <w:szCs w:val="24"/>
-          <w:lang w:eastAsia="fr-FR"/>
-          <w14:ligatures w14:val="none"/>
-        </w:rPr>
-        <w:t>stationarity</w:t>
-      </w:r>
-      <w:proofErr w:type="spellEnd"/>
+        <w:t>Day 64: Autocorrelation, stationarity</w:t>
+      </w:r>
     </w:p>
     <w:p>
       <w:pPr>
@@ -6730,19 +4549,11 @@
           <w:lang w:val="en-US"/>
         </w:rPr>
       </w:pPr>
-      <w:proofErr w:type="gramStart"/>
       <w:r>
         <w:rPr>
           <w:lang w:val="en-US"/>
         </w:rPr>
-        <w:t>Données :</w:t>
-      </w:r>
-      <w:proofErr w:type="gramEnd"/>
-      <w:r>
-        <w:rPr>
-          <w:lang w:val="en-US"/>
-        </w:rPr>
-        <w:t xml:space="preserve"> Open Power System Data, UK Power Consumption, etc.</w:t>
+        <w:t>Données : Open Power System Data, UK Power Consumption, etc.</w:t>
       </w:r>
     </w:p>
     <w:p>
@@ -6758,15 +4569,7 @@
         <w:ind w:left="360"/>
       </w:pPr>
       <w:r>
-        <w:t xml:space="preserve">Plus-value : Série temporelle, météo → </w:t>
-      </w:r>
-      <w:proofErr w:type="spellStart"/>
-      <w:r>
-        <w:t>features</w:t>
-      </w:r>
-      <w:proofErr w:type="spellEnd"/>
-      <w:r>
-        <w:t xml:space="preserve"> externes.</w:t>
+        <w:t>Plus-value : Série temporelle, météo → features externes.</w:t>
       </w:r>
     </w:p>
     <w:p>
@@ -6774,15 +4577,7 @@
         <w:ind w:left="360"/>
       </w:pPr>
       <w:r>
-        <w:t xml:space="preserve">Plus-value : Données spatio-temporelles → riche en </w:t>
-      </w:r>
-      <w:proofErr w:type="spellStart"/>
-      <w:r>
-        <w:t>feature</w:t>
-      </w:r>
-      <w:proofErr w:type="spellEnd"/>
-      <w:r>
-        <w:t xml:space="preserve"> engineering.</w:t>
+        <w:t>Plus-value : Données spatio-temporelles → riche en feature engineering.</w:t>
       </w:r>
     </w:p>
     <w:p>
@@ -6825,35 +4620,7 @@
           <w:lang w:eastAsia="fr-FR"/>
           <w14:ligatures w14:val="none"/>
         </w:rPr>
-        <w:t>Days 66–</w:t>
-      </w:r>
-      <w:proofErr w:type="gramStart"/>
-      <w:r>
-        <w:rPr>
-          <w:rFonts w:ascii="Times New Roman" w:eastAsia="Times New Roman" w:hAnsi="Times New Roman" w:cs="Times New Roman"/>
-          <w:b/>
-          <w:bCs/>
-          <w:kern w:val="0"/>
-          <w:sz w:val="27"/>
-          <w:szCs w:val="27"/>
-          <w:lang w:eastAsia="fr-FR"/>
-          <w14:ligatures w14:val="none"/>
-        </w:rPr>
-        <w:t>70:</w:t>
-      </w:r>
-      <w:proofErr w:type="gramEnd"/>
-      <w:r>
-        <w:rPr>
-          <w:rFonts w:ascii="Times New Roman" w:eastAsia="Times New Roman" w:hAnsi="Times New Roman" w:cs="Times New Roman"/>
-          <w:b/>
-          <w:bCs/>
-          <w:kern w:val="0"/>
-          <w:sz w:val="27"/>
-          <w:szCs w:val="27"/>
-          <w:lang w:eastAsia="fr-FR"/>
-          <w14:ligatures w14:val="none"/>
-        </w:rPr>
-        <w:t xml:space="preserve"> NLP Basics</w:t>
+        <w:t>Days 66–70: NLP Basics</w:t>
       </w:r>
     </w:p>
     <w:p>
@@ -6868,6 +4635,7 @@
           <w:kern w:val="0"/>
           <w:sz w:val="24"/>
           <w:szCs w:val="24"/>
+          <w:highlight w:val="yellow"/>
           <w:lang w:eastAsia="fr-FR"/>
           <w14:ligatures w14:val="none"/>
         </w:rPr>
@@ -6878,120 +4646,12 @@
           <w:kern w:val="0"/>
           <w:sz w:val="24"/>
           <w:szCs w:val="24"/>
+          <w:highlight w:val="yellow"/>
           <w:lang w:eastAsia="fr-FR"/>
           <w14:ligatures w14:val="none"/>
         </w:rPr>
-        <w:t xml:space="preserve">Day </w:t>
-      </w:r>
-      <w:proofErr w:type="gramStart"/>
-      <w:r>
-        <w:rPr>
-          <w:rFonts w:ascii="Times New Roman" w:eastAsia="Times New Roman" w:hAnsi="Times New Roman" w:cs="Times New Roman"/>
-          <w:kern w:val="0"/>
-          <w:sz w:val="24"/>
-          <w:szCs w:val="24"/>
-          <w:lang w:eastAsia="fr-FR"/>
-          <w14:ligatures w14:val="none"/>
-        </w:rPr>
-        <w:t>66:</w:t>
-      </w:r>
-      <w:proofErr w:type="gramEnd"/>
-      <w:r>
-        <w:rPr>
-          <w:rFonts w:ascii="Times New Roman" w:eastAsia="Times New Roman" w:hAnsi="Times New Roman" w:cs="Times New Roman"/>
-          <w:kern w:val="0"/>
-          <w:sz w:val="24"/>
-          <w:szCs w:val="24"/>
-          <w:lang w:eastAsia="fr-FR"/>
-          <w14:ligatures w14:val="none"/>
-        </w:rPr>
-        <w:t xml:space="preserve"> </w:t>
-      </w:r>
-      <w:proofErr w:type="spellStart"/>
-      <w:r>
-        <w:rPr>
-          <w:rFonts w:ascii="Times New Roman" w:eastAsia="Times New Roman" w:hAnsi="Times New Roman" w:cs="Times New Roman"/>
-          <w:kern w:val="0"/>
-          <w:sz w:val="24"/>
-          <w:szCs w:val="24"/>
-          <w:lang w:eastAsia="fr-FR"/>
-          <w14:ligatures w14:val="none"/>
-        </w:rPr>
-        <w:t>Text</w:t>
-      </w:r>
-      <w:proofErr w:type="spellEnd"/>
-      <w:r>
-        <w:rPr>
-          <w:rFonts w:ascii="Times New Roman" w:eastAsia="Times New Roman" w:hAnsi="Times New Roman" w:cs="Times New Roman"/>
-          <w:kern w:val="0"/>
-          <w:sz w:val="24"/>
-          <w:szCs w:val="24"/>
-          <w:lang w:eastAsia="fr-FR"/>
-          <w14:ligatures w14:val="none"/>
-        </w:rPr>
-        <w:t xml:space="preserve"> </w:t>
-      </w:r>
-      <w:proofErr w:type="spellStart"/>
-      <w:r>
-        <w:rPr>
-          <w:rFonts w:ascii="Times New Roman" w:eastAsia="Times New Roman" w:hAnsi="Times New Roman" w:cs="Times New Roman"/>
-          <w:kern w:val="0"/>
-          <w:sz w:val="24"/>
-          <w:szCs w:val="24"/>
-          <w:lang w:eastAsia="fr-FR"/>
-          <w14:ligatures w14:val="none"/>
-        </w:rPr>
-        <w:t>preprocessing</w:t>
-      </w:r>
-      <w:proofErr w:type="spellEnd"/>
-      <w:r>
-        <w:rPr>
-          <w:rFonts w:ascii="Times New Roman" w:eastAsia="Times New Roman" w:hAnsi="Times New Roman" w:cs="Times New Roman"/>
-          <w:kern w:val="0"/>
-          <w:sz w:val="24"/>
-          <w:szCs w:val="24"/>
-          <w:lang w:eastAsia="fr-FR"/>
-          <w14:ligatures w14:val="none"/>
-        </w:rPr>
-        <w:t xml:space="preserve"> – </w:t>
-      </w:r>
-      <w:proofErr w:type="spellStart"/>
-      <w:r>
-        <w:rPr>
-          <w:rFonts w:ascii="Times New Roman" w:eastAsia="Times New Roman" w:hAnsi="Times New Roman" w:cs="Times New Roman"/>
-          <w:kern w:val="0"/>
-          <w:sz w:val="24"/>
-          <w:szCs w:val="24"/>
-          <w:lang w:eastAsia="fr-FR"/>
-          <w14:ligatures w14:val="none"/>
-        </w:rPr>
-        <w:t>tokenization</w:t>
-      </w:r>
-      <w:proofErr w:type="spellEnd"/>
-      <w:r>
-        <w:rPr>
-          <w:rFonts w:ascii="Times New Roman" w:eastAsia="Times New Roman" w:hAnsi="Times New Roman" w:cs="Times New Roman"/>
-          <w:kern w:val="0"/>
-          <w:sz w:val="24"/>
-          <w:szCs w:val="24"/>
-          <w:lang w:eastAsia="fr-FR"/>
-          <w14:ligatures w14:val="none"/>
-        </w:rPr>
-        <w:t xml:space="preserve">, </w:t>
-      </w:r>
-      <w:proofErr w:type="spellStart"/>
-      <w:r>
-        <w:rPr>
-          <w:rFonts w:ascii="Times New Roman" w:eastAsia="Times New Roman" w:hAnsi="Times New Roman" w:cs="Times New Roman"/>
-          <w:kern w:val="0"/>
-          <w:sz w:val="24"/>
-          <w:szCs w:val="24"/>
-          <w:lang w:eastAsia="fr-FR"/>
-          <w14:ligatures w14:val="none"/>
-        </w:rPr>
-        <w:t>stopwords</w:t>
-      </w:r>
-      <w:proofErr w:type="spellEnd"/>
+        <w:t>Day 66: Text preprocessing – tokenization, stopwords</w:t>
+      </w:r>
     </w:p>
     <w:p>
       <w:pPr>
@@ -7005,20 +4665,34 @@
           <w:kern w:val="0"/>
           <w:sz w:val="24"/>
           <w:szCs w:val="24"/>
-          <w:lang w:val="en-US" w:eastAsia="fr-FR"/>
-          <w14:ligatures w14:val="none"/>
-        </w:rPr>
-      </w:pPr>
-      <w:r>
-        <w:rPr>
-          <w:rFonts w:ascii="Times New Roman" w:eastAsia="Times New Roman" w:hAnsi="Times New Roman" w:cs="Times New Roman"/>
-          <w:kern w:val="0"/>
-          <w:sz w:val="24"/>
-          <w:szCs w:val="24"/>
+          <w:highlight w:val="yellow"/>
+          <w:lang w:val="en-US" w:eastAsia="fr-FR"/>
+          <w14:ligatures w14:val="none"/>
+        </w:rPr>
+      </w:pPr>
+      <w:r>
+        <w:rPr>
+          <w:rFonts w:ascii="Times New Roman" w:eastAsia="Times New Roman" w:hAnsi="Times New Roman" w:cs="Times New Roman"/>
+          <w:kern w:val="0"/>
+          <w:sz w:val="24"/>
+          <w:szCs w:val="24"/>
+          <w:highlight w:val="yellow"/>
           <w:lang w:val="en-US" w:eastAsia="fr-FR"/>
           <w14:ligatures w14:val="none"/>
         </w:rPr>
         <w:t>Day 67: Bag of Words, TF-IDF</w:t>
+      </w:r>
+      <w:r>
+        <w:rPr>
+          <w:rFonts w:ascii="Times New Roman" w:eastAsia="Times New Roman" w:hAnsi="Times New Roman" w:cs="Times New Roman"/>
+          <w:kern w:val="0"/>
+          <w:sz w:val="24"/>
+          <w:szCs w:val="24"/>
+          <w:highlight w:val="yellow"/>
+          <w:lang w:val="en-US" w:eastAsia="fr-FR"/>
+          <w14:ligatures w14:val="none"/>
+        </w:rPr>
+        <w:t>, Word2Vec, Glove</w:t>
       </w:r>
     </w:p>
     <w:p>
@@ -7033,16 +4707,18 @@
           <w:kern w:val="0"/>
           <w:sz w:val="24"/>
           <w:szCs w:val="24"/>
-          <w:lang w:val="en-US" w:eastAsia="fr-FR"/>
-          <w14:ligatures w14:val="none"/>
-        </w:rPr>
-      </w:pPr>
-      <w:r>
-        <w:rPr>
-          <w:rFonts w:ascii="Times New Roman" w:eastAsia="Times New Roman" w:hAnsi="Times New Roman" w:cs="Times New Roman"/>
-          <w:kern w:val="0"/>
-          <w:sz w:val="24"/>
-          <w:szCs w:val="24"/>
+          <w:highlight w:val="yellow"/>
+          <w:lang w:val="en-US" w:eastAsia="fr-FR"/>
+          <w14:ligatures w14:val="none"/>
+        </w:rPr>
+      </w:pPr>
+      <w:r>
+        <w:rPr>
+          <w:rFonts w:ascii="Times New Roman" w:eastAsia="Times New Roman" w:hAnsi="Times New Roman" w:cs="Times New Roman"/>
+          <w:kern w:val="0"/>
+          <w:sz w:val="24"/>
+          <w:szCs w:val="24"/>
+          <w:highlight w:val="yellow"/>
           <w:lang w:val="en-US" w:eastAsia="fr-FR"/>
           <w14:ligatures w14:val="none"/>
         </w:rPr>
@@ -7061,6 +4737,7 @@
           <w:kern w:val="0"/>
           <w:sz w:val="24"/>
           <w:szCs w:val="24"/>
+          <w:highlight w:val="yellow"/>
           <w:lang w:eastAsia="fr-FR"/>
           <w14:ligatures w14:val="none"/>
         </w:rPr>
@@ -7071,72 +4748,12 @@
           <w:kern w:val="0"/>
           <w:sz w:val="24"/>
           <w:szCs w:val="24"/>
+          <w:highlight w:val="yellow"/>
           <w:lang w:eastAsia="fr-FR"/>
           <w14:ligatures w14:val="none"/>
         </w:rPr>
-        <w:t xml:space="preserve">Day </w:t>
-      </w:r>
-      <w:proofErr w:type="gramStart"/>
-      <w:r>
-        <w:rPr>
-          <w:rFonts w:ascii="Times New Roman" w:eastAsia="Times New Roman" w:hAnsi="Times New Roman" w:cs="Times New Roman"/>
-          <w:kern w:val="0"/>
-          <w:sz w:val="24"/>
-          <w:szCs w:val="24"/>
-          <w:lang w:eastAsia="fr-FR"/>
-          <w14:ligatures w14:val="none"/>
-        </w:rPr>
-        <w:t>69:</w:t>
-      </w:r>
-      <w:proofErr w:type="gramEnd"/>
-      <w:r>
-        <w:rPr>
-          <w:rFonts w:ascii="Times New Roman" w:eastAsia="Times New Roman" w:hAnsi="Times New Roman" w:cs="Times New Roman"/>
-          <w:kern w:val="0"/>
-          <w:sz w:val="24"/>
-          <w:szCs w:val="24"/>
-          <w:lang w:eastAsia="fr-FR"/>
-          <w14:ligatures w14:val="none"/>
-        </w:rPr>
-        <w:t xml:space="preserve"> Sentiment </w:t>
-      </w:r>
-      <w:proofErr w:type="spellStart"/>
-      <w:r>
-        <w:rPr>
-          <w:rFonts w:ascii="Times New Roman" w:eastAsia="Times New Roman" w:hAnsi="Times New Roman" w:cs="Times New Roman"/>
-          <w:kern w:val="0"/>
-          <w:sz w:val="24"/>
-          <w:szCs w:val="24"/>
-          <w:lang w:eastAsia="fr-FR"/>
-          <w14:ligatures w14:val="none"/>
-        </w:rPr>
-        <w:t>analysis</w:t>
-      </w:r>
-      <w:proofErr w:type="spellEnd"/>
-      <w:r>
-        <w:rPr>
-          <w:rFonts w:ascii="Times New Roman" w:eastAsia="Times New Roman" w:hAnsi="Times New Roman" w:cs="Times New Roman"/>
-          <w:kern w:val="0"/>
-          <w:sz w:val="24"/>
-          <w:szCs w:val="24"/>
-          <w:lang w:eastAsia="fr-FR"/>
-          <w14:ligatures w14:val="none"/>
-        </w:rPr>
-        <w:t xml:space="preserve"> </w:t>
-      </w:r>
-      <w:proofErr w:type="spellStart"/>
-      <w:r>
-        <w:rPr>
-          <w:rFonts w:ascii="Times New Roman" w:eastAsia="Times New Roman" w:hAnsi="Times New Roman" w:cs="Times New Roman"/>
-          <w:kern w:val="0"/>
-          <w:sz w:val="24"/>
-          <w:szCs w:val="24"/>
-          <w:lang w:eastAsia="fr-FR"/>
-          <w14:ligatures w14:val="none"/>
-        </w:rPr>
-        <w:t>project</w:t>
-      </w:r>
-      <w:proofErr w:type="spellEnd"/>
+        <w:t>Day 69: Sentiment analysis project</w:t>
+      </w:r>
     </w:p>
     <w:p>
       <w:pPr>
@@ -7145,30 +4762,6 @@
           <w:numId w:val="14"/>
         </w:numPr>
         <w:spacing w:before="100" w:beforeAutospacing="1" w:after="100" w:afterAutospacing="1" w:line="240" w:lineRule="auto"/>
-        <w:rPr>
-          <w:rFonts w:ascii="Times New Roman" w:eastAsia="Times New Roman" w:hAnsi="Times New Roman" w:cs="Times New Roman"/>
-          <w:kern w:val="0"/>
-          <w:sz w:val="24"/>
-          <w:szCs w:val="24"/>
-          <w:lang w:val="en-US" w:eastAsia="fr-FR"/>
-          <w14:ligatures w14:val="none"/>
-        </w:rPr>
-      </w:pPr>
-      <w:r>
-        <w:rPr>
-          <w:rFonts w:ascii="Times New Roman" w:eastAsia="Times New Roman" w:hAnsi="Times New Roman" w:cs="Times New Roman"/>
-          <w:kern w:val="0"/>
-          <w:sz w:val="24"/>
-          <w:szCs w:val="24"/>
-          <w:lang w:val="en-US" w:eastAsia="fr-FR"/>
-          <w14:ligatures w14:val="none"/>
-        </w:rPr>
-        <w:t>Day 70: Mini project: Classify movie reviews</w:t>
-      </w:r>
-    </w:p>
-    <w:p>
-      <w:pPr>
-        <w:spacing w:before="100" w:beforeAutospacing="1" w:after="100" w:afterAutospacing="1" w:line="240" w:lineRule="auto"/>
         <w:outlineLvl w:val="2"/>
         <w:rPr>
           <w:rFonts w:ascii="Times New Roman" w:eastAsia="Times New Roman" w:hAnsi="Times New Roman" w:cs="Times New Roman"/>
@@ -7184,6 +4777,21 @@
       <w:r>
         <w:rPr>
           <w:rFonts w:ascii="Times New Roman" w:eastAsia="Times New Roman" w:hAnsi="Times New Roman" w:cs="Times New Roman"/>
+          <w:kern w:val="0"/>
+          <w:sz w:val="24"/>
+          <w:szCs w:val="24"/>
+          <w:lang w:val="en-US" w:eastAsia="fr-FR"/>
+          <w14:ligatures w14:val="none"/>
+        </w:rPr>
+        <w:t>Day 70: Mini project</w:t>
+      </w:r>
+    </w:p>
+    <w:p>
+      <w:pPr>
+        <w:spacing w:before="100" w:beforeAutospacing="1" w:after="100" w:afterAutospacing="1" w:line="240" w:lineRule="auto"/>
+        <w:outlineLvl w:val="2"/>
+        <w:rPr>
+          <w:rFonts w:ascii="Times New Roman" w:eastAsia="Times New Roman" w:hAnsi="Times New Roman" w:cs="Times New Roman"/>
           <w:b/>
           <w:bCs/>
           <w:kern w:val="0"/>
@@ -7192,10 +4800,13 @@
           <w:lang w:eastAsia="fr-FR"/>
           <w14:ligatures w14:val="none"/>
         </w:rPr>
-        <w:t>Days 71–</w:t>
-      </w:r>
-      <w:proofErr w:type="gramStart"/>
-      <w:r>
+      </w:pPr>
+    </w:p>
+    <w:p>
+      <w:pPr>
+        <w:spacing w:before="100" w:beforeAutospacing="1" w:after="100" w:afterAutospacing="1" w:line="240" w:lineRule="auto"/>
+        <w:ind w:left="360"/>
+        <w:outlineLvl w:val="2"/>
         <w:rPr>
           <w:rFonts w:ascii="Times New Roman" w:eastAsia="Times New Roman" w:hAnsi="Times New Roman" w:cs="Times New Roman"/>
           <w:b/>
@@ -7206,9 +4817,7 @@
           <w:lang w:eastAsia="fr-FR"/>
           <w14:ligatures w14:val="none"/>
         </w:rPr>
-        <w:t>75:</w:t>
-      </w:r>
-      <w:proofErr w:type="gramEnd"/>
+      </w:pPr>
       <w:r>
         <w:rPr>
           <w:rFonts w:ascii="Times New Roman" w:eastAsia="Times New Roman" w:hAnsi="Times New Roman" w:cs="Times New Roman"/>
@@ -7220,7 +4829,7 @@
           <w:lang w:eastAsia="fr-FR"/>
           <w14:ligatures w14:val="none"/>
         </w:rPr>
-        <w:t xml:space="preserve"> Deep Learning Basics</w:t>
+        <w:t>Days 71–75: Deep Learning Basics</w:t>
       </w:r>
     </w:p>
     <w:p>
@@ -7252,7 +4861,6 @@
         </w:rPr>
         <w:t xml:space="preserve">Day 71: What is deep learning? </w:t>
       </w:r>
-      <w:proofErr w:type="spellStart"/>
       <w:r>
         <w:rPr>
           <w:rFonts w:ascii="Times New Roman" w:eastAsia="Times New Roman" w:hAnsi="Times New Roman" w:cs="Times New Roman"/>
@@ -7263,35 +4871,8 @@
           <w:lang w:eastAsia="fr-FR"/>
           <w14:ligatures w14:val="none"/>
         </w:rPr>
-        <w:t>Neurons</w:t>
-      </w:r>
-      <w:proofErr w:type="spellEnd"/>
-      <w:r>
-        <w:rPr>
-          <w:rFonts w:ascii="Times New Roman" w:eastAsia="Times New Roman" w:hAnsi="Times New Roman" w:cs="Times New Roman"/>
-          <w:kern w:val="0"/>
-          <w:sz w:val="24"/>
-          <w:szCs w:val="24"/>
-          <w:highlight w:val="yellow"/>
-          <w:lang w:eastAsia="fr-FR"/>
-          <w14:ligatures w14:val="none"/>
-        </w:rPr>
-        <w:t xml:space="preserve">, </w:t>
-      </w:r>
-      <w:proofErr w:type="spellStart"/>
-      <w:r>
-        <w:rPr>
-          <w:rFonts w:ascii="Times New Roman" w:eastAsia="Times New Roman" w:hAnsi="Times New Roman" w:cs="Times New Roman"/>
-          <w:kern w:val="0"/>
-          <w:sz w:val="24"/>
-          <w:szCs w:val="24"/>
-          <w:highlight w:val="yellow"/>
-          <w:lang w:eastAsia="fr-FR"/>
-          <w14:ligatures w14:val="none"/>
-        </w:rPr>
-        <w:t>layers</w:t>
-      </w:r>
-      <w:proofErr w:type="spellEnd"/>
+        <w:t>Neurons, layers</w:t>
+      </w:r>
     </w:p>
     <w:p>
       <w:pPr>
@@ -7320,48 +4901,8 @@
           <w:lang w:eastAsia="fr-FR"/>
           <w14:ligatures w14:val="none"/>
         </w:rPr>
-        <w:t xml:space="preserve">Day </w:t>
-      </w:r>
-      <w:proofErr w:type="gramStart"/>
-      <w:r>
-        <w:rPr>
-          <w:rFonts w:ascii="Times New Roman" w:eastAsia="Times New Roman" w:hAnsi="Times New Roman" w:cs="Times New Roman"/>
-          <w:kern w:val="0"/>
-          <w:sz w:val="24"/>
-          <w:szCs w:val="24"/>
-          <w:highlight w:val="yellow"/>
-          <w:lang w:eastAsia="fr-FR"/>
-          <w14:ligatures w14:val="none"/>
-        </w:rPr>
-        <w:t>72:</w:t>
-      </w:r>
-      <w:proofErr w:type="gramEnd"/>
-      <w:r>
-        <w:rPr>
-          <w:rFonts w:ascii="Times New Roman" w:eastAsia="Times New Roman" w:hAnsi="Times New Roman" w:cs="Times New Roman"/>
-          <w:kern w:val="0"/>
-          <w:sz w:val="24"/>
-          <w:szCs w:val="24"/>
-          <w:highlight w:val="yellow"/>
-          <w:lang w:eastAsia="fr-FR"/>
-          <w14:ligatures w14:val="none"/>
-        </w:rPr>
-        <w:t xml:space="preserve"> Intro to </w:t>
-      </w:r>
-      <w:proofErr w:type="spellStart"/>
-      <w:r>
-        <w:rPr>
-          <w:rFonts w:ascii="Times New Roman" w:eastAsia="Times New Roman" w:hAnsi="Times New Roman" w:cs="Times New Roman"/>
-          <w:kern w:val="0"/>
-          <w:sz w:val="24"/>
-          <w:szCs w:val="24"/>
-          <w:highlight w:val="yellow"/>
-          <w:lang w:eastAsia="fr-FR"/>
-          <w14:ligatures w14:val="none"/>
-        </w:rPr>
-        <w:t>PyTorch</w:t>
-      </w:r>
-      <w:proofErr w:type="spellEnd"/>
+        <w:t>Day 72: Intro to PyTorch</w:t>
+      </w:r>
     </w:p>
     <w:p>
       <w:pPr>
@@ -7420,74 +4961,8 @@
           <w:lang w:eastAsia="fr-FR"/>
           <w14:ligatures w14:val="none"/>
         </w:rPr>
-        <w:t xml:space="preserve">Day </w:t>
-      </w:r>
-      <w:proofErr w:type="gramStart"/>
-      <w:r>
-        <w:rPr>
-          <w:rFonts w:ascii="Times New Roman" w:eastAsia="Times New Roman" w:hAnsi="Times New Roman" w:cs="Times New Roman"/>
-          <w:kern w:val="0"/>
-          <w:sz w:val="24"/>
-          <w:szCs w:val="24"/>
-          <w:highlight w:val="yellow"/>
-          <w:lang w:eastAsia="fr-FR"/>
-          <w14:ligatures w14:val="none"/>
-        </w:rPr>
-        <w:t>74:</w:t>
-      </w:r>
-      <w:proofErr w:type="gramEnd"/>
-      <w:r>
-        <w:rPr>
-          <w:rFonts w:ascii="Times New Roman" w:eastAsia="Times New Roman" w:hAnsi="Times New Roman" w:cs="Times New Roman"/>
-          <w:kern w:val="0"/>
-          <w:sz w:val="24"/>
-          <w:szCs w:val="24"/>
-          <w:highlight w:val="yellow"/>
-          <w:lang w:eastAsia="fr-FR"/>
-          <w14:ligatures w14:val="none"/>
-        </w:rPr>
-        <w:t xml:space="preserve"> Training </w:t>
-      </w:r>
-      <w:proofErr w:type="spellStart"/>
-      <w:r>
-        <w:rPr>
-          <w:rFonts w:ascii="Times New Roman" w:eastAsia="Times New Roman" w:hAnsi="Times New Roman" w:cs="Times New Roman"/>
-          <w:kern w:val="0"/>
-          <w:sz w:val="24"/>
-          <w:szCs w:val="24"/>
-          <w:highlight w:val="yellow"/>
-          <w:lang w:eastAsia="fr-FR"/>
-          <w14:ligatures w14:val="none"/>
-        </w:rPr>
-        <w:t>loop</w:t>
-      </w:r>
-      <w:proofErr w:type="spellEnd"/>
-      <w:r>
-        <w:rPr>
-          <w:rFonts w:ascii="Times New Roman" w:eastAsia="Times New Roman" w:hAnsi="Times New Roman" w:cs="Times New Roman"/>
-          <w:kern w:val="0"/>
-          <w:sz w:val="24"/>
-          <w:szCs w:val="24"/>
-          <w:highlight w:val="yellow"/>
-          <w:lang w:eastAsia="fr-FR"/>
-          <w14:ligatures w14:val="none"/>
-        </w:rPr>
-        <w:t xml:space="preserve">, </w:t>
-      </w:r>
-      <w:proofErr w:type="spellStart"/>
-      <w:r>
-        <w:rPr>
-          <w:rFonts w:ascii="Times New Roman" w:eastAsia="Times New Roman" w:hAnsi="Times New Roman" w:cs="Times New Roman"/>
-          <w:kern w:val="0"/>
-          <w:sz w:val="24"/>
-          <w:szCs w:val="24"/>
-          <w:highlight w:val="yellow"/>
-          <w:lang w:eastAsia="fr-FR"/>
-          <w14:ligatures w14:val="none"/>
-        </w:rPr>
-        <w:t>backpropagation</w:t>
-      </w:r>
-      <w:proofErr w:type="spellEnd"/>
+        <w:t>Day 74: Training loop, backpropagation</w:t>
+      </w:r>
     </w:p>
     <w:p>
       <w:pPr>
@@ -7516,73 +4991,7 @@
           <w:lang w:eastAsia="fr-FR"/>
           <w14:ligatures w14:val="none"/>
         </w:rPr>
-        <w:t xml:space="preserve">Day </w:t>
-      </w:r>
-      <w:proofErr w:type="gramStart"/>
-      <w:r>
-        <w:rPr>
-          <w:rFonts w:ascii="Times New Roman" w:eastAsia="Times New Roman" w:hAnsi="Times New Roman" w:cs="Times New Roman"/>
-          <w:kern w:val="0"/>
-          <w:sz w:val="24"/>
-          <w:szCs w:val="24"/>
-          <w:highlight w:val="yellow"/>
-          <w:lang w:eastAsia="fr-FR"/>
-          <w14:ligatures w14:val="none"/>
-        </w:rPr>
-        <w:t>75:</w:t>
-      </w:r>
-      <w:proofErr w:type="gramEnd"/>
-      <w:r>
-        <w:rPr>
-          <w:rFonts w:ascii="Times New Roman" w:eastAsia="Times New Roman" w:hAnsi="Times New Roman" w:cs="Times New Roman"/>
-          <w:kern w:val="0"/>
-          <w:sz w:val="24"/>
-          <w:szCs w:val="24"/>
-          <w:highlight w:val="yellow"/>
-          <w:lang w:eastAsia="fr-FR"/>
-          <w14:ligatures w14:val="none"/>
-        </w:rPr>
-        <w:t xml:space="preserve"> Mini </w:t>
-      </w:r>
-      <w:proofErr w:type="spellStart"/>
-      <w:proofErr w:type="gramStart"/>
-      <w:r>
-        <w:rPr>
-          <w:rFonts w:ascii="Times New Roman" w:eastAsia="Times New Roman" w:hAnsi="Times New Roman" w:cs="Times New Roman"/>
-          <w:kern w:val="0"/>
-          <w:sz w:val="24"/>
-          <w:szCs w:val="24"/>
-          <w:highlight w:val="yellow"/>
-          <w:lang w:eastAsia="fr-FR"/>
-          <w14:ligatures w14:val="none"/>
-        </w:rPr>
-        <w:t>project</w:t>
-      </w:r>
-      <w:proofErr w:type="spellEnd"/>
-      <w:r>
-        <w:rPr>
-          <w:rFonts w:ascii="Times New Roman" w:eastAsia="Times New Roman" w:hAnsi="Times New Roman" w:cs="Times New Roman"/>
-          <w:kern w:val="0"/>
-          <w:sz w:val="24"/>
-          <w:szCs w:val="24"/>
-          <w:highlight w:val="yellow"/>
-          <w:lang w:eastAsia="fr-FR"/>
-          <w14:ligatures w14:val="none"/>
-        </w:rPr>
-        <w:t>:</w:t>
-      </w:r>
-      <w:proofErr w:type="gramEnd"/>
-      <w:r>
-        <w:rPr>
-          <w:rFonts w:ascii="Times New Roman" w:eastAsia="Times New Roman" w:hAnsi="Times New Roman" w:cs="Times New Roman"/>
-          <w:kern w:val="0"/>
-          <w:sz w:val="24"/>
-          <w:szCs w:val="24"/>
-          <w:highlight w:val="yellow"/>
-          <w:lang w:eastAsia="fr-FR"/>
-          <w14:ligatures w14:val="none"/>
-        </w:rPr>
-        <w:t xml:space="preserve"> Digit recognition</w:t>
+        <w:t>Day 75: Mini project: Digit recognition</w:t>
       </w:r>
     </w:p>
     <w:p>

</xml_diff>

<commit_message>
object oriented programming : classes, objects, methods , attributes, init constructor
</commit_message>
<xml_diff>
--- a/Plan.docx
+++ b/Plan.docx
@@ -41,7 +41,35 @@
           <w:lang w:val="en-US" w:eastAsia="fr-FR"/>
           <w14:ligatures w14:val="none"/>
         </w:rPr>
-        <w:t xml:space="preserve"> Phase 1: Python &amp; Math Foundations (Days 1–20)</w:t>
+        <w:t xml:space="preserve"> Phase </w:t>
+      </w:r>
+      <w:proofErr w:type="gramStart"/>
+      <w:r>
+        <w:rPr>
+          <w:rFonts w:ascii="Times New Roman" w:eastAsia="Times New Roman" w:hAnsi="Times New Roman" w:cs="Times New Roman"/>
+          <w:b/>
+          <w:bCs/>
+          <w:kern w:val="0"/>
+          <w:sz w:val="36"/>
+          <w:szCs w:val="36"/>
+          <w:lang w:val="en-US" w:eastAsia="fr-FR"/>
+          <w14:ligatures w14:val="none"/>
+        </w:rPr>
+        <w:t>1:</w:t>
+      </w:r>
+      <w:proofErr w:type="gramEnd"/>
+      <w:r>
+        <w:rPr>
+          <w:rFonts w:ascii="Times New Roman" w:eastAsia="Times New Roman" w:hAnsi="Times New Roman" w:cs="Times New Roman"/>
+          <w:b/>
+          <w:bCs/>
+          <w:kern w:val="0"/>
+          <w:sz w:val="36"/>
+          <w:szCs w:val="36"/>
+          <w:lang w:val="en-US" w:eastAsia="fr-FR"/>
+          <w14:ligatures w14:val="none"/>
+        </w:rPr>
+        <w:t xml:space="preserve"> Python &amp; Math Foundations (Days 1–20)</w:t>
       </w:r>
     </w:p>
     <w:p>
@@ -70,7 +98,35 @@
           <w:lang w:eastAsia="fr-FR"/>
           <w14:ligatures w14:val="none"/>
         </w:rPr>
-        <w:t>Days 1–5: Python for Data Science</w:t>
+        <w:t>Days 1–</w:t>
+      </w:r>
+      <w:proofErr w:type="gramStart"/>
+      <w:r>
+        <w:rPr>
+          <w:rFonts w:ascii="Times New Roman" w:eastAsia="Times New Roman" w:hAnsi="Times New Roman" w:cs="Times New Roman"/>
+          <w:b/>
+          <w:bCs/>
+          <w:kern w:val="0"/>
+          <w:sz w:val="27"/>
+          <w:szCs w:val="27"/>
+          <w:lang w:eastAsia="fr-FR"/>
+          <w14:ligatures w14:val="none"/>
+        </w:rPr>
+        <w:t>5:</w:t>
+      </w:r>
+      <w:proofErr w:type="gramEnd"/>
+      <w:r>
+        <w:rPr>
+          <w:rFonts w:ascii="Times New Roman" w:eastAsia="Times New Roman" w:hAnsi="Times New Roman" w:cs="Times New Roman"/>
+          <w:b/>
+          <w:bCs/>
+          <w:kern w:val="0"/>
+          <w:sz w:val="27"/>
+          <w:szCs w:val="27"/>
+          <w:lang w:eastAsia="fr-FR"/>
+          <w14:ligatures w14:val="none"/>
+        </w:rPr>
+        <w:t xml:space="preserve"> Python for Data Science</w:t>
       </w:r>
     </w:p>
     <w:p>
@@ -130,8 +186,100 @@
           <w:lang w:eastAsia="fr-FR"/>
           <w14:ligatures w14:val="none"/>
         </w:rPr>
-        <w:t>Day 2: Lists, dictionaries, sets, tuples – practice exercises</w:t>
-      </w:r>
+        <w:t xml:space="preserve">Day </w:t>
+      </w:r>
+      <w:proofErr w:type="gramStart"/>
+      <w:r>
+        <w:rPr>
+          <w:rFonts w:ascii="Times New Roman" w:eastAsia="Times New Roman" w:hAnsi="Times New Roman" w:cs="Times New Roman"/>
+          <w:kern w:val="0"/>
+          <w:sz w:val="24"/>
+          <w:szCs w:val="24"/>
+          <w:highlight w:val="yellow"/>
+          <w:lang w:eastAsia="fr-FR"/>
+          <w14:ligatures w14:val="none"/>
+        </w:rPr>
+        <w:t>2:</w:t>
+      </w:r>
+      <w:proofErr w:type="gramEnd"/>
+      <w:r>
+        <w:rPr>
+          <w:rFonts w:ascii="Times New Roman" w:eastAsia="Times New Roman" w:hAnsi="Times New Roman" w:cs="Times New Roman"/>
+          <w:kern w:val="0"/>
+          <w:sz w:val="24"/>
+          <w:szCs w:val="24"/>
+          <w:highlight w:val="yellow"/>
+          <w:lang w:eastAsia="fr-FR"/>
+          <w14:ligatures w14:val="none"/>
+        </w:rPr>
+        <w:t xml:space="preserve"> </w:t>
+      </w:r>
+      <w:proofErr w:type="spellStart"/>
+      <w:r>
+        <w:rPr>
+          <w:rFonts w:ascii="Times New Roman" w:eastAsia="Times New Roman" w:hAnsi="Times New Roman" w:cs="Times New Roman"/>
+          <w:kern w:val="0"/>
+          <w:sz w:val="24"/>
+          <w:szCs w:val="24"/>
+          <w:highlight w:val="yellow"/>
+          <w:lang w:eastAsia="fr-FR"/>
+          <w14:ligatures w14:val="none"/>
+        </w:rPr>
+        <w:t>Lists</w:t>
+      </w:r>
+      <w:proofErr w:type="spellEnd"/>
+      <w:r>
+        <w:rPr>
+          <w:rFonts w:ascii="Times New Roman" w:eastAsia="Times New Roman" w:hAnsi="Times New Roman" w:cs="Times New Roman"/>
+          <w:kern w:val="0"/>
+          <w:sz w:val="24"/>
+          <w:szCs w:val="24"/>
+          <w:highlight w:val="yellow"/>
+          <w:lang w:eastAsia="fr-FR"/>
+          <w14:ligatures w14:val="none"/>
+        </w:rPr>
+        <w:t xml:space="preserve">, </w:t>
+      </w:r>
+      <w:proofErr w:type="spellStart"/>
+      <w:r>
+        <w:rPr>
+          <w:rFonts w:ascii="Times New Roman" w:eastAsia="Times New Roman" w:hAnsi="Times New Roman" w:cs="Times New Roman"/>
+          <w:kern w:val="0"/>
+          <w:sz w:val="24"/>
+          <w:szCs w:val="24"/>
+          <w:highlight w:val="yellow"/>
+          <w:lang w:eastAsia="fr-FR"/>
+          <w14:ligatures w14:val="none"/>
+        </w:rPr>
+        <w:t>dictionaries</w:t>
+      </w:r>
+      <w:proofErr w:type="spellEnd"/>
+      <w:r>
+        <w:rPr>
+          <w:rFonts w:ascii="Times New Roman" w:eastAsia="Times New Roman" w:hAnsi="Times New Roman" w:cs="Times New Roman"/>
+          <w:kern w:val="0"/>
+          <w:sz w:val="24"/>
+          <w:szCs w:val="24"/>
+          <w:highlight w:val="yellow"/>
+          <w:lang w:eastAsia="fr-FR"/>
+          <w14:ligatures w14:val="none"/>
+        </w:rPr>
+        <w:t xml:space="preserve">, sets, tuples – practice </w:t>
+      </w:r>
+      <w:proofErr w:type="spellStart"/>
+      <w:r>
+        <w:rPr>
+          <w:rFonts w:ascii="Times New Roman" w:eastAsia="Times New Roman" w:hAnsi="Times New Roman" w:cs="Times New Roman"/>
+          <w:kern w:val="0"/>
+          <w:sz w:val="24"/>
+          <w:szCs w:val="24"/>
+          <w:highlight w:val="yellow"/>
+          <w:lang w:eastAsia="fr-FR"/>
+          <w14:ligatures w14:val="none"/>
+        </w:rPr>
+        <w:t>exercises</w:t>
+      </w:r>
+      <w:proofErr w:type="spellEnd"/>
     </w:p>
     <w:p>
       <w:pPr>
@@ -190,7 +338,33 @@
           <w:lang w:val="en-US" w:eastAsia="fr-FR"/>
           <w14:ligatures w14:val="none"/>
         </w:rPr>
-        <w:t>Day 4: File handling, modules, intro to Jupyter Notebook</w:t>
+        <w:t xml:space="preserve">Day 4: File handling, modules, intro to </w:t>
+      </w:r>
+      <w:proofErr w:type="spellStart"/>
+      <w:r>
+        <w:rPr>
+          <w:rFonts w:ascii="Times New Roman" w:eastAsia="Times New Roman" w:hAnsi="Times New Roman" w:cs="Times New Roman"/>
+          <w:kern w:val="0"/>
+          <w:sz w:val="24"/>
+          <w:szCs w:val="24"/>
+          <w:highlight w:val="yellow"/>
+          <w:lang w:val="en-US" w:eastAsia="fr-FR"/>
+          <w14:ligatures w14:val="none"/>
+        </w:rPr>
+        <w:t>Jupyter</w:t>
+      </w:r>
+      <w:proofErr w:type="spellEnd"/>
+      <w:r>
+        <w:rPr>
+          <w:rFonts w:ascii="Times New Roman" w:eastAsia="Times New Roman" w:hAnsi="Times New Roman" w:cs="Times New Roman"/>
+          <w:kern w:val="0"/>
+          <w:sz w:val="24"/>
+          <w:szCs w:val="24"/>
+          <w:highlight w:val="yellow"/>
+          <w:lang w:val="en-US" w:eastAsia="fr-FR"/>
+          <w14:ligatures w14:val="none"/>
+        </w:rPr>
+        <w:t xml:space="preserve"> Notebook</w:t>
       </w:r>
     </w:p>
     <w:p>
@@ -249,7 +423,63 @@
           <w:lang w:eastAsia="fr-FR"/>
           <w14:ligatures w14:val="none"/>
         </w:rPr>
-        <w:t>Days 6–10: Numpy &amp; Pandas</w:t>
+        <w:t>Days 6–</w:t>
+      </w:r>
+      <w:proofErr w:type="gramStart"/>
+      <w:r>
+        <w:rPr>
+          <w:rFonts w:ascii="Times New Roman" w:eastAsia="Times New Roman" w:hAnsi="Times New Roman" w:cs="Times New Roman"/>
+          <w:b/>
+          <w:bCs/>
+          <w:kern w:val="0"/>
+          <w:sz w:val="27"/>
+          <w:szCs w:val="27"/>
+          <w:lang w:eastAsia="fr-FR"/>
+          <w14:ligatures w14:val="none"/>
+        </w:rPr>
+        <w:t>10:</w:t>
+      </w:r>
+      <w:proofErr w:type="gramEnd"/>
+      <w:r>
+        <w:rPr>
+          <w:rFonts w:ascii="Times New Roman" w:eastAsia="Times New Roman" w:hAnsi="Times New Roman" w:cs="Times New Roman"/>
+          <w:b/>
+          <w:bCs/>
+          <w:kern w:val="0"/>
+          <w:sz w:val="27"/>
+          <w:szCs w:val="27"/>
+          <w:lang w:eastAsia="fr-FR"/>
+          <w14:ligatures w14:val="none"/>
+        </w:rPr>
+        <w:t xml:space="preserve"> </w:t>
+      </w:r>
+      <w:proofErr w:type="spellStart"/>
+      <w:r>
+        <w:rPr>
+          <w:rFonts w:ascii="Times New Roman" w:eastAsia="Times New Roman" w:hAnsi="Times New Roman" w:cs="Times New Roman"/>
+          <w:b/>
+          <w:bCs/>
+          <w:kern w:val="0"/>
+          <w:sz w:val="27"/>
+          <w:szCs w:val="27"/>
+          <w:lang w:eastAsia="fr-FR"/>
+          <w14:ligatures w14:val="none"/>
+        </w:rPr>
+        <w:t>Numpy</w:t>
+      </w:r>
+      <w:proofErr w:type="spellEnd"/>
+      <w:r>
+        <w:rPr>
+          <w:rFonts w:ascii="Times New Roman" w:eastAsia="Times New Roman" w:hAnsi="Times New Roman" w:cs="Times New Roman"/>
+          <w:b/>
+          <w:bCs/>
+          <w:kern w:val="0"/>
+          <w:sz w:val="27"/>
+          <w:szCs w:val="27"/>
+          <w:lang w:eastAsia="fr-FR"/>
+          <w14:ligatures w14:val="none"/>
+        </w:rPr>
+        <w:t xml:space="preserve"> &amp; Pandas</w:t>
       </w:r>
     </w:p>
     <w:p>
@@ -279,7 +509,111 @@
           <w:lang w:eastAsia="fr-FR"/>
           <w14:ligatures w14:val="none"/>
         </w:rPr>
-        <w:t>Day 6: NumPy arrays, operations, broadcasting</w:t>
+        <w:t xml:space="preserve">Day </w:t>
+      </w:r>
+      <w:proofErr w:type="gramStart"/>
+      <w:r>
+        <w:rPr>
+          <w:rFonts w:ascii="Times New Roman" w:eastAsia="Times New Roman" w:hAnsi="Times New Roman" w:cs="Times New Roman"/>
+          <w:kern w:val="0"/>
+          <w:sz w:val="24"/>
+          <w:szCs w:val="24"/>
+          <w:highlight w:val="yellow"/>
+          <w:lang w:eastAsia="fr-FR"/>
+          <w14:ligatures w14:val="none"/>
+        </w:rPr>
+        <w:t>6:</w:t>
+      </w:r>
+      <w:proofErr w:type="gramEnd"/>
+      <w:r>
+        <w:rPr>
+          <w:rFonts w:ascii="Times New Roman" w:eastAsia="Times New Roman" w:hAnsi="Times New Roman" w:cs="Times New Roman"/>
+          <w:kern w:val="0"/>
+          <w:sz w:val="24"/>
+          <w:szCs w:val="24"/>
+          <w:highlight w:val="yellow"/>
+          <w:lang w:eastAsia="fr-FR"/>
+          <w14:ligatures w14:val="none"/>
+        </w:rPr>
+        <w:t xml:space="preserve"> </w:t>
+      </w:r>
+      <w:proofErr w:type="spellStart"/>
+      <w:r>
+        <w:rPr>
+          <w:rFonts w:ascii="Times New Roman" w:eastAsia="Times New Roman" w:hAnsi="Times New Roman" w:cs="Times New Roman"/>
+          <w:kern w:val="0"/>
+          <w:sz w:val="24"/>
+          <w:szCs w:val="24"/>
+          <w:highlight w:val="yellow"/>
+          <w:lang w:eastAsia="fr-FR"/>
+          <w14:ligatures w14:val="none"/>
+        </w:rPr>
+        <w:t>NumPy</w:t>
+      </w:r>
+      <w:proofErr w:type="spellEnd"/>
+      <w:r>
+        <w:rPr>
+          <w:rFonts w:ascii="Times New Roman" w:eastAsia="Times New Roman" w:hAnsi="Times New Roman" w:cs="Times New Roman"/>
+          <w:kern w:val="0"/>
+          <w:sz w:val="24"/>
+          <w:szCs w:val="24"/>
+          <w:highlight w:val="yellow"/>
+          <w:lang w:eastAsia="fr-FR"/>
+          <w14:ligatures w14:val="none"/>
+        </w:rPr>
+        <w:t xml:space="preserve"> </w:t>
+      </w:r>
+      <w:proofErr w:type="spellStart"/>
+      <w:r>
+        <w:rPr>
+          <w:rFonts w:ascii="Times New Roman" w:eastAsia="Times New Roman" w:hAnsi="Times New Roman" w:cs="Times New Roman"/>
+          <w:kern w:val="0"/>
+          <w:sz w:val="24"/>
+          <w:szCs w:val="24"/>
+          <w:highlight w:val="yellow"/>
+          <w:lang w:eastAsia="fr-FR"/>
+          <w14:ligatures w14:val="none"/>
+        </w:rPr>
+        <w:t>arrays</w:t>
+      </w:r>
+      <w:proofErr w:type="spellEnd"/>
+      <w:r>
+        <w:rPr>
+          <w:rFonts w:ascii="Times New Roman" w:eastAsia="Times New Roman" w:hAnsi="Times New Roman" w:cs="Times New Roman"/>
+          <w:kern w:val="0"/>
+          <w:sz w:val="24"/>
+          <w:szCs w:val="24"/>
+          <w:highlight w:val="yellow"/>
+          <w:lang w:eastAsia="fr-FR"/>
+          <w14:ligatures w14:val="none"/>
+        </w:rPr>
+        <w:t xml:space="preserve">, </w:t>
+      </w:r>
+      <w:proofErr w:type="spellStart"/>
+      <w:r>
+        <w:rPr>
+          <w:rFonts w:ascii="Times New Roman" w:eastAsia="Times New Roman" w:hAnsi="Times New Roman" w:cs="Times New Roman"/>
+          <w:kern w:val="0"/>
+          <w:sz w:val="24"/>
+          <w:szCs w:val="24"/>
+          <w:highlight w:val="yellow"/>
+          <w:lang w:eastAsia="fr-FR"/>
+          <w14:ligatures w14:val="none"/>
+        </w:rPr>
+        <w:t>operations</w:t>
+      </w:r>
+      <w:proofErr w:type="spellEnd"/>
+      <w:r>
+        <w:rPr>
+          <w:rFonts w:ascii="Times New Roman" w:eastAsia="Times New Roman" w:hAnsi="Times New Roman" w:cs="Times New Roman"/>
+          <w:kern w:val="0"/>
+          <w:sz w:val="24"/>
+          <w:szCs w:val="24"/>
+          <w:highlight w:val="yellow"/>
+          <w:lang w:eastAsia="fr-FR"/>
+          <w14:ligatures w14:val="none"/>
+        </w:rPr>
+        <w:t>, broadcasting</w:t>
       </w:r>
     </w:p>
     <w:p>
@@ -344,8 +678,66 @@
           <w:lang w:val="en-US" w:eastAsia="fr-FR"/>
           <w14:ligatures w14:val="none"/>
         </w:rPr>
-        <w:t>+ Practise mini project of numpy</w:t>
-      </w:r>
+        <w:t xml:space="preserve">+ </w:t>
+      </w:r>
+      <w:proofErr w:type="spellStart"/>
+      <w:r>
+        <w:rPr>
+          <w:rFonts w:ascii="Times New Roman" w:eastAsia="Times New Roman" w:hAnsi="Times New Roman" w:cs="Times New Roman"/>
+          <w:b/>
+          <w:bCs/>
+          <w:i/>
+          <w:iCs/>
+          <w:color w:val="EE0000"/>
+          <w:kern w:val="0"/>
+          <w:sz w:val="32"/>
+          <w:szCs w:val="32"/>
+          <w:highlight w:val="yellow"/>
+          <w:u w:val="single"/>
+          <w:lang w:val="en-US" w:eastAsia="fr-FR"/>
+          <w14:ligatures w14:val="none"/>
+        </w:rPr>
+        <w:t>Practise</w:t>
+      </w:r>
+      <w:proofErr w:type="spellEnd"/>
+      <w:r>
+        <w:rPr>
+          <w:rFonts w:ascii="Times New Roman" w:eastAsia="Times New Roman" w:hAnsi="Times New Roman" w:cs="Times New Roman"/>
+          <w:b/>
+          <w:bCs/>
+          <w:i/>
+          <w:iCs/>
+          <w:color w:val="EE0000"/>
+          <w:kern w:val="0"/>
+          <w:sz w:val="32"/>
+          <w:szCs w:val="32"/>
+          <w:highlight w:val="yellow"/>
+          <w:u w:val="single"/>
+          <w:lang w:val="en-US" w:eastAsia="fr-FR"/>
+          <w14:ligatures w14:val="none"/>
+        </w:rPr>
+        <w:t xml:space="preserve"> mini project of </w:t>
+      </w:r>
+      <w:proofErr w:type="spellStart"/>
+      <w:r>
+        <w:rPr>
+          <w:rFonts w:ascii="Times New Roman" w:eastAsia="Times New Roman" w:hAnsi="Times New Roman" w:cs="Times New Roman"/>
+          <w:b/>
+          <w:bCs/>
+          <w:i/>
+          <w:iCs/>
+          <w:color w:val="EE0000"/>
+          <w:kern w:val="0"/>
+          <w:sz w:val="32"/>
+          <w:szCs w:val="32"/>
+          <w:highlight w:val="yellow"/>
+          <w:u w:val="single"/>
+          <w:lang w:val="en-US" w:eastAsia="fr-FR"/>
+          <w14:ligatures w14:val="none"/>
+        </w:rPr>
+        <w:t>numpy</w:t>
+      </w:r>
+      <w:proofErr w:type="spellEnd"/>
     </w:p>
     <w:p>
       <w:pPr>
@@ -374,7 +766,33 @@
           <w:lang w:val="en-US" w:eastAsia="fr-FR"/>
           <w14:ligatures w14:val="none"/>
         </w:rPr>
-        <w:t>Day 8: Pandas DataFrames – loading CSV, inspecting data</w:t>
+        <w:t xml:space="preserve">Day 8: Pandas </w:t>
+      </w:r>
+      <w:proofErr w:type="spellStart"/>
+      <w:r>
+        <w:rPr>
+          <w:rFonts w:ascii="Times New Roman" w:eastAsia="Times New Roman" w:hAnsi="Times New Roman" w:cs="Times New Roman"/>
+          <w:kern w:val="0"/>
+          <w:sz w:val="24"/>
+          <w:szCs w:val="24"/>
+          <w:highlight w:val="yellow"/>
+          <w:lang w:val="en-US" w:eastAsia="fr-FR"/>
+          <w14:ligatures w14:val="none"/>
+        </w:rPr>
+        <w:t>DataFrames</w:t>
+      </w:r>
+      <w:proofErr w:type="spellEnd"/>
+      <w:r>
+        <w:rPr>
+          <w:rFonts w:ascii="Times New Roman" w:eastAsia="Times New Roman" w:hAnsi="Times New Roman" w:cs="Times New Roman"/>
+          <w:kern w:val="0"/>
+          <w:sz w:val="24"/>
+          <w:szCs w:val="24"/>
+          <w:highlight w:val="yellow"/>
+          <w:lang w:val="en-US" w:eastAsia="fr-FR"/>
+          <w14:ligatures w14:val="none"/>
+        </w:rPr>
+        <w:t xml:space="preserve"> – loading CSV, inspecting data</w:t>
       </w:r>
     </w:p>
     <w:p>
@@ -571,8 +989,22 @@
           <w:lang w:val="en-US" w:eastAsia="fr-FR"/>
           <w14:ligatures w14:val="none"/>
         </w:rPr>
-        <w:t>, pca</w:t>
-      </w:r>
+        <w:t xml:space="preserve">, </w:t>
+      </w:r>
+      <w:proofErr w:type="spellStart"/>
+      <w:r>
+        <w:rPr>
+          <w:rFonts w:ascii="Times New Roman" w:eastAsia="Times New Roman" w:hAnsi="Times New Roman" w:cs="Times New Roman"/>
+          <w:kern w:val="0"/>
+          <w:sz w:val="24"/>
+          <w:szCs w:val="24"/>
+          <w:highlight w:val="yellow"/>
+          <w:lang w:val="en-US" w:eastAsia="fr-FR"/>
+          <w14:ligatures w14:val="none"/>
+        </w:rPr>
+        <w:t>pca</w:t>
+      </w:r>
+      <w:proofErr w:type="spellEnd"/>
       <w:r>
         <w:rPr>
           <w:rFonts w:ascii="Times New Roman" w:eastAsia="Times New Roman" w:hAnsi="Times New Roman" w:cs="Times New Roman"/>
@@ -613,8 +1045,48 @@
           <w:lang w:eastAsia="fr-FR"/>
           <w14:ligatures w14:val="none"/>
         </w:rPr>
-        <w:t>Day 13: Matrices and operations</w:t>
-      </w:r>
+        <w:t xml:space="preserve">Day </w:t>
+      </w:r>
+      <w:proofErr w:type="gramStart"/>
+      <w:r>
+        <w:rPr>
+          <w:rFonts w:ascii="Times New Roman" w:eastAsia="Times New Roman" w:hAnsi="Times New Roman" w:cs="Times New Roman"/>
+          <w:kern w:val="0"/>
+          <w:sz w:val="24"/>
+          <w:szCs w:val="24"/>
+          <w:highlight w:val="yellow"/>
+          <w:lang w:eastAsia="fr-FR"/>
+          <w14:ligatures w14:val="none"/>
+        </w:rPr>
+        <w:t>13:</w:t>
+      </w:r>
+      <w:proofErr w:type="gramEnd"/>
+      <w:r>
+        <w:rPr>
+          <w:rFonts w:ascii="Times New Roman" w:eastAsia="Times New Roman" w:hAnsi="Times New Roman" w:cs="Times New Roman"/>
+          <w:kern w:val="0"/>
+          <w:sz w:val="24"/>
+          <w:szCs w:val="24"/>
+          <w:highlight w:val="yellow"/>
+          <w:lang w:eastAsia="fr-FR"/>
+          <w14:ligatures w14:val="none"/>
+        </w:rPr>
+        <w:t xml:space="preserve"> Matrices and </w:t>
+      </w:r>
+      <w:proofErr w:type="spellStart"/>
+      <w:r>
+        <w:rPr>
+          <w:rFonts w:ascii="Times New Roman" w:eastAsia="Times New Roman" w:hAnsi="Times New Roman" w:cs="Times New Roman"/>
+          <w:kern w:val="0"/>
+          <w:sz w:val="24"/>
+          <w:szCs w:val="24"/>
+          <w:highlight w:val="yellow"/>
+          <w:lang w:eastAsia="fr-FR"/>
+          <w14:ligatures w14:val="none"/>
+        </w:rPr>
+        <w:t>operations</w:t>
+      </w:r>
+      <w:proofErr w:type="spellEnd"/>
     </w:p>
     <w:p>
       <w:pPr>
@@ -672,8 +1144,87 @@
           <w:lang w:eastAsia="fr-FR"/>
           <w14:ligatures w14:val="none"/>
         </w:rPr>
-        <w:t xml:space="preserve">Day 15: Plotting with </w:t>
-      </w:r>
+        <w:t xml:space="preserve">Day </w:t>
+      </w:r>
+      <w:proofErr w:type="gramStart"/>
+      <w:r>
+        <w:rPr>
+          <w:rFonts w:ascii="Times New Roman" w:eastAsia="Times New Roman" w:hAnsi="Times New Roman" w:cs="Times New Roman"/>
+          <w:kern w:val="0"/>
+          <w:sz w:val="24"/>
+          <w:szCs w:val="24"/>
+          <w:highlight w:val="yellow"/>
+          <w:lang w:eastAsia="fr-FR"/>
+          <w14:ligatures w14:val="none"/>
+        </w:rPr>
+        <w:t>15:</w:t>
+      </w:r>
+      <w:proofErr w:type="gramEnd"/>
+      <w:r>
+        <w:rPr>
+          <w:rFonts w:ascii="Times New Roman" w:eastAsia="Times New Roman" w:hAnsi="Times New Roman" w:cs="Times New Roman"/>
+          <w:kern w:val="0"/>
+          <w:sz w:val="24"/>
+          <w:szCs w:val="24"/>
+          <w:highlight w:val="yellow"/>
+          <w:lang w:eastAsia="fr-FR"/>
+          <w14:ligatures w14:val="none"/>
+        </w:rPr>
+        <w:t xml:space="preserve"> </w:t>
+      </w:r>
+      <w:proofErr w:type="spellStart"/>
+      <w:r>
+        <w:rPr>
+          <w:rFonts w:ascii="Times New Roman" w:eastAsia="Times New Roman" w:hAnsi="Times New Roman" w:cs="Times New Roman"/>
+          <w:kern w:val="0"/>
+          <w:sz w:val="24"/>
+          <w:szCs w:val="24"/>
+          <w:highlight w:val="yellow"/>
+          <w:lang w:eastAsia="fr-FR"/>
+          <w14:ligatures w14:val="none"/>
+        </w:rPr>
+        <w:t>Plotting</w:t>
+      </w:r>
+      <w:proofErr w:type="spellEnd"/>
+      <w:r>
+        <w:rPr>
+          <w:rFonts w:ascii="Times New Roman" w:eastAsia="Times New Roman" w:hAnsi="Times New Roman" w:cs="Times New Roman"/>
+          <w:kern w:val="0"/>
+          <w:sz w:val="24"/>
+          <w:szCs w:val="24"/>
+          <w:highlight w:val="yellow"/>
+          <w:lang w:eastAsia="fr-FR"/>
+          <w14:ligatures w14:val="none"/>
+        </w:rPr>
+        <w:t xml:space="preserve"> </w:t>
+      </w:r>
+      <w:proofErr w:type="spellStart"/>
+      <w:r>
+        <w:rPr>
+          <w:rFonts w:ascii="Times New Roman" w:eastAsia="Times New Roman" w:hAnsi="Times New Roman" w:cs="Times New Roman"/>
+          <w:kern w:val="0"/>
+          <w:sz w:val="24"/>
+          <w:szCs w:val="24"/>
+          <w:highlight w:val="yellow"/>
+          <w:lang w:eastAsia="fr-FR"/>
+          <w14:ligatures w14:val="none"/>
+        </w:rPr>
+        <w:t>with</w:t>
+      </w:r>
+      <w:proofErr w:type="spellEnd"/>
+      <w:r>
+        <w:rPr>
+          <w:rFonts w:ascii="Times New Roman" w:eastAsia="Times New Roman" w:hAnsi="Times New Roman" w:cs="Times New Roman"/>
+          <w:kern w:val="0"/>
+          <w:sz w:val="24"/>
+          <w:szCs w:val="24"/>
+          <w:highlight w:val="yellow"/>
+          <w:lang w:eastAsia="fr-FR"/>
+          <w14:ligatures w14:val="none"/>
+        </w:rPr>
+        <w:t xml:space="preserve"> </w:t>
+      </w:r>
+      <w:proofErr w:type="spellStart"/>
       <w:r>
         <w:rPr>
           <w:rFonts w:ascii="Courier New" w:eastAsia="Times New Roman" w:hAnsi="Courier New" w:cs="Courier New"/>
@@ -686,6 +1237,7 @@
         </w:rPr>
         <w:t>matplotlib</w:t>
       </w:r>
+      <w:proofErr w:type="spellEnd"/>
       <w:r>
         <w:rPr>
           <w:rFonts w:ascii="Times New Roman" w:eastAsia="Times New Roman" w:hAnsi="Times New Roman" w:cs="Times New Roman"/>
@@ -698,6 +1250,7 @@
         </w:rPr>
         <w:t xml:space="preserve"> &amp; </w:t>
       </w:r>
+      <w:proofErr w:type="spellStart"/>
       <w:r>
         <w:rPr>
           <w:rFonts w:ascii="Courier New" w:eastAsia="Times New Roman" w:hAnsi="Courier New" w:cs="Courier New"/>
@@ -710,6 +1263,7 @@
         </w:rPr>
         <w:t>seaborn</w:t>
       </w:r>
+      <w:proofErr w:type="spellEnd"/>
     </w:p>
     <w:p>
       <w:pPr>
@@ -737,7 +1291,63 @@
           <w:lang w:eastAsia="fr-FR"/>
           <w14:ligatures w14:val="none"/>
         </w:rPr>
-        <w:t>Days 16–20: Data Cleaning &amp; EDA</w:t>
+        <w:t>Days 16–</w:t>
+      </w:r>
+      <w:proofErr w:type="gramStart"/>
+      <w:r>
+        <w:rPr>
+          <w:rFonts w:ascii="Times New Roman" w:eastAsia="Times New Roman" w:hAnsi="Times New Roman" w:cs="Times New Roman"/>
+          <w:b/>
+          <w:bCs/>
+          <w:kern w:val="0"/>
+          <w:sz w:val="27"/>
+          <w:szCs w:val="27"/>
+          <w:lang w:eastAsia="fr-FR"/>
+          <w14:ligatures w14:val="none"/>
+        </w:rPr>
+        <w:t>20:</w:t>
+      </w:r>
+      <w:proofErr w:type="gramEnd"/>
+      <w:r>
+        <w:rPr>
+          <w:rFonts w:ascii="Times New Roman" w:eastAsia="Times New Roman" w:hAnsi="Times New Roman" w:cs="Times New Roman"/>
+          <w:b/>
+          <w:bCs/>
+          <w:kern w:val="0"/>
+          <w:sz w:val="27"/>
+          <w:szCs w:val="27"/>
+          <w:lang w:eastAsia="fr-FR"/>
+          <w14:ligatures w14:val="none"/>
+        </w:rPr>
+        <w:t xml:space="preserve"> Data </w:t>
+      </w:r>
+      <w:proofErr w:type="spellStart"/>
+      <w:r>
+        <w:rPr>
+          <w:rFonts w:ascii="Times New Roman" w:eastAsia="Times New Roman" w:hAnsi="Times New Roman" w:cs="Times New Roman"/>
+          <w:b/>
+          <w:bCs/>
+          <w:kern w:val="0"/>
+          <w:sz w:val="27"/>
+          <w:szCs w:val="27"/>
+          <w:lang w:eastAsia="fr-FR"/>
+          <w14:ligatures w14:val="none"/>
+        </w:rPr>
+        <w:t>Cleaning</w:t>
+      </w:r>
+      <w:proofErr w:type="spellEnd"/>
+      <w:r>
+        <w:rPr>
+          <w:rFonts w:ascii="Times New Roman" w:eastAsia="Times New Roman" w:hAnsi="Times New Roman" w:cs="Times New Roman"/>
+          <w:b/>
+          <w:bCs/>
+          <w:kern w:val="0"/>
+          <w:sz w:val="27"/>
+          <w:szCs w:val="27"/>
+          <w:lang w:eastAsia="fr-FR"/>
+          <w14:ligatures w14:val="none"/>
+        </w:rPr>
+        <w:t xml:space="preserve"> &amp; EDA</w:t>
       </w:r>
     </w:p>
     <w:p>
@@ -856,7 +1466,20 @@
           <w:lang w:val="en-US" w:eastAsia="fr-FR"/>
           <w14:ligatures w14:val="none"/>
         </w:rPr>
-        <w:t>Day 19: Correlation</w:t>
+        <w:t xml:space="preserve">Day 19: </w:t>
+      </w:r>
+      <w:proofErr w:type="gramStart"/>
+      <w:r>
+        <w:rPr>
+          <w:rFonts w:ascii="Times New Roman" w:eastAsia="Times New Roman" w:hAnsi="Times New Roman" w:cs="Times New Roman"/>
+          <w:kern w:val="0"/>
+          <w:sz w:val="24"/>
+          <w:szCs w:val="24"/>
+          <w:highlight w:val="yellow"/>
+          <w:lang w:val="en-US" w:eastAsia="fr-FR"/>
+          <w14:ligatures w14:val="none"/>
+        </w:rPr>
+        <w:t>Correlation</w:t>
       </w:r>
       <w:r>
         <w:rPr>
@@ -870,6 +1493,7 @@
         </w:rPr>
         <w:t>(</w:t>
       </w:r>
+      <w:proofErr w:type="gramEnd"/>
       <w:r>
         <w:rPr>
           <w:rFonts w:ascii="Times New Roman" w:eastAsia="Times New Roman" w:hAnsi="Times New Roman" w:cs="Times New Roman"/>
@@ -953,6 +1577,7 @@
         </w:rPr>
         <w:t xml:space="preserve"> </w:t>
       </w:r>
+      <w:proofErr w:type="spellStart"/>
       <w:r>
         <w:rPr>
           <w:rFonts w:ascii="Times New Roman" w:eastAsia="Times New Roman" w:hAnsi="Times New Roman" w:cs="Times New Roman"/>
@@ -965,6 +1590,7 @@
         </w:rPr>
         <w:t>groupby</w:t>
       </w:r>
+      <w:proofErr w:type="spellEnd"/>
     </w:p>
     <w:p>
       <w:pPr>
@@ -993,8 +1619,9 @@
           <w:lang w:val="en-US" w:eastAsia="fr-FR"/>
           <w14:ligatures w14:val="none"/>
         </w:rPr>
-        <w:t>Day 20: Mini project: Full EDA on Titanic dataset</w:t>
-      </w:r>
+        <w:t xml:space="preserve">Day 20: Mini project: Full EDA on Titanic </w:t>
+      </w:r>
+      <w:proofErr w:type="gramStart"/>
       <w:r>
         <w:rPr>
           <w:rFonts w:ascii="Times New Roman" w:eastAsia="Times New Roman" w:hAnsi="Times New Roman" w:cs="Times New Roman"/>
@@ -1005,7 +1632,32 @@
           <w:lang w:val="en-US" w:eastAsia="fr-FR"/>
           <w14:ligatures w14:val="none"/>
         </w:rPr>
-        <w:t>(done day 18)</w:t>
+        <w:t>dataset</w:t>
+      </w:r>
+      <w:r>
+        <w:rPr>
+          <w:rFonts w:ascii="Times New Roman" w:eastAsia="Times New Roman" w:hAnsi="Times New Roman" w:cs="Times New Roman"/>
+          <w:kern w:val="0"/>
+          <w:sz w:val="24"/>
+          <w:szCs w:val="24"/>
+          <w:highlight w:val="cyan"/>
+          <w:lang w:val="en-US" w:eastAsia="fr-FR"/>
+          <w14:ligatures w14:val="none"/>
+        </w:rPr>
+        <w:t>(</w:t>
+      </w:r>
+      <w:proofErr w:type="gramEnd"/>
+      <w:r>
+        <w:rPr>
+          <w:rFonts w:ascii="Times New Roman" w:eastAsia="Times New Roman" w:hAnsi="Times New Roman" w:cs="Times New Roman"/>
+          <w:kern w:val="0"/>
+          <w:sz w:val="24"/>
+          <w:szCs w:val="24"/>
+          <w:highlight w:val="cyan"/>
+          <w:lang w:val="en-US" w:eastAsia="fr-FR"/>
+          <w14:ligatures w14:val="none"/>
+        </w:rPr>
+        <w:t>done day 18)</w:t>
       </w:r>
     </w:p>
     <w:p>
@@ -1073,7 +1725,35 @@
           <w:lang w:val="en-US" w:eastAsia="fr-FR"/>
           <w14:ligatures w14:val="none"/>
         </w:rPr>
-        <w:t xml:space="preserve"> Phase 2: Machine Learning Basics (Days 21–50)</w:t>
+        <w:t xml:space="preserve"> Phase </w:t>
+      </w:r>
+      <w:proofErr w:type="gramStart"/>
+      <w:r>
+        <w:rPr>
+          <w:rFonts w:ascii="Times New Roman" w:eastAsia="Times New Roman" w:hAnsi="Times New Roman" w:cs="Times New Roman"/>
+          <w:b/>
+          <w:bCs/>
+          <w:kern w:val="0"/>
+          <w:sz w:val="36"/>
+          <w:szCs w:val="36"/>
+          <w:lang w:val="en-US" w:eastAsia="fr-FR"/>
+          <w14:ligatures w14:val="none"/>
+        </w:rPr>
+        <w:t>2:</w:t>
+      </w:r>
+      <w:proofErr w:type="gramEnd"/>
+      <w:r>
+        <w:rPr>
+          <w:rFonts w:ascii="Times New Roman" w:eastAsia="Times New Roman" w:hAnsi="Times New Roman" w:cs="Times New Roman"/>
+          <w:b/>
+          <w:bCs/>
+          <w:kern w:val="0"/>
+          <w:sz w:val="36"/>
+          <w:szCs w:val="36"/>
+          <w:lang w:val="en-US" w:eastAsia="fr-FR"/>
+          <w14:ligatures w14:val="none"/>
+        </w:rPr>
+        <w:t xml:space="preserve"> Machine Learning Basics (Days 21–50)</w:t>
       </w:r>
     </w:p>
     <w:p>
@@ -2587,8 +3267,9 @@
           <w:lang w:eastAsia="fr-FR"/>
           <w14:ligatures w14:val="none"/>
         </w:rPr>
-        <w:t>Days 31–35: Classification – Logistic Regressio</w:t>
-      </w:r>
+        <w:t>Days 31–</w:t>
+      </w:r>
+      <w:proofErr w:type="gramStart"/>
       <w:r>
         <w:rPr>
           <w:rFonts w:ascii="Times New Roman" w:eastAsia="Times New Roman" w:hAnsi="Times New Roman" w:cs="Times New Roman"/>
@@ -2600,8 +3281,9 @@
           <w:lang w:eastAsia="fr-FR"/>
           <w14:ligatures w14:val="none"/>
         </w:rPr>
-        <w:t xml:space="preserve">n : </w:t>
-      </w:r>
+        <w:t>35:</w:t>
+      </w:r>
+      <w:proofErr w:type="gramEnd"/>
       <w:r>
         <w:rPr>
           <w:rFonts w:ascii="Times New Roman" w:eastAsia="Times New Roman" w:hAnsi="Times New Roman" w:cs="Times New Roman"/>
@@ -2613,8 +3295,9 @@
           <w:lang w:eastAsia="fr-FR"/>
           <w14:ligatures w14:val="none"/>
         </w:rPr>
-        <w:t>Binaire, multicla</w:t>
-      </w:r>
+        <w:t xml:space="preserve"> Classification – </w:t>
+      </w:r>
+      <w:proofErr w:type="spellStart"/>
       <w:r>
         <w:rPr>
           <w:rFonts w:ascii="Times New Roman" w:eastAsia="Times New Roman" w:hAnsi="Times New Roman" w:cs="Times New Roman"/>
@@ -2626,8 +3309,132 @@
           <w:lang w:eastAsia="fr-FR"/>
           <w14:ligatures w14:val="none"/>
         </w:rPr>
-        <w:t>sse, ordianle</w:t>
-      </w:r>
+        <w:t>Logistic</w:t>
+      </w:r>
+      <w:proofErr w:type="spellEnd"/>
+      <w:r>
+        <w:rPr>
+          <w:rFonts w:ascii="Times New Roman" w:eastAsia="Times New Roman" w:hAnsi="Times New Roman" w:cs="Times New Roman"/>
+          <w:b/>
+          <w:bCs/>
+          <w:kern w:val="0"/>
+          <w:sz w:val="27"/>
+          <w:szCs w:val="27"/>
+          <w:lang w:eastAsia="fr-FR"/>
+          <w14:ligatures w14:val="none"/>
+        </w:rPr>
+        <w:t xml:space="preserve"> </w:t>
+      </w:r>
+      <w:proofErr w:type="spellStart"/>
+      <w:r>
+        <w:rPr>
+          <w:rFonts w:ascii="Times New Roman" w:eastAsia="Times New Roman" w:hAnsi="Times New Roman" w:cs="Times New Roman"/>
+          <w:b/>
+          <w:bCs/>
+          <w:kern w:val="0"/>
+          <w:sz w:val="27"/>
+          <w:szCs w:val="27"/>
+          <w:lang w:eastAsia="fr-FR"/>
+          <w14:ligatures w14:val="none"/>
+        </w:rPr>
+        <w:t>Regressio</w:t>
+      </w:r>
+      <w:r>
+        <w:rPr>
+          <w:rFonts w:ascii="Times New Roman" w:eastAsia="Times New Roman" w:hAnsi="Times New Roman" w:cs="Times New Roman"/>
+          <w:b/>
+          <w:bCs/>
+          <w:kern w:val="0"/>
+          <w:sz w:val="27"/>
+          <w:szCs w:val="27"/>
+          <w:lang w:eastAsia="fr-FR"/>
+          <w14:ligatures w14:val="none"/>
+        </w:rPr>
+        <w:t>n</w:t>
+      </w:r>
+      <w:proofErr w:type="spellEnd"/>
+      <w:r>
+        <w:rPr>
+          <w:rFonts w:ascii="Times New Roman" w:eastAsia="Times New Roman" w:hAnsi="Times New Roman" w:cs="Times New Roman"/>
+          <w:b/>
+          <w:bCs/>
+          <w:kern w:val="0"/>
+          <w:sz w:val="27"/>
+          <w:szCs w:val="27"/>
+          <w:lang w:eastAsia="fr-FR"/>
+          <w14:ligatures w14:val="none"/>
+        </w:rPr>
+        <w:t xml:space="preserve"> : </w:t>
+      </w:r>
+      <w:r>
+        <w:rPr>
+          <w:rFonts w:ascii="Times New Roman" w:eastAsia="Times New Roman" w:hAnsi="Times New Roman" w:cs="Times New Roman"/>
+          <w:b/>
+          <w:bCs/>
+          <w:kern w:val="0"/>
+          <w:sz w:val="27"/>
+          <w:szCs w:val="27"/>
+          <w:lang w:eastAsia="fr-FR"/>
+          <w14:ligatures w14:val="none"/>
+        </w:rPr>
+        <w:t xml:space="preserve">Binaire, </w:t>
+      </w:r>
+      <w:proofErr w:type="spellStart"/>
+      <w:r>
+        <w:rPr>
+          <w:rFonts w:ascii="Times New Roman" w:eastAsia="Times New Roman" w:hAnsi="Times New Roman" w:cs="Times New Roman"/>
+          <w:b/>
+          <w:bCs/>
+          <w:kern w:val="0"/>
+          <w:sz w:val="27"/>
+          <w:szCs w:val="27"/>
+          <w:lang w:eastAsia="fr-FR"/>
+          <w14:ligatures w14:val="none"/>
+        </w:rPr>
+        <w:t>multicla</w:t>
+      </w:r>
+      <w:r>
+        <w:rPr>
+          <w:rFonts w:ascii="Times New Roman" w:eastAsia="Times New Roman" w:hAnsi="Times New Roman" w:cs="Times New Roman"/>
+          <w:b/>
+          <w:bCs/>
+          <w:kern w:val="0"/>
+          <w:sz w:val="27"/>
+          <w:szCs w:val="27"/>
+          <w:lang w:eastAsia="fr-FR"/>
+          <w14:ligatures w14:val="none"/>
+        </w:rPr>
+        <w:t>sse</w:t>
+      </w:r>
+      <w:proofErr w:type="spellEnd"/>
+      <w:r>
+        <w:rPr>
+          <w:rFonts w:ascii="Times New Roman" w:eastAsia="Times New Roman" w:hAnsi="Times New Roman" w:cs="Times New Roman"/>
+          <w:b/>
+          <w:bCs/>
+          <w:kern w:val="0"/>
+          <w:sz w:val="27"/>
+          <w:szCs w:val="27"/>
+          <w:lang w:eastAsia="fr-FR"/>
+          <w14:ligatures w14:val="none"/>
+        </w:rPr>
+        <w:t xml:space="preserve">, </w:t>
+      </w:r>
+      <w:proofErr w:type="spellStart"/>
+      <w:r>
+        <w:rPr>
+          <w:rFonts w:ascii="Times New Roman" w:eastAsia="Times New Roman" w:hAnsi="Times New Roman" w:cs="Times New Roman"/>
+          <w:b/>
+          <w:bCs/>
+          <w:kern w:val="0"/>
+          <w:sz w:val="27"/>
+          <w:szCs w:val="27"/>
+          <w:lang w:eastAsia="fr-FR"/>
+          <w14:ligatures w14:val="none"/>
+        </w:rPr>
+        <w:t>ordianle</w:t>
+      </w:r>
+      <w:proofErr w:type="spellEnd"/>
     </w:p>
     <w:p>
       <w:pPr>
@@ -2746,8 +3553,74 @@
           <w:lang w:eastAsia="fr-FR"/>
           <w14:ligatures w14:val="none"/>
         </w:rPr>
-        <w:t>Day 34: Evaluation: confusion matrix, ROC curve</w:t>
-      </w:r>
+        <w:t xml:space="preserve">Day </w:t>
+      </w:r>
+      <w:proofErr w:type="gramStart"/>
+      <w:r>
+        <w:rPr>
+          <w:rFonts w:ascii="Times New Roman" w:eastAsia="Times New Roman" w:hAnsi="Times New Roman" w:cs="Times New Roman"/>
+          <w:kern w:val="0"/>
+          <w:sz w:val="24"/>
+          <w:szCs w:val="24"/>
+          <w:highlight w:val="yellow"/>
+          <w:lang w:eastAsia="fr-FR"/>
+          <w14:ligatures w14:val="none"/>
+        </w:rPr>
+        <w:t>34:</w:t>
+      </w:r>
+      <w:proofErr w:type="gramEnd"/>
+      <w:r>
+        <w:rPr>
+          <w:rFonts w:ascii="Times New Roman" w:eastAsia="Times New Roman" w:hAnsi="Times New Roman" w:cs="Times New Roman"/>
+          <w:kern w:val="0"/>
+          <w:sz w:val="24"/>
+          <w:szCs w:val="24"/>
+          <w:highlight w:val="yellow"/>
+          <w:lang w:eastAsia="fr-FR"/>
+          <w14:ligatures w14:val="none"/>
+        </w:rPr>
+        <w:t xml:space="preserve"> </w:t>
+      </w:r>
+      <w:proofErr w:type="gramStart"/>
+      <w:r>
+        <w:rPr>
+          <w:rFonts w:ascii="Times New Roman" w:eastAsia="Times New Roman" w:hAnsi="Times New Roman" w:cs="Times New Roman"/>
+          <w:kern w:val="0"/>
+          <w:sz w:val="24"/>
+          <w:szCs w:val="24"/>
+          <w:highlight w:val="yellow"/>
+          <w:lang w:eastAsia="fr-FR"/>
+          <w14:ligatures w14:val="none"/>
+        </w:rPr>
+        <w:t>Evaluation:</w:t>
+      </w:r>
+      <w:proofErr w:type="gramEnd"/>
+      <w:r>
+        <w:rPr>
+          <w:rFonts w:ascii="Times New Roman" w:eastAsia="Times New Roman" w:hAnsi="Times New Roman" w:cs="Times New Roman"/>
+          <w:kern w:val="0"/>
+          <w:sz w:val="24"/>
+          <w:szCs w:val="24"/>
+          <w:highlight w:val="yellow"/>
+          <w:lang w:eastAsia="fr-FR"/>
+          <w14:ligatures w14:val="none"/>
+        </w:rPr>
+        <w:t xml:space="preserve"> confusion matrix, ROC </w:t>
+      </w:r>
+      <w:proofErr w:type="spellStart"/>
+      <w:r>
+        <w:rPr>
+          <w:rFonts w:ascii="Times New Roman" w:eastAsia="Times New Roman" w:hAnsi="Times New Roman" w:cs="Times New Roman"/>
+          <w:kern w:val="0"/>
+          <w:sz w:val="24"/>
+          <w:szCs w:val="24"/>
+          <w:highlight w:val="yellow"/>
+          <w:lang w:eastAsia="fr-FR"/>
+          <w14:ligatures w14:val="none"/>
+        </w:rPr>
+        <w:t>curve</w:t>
+      </w:r>
+      <w:proofErr w:type="spellEnd"/>
     </w:p>
     <w:p>
       <w:pPr>
@@ -2975,8 +3848,74 @@
           <w:lang w:eastAsia="fr-FR"/>
           <w14:ligatures w14:val="none"/>
         </w:rPr>
-        <w:t>Day 38: Overfitting and pruning</w:t>
-      </w:r>
+        <w:t xml:space="preserve">Day </w:t>
+      </w:r>
+      <w:proofErr w:type="gramStart"/>
+      <w:r>
+        <w:rPr>
+          <w:rFonts w:ascii="Times New Roman" w:eastAsia="Times New Roman" w:hAnsi="Times New Roman" w:cs="Times New Roman"/>
+          <w:kern w:val="0"/>
+          <w:sz w:val="24"/>
+          <w:szCs w:val="24"/>
+          <w:highlight w:val="yellow"/>
+          <w:lang w:eastAsia="fr-FR"/>
+          <w14:ligatures w14:val="none"/>
+        </w:rPr>
+        <w:t>38:</w:t>
+      </w:r>
+      <w:proofErr w:type="gramEnd"/>
+      <w:r>
+        <w:rPr>
+          <w:rFonts w:ascii="Times New Roman" w:eastAsia="Times New Roman" w:hAnsi="Times New Roman" w:cs="Times New Roman"/>
+          <w:kern w:val="0"/>
+          <w:sz w:val="24"/>
+          <w:szCs w:val="24"/>
+          <w:highlight w:val="yellow"/>
+          <w:lang w:eastAsia="fr-FR"/>
+          <w14:ligatures w14:val="none"/>
+        </w:rPr>
+        <w:t xml:space="preserve"> </w:t>
+      </w:r>
+      <w:proofErr w:type="spellStart"/>
+      <w:r>
+        <w:rPr>
+          <w:rFonts w:ascii="Times New Roman" w:eastAsia="Times New Roman" w:hAnsi="Times New Roman" w:cs="Times New Roman"/>
+          <w:kern w:val="0"/>
+          <w:sz w:val="24"/>
+          <w:szCs w:val="24"/>
+          <w:highlight w:val="yellow"/>
+          <w:lang w:eastAsia="fr-FR"/>
+          <w14:ligatures w14:val="none"/>
+        </w:rPr>
+        <w:t>Overfitting</w:t>
+      </w:r>
+      <w:proofErr w:type="spellEnd"/>
+      <w:r>
+        <w:rPr>
+          <w:rFonts w:ascii="Times New Roman" w:eastAsia="Times New Roman" w:hAnsi="Times New Roman" w:cs="Times New Roman"/>
+          <w:kern w:val="0"/>
+          <w:sz w:val="24"/>
+          <w:szCs w:val="24"/>
+          <w:highlight w:val="yellow"/>
+          <w:lang w:eastAsia="fr-FR"/>
+          <w14:ligatures w14:val="none"/>
+        </w:rPr>
+        <w:t xml:space="preserve"> and </w:t>
+      </w:r>
+      <w:proofErr w:type="spellStart"/>
+      <w:r>
+        <w:rPr>
+          <w:rFonts w:ascii="Times New Roman" w:eastAsia="Times New Roman" w:hAnsi="Times New Roman" w:cs="Times New Roman"/>
+          <w:kern w:val="0"/>
+          <w:sz w:val="24"/>
+          <w:szCs w:val="24"/>
+          <w:highlight w:val="yellow"/>
+          <w:lang w:eastAsia="fr-FR"/>
+          <w14:ligatures w14:val="none"/>
+        </w:rPr>
+        <w:t>pruning</w:t>
+      </w:r>
+      <w:proofErr w:type="spellEnd"/>
     </w:p>
     <w:p>
       <w:pPr>
@@ -3005,8 +3944,100 @@
           <w:lang w:eastAsia="fr-FR"/>
           <w14:ligatures w14:val="none"/>
         </w:rPr>
-        <w:t>Day 39: Visualizing decision trees</w:t>
-      </w:r>
+        <w:t xml:space="preserve">Day </w:t>
+      </w:r>
+      <w:proofErr w:type="gramStart"/>
+      <w:r>
+        <w:rPr>
+          <w:rFonts w:ascii="Times New Roman" w:eastAsia="Times New Roman" w:hAnsi="Times New Roman" w:cs="Times New Roman"/>
+          <w:kern w:val="0"/>
+          <w:sz w:val="24"/>
+          <w:szCs w:val="24"/>
+          <w:highlight w:val="yellow"/>
+          <w:lang w:eastAsia="fr-FR"/>
+          <w14:ligatures w14:val="none"/>
+        </w:rPr>
+        <w:t>39:</w:t>
+      </w:r>
+      <w:proofErr w:type="gramEnd"/>
+      <w:r>
+        <w:rPr>
+          <w:rFonts w:ascii="Times New Roman" w:eastAsia="Times New Roman" w:hAnsi="Times New Roman" w:cs="Times New Roman"/>
+          <w:kern w:val="0"/>
+          <w:sz w:val="24"/>
+          <w:szCs w:val="24"/>
+          <w:highlight w:val="yellow"/>
+          <w:lang w:eastAsia="fr-FR"/>
+          <w14:ligatures w14:val="none"/>
+        </w:rPr>
+        <w:t xml:space="preserve"> </w:t>
+      </w:r>
+      <w:proofErr w:type="spellStart"/>
+      <w:r>
+        <w:rPr>
+          <w:rFonts w:ascii="Times New Roman" w:eastAsia="Times New Roman" w:hAnsi="Times New Roman" w:cs="Times New Roman"/>
+          <w:kern w:val="0"/>
+          <w:sz w:val="24"/>
+          <w:szCs w:val="24"/>
+          <w:highlight w:val="yellow"/>
+          <w:lang w:eastAsia="fr-FR"/>
+          <w14:ligatures w14:val="none"/>
+        </w:rPr>
+        <w:t>Visualizing</w:t>
+      </w:r>
+      <w:proofErr w:type="spellEnd"/>
+      <w:r>
+        <w:rPr>
+          <w:rFonts w:ascii="Times New Roman" w:eastAsia="Times New Roman" w:hAnsi="Times New Roman" w:cs="Times New Roman"/>
+          <w:kern w:val="0"/>
+          <w:sz w:val="24"/>
+          <w:szCs w:val="24"/>
+          <w:highlight w:val="yellow"/>
+          <w:lang w:eastAsia="fr-FR"/>
+          <w14:ligatures w14:val="none"/>
+        </w:rPr>
+        <w:t xml:space="preserve"> </w:t>
+      </w:r>
+      <w:proofErr w:type="spellStart"/>
+      <w:r>
+        <w:rPr>
+          <w:rFonts w:ascii="Times New Roman" w:eastAsia="Times New Roman" w:hAnsi="Times New Roman" w:cs="Times New Roman"/>
+          <w:kern w:val="0"/>
+          <w:sz w:val="24"/>
+          <w:szCs w:val="24"/>
+          <w:highlight w:val="yellow"/>
+          <w:lang w:eastAsia="fr-FR"/>
+          <w14:ligatures w14:val="none"/>
+        </w:rPr>
+        <w:t>decision</w:t>
+      </w:r>
+      <w:proofErr w:type="spellEnd"/>
+      <w:r>
+        <w:rPr>
+          <w:rFonts w:ascii="Times New Roman" w:eastAsia="Times New Roman" w:hAnsi="Times New Roman" w:cs="Times New Roman"/>
+          <w:kern w:val="0"/>
+          <w:sz w:val="24"/>
+          <w:szCs w:val="24"/>
+          <w:highlight w:val="yellow"/>
+          <w:lang w:eastAsia="fr-FR"/>
+          <w14:ligatures w14:val="none"/>
+        </w:rPr>
+        <w:t xml:space="preserve"> </w:t>
+      </w:r>
+      <w:proofErr w:type="spellStart"/>
+      <w:r>
+        <w:rPr>
+          <w:rFonts w:ascii="Times New Roman" w:eastAsia="Times New Roman" w:hAnsi="Times New Roman" w:cs="Times New Roman"/>
+          <w:kern w:val="0"/>
+          <w:sz w:val="24"/>
+          <w:szCs w:val="24"/>
+          <w:highlight w:val="yellow"/>
+          <w:lang w:eastAsia="fr-FR"/>
+          <w14:ligatures w14:val="none"/>
+        </w:rPr>
+        <w:t>trees</w:t>
+      </w:r>
+      <w:proofErr w:type="spellEnd"/>
     </w:p>
     <w:p>
       <w:pPr>
@@ -3076,7 +4107,35 @@
           <w:lang w:eastAsia="fr-FR"/>
           <w14:ligatures w14:val="none"/>
         </w:rPr>
-        <w:t>Days 41–45: Ensemble Methods</w:t>
+        <w:t>Days 41–</w:t>
+      </w:r>
+      <w:proofErr w:type="gramStart"/>
+      <w:r>
+        <w:rPr>
+          <w:rFonts w:ascii="Times New Roman" w:eastAsia="Times New Roman" w:hAnsi="Times New Roman" w:cs="Times New Roman"/>
+          <w:b/>
+          <w:bCs/>
+          <w:kern w:val="0"/>
+          <w:sz w:val="27"/>
+          <w:szCs w:val="27"/>
+          <w:lang w:eastAsia="fr-FR"/>
+          <w14:ligatures w14:val="none"/>
+        </w:rPr>
+        <w:t>45:</w:t>
+      </w:r>
+      <w:proofErr w:type="gramEnd"/>
+      <w:r>
+        <w:rPr>
+          <w:rFonts w:ascii="Times New Roman" w:eastAsia="Times New Roman" w:hAnsi="Times New Roman" w:cs="Times New Roman"/>
+          <w:b/>
+          <w:bCs/>
+          <w:kern w:val="0"/>
+          <w:sz w:val="27"/>
+          <w:szCs w:val="27"/>
+          <w:lang w:eastAsia="fr-FR"/>
+          <w14:ligatures w14:val="none"/>
+        </w:rPr>
+        <w:t xml:space="preserve"> Ensemble Methods</w:t>
       </w:r>
     </w:p>
     <w:p>
@@ -3106,19 +4165,45 @@
           <w:lang w:val="en-US" w:eastAsia="fr-FR"/>
           <w14:ligatures w14:val="none"/>
         </w:rPr>
-        <w:t>Day 41: Random Forest – theory</w:t>
-      </w:r>
-      <w:r>
-        <w:rPr>
-          <w:rFonts w:ascii="Times New Roman" w:eastAsia="Times New Roman" w:hAnsi="Times New Roman" w:cs="Times New Roman"/>
-          <w:kern w:val="0"/>
-          <w:sz w:val="24"/>
-          <w:szCs w:val="24"/>
-          <w:highlight w:val="yellow"/>
-          <w:lang w:val="en-US" w:eastAsia="fr-FR"/>
-          <w14:ligatures w14:val="none"/>
-        </w:rPr>
-        <w:t>(c</w:t>
+        <w:t xml:space="preserve">Day 41: Random Forest – </w:t>
+      </w:r>
+      <w:proofErr w:type="gramStart"/>
+      <w:r>
+        <w:rPr>
+          <w:rFonts w:ascii="Times New Roman" w:eastAsia="Times New Roman" w:hAnsi="Times New Roman" w:cs="Times New Roman"/>
+          <w:kern w:val="0"/>
+          <w:sz w:val="24"/>
+          <w:szCs w:val="24"/>
+          <w:highlight w:val="yellow"/>
+          <w:lang w:val="en-US" w:eastAsia="fr-FR"/>
+          <w14:ligatures w14:val="none"/>
+        </w:rPr>
+        <w:t>theory</w:t>
+      </w:r>
+      <w:r>
+        <w:rPr>
+          <w:rFonts w:ascii="Times New Roman" w:eastAsia="Times New Roman" w:hAnsi="Times New Roman" w:cs="Times New Roman"/>
+          <w:kern w:val="0"/>
+          <w:sz w:val="24"/>
+          <w:szCs w:val="24"/>
+          <w:highlight w:val="yellow"/>
+          <w:lang w:val="en-US" w:eastAsia="fr-FR"/>
+          <w14:ligatures w14:val="none"/>
+        </w:rPr>
+        <w:t>(</w:t>
+      </w:r>
+      <w:proofErr w:type="gramEnd"/>
+      <w:r>
+        <w:rPr>
+          <w:rFonts w:ascii="Times New Roman" w:eastAsia="Times New Roman" w:hAnsi="Times New Roman" w:cs="Times New Roman"/>
+          <w:kern w:val="0"/>
+          <w:sz w:val="24"/>
+          <w:szCs w:val="24"/>
+          <w:highlight w:val="yellow"/>
+          <w:lang w:val="en-US" w:eastAsia="fr-FR"/>
+          <w14:ligatures w14:val="none"/>
+        </w:rPr>
+        <w:t>c</w:t>
       </w:r>
       <w:r>
         <w:rPr>
@@ -3160,8 +4245,22 @@
           <w:lang w:val="en-US" w:eastAsia="fr-FR"/>
           <w14:ligatures w14:val="none"/>
         </w:rPr>
-        <w:t>Day 42: Implement Random Forest with sklearn</w:t>
-      </w:r>
+        <w:t xml:space="preserve">Day 42: Implement Random Forest with </w:t>
+      </w:r>
+      <w:proofErr w:type="spellStart"/>
+      <w:r>
+        <w:rPr>
+          <w:rFonts w:ascii="Times New Roman" w:eastAsia="Times New Roman" w:hAnsi="Times New Roman" w:cs="Times New Roman"/>
+          <w:kern w:val="0"/>
+          <w:sz w:val="24"/>
+          <w:szCs w:val="24"/>
+          <w:highlight w:val="yellow"/>
+          <w:lang w:val="en-US" w:eastAsia="fr-FR"/>
+          <w14:ligatures w14:val="none"/>
+        </w:rPr>
+        <w:t>sklearn</w:t>
+      </w:r>
+      <w:proofErr w:type="spellEnd"/>
     </w:p>
     <w:p>
       <w:pPr>
@@ -3205,7 +4304,33 @@
           <w:lang w:val="en-US" w:eastAsia="fr-FR"/>
           <w14:ligatures w14:val="none"/>
         </w:rPr>
-        <w:t>Day 43: Gradient Boosting (intro to XGBoost)</w:t>
+        <w:t xml:space="preserve">Day 43: Gradient Boosting (intro to </w:t>
+      </w:r>
+      <w:proofErr w:type="spellStart"/>
+      <w:r>
+        <w:rPr>
+          <w:rFonts w:ascii="Times New Roman" w:eastAsia="Times New Roman" w:hAnsi="Times New Roman" w:cs="Times New Roman"/>
+          <w:kern w:val="0"/>
+          <w:sz w:val="24"/>
+          <w:szCs w:val="24"/>
+          <w:highlight w:val="yellow"/>
+          <w:lang w:val="en-US" w:eastAsia="fr-FR"/>
+          <w14:ligatures w14:val="none"/>
+        </w:rPr>
+        <w:t>XGBoost</w:t>
+      </w:r>
+      <w:proofErr w:type="spellEnd"/>
+      <w:r>
+        <w:rPr>
+          <w:rFonts w:ascii="Times New Roman" w:eastAsia="Times New Roman" w:hAnsi="Times New Roman" w:cs="Times New Roman"/>
+          <w:kern w:val="0"/>
+          <w:sz w:val="24"/>
+          <w:szCs w:val="24"/>
+          <w:highlight w:val="yellow"/>
+          <w:lang w:val="en-US" w:eastAsia="fr-FR"/>
+          <w14:ligatures w14:val="none"/>
+        </w:rPr>
+        <w:t>)</w:t>
       </w:r>
     </w:p>
     <w:p>
@@ -3235,7 +4360,59 @@
           <w:lang w:eastAsia="fr-FR"/>
           <w14:ligatures w14:val="none"/>
         </w:rPr>
-        <w:t>Day 44: Feature importance</w:t>
+        <w:t xml:space="preserve">Day </w:t>
+      </w:r>
+      <w:proofErr w:type="gramStart"/>
+      <w:r>
+        <w:rPr>
+          <w:rFonts w:ascii="Times New Roman" w:eastAsia="Times New Roman" w:hAnsi="Times New Roman" w:cs="Times New Roman"/>
+          <w:kern w:val="0"/>
+          <w:sz w:val="24"/>
+          <w:szCs w:val="24"/>
+          <w:highlight w:val="yellow"/>
+          <w:lang w:eastAsia="fr-FR"/>
+          <w14:ligatures w14:val="none"/>
+        </w:rPr>
+        <w:t>44:</w:t>
+      </w:r>
+      <w:proofErr w:type="gramEnd"/>
+      <w:r>
+        <w:rPr>
+          <w:rFonts w:ascii="Times New Roman" w:eastAsia="Times New Roman" w:hAnsi="Times New Roman" w:cs="Times New Roman"/>
+          <w:kern w:val="0"/>
+          <w:sz w:val="24"/>
+          <w:szCs w:val="24"/>
+          <w:highlight w:val="yellow"/>
+          <w:lang w:eastAsia="fr-FR"/>
+          <w14:ligatures w14:val="none"/>
+        </w:rPr>
+        <w:t xml:space="preserve"> </w:t>
+      </w:r>
+      <w:proofErr w:type="spellStart"/>
+      <w:r>
+        <w:rPr>
+          <w:rFonts w:ascii="Times New Roman" w:eastAsia="Times New Roman" w:hAnsi="Times New Roman" w:cs="Times New Roman"/>
+          <w:kern w:val="0"/>
+          <w:sz w:val="24"/>
+          <w:szCs w:val="24"/>
+          <w:highlight w:val="yellow"/>
+          <w:lang w:eastAsia="fr-FR"/>
+          <w14:ligatures w14:val="none"/>
+        </w:rPr>
+        <w:t>Feature</w:t>
+      </w:r>
+      <w:proofErr w:type="spellEnd"/>
+      <w:r>
+        <w:rPr>
+          <w:rFonts w:ascii="Times New Roman" w:eastAsia="Times New Roman" w:hAnsi="Times New Roman" w:cs="Times New Roman"/>
+          <w:kern w:val="0"/>
+          <w:sz w:val="24"/>
+          <w:szCs w:val="24"/>
+          <w:highlight w:val="yellow"/>
+          <w:lang w:eastAsia="fr-FR"/>
+          <w14:ligatures w14:val="none"/>
+        </w:rPr>
+        <w:t xml:space="preserve"> importance</w:t>
       </w:r>
     </w:p>
     <w:p>
@@ -3294,20 +4471,90 @@
           <w:lang w:eastAsia="fr-FR"/>
           <w14:ligatures w14:val="none"/>
         </w:rPr>
-        <w:t>Days 46–50: Model Tuning &amp; Validation</w:t>
-      </w:r>
-    </w:p>
-    <w:p>
-      <w:pPr>
-        <w:rPr>
-          <w:lang w:eastAsia="fr-FR"/>
-        </w:rPr>
-      </w:pPr>
-      <w:r>
-        <w:rPr>
-          <w:lang w:eastAsia="fr-FR"/>
-        </w:rPr>
-        <w:t>Model tunning : optimiser les hyperparametres pour améliorer les performances du modele.</w:t>
+        <w:t>Days 46–</w:t>
+      </w:r>
+      <w:proofErr w:type="gramStart"/>
+      <w:r>
+        <w:rPr>
+          <w:rFonts w:ascii="Times New Roman" w:eastAsia="Times New Roman" w:hAnsi="Times New Roman" w:cs="Times New Roman"/>
+          <w:b/>
+          <w:bCs/>
+          <w:kern w:val="0"/>
+          <w:sz w:val="27"/>
+          <w:szCs w:val="27"/>
+          <w:lang w:eastAsia="fr-FR"/>
+          <w14:ligatures w14:val="none"/>
+        </w:rPr>
+        <w:t>50:</w:t>
+      </w:r>
+      <w:proofErr w:type="gramEnd"/>
+      <w:r>
+        <w:rPr>
+          <w:rFonts w:ascii="Times New Roman" w:eastAsia="Times New Roman" w:hAnsi="Times New Roman" w:cs="Times New Roman"/>
+          <w:b/>
+          <w:bCs/>
+          <w:kern w:val="0"/>
+          <w:sz w:val="27"/>
+          <w:szCs w:val="27"/>
+          <w:lang w:eastAsia="fr-FR"/>
+          <w14:ligatures w14:val="none"/>
+        </w:rPr>
+        <w:t xml:space="preserve"> Model Tuning &amp; Validation</w:t>
+      </w:r>
+    </w:p>
+    <w:p>
+      <w:pPr>
+        <w:rPr>
+          <w:lang w:eastAsia="fr-FR"/>
+        </w:rPr>
+      </w:pPr>
+      <w:r>
+        <w:rPr>
+          <w:lang w:eastAsia="fr-FR"/>
+        </w:rPr>
+        <w:t xml:space="preserve">Model </w:t>
+      </w:r>
+      <w:proofErr w:type="spellStart"/>
+      <w:r>
+        <w:rPr>
+          <w:lang w:eastAsia="fr-FR"/>
+        </w:rPr>
+        <w:t>tunning</w:t>
+      </w:r>
+      <w:proofErr w:type="spellEnd"/>
+      <w:r>
+        <w:rPr>
+          <w:lang w:eastAsia="fr-FR"/>
+        </w:rPr>
+        <w:t xml:space="preserve"> : optimiser les </w:t>
+      </w:r>
+      <w:proofErr w:type="spellStart"/>
+      <w:r>
+        <w:rPr>
+          <w:lang w:eastAsia="fr-FR"/>
+        </w:rPr>
+        <w:t>hyperparametres</w:t>
+      </w:r>
+      <w:proofErr w:type="spellEnd"/>
+      <w:r>
+        <w:rPr>
+          <w:lang w:eastAsia="fr-FR"/>
+        </w:rPr>
+        <w:t xml:space="preserve"> pour améliorer les performances du </w:t>
+      </w:r>
+      <w:proofErr w:type="spellStart"/>
+      <w:r>
+        <w:rPr>
+          <w:lang w:eastAsia="fr-FR"/>
+        </w:rPr>
+        <w:t>modele</w:t>
+      </w:r>
+      <w:proofErr w:type="spellEnd"/>
+      <w:r>
+        <w:rPr>
+          <w:lang w:eastAsia="fr-FR"/>
+        </w:rPr>
+        <w:t>.</w:t>
       </w:r>
     </w:p>
     <w:p>
@@ -3466,6 +4713,7 @@
           <w14:ligatures w14:val="none"/>
         </w:rPr>
       </w:pPr>
+      <w:proofErr w:type="spellStart"/>
       <w:r>
         <w:rPr>
           <w:rFonts w:ascii="Times New Roman" w:eastAsia="Times New Roman" w:hAnsi="Times New Roman" w:cs="Times New Roman"/>
@@ -3478,7 +4726,22 @@
           <w:lang w:val="en-US" w:eastAsia="fr-FR"/>
           <w14:ligatures w14:val="none"/>
         </w:rPr>
-        <w:t xml:space="preserve">stratisfied k-fold, </w:t>
+        <w:t>stratisfied</w:t>
+      </w:r>
+      <w:proofErr w:type="spellEnd"/>
+      <w:r>
+        <w:rPr>
+          <w:rFonts w:ascii="Times New Roman" w:eastAsia="Times New Roman" w:hAnsi="Times New Roman" w:cs="Times New Roman"/>
+          <w:b/>
+          <w:bCs/>
+          <w:kern w:val="0"/>
+          <w:sz w:val="24"/>
+          <w:szCs w:val="24"/>
+          <w:highlight w:val="green"/>
+          <w:lang w:val="en-US" w:eastAsia="fr-FR"/>
+          <w14:ligatures w14:val="none"/>
+        </w:rPr>
+        <w:t xml:space="preserve"> k-fold, </w:t>
       </w:r>
     </w:p>
     <w:p>
@@ -3692,8 +4955,74 @@
           <w:lang w:eastAsia="fr-FR"/>
           <w14:ligatures w14:val="none"/>
         </w:rPr>
-        <w:t>Day 47: Grid Search, RandomizedSearch</w:t>
-      </w:r>
+        <w:t xml:space="preserve">Day </w:t>
+      </w:r>
+      <w:proofErr w:type="gramStart"/>
+      <w:r>
+        <w:rPr>
+          <w:rFonts w:ascii="Times New Roman" w:eastAsia="Times New Roman" w:hAnsi="Times New Roman" w:cs="Times New Roman"/>
+          <w:kern w:val="0"/>
+          <w:sz w:val="24"/>
+          <w:szCs w:val="24"/>
+          <w:highlight w:val="yellow"/>
+          <w:lang w:eastAsia="fr-FR"/>
+          <w14:ligatures w14:val="none"/>
+        </w:rPr>
+        <w:t>47:</w:t>
+      </w:r>
+      <w:proofErr w:type="gramEnd"/>
+      <w:r>
+        <w:rPr>
+          <w:rFonts w:ascii="Times New Roman" w:eastAsia="Times New Roman" w:hAnsi="Times New Roman" w:cs="Times New Roman"/>
+          <w:kern w:val="0"/>
+          <w:sz w:val="24"/>
+          <w:szCs w:val="24"/>
+          <w:highlight w:val="yellow"/>
+          <w:lang w:eastAsia="fr-FR"/>
+          <w14:ligatures w14:val="none"/>
+        </w:rPr>
+        <w:t xml:space="preserve"> </w:t>
+      </w:r>
+      <w:proofErr w:type="spellStart"/>
+      <w:r>
+        <w:rPr>
+          <w:rFonts w:ascii="Times New Roman" w:eastAsia="Times New Roman" w:hAnsi="Times New Roman" w:cs="Times New Roman"/>
+          <w:kern w:val="0"/>
+          <w:sz w:val="24"/>
+          <w:szCs w:val="24"/>
+          <w:highlight w:val="yellow"/>
+          <w:lang w:eastAsia="fr-FR"/>
+          <w14:ligatures w14:val="none"/>
+        </w:rPr>
+        <w:t>Grid</w:t>
+      </w:r>
+      <w:proofErr w:type="spellEnd"/>
+      <w:r>
+        <w:rPr>
+          <w:rFonts w:ascii="Times New Roman" w:eastAsia="Times New Roman" w:hAnsi="Times New Roman" w:cs="Times New Roman"/>
+          <w:kern w:val="0"/>
+          <w:sz w:val="24"/>
+          <w:szCs w:val="24"/>
+          <w:highlight w:val="yellow"/>
+          <w:lang w:eastAsia="fr-FR"/>
+          <w14:ligatures w14:val="none"/>
+        </w:rPr>
+        <w:t xml:space="preserve"> Search, </w:t>
+      </w:r>
+      <w:proofErr w:type="spellStart"/>
+      <w:r>
+        <w:rPr>
+          <w:rFonts w:ascii="Times New Roman" w:eastAsia="Times New Roman" w:hAnsi="Times New Roman" w:cs="Times New Roman"/>
+          <w:kern w:val="0"/>
+          <w:sz w:val="24"/>
+          <w:szCs w:val="24"/>
+          <w:highlight w:val="yellow"/>
+          <w:lang w:eastAsia="fr-FR"/>
+          <w14:ligatures w14:val="none"/>
+        </w:rPr>
+        <w:t>RandomizedSearch</w:t>
+      </w:r>
+      <w:proofErr w:type="spellEnd"/>
     </w:p>
     <w:p>
       <w:pPr>
@@ -3736,6 +5065,7 @@
         </w:rPr>
         <w:t xml:space="preserve">, </w:t>
       </w:r>
+      <w:proofErr w:type="spellStart"/>
       <w:r>
         <w:rPr>
           <w:rFonts w:ascii="Times New Roman" w:eastAsia="Times New Roman" w:hAnsi="Times New Roman" w:cs="Times New Roman"/>
@@ -3748,6 +5078,7 @@
         </w:rPr>
         <w:t>SelectFromModel</w:t>
       </w:r>
+      <w:proofErr w:type="spellEnd"/>
     </w:p>
     <w:p>
       <w:pPr>
@@ -3874,7 +5205,35 @@
           <w:lang w:val="en-US" w:eastAsia="fr-FR"/>
           <w14:ligatures w14:val="none"/>
         </w:rPr>
-        <w:t xml:space="preserve"> Phase 3: Intermediate Topics (Days 51–80)</w:t>
+        <w:t xml:space="preserve"> Phase </w:t>
+      </w:r>
+      <w:proofErr w:type="gramStart"/>
+      <w:r>
+        <w:rPr>
+          <w:rFonts w:ascii="Times New Roman" w:eastAsia="Times New Roman" w:hAnsi="Times New Roman" w:cs="Times New Roman"/>
+          <w:b/>
+          <w:bCs/>
+          <w:kern w:val="0"/>
+          <w:sz w:val="36"/>
+          <w:szCs w:val="36"/>
+          <w:lang w:val="en-US" w:eastAsia="fr-FR"/>
+          <w14:ligatures w14:val="none"/>
+        </w:rPr>
+        <w:t>3:</w:t>
+      </w:r>
+      <w:proofErr w:type="gramEnd"/>
+      <w:r>
+        <w:rPr>
+          <w:rFonts w:ascii="Times New Roman" w:eastAsia="Times New Roman" w:hAnsi="Times New Roman" w:cs="Times New Roman"/>
+          <w:b/>
+          <w:bCs/>
+          <w:kern w:val="0"/>
+          <w:sz w:val="36"/>
+          <w:szCs w:val="36"/>
+          <w:lang w:val="en-US" w:eastAsia="fr-FR"/>
+          <w14:ligatures w14:val="none"/>
+        </w:rPr>
+        <w:t xml:space="preserve"> Intermediate Topics (Days 51–80)</w:t>
       </w:r>
     </w:p>
     <w:p>
@@ -3903,7 +5262,63 @@
           <w:lang w:eastAsia="fr-FR"/>
           <w14:ligatures w14:val="none"/>
         </w:rPr>
-        <w:t>Days 51–55: Unsupervised Learning</w:t>
+        <w:t>Days 51–</w:t>
+      </w:r>
+      <w:proofErr w:type="gramStart"/>
+      <w:r>
+        <w:rPr>
+          <w:rFonts w:ascii="Times New Roman" w:eastAsia="Times New Roman" w:hAnsi="Times New Roman" w:cs="Times New Roman"/>
+          <w:b/>
+          <w:bCs/>
+          <w:kern w:val="0"/>
+          <w:sz w:val="27"/>
+          <w:szCs w:val="27"/>
+          <w:lang w:eastAsia="fr-FR"/>
+          <w14:ligatures w14:val="none"/>
+        </w:rPr>
+        <w:t>55:</w:t>
+      </w:r>
+      <w:proofErr w:type="gramEnd"/>
+      <w:r>
+        <w:rPr>
+          <w:rFonts w:ascii="Times New Roman" w:eastAsia="Times New Roman" w:hAnsi="Times New Roman" w:cs="Times New Roman"/>
+          <w:b/>
+          <w:bCs/>
+          <w:kern w:val="0"/>
+          <w:sz w:val="27"/>
+          <w:szCs w:val="27"/>
+          <w:lang w:eastAsia="fr-FR"/>
+          <w14:ligatures w14:val="none"/>
+        </w:rPr>
+        <w:t xml:space="preserve"> </w:t>
+      </w:r>
+      <w:proofErr w:type="spellStart"/>
+      <w:r>
+        <w:rPr>
+          <w:rFonts w:ascii="Times New Roman" w:eastAsia="Times New Roman" w:hAnsi="Times New Roman" w:cs="Times New Roman"/>
+          <w:b/>
+          <w:bCs/>
+          <w:kern w:val="0"/>
+          <w:sz w:val="27"/>
+          <w:szCs w:val="27"/>
+          <w:lang w:eastAsia="fr-FR"/>
+          <w14:ligatures w14:val="none"/>
+        </w:rPr>
+        <w:t>Unsupervised</w:t>
+      </w:r>
+      <w:proofErr w:type="spellEnd"/>
+      <w:r>
+        <w:rPr>
+          <w:rFonts w:ascii="Times New Roman" w:eastAsia="Times New Roman" w:hAnsi="Times New Roman" w:cs="Times New Roman"/>
+          <w:b/>
+          <w:bCs/>
+          <w:kern w:val="0"/>
+          <w:sz w:val="27"/>
+          <w:szCs w:val="27"/>
+          <w:lang w:eastAsia="fr-FR"/>
+          <w14:ligatures w14:val="none"/>
+        </w:rPr>
+        <w:t xml:space="preserve"> Learning</w:t>
       </w:r>
     </w:p>
     <w:p>
@@ -3959,8 +5374,69 @@
           <w:lang w:eastAsia="fr-FR"/>
           <w14:ligatures w14:val="none"/>
         </w:rPr>
-        <w:t>Day 52: K-means implementation</w:t>
-      </w:r>
+        <w:t xml:space="preserve">Day </w:t>
+      </w:r>
+      <w:proofErr w:type="gramStart"/>
+      <w:r>
+        <w:rPr>
+          <w:rFonts w:ascii="Times New Roman" w:eastAsia="Times New Roman" w:hAnsi="Times New Roman" w:cs="Times New Roman"/>
+          <w:kern w:val="0"/>
+          <w:sz w:val="24"/>
+          <w:szCs w:val="24"/>
+          <w:lang w:eastAsia="fr-FR"/>
+          <w14:ligatures w14:val="none"/>
+        </w:rPr>
+        <w:t>52:</w:t>
+      </w:r>
+      <w:proofErr w:type="gramEnd"/>
+      <w:r>
+        <w:rPr>
+          <w:rFonts w:ascii="Times New Roman" w:eastAsia="Times New Roman" w:hAnsi="Times New Roman" w:cs="Times New Roman"/>
+          <w:kern w:val="0"/>
+          <w:sz w:val="24"/>
+          <w:szCs w:val="24"/>
+          <w:lang w:eastAsia="fr-FR"/>
+          <w14:ligatures w14:val="none"/>
+        </w:rPr>
+        <w:t xml:space="preserve"> K-</w:t>
+      </w:r>
+      <w:proofErr w:type="spellStart"/>
+      <w:r>
+        <w:rPr>
+          <w:rFonts w:ascii="Times New Roman" w:eastAsia="Times New Roman" w:hAnsi="Times New Roman" w:cs="Times New Roman"/>
+          <w:kern w:val="0"/>
+          <w:sz w:val="24"/>
+          <w:szCs w:val="24"/>
+          <w:lang w:eastAsia="fr-FR"/>
+          <w14:ligatures w14:val="none"/>
+        </w:rPr>
+        <w:t>means</w:t>
+      </w:r>
+      <w:proofErr w:type="spellEnd"/>
+      <w:r>
+        <w:rPr>
+          <w:rFonts w:ascii="Times New Roman" w:eastAsia="Times New Roman" w:hAnsi="Times New Roman" w:cs="Times New Roman"/>
+          <w:kern w:val="0"/>
+          <w:sz w:val="24"/>
+          <w:szCs w:val="24"/>
+          <w:lang w:eastAsia="fr-FR"/>
+          <w14:ligatures w14:val="none"/>
+        </w:rPr>
+        <w:t xml:space="preserve"> </w:t>
+      </w:r>
+      <w:proofErr w:type="spellStart"/>
+      <w:r>
+        <w:rPr>
+          <w:rFonts w:ascii="Times New Roman" w:eastAsia="Times New Roman" w:hAnsi="Times New Roman" w:cs="Times New Roman"/>
+          <w:kern w:val="0"/>
+          <w:sz w:val="24"/>
+          <w:szCs w:val="24"/>
+          <w:lang w:eastAsia="fr-FR"/>
+          <w14:ligatures w14:val="none"/>
+        </w:rPr>
+        <w:t>implementation</w:t>
+      </w:r>
+      <w:proofErr w:type="spellEnd"/>
     </w:p>
     <w:p>
       <w:pPr>
@@ -3987,7 +5463,55 @@
           <w:lang w:eastAsia="fr-FR"/>
           <w14:ligatures w14:val="none"/>
         </w:rPr>
-        <w:t>Day 53: DBSCAN and hierarchical clustering</w:t>
+        <w:t xml:space="preserve">Day </w:t>
+      </w:r>
+      <w:proofErr w:type="gramStart"/>
+      <w:r>
+        <w:rPr>
+          <w:rFonts w:ascii="Times New Roman" w:eastAsia="Times New Roman" w:hAnsi="Times New Roman" w:cs="Times New Roman"/>
+          <w:kern w:val="0"/>
+          <w:sz w:val="24"/>
+          <w:szCs w:val="24"/>
+          <w:lang w:eastAsia="fr-FR"/>
+          <w14:ligatures w14:val="none"/>
+        </w:rPr>
+        <w:t>53:</w:t>
+      </w:r>
+      <w:proofErr w:type="gramEnd"/>
+      <w:r>
+        <w:rPr>
+          <w:rFonts w:ascii="Times New Roman" w:eastAsia="Times New Roman" w:hAnsi="Times New Roman" w:cs="Times New Roman"/>
+          <w:kern w:val="0"/>
+          <w:sz w:val="24"/>
+          <w:szCs w:val="24"/>
+          <w:lang w:eastAsia="fr-FR"/>
+          <w14:ligatures w14:val="none"/>
+        </w:rPr>
+        <w:t xml:space="preserve"> DBSCAN and </w:t>
+      </w:r>
+      <w:proofErr w:type="spellStart"/>
+      <w:r>
+        <w:rPr>
+          <w:rFonts w:ascii="Times New Roman" w:eastAsia="Times New Roman" w:hAnsi="Times New Roman" w:cs="Times New Roman"/>
+          <w:kern w:val="0"/>
+          <w:sz w:val="24"/>
+          <w:szCs w:val="24"/>
+          <w:lang w:eastAsia="fr-FR"/>
+          <w14:ligatures w14:val="none"/>
+        </w:rPr>
+        <w:t>hierarchical</w:t>
+      </w:r>
+      <w:proofErr w:type="spellEnd"/>
+      <w:r>
+        <w:rPr>
+          <w:rFonts w:ascii="Times New Roman" w:eastAsia="Times New Roman" w:hAnsi="Times New Roman" w:cs="Times New Roman"/>
+          <w:kern w:val="0"/>
+          <w:sz w:val="24"/>
+          <w:szCs w:val="24"/>
+          <w:lang w:eastAsia="fr-FR"/>
+          <w14:ligatures w14:val="none"/>
+        </w:rPr>
+        <w:t xml:space="preserve"> clustering</w:t>
       </w:r>
     </w:p>
     <w:p>
@@ -4015,7 +5539,79 @@
           <w:lang w:eastAsia="fr-FR"/>
           <w14:ligatures w14:val="none"/>
         </w:rPr>
-        <w:t>Day 54: Dimensionality reduction (PCA)</w:t>
+        <w:t xml:space="preserve">Day </w:t>
+      </w:r>
+      <w:proofErr w:type="gramStart"/>
+      <w:r>
+        <w:rPr>
+          <w:rFonts w:ascii="Times New Roman" w:eastAsia="Times New Roman" w:hAnsi="Times New Roman" w:cs="Times New Roman"/>
+          <w:kern w:val="0"/>
+          <w:sz w:val="24"/>
+          <w:szCs w:val="24"/>
+          <w:lang w:eastAsia="fr-FR"/>
+          <w14:ligatures w14:val="none"/>
+        </w:rPr>
+        <w:t>54:</w:t>
+      </w:r>
+      <w:proofErr w:type="gramEnd"/>
+      <w:r>
+        <w:rPr>
+          <w:rFonts w:ascii="Times New Roman" w:eastAsia="Times New Roman" w:hAnsi="Times New Roman" w:cs="Times New Roman"/>
+          <w:kern w:val="0"/>
+          <w:sz w:val="24"/>
+          <w:szCs w:val="24"/>
+          <w:lang w:eastAsia="fr-FR"/>
+          <w14:ligatures w14:val="none"/>
+        </w:rPr>
+        <w:t xml:space="preserve"> </w:t>
+      </w:r>
+      <w:proofErr w:type="spellStart"/>
+      <w:r>
+        <w:rPr>
+          <w:rFonts w:ascii="Times New Roman" w:eastAsia="Times New Roman" w:hAnsi="Times New Roman" w:cs="Times New Roman"/>
+          <w:kern w:val="0"/>
+          <w:sz w:val="24"/>
+          <w:szCs w:val="24"/>
+          <w:lang w:eastAsia="fr-FR"/>
+          <w14:ligatures w14:val="none"/>
+        </w:rPr>
+        <w:t>Dimensionality</w:t>
+      </w:r>
+      <w:proofErr w:type="spellEnd"/>
+      <w:r>
+        <w:rPr>
+          <w:rFonts w:ascii="Times New Roman" w:eastAsia="Times New Roman" w:hAnsi="Times New Roman" w:cs="Times New Roman"/>
+          <w:kern w:val="0"/>
+          <w:sz w:val="24"/>
+          <w:szCs w:val="24"/>
+          <w:lang w:eastAsia="fr-FR"/>
+          <w14:ligatures w14:val="none"/>
+        </w:rPr>
+        <w:t xml:space="preserve"> </w:t>
+      </w:r>
+      <w:proofErr w:type="spellStart"/>
+      <w:r>
+        <w:rPr>
+          <w:rFonts w:ascii="Times New Roman" w:eastAsia="Times New Roman" w:hAnsi="Times New Roman" w:cs="Times New Roman"/>
+          <w:kern w:val="0"/>
+          <w:sz w:val="24"/>
+          <w:szCs w:val="24"/>
+          <w:lang w:eastAsia="fr-FR"/>
+          <w14:ligatures w14:val="none"/>
+        </w:rPr>
+        <w:t>reduction</w:t>
+      </w:r>
+      <w:proofErr w:type="spellEnd"/>
+      <w:r>
+        <w:rPr>
+          <w:rFonts w:ascii="Times New Roman" w:eastAsia="Times New Roman" w:hAnsi="Times New Roman" w:cs="Times New Roman"/>
+          <w:kern w:val="0"/>
+          <w:sz w:val="24"/>
+          <w:szCs w:val="24"/>
+          <w:lang w:eastAsia="fr-FR"/>
+          <w14:ligatures w14:val="none"/>
+        </w:rPr>
+        <w:t xml:space="preserve"> (PCA)</w:t>
       </w:r>
     </w:p>
     <w:p>
@@ -4094,7 +5690,63 @@
           <w:lang w:eastAsia="fr-FR"/>
           <w14:ligatures w14:val="none"/>
         </w:rPr>
-        <w:t>Days 56–60: Feature Engineering</w:t>
+        <w:t>Days 56–</w:t>
+      </w:r>
+      <w:proofErr w:type="gramStart"/>
+      <w:r>
+        <w:rPr>
+          <w:rFonts w:ascii="Times New Roman" w:eastAsia="Times New Roman" w:hAnsi="Times New Roman" w:cs="Times New Roman"/>
+          <w:b/>
+          <w:bCs/>
+          <w:kern w:val="0"/>
+          <w:sz w:val="27"/>
+          <w:szCs w:val="27"/>
+          <w:lang w:eastAsia="fr-FR"/>
+          <w14:ligatures w14:val="none"/>
+        </w:rPr>
+        <w:t>60:</w:t>
+      </w:r>
+      <w:proofErr w:type="gramEnd"/>
+      <w:r>
+        <w:rPr>
+          <w:rFonts w:ascii="Times New Roman" w:eastAsia="Times New Roman" w:hAnsi="Times New Roman" w:cs="Times New Roman"/>
+          <w:b/>
+          <w:bCs/>
+          <w:kern w:val="0"/>
+          <w:sz w:val="27"/>
+          <w:szCs w:val="27"/>
+          <w:lang w:eastAsia="fr-FR"/>
+          <w14:ligatures w14:val="none"/>
+        </w:rPr>
+        <w:t xml:space="preserve"> </w:t>
+      </w:r>
+      <w:proofErr w:type="spellStart"/>
+      <w:r>
+        <w:rPr>
+          <w:rFonts w:ascii="Times New Roman" w:eastAsia="Times New Roman" w:hAnsi="Times New Roman" w:cs="Times New Roman"/>
+          <w:b/>
+          <w:bCs/>
+          <w:kern w:val="0"/>
+          <w:sz w:val="27"/>
+          <w:szCs w:val="27"/>
+          <w:lang w:eastAsia="fr-FR"/>
+          <w14:ligatures w14:val="none"/>
+        </w:rPr>
+        <w:t>Feature</w:t>
+      </w:r>
+      <w:proofErr w:type="spellEnd"/>
+      <w:r>
+        <w:rPr>
+          <w:rFonts w:ascii="Times New Roman" w:eastAsia="Times New Roman" w:hAnsi="Times New Roman" w:cs="Times New Roman"/>
+          <w:b/>
+          <w:bCs/>
+          <w:kern w:val="0"/>
+          <w:sz w:val="27"/>
+          <w:szCs w:val="27"/>
+          <w:lang w:eastAsia="fr-FR"/>
+          <w14:ligatures w14:val="none"/>
+        </w:rPr>
+        <w:t xml:space="preserve"> Engineering</w:t>
       </w:r>
     </w:p>
     <w:p>
@@ -4184,8 +5836,48 @@
           <w:lang w:eastAsia="fr-FR"/>
           <w14:ligatures w14:val="none"/>
         </w:rPr>
-        <w:t>Day 58: Binning, interaction terms</w:t>
-      </w:r>
+        <w:t xml:space="preserve">Day </w:t>
+      </w:r>
+      <w:proofErr w:type="gramStart"/>
+      <w:r>
+        <w:rPr>
+          <w:rFonts w:ascii="Times New Roman" w:eastAsia="Times New Roman" w:hAnsi="Times New Roman" w:cs="Times New Roman"/>
+          <w:kern w:val="0"/>
+          <w:sz w:val="24"/>
+          <w:szCs w:val="24"/>
+          <w:highlight w:val="yellow"/>
+          <w:lang w:eastAsia="fr-FR"/>
+          <w14:ligatures w14:val="none"/>
+        </w:rPr>
+        <w:t>58:</w:t>
+      </w:r>
+      <w:proofErr w:type="gramEnd"/>
+      <w:r>
+        <w:rPr>
+          <w:rFonts w:ascii="Times New Roman" w:eastAsia="Times New Roman" w:hAnsi="Times New Roman" w:cs="Times New Roman"/>
+          <w:kern w:val="0"/>
+          <w:sz w:val="24"/>
+          <w:szCs w:val="24"/>
+          <w:highlight w:val="yellow"/>
+          <w:lang w:eastAsia="fr-FR"/>
+          <w14:ligatures w14:val="none"/>
+        </w:rPr>
+        <w:t xml:space="preserve"> Binning, interaction </w:t>
+      </w:r>
+      <w:proofErr w:type="spellStart"/>
+      <w:r>
+        <w:rPr>
+          <w:rFonts w:ascii="Times New Roman" w:eastAsia="Times New Roman" w:hAnsi="Times New Roman" w:cs="Times New Roman"/>
+          <w:kern w:val="0"/>
+          <w:sz w:val="24"/>
+          <w:szCs w:val="24"/>
+          <w:highlight w:val="yellow"/>
+          <w:lang w:eastAsia="fr-FR"/>
+          <w14:ligatures w14:val="none"/>
+        </w:rPr>
+        <w:t>terms</w:t>
+      </w:r>
+      <w:proofErr w:type="spellEnd"/>
       <w:r>
         <w:rPr>
           <w:rFonts w:ascii="Times New Roman" w:eastAsia="Times New Roman" w:hAnsi="Times New Roman" w:cs="Times New Roman"/>
@@ -4208,18 +5900,20 @@
           <w:kern w:val="0"/>
           <w:sz w:val="24"/>
           <w:szCs w:val="24"/>
-          <w:lang w:eastAsia="fr-FR"/>
-          <w14:ligatures w14:val="none"/>
-        </w:rPr>
-      </w:pPr>
-      <w:r>
-        <w:rPr>
-          <w:rFonts w:ascii="Times New Roman" w:eastAsia="Times New Roman" w:hAnsi="Times New Roman" w:cs="Times New Roman"/>
-          <w:b/>
-          <w:bCs/>
-          <w:kern w:val="0"/>
-          <w:sz w:val="24"/>
-          <w:szCs w:val="24"/>
+          <w:highlight w:val="yellow"/>
+          <w:lang w:eastAsia="fr-FR"/>
+          <w14:ligatures w14:val="none"/>
+        </w:rPr>
+      </w:pPr>
+      <w:r>
+        <w:rPr>
+          <w:rFonts w:ascii="Times New Roman" w:eastAsia="Times New Roman" w:hAnsi="Times New Roman" w:cs="Times New Roman"/>
+          <w:b/>
+          <w:bCs/>
+          <w:kern w:val="0"/>
+          <w:sz w:val="24"/>
+          <w:szCs w:val="24"/>
+          <w:highlight w:val="yellow"/>
           <w:lang w:eastAsia="fr-FR"/>
           <w14:ligatures w14:val="none"/>
         </w:rPr>
@@ -4231,10 +5925,103 @@
           <w:kern w:val="0"/>
           <w:sz w:val="24"/>
           <w:szCs w:val="24"/>
-          <w:lang w:eastAsia="fr-FR"/>
-          <w14:ligatures w14:val="none"/>
-        </w:rPr>
-        <w:t>c’est render une variable continue en catégorie par exemple age : « jeune » = [0,20] « adult »= [21,40] « senior » = [41+]</w:t>
+          <w:highlight w:val="yellow"/>
+          <w:lang w:eastAsia="fr-FR"/>
+          <w14:ligatures w14:val="none"/>
+        </w:rPr>
+        <w:t xml:space="preserve">c’est </w:t>
+      </w:r>
+      <w:proofErr w:type="spellStart"/>
+      <w:r>
+        <w:rPr>
+          <w:rFonts w:ascii="Times New Roman" w:eastAsia="Times New Roman" w:hAnsi="Times New Roman" w:cs="Times New Roman"/>
+          <w:kern w:val="0"/>
+          <w:sz w:val="24"/>
+          <w:szCs w:val="24"/>
+          <w:highlight w:val="yellow"/>
+          <w:lang w:eastAsia="fr-FR"/>
+          <w14:ligatures w14:val="none"/>
+        </w:rPr>
+        <w:t>render</w:t>
+      </w:r>
+      <w:proofErr w:type="spellEnd"/>
+      <w:r>
+        <w:rPr>
+          <w:rFonts w:ascii="Times New Roman" w:eastAsia="Times New Roman" w:hAnsi="Times New Roman" w:cs="Times New Roman"/>
+          <w:kern w:val="0"/>
+          <w:sz w:val="24"/>
+          <w:szCs w:val="24"/>
+          <w:highlight w:val="yellow"/>
+          <w:lang w:eastAsia="fr-FR"/>
+          <w14:ligatures w14:val="none"/>
+        </w:rPr>
+        <w:t xml:space="preserve"> une variable continue en catégorie par exemple </w:t>
+      </w:r>
+      <w:proofErr w:type="spellStart"/>
+      <w:r>
+        <w:rPr>
+          <w:rFonts w:ascii="Times New Roman" w:eastAsia="Times New Roman" w:hAnsi="Times New Roman" w:cs="Times New Roman"/>
+          <w:kern w:val="0"/>
+          <w:sz w:val="24"/>
+          <w:szCs w:val="24"/>
+          <w:highlight w:val="yellow"/>
+          <w:lang w:eastAsia="fr-FR"/>
+          <w14:ligatures w14:val="none"/>
+        </w:rPr>
+        <w:t>age</w:t>
+      </w:r>
+      <w:proofErr w:type="spellEnd"/>
+      <w:r>
+        <w:rPr>
+          <w:rFonts w:ascii="Times New Roman" w:eastAsia="Times New Roman" w:hAnsi="Times New Roman" w:cs="Times New Roman"/>
+          <w:kern w:val="0"/>
+          <w:sz w:val="24"/>
+          <w:szCs w:val="24"/>
+          <w:highlight w:val="yellow"/>
+          <w:lang w:eastAsia="fr-FR"/>
+          <w14:ligatures w14:val="none"/>
+        </w:rPr>
+        <w:t> : « jeune » = [0,20] « </w:t>
+      </w:r>
+      <w:proofErr w:type="spellStart"/>
+      <w:r>
+        <w:rPr>
+          <w:rFonts w:ascii="Times New Roman" w:eastAsia="Times New Roman" w:hAnsi="Times New Roman" w:cs="Times New Roman"/>
+          <w:kern w:val="0"/>
+          <w:sz w:val="24"/>
+          <w:szCs w:val="24"/>
+          <w:highlight w:val="yellow"/>
+          <w:lang w:eastAsia="fr-FR"/>
+          <w14:ligatures w14:val="none"/>
+        </w:rPr>
+        <w:t>adult</w:t>
+      </w:r>
+      <w:proofErr w:type="spellEnd"/>
+      <w:proofErr w:type="gramStart"/>
+      <w:r>
+        <w:rPr>
+          <w:rFonts w:ascii="Times New Roman" w:eastAsia="Times New Roman" w:hAnsi="Times New Roman" w:cs="Times New Roman"/>
+          <w:kern w:val="0"/>
+          <w:sz w:val="24"/>
+          <w:szCs w:val="24"/>
+          <w:highlight w:val="yellow"/>
+          <w:lang w:eastAsia="fr-FR"/>
+          <w14:ligatures w14:val="none"/>
+        </w:rPr>
+        <w:t> »=</w:t>
+      </w:r>
+      <w:proofErr w:type="gramEnd"/>
+      <w:r>
+        <w:rPr>
+          <w:rFonts w:ascii="Times New Roman" w:eastAsia="Times New Roman" w:hAnsi="Times New Roman" w:cs="Times New Roman"/>
+          <w:kern w:val="0"/>
+          <w:sz w:val="24"/>
+          <w:szCs w:val="24"/>
+          <w:highlight w:val="yellow"/>
+          <w:lang w:eastAsia="fr-FR"/>
+          <w14:ligatures w14:val="none"/>
+        </w:rPr>
+        <w:t xml:space="preserve"> [21,40] « senior » = [41+]</w:t>
       </w:r>
     </w:p>
     <w:p>
@@ -4246,33 +6033,92 @@
           <w:kern w:val="0"/>
           <w:sz w:val="24"/>
           <w:szCs w:val="24"/>
-          <w:lang w:eastAsia="fr-FR"/>
-          <w14:ligatures w14:val="none"/>
-        </w:rPr>
-      </w:pPr>
-      <w:r>
-        <w:rPr>
-          <w:rFonts w:ascii="Times New Roman" w:eastAsia="Times New Roman" w:hAnsi="Times New Roman" w:cs="Times New Roman"/>
-          <w:b/>
-          <w:bCs/>
-          <w:kern w:val="0"/>
-          <w:sz w:val="24"/>
-          <w:szCs w:val="24"/>
-          <w:lang w:eastAsia="fr-FR"/>
-          <w14:ligatures w14:val="none"/>
-        </w:rPr>
-        <w:t xml:space="preserve">Interaction terms </w:t>
-      </w:r>
-      <w:r>
-        <w:rPr>
-          <w:rFonts w:ascii="Times New Roman" w:eastAsia="Times New Roman" w:hAnsi="Times New Roman" w:cs="Times New Roman"/>
-          <w:kern w:val="0"/>
-          <w:sz w:val="24"/>
-          <w:szCs w:val="24"/>
-          <w:lang w:eastAsia="fr-FR"/>
-          <w14:ligatures w14:val="none"/>
-        </w:rPr>
-        <w:t xml:space="preserve">c’est créer de nouvelles features par exemple </w:t>
+          <w:highlight w:val="yellow"/>
+          <w:lang w:eastAsia="fr-FR"/>
+          <w14:ligatures w14:val="none"/>
+        </w:rPr>
+      </w:pPr>
+      <w:r>
+        <w:rPr>
+          <w:rFonts w:ascii="Times New Roman" w:eastAsia="Times New Roman" w:hAnsi="Times New Roman" w:cs="Times New Roman"/>
+          <w:b/>
+          <w:bCs/>
+          <w:kern w:val="0"/>
+          <w:sz w:val="24"/>
+          <w:szCs w:val="24"/>
+          <w:highlight w:val="yellow"/>
+          <w:lang w:eastAsia="fr-FR"/>
+          <w14:ligatures w14:val="none"/>
+        </w:rPr>
+        <w:t xml:space="preserve">Interaction </w:t>
+      </w:r>
+      <w:proofErr w:type="spellStart"/>
+      <w:r>
+        <w:rPr>
+          <w:rFonts w:ascii="Times New Roman" w:eastAsia="Times New Roman" w:hAnsi="Times New Roman" w:cs="Times New Roman"/>
+          <w:b/>
+          <w:bCs/>
+          <w:kern w:val="0"/>
+          <w:sz w:val="24"/>
+          <w:szCs w:val="24"/>
+          <w:highlight w:val="yellow"/>
+          <w:lang w:eastAsia="fr-FR"/>
+          <w14:ligatures w14:val="none"/>
+        </w:rPr>
+        <w:t>terms</w:t>
+      </w:r>
+      <w:proofErr w:type="spellEnd"/>
+      <w:r>
+        <w:rPr>
+          <w:rFonts w:ascii="Times New Roman" w:eastAsia="Times New Roman" w:hAnsi="Times New Roman" w:cs="Times New Roman"/>
+          <w:b/>
+          <w:bCs/>
+          <w:kern w:val="0"/>
+          <w:sz w:val="24"/>
+          <w:szCs w:val="24"/>
+          <w:highlight w:val="yellow"/>
+          <w:lang w:eastAsia="fr-FR"/>
+          <w14:ligatures w14:val="none"/>
+        </w:rPr>
+        <w:t xml:space="preserve"> </w:t>
+      </w:r>
+      <w:r>
+        <w:rPr>
+          <w:rFonts w:ascii="Times New Roman" w:eastAsia="Times New Roman" w:hAnsi="Times New Roman" w:cs="Times New Roman"/>
+          <w:kern w:val="0"/>
+          <w:sz w:val="24"/>
+          <w:szCs w:val="24"/>
+          <w:highlight w:val="yellow"/>
+          <w:lang w:eastAsia="fr-FR"/>
+          <w14:ligatures w14:val="none"/>
+        </w:rPr>
+        <w:t xml:space="preserve">c’est créer de nouvelles </w:t>
+      </w:r>
+      <w:proofErr w:type="spellStart"/>
+      <w:r>
+        <w:rPr>
+          <w:rFonts w:ascii="Times New Roman" w:eastAsia="Times New Roman" w:hAnsi="Times New Roman" w:cs="Times New Roman"/>
+          <w:kern w:val="0"/>
+          <w:sz w:val="24"/>
+          <w:szCs w:val="24"/>
+          <w:highlight w:val="yellow"/>
+          <w:lang w:eastAsia="fr-FR"/>
+          <w14:ligatures w14:val="none"/>
+        </w:rPr>
+        <w:t>features</w:t>
+      </w:r>
+      <w:proofErr w:type="spellEnd"/>
+      <w:r>
+        <w:rPr>
+          <w:rFonts w:ascii="Times New Roman" w:eastAsia="Times New Roman" w:hAnsi="Times New Roman" w:cs="Times New Roman"/>
+          <w:kern w:val="0"/>
+          <w:sz w:val="24"/>
+          <w:szCs w:val="24"/>
+          <w:highlight w:val="yellow"/>
+          <w:lang w:eastAsia="fr-FR"/>
+          <w14:ligatures w14:val="none"/>
+        </w:rPr>
+        <w:t xml:space="preserve"> par exemple </w:t>
       </w:r>
     </w:p>
     <w:p>
@@ -4288,16 +6134,45 @@
           <w14:ligatures w14:val="none"/>
         </w:rPr>
       </w:pPr>
-      <w:r>
-        <w:rPr>
-          <w:rFonts w:ascii="Times New Roman" w:eastAsia="Times New Roman" w:hAnsi="Times New Roman" w:cs="Times New Roman"/>
-          <w:kern w:val="0"/>
-          <w:sz w:val="24"/>
-          <w:szCs w:val="24"/>
-          <w:lang w:eastAsia="fr-FR"/>
-          <w14:ligatures w14:val="none"/>
-        </w:rPr>
-        <w:t>feature_new = feature1 * feature2</w:t>
+      <w:proofErr w:type="spellStart"/>
+      <w:proofErr w:type="gramStart"/>
+      <w:r>
+        <w:rPr>
+          <w:rFonts w:ascii="Times New Roman" w:eastAsia="Times New Roman" w:hAnsi="Times New Roman" w:cs="Times New Roman"/>
+          <w:kern w:val="0"/>
+          <w:sz w:val="24"/>
+          <w:szCs w:val="24"/>
+          <w:highlight w:val="yellow"/>
+          <w:lang w:eastAsia="fr-FR"/>
+          <w14:ligatures w14:val="none"/>
+        </w:rPr>
+        <w:t>feature</w:t>
+      </w:r>
+      <w:proofErr w:type="gramEnd"/>
+      <w:r>
+        <w:rPr>
+          <w:rFonts w:ascii="Times New Roman" w:eastAsia="Times New Roman" w:hAnsi="Times New Roman" w:cs="Times New Roman"/>
+          <w:kern w:val="0"/>
+          <w:sz w:val="24"/>
+          <w:szCs w:val="24"/>
+          <w:highlight w:val="yellow"/>
+          <w:lang w:eastAsia="fr-FR"/>
+          <w14:ligatures w14:val="none"/>
+        </w:rPr>
+        <w:t>_new</w:t>
+      </w:r>
+      <w:proofErr w:type="spellEnd"/>
+      <w:r>
+        <w:rPr>
+          <w:rFonts w:ascii="Times New Roman" w:eastAsia="Times New Roman" w:hAnsi="Times New Roman" w:cs="Times New Roman"/>
+          <w:kern w:val="0"/>
+          <w:sz w:val="24"/>
+          <w:szCs w:val="24"/>
+          <w:highlight w:val="yellow"/>
+          <w:lang w:eastAsia="fr-FR"/>
+          <w14:ligatures w14:val="none"/>
+        </w:rPr>
+        <w:t xml:space="preserve"> = feature1 * feature2</w:t>
       </w:r>
     </w:p>
     <w:p>
@@ -4327,7 +6202,85 @@
           <w:lang w:eastAsia="fr-FR"/>
           <w14:ligatures w14:val="none"/>
         </w:rPr>
-        <w:t>Day 59: Feature selection techniques</w:t>
+        <w:t xml:space="preserve">Day </w:t>
+      </w:r>
+      <w:proofErr w:type="gramStart"/>
+      <w:r>
+        <w:rPr>
+          <w:rFonts w:ascii="Times New Roman" w:eastAsia="Times New Roman" w:hAnsi="Times New Roman" w:cs="Times New Roman"/>
+          <w:kern w:val="0"/>
+          <w:sz w:val="24"/>
+          <w:szCs w:val="24"/>
+          <w:highlight w:val="yellow"/>
+          <w:lang w:eastAsia="fr-FR"/>
+          <w14:ligatures w14:val="none"/>
+        </w:rPr>
+        <w:t>59:</w:t>
+      </w:r>
+      <w:proofErr w:type="gramEnd"/>
+      <w:r>
+        <w:rPr>
+          <w:rFonts w:ascii="Times New Roman" w:eastAsia="Times New Roman" w:hAnsi="Times New Roman" w:cs="Times New Roman"/>
+          <w:kern w:val="0"/>
+          <w:sz w:val="24"/>
+          <w:szCs w:val="24"/>
+          <w:highlight w:val="yellow"/>
+          <w:lang w:eastAsia="fr-FR"/>
+          <w14:ligatures w14:val="none"/>
+        </w:rPr>
+        <w:t xml:space="preserve"> </w:t>
+      </w:r>
+      <w:proofErr w:type="spellStart"/>
+      <w:r>
+        <w:rPr>
+          <w:rFonts w:ascii="Times New Roman" w:eastAsia="Times New Roman" w:hAnsi="Times New Roman" w:cs="Times New Roman"/>
+          <w:kern w:val="0"/>
+          <w:sz w:val="24"/>
+          <w:szCs w:val="24"/>
+          <w:highlight w:val="yellow"/>
+          <w:lang w:eastAsia="fr-FR"/>
+          <w14:ligatures w14:val="none"/>
+        </w:rPr>
+        <w:t>Feature</w:t>
+      </w:r>
+      <w:proofErr w:type="spellEnd"/>
+      <w:r>
+        <w:rPr>
+          <w:rFonts w:ascii="Times New Roman" w:eastAsia="Times New Roman" w:hAnsi="Times New Roman" w:cs="Times New Roman"/>
+          <w:kern w:val="0"/>
+          <w:sz w:val="24"/>
+          <w:szCs w:val="24"/>
+          <w:highlight w:val="yellow"/>
+          <w:lang w:eastAsia="fr-FR"/>
+          <w14:ligatures w14:val="none"/>
+        </w:rPr>
+        <w:t xml:space="preserve"> </w:t>
+      </w:r>
+      <w:proofErr w:type="spellStart"/>
+      <w:r>
+        <w:rPr>
+          <w:rFonts w:ascii="Times New Roman" w:eastAsia="Times New Roman" w:hAnsi="Times New Roman" w:cs="Times New Roman"/>
+          <w:kern w:val="0"/>
+          <w:sz w:val="24"/>
+          <w:szCs w:val="24"/>
+          <w:highlight w:val="yellow"/>
+          <w:lang w:eastAsia="fr-FR"/>
+          <w14:ligatures w14:val="none"/>
+        </w:rPr>
+        <w:t>selection</w:t>
+      </w:r>
+      <w:proofErr w:type="spellEnd"/>
+      <w:r>
+        <w:rPr>
+          <w:rFonts w:ascii="Times New Roman" w:eastAsia="Times New Roman" w:hAnsi="Times New Roman" w:cs="Times New Roman"/>
+          <w:kern w:val="0"/>
+          <w:sz w:val="24"/>
+          <w:szCs w:val="24"/>
+          <w:highlight w:val="yellow"/>
+          <w:lang w:eastAsia="fr-FR"/>
+          <w14:ligatures w14:val="none"/>
+        </w:rPr>
+        <w:t xml:space="preserve"> techniques</w:t>
       </w:r>
     </w:p>
     <w:p>
@@ -4386,7 +6339,63 @@
           <w:lang w:eastAsia="fr-FR"/>
           <w14:ligatures w14:val="none"/>
         </w:rPr>
-        <w:t>Days 61–65: Time Series Basics</w:t>
+        <w:t>Days 61–</w:t>
+      </w:r>
+      <w:proofErr w:type="gramStart"/>
+      <w:r>
+        <w:rPr>
+          <w:rFonts w:ascii="Times New Roman" w:eastAsia="Times New Roman" w:hAnsi="Times New Roman" w:cs="Times New Roman"/>
+          <w:b/>
+          <w:bCs/>
+          <w:kern w:val="0"/>
+          <w:sz w:val="27"/>
+          <w:szCs w:val="27"/>
+          <w:lang w:eastAsia="fr-FR"/>
+          <w14:ligatures w14:val="none"/>
+        </w:rPr>
+        <w:t>65:</w:t>
+      </w:r>
+      <w:proofErr w:type="gramEnd"/>
+      <w:r>
+        <w:rPr>
+          <w:rFonts w:ascii="Times New Roman" w:eastAsia="Times New Roman" w:hAnsi="Times New Roman" w:cs="Times New Roman"/>
+          <w:b/>
+          <w:bCs/>
+          <w:kern w:val="0"/>
+          <w:sz w:val="27"/>
+          <w:szCs w:val="27"/>
+          <w:lang w:eastAsia="fr-FR"/>
+          <w14:ligatures w14:val="none"/>
+        </w:rPr>
+        <w:t xml:space="preserve"> Time </w:t>
+      </w:r>
+      <w:proofErr w:type="spellStart"/>
+      <w:r>
+        <w:rPr>
+          <w:rFonts w:ascii="Times New Roman" w:eastAsia="Times New Roman" w:hAnsi="Times New Roman" w:cs="Times New Roman"/>
+          <w:b/>
+          <w:bCs/>
+          <w:kern w:val="0"/>
+          <w:sz w:val="27"/>
+          <w:szCs w:val="27"/>
+          <w:lang w:eastAsia="fr-FR"/>
+          <w14:ligatures w14:val="none"/>
+        </w:rPr>
+        <w:t>Series</w:t>
+      </w:r>
+      <w:proofErr w:type="spellEnd"/>
+      <w:r>
+        <w:rPr>
+          <w:rFonts w:ascii="Times New Roman" w:eastAsia="Times New Roman" w:hAnsi="Times New Roman" w:cs="Times New Roman"/>
+          <w:b/>
+          <w:bCs/>
+          <w:kern w:val="0"/>
+          <w:sz w:val="27"/>
+          <w:szCs w:val="27"/>
+          <w:lang w:eastAsia="fr-FR"/>
+          <w14:ligatures w14:val="none"/>
+        </w:rPr>
+        <w:t xml:space="preserve"> Basics</w:t>
       </w:r>
     </w:p>
     <w:p>
@@ -4470,8 +6479,69 @@
           <w:lang w:eastAsia="fr-FR"/>
           <w14:ligatures w14:val="none"/>
         </w:rPr>
-        <w:t>Day 63: Moving averages, differencing</w:t>
-      </w:r>
+        <w:t xml:space="preserve">Day </w:t>
+      </w:r>
+      <w:proofErr w:type="gramStart"/>
+      <w:r>
+        <w:rPr>
+          <w:rFonts w:ascii="Times New Roman" w:eastAsia="Times New Roman" w:hAnsi="Times New Roman" w:cs="Times New Roman"/>
+          <w:kern w:val="0"/>
+          <w:sz w:val="24"/>
+          <w:szCs w:val="24"/>
+          <w:lang w:eastAsia="fr-FR"/>
+          <w14:ligatures w14:val="none"/>
+        </w:rPr>
+        <w:t>63:</w:t>
+      </w:r>
+      <w:proofErr w:type="gramEnd"/>
+      <w:r>
+        <w:rPr>
+          <w:rFonts w:ascii="Times New Roman" w:eastAsia="Times New Roman" w:hAnsi="Times New Roman" w:cs="Times New Roman"/>
+          <w:kern w:val="0"/>
+          <w:sz w:val="24"/>
+          <w:szCs w:val="24"/>
+          <w:lang w:eastAsia="fr-FR"/>
+          <w14:ligatures w14:val="none"/>
+        </w:rPr>
+        <w:t xml:space="preserve"> Moving </w:t>
+      </w:r>
+      <w:proofErr w:type="spellStart"/>
+      <w:r>
+        <w:rPr>
+          <w:rFonts w:ascii="Times New Roman" w:eastAsia="Times New Roman" w:hAnsi="Times New Roman" w:cs="Times New Roman"/>
+          <w:kern w:val="0"/>
+          <w:sz w:val="24"/>
+          <w:szCs w:val="24"/>
+          <w:lang w:eastAsia="fr-FR"/>
+          <w14:ligatures w14:val="none"/>
+        </w:rPr>
+        <w:t>averages</w:t>
+      </w:r>
+      <w:proofErr w:type="spellEnd"/>
+      <w:r>
+        <w:rPr>
+          <w:rFonts w:ascii="Times New Roman" w:eastAsia="Times New Roman" w:hAnsi="Times New Roman" w:cs="Times New Roman"/>
+          <w:kern w:val="0"/>
+          <w:sz w:val="24"/>
+          <w:szCs w:val="24"/>
+          <w:lang w:eastAsia="fr-FR"/>
+          <w14:ligatures w14:val="none"/>
+        </w:rPr>
+        <w:t xml:space="preserve">, </w:t>
+      </w:r>
+      <w:proofErr w:type="spellStart"/>
+      <w:r>
+        <w:rPr>
+          <w:rFonts w:ascii="Times New Roman" w:eastAsia="Times New Roman" w:hAnsi="Times New Roman" w:cs="Times New Roman"/>
+          <w:kern w:val="0"/>
+          <w:sz w:val="24"/>
+          <w:szCs w:val="24"/>
+          <w:lang w:eastAsia="fr-FR"/>
+          <w14:ligatures w14:val="none"/>
+        </w:rPr>
+        <w:t>differencing</w:t>
+      </w:r>
+      <w:proofErr w:type="spellEnd"/>
     </w:p>
     <w:p>
       <w:pPr>
@@ -4498,8 +6568,69 @@
           <w:lang w:eastAsia="fr-FR"/>
           <w14:ligatures w14:val="none"/>
         </w:rPr>
-        <w:t>Day 64: Autocorrelation, stationarity</w:t>
-      </w:r>
+        <w:t xml:space="preserve">Day </w:t>
+      </w:r>
+      <w:proofErr w:type="gramStart"/>
+      <w:r>
+        <w:rPr>
+          <w:rFonts w:ascii="Times New Roman" w:eastAsia="Times New Roman" w:hAnsi="Times New Roman" w:cs="Times New Roman"/>
+          <w:kern w:val="0"/>
+          <w:sz w:val="24"/>
+          <w:szCs w:val="24"/>
+          <w:lang w:eastAsia="fr-FR"/>
+          <w14:ligatures w14:val="none"/>
+        </w:rPr>
+        <w:t>64:</w:t>
+      </w:r>
+      <w:proofErr w:type="gramEnd"/>
+      <w:r>
+        <w:rPr>
+          <w:rFonts w:ascii="Times New Roman" w:eastAsia="Times New Roman" w:hAnsi="Times New Roman" w:cs="Times New Roman"/>
+          <w:kern w:val="0"/>
+          <w:sz w:val="24"/>
+          <w:szCs w:val="24"/>
+          <w:lang w:eastAsia="fr-FR"/>
+          <w14:ligatures w14:val="none"/>
+        </w:rPr>
+        <w:t xml:space="preserve"> </w:t>
+      </w:r>
+      <w:proofErr w:type="spellStart"/>
+      <w:r>
+        <w:rPr>
+          <w:rFonts w:ascii="Times New Roman" w:eastAsia="Times New Roman" w:hAnsi="Times New Roman" w:cs="Times New Roman"/>
+          <w:kern w:val="0"/>
+          <w:sz w:val="24"/>
+          <w:szCs w:val="24"/>
+          <w:lang w:eastAsia="fr-FR"/>
+          <w14:ligatures w14:val="none"/>
+        </w:rPr>
+        <w:t>Autocorrelation</w:t>
+      </w:r>
+      <w:proofErr w:type="spellEnd"/>
+      <w:r>
+        <w:rPr>
+          <w:rFonts w:ascii="Times New Roman" w:eastAsia="Times New Roman" w:hAnsi="Times New Roman" w:cs="Times New Roman"/>
+          <w:kern w:val="0"/>
+          <w:sz w:val="24"/>
+          <w:szCs w:val="24"/>
+          <w:lang w:eastAsia="fr-FR"/>
+          <w14:ligatures w14:val="none"/>
+        </w:rPr>
+        <w:t xml:space="preserve">, </w:t>
+      </w:r>
+      <w:proofErr w:type="spellStart"/>
+      <w:r>
+        <w:rPr>
+          <w:rFonts w:ascii="Times New Roman" w:eastAsia="Times New Roman" w:hAnsi="Times New Roman" w:cs="Times New Roman"/>
+          <w:kern w:val="0"/>
+          <w:sz w:val="24"/>
+          <w:szCs w:val="24"/>
+          <w:lang w:eastAsia="fr-FR"/>
+          <w14:ligatures w14:val="none"/>
+        </w:rPr>
+        <w:t>stationarity</w:t>
+      </w:r>
+      <w:proofErr w:type="spellEnd"/>
     </w:p>
     <w:p>
       <w:pPr>
@@ -4549,11 +6680,19 @@
           <w:lang w:val="en-US"/>
         </w:rPr>
       </w:pPr>
+      <w:proofErr w:type="gramStart"/>
       <w:r>
         <w:rPr>
           <w:lang w:val="en-US"/>
         </w:rPr>
-        <w:t>Données : Open Power System Data, UK Power Consumption, etc.</w:t>
+        <w:t>Données :</w:t>
+      </w:r>
+      <w:proofErr w:type="gramEnd"/>
+      <w:r>
+        <w:rPr>
+          <w:lang w:val="en-US"/>
+        </w:rPr>
+        <w:t xml:space="preserve"> Open Power System Data, UK Power Consumption, etc.</w:t>
       </w:r>
     </w:p>
     <w:p>
@@ -4569,7 +6708,15 @@
         <w:ind w:left="360"/>
       </w:pPr>
       <w:r>
-        <w:t>Plus-value : Série temporelle, météo → features externes.</w:t>
+        <w:t xml:space="preserve">Plus-value : Série temporelle, météo → </w:t>
+      </w:r>
+      <w:proofErr w:type="spellStart"/>
+      <w:r>
+        <w:t>features</w:t>
+      </w:r>
+      <w:proofErr w:type="spellEnd"/>
+      <w:r>
+        <w:t xml:space="preserve"> externes.</w:t>
       </w:r>
     </w:p>
     <w:p>
@@ -4577,7 +6724,15 @@
         <w:ind w:left="360"/>
       </w:pPr>
       <w:r>
-        <w:t>Plus-value : Données spatio-temporelles → riche en feature engineering.</w:t>
+        <w:t xml:space="preserve">Plus-value : Données spatio-temporelles → riche en </w:t>
+      </w:r>
+      <w:proofErr w:type="spellStart"/>
+      <w:r>
+        <w:t>feature</w:t>
+      </w:r>
+      <w:proofErr w:type="spellEnd"/>
+      <w:r>
+        <w:t xml:space="preserve"> engineering.</w:t>
       </w:r>
     </w:p>
     <w:p>
@@ -4620,7 +6775,35 @@
           <w:lang w:eastAsia="fr-FR"/>
           <w14:ligatures w14:val="none"/>
         </w:rPr>
-        <w:t>Days 66–70: NLP Basics</w:t>
+        <w:t>Days 66–</w:t>
+      </w:r>
+      <w:proofErr w:type="gramStart"/>
+      <w:r>
+        <w:rPr>
+          <w:rFonts w:ascii="Times New Roman" w:eastAsia="Times New Roman" w:hAnsi="Times New Roman" w:cs="Times New Roman"/>
+          <w:b/>
+          <w:bCs/>
+          <w:kern w:val="0"/>
+          <w:sz w:val="27"/>
+          <w:szCs w:val="27"/>
+          <w:lang w:eastAsia="fr-FR"/>
+          <w14:ligatures w14:val="none"/>
+        </w:rPr>
+        <w:t>70:</w:t>
+      </w:r>
+      <w:proofErr w:type="gramEnd"/>
+      <w:r>
+        <w:rPr>
+          <w:rFonts w:ascii="Times New Roman" w:eastAsia="Times New Roman" w:hAnsi="Times New Roman" w:cs="Times New Roman"/>
+          <w:b/>
+          <w:bCs/>
+          <w:kern w:val="0"/>
+          <w:sz w:val="27"/>
+          <w:szCs w:val="27"/>
+          <w:lang w:eastAsia="fr-FR"/>
+          <w14:ligatures w14:val="none"/>
+        </w:rPr>
+        <w:t xml:space="preserve"> NLP Basics</w:t>
       </w:r>
     </w:p>
     <w:p>
@@ -4650,8 +6833,126 @@
           <w:lang w:eastAsia="fr-FR"/>
           <w14:ligatures w14:val="none"/>
         </w:rPr>
-        <w:t>Day 66: Text preprocessing – tokenization, stopwords</w:t>
-      </w:r>
+        <w:t xml:space="preserve">Day </w:t>
+      </w:r>
+      <w:proofErr w:type="gramStart"/>
+      <w:r>
+        <w:rPr>
+          <w:rFonts w:ascii="Times New Roman" w:eastAsia="Times New Roman" w:hAnsi="Times New Roman" w:cs="Times New Roman"/>
+          <w:kern w:val="0"/>
+          <w:sz w:val="24"/>
+          <w:szCs w:val="24"/>
+          <w:highlight w:val="yellow"/>
+          <w:lang w:eastAsia="fr-FR"/>
+          <w14:ligatures w14:val="none"/>
+        </w:rPr>
+        <w:t>66:</w:t>
+      </w:r>
+      <w:proofErr w:type="gramEnd"/>
+      <w:r>
+        <w:rPr>
+          <w:rFonts w:ascii="Times New Roman" w:eastAsia="Times New Roman" w:hAnsi="Times New Roman" w:cs="Times New Roman"/>
+          <w:kern w:val="0"/>
+          <w:sz w:val="24"/>
+          <w:szCs w:val="24"/>
+          <w:highlight w:val="yellow"/>
+          <w:lang w:eastAsia="fr-FR"/>
+          <w14:ligatures w14:val="none"/>
+        </w:rPr>
+        <w:t xml:space="preserve"> </w:t>
+      </w:r>
+      <w:proofErr w:type="spellStart"/>
+      <w:r>
+        <w:rPr>
+          <w:rFonts w:ascii="Times New Roman" w:eastAsia="Times New Roman" w:hAnsi="Times New Roman" w:cs="Times New Roman"/>
+          <w:kern w:val="0"/>
+          <w:sz w:val="24"/>
+          <w:szCs w:val="24"/>
+          <w:highlight w:val="yellow"/>
+          <w:lang w:eastAsia="fr-FR"/>
+          <w14:ligatures w14:val="none"/>
+        </w:rPr>
+        <w:t>Text</w:t>
+      </w:r>
+      <w:proofErr w:type="spellEnd"/>
+      <w:r>
+        <w:rPr>
+          <w:rFonts w:ascii="Times New Roman" w:eastAsia="Times New Roman" w:hAnsi="Times New Roman" w:cs="Times New Roman"/>
+          <w:kern w:val="0"/>
+          <w:sz w:val="24"/>
+          <w:szCs w:val="24"/>
+          <w:highlight w:val="yellow"/>
+          <w:lang w:eastAsia="fr-FR"/>
+          <w14:ligatures w14:val="none"/>
+        </w:rPr>
+        <w:t xml:space="preserve"> </w:t>
+      </w:r>
+      <w:proofErr w:type="spellStart"/>
+      <w:r>
+        <w:rPr>
+          <w:rFonts w:ascii="Times New Roman" w:eastAsia="Times New Roman" w:hAnsi="Times New Roman" w:cs="Times New Roman"/>
+          <w:kern w:val="0"/>
+          <w:sz w:val="24"/>
+          <w:szCs w:val="24"/>
+          <w:highlight w:val="yellow"/>
+          <w:lang w:eastAsia="fr-FR"/>
+          <w14:ligatures w14:val="none"/>
+        </w:rPr>
+        <w:t>preprocessing</w:t>
+      </w:r>
+      <w:proofErr w:type="spellEnd"/>
+      <w:r>
+        <w:rPr>
+          <w:rFonts w:ascii="Times New Roman" w:eastAsia="Times New Roman" w:hAnsi="Times New Roman" w:cs="Times New Roman"/>
+          <w:kern w:val="0"/>
+          <w:sz w:val="24"/>
+          <w:szCs w:val="24"/>
+          <w:highlight w:val="yellow"/>
+          <w:lang w:eastAsia="fr-FR"/>
+          <w14:ligatures w14:val="none"/>
+        </w:rPr>
+        <w:t xml:space="preserve"> – </w:t>
+      </w:r>
+      <w:proofErr w:type="spellStart"/>
+      <w:r>
+        <w:rPr>
+          <w:rFonts w:ascii="Times New Roman" w:eastAsia="Times New Roman" w:hAnsi="Times New Roman" w:cs="Times New Roman"/>
+          <w:kern w:val="0"/>
+          <w:sz w:val="24"/>
+          <w:szCs w:val="24"/>
+          <w:highlight w:val="yellow"/>
+          <w:lang w:eastAsia="fr-FR"/>
+          <w14:ligatures w14:val="none"/>
+        </w:rPr>
+        <w:t>tokenization</w:t>
+      </w:r>
+      <w:proofErr w:type="spellEnd"/>
+      <w:r>
+        <w:rPr>
+          <w:rFonts w:ascii="Times New Roman" w:eastAsia="Times New Roman" w:hAnsi="Times New Roman" w:cs="Times New Roman"/>
+          <w:kern w:val="0"/>
+          <w:sz w:val="24"/>
+          <w:szCs w:val="24"/>
+          <w:highlight w:val="yellow"/>
+          <w:lang w:eastAsia="fr-FR"/>
+          <w14:ligatures w14:val="none"/>
+        </w:rPr>
+        <w:t xml:space="preserve">, </w:t>
+      </w:r>
+      <w:proofErr w:type="spellStart"/>
+      <w:r>
+        <w:rPr>
+          <w:rFonts w:ascii="Times New Roman" w:eastAsia="Times New Roman" w:hAnsi="Times New Roman" w:cs="Times New Roman"/>
+          <w:kern w:val="0"/>
+          <w:sz w:val="24"/>
+          <w:szCs w:val="24"/>
+          <w:highlight w:val="yellow"/>
+          <w:lang w:eastAsia="fr-FR"/>
+          <w14:ligatures w14:val="none"/>
+        </w:rPr>
+        <w:t>stopwords</w:t>
+      </w:r>
+      <w:proofErr w:type="spellEnd"/>
     </w:p>
     <w:p>
       <w:pPr>
@@ -4752,8 +7053,74 @@
           <w:lang w:eastAsia="fr-FR"/>
           <w14:ligatures w14:val="none"/>
         </w:rPr>
-        <w:t>Day 69: Sentiment analysis project</w:t>
-      </w:r>
+        <w:t xml:space="preserve">Day </w:t>
+      </w:r>
+      <w:proofErr w:type="gramStart"/>
+      <w:r>
+        <w:rPr>
+          <w:rFonts w:ascii="Times New Roman" w:eastAsia="Times New Roman" w:hAnsi="Times New Roman" w:cs="Times New Roman"/>
+          <w:kern w:val="0"/>
+          <w:sz w:val="24"/>
+          <w:szCs w:val="24"/>
+          <w:highlight w:val="yellow"/>
+          <w:lang w:eastAsia="fr-FR"/>
+          <w14:ligatures w14:val="none"/>
+        </w:rPr>
+        <w:t>69:</w:t>
+      </w:r>
+      <w:proofErr w:type="gramEnd"/>
+      <w:r>
+        <w:rPr>
+          <w:rFonts w:ascii="Times New Roman" w:eastAsia="Times New Roman" w:hAnsi="Times New Roman" w:cs="Times New Roman"/>
+          <w:kern w:val="0"/>
+          <w:sz w:val="24"/>
+          <w:szCs w:val="24"/>
+          <w:highlight w:val="yellow"/>
+          <w:lang w:eastAsia="fr-FR"/>
+          <w14:ligatures w14:val="none"/>
+        </w:rPr>
+        <w:t xml:space="preserve"> Sentiment </w:t>
+      </w:r>
+      <w:proofErr w:type="spellStart"/>
+      <w:r>
+        <w:rPr>
+          <w:rFonts w:ascii="Times New Roman" w:eastAsia="Times New Roman" w:hAnsi="Times New Roman" w:cs="Times New Roman"/>
+          <w:kern w:val="0"/>
+          <w:sz w:val="24"/>
+          <w:szCs w:val="24"/>
+          <w:highlight w:val="yellow"/>
+          <w:lang w:eastAsia="fr-FR"/>
+          <w14:ligatures w14:val="none"/>
+        </w:rPr>
+        <w:t>analysis</w:t>
+      </w:r>
+      <w:proofErr w:type="spellEnd"/>
+      <w:r>
+        <w:rPr>
+          <w:rFonts w:ascii="Times New Roman" w:eastAsia="Times New Roman" w:hAnsi="Times New Roman" w:cs="Times New Roman"/>
+          <w:kern w:val="0"/>
+          <w:sz w:val="24"/>
+          <w:szCs w:val="24"/>
+          <w:highlight w:val="yellow"/>
+          <w:lang w:eastAsia="fr-FR"/>
+          <w14:ligatures w14:val="none"/>
+        </w:rPr>
+        <w:t xml:space="preserve"> </w:t>
+      </w:r>
+      <w:proofErr w:type="spellStart"/>
+      <w:r>
+        <w:rPr>
+          <w:rFonts w:ascii="Times New Roman" w:eastAsia="Times New Roman" w:hAnsi="Times New Roman" w:cs="Times New Roman"/>
+          <w:kern w:val="0"/>
+          <w:sz w:val="24"/>
+          <w:szCs w:val="24"/>
+          <w:highlight w:val="yellow"/>
+          <w:lang w:eastAsia="fr-FR"/>
+          <w14:ligatures w14:val="none"/>
+        </w:rPr>
+        <w:t>project</w:t>
+      </w:r>
+      <w:proofErr w:type="spellEnd"/>
     </w:p>
     <w:p>
       <w:pPr>
@@ -4770,16 +7137,18 @@
           <w:kern w:val="0"/>
           <w:sz w:val="27"/>
           <w:szCs w:val="27"/>
-          <w:lang w:eastAsia="fr-FR"/>
-          <w14:ligatures w14:val="none"/>
-        </w:rPr>
-      </w:pPr>
-      <w:r>
-        <w:rPr>
-          <w:rFonts w:ascii="Times New Roman" w:eastAsia="Times New Roman" w:hAnsi="Times New Roman" w:cs="Times New Roman"/>
-          <w:kern w:val="0"/>
-          <w:sz w:val="24"/>
-          <w:szCs w:val="24"/>
+          <w:highlight w:val="yellow"/>
+          <w:lang w:eastAsia="fr-FR"/>
+          <w14:ligatures w14:val="none"/>
+        </w:rPr>
+      </w:pPr>
+      <w:r>
+        <w:rPr>
+          <w:rFonts w:ascii="Times New Roman" w:eastAsia="Times New Roman" w:hAnsi="Times New Roman" w:cs="Times New Roman"/>
+          <w:kern w:val="0"/>
+          <w:sz w:val="24"/>
+          <w:szCs w:val="24"/>
+          <w:highlight w:val="yellow"/>
           <w:lang w:val="en-US" w:eastAsia="fr-FR"/>
           <w14:ligatures w14:val="none"/>
         </w:rPr>
@@ -4829,7 +7198,35 @@
           <w:lang w:eastAsia="fr-FR"/>
           <w14:ligatures w14:val="none"/>
         </w:rPr>
-        <w:t>Days 71–75: Deep Learning Basics</w:t>
+        <w:t>Days 71–</w:t>
+      </w:r>
+      <w:proofErr w:type="gramStart"/>
+      <w:r>
+        <w:rPr>
+          <w:rFonts w:ascii="Times New Roman" w:eastAsia="Times New Roman" w:hAnsi="Times New Roman" w:cs="Times New Roman"/>
+          <w:b/>
+          <w:bCs/>
+          <w:kern w:val="0"/>
+          <w:sz w:val="27"/>
+          <w:szCs w:val="27"/>
+          <w:lang w:eastAsia="fr-FR"/>
+          <w14:ligatures w14:val="none"/>
+        </w:rPr>
+        <w:t>75:</w:t>
+      </w:r>
+      <w:proofErr w:type="gramEnd"/>
+      <w:r>
+        <w:rPr>
+          <w:rFonts w:ascii="Times New Roman" w:eastAsia="Times New Roman" w:hAnsi="Times New Roman" w:cs="Times New Roman"/>
+          <w:b/>
+          <w:bCs/>
+          <w:kern w:val="0"/>
+          <w:sz w:val="27"/>
+          <w:szCs w:val="27"/>
+          <w:lang w:eastAsia="fr-FR"/>
+          <w14:ligatures w14:val="none"/>
+        </w:rPr>
+        <w:t xml:space="preserve"> Deep Learning Basics</w:t>
       </w:r>
     </w:p>
     <w:p>
@@ -4861,18 +7258,46 @@
         </w:rPr>
         <w:t xml:space="preserve">Day 71: What is deep learning? </w:t>
       </w:r>
-      <w:r>
-        <w:rPr>
-          <w:rFonts w:ascii="Times New Roman" w:eastAsia="Times New Roman" w:hAnsi="Times New Roman" w:cs="Times New Roman"/>
-          <w:kern w:val="0"/>
-          <w:sz w:val="24"/>
-          <w:szCs w:val="24"/>
-          <w:highlight w:val="yellow"/>
-          <w:lang w:eastAsia="fr-FR"/>
-          <w14:ligatures w14:val="none"/>
-        </w:rPr>
-        <w:t>Neurons, layers</w:t>
-      </w:r>
+      <w:proofErr w:type="spellStart"/>
+      <w:r>
+        <w:rPr>
+          <w:rFonts w:ascii="Times New Roman" w:eastAsia="Times New Roman" w:hAnsi="Times New Roman" w:cs="Times New Roman"/>
+          <w:kern w:val="0"/>
+          <w:sz w:val="24"/>
+          <w:szCs w:val="24"/>
+          <w:highlight w:val="yellow"/>
+          <w:lang w:eastAsia="fr-FR"/>
+          <w14:ligatures w14:val="none"/>
+        </w:rPr>
+        <w:t>Neurons</w:t>
+      </w:r>
+      <w:proofErr w:type="spellEnd"/>
+      <w:r>
+        <w:rPr>
+          <w:rFonts w:ascii="Times New Roman" w:eastAsia="Times New Roman" w:hAnsi="Times New Roman" w:cs="Times New Roman"/>
+          <w:kern w:val="0"/>
+          <w:sz w:val="24"/>
+          <w:szCs w:val="24"/>
+          <w:highlight w:val="yellow"/>
+          <w:lang w:eastAsia="fr-FR"/>
+          <w14:ligatures w14:val="none"/>
+        </w:rPr>
+        <w:t xml:space="preserve">, </w:t>
+      </w:r>
+      <w:proofErr w:type="spellStart"/>
+      <w:r>
+        <w:rPr>
+          <w:rFonts w:ascii="Times New Roman" w:eastAsia="Times New Roman" w:hAnsi="Times New Roman" w:cs="Times New Roman"/>
+          <w:kern w:val="0"/>
+          <w:sz w:val="24"/>
+          <w:szCs w:val="24"/>
+          <w:highlight w:val="yellow"/>
+          <w:lang w:eastAsia="fr-FR"/>
+          <w14:ligatures w14:val="none"/>
+        </w:rPr>
+        <w:t>layers</w:t>
+      </w:r>
+      <w:proofErr w:type="spellEnd"/>
     </w:p>
     <w:p>
       <w:pPr>
@@ -4901,8 +7326,48 @@
           <w:lang w:eastAsia="fr-FR"/>
           <w14:ligatures w14:val="none"/>
         </w:rPr>
-        <w:t>Day 72: Intro to PyTorch</w:t>
-      </w:r>
+        <w:t xml:space="preserve">Day </w:t>
+      </w:r>
+      <w:proofErr w:type="gramStart"/>
+      <w:r>
+        <w:rPr>
+          <w:rFonts w:ascii="Times New Roman" w:eastAsia="Times New Roman" w:hAnsi="Times New Roman" w:cs="Times New Roman"/>
+          <w:kern w:val="0"/>
+          <w:sz w:val="24"/>
+          <w:szCs w:val="24"/>
+          <w:highlight w:val="yellow"/>
+          <w:lang w:eastAsia="fr-FR"/>
+          <w14:ligatures w14:val="none"/>
+        </w:rPr>
+        <w:t>72:</w:t>
+      </w:r>
+      <w:proofErr w:type="gramEnd"/>
+      <w:r>
+        <w:rPr>
+          <w:rFonts w:ascii="Times New Roman" w:eastAsia="Times New Roman" w:hAnsi="Times New Roman" w:cs="Times New Roman"/>
+          <w:kern w:val="0"/>
+          <w:sz w:val="24"/>
+          <w:szCs w:val="24"/>
+          <w:highlight w:val="yellow"/>
+          <w:lang w:eastAsia="fr-FR"/>
+          <w14:ligatures w14:val="none"/>
+        </w:rPr>
+        <w:t xml:space="preserve"> Intro to </w:t>
+      </w:r>
+      <w:proofErr w:type="spellStart"/>
+      <w:r>
+        <w:rPr>
+          <w:rFonts w:ascii="Times New Roman" w:eastAsia="Times New Roman" w:hAnsi="Times New Roman" w:cs="Times New Roman"/>
+          <w:kern w:val="0"/>
+          <w:sz w:val="24"/>
+          <w:szCs w:val="24"/>
+          <w:highlight w:val="yellow"/>
+          <w:lang w:eastAsia="fr-FR"/>
+          <w14:ligatures w14:val="none"/>
+        </w:rPr>
+        <w:t>PyTorch</w:t>
+      </w:r>
+      <w:proofErr w:type="spellEnd"/>
     </w:p>
     <w:p>
       <w:pPr>
@@ -4961,8 +7426,74 @@
           <w:lang w:eastAsia="fr-FR"/>
           <w14:ligatures w14:val="none"/>
         </w:rPr>
-        <w:t>Day 74: Training loop, backpropagation</w:t>
-      </w:r>
+        <w:t xml:space="preserve">Day </w:t>
+      </w:r>
+      <w:proofErr w:type="gramStart"/>
+      <w:r>
+        <w:rPr>
+          <w:rFonts w:ascii="Times New Roman" w:eastAsia="Times New Roman" w:hAnsi="Times New Roman" w:cs="Times New Roman"/>
+          <w:kern w:val="0"/>
+          <w:sz w:val="24"/>
+          <w:szCs w:val="24"/>
+          <w:highlight w:val="yellow"/>
+          <w:lang w:eastAsia="fr-FR"/>
+          <w14:ligatures w14:val="none"/>
+        </w:rPr>
+        <w:t>74:</w:t>
+      </w:r>
+      <w:proofErr w:type="gramEnd"/>
+      <w:r>
+        <w:rPr>
+          <w:rFonts w:ascii="Times New Roman" w:eastAsia="Times New Roman" w:hAnsi="Times New Roman" w:cs="Times New Roman"/>
+          <w:kern w:val="0"/>
+          <w:sz w:val="24"/>
+          <w:szCs w:val="24"/>
+          <w:highlight w:val="yellow"/>
+          <w:lang w:eastAsia="fr-FR"/>
+          <w14:ligatures w14:val="none"/>
+        </w:rPr>
+        <w:t xml:space="preserve"> Training </w:t>
+      </w:r>
+      <w:proofErr w:type="spellStart"/>
+      <w:r>
+        <w:rPr>
+          <w:rFonts w:ascii="Times New Roman" w:eastAsia="Times New Roman" w:hAnsi="Times New Roman" w:cs="Times New Roman"/>
+          <w:kern w:val="0"/>
+          <w:sz w:val="24"/>
+          <w:szCs w:val="24"/>
+          <w:highlight w:val="yellow"/>
+          <w:lang w:eastAsia="fr-FR"/>
+          <w14:ligatures w14:val="none"/>
+        </w:rPr>
+        <w:t>loop</w:t>
+      </w:r>
+      <w:proofErr w:type="spellEnd"/>
+      <w:r>
+        <w:rPr>
+          <w:rFonts w:ascii="Times New Roman" w:eastAsia="Times New Roman" w:hAnsi="Times New Roman" w:cs="Times New Roman"/>
+          <w:kern w:val="0"/>
+          <w:sz w:val="24"/>
+          <w:szCs w:val="24"/>
+          <w:highlight w:val="yellow"/>
+          <w:lang w:eastAsia="fr-FR"/>
+          <w14:ligatures w14:val="none"/>
+        </w:rPr>
+        <w:t xml:space="preserve">, </w:t>
+      </w:r>
+      <w:proofErr w:type="spellStart"/>
+      <w:r>
+        <w:rPr>
+          <w:rFonts w:ascii="Times New Roman" w:eastAsia="Times New Roman" w:hAnsi="Times New Roman" w:cs="Times New Roman"/>
+          <w:kern w:val="0"/>
+          <w:sz w:val="24"/>
+          <w:szCs w:val="24"/>
+          <w:highlight w:val="yellow"/>
+          <w:lang w:eastAsia="fr-FR"/>
+          <w14:ligatures w14:val="none"/>
+        </w:rPr>
+        <w:t>backpropagation</w:t>
+      </w:r>
+      <w:proofErr w:type="spellEnd"/>
     </w:p>
     <w:p>
       <w:pPr>
@@ -4991,7 +7522,73 @@
           <w:lang w:eastAsia="fr-FR"/>
           <w14:ligatures w14:val="none"/>
         </w:rPr>
-        <w:t>Day 75: Mini project: Digit recognition</w:t>
+        <w:t xml:space="preserve">Day </w:t>
+      </w:r>
+      <w:proofErr w:type="gramStart"/>
+      <w:r>
+        <w:rPr>
+          <w:rFonts w:ascii="Times New Roman" w:eastAsia="Times New Roman" w:hAnsi="Times New Roman" w:cs="Times New Roman"/>
+          <w:kern w:val="0"/>
+          <w:sz w:val="24"/>
+          <w:szCs w:val="24"/>
+          <w:highlight w:val="yellow"/>
+          <w:lang w:eastAsia="fr-FR"/>
+          <w14:ligatures w14:val="none"/>
+        </w:rPr>
+        <w:t>75:</w:t>
+      </w:r>
+      <w:proofErr w:type="gramEnd"/>
+      <w:r>
+        <w:rPr>
+          <w:rFonts w:ascii="Times New Roman" w:eastAsia="Times New Roman" w:hAnsi="Times New Roman" w:cs="Times New Roman"/>
+          <w:kern w:val="0"/>
+          <w:sz w:val="24"/>
+          <w:szCs w:val="24"/>
+          <w:highlight w:val="yellow"/>
+          <w:lang w:eastAsia="fr-FR"/>
+          <w14:ligatures w14:val="none"/>
+        </w:rPr>
+        <w:t xml:space="preserve"> Mini </w:t>
+      </w:r>
+      <w:proofErr w:type="spellStart"/>
+      <w:proofErr w:type="gramStart"/>
+      <w:r>
+        <w:rPr>
+          <w:rFonts w:ascii="Times New Roman" w:eastAsia="Times New Roman" w:hAnsi="Times New Roman" w:cs="Times New Roman"/>
+          <w:kern w:val="0"/>
+          <w:sz w:val="24"/>
+          <w:szCs w:val="24"/>
+          <w:highlight w:val="yellow"/>
+          <w:lang w:eastAsia="fr-FR"/>
+          <w14:ligatures w14:val="none"/>
+        </w:rPr>
+        <w:t>project</w:t>
+      </w:r>
+      <w:proofErr w:type="spellEnd"/>
+      <w:r>
+        <w:rPr>
+          <w:rFonts w:ascii="Times New Roman" w:eastAsia="Times New Roman" w:hAnsi="Times New Roman" w:cs="Times New Roman"/>
+          <w:kern w:val="0"/>
+          <w:sz w:val="24"/>
+          <w:szCs w:val="24"/>
+          <w:highlight w:val="yellow"/>
+          <w:lang w:eastAsia="fr-FR"/>
+          <w14:ligatures w14:val="none"/>
+        </w:rPr>
+        <w:t>:</w:t>
+      </w:r>
+      <w:proofErr w:type="gramEnd"/>
+      <w:r>
+        <w:rPr>
+          <w:rFonts w:ascii="Times New Roman" w:eastAsia="Times New Roman" w:hAnsi="Times New Roman" w:cs="Times New Roman"/>
+          <w:kern w:val="0"/>
+          <w:sz w:val="24"/>
+          <w:szCs w:val="24"/>
+          <w:highlight w:val="yellow"/>
+          <w:lang w:eastAsia="fr-FR"/>
+          <w14:ligatures w14:val="none"/>
+        </w:rPr>
+        <w:t xml:space="preserve"> Digit recognition</w:t>
       </w:r>
     </w:p>
     <w:p>

</xml_diff>

<commit_message>
Fondamentaux et Exploration des Séries Temporelles
</commit_message>
<xml_diff>
--- a/Plan.docx
+++ b/Plan.docx
@@ -19,57 +19,16 @@
       </w:pPr>
       <w:r>
         <w:rPr>
-          <w:rFonts w:ascii="Segoe UI Emoji" w:eastAsia="Times New Roman" w:hAnsi="Segoe UI Emoji" w:cs="Segoe UI Emoji"/>
+          <w:rFonts w:ascii="Times New Roman" w:eastAsia="Times New Roman" w:hAnsi="Times New Roman" w:cs="Times New Roman"/>
           <w:b/>
           <w:bCs/>
           <w:kern w:val="0"/>
           <w:sz w:val="36"/>
           <w:szCs w:val="36"/>
-          <w:lang w:eastAsia="fr-FR"/>
-          <w14:ligatures w14:val="none"/>
-        </w:rPr>
-        <w:t>🗓️</w:t>
-      </w:r>
-      <w:r>
-        <w:rPr>
-          <w:rFonts w:ascii="Times New Roman" w:eastAsia="Times New Roman" w:hAnsi="Times New Roman" w:cs="Times New Roman"/>
-          <w:b/>
-          <w:bCs/>
-          <w:kern w:val="0"/>
-          <w:sz w:val="36"/>
-          <w:szCs w:val="36"/>
-          <w:lang w:val="en-US" w:eastAsia="fr-FR"/>
-          <w14:ligatures w14:val="none"/>
-        </w:rPr>
-        <w:t xml:space="preserve"> Phase </w:t>
-      </w:r>
-      <w:proofErr w:type="gramStart"/>
-      <w:r>
-        <w:rPr>
-          <w:rFonts w:ascii="Times New Roman" w:eastAsia="Times New Roman" w:hAnsi="Times New Roman" w:cs="Times New Roman"/>
-          <w:b/>
-          <w:bCs/>
-          <w:kern w:val="0"/>
-          <w:sz w:val="36"/>
-          <w:szCs w:val="36"/>
-          <w:lang w:val="en-US" w:eastAsia="fr-FR"/>
-          <w14:ligatures w14:val="none"/>
-        </w:rPr>
-        <w:t>1:</w:t>
-      </w:r>
-      <w:proofErr w:type="gramEnd"/>
-      <w:r>
-        <w:rPr>
-          <w:rFonts w:ascii="Times New Roman" w:eastAsia="Times New Roman" w:hAnsi="Times New Roman" w:cs="Times New Roman"/>
-          <w:b/>
-          <w:bCs/>
-          <w:kern w:val="0"/>
-          <w:sz w:val="36"/>
-          <w:szCs w:val="36"/>
-          <w:lang w:val="en-US" w:eastAsia="fr-FR"/>
-          <w14:ligatures w14:val="none"/>
-        </w:rPr>
-        <w:t xml:space="preserve"> Python &amp; Math Foundations (Days 1–20)</w:t>
+          <w:lang w:val="en-US" w:eastAsia="fr-FR"/>
+          <w14:ligatures w14:val="none"/>
+        </w:rPr>
+        <w:t xml:space="preserve"> Phase 1: Python &amp; Math Foundations (Days 1–20)</w:t>
       </w:r>
     </w:p>
     <w:p>
@@ -3377,9 +3336,8 @@
           <w:lang w:eastAsia="fr-FR"/>
           <w14:ligatures w14:val="none"/>
         </w:rPr>
-        <w:t xml:space="preserve">Binaire, </w:t>
-      </w:r>
-      <w:proofErr w:type="spellStart"/>
+        <w:t>Binaire, multicla</w:t>
+      </w:r>
       <w:r>
         <w:rPr>
           <w:rFonts w:ascii="Times New Roman" w:eastAsia="Times New Roman" w:hAnsi="Times New Roman" w:cs="Times New Roman"/>
@@ -3391,34 +3349,7 @@
           <w:lang w:eastAsia="fr-FR"/>
           <w14:ligatures w14:val="none"/>
         </w:rPr>
-        <w:t>multicla</w:t>
-      </w:r>
-      <w:r>
-        <w:rPr>
-          <w:rFonts w:ascii="Times New Roman" w:eastAsia="Times New Roman" w:hAnsi="Times New Roman" w:cs="Times New Roman"/>
-          <w:b/>
-          <w:bCs/>
-          <w:kern w:val="0"/>
-          <w:sz w:val="27"/>
-          <w:szCs w:val="27"/>
-          <w:lang w:eastAsia="fr-FR"/>
-          <w14:ligatures w14:val="none"/>
-        </w:rPr>
-        <w:t>sse</w:t>
-      </w:r>
-      <w:proofErr w:type="spellEnd"/>
-      <w:r>
-        <w:rPr>
-          <w:rFonts w:ascii="Times New Roman" w:eastAsia="Times New Roman" w:hAnsi="Times New Roman" w:cs="Times New Roman"/>
-          <w:b/>
-          <w:bCs/>
-          <w:kern w:val="0"/>
-          <w:sz w:val="27"/>
-          <w:szCs w:val="27"/>
-          <w:lang w:eastAsia="fr-FR"/>
-          <w14:ligatures w14:val="none"/>
-        </w:rPr>
-        <w:t xml:space="preserve">, </w:t>
+        <w:t xml:space="preserve">sse, </w:t>
       </w:r>
       <w:proofErr w:type="spellStart"/>
       <w:r>
@@ -6400,195 +6331,363 @@
     </w:p>
     <w:p>
       <w:pPr>
+        <w:spacing w:after="0" w:line="240" w:lineRule="auto"/>
+        <w:outlineLvl w:val="2"/>
+        <w:rPr>
+          <w:rFonts w:eastAsia="Times New Roman" w:cstheme="minorHAnsi"/>
+          <w:b/>
+          <w:bCs/>
+          <w:kern w:val="0"/>
+          <w:sz w:val="20"/>
+          <w:szCs w:val="20"/>
+          <w:lang w:eastAsia="fr-FR"/>
+          <w14:ligatures w14:val="none"/>
+        </w:rPr>
+      </w:pPr>
+      <w:r>
+        <w:rPr>
+          <w:rFonts w:eastAsia="Times New Roman" w:cstheme="minorHAnsi"/>
+          <w:b/>
+          <w:bCs/>
+          <w:kern w:val="0"/>
+          <w:sz w:val="20"/>
+          <w:szCs w:val="20"/>
+          <w:highlight w:val="yellow"/>
+          <w:lang w:eastAsia="fr-FR"/>
+          <w14:ligatures w14:val="none"/>
+        </w:rPr>
+        <w:t>Module 1 : Fondamentaux et Exploration des Séries Temporelles</w:t>
+      </w:r>
+    </w:p>
+    <w:p>
+      <w:pPr>
         <w:numPr>
           <w:ilvl w:val="0"/>
-          <w:numId w:val="13"/>
+          <w:numId w:val="27"/>
         </w:numPr>
-        <w:spacing w:before="100" w:beforeAutospacing="1" w:after="100" w:afterAutospacing="1" w:line="240" w:lineRule="auto"/>
-        <w:rPr>
-          <w:rFonts w:ascii="Times New Roman" w:eastAsia="Times New Roman" w:hAnsi="Times New Roman" w:cs="Times New Roman"/>
-          <w:kern w:val="0"/>
-          <w:sz w:val="24"/>
-          <w:szCs w:val="24"/>
-          <w:lang w:val="en-US" w:eastAsia="fr-FR"/>
-          <w14:ligatures w14:val="none"/>
-        </w:rPr>
-      </w:pPr>
-      <w:r>
-        <w:rPr>
-          <w:rFonts w:ascii="Times New Roman" w:eastAsia="Times New Roman" w:hAnsi="Times New Roman" w:cs="Times New Roman"/>
-          <w:kern w:val="0"/>
-          <w:sz w:val="24"/>
-          <w:szCs w:val="24"/>
-          <w:lang w:val="en-US" w:eastAsia="fr-FR"/>
-          <w14:ligatures w14:val="none"/>
-        </w:rPr>
-        <w:t>Day 61: Time series concepts – trend, seasonality</w:t>
+        <w:spacing w:after="0" w:line="240" w:lineRule="auto"/>
+        <w:rPr>
+          <w:rFonts w:eastAsia="Times New Roman" w:cstheme="minorHAnsi"/>
+          <w:kern w:val="0"/>
+          <w:sz w:val="20"/>
+          <w:szCs w:val="20"/>
+          <w:lang w:eastAsia="fr-FR"/>
+          <w14:ligatures w14:val="none"/>
+        </w:rPr>
+      </w:pPr>
+      <w:r>
+        <w:rPr>
+          <w:rFonts w:eastAsia="Times New Roman" w:cstheme="minorHAnsi"/>
+          <w:kern w:val="0"/>
+          <w:sz w:val="20"/>
+          <w:szCs w:val="20"/>
+          <w:lang w:eastAsia="fr-FR"/>
+          <w14:ligatures w14:val="none"/>
+        </w:rPr>
+        <w:t xml:space="preserve"> Qu'est-ce qu'une série temporelle ? </w:t>
       </w:r>
     </w:p>
     <w:p>
       <w:pPr>
         <w:numPr>
           <w:ilvl w:val="0"/>
-          <w:numId w:val="13"/>
+          <w:numId w:val="27"/>
         </w:numPr>
-        <w:spacing w:before="100" w:beforeAutospacing="1" w:after="100" w:afterAutospacing="1" w:line="240" w:lineRule="auto"/>
-        <w:rPr>
-          <w:rFonts w:ascii="Times New Roman" w:eastAsia="Times New Roman" w:hAnsi="Times New Roman" w:cs="Times New Roman"/>
-          <w:kern w:val="0"/>
-          <w:sz w:val="24"/>
-          <w:szCs w:val="24"/>
-          <w:lang w:val="en-US" w:eastAsia="fr-FR"/>
-          <w14:ligatures w14:val="none"/>
-        </w:rPr>
-      </w:pPr>
-      <w:r>
-        <w:rPr>
-          <w:rFonts w:ascii="Times New Roman" w:eastAsia="Times New Roman" w:hAnsi="Times New Roman" w:cs="Times New Roman"/>
-          <w:kern w:val="0"/>
-          <w:sz w:val="24"/>
-          <w:szCs w:val="24"/>
-          <w:lang w:val="en-US" w:eastAsia="fr-FR"/>
-          <w14:ligatures w14:val="none"/>
-        </w:rPr>
-        <w:t>Day 62: Parsing dates, plotting time series</w:t>
+        <w:spacing w:after="0" w:line="240" w:lineRule="auto"/>
+        <w:rPr>
+          <w:rFonts w:eastAsia="Times New Roman" w:cstheme="minorHAnsi"/>
+          <w:kern w:val="0"/>
+          <w:sz w:val="20"/>
+          <w:szCs w:val="20"/>
+          <w:lang w:eastAsia="fr-FR"/>
+          <w14:ligatures w14:val="none"/>
+        </w:rPr>
+      </w:pPr>
+      <w:r>
+        <w:rPr>
+          <w:rFonts w:eastAsia="Times New Roman" w:cstheme="minorHAnsi"/>
+          <w:b/>
+          <w:bCs/>
+          <w:kern w:val="0"/>
+          <w:sz w:val="20"/>
+          <w:szCs w:val="20"/>
+          <w:lang w:eastAsia="fr-FR"/>
+          <w14:ligatures w14:val="none"/>
+        </w:rPr>
+        <w:t>Les composantes d'une série</w:t>
+      </w:r>
+      <w:r>
+        <w:rPr>
+          <w:rFonts w:eastAsia="Times New Roman" w:cstheme="minorHAnsi"/>
+          <w:kern w:val="0"/>
+          <w:sz w:val="20"/>
+          <w:szCs w:val="20"/>
+          <w:lang w:eastAsia="fr-FR"/>
+          <w14:ligatures w14:val="none"/>
+        </w:rPr>
+        <w:t xml:space="preserve"> :</w:t>
+      </w:r>
+    </w:p>
+    <w:p>
+      <w:pPr>
+        <w:numPr>
+          <w:ilvl w:val="1"/>
+          <w:numId w:val="27"/>
+        </w:numPr>
+        <w:spacing w:after="0" w:line="240" w:lineRule="auto"/>
+        <w:rPr>
+          <w:rFonts w:eastAsia="Times New Roman" w:cstheme="minorHAnsi"/>
+          <w:kern w:val="0"/>
+          <w:sz w:val="20"/>
+          <w:szCs w:val="20"/>
+          <w:lang w:eastAsia="fr-FR"/>
+          <w14:ligatures w14:val="none"/>
+        </w:rPr>
+      </w:pPr>
+      <w:r>
+        <w:rPr>
+          <w:rFonts w:eastAsia="Times New Roman" w:cstheme="minorHAnsi"/>
+          <w:kern w:val="0"/>
+          <w:sz w:val="20"/>
+          <w:szCs w:val="20"/>
+          <w:lang w:eastAsia="fr-FR"/>
+          <w14:ligatures w14:val="none"/>
+        </w:rPr>
+        <w:t>Tendance (Trend)</w:t>
+      </w:r>
+    </w:p>
+    <w:p>
+      <w:pPr>
+        <w:numPr>
+          <w:ilvl w:val="1"/>
+          <w:numId w:val="27"/>
+        </w:numPr>
+        <w:spacing w:after="0" w:line="240" w:lineRule="auto"/>
+        <w:rPr>
+          <w:rFonts w:eastAsia="Times New Roman" w:cstheme="minorHAnsi"/>
+          <w:kern w:val="0"/>
+          <w:sz w:val="20"/>
+          <w:szCs w:val="20"/>
+          <w:lang w:eastAsia="fr-FR"/>
+          <w14:ligatures w14:val="none"/>
+        </w:rPr>
+      </w:pPr>
+      <w:r>
+        <w:rPr>
+          <w:rFonts w:eastAsia="Times New Roman" w:cstheme="minorHAnsi"/>
+          <w:kern w:val="0"/>
+          <w:sz w:val="20"/>
+          <w:szCs w:val="20"/>
+          <w:lang w:eastAsia="fr-FR"/>
+          <w14:ligatures w14:val="none"/>
+        </w:rPr>
+        <w:t>Saisonnalité (</w:t>
+      </w:r>
+      <w:proofErr w:type="spellStart"/>
+      <w:r>
+        <w:rPr>
+          <w:rFonts w:eastAsia="Times New Roman" w:cstheme="minorHAnsi"/>
+          <w:kern w:val="0"/>
+          <w:sz w:val="20"/>
+          <w:szCs w:val="20"/>
+          <w:lang w:eastAsia="fr-FR"/>
+          <w14:ligatures w14:val="none"/>
+        </w:rPr>
+        <w:t>Seasonality</w:t>
+      </w:r>
+      <w:proofErr w:type="spellEnd"/>
+      <w:r>
+        <w:rPr>
+          <w:rFonts w:eastAsia="Times New Roman" w:cstheme="minorHAnsi"/>
+          <w:kern w:val="0"/>
+          <w:sz w:val="20"/>
+          <w:szCs w:val="20"/>
+          <w:lang w:eastAsia="fr-FR"/>
+          <w14:ligatures w14:val="none"/>
+        </w:rPr>
+        <w:t>)</w:t>
+      </w:r>
+    </w:p>
+    <w:p>
+      <w:pPr>
+        <w:numPr>
+          <w:ilvl w:val="1"/>
+          <w:numId w:val="27"/>
+        </w:numPr>
+        <w:spacing w:after="0" w:line="240" w:lineRule="auto"/>
+        <w:rPr>
+          <w:rFonts w:eastAsia="Times New Roman" w:cstheme="minorHAnsi"/>
+          <w:kern w:val="0"/>
+          <w:sz w:val="20"/>
+          <w:szCs w:val="20"/>
+          <w:lang w:eastAsia="fr-FR"/>
+          <w14:ligatures w14:val="none"/>
+        </w:rPr>
+      </w:pPr>
+      <w:r>
+        <w:rPr>
+          <w:rFonts w:eastAsia="Times New Roman" w:cstheme="minorHAnsi"/>
+          <w:kern w:val="0"/>
+          <w:sz w:val="20"/>
+          <w:szCs w:val="20"/>
+          <w:lang w:eastAsia="fr-FR"/>
+          <w14:ligatures w14:val="none"/>
+        </w:rPr>
+        <w:t>Cyclicité vs Saisonnalité</w:t>
+      </w:r>
+    </w:p>
+    <w:p>
+      <w:pPr>
+        <w:numPr>
+          <w:ilvl w:val="1"/>
+          <w:numId w:val="27"/>
+        </w:numPr>
+        <w:spacing w:after="0" w:line="240" w:lineRule="auto"/>
+        <w:rPr>
+          <w:rFonts w:eastAsia="Times New Roman" w:cstheme="minorHAnsi"/>
+          <w:kern w:val="0"/>
+          <w:sz w:val="20"/>
+          <w:szCs w:val="20"/>
+          <w:lang w:eastAsia="fr-FR"/>
+          <w14:ligatures w14:val="none"/>
+        </w:rPr>
+      </w:pPr>
+      <w:r>
+        <w:rPr>
+          <w:rFonts w:eastAsia="Times New Roman" w:cstheme="minorHAnsi"/>
+          <w:kern w:val="0"/>
+          <w:sz w:val="20"/>
+          <w:szCs w:val="20"/>
+          <w:lang w:eastAsia="fr-FR"/>
+          <w14:ligatures w14:val="none"/>
+        </w:rPr>
+        <w:t>Bruit blanc (White noise) et résidus.</w:t>
       </w:r>
     </w:p>
     <w:p>
       <w:pPr>
         <w:numPr>
           <w:ilvl w:val="0"/>
-          <w:numId w:val="13"/>
+          <w:numId w:val="27"/>
         </w:numPr>
-        <w:spacing w:before="100" w:beforeAutospacing="1" w:after="100" w:afterAutospacing="1" w:line="240" w:lineRule="auto"/>
-        <w:rPr>
-          <w:rFonts w:ascii="Times New Roman" w:eastAsia="Times New Roman" w:hAnsi="Times New Roman" w:cs="Times New Roman"/>
-          <w:kern w:val="0"/>
-          <w:sz w:val="24"/>
-          <w:szCs w:val="24"/>
-          <w:lang w:eastAsia="fr-FR"/>
-          <w14:ligatures w14:val="none"/>
-        </w:rPr>
-      </w:pPr>
-      <w:r>
-        <w:rPr>
-          <w:rFonts w:ascii="Times New Roman" w:eastAsia="Times New Roman" w:hAnsi="Times New Roman" w:cs="Times New Roman"/>
-          <w:kern w:val="0"/>
-          <w:sz w:val="24"/>
-          <w:szCs w:val="24"/>
-          <w:lang w:eastAsia="fr-FR"/>
-          <w14:ligatures w14:val="none"/>
-        </w:rPr>
-        <w:t xml:space="preserve">Day </w:t>
-      </w:r>
-      <w:proofErr w:type="gramStart"/>
-      <w:r>
-        <w:rPr>
-          <w:rFonts w:ascii="Times New Roman" w:eastAsia="Times New Roman" w:hAnsi="Times New Roman" w:cs="Times New Roman"/>
-          <w:kern w:val="0"/>
-          <w:sz w:val="24"/>
-          <w:szCs w:val="24"/>
-          <w:lang w:eastAsia="fr-FR"/>
-          <w14:ligatures w14:val="none"/>
-        </w:rPr>
-        <w:t>63:</w:t>
-      </w:r>
-      <w:proofErr w:type="gramEnd"/>
-      <w:r>
-        <w:rPr>
-          <w:rFonts w:ascii="Times New Roman" w:eastAsia="Times New Roman" w:hAnsi="Times New Roman" w:cs="Times New Roman"/>
-          <w:kern w:val="0"/>
-          <w:sz w:val="24"/>
-          <w:szCs w:val="24"/>
-          <w:lang w:eastAsia="fr-FR"/>
-          <w14:ligatures w14:val="none"/>
-        </w:rPr>
-        <w:t xml:space="preserve"> Moving </w:t>
-      </w:r>
-      <w:proofErr w:type="spellStart"/>
-      <w:r>
-        <w:rPr>
-          <w:rFonts w:ascii="Times New Roman" w:eastAsia="Times New Roman" w:hAnsi="Times New Roman" w:cs="Times New Roman"/>
-          <w:kern w:val="0"/>
-          <w:sz w:val="24"/>
-          <w:szCs w:val="24"/>
-          <w:lang w:eastAsia="fr-FR"/>
-          <w14:ligatures w14:val="none"/>
-        </w:rPr>
-        <w:t>averages</w:t>
-      </w:r>
-      <w:proofErr w:type="spellEnd"/>
-      <w:r>
-        <w:rPr>
-          <w:rFonts w:ascii="Times New Roman" w:eastAsia="Times New Roman" w:hAnsi="Times New Roman" w:cs="Times New Roman"/>
-          <w:kern w:val="0"/>
-          <w:sz w:val="24"/>
-          <w:szCs w:val="24"/>
-          <w:lang w:eastAsia="fr-FR"/>
-          <w14:ligatures w14:val="none"/>
-        </w:rPr>
-        <w:t xml:space="preserve">, </w:t>
-      </w:r>
-      <w:proofErr w:type="spellStart"/>
-      <w:r>
-        <w:rPr>
-          <w:rFonts w:ascii="Times New Roman" w:eastAsia="Times New Roman" w:hAnsi="Times New Roman" w:cs="Times New Roman"/>
-          <w:kern w:val="0"/>
-          <w:sz w:val="24"/>
-          <w:szCs w:val="24"/>
-          <w:lang w:eastAsia="fr-FR"/>
-          <w14:ligatures w14:val="none"/>
-        </w:rPr>
-        <w:t>differencing</w:t>
-      </w:r>
-      <w:proofErr w:type="spellEnd"/>
+        <w:spacing w:after="0" w:line="240" w:lineRule="auto"/>
+        <w:rPr>
+          <w:rFonts w:eastAsia="Times New Roman" w:cstheme="minorHAnsi"/>
+          <w:kern w:val="0"/>
+          <w:sz w:val="20"/>
+          <w:szCs w:val="20"/>
+          <w:lang w:eastAsia="fr-FR"/>
+          <w14:ligatures w14:val="none"/>
+        </w:rPr>
+      </w:pPr>
+      <w:r>
+        <w:rPr>
+          <w:rFonts w:eastAsia="Times New Roman" w:cstheme="minorHAnsi"/>
+          <w:b/>
+          <w:bCs/>
+          <w:kern w:val="0"/>
+          <w:sz w:val="20"/>
+          <w:szCs w:val="20"/>
+          <w:lang w:eastAsia="fr-FR"/>
+          <w14:ligatures w14:val="none"/>
+        </w:rPr>
+        <w:t>Méthodes de décomposition</w:t>
+      </w:r>
+      <w:r>
+        <w:rPr>
+          <w:rFonts w:eastAsia="Times New Roman" w:cstheme="minorHAnsi"/>
+          <w:kern w:val="0"/>
+          <w:sz w:val="20"/>
+          <w:szCs w:val="20"/>
+          <w:lang w:eastAsia="fr-FR"/>
+          <w14:ligatures w14:val="none"/>
+        </w:rPr>
+        <w:t xml:space="preserve"> : Décomposition additive vs multiplicative.</w:t>
+      </w:r>
     </w:p>
     <w:p>
       <w:pPr>
         <w:numPr>
           <w:ilvl w:val="0"/>
-          <w:numId w:val="13"/>
+          <w:numId w:val="27"/>
         </w:numPr>
-        <w:spacing w:before="100" w:beforeAutospacing="1" w:after="100" w:afterAutospacing="1" w:line="240" w:lineRule="auto"/>
-        <w:rPr>
-          <w:rFonts w:ascii="Times New Roman" w:eastAsia="Times New Roman" w:hAnsi="Times New Roman" w:cs="Times New Roman"/>
-          <w:kern w:val="0"/>
-          <w:sz w:val="24"/>
-          <w:szCs w:val="24"/>
-          <w:lang w:eastAsia="fr-FR"/>
-          <w14:ligatures w14:val="none"/>
-        </w:rPr>
-      </w:pPr>
-      <w:r>
-        <w:rPr>
-          <w:rFonts w:ascii="Times New Roman" w:eastAsia="Times New Roman" w:hAnsi="Times New Roman" w:cs="Times New Roman"/>
-          <w:kern w:val="0"/>
-          <w:sz w:val="24"/>
-          <w:szCs w:val="24"/>
-          <w:lang w:eastAsia="fr-FR"/>
-          <w14:ligatures w14:val="none"/>
-        </w:rPr>
-        <w:t xml:space="preserve">Day </w:t>
-      </w:r>
-      <w:proofErr w:type="gramStart"/>
-      <w:r>
-        <w:rPr>
-          <w:rFonts w:ascii="Times New Roman" w:eastAsia="Times New Roman" w:hAnsi="Times New Roman" w:cs="Times New Roman"/>
-          <w:kern w:val="0"/>
-          <w:sz w:val="24"/>
-          <w:szCs w:val="24"/>
-          <w:lang w:eastAsia="fr-FR"/>
-          <w14:ligatures w14:val="none"/>
-        </w:rPr>
-        <w:t>64:</w:t>
-      </w:r>
-      <w:proofErr w:type="gramEnd"/>
-      <w:r>
-        <w:rPr>
-          <w:rFonts w:ascii="Times New Roman" w:eastAsia="Times New Roman" w:hAnsi="Times New Roman" w:cs="Times New Roman"/>
-          <w:kern w:val="0"/>
-          <w:sz w:val="24"/>
-          <w:szCs w:val="24"/>
+        <w:spacing w:after="0" w:line="240" w:lineRule="auto"/>
+        <w:rPr>
+          <w:rFonts w:eastAsia="Times New Roman" w:cstheme="minorHAnsi"/>
+          <w:kern w:val="0"/>
+          <w:sz w:val="20"/>
+          <w:szCs w:val="20"/>
+          <w:lang w:eastAsia="fr-FR"/>
+          <w14:ligatures w14:val="none"/>
+        </w:rPr>
+      </w:pPr>
+      <w:r>
+        <w:rPr>
+          <w:rFonts w:eastAsia="Times New Roman" w:cstheme="minorHAnsi"/>
+          <w:b/>
+          <w:bCs/>
+          <w:kern w:val="0"/>
+          <w:sz w:val="20"/>
+          <w:szCs w:val="20"/>
+          <w:lang w:eastAsia="fr-FR"/>
+          <w14:ligatures w14:val="none"/>
+        </w:rPr>
+        <w:t>Pratique (Python)</w:t>
+      </w:r>
+      <w:r>
+        <w:rPr>
+          <w:rFonts w:eastAsia="Times New Roman" w:cstheme="minorHAnsi"/>
+          <w:kern w:val="0"/>
+          <w:sz w:val="20"/>
+          <w:szCs w:val="20"/>
+          <w:lang w:eastAsia="fr-FR"/>
+          <w14:ligatures w14:val="none"/>
+        </w:rPr>
+        <w:t xml:space="preserve"> : Utilisation de pandas pour la manipulation d'index temporels (</w:t>
+      </w:r>
+      <w:proofErr w:type="spellStart"/>
+      <w:r>
+        <w:rPr>
+          <w:rFonts w:eastAsia="Times New Roman" w:cstheme="minorHAnsi"/>
+          <w:kern w:val="0"/>
+          <w:sz w:val="20"/>
+          <w:szCs w:val="20"/>
+          <w:lang w:eastAsia="fr-FR"/>
+          <w14:ligatures w14:val="none"/>
+        </w:rPr>
+        <w:t>resampling</w:t>
+      </w:r>
+      <w:proofErr w:type="spellEnd"/>
+      <w:r>
+        <w:rPr>
+          <w:rFonts w:eastAsia="Times New Roman" w:cstheme="minorHAnsi"/>
+          <w:kern w:val="0"/>
+          <w:sz w:val="20"/>
+          <w:szCs w:val="20"/>
+          <w:lang w:eastAsia="fr-FR"/>
+          <w14:ligatures w14:val="none"/>
+        </w:rPr>
+        <w:t xml:space="preserve">, </w:t>
+      </w:r>
+      <w:proofErr w:type="spellStart"/>
+      <w:r>
+        <w:rPr>
+          <w:rFonts w:eastAsia="Times New Roman" w:cstheme="minorHAnsi"/>
+          <w:kern w:val="0"/>
+          <w:sz w:val="20"/>
+          <w:szCs w:val="20"/>
+          <w:lang w:eastAsia="fr-FR"/>
+          <w14:ligatures w14:val="none"/>
+        </w:rPr>
+        <w:t>rolling</w:t>
+      </w:r>
+      <w:proofErr w:type="spellEnd"/>
+      <w:r>
+        <w:rPr>
+          <w:rFonts w:eastAsia="Times New Roman" w:cstheme="minorHAnsi"/>
+          <w:kern w:val="0"/>
+          <w:sz w:val="20"/>
+          <w:szCs w:val="20"/>
           <w:lang w:eastAsia="fr-FR"/>
           <w14:ligatures w14:val="none"/>
         </w:rPr>
@@ -6597,157 +6696,2109 @@
       <w:proofErr w:type="spellStart"/>
       <w:r>
         <w:rPr>
-          <w:rFonts w:ascii="Times New Roman" w:eastAsia="Times New Roman" w:hAnsi="Times New Roman" w:cs="Times New Roman"/>
-          <w:kern w:val="0"/>
-          <w:sz w:val="24"/>
-          <w:szCs w:val="24"/>
-          <w:lang w:eastAsia="fr-FR"/>
-          <w14:ligatures w14:val="none"/>
-        </w:rPr>
-        <w:t>Autocorrelation</w:t>
+          <w:rFonts w:eastAsia="Times New Roman" w:cstheme="minorHAnsi"/>
+          <w:kern w:val="0"/>
+          <w:sz w:val="20"/>
+          <w:szCs w:val="20"/>
+          <w:lang w:eastAsia="fr-FR"/>
+          <w14:ligatures w14:val="none"/>
+        </w:rPr>
+        <w:t>windows</w:t>
       </w:r>
       <w:proofErr w:type="spellEnd"/>
       <w:r>
         <w:rPr>
-          <w:rFonts w:ascii="Times New Roman" w:eastAsia="Times New Roman" w:hAnsi="Times New Roman" w:cs="Times New Roman"/>
-          <w:kern w:val="0"/>
-          <w:sz w:val="24"/>
-          <w:szCs w:val="24"/>
-          <w:lang w:eastAsia="fr-FR"/>
-          <w14:ligatures w14:val="none"/>
-        </w:rPr>
-        <w:t xml:space="preserve">, </w:t>
+          <w:rFonts w:eastAsia="Times New Roman" w:cstheme="minorHAnsi"/>
+          <w:kern w:val="0"/>
+          <w:sz w:val="20"/>
+          <w:szCs w:val="20"/>
+          <w:lang w:eastAsia="fr-FR"/>
+          <w14:ligatures w14:val="none"/>
+        </w:rPr>
+        <w:t xml:space="preserve">) et </w:t>
       </w:r>
       <w:proofErr w:type="spellStart"/>
       <w:r>
         <w:rPr>
-          <w:rFonts w:ascii="Times New Roman" w:eastAsia="Times New Roman" w:hAnsi="Times New Roman" w:cs="Times New Roman"/>
-          <w:kern w:val="0"/>
-          <w:sz w:val="24"/>
-          <w:szCs w:val="24"/>
-          <w:lang w:eastAsia="fr-FR"/>
-          <w14:ligatures w14:val="none"/>
-        </w:rPr>
-        <w:t>stationarity</w:t>
+          <w:rFonts w:eastAsia="Times New Roman" w:cstheme="minorHAnsi"/>
+          <w:kern w:val="0"/>
+          <w:sz w:val="20"/>
+          <w:szCs w:val="20"/>
+          <w:lang w:eastAsia="fr-FR"/>
+          <w14:ligatures w14:val="none"/>
+        </w:rPr>
+        <w:t>statsmodels</w:t>
       </w:r>
       <w:proofErr w:type="spellEnd"/>
+      <w:r>
+        <w:rPr>
+          <w:rFonts w:eastAsia="Times New Roman" w:cstheme="minorHAnsi"/>
+          <w:kern w:val="0"/>
+          <w:sz w:val="20"/>
+          <w:szCs w:val="20"/>
+          <w:lang w:eastAsia="fr-FR"/>
+          <w14:ligatures w14:val="none"/>
+        </w:rPr>
+        <w:t xml:space="preserve"> pour la décomposition.</w:t>
+      </w:r>
+    </w:p>
+    <w:p>
+      <w:pPr>
+        <w:spacing w:after="0" w:line="240" w:lineRule="auto"/>
+        <w:outlineLvl w:val="2"/>
+        <w:rPr>
+          <w:rFonts w:eastAsia="Times New Roman" w:cstheme="minorHAnsi"/>
+          <w:b/>
+          <w:bCs/>
+          <w:kern w:val="0"/>
+          <w:sz w:val="20"/>
+          <w:szCs w:val="20"/>
+          <w:lang w:eastAsia="fr-FR"/>
+          <w14:ligatures w14:val="none"/>
+        </w:rPr>
+      </w:pPr>
+      <w:r>
+        <w:rPr>
+          <w:rFonts w:eastAsia="Times New Roman" w:cstheme="minorHAnsi"/>
+          <w:b/>
+          <w:bCs/>
+          <w:kern w:val="0"/>
+          <w:sz w:val="20"/>
+          <w:szCs w:val="20"/>
+          <w:lang w:eastAsia="fr-FR"/>
+          <w14:ligatures w14:val="none"/>
+        </w:rPr>
+        <w:t>Module 2 : Stationnarité et Outils Mathématiques</w:t>
+      </w:r>
+    </w:p>
+    <w:p>
+      <w:pPr>
+        <w:spacing w:after="0" w:line="240" w:lineRule="auto"/>
+        <w:rPr>
+          <w:rFonts w:eastAsia="Times New Roman" w:cstheme="minorHAnsi"/>
+          <w:kern w:val="0"/>
+          <w:sz w:val="20"/>
+          <w:szCs w:val="20"/>
+          <w:lang w:eastAsia="fr-FR"/>
+          <w14:ligatures w14:val="none"/>
+        </w:rPr>
+      </w:pPr>
+      <w:r>
+        <w:rPr>
+          <w:rFonts w:eastAsia="Times New Roman" w:cstheme="minorHAnsi"/>
+          <w:i/>
+          <w:iCs/>
+          <w:kern w:val="0"/>
+          <w:sz w:val="20"/>
+          <w:szCs w:val="20"/>
+          <w:lang w:eastAsia="fr-FR"/>
+          <w14:ligatures w14:val="none"/>
+        </w:rPr>
+        <w:t>Objectif : Maîtriser le concept clé qui permet d'appliquer la plupart des modèles statistiques.</w:t>
+      </w:r>
     </w:p>
     <w:p>
       <w:pPr>
         <w:numPr>
           <w:ilvl w:val="0"/>
-          <w:numId w:val="13"/>
+          <w:numId w:val="28"/>
         </w:numPr>
-        <w:spacing w:before="100" w:beforeAutospacing="1" w:after="100" w:afterAutospacing="1" w:line="240" w:lineRule="auto"/>
-        <w:rPr>
-          <w:b/>
-          <w:bCs/>
-        </w:rPr>
-      </w:pPr>
-      <w:r>
-        <w:rPr>
-          <w:rFonts w:ascii="Times New Roman" w:eastAsia="Times New Roman" w:hAnsi="Times New Roman" w:cs="Times New Roman"/>
-          <w:kern w:val="0"/>
-          <w:sz w:val="24"/>
-          <w:szCs w:val="24"/>
-          <w:lang w:val="en-US" w:eastAsia="fr-FR"/>
-          <w14:ligatures w14:val="none"/>
-        </w:rPr>
-        <w:t xml:space="preserve">Day 65: Mini project: </w:t>
-      </w:r>
-    </w:p>
-    <w:p>
-      <w:pPr>
-        <w:spacing w:before="100" w:beforeAutospacing="1" w:after="100" w:afterAutospacing="1" w:line="240" w:lineRule="auto"/>
-        <w:ind w:left="720"/>
-        <w:rPr>
-          <w:b/>
-          <w:bCs/>
-        </w:rPr>
-      </w:pPr>
-      <w:r>
-        <w:rPr>
-          <w:b/>
-          <w:bCs/>
-        </w:rPr>
-        <w:t>1. Prévision de consommation électrique d’un foyer</w:t>
-      </w:r>
-    </w:p>
-    <w:p>
-      <w:pPr>
-        <w:ind w:left="360"/>
-        <w:rPr>
-          <w:lang w:val="en-US"/>
-        </w:rPr>
-      </w:pPr>
+        <w:spacing w:after="0" w:line="240" w:lineRule="auto"/>
+        <w:rPr>
+          <w:rFonts w:eastAsia="Times New Roman" w:cstheme="minorHAnsi"/>
+          <w:kern w:val="0"/>
+          <w:sz w:val="20"/>
+          <w:szCs w:val="20"/>
+          <w:lang w:eastAsia="fr-FR"/>
+          <w14:ligatures w14:val="none"/>
+        </w:rPr>
+      </w:pPr>
+      <w:r>
+        <w:rPr>
+          <w:rFonts w:eastAsia="Times New Roman" w:cstheme="minorHAnsi"/>
+          <w:b/>
+          <w:bCs/>
+          <w:kern w:val="0"/>
+          <w:sz w:val="20"/>
+          <w:szCs w:val="20"/>
+          <w:lang w:eastAsia="fr-FR"/>
+          <w14:ligatures w14:val="none"/>
+        </w:rPr>
+        <w:t>Qu'est-ce que la stationnarité ?</w:t>
+      </w:r>
+      <w:r>
+        <w:rPr>
+          <w:rFonts w:eastAsia="Times New Roman" w:cstheme="minorHAnsi"/>
+          <w:kern w:val="0"/>
+          <w:sz w:val="20"/>
+          <w:szCs w:val="20"/>
+          <w:lang w:eastAsia="fr-FR"/>
+          <w14:ligatures w14:val="none"/>
+        </w:rPr>
+        <w:t xml:space="preserve"> (Définition forte vs faible, moyenne et variance constantes).</w:t>
+      </w:r>
+    </w:p>
+    <w:p>
+      <w:pPr>
+        <w:numPr>
+          <w:ilvl w:val="0"/>
+          <w:numId w:val="28"/>
+        </w:numPr>
+        <w:spacing w:after="0" w:line="240" w:lineRule="auto"/>
+        <w:rPr>
+          <w:rFonts w:eastAsia="Times New Roman" w:cstheme="minorHAnsi"/>
+          <w:kern w:val="0"/>
+          <w:sz w:val="20"/>
+          <w:szCs w:val="20"/>
+          <w:lang w:eastAsia="fr-FR"/>
+          <w14:ligatures w14:val="none"/>
+        </w:rPr>
+      </w:pPr>
+      <w:r>
+        <w:rPr>
+          <w:rFonts w:eastAsia="Times New Roman" w:cstheme="minorHAnsi"/>
+          <w:b/>
+          <w:bCs/>
+          <w:kern w:val="0"/>
+          <w:sz w:val="20"/>
+          <w:szCs w:val="20"/>
+          <w:lang w:eastAsia="fr-FR"/>
+          <w14:ligatures w14:val="none"/>
+        </w:rPr>
+        <w:t>Tests statistiques de stationnarité</w:t>
+      </w:r>
+      <w:r>
+        <w:rPr>
+          <w:rFonts w:eastAsia="Times New Roman" w:cstheme="minorHAnsi"/>
+          <w:kern w:val="0"/>
+          <w:sz w:val="20"/>
+          <w:szCs w:val="20"/>
+          <w:lang w:eastAsia="fr-FR"/>
+          <w14:ligatures w14:val="none"/>
+        </w:rPr>
+        <w:t xml:space="preserve"> :</w:t>
+      </w:r>
+    </w:p>
+    <w:p>
+      <w:pPr>
+        <w:numPr>
+          <w:ilvl w:val="1"/>
+          <w:numId w:val="28"/>
+        </w:numPr>
+        <w:spacing w:after="0" w:line="240" w:lineRule="auto"/>
+        <w:rPr>
+          <w:rFonts w:eastAsia="Times New Roman" w:cstheme="minorHAnsi"/>
+          <w:kern w:val="0"/>
+          <w:sz w:val="20"/>
+          <w:szCs w:val="20"/>
+          <w:lang w:eastAsia="fr-FR"/>
+          <w14:ligatures w14:val="none"/>
+        </w:rPr>
+      </w:pPr>
+      <w:r>
+        <w:rPr>
+          <w:rFonts w:eastAsia="Times New Roman" w:cstheme="minorHAnsi"/>
+          <w:kern w:val="0"/>
+          <w:sz w:val="20"/>
+          <w:szCs w:val="20"/>
+          <w:lang w:eastAsia="fr-FR"/>
+          <w14:ligatures w14:val="none"/>
+        </w:rPr>
+        <w:t>Test de Dickey-Augmenté (ADF)</w:t>
+      </w:r>
+    </w:p>
+    <w:p>
+      <w:pPr>
+        <w:numPr>
+          <w:ilvl w:val="1"/>
+          <w:numId w:val="28"/>
+        </w:numPr>
+        <w:spacing w:after="0" w:line="240" w:lineRule="auto"/>
+        <w:rPr>
+          <w:rFonts w:eastAsia="Times New Roman" w:cstheme="minorHAnsi"/>
+          <w:kern w:val="0"/>
+          <w:sz w:val="20"/>
+          <w:szCs w:val="20"/>
+          <w:lang w:eastAsia="fr-FR"/>
+          <w14:ligatures w14:val="none"/>
+        </w:rPr>
+      </w:pPr>
+      <w:r>
+        <w:rPr>
+          <w:rFonts w:eastAsia="Times New Roman" w:cstheme="minorHAnsi"/>
+          <w:kern w:val="0"/>
+          <w:sz w:val="20"/>
+          <w:szCs w:val="20"/>
+          <w:lang w:eastAsia="fr-FR"/>
+          <w14:ligatures w14:val="none"/>
+        </w:rPr>
+        <w:t>Test KPSS.</w:t>
+      </w:r>
+    </w:p>
+    <w:p>
+      <w:pPr>
+        <w:numPr>
+          <w:ilvl w:val="0"/>
+          <w:numId w:val="28"/>
+        </w:numPr>
+        <w:spacing w:after="0" w:line="240" w:lineRule="auto"/>
+        <w:rPr>
+          <w:rFonts w:eastAsia="Times New Roman" w:cstheme="minorHAnsi"/>
+          <w:kern w:val="0"/>
+          <w:sz w:val="20"/>
+          <w:szCs w:val="20"/>
+          <w:lang w:eastAsia="fr-FR"/>
+          <w14:ligatures w14:val="none"/>
+        </w:rPr>
+      </w:pPr>
+      <w:r>
+        <w:rPr>
+          <w:rFonts w:eastAsia="Times New Roman" w:cstheme="minorHAnsi"/>
+          <w:b/>
+          <w:bCs/>
+          <w:kern w:val="0"/>
+          <w:sz w:val="20"/>
+          <w:szCs w:val="20"/>
+          <w:lang w:eastAsia="fr-FR"/>
+          <w14:ligatures w14:val="none"/>
+        </w:rPr>
+        <w:t>Techniques de transformation</w:t>
+      </w:r>
+      <w:r>
+        <w:rPr>
+          <w:rFonts w:eastAsia="Times New Roman" w:cstheme="minorHAnsi"/>
+          <w:kern w:val="0"/>
+          <w:sz w:val="20"/>
+          <w:szCs w:val="20"/>
+          <w:lang w:eastAsia="fr-FR"/>
+          <w14:ligatures w14:val="none"/>
+        </w:rPr>
+        <w:t xml:space="preserve"> :</w:t>
+      </w:r>
+    </w:p>
+    <w:p>
+      <w:pPr>
+        <w:numPr>
+          <w:ilvl w:val="1"/>
+          <w:numId w:val="28"/>
+        </w:numPr>
+        <w:spacing w:after="0" w:line="240" w:lineRule="auto"/>
+        <w:rPr>
+          <w:rFonts w:eastAsia="Times New Roman" w:cstheme="minorHAnsi"/>
+          <w:kern w:val="0"/>
+          <w:sz w:val="20"/>
+          <w:szCs w:val="20"/>
+          <w:lang w:eastAsia="fr-FR"/>
+          <w14:ligatures w14:val="none"/>
+        </w:rPr>
+      </w:pPr>
+      <w:r>
+        <w:rPr>
+          <w:rFonts w:eastAsia="Times New Roman" w:cstheme="minorHAnsi"/>
+          <w:kern w:val="0"/>
+          <w:sz w:val="20"/>
+          <w:szCs w:val="20"/>
+          <w:lang w:eastAsia="fr-FR"/>
+          <w14:ligatures w14:val="none"/>
+        </w:rPr>
+        <w:t>Différenciation (pour supprimer la tendance)</w:t>
+      </w:r>
+    </w:p>
+    <w:p>
+      <w:pPr>
+        <w:numPr>
+          <w:ilvl w:val="1"/>
+          <w:numId w:val="28"/>
+        </w:numPr>
+        <w:spacing w:after="0" w:line="240" w:lineRule="auto"/>
+        <w:rPr>
+          <w:rFonts w:eastAsia="Times New Roman" w:cstheme="minorHAnsi"/>
+          <w:kern w:val="0"/>
+          <w:sz w:val="20"/>
+          <w:szCs w:val="20"/>
+          <w:lang w:eastAsia="fr-FR"/>
+          <w14:ligatures w14:val="none"/>
+        </w:rPr>
+      </w:pPr>
+      <w:r>
+        <w:rPr>
+          <w:rFonts w:eastAsia="Times New Roman" w:cstheme="minorHAnsi"/>
+          <w:kern w:val="0"/>
+          <w:sz w:val="20"/>
+          <w:szCs w:val="20"/>
+          <w:lang w:eastAsia="fr-FR"/>
+          <w14:ligatures w14:val="none"/>
+        </w:rPr>
+        <w:t>Transformation de Box-Cox (stabilisation de la variance).</w:t>
+      </w:r>
+    </w:p>
+    <w:p>
+      <w:pPr>
+        <w:numPr>
+          <w:ilvl w:val="0"/>
+          <w:numId w:val="28"/>
+        </w:numPr>
+        <w:spacing w:after="0" w:line="240" w:lineRule="auto"/>
+        <w:rPr>
+          <w:rFonts w:eastAsia="Times New Roman" w:cstheme="minorHAnsi"/>
+          <w:kern w:val="0"/>
+          <w:sz w:val="20"/>
+          <w:szCs w:val="20"/>
+          <w:lang w:eastAsia="fr-FR"/>
+          <w14:ligatures w14:val="none"/>
+        </w:rPr>
+      </w:pPr>
+      <w:r>
+        <w:rPr>
+          <w:rFonts w:eastAsia="Times New Roman" w:cstheme="minorHAnsi"/>
+          <w:b/>
+          <w:bCs/>
+          <w:kern w:val="0"/>
+          <w:sz w:val="20"/>
+          <w:szCs w:val="20"/>
+          <w:lang w:eastAsia="fr-FR"/>
+          <w14:ligatures w14:val="none"/>
+        </w:rPr>
+        <w:t>Pratique (Python)</w:t>
+      </w:r>
+      <w:r>
+        <w:rPr>
+          <w:rFonts w:eastAsia="Times New Roman" w:cstheme="minorHAnsi"/>
+          <w:kern w:val="0"/>
+          <w:sz w:val="20"/>
+          <w:szCs w:val="20"/>
+          <w:lang w:eastAsia="fr-FR"/>
+          <w14:ligatures w14:val="none"/>
+        </w:rPr>
+        <w:t xml:space="preserve"> : Application des tests ADF et mise en œuvre des transformations sur un jeu de données réel.</w:t>
+      </w:r>
+    </w:p>
+    <w:p>
+      <w:pPr>
+        <w:spacing w:after="0" w:line="240" w:lineRule="auto"/>
+        <w:outlineLvl w:val="2"/>
+        <w:rPr>
+          <w:rFonts w:eastAsia="Times New Roman" w:cstheme="minorHAnsi"/>
+          <w:b/>
+          <w:bCs/>
+          <w:kern w:val="0"/>
+          <w:sz w:val="20"/>
+          <w:szCs w:val="20"/>
+          <w:lang w:eastAsia="fr-FR"/>
+          <w14:ligatures w14:val="none"/>
+        </w:rPr>
+      </w:pPr>
+      <w:r>
+        <w:rPr>
+          <w:rFonts w:eastAsia="Times New Roman" w:cstheme="minorHAnsi"/>
+          <w:b/>
+          <w:bCs/>
+          <w:kern w:val="0"/>
+          <w:sz w:val="20"/>
+          <w:szCs w:val="20"/>
+          <w:lang w:eastAsia="fr-FR"/>
+          <w14:ligatures w14:val="none"/>
+        </w:rPr>
+        <w:t>Module 3 : Modèles Statistiques Traditionnels (ARIMA &amp; Friends)</w:t>
+      </w:r>
+    </w:p>
+    <w:p>
+      <w:pPr>
+        <w:spacing w:after="0" w:line="240" w:lineRule="auto"/>
+        <w:rPr>
+          <w:rFonts w:eastAsia="Times New Roman" w:cstheme="minorHAnsi"/>
+          <w:kern w:val="0"/>
+          <w:sz w:val="20"/>
+          <w:szCs w:val="20"/>
+          <w:lang w:eastAsia="fr-FR"/>
+          <w14:ligatures w14:val="none"/>
+        </w:rPr>
+      </w:pPr>
+      <w:r>
+        <w:rPr>
+          <w:rFonts w:eastAsia="Times New Roman" w:cstheme="minorHAnsi"/>
+          <w:i/>
+          <w:iCs/>
+          <w:kern w:val="0"/>
+          <w:sz w:val="20"/>
+          <w:szCs w:val="20"/>
+          <w:lang w:eastAsia="fr-FR"/>
+          <w14:ligatures w14:val="none"/>
+        </w:rPr>
+        <w:t>Objectif : Modéliser la dépendance temporelle linéaire.</w:t>
+      </w:r>
+    </w:p>
+    <w:p>
+      <w:pPr>
+        <w:numPr>
+          <w:ilvl w:val="0"/>
+          <w:numId w:val="29"/>
+        </w:numPr>
+        <w:spacing w:after="0" w:line="240" w:lineRule="auto"/>
+        <w:rPr>
+          <w:rFonts w:eastAsia="Times New Roman" w:cstheme="minorHAnsi"/>
+          <w:kern w:val="0"/>
+          <w:sz w:val="20"/>
+          <w:szCs w:val="20"/>
+          <w:lang w:eastAsia="fr-FR"/>
+          <w14:ligatures w14:val="none"/>
+        </w:rPr>
+      </w:pPr>
+      <w:r>
+        <w:rPr>
+          <w:rFonts w:eastAsia="Times New Roman" w:cstheme="minorHAnsi"/>
+          <w:b/>
+          <w:bCs/>
+          <w:kern w:val="0"/>
+          <w:sz w:val="20"/>
+          <w:szCs w:val="20"/>
+          <w:lang w:eastAsia="fr-FR"/>
+          <w14:ligatures w14:val="none"/>
+        </w:rPr>
+        <w:t>Processus stochastiques de base</w:t>
+      </w:r>
+      <w:r>
+        <w:rPr>
+          <w:rFonts w:eastAsia="Times New Roman" w:cstheme="minorHAnsi"/>
+          <w:kern w:val="0"/>
+          <w:sz w:val="20"/>
+          <w:szCs w:val="20"/>
+          <w:lang w:eastAsia="fr-FR"/>
+          <w14:ligatures w14:val="none"/>
+        </w:rPr>
+        <w:t xml:space="preserve"> : Bruit blanc, marche aléatoire (Random Walk), processus AR (Autorégressifs) et MA (Moyennes Mobiles).</w:t>
+      </w:r>
+    </w:p>
+    <w:p>
+      <w:pPr>
+        <w:numPr>
+          <w:ilvl w:val="0"/>
+          <w:numId w:val="29"/>
+        </w:numPr>
+        <w:spacing w:after="0" w:line="240" w:lineRule="auto"/>
+        <w:rPr>
+          <w:rFonts w:eastAsia="Times New Roman" w:cstheme="minorHAnsi"/>
+          <w:kern w:val="0"/>
+          <w:sz w:val="20"/>
+          <w:szCs w:val="20"/>
+          <w:lang w:eastAsia="fr-FR"/>
+          <w14:ligatures w14:val="none"/>
+        </w:rPr>
+      </w:pPr>
+      <w:r>
+        <w:rPr>
+          <w:rFonts w:eastAsia="Times New Roman" w:cstheme="minorHAnsi"/>
+          <w:b/>
+          <w:bCs/>
+          <w:kern w:val="0"/>
+          <w:sz w:val="20"/>
+          <w:szCs w:val="20"/>
+          <w:lang w:eastAsia="fr-FR"/>
+          <w14:ligatures w14:val="none"/>
+        </w:rPr>
+        <w:t>La famille ARMA et ARIMA</w:t>
+      </w:r>
+      <w:r>
+        <w:rPr>
+          <w:rFonts w:eastAsia="Times New Roman" w:cstheme="minorHAnsi"/>
+          <w:kern w:val="0"/>
+          <w:sz w:val="20"/>
+          <w:szCs w:val="20"/>
+          <w:lang w:eastAsia="fr-FR"/>
+          <w14:ligatures w14:val="none"/>
+        </w:rPr>
+        <w:t xml:space="preserve"> : Paramètres $(p, d, </w:t>
+      </w:r>
       <w:proofErr w:type="gramStart"/>
       <w:r>
         <w:rPr>
-          <w:lang w:val="en-US"/>
-        </w:rPr>
-        <w:t>Données :</w:t>
+          <w:rFonts w:eastAsia="Times New Roman" w:cstheme="minorHAnsi"/>
+          <w:kern w:val="0"/>
+          <w:sz w:val="20"/>
+          <w:szCs w:val="20"/>
+          <w:lang w:eastAsia="fr-FR"/>
+          <w14:ligatures w14:val="none"/>
+        </w:rPr>
+        <w:t>q)$</w:t>
       </w:r>
       <w:proofErr w:type="gramEnd"/>
       <w:r>
         <w:rPr>
-          <w:lang w:val="en-US"/>
-        </w:rPr>
-        <w:t xml:space="preserve"> Open Power System Data, UK Power Consumption, etc.</w:t>
-      </w:r>
-    </w:p>
-    <w:p>
-      <w:pPr>
-        <w:ind w:left="360"/>
-      </w:pPr>
-      <w:r>
-        <w:t>Tâche : Prévoir la consommation horaire sur 48h.</w:t>
-      </w:r>
-    </w:p>
-    <w:p>
-      <w:pPr>
-        <w:ind w:left="360"/>
-      </w:pPr>
-      <w:r>
-        <w:t xml:space="preserve">Plus-value : Série temporelle, météo → </w:t>
+          <w:rFonts w:eastAsia="Times New Roman" w:cstheme="minorHAnsi"/>
+          <w:kern w:val="0"/>
+          <w:sz w:val="20"/>
+          <w:szCs w:val="20"/>
+          <w:lang w:eastAsia="fr-FR"/>
+          <w14:ligatures w14:val="none"/>
+        </w:rPr>
+        <w:t>, fonction d'autocorrélation (ACF) et d'autocorrélation partielle (PACF).</w:t>
+      </w:r>
+    </w:p>
+    <w:p>
+      <w:pPr>
+        <w:numPr>
+          <w:ilvl w:val="0"/>
+          <w:numId w:val="29"/>
+        </w:numPr>
+        <w:spacing w:after="0" w:line="240" w:lineRule="auto"/>
+        <w:rPr>
+          <w:rFonts w:eastAsia="Times New Roman" w:cstheme="minorHAnsi"/>
+          <w:kern w:val="0"/>
+          <w:sz w:val="20"/>
+          <w:szCs w:val="20"/>
+          <w:lang w:eastAsia="fr-FR"/>
+          <w14:ligatures w14:val="none"/>
+        </w:rPr>
+      </w:pPr>
+      <w:r>
+        <w:rPr>
+          <w:rFonts w:eastAsia="Times New Roman" w:cstheme="minorHAnsi"/>
+          <w:b/>
+          <w:bCs/>
+          <w:kern w:val="0"/>
+          <w:sz w:val="20"/>
+          <w:szCs w:val="20"/>
+          <w:lang w:eastAsia="fr-FR"/>
+          <w14:ligatures w14:val="none"/>
+        </w:rPr>
+        <w:t>Extensions saisonnières et exogènes</w:t>
+      </w:r>
+      <w:r>
+        <w:rPr>
+          <w:rFonts w:eastAsia="Times New Roman" w:cstheme="minorHAnsi"/>
+          <w:kern w:val="0"/>
+          <w:sz w:val="20"/>
+          <w:szCs w:val="20"/>
+          <w:lang w:eastAsia="fr-FR"/>
+          <w14:ligatures w14:val="none"/>
+        </w:rPr>
+        <w:t xml:space="preserve"> : SARIMA $(</w:t>
       </w:r>
       <w:proofErr w:type="spellStart"/>
-      <w:r>
+      <w:proofErr w:type="gramStart"/>
+      <w:r>
+        <w:rPr>
+          <w:rFonts w:eastAsia="Times New Roman" w:cstheme="minorHAnsi"/>
+          <w:kern w:val="0"/>
+          <w:sz w:val="20"/>
+          <w:szCs w:val="20"/>
+          <w:lang w:eastAsia="fr-FR"/>
+          <w14:ligatures w14:val="none"/>
+        </w:rPr>
+        <w:t>p,d</w:t>
+      </w:r>
+      <w:proofErr w:type="gramEnd"/>
+      <w:r>
+        <w:rPr>
+          <w:rFonts w:eastAsia="Times New Roman" w:cstheme="minorHAnsi"/>
+          <w:kern w:val="0"/>
+          <w:sz w:val="20"/>
+          <w:szCs w:val="20"/>
+          <w:lang w:eastAsia="fr-FR"/>
+          <w14:ligatures w14:val="none"/>
+        </w:rPr>
+        <w:t>,</w:t>
+      </w:r>
+      <w:proofErr w:type="gramStart"/>
+      <w:r>
+        <w:rPr>
+          <w:rFonts w:eastAsia="Times New Roman" w:cstheme="minorHAnsi"/>
+          <w:kern w:val="0"/>
+          <w:sz w:val="20"/>
+          <w:szCs w:val="20"/>
+          <w:lang w:eastAsia="fr-FR"/>
+          <w14:ligatures w14:val="none"/>
+        </w:rPr>
+        <w:t>q</w:t>
+      </w:r>
+      <w:proofErr w:type="spellEnd"/>
+      <w:r>
+        <w:rPr>
+          <w:rFonts w:eastAsia="Times New Roman" w:cstheme="minorHAnsi"/>
+          <w:kern w:val="0"/>
+          <w:sz w:val="20"/>
+          <w:szCs w:val="20"/>
+          <w:lang w:eastAsia="fr-FR"/>
+          <w14:ligatures w14:val="none"/>
+        </w:rPr>
+        <w:t>)(P,D</w:t>
+      </w:r>
+      <w:proofErr w:type="gramEnd"/>
+      <w:r>
+        <w:rPr>
+          <w:rFonts w:eastAsia="Times New Roman" w:cstheme="minorHAnsi"/>
+          <w:kern w:val="0"/>
+          <w:sz w:val="20"/>
+          <w:szCs w:val="20"/>
+          <w:lang w:eastAsia="fr-FR"/>
+          <w14:ligatures w14:val="none"/>
+        </w:rPr>
+        <w:t>,</w:t>
+      </w:r>
+      <w:proofErr w:type="gramStart"/>
+      <w:r>
+        <w:rPr>
+          <w:rFonts w:eastAsia="Times New Roman" w:cstheme="minorHAnsi"/>
+          <w:kern w:val="0"/>
+          <w:sz w:val="20"/>
+          <w:szCs w:val="20"/>
+          <w:lang w:eastAsia="fr-FR"/>
+          <w14:ligatures w14:val="none"/>
+        </w:rPr>
+        <w:t>Q)_</w:t>
+      </w:r>
+      <w:proofErr w:type="gramEnd"/>
+      <w:r>
+        <w:rPr>
+          <w:rFonts w:eastAsia="Times New Roman" w:cstheme="minorHAnsi"/>
+          <w:kern w:val="0"/>
+          <w:sz w:val="20"/>
+          <w:szCs w:val="20"/>
+          <w:lang w:eastAsia="fr-FR"/>
+          <w14:ligatures w14:val="none"/>
+        </w:rPr>
+        <w:t>s$ et ARIMAX.</w:t>
+      </w:r>
+    </w:p>
+    <w:p>
+      <w:pPr>
+        <w:numPr>
+          <w:ilvl w:val="0"/>
+          <w:numId w:val="29"/>
+        </w:numPr>
+        <w:spacing w:after="0" w:line="240" w:lineRule="auto"/>
+        <w:rPr>
+          <w:rFonts w:eastAsia="Times New Roman" w:cstheme="minorHAnsi"/>
+          <w:kern w:val="0"/>
+          <w:sz w:val="20"/>
+          <w:szCs w:val="20"/>
+          <w:lang w:eastAsia="fr-FR"/>
+          <w14:ligatures w14:val="none"/>
+        </w:rPr>
+      </w:pPr>
+      <w:r>
+        <w:rPr>
+          <w:rFonts w:eastAsia="Times New Roman" w:cstheme="minorHAnsi"/>
+          <w:b/>
+          <w:bCs/>
+          <w:kern w:val="0"/>
+          <w:sz w:val="20"/>
+          <w:szCs w:val="20"/>
+          <w:lang w:eastAsia="fr-FR"/>
+          <w14:ligatures w14:val="none"/>
+        </w:rPr>
+        <w:t>Pratique (Python)</w:t>
+      </w:r>
+      <w:r>
+        <w:rPr>
+          <w:rFonts w:eastAsia="Times New Roman" w:cstheme="minorHAnsi"/>
+          <w:kern w:val="0"/>
+          <w:sz w:val="20"/>
+          <w:szCs w:val="20"/>
+          <w:lang w:eastAsia="fr-FR"/>
+          <w14:ligatures w14:val="none"/>
+        </w:rPr>
+        <w:t xml:space="preserve"> : Utilisation de </w:t>
+      </w:r>
+      <w:proofErr w:type="spellStart"/>
+      <w:r>
+        <w:rPr>
+          <w:rFonts w:eastAsia="Times New Roman" w:cstheme="minorHAnsi"/>
+          <w:kern w:val="0"/>
+          <w:sz w:val="20"/>
+          <w:szCs w:val="20"/>
+          <w:lang w:eastAsia="fr-FR"/>
+          <w14:ligatures w14:val="none"/>
+        </w:rPr>
+        <w:t>pmdarima</w:t>
+      </w:r>
+      <w:proofErr w:type="spellEnd"/>
+      <w:r>
+        <w:rPr>
+          <w:rFonts w:eastAsia="Times New Roman" w:cstheme="minorHAnsi"/>
+          <w:kern w:val="0"/>
+          <w:sz w:val="20"/>
+          <w:szCs w:val="20"/>
+          <w:lang w:eastAsia="fr-FR"/>
+          <w14:ligatures w14:val="none"/>
+        </w:rPr>
+        <w:t xml:space="preserve"> pour l'optimisation automatique des hyperparamètres (</w:t>
+      </w:r>
+      <w:proofErr w:type="spellStart"/>
+      <w:r>
+        <w:rPr>
+          <w:rFonts w:eastAsia="Times New Roman" w:cstheme="minorHAnsi"/>
+          <w:kern w:val="0"/>
+          <w:sz w:val="20"/>
+          <w:szCs w:val="20"/>
+          <w:lang w:eastAsia="fr-FR"/>
+          <w14:ligatures w14:val="none"/>
+        </w:rPr>
+        <w:t>auto_arima</w:t>
+      </w:r>
+      <w:proofErr w:type="spellEnd"/>
+      <w:r>
+        <w:rPr>
+          <w:rFonts w:eastAsia="Times New Roman" w:cstheme="minorHAnsi"/>
+          <w:kern w:val="0"/>
+          <w:sz w:val="20"/>
+          <w:szCs w:val="20"/>
+          <w:lang w:eastAsia="fr-FR"/>
+          <w14:ligatures w14:val="none"/>
+        </w:rPr>
+        <w:t xml:space="preserve">) et prédictions avec </w:t>
+      </w:r>
+      <w:proofErr w:type="spellStart"/>
+      <w:r>
+        <w:rPr>
+          <w:rFonts w:eastAsia="Times New Roman" w:cstheme="minorHAnsi"/>
+          <w:kern w:val="0"/>
+          <w:sz w:val="20"/>
+          <w:szCs w:val="20"/>
+          <w:lang w:eastAsia="fr-FR"/>
+          <w14:ligatures w14:val="none"/>
+        </w:rPr>
+        <w:t>statsmodels</w:t>
+      </w:r>
+      <w:proofErr w:type="spellEnd"/>
+      <w:r>
+        <w:rPr>
+          <w:rFonts w:eastAsia="Times New Roman" w:cstheme="minorHAnsi"/>
+          <w:kern w:val="0"/>
+          <w:sz w:val="20"/>
+          <w:szCs w:val="20"/>
+          <w:lang w:eastAsia="fr-FR"/>
+          <w14:ligatures w14:val="none"/>
+        </w:rPr>
+        <w:t>.</w:t>
+      </w:r>
+    </w:p>
+    <w:p>
+      <w:pPr>
+        <w:spacing w:after="0" w:line="240" w:lineRule="auto"/>
+        <w:outlineLvl w:val="2"/>
+        <w:rPr>
+          <w:rFonts w:eastAsia="Times New Roman" w:cstheme="minorHAnsi"/>
+          <w:b/>
+          <w:bCs/>
+          <w:kern w:val="0"/>
+          <w:sz w:val="20"/>
+          <w:szCs w:val="20"/>
+          <w:lang w:eastAsia="fr-FR"/>
+          <w14:ligatures w14:val="none"/>
+        </w:rPr>
+      </w:pPr>
+      <w:r>
+        <w:rPr>
+          <w:rFonts w:eastAsia="Times New Roman" w:cstheme="minorHAnsi"/>
+          <w:b/>
+          <w:bCs/>
+          <w:kern w:val="0"/>
+          <w:sz w:val="20"/>
+          <w:szCs w:val="20"/>
+          <w:lang w:eastAsia="fr-FR"/>
+          <w14:ligatures w14:val="none"/>
+        </w:rPr>
+        <w:t>Module 4 : Lissage Exponentiel et Méthodes Rapides</w:t>
+      </w:r>
+    </w:p>
+    <w:p>
+      <w:pPr>
+        <w:spacing w:after="0" w:line="240" w:lineRule="auto"/>
+        <w:rPr>
+          <w:rFonts w:eastAsia="Times New Roman" w:cstheme="minorHAnsi"/>
+          <w:kern w:val="0"/>
+          <w:sz w:val="20"/>
+          <w:szCs w:val="20"/>
+          <w:lang w:eastAsia="fr-FR"/>
+          <w14:ligatures w14:val="none"/>
+        </w:rPr>
+      </w:pPr>
+      <w:r>
+        <w:rPr>
+          <w:rFonts w:eastAsia="Times New Roman" w:cstheme="minorHAnsi"/>
+          <w:i/>
+          <w:iCs/>
+          <w:kern w:val="0"/>
+          <w:sz w:val="20"/>
+          <w:szCs w:val="20"/>
+          <w:lang w:eastAsia="fr-FR"/>
+          <w14:ligatures w14:val="none"/>
+        </w:rPr>
+        <w:t>Objectif : Disposer de modèles simples, robustes et efficaces pour les prévisions à court terme.</w:t>
+      </w:r>
+    </w:p>
+    <w:p>
+      <w:pPr>
+        <w:numPr>
+          <w:ilvl w:val="0"/>
+          <w:numId w:val="30"/>
+        </w:numPr>
+        <w:spacing w:after="0" w:line="240" w:lineRule="auto"/>
+        <w:rPr>
+          <w:rFonts w:eastAsia="Times New Roman" w:cstheme="minorHAnsi"/>
+          <w:kern w:val="0"/>
+          <w:sz w:val="20"/>
+          <w:szCs w:val="20"/>
+          <w:lang w:eastAsia="fr-FR"/>
+          <w14:ligatures w14:val="none"/>
+        </w:rPr>
+      </w:pPr>
+      <w:r>
+        <w:rPr>
+          <w:rFonts w:eastAsia="Times New Roman" w:cstheme="minorHAnsi"/>
+          <w:b/>
+          <w:bCs/>
+          <w:kern w:val="0"/>
+          <w:sz w:val="20"/>
+          <w:szCs w:val="20"/>
+          <w:lang w:eastAsia="fr-FR"/>
+          <w14:ligatures w14:val="none"/>
+        </w:rPr>
+        <w:t>Lissage exponentiel simple</w:t>
+      </w:r>
+      <w:r>
+        <w:rPr>
+          <w:rFonts w:eastAsia="Times New Roman" w:cstheme="minorHAnsi"/>
+          <w:kern w:val="0"/>
+          <w:sz w:val="20"/>
+          <w:szCs w:val="20"/>
+          <w:lang w:eastAsia="fr-FR"/>
+          <w14:ligatures w14:val="none"/>
+        </w:rPr>
+        <w:t xml:space="preserve"> (Simple </w:t>
+      </w:r>
+      <w:proofErr w:type="spellStart"/>
+      <w:r>
+        <w:rPr>
+          <w:rFonts w:eastAsia="Times New Roman" w:cstheme="minorHAnsi"/>
+          <w:kern w:val="0"/>
+          <w:sz w:val="20"/>
+          <w:szCs w:val="20"/>
+          <w:lang w:eastAsia="fr-FR"/>
+          <w14:ligatures w14:val="none"/>
+        </w:rPr>
+        <w:t>Exponential</w:t>
+      </w:r>
+      <w:proofErr w:type="spellEnd"/>
+      <w:r>
+        <w:rPr>
+          <w:rFonts w:eastAsia="Times New Roman" w:cstheme="minorHAnsi"/>
+          <w:kern w:val="0"/>
+          <w:sz w:val="20"/>
+          <w:szCs w:val="20"/>
+          <w:lang w:eastAsia="fr-FR"/>
+          <w14:ligatures w14:val="none"/>
+        </w:rPr>
+        <w:t xml:space="preserve"> </w:t>
+      </w:r>
+      <w:proofErr w:type="spellStart"/>
+      <w:r>
+        <w:rPr>
+          <w:rFonts w:eastAsia="Times New Roman" w:cstheme="minorHAnsi"/>
+          <w:kern w:val="0"/>
+          <w:sz w:val="20"/>
+          <w:szCs w:val="20"/>
+          <w:lang w:eastAsia="fr-FR"/>
+          <w14:ligatures w14:val="none"/>
+        </w:rPr>
+        <w:t>Smoothing</w:t>
+      </w:r>
+      <w:proofErr w:type="spellEnd"/>
+      <w:r>
+        <w:rPr>
+          <w:rFonts w:eastAsia="Times New Roman" w:cstheme="minorHAnsi"/>
+          <w:kern w:val="0"/>
+          <w:sz w:val="20"/>
+          <w:szCs w:val="20"/>
+          <w:lang w:eastAsia="fr-FR"/>
+          <w14:ligatures w14:val="none"/>
+        </w:rPr>
+        <w:t>).</w:t>
+      </w:r>
+    </w:p>
+    <w:p>
+      <w:pPr>
+        <w:numPr>
+          <w:ilvl w:val="0"/>
+          <w:numId w:val="30"/>
+        </w:numPr>
+        <w:spacing w:after="0" w:line="240" w:lineRule="auto"/>
+        <w:rPr>
+          <w:rFonts w:eastAsia="Times New Roman" w:cstheme="minorHAnsi"/>
+          <w:kern w:val="0"/>
+          <w:sz w:val="20"/>
+          <w:szCs w:val="20"/>
+          <w:lang w:eastAsia="fr-FR"/>
+          <w14:ligatures w14:val="none"/>
+        </w:rPr>
+      </w:pPr>
+      <w:r>
+        <w:rPr>
+          <w:rFonts w:eastAsia="Times New Roman" w:cstheme="minorHAnsi"/>
+          <w:b/>
+          <w:bCs/>
+          <w:kern w:val="0"/>
+          <w:sz w:val="20"/>
+          <w:szCs w:val="20"/>
+          <w:lang w:eastAsia="fr-FR"/>
+          <w14:ligatures w14:val="none"/>
+        </w:rPr>
+        <w:t>Méthode de Holt</w:t>
+      </w:r>
+      <w:r>
+        <w:rPr>
+          <w:rFonts w:eastAsia="Times New Roman" w:cstheme="minorHAnsi"/>
+          <w:kern w:val="0"/>
+          <w:sz w:val="20"/>
+          <w:szCs w:val="20"/>
+          <w:lang w:eastAsia="fr-FR"/>
+          <w14:ligatures w14:val="none"/>
+        </w:rPr>
+        <w:t xml:space="preserve"> (Tendance) et </w:t>
+      </w:r>
+      <w:r>
+        <w:rPr>
+          <w:rFonts w:eastAsia="Times New Roman" w:cstheme="minorHAnsi"/>
+          <w:b/>
+          <w:bCs/>
+          <w:kern w:val="0"/>
+          <w:sz w:val="20"/>
+          <w:szCs w:val="20"/>
+          <w:lang w:eastAsia="fr-FR"/>
+          <w14:ligatures w14:val="none"/>
+        </w:rPr>
+        <w:t>Holt-Winters</w:t>
+      </w:r>
+      <w:r>
+        <w:rPr>
+          <w:rFonts w:eastAsia="Times New Roman" w:cstheme="minorHAnsi"/>
+          <w:kern w:val="0"/>
+          <w:sz w:val="20"/>
+          <w:szCs w:val="20"/>
+          <w:lang w:eastAsia="fr-FR"/>
+          <w14:ligatures w14:val="none"/>
+        </w:rPr>
+        <w:t xml:space="preserve"> (Tendance + Saisonnalité).</w:t>
+      </w:r>
+    </w:p>
+    <w:p>
+      <w:pPr>
+        <w:numPr>
+          <w:ilvl w:val="0"/>
+          <w:numId w:val="30"/>
+        </w:numPr>
+        <w:spacing w:after="0" w:line="240" w:lineRule="auto"/>
+        <w:rPr>
+          <w:rFonts w:eastAsia="Times New Roman" w:cstheme="minorHAnsi"/>
+          <w:kern w:val="0"/>
+          <w:sz w:val="20"/>
+          <w:szCs w:val="20"/>
+          <w:lang w:eastAsia="fr-FR"/>
+          <w14:ligatures w14:val="none"/>
+        </w:rPr>
+      </w:pPr>
+      <w:r>
+        <w:rPr>
+          <w:rFonts w:eastAsia="Times New Roman" w:cstheme="minorHAnsi"/>
+          <w:b/>
+          <w:bCs/>
+          <w:kern w:val="0"/>
+          <w:sz w:val="20"/>
+          <w:szCs w:val="20"/>
+          <w:lang w:eastAsia="fr-FR"/>
+          <w14:ligatures w14:val="none"/>
+        </w:rPr>
+        <w:t>Pratique (Python)</w:t>
+      </w:r>
+      <w:r>
+        <w:rPr>
+          <w:rFonts w:eastAsia="Times New Roman" w:cstheme="minorHAnsi"/>
+          <w:kern w:val="0"/>
+          <w:sz w:val="20"/>
+          <w:szCs w:val="20"/>
+          <w:lang w:eastAsia="fr-FR"/>
+          <w14:ligatures w14:val="none"/>
+        </w:rPr>
+        <w:t xml:space="preserve"> : Implémentation via </w:t>
+      </w:r>
+      <w:proofErr w:type="spellStart"/>
+      <w:r>
+        <w:rPr>
+          <w:rFonts w:eastAsia="Times New Roman" w:cstheme="minorHAnsi"/>
+          <w:kern w:val="0"/>
+          <w:sz w:val="20"/>
+          <w:szCs w:val="20"/>
+          <w:lang w:eastAsia="fr-FR"/>
+          <w14:ligatures w14:val="none"/>
+        </w:rPr>
+        <w:t>ExponentialSmoothing</w:t>
+      </w:r>
+      <w:proofErr w:type="spellEnd"/>
+      <w:r>
+        <w:rPr>
+          <w:rFonts w:eastAsia="Times New Roman" w:cstheme="minorHAnsi"/>
+          <w:kern w:val="0"/>
+          <w:sz w:val="20"/>
+          <w:szCs w:val="20"/>
+          <w:lang w:eastAsia="fr-FR"/>
+          <w14:ligatures w14:val="none"/>
+        </w:rPr>
+        <w:t xml:space="preserve"> de </w:t>
+      </w:r>
+      <w:proofErr w:type="spellStart"/>
+      <w:r>
+        <w:rPr>
+          <w:rFonts w:eastAsia="Times New Roman" w:cstheme="minorHAnsi"/>
+          <w:kern w:val="0"/>
+          <w:sz w:val="20"/>
+          <w:szCs w:val="20"/>
+          <w:lang w:eastAsia="fr-FR"/>
+          <w14:ligatures w14:val="none"/>
+        </w:rPr>
+        <w:t>statsmodels</w:t>
+      </w:r>
+      <w:proofErr w:type="spellEnd"/>
+      <w:r>
+        <w:rPr>
+          <w:rFonts w:eastAsia="Times New Roman" w:cstheme="minorHAnsi"/>
+          <w:kern w:val="0"/>
+          <w:sz w:val="20"/>
+          <w:szCs w:val="20"/>
+          <w:lang w:eastAsia="fr-FR"/>
+          <w14:ligatures w14:val="none"/>
+        </w:rPr>
+        <w:t>.</w:t>
+      </w:r>
+    </w:p>
+    <w:p>
+      <w:pPr>
+        <w:spacing w:after="0" w:line="240" w:lineRule="auto"/>
+        <w:outlineLvl w:val="2"/>
+        <w:rPr>
+          <w:rFonts w:eastAsia="Times New Roman" w:cstheme="minorHAnsi"/>
+          <w:b/>
+          <w:bCs/>
+          <w:kern w:val="0"/>
+          <w:sz w:val="20"/>
+          <w:szCs w:val="20"/>
+          <w:lang w:eastAsia="fr-FR"/>
+          <w14:ligatures w14:val="none"/>
+        </w:rPr>
+      </w:pPr>
+      <w:r>
+        <w:rPr>
+          <w:rFonts w:eastAsia="Times New Roman" w:cstheme="minorHAnsi"/>
+          <w:b/>
+          <w:bCs/>
+          <w:kern w:val="0"/>
+          <w:sz w:val="20"/>
+          <w:szCs w:val="20"/>
+          <w:lang w:eastAsia="fr-FR"/>
+          <w14:ligatures w14:val="none"/>
+        </w:rPr>
+        <w:t>Module 5 : Approche Machine Learning pour les Séries Temporelles</w:t>
+      </w:r>
+    </w:p>
+    <w:p>
+      <w:pPr>
+        <w:spacing w:after="0" w:line="240" w:lineRule="auto"/>
+        <w:rPr>
+          <w:rFonts w:eastAsia="Times New Roman" w:cstheme="minorHAnsi"/>
+          <w:kern w:val="0"/>
+          <w:sz w:val="20"/>
+          <w:szCs w:val="20"/>
+          <w:lang w:eastAsia="fr-FR"/>
+          <w14:ligatures w14:val="none"/>
+        </w:rPr>
+      </w:pPr>
+      <w:r>
+        <w:rPr>
+          <w:rFonts w:eastAsia="Times New Roman" w:cstheme="minorHAnsi"/>
+          <w:i/>
+          <w:iCs/>
+          <w:kern w:val="0"/>
+          <w:sz w:val="20"/>
+          <w:szCs w:val="20"/>
+          <w:lang w:eastAsia="fr-FR"/>
+          <w14:ligatures w14:val="none"/>
+        </w:rPr>
+        <w:t>Objectif : Transformer un problème temporel en problème tabulaire classique.</w:t>
+      </w:r>
+    </w:p>
+    <w:p>
+      <w:pPr>
+        <w:numPr>
+          <w:ilvl w:val="0"/>
+          <w:numId w:val="31"/>
+        </w:numPr>
+        <w:spacing w:after="0" w:line="240" w:lineRule="auto"/>
+        <w:rPr>
+          <w:rFonts w:eastAsia="Times New Roman" w:cstheme="minorHAnsi"/>
+          <w:kern w:val="0"/>
+          <w:sz w:val="20"/>
+          <w:szCs w:val="20"/>
+          <w:lang w:eastAsia="fr-FR"/>
+          <w14:ligatures w14:val="none"/>
+        </w:rPr>
+      </w:pPr>
+      <w:proofErr w:type="spellStart"/>
+      <w:r>
+        <w:rPr>
+          <w:rFonts w:eastAsia="Times New Roman" w:cstheme="minorHAnsi"/>
+          <w:b/>
+          <w:bCs/>
+          <w:kern w:val="0"/>
+          <w:sz w:val="20"/>
+          <w:szCs w:val="20"/>
+          <w:lang w:eastAsia="fr-FR"/>
+          <w14:ligatures w14:val="none"/>
+        </w:rPr>
+        <w:t>Feature</w:t>
+      </w:r>
+      <w:proofErr w:type="spellEnd"/>
+      <w:r>
+        <w:rPr>
+          <w:rFonts w:eastAsia="Times New Roman" w:cstheme="minorHAnsi"/>
+          <w:b/>
+          <w:bCs/>
+          <w:kern w:val="0"/>
+          <w:sz w:val="20"/>
+          <w:szCs w:val="20"/>
+          <w:lang w:eastAsia="fr-FR"/>
+          <w14:ligatures w14:val="none"/>
+        </w:rPr>
+        <w:t xml:space="preserve"> Engineering temporel</w:t>
+      </w:r>
+      <w:r>
+        <w:rPr>
+          <w:rFonts w:eastAsia="Times New Roman" w:cstheme="minorHAnsi"/>
+          <w:kern w:val="0"/>
+          <w:sz w:val="20"/>
+          <w:szCs w:val="20"/>
+          <w:lang w:eastAsia="fr-FR"/>
+          <w14:ligatures w14:val="none"/>
+        </w:rPr>
+        <w:t xml:space="preserve"> :</w:t>
+      </w:r>
+    </w:p>
+    <w:p>
+      <w:pPr>
+        <w:numPr>
+          <w:ilvl w:val="1"/>
+          <w:numId w:val="31"/>
+        </w:numPr>
+        <w:spacing w:after="0" w:line="240" w:lineRule="auto"/>
+        <w:rPr>
+          <w:rFonts w:eastAsia="Times New Roman" w:cstheme="minorHAnsi"/>
+          <w:kern w:val="0"/>
+          <w:sz w:val="20"/>
+          <w:szCs w:val="20"/>
+          <w:lang w:eastAsia="fr-FR"/>
+          <w14:ligatures w14:val="none"/>
+        </w:rPr>
+      </w:pPr>
+      <w:r>
+        <w:rPr>
+          <w:rFonts w:eastAsia="Times New Roman" w:cstheme="minorHAnsi"/>
+          <w:kern w:val="0"/>
+          <w:sz w:val="20"/>
+          <w:szCs w:val="20"/>
+          <w:lang w:eastAsia="fr-FR"/>
+          <w14:ligatures w14:val="none"/>
+        </w:rPr>
+        <w:t>Variables calendaires (jour de la semaine, mois, jours fériés).</w:t>
+      </w:r>
+    </w:p>
+    <w:p>
+      <w:pPr>
+        <w:numPr>
+          <w:ilvl w:val="1"/>
+          <w:numId w:val="31"/>
+        </w:numPr>
+        <w:spacing w:after="0" w:line="240" w:lineRule="auto"/>
+        <w:rPr>
+          <w:rFonts w:eastAsia="Times New Roman" w:cstheme="minorHAnsi"/>
+          <w:kern w:val="0"/>
+          <w:sz w:val="20"/>
+          <w:szCs w:val="20"/>
+          <w:lang w:eastAsia="fr-FR"/>
+          <w14:ligatures w14:val="none"/>
+        </w:rPr>
+      </w:pPr>
+      <w:r>
+        <w:rPr>
+          <w:rFonts w:eastAsia="Times New Roman" w:cstheme="minorHAnsi"/>
+          <w:kern w:val="0"/>
+          <w:sz w:val="20"/>
+          <w:szCs w:val="20"/>
+          <w:lang w:eastAsia="fr-FR"/>
+          <w14:ligatures w14:val="none"/>
+        </w:rPr>
+        <w:t xml:space="preserve">Valeurs retardées (Lag </w:t>
+      </w:r>
+      <w:proofErr w:type="spellStart"/>
+      <w:r>
+        <w:rPr>
+          <w:rFonts w:eastAsia="Times New Roman" w:cstheme="minorHAnsi"/>
+          <w:kern w:val="0"/>
+          <w:sz w:val="20"/>
+          <w:szCs w:val="20"/>
+          <w:lang w:eastAsia="fr-FR"/>
+          <w14:ligatures w14:val="none"/>
+        </w:rPr>
         <w:t>features</w:t>
       </w:r>
       <w:proofErr w:type="spellEnd"/>
       <w:r>
-        <w:t xml:space="preserve"> externes.</w:t>
-      </w:r>
-    </w:p>
-    <w:p>
-      <w:pPr>
-        <w:ind w:left="360"/>
-      </w:pPr>
-      <w:r>
-        <w:t xml:space="preserve">Plus-value : Données spatio-temporelles → riche en </w:t>
+        <w:rPr>
+          <w:rFonts w:eastAsia="Times New Roman" w:cstheme="minorHAnsi"/>
+          <w:kern w:val="0"/>
+          <w:sz w:val="20"/>
+          <w:szCs w:val="20"/>
+          <w:lang w:eastAsia="fr-FR"/>
+          <w14:ligatures w14:val="none"/>
+        </w:rPr>
+        <w:t>) et moyennes mobiles.</w:t>
+      </w:r>
+    </w:p>
+    <w:p>
+      <w:pPr>
+        <w:numPr>
+          <w:ilvl w:val="0"/>
+          <w:numId w:val="31"/>
+        </w:numPr>
+        <w:spacing w:after="0" w:line="240" w:lineRule="auto"/>
+        <w:rPr>
+          <w:rFonts w:eastAsia="Times New Roman" w:cstheme="minorHAnsi"/>
+          <w:kern w:val="0"/>
+          <w:sz w:val="20"/>
+          <w:szCs w:val="20"/>
+          <w:lang w:eastAsia="fr-FR"/>
+          <w14:ligatures w14:val="none"/>
+        </w:rPr>
+      </w:pPr>
+      <w:r>
+        <w:rPr>
+          <w:rFonts w:eastAsia="Times New Roman" w:cstheme="minorHAnsi"/>
+          <w:b/>
+          <w:bCs/>
+          <w:kern w:val="0"/>
+          <w:sz w:val="20"/>
+          <w:szCs w:val="20"/>
+          <w:lang w:eastAsia="fr-FR"/>
+          <w14:ligatures w14:val="none"/>
+        </w:rPr>
+        <w:t>Validation croisée spécifique</w:t>
+      </w:r>
+      <w:r>
+        <w:rPr>
+          <w:rFonts w:eastAsia="Times New Roman" w:cstheme="minorHAnsi"/>
+          <w:kern w:val="0"/>
+          <w:sz w:val="20"/>
+          <w:szCs w:val="20"/>
+          <w:lang w:eastAsia="fr-FR"/>
+          <w14:ligatures w14:val="none"/>
+        </w:rPr>
+        <w:t xml:space="preserve"> : Le </w:t>
+      </w:r>
+      <w:r>
+        <w:rPr>
+          <w:rFonts w:eastAsia="Times New Roman" w:cstheme="minorHAnsi"/>
+          <w:i/>
+          <w:iCs/>
+          <w:kern w:val="0"/>
+          <w:sz w:val="20"/>
+          <w:szCs w:val="20"/>
+          <w:lang w:eastAsia="fr-FR"/>
+          <w14:ligatures w14:val="none"/>
+        </w:rPr>
+        <w:t xml:space="preserve">Time </w:t>
       </w:r>
       <w:proofErr w:type="spellStart"/>
       <w:r>
-        <w:t>feature</w:t>
+        <w:rPr>
+          <w:rFonts w:eastAsia="Times New Roman" w:cstheme="minorHAnsi"/>
+          <w:i/>
+          <w:iCs/>
+          <w:kern w:val="0"/>
+          <w:sz w:val="20"/>
+          <w:szCs w:val="20"/>
+          <w:lang w:eastAsia="fr-FR"/>
+          <w14:ligatures w14:val="none"/>
+        </w:rPr>
+        <w:t>Series</w:t>
       </w:r>
       <w:proofErr w:type="spellEnd"/>
       <w:r>
-        <w:t xml:space="preserve"> engineering.</w:t>
-      </w:r>
-    </w:p>
-    <w:p>
-      <w:pPr>
-        <w:spacing w:before="100" w:beforeAutospacing="1" w:after="100" w:afterAutospacing="1" w:line="240" w:lineRule="auto"/>
-        <w:ind w:left="720"/>
-        <w:rPr>
-          <w:rFonts w:ascii="Times New Roman" w:eastAsia="Times New Roman" w:hAnsi="Times New Roman" w:cs="Times New Roman"/>
-          <w:kern w:val="0"/>
-          <w:sz w:val="24"/>
-          <w:szCs w:val="24"/>
-          <w:lang w:eastAsia="fr-FR"/>
-          <w14:ligatures w14:val="none"/>
-        </w:rPr>
-      </w:pPr>
+        <w:rPr>
+          <w:rFonts w:eastAsia="Times New Roman" w:cstheme="minorHAnsi"/>
+          <w:i/>
+          <w:iCs/>
+          <w:kern w:val="0"/>
+          <w:sz w:val="20"/>
+          <w:szCs w:val="20"/>
+          <w:lang w:eastAsia="fr-FR"/>
+          <w14:ligatures w14:val="none"/>
+        </w:rPr>
+        <w:t xml:space="preserve"> Split</w:t>
+      </w:r>
+      <w:r>
+        <w:rPr>
+          <w:rFonts w:eastAsia="Times New Roman" w:cstheme="minorHAnsi"/>
+          <w:kern w:val="0"/>
+          <w:sz w:val="20"/>
+          <w:szCs w:val="20"/>
+          <w:lang w:eastAsia="fr-FR"/>
+          <w14:ligatures w14:val="none"/>
+        </w:rPr>
+        <w:t xml:space="preserve"> (éviter le data </w:t>
+      </w:r>
+      <w:proofErr w:type="spellStart"/>
+      <w:r>
+        <w:rPr>
+          <w:rFonts w:eastAsia="Times New Roman" w:cstheme="minorHAnsi"/>
+          <w:kern w:val="0"/>
+          <w:sz w:val="20"/>
+          <w:szCs w:val="20"/>
+          <w:lang w:eastAsia="fr-FR"/>
+          <w14:ligatures w14:val="none"/>
+        </w:rPr>
+        <w:t>leakage</w:t>
+      </w:r>
+      <w:proofErr w:type="spellEnd"/>
+      <w:r>
+        <w:rPr>
+          <w:rFonts w:eastAsia="Times New Roman" w:cstheme="minorHAnsi"/>
+          <w:kern w:val="0"/>
+          <w:sz w:val="20"/>
+          <w:szCs w:val="20"/>
+          <w:lang w:eastAsia="fr-FR"/>
+          <w14:ligatures w14:val="none"/>
+        </w:rPr>
+        <w:t xml:space="preserve"> futur).</w:t>
+      </w:r>
+    </w:p>
+    <w:p>
+      <w:pPr>
+        <w:numPr>
+          <w:ilvl w:val="0"/>
+          <w:numId w:val="31"/>
+        </w:numPr>
+        <w:spacing w:after="0" w:line="240" w:lineRule="auto"/>
+        <w:rPr>
+          <w:rFonts w:eastAsia="Times New Roman" w:cstheme="minorHAnsi"/>
+          <w:kern w:val="0"/>
+          <w:sz w:val="20"/>
+          <w:szCs w:val="20"/>
+          <w:lang w:eastAsia="fr-FR"/>
+          <w14:ligatures w14:val="none"/>
+        </w:rPr>
+      </w:pPr>
+      <w:r>
+        <w:rPr>
+          <w:rFonts w:eastAsia="Times New Roman" w:cstheme="minorHAnsi"/>
+          <w:b/>
+          <w:bCs/>
+          <w:kern w:val="0"/>
+          <w:sz w:val="20"/>
+          <w:szCs w:val="20"/>
+          <w:lang w:eastAsia="fr-FR"/>
+          <w14:ligatures w14:val="none"/>
+        </w:rPr>
+        <w:t>Modèles supervisés</w:t>
+      </w:r>
+      <w:r>
+        <w:rPr>
+          <w:rFonts w:eastAsia="Times New Roman" w:cstheme="minorHAnsi"/>
+          <w:kern w:val="0"/>
+          <w:sz w:val="20"/>
+          <w:szCs w:val="20"/>
+          <w:lang w:eastAsia="fr-FR"/>
+          <w14:ligatures w14:val="none"/>
+        </w:rPr>
+        <w:t xml:space="preserve"> : </w:t>
+      </w:r>
+      <w:proofErr w:type="spellStart"/>
+      <w:r>
+        <w:rPr>
+          <w:rFonts w:eastAsia="Times New Roman" w:cstheme="minorHAnsi"/>
+          <w:kern w:val="0"/>
+          <w:sz w:val="20"/>
+          <w:szCs w:val="20"/>
+          <w:lang w:eastAsia="fr-FR"/>
+          <w14:ligatures w14:val="none"/>
+        </w:rPr>
+        <w:t>XGBoost</w:t>
+      </w:r>
+      <w:proofErr w:type="spellEnd"/>
+      <w:r>
+        <w:rPr>
+          <w:rFonts w:eastAsia="Times New Roman" w:cstheme="minorHAnsi"/>
+          <w:kern w:val="0"/>
+          <w:sz w:val="20"/>
+          <w:szCs w:val="20"/>
+          <w:lang w:eastAsia="fr-FR"/>
+          <w14:ligatures w14:val="none"/>
+        </w:rPr>
+        <w:t xml:space="preserve">, </w:t>
+      </w:r>
+      <w:proofErr w:type="spellStart"/>
+      <w:r>
+        <w:rPr>
+          <w:rFonts w:eastAsia="Times New Roman" w:cstheme="minorHAnsi"/>
+          <w:kern w:val="0"/>
+          <w:sz w:val="20"/>
+          <w:szCs w:val="20"/>
+          <w:lang w:eastAsia="fr-FR"/>
+          <w14:ligatures w14:val="none"/>
+        </w:rPr>
+        <w:t>LightGBM</w:t>
+      </w:r>
+      <w:proofErr w:type="spellEnd"/>
+      <w:r>
+        <w:rPr>
+          <w:rFonts w:eastAsia="Times New Roman" w:cstheme="minorHAnsi"/>
+          <w:kern w:val="0"/>
+          <w:sz w:val="20"/>
+          <w:szCs w:val="20"/>
+          <w:lang w:eastAsia="fr-FR"/>
+          <w14:ligatures w14:val="none"/>
+        </w:rPr>
+        <w:t>, Random Forest appliqués aux séries temporelles.</w:t>
+      </w:r>
+    </w:p>
+    <w:p>
+      <w:pPr>
+        <w:numPr>
+          <w:ilvl w:val="0"/>
+          <w:numId w:val="31"/>
+        </w:numPr>
+        <w:spacing w:after="0" w:line="240" w:lineRule="auto"/>
+        <w:rPr>
+          <w:rFonts w:eastAsia="Times New Roman" w:cstheme="minorHAnsi"/>
+          <w:kern w:val="0"/>
+          <w:sz w:val="20"/>
+          <w:szCs w:val="20"/>
+          <w:lang w:eastAsia="fr-FR"/>
+          <w14:ligatures w14:val="none"/>
+        </w:rPr>
+      </w:pPr>
+      <w:r>
+        <w:rPr>
+          <w:rFonts w:eastAsia="Times New Roman" w:cstheme="minorHAnsi"/>
+          <w:b/>
+          <w:bCs/>
+          <w:kern w:val="0"/>
+          <w:sz w:val="20"/>
+          <w:szCs w:val="20"/>
+          <w:lang w:eastAsia="fr-FR"/>
+          <w14:ligatures w14:val="none"/>
+        </w:rPr>
+        <w:t>Prophet</w:t>
+      </w:r>
+      <w:r>
+        <w:rPr>
+          <w:rFonts w:eastAsia="Times New Roman" w:cstheme="minorHAnsi"/>
+          <w:kern w:val="0"/>
+          <w:sz w:val="20"/>
+          <w:szCs w:val="20"/>
+          <w:lang w:eastAsia="fr-FR"/>
+          <w14:ligatures w14:val="none"/>
+        </w:rPr>
+        <w:t xml:space="preserve"> (par Meta) : Modèle additif décomposable basé sur la régression non-linéaire.</w:t>
+      </w:r>
+    </w:p>
+    <w:p>
+      <w:pPr>
+        <w:numPr>
+          <w:ilvl w:val="0"/>
+          <w:numId w:val="31"/>
+        </w:numPr>
+        <w:spacing w:after="0" w:line="240" w:lineRule="auto"/>
+        <w:rPr>
+          <w:rFonts w:eastAsia="Times New Roman" w:cstheme="minorHAnsi"/>
+          <w:kern w:val="0"/>
+          <w:sz w:val="20"/>
+          <w:szCs w:val="20"/>
+          <w:lang w:eastAsia="fr-FR"/>
+          <w14:ligatures w14:val="none"/>
+        </w:rPr>
+      </w:pPr>
+      <w:r>
+        <w:rPr>
+          <w:rFonts w:eastAsia="Times New Roman" w:cstheme="minorHAnsi"/>
+          <w:b/>
+          <w:bCs/>
+          <w:kern w:val="0"/>
+          <w:sz w:val="20"/>
+          <w:szCs w:val="20"/>
+          <w:lang w:eastAsia="fr-FR"/>
+          <w14:ligatures w14:val="none"/>
+        </w:rPr>
+        <w:t>Pratique (Python)</w:t>
+      </w:r>
+      <w:r>
+        <w:rPr>
+          <w:rFonts w:eastAsia="Times New Roman" w:cstheme="minorHAnsi"/>
+          <w:kern w:val="0"/>
+          <w:sz w:val="20"/>
+          <w:szCs w:val="20"/>
+          <w:lang w:eastAsia="fr-FR"/>
+          <w14:ligatures w14:val="none"/>
+        </w:rPr>
+        <w:t xml:space="preserve"> : Construction d'un pipeline complet de Machine Learning avec </w:t>
+      </w:r>
+      <w:proofErr w:type="spellStart"/>
+      <w:r>
+        <w:rPr>
+          <w:rFonts w:eastAsia="Times New Roman" w:cstheme="minorHAnsi"/>
+          <w:kern w:val="0"/>
+          <w:sz w:val="20"/>
+          <w:szCs w:val="20"/>
+          <w:lang w:eastAsia="fr-FR"/>
+          <w14:ligatures w14:val="none"/>
+        </w:rPr>
+        <w:t>scikit</w:t>
+      </w:r>
+      <w:proofErr w:type="spellEnd"/>
+      <w:r>
+        <w:rPr>
+          <w:rFonts w:eastAsia="Times New Roman" w:cstheme="minorHAnsi"/>
+          <w:kern w:val="0"/>
+          <w:sz w:val="20"/>
+          <w:szCs w:val="20"/>
+          <w:lang w:eastAsia="fr-FR"/>
+          <w14:ligatures w14:val="none"/>
+        </w:rPr>
+        <w:t xml:space="preserve">-learn et </w:t>
+      </w:r>
+      <w:proofErr w:type="spellStart"/>
+      <w:r>
+        <w:rPr>
+          <w:rFonts w:eastAsia="Times New Roman" w:cstheme="minorHAnsi"/>
+          <w:kern w:val="0"/>
+          <w:sz w:val="20"/>
+          <w:szCs w:val="20"/>
+          <w:lang w:eastAsia="fr-FR"/>
+          <w14:ligatures w14:val="none"/>
+        </w:rPr>
+        <w:t>LightGBM</w:t>
+      </w:r>
+      <w:proofErr w:type="spellEnd"/>
+      <w:r>
+        <w:rPr>
+          <w:rFonts w:eastAsia="Times New Roman" w:cstheme="minorHAnsi"/>
+          <w:kern w:val="0"/>
+          <w:sz w:val="20"/>
+          <w:szCs w:val="20"/>
+          <w:lang w:eastAsia="fr-FR"/>
+          <w14:ligatures w14:val="none"/>
+        </w:rPr>
+        <w:t>.</w:t>
+      </w:r>
+    </w:p>
+    <w:p>
+      <w:pPr>
+        <w:spacing w:after="0" w:line="240" w:lineRule="auto"/>
+        <w:outlineLvl w:val="2"/>
+        <w:rPr>
+          <w:rFonts w:eastAsia="Times New Roman" w:cstheme="minorHAnsi"/>
+          <w:b/>
+          <w:bCs/>
+          <w:kern w:val="0"/>
+          <w:sz w:val="20"/>
+          <w:szCs w:val="20"/>
+          <w:lang w:eastAsia="fr-FR"/>
+          <w14:ligatures w14:val="none"/>
+        </w:rPr>
+      </w:pPr>
+      <w:r>
+        <w:rPr>
+          <w:rFonts w:eastAsia="Times New Roman" w:cstheme="minorHAnsi"/>
+          <w:b/>
+          <w:bCs/>
+          <w:kern w:val="0"/>
+          <w:sz w:val="20"/>
+          <w:szCs w:val="20"/>
+          <w:lang w:eastAsia="fr-FR"/>
+          <w14:ligatures w14:val="none"/>
+        </w:rPr>
+        <w:t>Module 6 : Deep Learning et Modèles Avancés</w:t>
+      </w:r>
+    </w:p>
+    <w:p>
+      <w:pPr>
+        <w:spacing w:after="0" w:line="240" w:lineRule="auto"/>
+        <w:rPr>
+          <w:rFonts w:eastAsia="Times New Roman" w:cstheme="minorHAnsi"/>
+          <w:kern w:val="0"/>
+          <w:sz w:val="20"/>
+          <w:szCs w:val="20"/>
+          <w:lang w:eastAsia="fr-FR"/>
+          <w14:ligatures w14:val="none"/>
+        </w:rPr>
+      </w:pPr>
+      <w:r>
+        <w:rPr>
+          <w:rFonts w:eastAsia="Times New Roman" w:cstheme="minorHAnsi"/>
+          <w:i/>
+          <w:iCs/>
+          <w:kern w:val="0"/>
+          <w:sz w:val="20"/>
+          <w:szCs w:val="20"/>
+          <w:lang w:eastAsia="fr-FR"/>
+          <w14:ligatures w14:val="none"/>
+        </w:rPr>
+        <w:t>Objectif : Capturer des dynamiques complexes à long terme.</w:t>
+      </w:r>
+    </w:p>
+    <w:p>
+      <w:pPr>
+        <w:numPr>
+          <w:ilvl w:val="0"/>
+          <w:numId w:val="32"/>
+        </w:numPr>
+        <w:spacing w:after="0" w:line="240" w:lineRule="auto"/>
+        <w:rPr>
+          <w:rFonts w:eastAsia="Times New Roman" w:cstheme="minorHAnsi"/>
+          <w:kern w:val="0"/>
+          <w:sz w:val="20"/>
+          <w:szCs w:val="20"/>
+          <w:lang w:eastAsia="fr-FR"/>
+          <w14:ligatures w14:val="none"/>
+        </w:rPr>
+      </w:pPr>
+      <w:r>
+        <w:rPr>
+          <w:rFonts w:eastAsia="Times New Roman" w:cstheme="minorHAnsi"/>
+          <w:b/>
+          <w:bCs/>
+          <w:kern w:val="0"/>
+          <w:sz w:val="20"/>
+          <w:szCs w:val="20"/>
+          <w:lang w:eastAsia="fr-FR"/>
+          <w14:ligatures w14:val="none"/>
+        </w:rPr>
+        <w:t>Réseaux récurrents (RNN)</w:t>
+      </w:r>
+      <w:r>
+        <w:rPr>
+          <w:rFonts w:eastAsia="Times New Roman" w:cstheme="minorHAnsi"/>
+          <w:kern w:val="0"/>
+          <w:sz w:val="20"/>
+          <w:szCs w:val="20"/>
+          <w:lang w:eastAsia="fr-FR"/>
+          <w14:ligatures w14:val="none"/>
+        </w:rPr>
+        <w:t xml:space="preserve"> : Introduction aux cellules LSTM (Long Short-</w:t>
+      </w:r>
+      <w:proofErr w:type="spellStart"/>
+      <w:r>
+        <w:rPr>
+          <w:rFonts w:eastAsia="Times New Roman" w:cstheme="minorHAnsi"/>
+          <w:kern w:val="0"/>
+          <w:sz w:val="20"/>
+          <w:szCs w:val="20"/>
+          <w:lang w:eastAsia="fr-FR"/>
+          <w14:ligatures w14:val="none"/>
+        </w:rPr>
+        <w:t>Term</w:t>
+      </w:r>
+      <w:proofErr w:type="spellEnd"/>
+      <w:r>
+        <w:rPr>
+          <w:rFonts w:eastAsia="Times New Roman" w:cstheme="minorHAnsi"/>
+          <w:kern w:val="0"/>
+          <w:sz w:val="20"/>
+          <w:szCs w:val="20"/>
+          <w:lang w:eastAsia="fr-FR"/>
+          <w14:ligatures w14:val="none"/>
+        </w:rPr>
+        <w:t xml:space="preserve"> Memory) et GRU.</w:t>
+      </w:r>
+    </w:p>
+    <w:p>
+      <w:pPr>
+        <w:numPr>
+          <w:ilvl w:val="0"/>
+          <w:numId w:val="32"/>
+        </w:numPr>
+        <w:spacing w:after="0" w:line="240" w:lineRule="auto"/>
+        <w:rPr>
+          <w:rFonts w:eastAsia="Times New Roman" w:cstheme="minorHAnsi"/>
+          <w:kern w:val="0"/>
+          <w:sz w:val="20"/>
+          <w:szCs w:val="20"/>
+          <w:lang w:eastAsia="fr-FR"/>
+          <w14:ligatures w14:val="none"/>
+        </w:rPr>
+      </w:pPr>
+      <w:r>
+        <w:rPr>
+          <w:rFonts w:eastAsia="Times New Roman" w:cstheme="minorHAnsi"/>
+          <w:b/>
+          <w:bCs/>
+          <w:kern w:val="0"/>
+          <w:sz w:val="20"/>
+          <w:szCs w:val="20"/>
+          <w:lang w:eastAsia="fr-FR"/>
+          <w14:ligatures w14:val="none"/>
+        </w:rPr>
+        <w:t>Approches Transformers</w:t>
+      </w:r>
+      <w:r>
+        <w:rPr>
+          <w:rFonts w:eastAsia="Times New Roman" w:cstheme="minorHAnsi"/>
+          <w:kern w:val="0"/>
+          <w:sz w:val="20"/>
+          <w:szCs w:val="20"/>
+          <w:lang w:eastAsia="fr-FR"/>
+          <w14:ligatures w14:val="none"/>
+        </w:rPr>
+        <w:t xml:space="preserve"> : Introduction aux architectures modernes adaptées au time </w:t>
+      </w:r>
+      <w:proofErr w:type="spellStart"/>
+      <w:r>
+        <w:rPr>
+          <w:rFonts w:eastAsia="Times New Roman" w:cstheme="minorHAnsi"/>
+          <w:kern w:val="0"/>
+          <w:sz w:val="20"/>
+          <w:szCs w:val="20"/>
+          <w:lang w:eastAsia="fr-FR"/>
+          <w14:ligatures w14:val="none"/>
+        </w:rPr>
+        <w:t>series</w:t>
+      </w:r>
+      <w:proofErr w:type="spellEnd"/>
+      <w:r>
+        <w:rPr>
+          <w:rFonts w:eastAsia="Times New Roman" w:cstheme="minorHAnsi"/>
+          <w:kern w:val="0"/>
+          <w:sz w:val="20"/>
+          <w:szCs w:val="20"/>
+          <w:lang w:eastAsia="fr-FR"/>
+          <w14:ligatures w14:val="none"/>
+        </w:rPr>
+        <w:t xml:space="preserve"> </w:t>
+      </w:r>
+      <w:proofErr w:type="spellStart"/>
+      <w:r>
+        <w:rPr>
+          <w:rFonts w:eastAsia="Times New Roman" w:cstheme="minorHAnsi"/>
+          <w:kern w:val="0"/>
+          <w:sz w:val="20"/>
+          <w:szCs w:val="20"/>
+          <w:lang w:eastAsia="fr-FR"/>
+          <w14:ligatures w14:val="none"/>
+        </w:rPr>
+        <w:t>forecasting</w:t>
+      </w:r>
+      <w:proofErr w:type="spellEnd"/>
+      <w:r>
+        <w:rPr>
+          <w:rFonts w:eastAsia="Times New Roman" w:cstheme="minorHAnsi"/>
+          <w:kern w:val="0"/>
+          <w:sz w:val="20"/>
+          <w:szCs w:val="20"/>
+          <w:lang w:eastAsia="fr-FR"/>
+          <w14:ligatures w14:val="none"/>
+        </w:rPr>
+        <w:t xml:space="preserve"> (</w:t>
+      </w:r>
+      <w:proofErr w:type="gramStart"/>
+      <w:r>
+        <w:rPr>
+          <w:rFonts w:eastAsia="Times New Roman" w:cstheme="minorHAnsi"/>
+          <w:kern w:val="0"/>
+          <w:sz w:val="20"/>
+          <w:szCs w:val="20"/>
+          <w:lang w:eastAsia="fr-FR"/>
+          <w14:ligatures w14:val="none"/>
+        </w:rPr>
+        <w:t>ex:</w:t>
+      </w:r>
+      <w:proofErr w:type="gramEnd"/>
+      <w:r>
+        <w:rPr>
+          <w:rFonts w:eastAsia="Times New Roman" w:cstheme="minorHAnsi"/>
+          <w:kern w:val="0"/>
+          <w:sz w:val="20"/>
+          <w:szCs w:val="20"/>
+          <w:lang w:eastAsia="fr-FR"/>
+          <w14:ligatures w14:val="none"/>
+        </w:rPr>
+        <w:t xml:space="preserve"> </w:t>
+      </w:r>
+      <w:proofErr w:type="spellStart"/>
+      <w:r>
+        <w:rPr>
+          <w:rFonts w:eastAsia="Times New Roman" w:cstheme="minorHAnsi"/>
+          <w:kern w:val="0"/>
+          <w:sz w:val="20"/>
+          <w:szCs w:val="20"/>
+          <w:lang w:eastAsia="fr-FR"/>
+          <w14:ligatures w14:val="none"/>
+        </w:rPr>
+        <w:t>PatchTST</w:t>
+      </w:r>
+      <w:proofErr w:type="spellEnd"/>
+      <w:r>
+        <w:rPr>
+          <w:rFonts w:eastAsia="Times New Roman" w:cstheme="minorHAnsi"/>
+          <w:kern w:val="0"/>
+          <w:sz w:val="20"/>
+          <w:szCs w:val="20"/>
+          <w:lang w:eastAsia="fr-FR"/>
+          <w14:ligatures w14:val="none"/>
+        </w:rPr>
+        <w:t>).</w:t>
+      </w:r>
+    </w:p>
+    <w:p>
+      <w:pPr>
+        <w:numPr>
+          <w:ilvl w:val="0"/>
+          <w:numId w:val="32"/>
+        </w:numPr>
+        <w:spacing w:after="0" w:line="240" w:lineRule="auto"/>
+        <w:rPr>
+          <w:rFonts w:eastAsia="Times New Roman" w:cstheme="minorHAnsi"/>
+          <w:kern w:val="0"/>
+          <w:sz w:val="20"/>
+          <w:szCs w:val="20"/>
+          <w:lang w:eastAsia="fr-FR"/>
+          <w14:ligatures w14:val="none"/>
+        </w:rPr>
+      </w:pPr>
+      <w:r>
+        <w:rPr>
+          <w:rFonts w:eastAsia="Times New Roman" w:cstheme="minorHAnsi"/>
+          <w:b/>
+          <w:bCs/>
+          <w:kern w:val="0"/>
+          <w:sz w:val="20"/>
+          <w:szCs w:val="20"/>
+          <w:lang w:eastAsia="fr-FR"/>
+          <w14:ligatures w14:val="none"/>
+        </w:rPr>
+        <w:t>Pratique (Python)</w:t>
+      </w:r>
+      <w:r>
+        <w:rPr>
+          <w:rFonts w:eastAsia="Times New Roman" w:cstheme="minorHAnsi"/>
+          <w:kern w:val="0"/>
+          <w:sz w:val="20"/>
+          <w:szCs w:val="20"/>
+          <w:lang w:eastAsia="fr-FR"/>
+          <w14:ligatures w14:val="none"/>
+        </w:rPr>
+        <w:t xml:space="preserve"> : Création d'un modèle LSTM simple avec PyTorch ou </w:t>
+      </w:r>
+      <w:proofErr w:type="spellStart"/>
+      <w:r>
+        <w:rPr>
+          <w:rFonts w:eastAsia="Times New Roman" w:cstheme="minorHAnsi"/>
+          <w:kern w:val="0"/>
+          <w:sz w:val="20"/>
+          <w:szCs w:val="20"/>
+          <w:lang w:eastAsia="fr-FR"/>
+          <w14:ligatures w14:val="none"/>
+        </w:rPr>
+        <w:t>TensorFlow</w:t>
+      </w:r>
+      <w:proofErr w:type="spellEnd"/>
+      <w:r>
+        <w:rPr>
+          <w:rFonts w:eastAsia="Times New Roman" w:cstheme="minorHAnsi"/>
+          <w:kern w:val="0"/>
+          <w:sz w:val="20"/>
+          <w:szCs w:val="20"/>
+          <w:lang w:eastAsia="fr-FR"/>
+          <w14:ligatures w14:val="none"/>
+        </w:rPr>
+        <w:t>.</w:t>
+      </w:r>
+    </w:p>
+    <w:p>
+      <w:pPr>
+        <w:spacing w:after="0" w:line="240" w:lineRule="auto"/>
+        <w:outlineLvl w:val="2"/>
+        <w:rPr>
+          <w:rFonts w:eastAsia="Times New Roman" w:cstheme="minorHAnsi"/>
+          <w:b/>
+          <w:bCs/>
+          <w:kern w:val="0"/>
+          <w:sz w:val="20"/>
+          <w:szCs w:val="20"/>
+          <w:lang w:eastAsia="fr-FR"/>
+          <w14:ligatures w14:val="none"/>
+        </w:rPr>
+      </w:pPr>
+      <w:r>
+        <w:rPr>
+          <w:rFonts w:eastAsia="Times New Roman" w:cstheme="minorHAnsi"/>
+          <w:b/>
+          <w:bCs/>
+          <w:kern w:val="0"/>
+          <w:sz w:val="20"/>
+          <w:szCs w:val="20"/>
+          <w:lang w:eastAsia="fr-FR"/>
+          <w14:ligatures w14:val="none"/>
+        </w:rPr>
+        <w:t>Module 7 : Évaluation et Bonnes Pratiques en Production</w:t>
+      </w:r>
+    </w:p>
+    <w:p>
+      <w:pPr>
+        <w:spacing w:after="0" w:line="240" w:lineRule="auto"/>
+        <w:rPr>
+          <w:rFonts w:eastAsia="Times New Roman" w:cstheme="minorHAnsi"/>
+          <w:kern w:val="0"/>
+          <w:sz w:val="20"/>
+          <w:szCs w:val="20"/>
+          <w:lang w:eastAsia="fr-FR"/>
+          <w14:ligatures w14:val="none"/>
+        </w:rPr>
+      </w:pPr>
+      <w:r>
+        <w:rPr>
+          <w:rFonts w:eastAsia="Times New Roman" w:cstheme="minorHAnsi"/>
+          <w:i/>
+          <w:iCs/>
+          <w:kern w:val="0"/>
+          <w:sz w:val="20"/>
+          <w:szCs w:val="20"/>
+          <w:lang w:eastAsia="fr-FR"/>
+          <w14:ligatures w14:val="none"/>
+        </w:rPr>
+        <w:t>Objectif : Mesurer la performance de nos modèles et les déployer proprement.</w:t>
+      </w:r>
+    </w:p>
+    <w:p>
+      <w:pPr>
+        <w:numPr>
+          <w:ilvl w:val="0"/>
+          <w:numId w:val="33"/>
+        </w:numPr>
+        <w:spacing w:after="0" w:line="240" w:lineRule="auto"/>
+        <w:rPr>
+          <w:rFonts w:eastAsia="Times New Roman" w:cstheme="minorHAnsi"/>
+          <w:kern w:val="0"/>
+          <w:sz w:val="20"/>
+          <w:szCs w:val="20"/>
+          <w:lang w:eastAsia="fr-FR"/>
+          <w14:ligatures w14:val="none"/>
+        </w:rPr>
+      </w:pPr>
+      <w:r>
+        <w:rPr>
+          <w:rFonts w:eastAsia="Times New Roman" w:cstheme="minorHAnsi"/>
+          <w:b/>
+          <w:bCs/>
+          <w:kern w:val="0"/>
+          <w:sz w:val="20"/>
+          <w:szCs w:val="20"/>
+          <w:lang w:eastAsia="fr-FR"/>
+          <w14:ligatures w14:val="none"/>
+        </w:rPr>
+        <w:t>Métriques d'évaluation</w:t>
+      </w:r>
+      <w:r>
+        <w:rPr>
+          <w:rFonts w:eastAsia="Times New Roman" w:cstheme="minorHAnsi"/>
+          <w:kern w:val="0"/>
+          <w:sz w:val="20"/>
+          <w:szCs w:val="20"/>
+          <w:lang w:eastAsia="fr-FR"/>
+          <w14:ligatures w14:val="none"/>
+        </w:rPr>
+        <w:t xml:space="preserve"> : MAE, MSE, RMSE, MAPE, MASE.</w:t>
+      </w:r>
+    </w:p>
+    <w:p>
+      <w:pPr>
+        <w:numPr>
+          <w:ilvl w:val="0"/>
+          <w:numId w:val="33"/>
+        </w:numPr>
+        <w:spacing w:after="0" w:line="240" w:lineRule="auto"/>
+        <w:rPr>
+          <w:rFonts w:eastAsia="Times New Roman" w:cstheme="minorHAnsi"/>
+          <w:kern w:val="0"/>
+          <w:sz w:val="20"/>
+          <w:szCs w:val="20"/>
+          <w:lang w:eastAsia="fr-FR"/>
+          <w14:ligatures w14:val="none"/>
+        </w:rPr>
+      </w:pPr>
+      <w:r>
+        <w:rPr>
+          <w:rFonts w:eastAsia="Times New Roman" w:cstheme="minorHAnsi"/>
+          <w:b/>
+          <w:bCs/>
+          <w:kern w:val="0"/>
+          <w:sz w:val="20"/>
+          <w:szCs w:val="20"/>
+          <w:lang w:eastAsia="fr-FR"/>
+          <w14:ligatures w14:val="none"/>
+        </w:rPr>
+        <w:t>Gestion du concept drift</w:t>
+      </w:r>
+      <w:r>
+        <w:rPr>
+          <w:rFonts w:eastAsia="Times New Roman" w:cstheme="minorHAnsi"/>
+          <w:kern w:val="0"/>
+          <w:sz w:val="20"/>
+          <w:szCs w:val="20"/>
+          <w:lang w:eastAsia="fr-FR"/>
+          <w14:ligatures w14:val="none"/>
+        </w:rPr>
+        <w:t xml:space="preserve"> (dérive temporelle des données).</w:t>
+      </w:r>
+    </w:p>
+    <w:p>
+      <w:pPr>
+        <w:numPr>
+          <w:ilvl w:val="0"/>
+          <w:numId w:val="33"/>
+        </w:numPr>
+        <w:spacing w:after="0" w:line="240" w:lineRule="auto"/>
+        <w:rPr>
+          <w:rFonts w:eastAsia="Times New Roman" w:cstheme="minorHAnsi"/>
+          <w:kern w:val="0"/>
+          <w:sz w:val="20"/>
+          <w:szCs w:val="20"/>
+          <w:lang w:eastAsia="fr-FR"/>
+          <w14:ligatures w14:val="none"/>
+        </w:rPr>
+      </w:pPr>
+      <w:proofErr w:type="spellStart"/>
+      <w:r>
+        <w:rPr>
+          <w:rFonts w:eastAsia="Times New Roman" w:cstheme="minorHAnsi"/>
+          <w:b/>
+          <w:bCs/>
+          <w:kern w:val="0"/>
+          <w:sz w:val="20"/>
+          <w:szCs w:val="20"/>
+          <w:lang w:eastAsia="fr-FR"/>
+          <w14:ligatures w14:val="none"/>
+        </w:rPr>
+        <w:t>Backtesting</w:t>
+      </w:r>
+      <w:proofErr w:type="spellEnd"/>
+      <w:r>
+        <w:rPr>
+          <w:rFonts w:eastAsia="Times New Roman" w:cstheme="minorHAnsi"/>
+          <w:kern w:val="0"/>
+          <w:sz w:val="20"/>
+          <w:szCs w:val="20"/>
+          <w:lang w:eastAsia="fr-FR"/>
+          <w14:ligatures w14:val="none"/>
+        </w:rPr>
+        <w:t xml:space="preserve"> et stratégies de mise à jour des modèles.</w:t>
+      </w:r>
     </w:p>
     <w:p>
       <w:pPr>
@@ -7352,22 +9403,8 @@
           <w:lang w:eastAsia="fr-FR"/>
           <w14:ligatures w14:val="none"/>
         </w:rPr>
-        <w:t xml:space="preserve"> Intro to </w:t>
-      </w:r>
-      <w:proofErr w:type="spellStart"/>
-      <w:r>
-        <w:rPr>
-          <w:rFonts w:ascii="Times New Roman" w:eastAsia="Times New Roman" w:hAnsi="Times New Roman" w:cs="Times New Roman"/>
-          <w:kern w:val="0"/>
-          <w:sz w:val="24"/>
-          <w:szCs w:val="24"/>
-          <w:highlight w:val="yellow"/>
-          <w:lang w:eastAsia="fr-FR"/>
-          <w14:ligatures w14:val="none"/>
-        </w:rPr>
-        <w:t>PyTorch</w:t>
-      </w:r>
-      <w:proofErr w:type="spellEnd"/>
+        <w:t xml:space="preserve"> Intro to PyTorch</w:t>
+      </w:r>
     </w:p>
     <w:p>
       <w:pPr>
@@ -8377,6 +10414,155 @@
     </w:lvl>
   </w:abstractNum>
   <w:abstractNum w:abstractNumId="5" w15:restartNumberingAfterBreak="0">
+    <w:nsid w:val="0B8E65DC"/>
+    <w:multiLevelType w:val="multilevel"/>
+    <w:tmpl w:val="C4AA6924"/>
+    <w:lvl w:ilvl="0">
+      <w:start w:val="1"/>
+      <w:numFmt w:val="bullet"/>
+      <w:lvlText w:val=""/>
+      <w:lvlJc w:val="left"/>
+      <w:pPr>
+        <w:tabs>
+          <w:tab w:val="num" w:pos="720"/>
+        </w:tabs>
+        <w:ind w:left="720" w:hanging="360"/>
+      </w:pPr>
+      <w:rPr>
+        <w:rFonts w:ascii="Symbol" w:hAnsi="Symbol" w:hint="default"/>
+        <w:sz w:val="20"/>
+      </w:rPr>
+    </w:lvl>
+    <w:lvl w:ilvl="1" w:tentative="1">
+      <w:start w:val="1"/>
+      <w:numFmt w:val="bullet"/>
+      <w:lvlText w:val="o"/>
+      <w:lvlJc w:val="left"/>
+      <w:pPr>
+        <w:tabs>
+          <w:tab w:val="num" w:pos="1440"/>
+        </w:tabs>
+        <w:ind w:left="1440" w:hanging="360"/>
+      </w:pPr>
+      <w:rPr>
+        <w:rFonts w:ascii="Courier New" w:hAnsi="Courier New" w:hint="default"/>
+        <w:sz w:val="20"/>
+      </w:rPr>
+    </w:lvl>
+    <w:lvl w:ilvl="2" w:tentative="1">
+      <w:start w:val="1"/>
+      <w:numFmt w:val="bullet"/>
+      <w:lvlText w:val=""/>
+      <w:lvlJc w:val="left"/>
+      <w:pPr>
+        <w:tabs>
+          <w:tab w:val="num" w:pos="2160"/>
+        </w:tabs>
+        <w:ind w:left="2160" w:hanging="360"/>
+      </w:pPr>
+      <w:rPr>
+        <w:rFonts w:ascii="Wingdings" w:hAnsi="Wingdings" w:hint="default"/>
+        <w:sz w:val="20"/>
+      </w:rPr>
+    </w:lvl>
+    <w:lvl w:ilvl="3" w:tentative="1">
+      <w:start w:val="1"/>
+      <w:numFmt w:val="bullet"/>
+      <w:lvlText w:val=""/>
+      <w:lvlJc w:val="left"/>
+      <w:pPr>
+        <w:tabs>
+          <w:tab w:val="num" w:pos="2880"/>
+        </w:tabs>
+        <w:ind w:left="2880" w:hanging="360"/>
+      </w:pPr>
+      <w:rPr>
+        <w:rFonts w:ascii="Wingdings" w:hAnsi="Wingdings" w:hint="default"/>
+        <w:sz w:val="20"/>
+      </w:rPr>
+    </w:lvl>
+    <w:lvl w:ilvl="4" w:tentative="1">
+      <w:start w:val="1"/>
+      <w:numFmt w:val="bullet"/>
+      <w:lvlText w:val=""/>
+      <w:lvlJc w:val="left"/>
+      <w:pPr>
+        <w:tabs>
+          <w:tab w:val="num" w:pos="3600"/>
+        </w:tabs>
+        <w:ind w:left="3600" w:hanging="360"/>
+      </w:pPr>
+      <w:rPr>
+        <w:rFonts w:ascii="Wingdings" w:hAnsi="Wingdings" w:hint="default"/>
+        <w:sz w:val="20"/>
+      </w:rPr>
+    </w:lvl>
+    <w:lvl w:ilvl="5" w:tentative="1">
+      <w:start w:val="1"/>
+      <w:numFmt w:val="bullet"/>
+      <w:lvlText w:val=""/>
+      <w:lvlJc w:val="left"/>
+      <w:pPr>
+        <w:tabs>
+          <w:tab w:val="num" w:pos="4320"/>
+        </w:tabs>
+        <w:ind w:left="4320" w:hanging="360"/>
+      </w:pPr>
+      <w:rPr>
+        <w:rFonts w:ascii="Wingdings" w:hAnsi="Wingdings" w:hint="default"/>
+        <w:sz w:val="20"/>
+      </w:rPr>
+    </w:lvl>
+    <w:lvl w:ilvl="6" w:tentative="1">
+      <w:start w:val="1"/>
+      <w:numFmt w:val="bullet"/>
+      <w:lvlText w:val=""/>
+      <w:lvlJc w:val="left"/>
+      <w:pPr>
+        <w:tabs>
+          <w:tab w:val="num" w:pos="5040"/>
+        </w:tabs>
+        <w:ind w:left="5040" w:hanging="360"/>
+      </w:pPr>
+      <w:rPr>
+        <w:rFonts w:ascii="Wingdings" w:hAnsi="Wingdings" w:hint="default"/>
+        <w:sz w:val="20"/>
+      </w:rPr>
+    </w:lvl>
+    <w:lvl w:ilvl="7" w:tentative="1">
+      <w:start w:val="1"/>
+      <w:numFmt w:val="bullet"/>
+      <w:lvlText w:val=""/>
+      <w:lvlJc w:val="left"/>
+      <w:pPr>
+        <w:tabs>
+          <w:tab w:val="num" w:pos="5760"/>
+        </w:tabs>
+        <w:ind w:left="5760" w:hanging="360"/>
+      </w:pPr>
+      <w:rPr>
+        <w:rFonts w:ascii="Wingdings" w:hAnsi="Wingdings" w:hint="default"/>
+        <w:sz w:val="20"/>
+      </w:rPr>
+    </w:lvl>
+    <w:lvl w:ilvl="8" w:tentative="1">
+      <w:start w:val="1"/>
+      <w:numFmt w:val="bullet"/>
+      <w:lvlText w:val=""/>
+      <w:lvlJc w:val="left"/>
+      <w:pPr>
+        <w:tabs>
+          <w:tab w:val="num" w:pos="6480"/>
+        </w:tabs>
+        <w:ind w:left="6480" w:hanging="360"/>
+      </w:pPr>
+      <w:rPr>
+        <w:rFonts w:ascii="Wingdings" w:hAnsi="Wingdings" w:hint="default"/>
+        <w:sz w:val="20"/>
+      </w:rPr>
+    </w:lvl>
+  </w:abstractNum>
+  <w:abstractNum w:abstractNumId="6" w15:restartNumberingAfterBreak="0">
     <w:nsid w:val="1F3439CF"/>
     <w:multiLevelType w:val="multilevel"/>
     <w:tmpl w:val="03E251E4"/>
@@ -8525,7 +10711,7 @@
       </w:rPr>
     </w:lvl>
   </w:abstractNum>
-  <w:abstractNum w:abstractNumId="6" w15:restartNumberingAfterBreak="0">
+  <w:abstractNum w:abstractNumId="7" w15:restartNumberingAfterBreak="0">
     <w:nsid w:val="2A0B18EF"/>
     <w:multiLevelType w:val="multilevel"/>
     <w:tmpl w:val="A1FE297C"/>
@@ -8674,7 +10860,7 @@
       </w:rPr>
     </w:lvl>
   </w:abstractNum>
-  <w:abstractNum w:abstractNumId="7" w15:restartNumberingAfterBreak="0">
+  <w:abstractNum w:abstractNumId="8" w15:restartNumberingAfterBreak="0">
     <w:nsid w:val="2A6D4F8F"/>
     <w:multiLevelType w:val="multilevel"/>
     <w:tmpl w:val="CA8E2F6C"/>
@@ -8823,7 +11009,156 @@
       </w:rPr>
     </w:lvl>
   </w:abstractNum>
-  <w:abstractNum w:abstractNumId="8" w15:restartNumberingAfterBreak="0">
+  <w:abstractNum w:abstractNumId="9" w15:restartNumberingAfterBreak="0">
+    <w:nsid w:val="2B440BB0"/>
+    <w:multiLevelType w:val="multilevel"/>
+    <w:tmpl w:val="C4AA6924"/>
+    <w:lvl w:ilvl="0">
+      <w:start w:val="1"/>
+      <w:numFmt w:val="bullet"/>
+      <w:lvlText w:val=""/>
+      <w:lvlJc w:val="left"/>
+      <w:pPr>
+        <w:tabs>
+          <w:tab w:val="num" w:pos="720"/>
+        </w:tabs>
+        <w:ind w:left="720" w:hanging="360"/>
+      </w:pPr>
+      <w:rPr>
+        <w:rFonts w:ascii="Symbol" w:hAnsi="Symbol" w:hint="default"/>
+        <w:sz w:val="20"/>
+      </w:rPr>
+    </w:lvl>
+    <w:lvl w:ilvl="1" w:tentative="1">
+      <w:start w:val="1"/>
+      <w:numFmt w:val="bullet"/>
+      <w:lvlText w:val="o"/>
+      <w:lvlJc w:val="left"/>
+      <w:pPr>
+        <w:tabs>
+          <w:tab w:val="num" w:pos="1440"/>
+        </w:tabs>
+        <w:ind w:left="1440" w:hanging="360"/>
+      </w:pPr>
+      <w:rPr>
+        <w:rFonts w:ascii="Courier New" w:hAnsi="Courier New" w:hint="default"/>
+        <w:sz w:val="20"/>
+      </w:rPr>
+    </w:lvl>
+    <w:lvl w:ilvl="2" w:tentative="1">
+      <w:start w:val="1"/>
+      <w:numFmt w:val="bullet"/>
+      <w:lvlText w:val=""/>
+      <w:lvlJc w:val="left"/>
+      <w:pPr>
+        <w:tabs>
+          <w:tab w:val="num" w:pos="2160"/>
+        </w:tabs>
+        <w:ind w:left="2160" w:hanging="360"/>
+      </w:pPr>
+      <w:rPr>
+        <w:rFonts w:ascii="Wingdings" w:hAnsi="Wingdings" w:hint="default"/>
+        <w:sz w:val="20"/>
+      </w:rPr>
+    </w:lvl>
+    <w:lvl w:ilvl="3" w:tentative="1">
+      <w:start w:val="1"/>
+      <w:numFmt w:val="bullet"/>
+      <w:lvlText w:val=""/>
+      <w:lvlJc w:val="left"/>
+      <w:pPr>
+        <w:tabs>
+          <w:tab w:val="num" w:pos="2880"/>
+        </w:tabs>
+        <w:ind w:left="2880" w:hanging="360"/>
+      </w:pPr>
+      <w:rPr>
+        <w:rFonts w:ascii="Wingdings" w:hAnsi="Wingdings" w:hint="default"/>
+        <w:sz w:val="20"/>
+      </w:rPr>
+    </w:lvl>
+    <w:lvl w:ilvl="4" w:tentative="1">
+      <w:start w:val="1"/>
+      <w:numFmt w:val="bullet"/>
+      <w:lvlText w:val=""/>
+      <w:lvlJc w:val="left"/>
+      <w:pPr>
+        <w:tabs>
+          <w:tab w:val="num" w:pos="3600"/>
+        </w:tabs>
+        <w:ind w:left="3600" w:hanging="360"/>
+      </w:pPr>
+      <w:rPr>
+        <w:rFonts w:ascii="Wingdings" w:hAnsi="Wingdings" w:hint="default"/>
+        <w:sz w:val="20"/>
+      </w:rPr>
+    </w:lvl>
+    <w:lvl w:ilvl="5" w:tentative="1">
+      <w:start w:val="1"/>
+      <w:numFmt w:val="bullet"/>
+      <w:lvlText w:val=""/>
+      <w:lvlJc w:val="left"/>
+      <w:pPr>
+        <w:tabs>
+          <w:tab w:val="num" w:pos="4320"/>
+        </w:tabs>
+        <w:ind w:left="4320" w:hanging="360"/>
+      </w:pPr>
+      <w:rPr>
+        <w:rFonts w:ascii="Wingdings" w:hAnsi="Wingdings" w:hint="default"/>
+        <w:sz w:val="20"/>
+      </w:rPr>
+    </w:lvl>
+    <w:lvl w:ilvl="6" w:tentative="1">
+      <w:start w:val="1"/>
+      <w:numFmt w:val="bullet"/>
+      <w:lvlText w:val=""/>
+      <w:lvlJc w:val="left"/>
+      <w:pPr>
+        <w:tabs>
+          <w:tab w:val="num" w:pos="5040"/>
+        </w:tabs>
+        <w:ind w:left="5040" w:hanging="360"/>
+      </w:pPr>
+      <w:rPr>
+        <w:rFonts w:ascii="Wingdings" w:hAnsi="Wingdings" w:hint="default"/>
+        <w:sz w:val="20"/>
+      </w:rPr>
+    </w:lvl>
+    <w:lvl w:ilvl="7" w:tentative="1">
+      <w:start w:val="1"/>
+      <w:numFmt w:val="bullet"/>
+      <w:lvlText w:val=""/>
+      <w:lvlJc w:val="left"/>
+      <w:pPr>
+        <w:tabs>
+          <w:tab w:val="num" w:pos="5760"/>
+        </w:tabs>
+        <w:ind w:left="5760" w:hanging="360"/>
+      </w:pPr>
+      <w:rPr>
+        <w:rFonts w:ascii="Wingdings" w:hAnsi="Wingdings" w:hint="default"/>
+        <w:sz w:val="20"/>
+      </w:rPr>
+    </w:lvl>
+    <w:lvl w:ilvl="8" w:tentative="1">
+      <w:start w:val="1"/>
+      <w:numFmt w:val="bullet"/>
+      <w:lvlText w:val=""/>
+      <w:lvlJc w:val="left"/>
+      <w:pPr>
+        <w:tabs>
+          <w:tab w:val="num" w:pos="6480"/>
+        </w:tabs>
+        <w:ind w:left="6480" w:hanging="360"/>
+      </w:pPr>
+      <w:rPr>
+        <w:rFonts w:ascii="Wingdings" w:hAnsi="Wingdings" w:hint="default"/>
+        <w:sz w:val="20"/>
+      </w:rPr>
+    </w:lvl>
+  </w:abstractNum>
+  <w:abstractNum w:abstractNumId="10" w15:restartNumberingAfterBreak="0">
     <w:nsid w:val="2C85342D"/>
     <w:multiLevelType w:val="multilevel"/>
     <w:tmpl w:val="BD120FD8"/>
@@ -8972,7 +11307,7 @@
       </w:rPr>
     </w:lvl>
   </w:abstractNum>
-  <w:abstractNum w:abstractNumId="9" w15:restartNumberingAfterBreak="0">
+  <w:abstractNum w:abstractNumId="11" w15:restartNumberingAfterBreak="0">
     <w:nsid w:val="2CFD0F6F"/>
     <w:multiLevelType w:val="multilevel"/>
     <w:tmpl w:val="95241BD0"/>
@@ -9121,7 +11456,7 @@
       </w:rPr>
     </w:lvl>
   </w:abstractNum>
-  <w:abstractNum w:abstractNumId="10" w15:restartNumberingAfterBreak="0">
+  <w:abstractNum w:abstractNumId="12" w15:restartNumberingAfterBreak="0">
     <w:nsid w:val="319E2522"/>
     <w:multiLevelType w:val="hybridMultilevel"/>
     <w:tmpl w:val="A4C46684"/>
@@ -9207,7 +11542,7 @@
       </w:pPr>
     </w:lvl>
   </w:abstractNum>
-  <w:abstractNum w:abstractNumId="11" w15:restartNumberingAfterBreak="0">
+  <w:abstractNum w:abstractNumId="13" w15:restartNumberingAfterBreak="0">
     <w:nsid w:val="32314E43"/>
     <w:multiLevelType w:val="multilevel"/>
     <w:tmpl w:val="6DFE445C"/>
@@ -9356,7 +11691,7 @@
       </w:rPr>
     </w:lvl>
   </w:abstractNum>
-  <w:abstractNum w:abstractNumId="12" w15:restartNumberingAfterBreak="0">
+  <w:abstractNum w:abstractNumId="14" w15:restartNumberingAfterBreak="0">
     <w:nsid w:val="37306EE6"/>
     <w:multiLevelType w:val="multilevel"/>
     <w:tmpl w:val="58B45C42"/>
@@ -9505,7 +11840,7 @@
       </w:rPr>
     </w:lvl>
   </w:abstractNum>
-  <w:abstractNum w:abstractNumId="13" w15:restartNumberingAfterBreak="0">
+  <w:abstractNum w:abstractNumId="15" w15:restartNumberingAfterBreak="0">
     <w:nsid w:val="39C038B1"/>
     <w:multiLevelType w:val="multilevel"/>
     <w:tmpl w:val="2BA83B04"/>
@@ -9654,7 +11989,7 @@
       </w:rPr>
     </w:lvl>
   </w:abstractNum>
-  <w:abstractNum w:abstractNumId="14" w15:restartNumberingAfterBreak="0">
+  <w:abstractNum w:abstractNumId="16" w15:restartNumberingAfterBreak="0">
     <w:nsid w:val="3D6F0EA4"/>
     <w:multiLevelType w:val="multilevel"/>
     <w:tmpl w:val="BDF03F3C"/>
@@ -9803,7 +12138,156 @@
       </w:rPr>
     </w:lvl>
   </w:abstractNum>
-  <w:abstractNum w:abstractNumId="15" w15:restartNumberingAfterBreak="0">
+  <w:abstractNum w:abstractNumId="17" w15:restartNumberingAfterBreak="0">
+    <w:nsid w:val="3D9D618F"/>
+    <w:multiLevelType w:val="multilevel"/>
+    <w:tmpl w:val="C4AA6924"/>
+    <w:lvl w:ilvl="0">
+      <w:start w:val="1"/>
+      <w:numFmt w:val="bullet"/>
+      <w:lvlText w:val=""/>
+      <w:lvlJc w:val="left"/>
+      <w:pPr>
+        <w:tabs>
+          <w:tab w:val="num" w:pos="720"/>
+        </w:tabs>
+        <w:ind w:left="720" w:hanging="360"/>
+      </w:pPr>
+      <w:rPr>
+        <w:rFonts w:ascii="Symbol" w:hAnsi="Symbol" w:hint="default"/>
+        <w:sz w:val="20"/>
+      </w:rPr>
+    </w:lvl>
+    <w:lvl w:ilvl="1">
+      <w:start w:val="1"/>
+      <w:numFmt w:val="bullet"/>
+      <w:lvlText w:val="o"/>
+      <w:lvlJc w:val="left"/>
+      <w:pPr>
+        <w:tabs>
+          <w:tab w:val="num" w:pos="1440"/>
+        </w:tabs>
+        <w:ind w:left="1440" w:hanging="360"/>
+      </w:pPr>
+      <w:rPr>
+        <w:rFonts w:ascii="Courier New" w:hAnsi="Courier New" w:hint="default"/>
+        <w:sz w:val="20"/>
+      </w:rPr>
+    </w:lvl>
+    <w:lvl w:ilvl="2" w:tentative="1">
+      <w:start w:val="1"/>
+      <w:numFmt w:val="bullet"/>
+      <w:lvlText w:val=""/>
+      <w:lvlJc w:val="left"/>
+      <w:pPr>
+        <w:tabs>
+          <w:tab w:val="num" w:pos="2160"/>
+        </w:tabs>
+        <w:ind w:left="2160" w:hanging="360"/>
+      </w:pPr>
+      <w:rPr>
+        <w:rFonts w:ascii="Wingdings" w:hAnsi="Wingdings" w:hint="default"/>
+        <w:sz w:val="20"/>
+      </w:rPr>
+    </w:lvl>
+    <w:lvl w:ilvl="3" w:tentative="1">
+      <w:start w:val="1"/>
+      <w:numFmt w:val="bullet"/>
+      <w:lvlText w:val=""/>
+      <w:lvlJc w:val="left"/>
+      <w:pPr>
+        <w:tabs>
+          <w:tab w:val="num" w:pos="2880"/>
+        </w:tabs>
+        <w:ind w:left="2880" w:hanging="360"/>
+      </w:pPr>
+      <w:rPr>
+        <w:rFonts w:ascii="Wingdings" w:hAnsi="Wingdings" w:hint="default"/>
+        <w:sz w:val="20"/>
+      </w:rPr>
+    </w:lvl>
+    <w:lvl w:ilvl="4" w:tentative="1">
+      <w:start w:val="1"/>
+      <w:numFmt w:val="bullet"/>
+      <w:lvlText w:val=""/>
+      <w:lvlJc w:val="left"/>
+      <w:pPr>
+        <w:tabs>
+          <w:tab w:val="num" w:pos="3600"/>
+        </w:tabs>
+        <w:ind w:left="3600" w:hanging="360"/>
+      </w:pPr>
+      <w:rPr>
+        <w:rFonts w:ascii="Wingdings" w:hAnsi="Wingdings" w:hint="default"/>
+        <w:sz w:val="20"/>
+      </w:rPr>
+    </w:lvl>
+    <w:lvl w:ilvl="5" w:tentative="1">
+      <w:start w:val="1"/>
+      <w:numFmt w:val="bullet"/>
+      <w:lvlText w:val=""/>
+      <w:lvlJc w:val="left"/>
+      <w:pPr>
+        <w:tabs>
+          <w:tab w:val="num" w:pos="4320"/>
+        </w:tabs>
+        <w:ind w:left="4320" w:hanging="360"/>
+      </w:pPr>
+      <w:rPr>
+        <w:rFonts w:ascii="Wingdings" w:hAnsi="Wingdings" w:hint="default"/>
+        <w:sz w:val="20"/>
+      </w:rPr>
+    </w:lvl>
+    <w:lvl w:ilvl="6" w:tentative="1">
+      <w:start w:val="1"/>
+      <w:numFmt w:val="bullet"/>
+      <w:lvlText w:val=""/>
+      <w:lvlJc w:val="left"/>
+      <w:pPr>
+        <w:tabs>
+          <w:tab w:val="num" w:pos="5040"/>
+        </w:tabs>
+        <w:ind w:left="5040" w:hanging="360"/>
+      </w:pPr>
+      <w:rPr>
+        <w:rFonts w:ascii="Wingdings" w:hAnsi="Wingdings" w:hint="default"/>
+        <w:sz w:val="20"/>
+      </w:rPr>
+    </w:lvl>
+    <w:lvl w:ilvl="7" w:tentative="1">
+      <w:start w:val="1"/>
+      <w:numFmt w:val="bullet"/>
+      <w:lvlText w:val=""/>
+      <w:lvlJc w:val="left"/>
+      <w:pPr>
+        <w:tabs>
+          <w:tab w:val="num" w:pos="5760"/>
+        </w:tabs>
+        <w:ind w:left="5760" w:hanging="360"/>
+      </w:pPr>
+      <w:rPr>
+        <w:rFonts w:ascii="Wingdings" w:hAnsi="Wingdings" w:hint="default"/>
+        <w:sz w:val="20"/>
+      </w:rPr>
+    </w:lvl>
+    <w:lvl w:ilvl="8" w:tentative="1">
+      <w:start w:val="1"/>
+      <w:numFmt w:val="bullet"/>
+      <w:lvlText w:val=""/>
+      <w:lvlJc w:val="left"/>
+      <w:pPr>
+        <w:tabs>
+          <w:tab w:val="num" w:pos="6480"/>
+        </w:tabs>
+        <w:ind w:left="6480" w:hanging="360"/>
+      </w:pPr>
+      <w:rPr>
+        <w:rFonts w:ascii="Wingdings" w:hAnsi="Wingdings" w:hint="default"/>
+        <w:sz w:val="20"/>
+      </w:rPr>
+    </w:lvl>
+  </w:abstractNum>
+  <w:abstractNum w:abstractNumId="18" w15:restartNumberingAfterBreak="0">
     <w:nsid w:val="3E7013D6"/>
     <w:multiLevelType w:val="multilevel"/>
     <w:tmpl w:val="74A45D22"/>
@@ -9952,7 +12436,7 @@
       </w:rPr>
     </w:lvl>
   </w:abstractNum>
-  <w:abstractNum w:abstractNumId="16" w15:restartNumberingAfterBreak="0">
+  <w:abstractNum w:abstractNumId="19" w15:restartNumberingAfterBreak="0">
     <w:nsid w:val="403C08E2"/>
     <w:multiLevelType w:val="multilevel"/>
     <w:tmpl w:val="FB6288E0"/>
@@ -10101,7 +12585,156 @@
       </w:rPr>
     </w:lvl>
   </w:abstractNum>
-  <w:abstractNum w:abstractNumId="17" w15:restartNumberingAfterBreak="0">
+  <w:abstractNum w:abstractNumId="20" w15:restartNumberingAfterBreak="0">
+    <w:nsid w:val="41506B1E"/>
+    <w:multiLevelType w:val="multilevel"/>
+    <w:tmpl w:val="C4AA6924"/>
+    <w:lvl w:ilvl="0">
+      <w:start w:val="1"/>
+      <w:numFmt w:val="bullet"/>
+      <w:lvlText w:val=""/>
+      <w:lvlJc w:val="left"/>
+      <w:pPr>
+        <w:tabs>
+          <w:tab w:val="num" w:pos="720"/>
+        </w:tabs>
+        <w:ind w:left="720" w:hanging="360"/>
+      </w:pPr>
+      <w:rPr>
+        <w:rFonts w:ascii="Symbol" w:hAnsi="Symbol" w:hint="default"/>
+        <w:sz w:val="20"/>
+      </w:rPr>
+    </w:lvl>
+    <w:lvl w:ilvl="1" w:tentative="1">
+      <w:start w:val="1"/>
+      <w:numFmt w:val="bullet"/>
+      <w:lvlText w:val="o"/>
+      <w:lvlJc w:val="left"/>
+      <w:pPr>
+        <w:tabs>
+          <w:tab w:val="num" w:pos="1440"/>
+        </w:tabs>
+        <w:ind w:left="1440" w:hanging="360"/>
+      </w:pPr>
+      <w:rPr>
+        <w:rFonts w:ascii="Courier New" w:hAnsi="Courier New" w:hint="default"/>
+        <w:sz w:val="20"/>
+      </w:rPr>
+    </w:lvl>
+    <w:lvl w:ilvl="2" w:tentative="1">
+      <w:start w:val="1"/>
+      <w:numFmt w:val="bullet"/>
+      <w:lvlText w:val=""/>
+      <w:lvlJc w:val="left"/>
+      <w:pPr>
+        <w:tabs>
+          <w:tab w:val="num" w:pos="2160"/>
+        </w:tabs>
+        <w:ind w:left="2160" w:hanging="360"/>
+      </w:pPr>
+      <w:rPr>
+        <w:rFonts w:ascii="Wingdings" w:hAnsi="Wingdings" w:hint="default"/>
+        <w:sz w:val="20"/>
+      </w:rPr>
+    </w:lvl>
+    <w:lvl w:ilvl="3" w:tentative="1">
+      <w:start w:val="1"/>
+      <w:numFmt w:val="bullet"/>
+      <w:lvlText w:val=""/>
+      <w:lvlJc w:val="left"/>
+      <w:pPr>
+        <w:tabs>
+          <w:tab w:val="num" w:pos="2880"/>
+        </w:tabs>
+        <w:ind w:left="2880" w:hanging="360"/>
+      </w:pPr>
+      <w:rPr>
+        <w:rFonts w:ascii="Wingdings" w:hAnsi="Wingdings" w:hint="default"/>
+        <w:sz w:val="20"/>
+      </w:rPr>
+    </w:lvl>
+    <w:lvl w:ilvl="4" w:tentative="1">
+      <w:start w:val="1"/>
+      <w:numFmt w:val="bullet"/>
+      <w:lvlText w:val=""/>
+      <w:lvlJc w:val="left"/>
+      <w:pPr>
+        <w:tabs>
+          <w:tab w:val="num" w:pos="3600"/>
+        </w:tabs>
+        <w:ind w:left="3600" w:hanging="360"/>
+      </w:pPr>
+      <w:rPr>
+        <w:rFonts w:ascii="Wingdings" w:hAnsi="Wingdings" w:hint="default"/>
+        <w:sz w:val="20"/>
+      </w:rPr>
+    </w:lvl>
+    <w:lvl w:ilvl="5" w:tentative="1">
+      <w:start w:val="1"/>
+      <w:numFmt w:val="bullet"/>
+      <w:lvlText w:val=""/>
+      <w:lvlJc w:val="left"/>
+      <w:pPr>
+        <w:tabs>
+          <w:tab w:val="num" w:pos="4320"/>
+        </w:tabs>
+        <w:ind w:left="4320" w:hanging="360"/>
+      </w:pPr>
+      <w:rPr>
+        <w:rFonts w:ascii="Wingdings" w:hAnsi="Wingdings" w:hint="default"/>
+        <w:sz w:val="20"/>
+      </w:rPr>
+    </w:lvl>
+    <w:lvl w:ilvl="6" w:tentative="1">
+      <w:start w:val="1"/>
+      <w:numFmt w:val="bullet"/>
+      <w:lvlText w:val=""/>
+      <w:lvlJc w:val="left"/>
+      <w:pPr>
+        <w:tabs>
+          <w:tab w:val="num" w:pos="5040"/>
+        </w:tabs>
+        <w:ind w:left="5040" w:hanging="360"/>
+      </w:pPr>
+      <w:rPr>
+        <w:rFonts w:ascii="Wingdings" w:hAnsi="Wingdings" w:hint="default"/>
+        <w:sz w:val="20"/>
+      </w:rPr>
+    </w:lvl>
+    <w:lvl w:ilvl="7" w:tentative="1">
+      <w:start w:val="1"/>
+      <w:numFmt w:val="bullet"/>
+      <w:lvlText w:val=""/>
+      <w:lvlJc w:val="left"/>
+      <w:pPr>
+        <w:tabs>
+          <w:tab w:val="num" w:pos="5760"/>
+        </w:tabs>
+        <w:ind w:left="5760" w:hanging="360"/>
+      </w:pPr>
+      <w:rPr>
+        <w:rFonts w:ascii="Wingdings" w:hAnsi="Wingdings" w:hint="default"/>
+        <w:sz w:val="20"/>
+      </w:rPr>
+    </w:lvl>
+    <w:lvl w:ilvl="8" w:tentative="1">
+      <w:start w:val="1"/>
+      <w:numFmt w:val="bullet"/>
+      <w:lvlText w:val=""/>
+      <w:lvlJc w:val="left"/>
+      <w:pPr>
+        <w:tabs>
+          <w:tab w:val="num" w:pos="6480"/>
+        </w:tabs>
+        <w:ind w:left="6480" w:hanging="360"/>
+      </w:pPr>
+      <w:rPr>
+        <w:rFonts w:ascii="Wingdings" w:hAnsi="Wingdings" w:hint="default"/>
+        <w:sz w:val="20"/>
+      </w:rPr>
+    </w:lvl>
+  </w:abstractNum>
+  <w:abstractNum w:abstractNumId="21" w15:restartNumberingAfterBreak="0">
     <w:nsid w:val="46A85515"/>
     <w:multiLevelType w:val="multilevel"/>
     <w:tmpl w:val="8D6CE70C"/>
@@ -10250,7 +12883,7 @@
       </w:rPr>
     </w:lvl>
   </w:abstractNum>
-  <w:abstractNum w:abstractNumId="18" w15:restartNumberingAfterBreak="0">
+  <w:abstractNum w:abstractNumId="22" w15:restartNumberingAfterBreak="0">
     <w:nsid w:val="48425E02"/>
     <w:multiLevelType w:val="multilevel"/>
     <w:tmpl w:val="9DBA5C14"/>
@@ -10399,7 +13032,7 @@
       </w:rPr>
     </w:lvl>
   </w:abstractNum>
-  <w:abstractNum w:abstractNumId="19" w15:restartNumberingAfterBreak="0">
+  <w:abstractNum w:abstractNumId="23" w15:restartNumberingAfterBreak="0">
     <w:nsid w:val="4A765645"/>
     <w:multiLevelType w:val="multilevel"/>
     <w:tmpl w:val="C4AA6924"/>
@@ -10548,7 +13181,7 @@
       </w:rPr>
     </w:lvl>
   </w:abstractNum>
-  <w:abstractNum w:abstractNumId="20" w15:restartNumberingAfterBreak="0">
+  <w:abstractNum w:abstractNumId="24" w15:restartNumberingAfterBreak="0">
     <w:nsid w:val="4E414EC2"/>
     <w:multiLevelType w:val="multilevel"/>
     <w:tmpl w:val="6BBA3D38"/>
@@ -10697,7 +13330,7 @@
       </w:rPr>
     </w:lvl>
   </w:abstractNum>
-  <w:abstractNum w:abstractNumId="21" w15:restartNumberingAfterBreak="0">
+  <w:abstractNum w:abstractNumId="25" w15:restartNumberingAfterBreak="0">
     <w:nsid w:val="5443533E"/>
     <w:multiLevelType w:val="multilevel"/>
     <w:tmpl w:val="8446EBBC"/>
@@ -10846,7 +13479,156 @@
       </w:rPr>
     </w:lvl>
   </w:abstractNum>
-  <w:abstractNum w:abstractNumId="22" w15:restartNumberingAfterBreak="0">
+  <w:abstractNum w:abstractNumId="26" w15:restartNumberingAfterBreak="0">
+    <w:nsid w:val="5DE44008"/>
+    <w:multiLevelType w:val="multilevel"/>
+    <w:tmpl w:val="C4AA6924"/>
+    <w:lvl w:ilvl="0">
+      <w:start w:val="1"/>
+      <w:numFmt w:val="bullet"/>
+      <w:lvlText w:val=""/>
+      <w:lvlJc w:val="left"/>
+      <w:pPr>
+        <w:tabs>
+          <w:tab w:val="num" w:pos="720"/>
+        </w:tabs>
+        <w:ind w:left="720" w:hanging="360"/>
+      </w:pPr>
+      <w:rPr>
+        <w:rFonts w:ascii="Symbol" w:hAnsi="Symbol" w:hint="default"/>
+        <w:sz w:val="20"/>
+      </w:rPr>
+    </w:lvl>
+    <w:lvl w:ilvl="1" w:tentative="1">
+      <w:start w:val="1"/>
+      <w:numFmt w:val="bullet"/>
+      <w:lvlText w:val="o"/>
+      <w:lvlJc w:val="left"/>
+      <w:pPr>
+        <w:tabs>
+          <w:tab w:val="num" w:pos="1440"/>
+        </w:tabs>
+        <w:ind w:left="1440" w:hanging="360"/>
+      </w:pPr>
+      <w:rPr>
+        <w:rFonts w:ascii="Courier New" w:hAnsi="Courier New" w:hint="default"/>
+        <w:sz w:val="20"/>
+      </w:rPr>
+    </w:lvl>
+    <w:lvl w:ilvl="2" w:tentative="1">
+      <w:start w:val="1"/>
+      <w:numFmt w:val="bullet"/>
+      <w:lvlText w:val=""/>
+      <w:lvlJc w:val="left"/>
+      <w:pPr>
+        <w:tabs>
+          <w:tab w:val="num" w:pos="2160"/>
+        </w:tabs>
+        <w:ind w:left="2160" w:hanging="360"/>
+      </w:pPr>
+      <w:rPr>
+        <w:rFonts w:ascii="Wingdings" w:hAnsi="Wingdings" w:hint="default"/>
+        <w:sz w:val="20"/>
+      </w:rPr>
+    </w:lvl>
+    <w:lvl w:ilvl="3" w:tentative="1">
+      <w:start w:val="1"/>
+      <w:numFmt w:val="bullet"/>
+      <w:lvlText w:val=""/>
+      <w:lvlJc w:val="left"/>
+      <w:pPr>
+        <w:tabs>
+          <w:tab w:val="num" w:pos="2880"/>
+        </w:tabs>
+        <w:ind w:left="2880" w:hanging="360"/>
+      </w:pPr>
+      <w:rPr>
+        <w:rFonts w:ascii="Wingdings" w:hAnsi="Wingdings" w:hint="default"/>
+        <w:sz w:val="20"/>
+      </w:rPr>
+    </w:lvl>
+    <w:lvl w:ilvl="4" w:tentative="1">
+      <w:start w:val="1"/>
+      <w:numFmt w:val="bullet"/>
+      <w:lvlText w:val=""/>
+      <w:lvlJc w:val="left"/>
+      <w:pPr>
+        <w:tabs>
+          <w:tab w:val="num" w:pos="3600"/>
+        </w:tabs>
+        <w:ind w:left="3600" w:hanging="360"/>
+      </w:pPr>
+      <w:rPr>
+        <w:rFonts w:ascii="Wingdings" w:hAnsi="Wingdings" w:hint="default"/>
+        <w:sz w:val="20"/>
+      </w:rPr>
+    </w:lvl>
+    <w:lvl w:ilvl="5" w:tentative="1">
+      <w:start w:val="1"/>
+      <w:numFmt w:val="bullet"/>
+      <w:lvlText w:val=""/>
+      <w:lvlJc w:val="left"/>
+      <w:pPr>
+        <w:tabs>
+          <w:tab w:val="num" w:pos="4320"/>
+        </w:tabs>
+        <w:ind w:left="4320" w:hanging="360"/>
+      </w:pPr>
+      <w:rPr>
+        <w:rFonts w:ascii="Wingdings" w:hAnsi="Wingdings" w:hint="default"/>
+        <w:sz w:val="20"/>
+      </w:rPr>
+    </w:lvl>
+    <w:lvl w:ilvl="6" w:tentative="1">
+      <w:start w:val="1"/>
+      <w:numFmt w:val="bullet"/>
+      <w:lvlText w:val=""/>
+      <w:lvlJc w:val="left"/>
+      <w:pPr>
+        <w:tabs>
+          <w:tab w:val="num" w:pos="5040"/>
+        </w:tabs>
+        <w:ind w:left="5040" w:hanging="360"/>
+      </w:pPr>
+      <w:rPr>
+        <w:rFonts w:ascii="Wingdings" w:hAnsi="Wingdings" w:hint="default"/>
+        <w:sz w:val="20"/>
+      </w:rPr>
+    </w:lvl>
+    <w:lvl w:ilvl="7" w:tentative="1">
+      <w:start w:val="1"/>
+      <w:numFmt w:val="bullet"/>
+      <w:lvlText w:val=""/>
+      <w:lvlJc w:val="left"/>
+      <w:pPr>
+        <w:tabs>
+          <w:tab w:val="num" w:pos="5760"/>
+        </w:tabs>
+        <w:ind w:left="5760" w:hanging="360"/>
+      </w:pPr>
+      <w:rPr>
+        <w:rFonts w:ascii="Wingdings" w:hAnsi="Wingdings" w:hint="default"/>
+        <w:sz w:val="20"/>
+      </w:rPr>
+    </w:lvl>
+    <w:lvl w:ilvl="8" w:tentative="1">
+      <w:start w:val="1"/>
+      <w:numFmt w:val="bullet"/>
+      <w:lvlText w:val=""/>
+      <w:lvlJc w:val="left"/>
+      <w:pPr>
+        <w:tabs>
+          <w:tab w:val="num" w:pos="6480"/>
+        </w:tabs>
+        <w:ind w:left="6480" w:hanging="360"/>
+      </w:pPr>
+      <w:rPr>
+        <w:rFonts w:ascii="Wingdings" w:hAnsi="Wingdings" w:hint="default"/>
+        <w:sz w:val="20"/>
+      </w:rPr>
+    </w:lvl>
+  </w:abstractNum>
+  <w:abstractNum w:abstractNumId="27" w15:restartNumberingAfterBreak="0">
     <w:nsid w:val="5E953EED"/>
     <w:multiLevelType w:val="multilevel"/>
     <w:tmpl w:val="A71ECE4C"/>
@@ -10995,7 +13777,7 @@
       </w:rPr>
     </w:lvl>
   </w:abstractNum>
-  <w:abstractNum w:abstractNumId="23" w15:restartNumberingAfterBreak="0">
+  <w:abstractNum w:abstractNumId="28" w15:restartNumberingAfterBreak="0">
     <w:nsid w:val="609C14FA"/>
     <w:multiLevelType w:val="multilevel"/>
     <w:tmpl w:val="DB1A14BA"/>
@@ -11144,7 +13926,7 @@
       </w:rPr>
     </w:lvl>
   </w:abstractNum>
-  <w:abstractNum w:abstractNumId="24" w15:restartNumberingAfterBreak="0">
+  <w:abstractNum w:abstractNumId="29" w15:restartNumberingAfterBreak="0">
     <w:nsid w:val="69F818B0"/>
     <w:multiLevelType w:val="multilevel"/>
     <w:tmpl w:val="997E2736"/>
@@ -11293,7 +14075,305 @@
       </w:rPr>
     </w:lvl>
   </w:abstractNum>
-  <w:abstractNum w:abstractNumId="25" w15:restartNumberingAfterBreak="0">
+  <w:abstractNum w:abstractNumId="30" w15:restartNumberingAfterBreak="0">
+    <w:nsid w:val="714E15DA"/>
+    <w:multiLevelType w:val="multilevel"/>
+    <w:tmpl w:val="C4AA6924"/>
+    <w:lvl w:ilvl="0">
+      <w:start w:val="1"/>
+      <w:numFmt w:val="bullet"/>
+      <w:lvlText w:val=""/>
+      <w:lvlJc w:val="left"/>
+      <w:pPr>
+        <w:tabs>
+          <w:tab w:val="num" w:pos="720"/>
+        </w:tabs>
+        <w:ind w:left="720" w:hanging="360"/>
+      </w:pPr>
+      <w:rPr>
+        <w:rFonts w:ascii="Symbol" w:hAnsi="Symbol" w:hint="default"/>
+        <w:sz w:val="20"/>
+      </w:rPr>
+    </w:lvl>
+    <w:lvl w:ilvl="1">
+      <w:start w:val="1"/>
+      <w:numFmt w:val="bullet"/>
+      <w:lvlText w:val="o"/>
+      <w:lvlJc w:val="left"/>
+      <w:pPr>
+        <w:tabs>
+          <w:tab w:val="num" w:pos="1440"/>
+        </w:tabs>
+        <w:ind w:left="1440" w:hanging="360"/>
+      </w:pPr>
+      <w:rPr>
+        <w:rFonts w:ascii="Courier New" w:hAnsi="Courier New" w:hint="default"/>
+        <w:sz w:val="20"/>
+      </w:rPr>
+    </w:lvl>
+    <w:lvl w:ilvl="2" w:tentative="1">
+      <w:start w:val="1"/>
+      <w:numFmt w:val="bullet"/>
+      <w:lvlText w:val=""/>
+      <w:lvlJc w:val="left"/>
+      <w:pPr>
+        <w:tabs>
+          <w:tab w:val="num" w:pos="2160"/>
+        </w:tabs>
+        <w:ind w:left="2160" w:hanging="360"/>
+      </w:pPr>
+      <w:rPr>
+        <w:rFonts w:ascii="Wingdings" w:hAnsi="Wingdings" w:hint="default"/>
+        <w:sz w:val="20"/>
+      </w:rPr>
+    </w:lvl>
+    <w:lvl w:ilvl="3" w:tentative="1">
+      <w:start w:val="1"/>
+      <w:numFmt w:val="bullet"/>
+      <w:lvlText w:val=""/>
+      <w:lvlJc w:val="left"/>
+      <w:pPr>
+        <w:tabs>
+          <w:tab w:val="num" w:pos="2880"/>
+        </w:tabs>
+        <w:ind w:left="2880" w:hanging="360"/>
+      </w:pPr>
+      <w:rPr>
+        <w:rFonts w:ascii="Wingdings" w:hAnsi="Wingdings" w:hint="default"/>
+        <w:sz w:val="20"/>
+      </w:rPr>
+    </w:lvl>
+    <w:lvl w:ilvl="4" w:tentative="1">
+      <w:start w:val="1"/>
+      <w:numFmt w:val="bullet"/>
+      <w:lvlText w:val=""/>
+      <w:lvlJc w:val="left"/>
+      <w:pPr>
+        <w:tabs>
+          <w:tab w:val="num" w:pos="3600"/>
+        </w:tabs>
+        <w:ind w:left="3600" w:hanging="360"/>
+      </w:pPr>
+      <w:rPr>
+        <w:rFonts w:ascii="Wingdings" w:hAnsi="Wingdings" w:hint="default"/>
+        <w:sz w:val="20"/>
+      </w:rPr>
+    </w:lvl>
+    <w:lvl w:ilvl="5" w:tentative="1">
+      <w:start w:val="1"/>
+      <w:numFmt w:val="bullet"/>
+      <w:lvlText w:val=""/>
+      <w:lvlJc w:val="left"/>
+      <w:pPr>
+        <w:tabs>
+          <w:tab w:val="num" w:pos="4320"/>
+        </w:tabs>
+        <w:ind w:left="4320" w:hanging="360"/>
+      </w:pPr>
+      <w:rPr>
+        <w:rFonts w:ascii="Wingdings" w:hAnsi="Wingdings" w:hint="default"/>
+        <w:sz w:val="20"/>
+      </w:rPr>
+    </w:lvl>
+    <w:lvl w:ilvl="6" w:tentative="1">
+      <w:start w:val="1"/>
+      <w:numFmt w:val="bullet"/>
+      <w:lvlText w:val=""/>
+      <w:lvlJc w:val="left"/>
+      <w:pPr>
+        <w:tabs>
+          <w:tab w:val="num" w:pos="5040"/>
+        </w:tabs>
+        <w:ind w:left="5040" w:hanging="360"/>
+      </w:pPr>
+      <w:rPr>
+        <w:rFonts w:ascii="Wingdings" w:hAnsi="Wingdings" w:hint="default"/>
+        <w:sz w:val="20"/>
+      </w:rPr>
+    </w:lvl>
+    <w:lvl w:ilvl="7" w:tentative="1">
+      <w:start w:val="1"/>
+      <w:numFmt w:val="bullet"/>
+      <w:lvlText w:val=""/>
+      <w:lvlJc w:val="left"/>
+      <w:pPr>
+        <w:tabs>
+          <w:tab w:val="num" w:pos="5760"/>
+        </w:tabs>
+        <w:ind w:left="5760" w:hanging="360"/>
+      </w:pPr>
+      <w:rPr>
+        <w:rFonts w:ascii="Wingdings" w:hAnsi="Wingdings" w:hint="default"/>
+        <w:sz w:val="20"/>
+      </w:rPr>
+    </w:lvl>
+    <w:lvl w:ilvl="8" w:tentative="1">
+      <w:start w:val="1"/>
+      <w:numFmt w:val="bullet"/>
+      <w:lvlText w:val=""/>
+      <w:lvlJc w:val="left"/>
+      <w:pPr>
+        <w:tabs>
+          <w:tab w:val="num" w:pos="6480"/>
+        </w:tabs>
+        <w:ind w:left="6480" w:hanging="360"/>
+      </w:pPr>
+      <w:rPr>
+        <w:rFonts w:ascii="Wingdings" w:hAnsi="Wingdings" w:hint="default"/>
+        <w:sz w:val="20"/>
+      </w:rPr>
+    </w:lvl>
+  </w:abstractNum>
+  <w:abstractNum w:abstractNumId="31" w15:restartNumberingAfterBreak="0">
+    <w:nsid w:val="76377025"/>
+    <w:multiLevelType w:val="multilevel"/>
+    <w:tmpl w:val="C4AA6924"/>
+    <w:lvl w:ilvl="0">
+      <w:start w:val="1"/>
+      <w:numFmt w:val="bullet"/>
+      <w:lvlText w:val=""/>
+      <w:lvlJc w:val="left"/>
+      <w:pPr>
+        <w:tabs>
+          <w:tab w:val="num" w:pos="720"/>
+        </w:tabs>
+        <w:ind w:left="720" w:hanging="360"/>
+      </w:pPr>
+      <w:rPr>
+        <w:rFonts w:ascii="Symbol" w:hAnsi="Symbol" w:hint="default"/>
+        <w:sz w:val="20"/>
+      </w:rPr>
+    </w:lvl>
+    <w:lvl w:ilvl="1">
+      <w:start w:val="1"/>
+      <w:numFmt w:val="bullet"/>
+      <w:lvlText w:val="o"/>
+      <w:lvlJc w:val="left"/>
+      <w:pPr>
+        <w:tabs>
+          <w:tab w:val="num" w:pos="1440"/>
+        </w:tabs>
+        <w:ind w:left="1440" w:hanging="360"/>
+      </w:pPr>
+      <w:rPr>
+        <w:rFonts w:ascii="Courier New" w:hAnsi="Courier New" w:hint="default"/>
+        <w:sz w:val="20"/>
+      </w:rPr>
+    </w:lvl>
+    <w:lvl w:ilvl="2" w:tentative="1">
+      <w:start w:val="1"/>
+      <w:numFmt w:val="bullet"/>
+      <w:lvlText w:val=""/>
+      <w:lvlJc w:val="left"/>
+      <w:pPr>
+        <w:tabs>
+          <w:tab w:val="num" w:pos="2160"/>
+        </w:tabs>
+        <w:ind w:left="2160" w:hanging="360"/>
+      </w:pPr>
+      <w:rPr>
+        <w:rFonts w:ascii="Wingdings" w:hAnsi="Wingdings" w:hint="default"/>
+        <w:sz w:val="20"/>
+      </w:rPr>
+    </w:lvl>
+    <w:lvl w:ilvl="3" w:tentative="1">
+      <w:start w:val="1"/>
+      <w:numFmt w:val="bullet"/>
+      <w:lvlText w:val=""/>
+      <w:lvlJc w:val="left"/>
+      <w:pPr>
+        <w:tabs>
+          <w:tab w:val="num" w:pos="2880"/>
+        </w:tabs>
+        <w:ind w:left="2880" w:hanging="360"/>
+      </w:pPr>
+      <w:rPr>
+        <w:rFonts w:ascii="Wingdings" w:hAnsi="Wingdings" w:hint="default"/>
+        <w:sz w:val="20"/>
+      </w:rPr>
+    </w:lvl>
+    <w:lvl w:ilvl="4" w:tentative="1">
+      <w:start w:val="1"/>
+      <w:numFmt w:val="bullet"/>
+      <w:lvlText w:val=""/>
+      <w:lvlJc w:val="left"/>
+      <w:pPr>
+        <w:tabs>
+          <w:tab w:val="num" w:pos="3600"/>
+        </w:tabs>
+        <w:ind w:left="3600" w:hanging="360"/>
+      </w:pPr>
+      <w:rPr>
+        <w:rFonts w:ascii="Wingdings" w:hAnsi="Wingdings" w:hint="default"/>
+        <w:sz w:val="20"/>
+      </w:rPr>
+    </w:lvl>
+    <w:lvl w:ilvl="5" w:tentative="1">
+      <w:start w:val="1"/>
+      <w:numFmt w:val="bullet"/>
+      <w:lvlText w:val=""/>
+      <w:lvlJc w:val="left"/>
+      <w:pPr>
+        <w:tabs>
+          <w:tab w:val="num" w:pos="4320"/>
+        </w:tabs>
+        <w:ind w:left="4320" w:hanging="360"/>
+      </w:pPr>
+      <w:rPr>
+        <w:rFonts w:ascii="Wingdings" w:hAnsi="Wingdings" w:hint="default"/>
+        <w:sz w:val="20"/>
+      </w:rPr>
+    </w:lvl>
+    <w:lvl w:ilvl="6" w:tentative="1">
+      <w:start w:val="1"/>
+      <w:numFmt w:val="bullet"/>
+      <w:lvlText w:val=""/>
+      <w:lvlJc w:val="left"/>
+      <w:pPr>
+        <w:tabs>
+          <w:tab w:val="num" w:pos="5040"/>
+        </w:tabs>
+        <w:ind w:left="5040" w:hanging="360"/>
+      </w:pPr>
+      <w:rPr>
+        <w:rFonts w:ascii="Wingdings" w:hAnsi="Wingdings" w:hint="default"/>
+        <w:sz w:val="20"/>
+      </w:rPr>
+    </w:lvl>
+    <w:lvl w:ilvl="7" w:tentative="1">
+      <w:start w:val="1"/>
+      <w:numFmt w:val="bullet"/>
+      <w:lvlText w:val=""/>
+      <w:lvlJc w:val="left"/>
+      <w:pPr>
+        <w:tabs>
+          <w:tab w:val="num" w:pos="5760"/>
+        </w:tabs>
+        <w:ind w:left="5760" w:hanging="360"/>
+      </w:pPr>
+      <w:rPr>
+        <w:rFonts w:ascii="Wingdings" w:hAnsi="Wingdings" w:hint="default"/>
+        <w:sz w:val="20"/>
+      </w:rPr>
+    </w:lvl>
+    <w:lvl w:ilvl="8" w:tentative="1">
+      <w:start w:val="1"/>
+      <w:numFmt w:val="bullet"/>
+      <w:lvlText w:val=""/>
+      <w:lvlJc w:val="left"/>
+      <w:pPr>
+        <w:tabs>
+          <w:tab w:val="num" w:pos="6480"/>
+        </w:tabs>
+        <w:ind w:left="6480" w:hanging="360"/>
+      </w:pPr>
+      <w:rPr>
+        <w:rFonts w:ascii="Wingdings" w:hAnsi="Wingdings" w:hint="default"/>
+        <w:sz w:val="20"/>
+      </w:rPr>
+    </w:lvl>
+  </w:abstractNum>
+  <w:abstractNum w:abstractNumId="32" w15:restartNumberingAfterBreak="0">
     <w:nsid w:val="7C576E51"/>
     <w:multiLevelType w:val="multilevel"/>
     <w:tmpl w:val="B64ACDBC"/>
@@ -11446,79 +14526,100 @@
     <w:abstractNumId w:val="4"/>
   </w:num>
   <w:num w:numId="2" w16cid:durableId="1586569769">
-    <w:abstractNumId w:val="12"/>
+    <w:abstractNumId w:val="14"/>
   </w:num>
   <w:num w:numId="3" w16cid:durableId="1779371563">
-    <w:abstractNumId w:val="6"/>
+    <w:abstractNumId w:val="7"/>
   </w:num>
   <w:num w:numId="4" w16cid:durableId="1204370127">
-    <w:abstractNumId w:val="16"/>
+    <w:abstractNumId w:val="19"/>
   </w:num>
   <w:num w:numId="5" w16cid:durableId="1751196124">
-    <w:abstractNumId w:val="24"/>
+    <w:abstractNumId w:val="29"/>
   </w:num>
   <w:num w:numId="6" w16cid:durableId="1074426143">
-    <w:abstractNumId w:val="15"/>
+    <w:abstractNumId w:val="18"/>
   </w:num>
   <w:num w:numId="7" w16cid:durableId="57048577">
     <w:abstractNumId w:val="3"/>
   </w:num>
   <w:num w:numId="8" w16cid:durableId="815874802">
-    <w:abstractNumId w:val="13"/>
+    <w:abstractNumId w:val="15"/>
   </w:num>
   <w:num w:numId="9" w16cid:durableId="92941787">
     <w:abstractNumId w:val="1"/>
   </w:num>
   <w:num w:numId="10" w16cid:durableId="669068450">
+    <w:abstractNumId w:val="25"/>
+  </w:num>
+  <w:num w:numId="11" w16cid:durableId="667290534">
+    <w:abstractNumId w:val="32"/>
+  </w:num>
+  <w:num w:numId="12" w16cid:durableId="226839535">
+    <w:abstractNumId w:val="6"/>
+  </w:num>
+  <w:num w:numId="13" w16cid:durableId="2059235817">
+    <w:abstractNumId w:val="23"/>
+  </w:num>
+  <w:num w:numId="14" w16cid:durableId="829562467">
+    <w:abstractNumId w:val="16"/>
+  </w:num>
+  <w:num w:numId="15" w16cid:durableId="1148400394">
+    <w:abstractNumId w:val="28"/>
+  </w:num>
+  <w:num w:numId="16" w16cid:durableId="1835878333">
+    <w:abstractNumId w:val="24"/>
+  </w:num>
+  <w:num w:numId="17" w16cid:durableId="1793818157">
+    <w:abstractNumId w:val="27"/>
+  </w:num>
+  <w:num w:numId="18" w16cid:durableId="916941765">
     <w:abstractNumId w:val="21"/>
   </w:num>
-  <w:num w:numId="11" w16cid:durableId="667290534">
-    <w:abstractNumId w:val="25"/>
+  <w:num w:numId="19" w16cid:durableId="1829982507">
+    <w:abstractNumId w:val="13"/>
   </w:num>
-  <w:num w:numId="12" w16cid:durableId="226839535">
-    <w:abstractNumId w:val="5"/>
-  </w:num>
-  <w:num w:numId="13" w16cid:durableId="2059235817">
-    <w:abstractNumId w:val="19"/>
-  </w:num>
-  <w:num w:numId="14" w16cid:durableId="829562467">
-    <w:abstractNumId w:val="14"/>
-  </w:num>
-  <w:num w:numId="15" w16cid:durableId="1148400394">
-    <w:abstractNumId w:val="23"/>
-  </w:num>
-  <w:num w:numId="16" w16cid:durableId="1835878333">
-    <w:abstractNumId w:val="20"/>
-  </w:num>
-  <w:num w:numId="17" w16cid:durableId="1793818157">
+  <w:num w:numId="20" w16cid:durableId="1882934644">
     <w:abstractNumId w:val="22"/>
   </w:num>
-  <w:num w:numId="18" w16cid:durableId="916941765">
-    <w:abstractNumId w:val="17"/>
+  <w:num w:numId="21" w16cid:durableId="324482125">
+    <w:abstractNumId w:val="10"/>
   </w:num>
-  <w:num w:numId="19" w16cid:durableId="1829982507">
+  <w:num w:numId="22" w16cid:durableId="1477064731">
+    <w:abstractNumId w:val="8"/>
+  </w:num>
+  <w:num w:numId="23" w16cid:durableId="850295434">
     <w:abstractNumId w:val="11"/>
   </w:num>
-  <w:num w:numId="20" w16cid:durableId="1882934644">
-    <w:abstractNumId w:val="18"/>
-  </w:num>
-  <w:num w:numId="21" w16cid:durableId="324482125">
-    <w:abstractNumId w:val="8"/>
-  </w:num>
-  <w:num w:numId="22" w16cid:durableId="1477064731">
-    <w:abstractNumId w:val="7"/>
-  </w:num>
-  <w:num w:numId="23" w16cid:durableId="850295434">
-    <w:abstractNumId w:val="9"/>
-  </w:num>
   <w:num w:numId="24" w16cid:durableId="657005186">
-    <w:abstractNumId w:val="10"/>
+    <w:abstractNumId w:val="12"/>
   </w:num>
   <w:num w:numId="25" w16cid:durableId="1349327198">
     <w:abstractNumId w:val="2"/>
   </w:num>
   <w:num w:numId="26" w16cid:durableId="1262639490">
     <w:abstractNumId w:val="0"/>
+  </w:num>
+  <w:num w:numId="27" w16cid:durableId="68619342">
+    <w:abstractNumId w:val="31"/>
+  </w:num>
+  <w:num w:numId="28" w16cid:durableId="1697845139">
+    <w:abstractNumId w:val="17"/>
+  </w:num>
+  <w:num w:numId="29" w16cid:durableId="412825670">
+    <w:abstractNumId w:val="9"/>
+  </w:num>
+  <w:num w:numId="30" w16cid:durableId="70390740">
+    <w:abstractNumId w:val="5"/>
+  </w:num>
+  <w:num w:numId="31" w16cid:durableId="1915624695">
+    <w:abstractNumId w:val="30"/>
+  </w:num>
+  <w:num w:numId="32" w16cid:durableId="769812801">
+    <w:abstractNumId w:val="26"/>
+  </w:num>
+  <w:num w:numId="33" w16cid:durableId="458493004">
+    <w:abstractNumId w:val="20"/>
   </w:num>
 </w:numbering>
 </file>
@@ -12125,7 +15226,6 @@
   <w:style w:type="character" w:default="1" w:styleId="Policepardfaut">
     <w:name w:val="Default Paragraph Font"/>
     <w:uiPriority w:val="1"/>
-    <w:semiHidden/>
     <w:unhideWhenUsed/>
   </w:style>
   <w:style w:type="table" w:default="1" w:styleId="TableauNormal">
@@ -12438,6 +15538,19 @@
       <w:spacing w:val="5"/>
     </w:rPr>
   </w:style>
+  <w:style w:type="paragraph" w:styleId="NormalWeb">
+    <w:name w:val="Normal (Web)"/>
+    <w:basedOn w:val="Normal"/>
+    <w:uiPriority w:val="99"/>
+    <w:semiHidden/>
+    <w:unhideWhenUsed/>
+    <w:rsid w:val="008A0AF4"/>
+    <w:rPr>
+      <w:rFonts w:ascii="Times New Roman" w:hAnsi="Times New Roman" w:cs="Times New Roman"/>
+      <w:sz w:val="24"/>
+      <w:szCs w:val="24"/>
+    </w:rPr>
+  </w:style>
 </w:styles>
 </file>
 

</xml_diff>

<commit_message>
Module 2: stationnarité et outils mathématiques
</commit_message>
<xml_diff>
--- a/Plan.docx
+++ b/Plan.docx
@@ -6643,79 +6643,7 @@
           <w:lang w:eastAsia="fr-FR"/>
           <w14:ligatures w14:val="none"/>
         </w:rPr>
-        <w:t xml:space="preserve"> : Utilisation de pandas pour la manipulation d'index temporels (</w:t>
-      </w:r>
-      <w:proofErr w:type="spellStart"/>
-      <w:r>
-        <w:rPr>
-          <w:rFonts w:eastAsia="Times New Roman" w:cstheme="minorHAnsi"/>
-          <w:kern w:val="0"/>
-          <w:sz w:val="20"/>
-          <w:szCs w:val="20"/>
-          <w:lang w:eastAsia="fr-FR"/>
-          <w14:ligatures w14:val="none"/>
-        </w:rPr>
-        <w:t>resampling</w:t>
-      </w:r>
-      <w:proofErr w:type="spellEnd"/>
-      <w:r>
-        <w:rPr>
-          <w:rFonts w:eastAsia="Times New Roman" w:cstheme="minorHAnsi"/>
-          <w:kern w:val="0"/>
-          <w:sz w:val="20"/>
-          <w:szCs w:val="20"/>
-          <w:lang w:eastAsia="fr-FR"/>
-          <w14:ligatures w14:val="none"/>
-        </w:rPr>
-        <w:t xml:space="preserve">, </w:t>
-      </w:r>
-      <w:proofErr w:type="spellStart"/>
-      <w:r>
-        <w:rPr>
-          <w:rFonts w:eastAsia="Times New Roman" w:cstheme="minorHAnsi"/>
-          <w:kern w:val="0"/>
-          <w:sz w:val="20"/>
-          <w:szCs w:val="20"/>
-          <w:lang w:eastAsia="fr-FR"/>
-          <w14:ligatures w14:val="none"/>
-        </w:rPr>
-        <w:t>rolling</w:t>
-      </w:r>
-      <w:proofErr w:type="spellEnd"/>
-      <w:r>
-        <w:rPr>
-          <w:rFonts w:eastAsia="Times New Roman" w:cstheme="minorHAnsi"/>
-          <w:kern w:val="0"/>
-          <w:sz w:val="20"/>
-          <w:szCs w:val="20"/>
-          <w:lang w:eastAsia="fr-FR"/>
-          <w14:ligatures w14:val="none"/>
-        </w:rPr>
-        <w:t xml:space="preserve"> </w:t>
-      </w:r>
-      <w:proofErr w:type="spellStart"/>
-      <w:r>
-        <w:rPr>
-          <w:rFonts w:eastAsia="Times New Roman" w:cstheme="minorHAnsi"/>
-          <w:kern w:val="0"/>
-          <w:sz w:val="20"/>
-          <w:szCs w:val="20"/>
-          <w:lang w:eastAsia="fr-FR"/>
-          <w14:ligatures w14:val="none"/>
-        </w:rPr>
-        <w:t>windows</w:t>
-      </w:r>
-      <w:proofErr w:type="spellEnd"/>
-      <w:r>
-        <w:rPr>
-          <w:rFonts w:eastAsia="Times New Roman" w:cstheme="minorHAnsi"/>
-          <w:kern w:val="0"/>
-          <w:sz w:val="20"/>
-          <w:szCs w:val="20"/>
-          <w:lang w:eastAsia="fr-FR"/>
-          <w14:ligatures w14:val="none"/>
-        </w:rPr>
-        <w:t xml:space="preserve">) et </w:t>
+        <w:t xml:space="preserve"> : Utilisation de pandas pour la manipulation d'index temporels et </w:t>
       </w:r>
       <w:proofErr w:type="spellStart"/>
       <w:r>
@@ -6765,36 +6693,11 @@
           <w:kern w:val="0"/>
           <w:sz w:val="20"/>
           <w:szCs w:val="20"/>
+          <w:highlight w:val="yellow"/>
           <w:lang w:eastAsia="fr-FR"/>
           <w14:ligatures w14:val="none"/>
         </w:rPr>
         <w:t>Module 2 : Stationnarité et Outils Mathématiques</w:t>
-      </w:r>
-    </w:p>
-    <w:p>
-      <w:pPr>
-        <w:spacing w:after="0" w:line="240" w:lineRule="auto"/>
-        <w:rPr>
-          <w:rFonts w:eastAsia="Times New Roman" w:cstheme="minorHAnsi"/>
-          <w:kern w:val="0"/>
-          <w:sz w:val="20"/>
-          <w:szCs w:val="20"/>
-          <w:lang w:eastAsia="fr-FR"/>
-          <w14:ligatures w14:val="none"/>
-        </w:rPr>
-      </w:pPr>
-      <w:r>
-        <w:rPr>
-          <w:rFonts w:eastAsia="Times New Roman" w:cstheme="minorHAnsi"/>
-          <w:i/>
-          <w:iCs/>
-          <w:kern w:val="0"/>
-          <w:sz w:val="20"/>
-          <w:szCs w:val="20"/>
-          <w:lang w:eastAsia="fr-FR"/>
-          <w14:ligatures w14:val="none"/>
-        </w:rPr>
-        <w:t>Objectif : Maîtriser le concept clé qui permet d'appliquer la plupart des modèles statistiques.</w:t>
       </w:r>
     </w:p>
     <w:p>
@@ -15226,6 +15129,7 @@
   <w:style w:type="character" w:default="1" w:styleId="Policepardfaut">
     <w:name w:val="Default Paragraph Font"/>
     <w:uiPriority w:val="1"/>
+    <w:semiHidden/>
     <w:unhideWhenUsed/>
   </w:style>
   <w:style w:type="table" w:default="1" w:styleId="TableauNormal">

</xml_diff>

<commit_message>
Le lissage exponentielle et les méthodes rapides
</commit_message>
<xml_diff>
--- a/Plan.docx
+++ b/Plan.docx
@@ -57,35 +57,7 @@
           <w:lang w:eastAsia="fr-FR"/>
           <w14:ligatures w14:val="none"/>
         </w:rPr>
-        <w:t>Days 1–</w:t>
-      </w:r>
-      <w:proofErr w:type="gramStart"/>
-      <w:r>
-        <w:rPr>
-          <w:rFonts w:ascii="Times New Roman" w:eastAsia="Times New Roman" w:hAnsi="Times New Roman" w:cs="Times New Roman"/>
-          <w:b/>
-          <w:bCs/>
-          <w:kern w:val="0"/>
-          <w:sz w:val="27"/>
-          <w:szCs w:val="27"/>
-          <w:lang w:eastAsia="fr-FR"/>
-          <w14:ligatures w14:val="none"/>
-        </w:rPr>
-        <w:t>5:</w:t>
-      </w:r>
-      <w:proofErr w:type="gramEnd"/>
-      <w:r>
-        <w:rPr>
-          <w:rFonts w:ascii="Times New Roman" w:eastAsia="Times New Roman" w:hAnsi="Times New Roman" w:cs="Times New Roman"/>
-          <w:b/>
-          <w:bCs/>
-          <w:kern w:val="0"/>
-          <w:sz w:val="27"/>
-          <w:szCs w:val="27"/>
-          <w:lang w:eastAsia="fr-FR"/>
-          <w14:ligatures w14:val="none"/>
-        </w:rPr>
-        <w:t xml:space="preserve"> Python for Data Science</w:t>
+        <w:t>Days 1–5: Python for Data Science</w:t>
       </w:r>
     </w:p>
     <w:p>
@@ -145,100 +117,8 @@
           <w:lang w:eastAsia="fr-FR"/>
           <w14:ligatures w14:val="none"/>
         </w:rPr>
-        <w:t xml:space="preserve">Day </w:t>
-      </w:r>
-      <w:proofErr w:type="gramStart"/>
-      <w:r>
-        <w:rPr>
-          <w:rFonts w:ascii="Times New Roman" w:eastAsia="Times New Roman" w:hAnsi="Times New Roman" w:cs="Times New Roman"/>
-          <w:kern w:val="0"/>
-          <w:sz w:val="24"/>
-          <w:szCs w:val="24"/>
-          <w:highlight w:val="yellow"/>
-          <w:lang w:eastAsia="fr-FR"/>
-          <w14:ligatures w14:val="none"/>
-        </w:rPr>
-        <w:t>2:</w:t>
-      </w:r>
-      <w:proofErr w:type="gramEnd"/>
-      <w:r>
-        <w:rPr>
-          <w:rFonts w:ascii="Times New Roman" w:eastAsia="Times New Roman" w:hAnsi="Times New Roman" w:cs="Times New Roman"/>
-          <w:kern w:val="0"/>
-          <w:sz w:val="24"/>
-          <w:szCs w:val="24"/>
-          <w:highlight w:val="yellow"/>
-          <w:lang w:eastAsia="fr-FR"/>
-          <w14:ligatures w14:val="none"/>
-        </w:rPr>
-        <w:t xml:space="preserve"> </w:t>
-      </w:r>
-      <w:proofErr w:type="spellStart"/>
-      <w:r>
-        <w:rPr>
-          <w:rFonts w:ascii="Times New Roman" w:eastAsia="Times New Roman" w:hAnsi="Times New Roman" w:cs="Times New Roman"/>
-          <w:kern w:val="0"/>
-          <w:sz w:val="24"/>
-          <w:szCs w:val="24"/>
-          <w:highlight w:val="yellow"/>
-          <w:lang w:eastAsia="fr-FR"/>
-          <w14:ligatures w14:val="none"/>
-        </w:rPr>
-        <w:t>Lists</w:t>
-      </w:r>
-      <w:proofErr w:type="spellEnd"/>
-      <w:r>
-        <w:rPr>
-          <w:rFonts w:ascii="Times New Roman" w:eastAsia="Times New Roman" w:hAnsi="Times New Roman" w:cs="Times New Roman"/>
-          <w:kern w:val="0"/>
-          <w:sz w:val="24"/>
-          <w:szCs w:val="24"/>
-          <w:highlight w:val="yellow"/>
-          <w:lang w:eastAsia="fr-FR"/>
-          <w14:ligatures w14:val="none"/>
-        </w:rPr>
-        <w:t xml:space="preserve">, </w:t>
-      </w:r>
-      <w:proofErr w:type="spellStart"/>
-      <w:r>
-        <w:rPr>
-          <w:rFonts w:ascii="Times New Roman" w:eastAsia="Times New Roman" w:hAnsi="Times New Roman" w:cs="Times New Roman"/>
-          <w:kern w:val="0"/>
-          <w:sz w:val="24"/>
-          <w:szCs w:val="24"/>
-          <w:highlight w:val="yellow"/>
-          <w:lang w:eastAsia="fr-FR"/>
-          <w14:ligatures w14:val="none"/>
-        </w:rPr>
-        <w:t>dictionaries</w:t>
-      </w:r>
-      <w:proofErr w:type="spellEnd"/>
-      <w:r>
-        <w:rPr>
-          <w:rFonts w:ascii="Times New Roman" w:eastAsia="Times New Roman" w:hAnsi="Times New Roman" w:cs="Times New Roman"/>
-          <w:kern w:val="0"/>
-          <w:sz w:val="24"/>
-          <w:szCs w:val="24"/>
-          <w:highlight w:val="yellow"/>
-          <w:lang w:eastAsia="fr-FR"/>
-          <w14:ligatures w14:val="none"/>
-        </w:rPr>
-        <w:t xml:space="preserve">, sets, tuples – practice </w:t>
-      </w:r>
-      <w:proofErr w:type="spellStart"/>
-      <w:r>
-        <w:rPr>
-          <w:rFonts w:ascii="Times New Roman" w:eastAsia="Times New Roman" w:hAnsi="Times New Roman" w:cs="Times New Roman"/>
-          <w:kern w:val="0"/>
-          <w:sz w:val="24"/>
-          <w:szCs w:val="24"/>
-          <w:highlight w:val="yellow"/>
-          <w:lang w:eastAsia="fr-FR"/>
-          <w14:ligatures w14:val="none"/>
-        </w:rPr>
-        <w:t>exercises</w:t>
-      </w:r>
-      <w:proofErr w:type="spellEnd"/>
+        <w:t>Day 2: Lists, dictionaries, sets, tuples – practice exercises</w:t>
+      </w:r>
     </w:p>
     <w:p>
       <w:pPr>
@@ -297,33 +177,7 @@
           <w:lang w:val="en-US" w:eastAsia="fr-FR"/>
           <w14:ligatures w14:val="none"/>
         </w:rPr>
-        <w:t xml:space="preserve">Day 4: File handling, modules, intro to </w:t>
-      </w:r>
-      <w:proofErr w:type="spellStart"/>
-      <w:r>
-        <w:rPr>
-          <w:rFonts w:ascii="Times New Roman" w:eastAsia="Times New Roman" w:hAnsi="Times New Roman" w:cs="Times New Roman"/>
-          <w:kern w:val="0"/>
-          <w:sz w:val="24"/>
-          <w:szCs w:val="24"/>
-          <w:highlight w:val="yellow"/>
-          <w:lang w:val="en-US" w:eastAsia="fr-FR"/>
-          <w14:ligatures w14:val="none"/>
-        </w:rPr>
-        <w:t>Jupyter</w:t>
-      </w:r>
-      <w:proofErr w:type="spellEnd"/>
-      <w:r>
-        <w:rPr>
-          <w:rFonts w:ascii="Times New Roman" w:eastAsia="Times New Roman" w:hAnsi="Times New Roman" w:cs="Times New Roman"/>
-          <w:kern w:val="0"/>
-          <w:sz w:val="24"/>
-          <w:szCs w:val="24"/>
-          <w:highlight w:val="yellow"/>
-          <w:lang w:val="en-US" w:eastAsia="fr-FR"/>
-          <w14:ligatures w14:val="none"/>
-        </w:rPr>
-        <w:t xml:space="preserve"> Notebook</w:t>
+        <w:t>Day 4: File handling, modules, intro to Jupyter Notebook</w:t>
       </w:r>
     </w:p>
     <w:p>
@@ -382,63 +236,7 @@
           <w:lang w:eastAsia="fr-FR"/>
           <w14:ligatures w14:val="none"/>
         </w:rPr>
-        <w:t>Days 6–</w:t>
-      </w:r>
-      <w:proofErr w:type="gramStart"/>
-      <w:r>
-        <w:rPr>
-          <w:rFonts w:ascii="Times New Roman" w:eastAsia="Times New Roman" w:hAnsi="Times New Roman" w:cs="Times New Roman"/>
-          <w:b/>
-          <w:bCs/>
-          <w:kern w:val="0"/>
-          <w:sz w:val="27"/>
-          <w:szCs w:val="27"/>
-          <w:lang w:eastAsia="fr-FR"/>
-          <w14:ligatures w14:val="none"/>
-        </w:rPr>
-        <w:t>10:</w:t>
-      </w:r>
-      <w:proofErr w:type="gramEnd"/>
-      <w:r>
-        <w:rPr>
-          <w:rFonts w:ascii="Times New Roman" w:eastAsia="Times New Roman" w:hAnsi="Times New Roman" w:cs="Times New Roman"/>
-          <w:b/>
-          <w:bCs/>
-          <w:kern w:val="0"/>
-          <w:sz w:val="27"/>
-          <w:szCs w:val="27"/>
-          <w:lang w:eastAsia="fr-FR"/>
-          <w14:ligatures w14:val="none"/>
-        </w:rPr>
-        <w:t xml:space="preserve"> </w:t>
-      </w:r>
-      <w:proofErr w:type="spellStart"/>
-      <w:r>
-        <w:rPr>
-          <w:rFonts w:ascii="Times New Roman" w:eastAsia="Times New Roman" w:hAnsi="Times New Roman" w:cs="Times New Roman"/>
-          <w:b/>
-          <w:bCs/>
-          <w:kern w:val="0"/>
-          <w:sz w:val="27"/>
-          <w:szCs w:val="27"/>
-          <w:lang w:eastAsia="fr-FR"/>
-          <w14:ligatures w14:val="none"/>
-        </w:rPr>
-        <w:t>Numpy</w:t>
-      </w:r>
-      <w:proofErr w:type="spellEnd"/>
-      <w:r>
-        <w:rPr>
-          <w:rFonts w:ascii="Times New Roman" w:eastAsia="Times New Roman" w:hAnsi="Times New Roman" w:cs="Times New Roman"/>
-          <w:b/>
-          <w:bCs/>
-          <w:kern w:val="0"/>
-          <w:sz w:val="27"/>
-          <w:szCs w:val="27"/>
-          <w:lang w:eastAsia="fr-FR"/>
-          <w14:ligatures w14:val="none"/>
-        </w:rPr>
-        <w:t xml:space="preserve"> &amp; Pandas</w:t>
+        <w:t>Days 6–10: Numpy &amp; Pandas</w:t>
       </w:r>
     </w:p>
     <w:p>
@@ -468,111 +266,7 @@
           <w:lang w:eastAsia="fr-FR"/>
           <w14:ligatures w14:val="none"/>
         </w:rPr>
-        <w:t xml:space="preserve">Day </w:t>
-      </w:r>
-      <w:proofErr w:type="gramStart"/>
-      <w:r>
-        <w:rPr>
-          <w:rFonts w:ascii="Times New Roman" w:eastAsia="Times New Roman" w:hAnsi="Times New Roman" w:cs="Times New Roman"/>
-          <w:kern w:val="0"/>
-          <w:sz w:val="24"/>
-          <w:szCs w:val="24"/>
-          <w:highlight w:val="yellow"/>
-          <w:lang w:eastAsia="fr-FR"/>
-          <w14:ligatures w14:val="none"/>
-        </w:rPr>
-        <w:t>6:</w:t>
-      </w:r>
-      <w:proofErr w:type="gramEnd"/>
-      <w:r>
-        <w:rPr>
-          <w:rFonts w:ascii="Times New Roman" w:eastAsia="Times New Roman" w:hAnsi="Times New Roman" w:cs="Times New Roman"/>
-          <w:kern w:val="0"/>
-          <w:sz w:val="24"/>
-          <w:szCs w:val="24"/>
-          <w:highlight w:val="yellow"/>
-          <w:lang w:eastAsia="fr-FR"/>
-          <w14:ligatures w14:val="none"/>
-        </w:rPr>
-        <w:t xml:space="preserve"> </w:t>
-      </w:r>
-      <w:proofErr w:type="spellStart"/>
-      <w:r>
-        <w:rPr>
-          <w:rFonts w:ascii="Times New Roman" w:eastAsia="Times New Roman" w:hAnsi="Times New Roman" w:cs="Times New Roman"/>
-          <w:kern w:val="0"/>
-          <w:sz w:val="24"/>
-          <w:szCs w:val="24"/>
-          <w:highlight w:val="yellow"/>
-          <w:lang w:eastAsia="fr-FR"/>
-          <w14:ligatures w14:val="none"/>
-        </w:rPr>
-        <w:t>NumPy</w:t>
-      </w:r>
-      <w:proofErr w:type="spellEnd"/>
-      <w:r>
-        <w:rPr>
-          <w:rFonts w:ascii="Times New Roman" w:eastAsia="Times New Roman" w:hAnsi="Times New Roman" w:cs="Times New Roman"/>
-          <w:kern w:val="0"/>
-          <w:sz w:val="24"/>
-          <w:szCs w:val="24"/>
-          <w:highlight w:val="yellow"/>
-          <w:lang w:eastAsia="fr-FR"/>
-          <w14:ligatures w14:val="none"/>
-        </w:rPr>
-        <w:t xml:space="preserve"> </w:t>
-      </w:r>
-      <w:proofErr w:type="spellStart"/>
-      <w:r>
-        <w:rPr>
-          <w:rFonts w:ascii="Times New Roman" w:eastAsia="Times New Roman" w:hAnsi="Times New Roman" w:cs="Times New Roman"/>
-          <w:kern w:val="0"/>
-          <w:sz w:val="24"/>
-          <w:szCs w:val="24"/>
-          <w:highlight w:val="yellow"/>
-          <w:lang w:eastAsia="fr-FR"/>
-          <w14:ligatures w14:val="none"/>
-        </w:rPr>
-        <w:t>arrays</w:t>
-      </w:r>
-      <w:proofErr w:type="spellEnd"/>
-      <w:r>
-        <w:rPr>
-          <w:rFonts w:ascii="Times New Roman" w:eastAsia="Times New Roman" w:hAnsi="Times New Roman" w:cs="Times New Roman"/>
-          <w:kern w:val="0"/>
-          <w:sz w:val="24"/>
-          <w:szCs w:val="24"/>
-          <w:highlight w:val="yellow"/>
-          <w:lang w:eastAsia="fr-FR"/>
-          <w14:ligatures w14:val="none"/>
-        </w:rPr>
-        <w:t xml:space="preserve">, </w:t>
-      </w:r>
-      <w:proofErr w:type="spellStart"/>
-      <w:r>
-        <w:rPr>
-          <w:rFonts w:ascii="Times New Roman" w:eastAsia="Times New Roman" w:hAnsi="Times New Roman" w:cs="Times New Roman"/>
-          <w:kern w:val="0"/>
-          <w:sz w:val="24"/>
-          <w:szCs w:val="24"/>
-          <w:highlight w:val="yellow"/>
-          <w:lang w:eastAsia="fr-FR"/>
-          <w14:ligatures w14:val="none"/>
-        </w:rPr>
-        <w:t>operations</w:t>
-      </w:r>
-      <w:proofErr w:type="spellEnd"/>
-      <w:r>
-        <w:rPr>
-          <w:rFonts w:ascii="Times New Roman" w:eastAsia="Times New Roman" w:hAnsi="Times New Roman" w:cs="Times New Roman"/>
-          <w:kern w:val="0"/>
-          <w:sz w:val="24"/>
-          <w:szCs w:val="24"/>
-          <w:highlight w:val="yellow"/>
-          <w:lang w:eastAsia="fr-FR"/>
-          <w14:ligatures w14:val="none"/>
-        </w:rPr>
-        <w:t>, broadcasting</w:t>
+        <w:t>Day 6: NumPy arrays, operations, broadcasting</w:t>
       </w:r>
     </w:p>
     <w:p>
@@ -637,66 +331,8 @@
           <w:lang w:val="en-US" w:eastAsia="fr-FR"/>
           <w14:ligatures w14:val="none"/>
         </w:rPr>
-        <w:t xml:space="preserve">+ </w:t>
-      </w:r>
-      <w:proofErr w:type="spellStart"/>
-      <w:r>
-        <w:rPr>
-          <w:rFonts w:ascii="Times New Roman" w:eastAsia="Times New Roman" w:hAnsi="Times New Roman" w:cs="Times New Roman"/>
-          <w:b/>
-          <w:bCs/>
-          <w:i/>
-          <w:iCs/>
-          <w:color w:val="EE0000"/>
-          <w:kern w:val="0"/>
-          <w:sz w:val="32"/>
-          <w:szCs w:val="32"/>
-          <w:highlight w:val="yellow"/>
-          <w:u w:val="single"/>
-          <w:lang w:val="en-US" w:eastAsia="fr-FR"/>
-          <w14:ligatures w14:val="none"/>
-        </w:rPr>
-        <w:t>Practise</w:t>
-      </w:r>
-      <w:proofErr w:type="spellEnd"/>
-      <w:r>
-        <w:rPr>
-          <w:rFonts w:ascii="Times New Roman" w:eastAsia="Times New Roman" w:hAnsi="Times New Roman" w:cs="Times New Roman"/>
-          <w:b/>
-          <w:bCs/>
-          <w:i/>
-          <w:iCs/>
-          <w:color w:val="EE0000"/>
-          <w:kern w:val="0"/>
-          <w:sz w:val="32"/>
-          <w:szCs w:val="32"/>
-          <w:highlight w:val="yellow"/>
-          <w:u w:val="single"/>
-          <w:lang w:val="en-US" w:eastAsia="fr-FR"/>
-          <w14:ligatures w14:val="none"/>
-        </w:rPr>
-        <w:t xml:space="preserve"> mini project of </w:t>
-      </w:r>
-      <w:proofErr w:type="spellStart"/>
-      <w:r>
-        <w:rPr>
-          <w:rFonts w:ascii="Times New Roman" w:eastAsia="Times New Roman" w:hAnsi="Times New Roman" w:cs="Times New Roman"/>
-          <w:b/>
-          <w:bCs/>
-          <w:i/>
-          <w:iCs/>
-          <w:color w:val="EE0000"/>
-          <w:kern w:val="0"/>
-          <w:sz w:val="32"/>
-          <w:szCs w:val="32"/>
-          <w:highlight w:val="yellow"/>
-          <w:u w:val="single"/>
-          <w:lang w:val="en-US" w:eastAsia="fr-FR"/>
-          <w14:ligatures w14:val="none"/>
-        </w:rPr>
-        <w:t>numpy</w:t>
-      </w:r>
-      <w:proofErr w:type="spellEnd"/>
+        <w:t>+ Practise mini project of numpy</w:t>
+      </w:r>
     </w:p>
     <w:p>
       <w:pPr>
@@ -725,33 +361,7 @@
           <w:lang w:val="en-US" w:eastAsia="fr-FR"/>
           <w14:ligatures w14:val="none"/>
         </w:rPr>
-        <w:t xml:space="preserve">Day 8: Pandas </w:t>
-      </w:r>
-      <w:proofErr w:type="spellStart"/>
-      <w:r>
-        <w:rPr>
-          <w:rFonts w:ascii="Times New Roman" w:eastAsia="Times New Roman" w:hAnsi="Times New Roman" w:cs="Times New Roman"/>
-          <w:kern w:val="0"/>
-          <w:sz w:val="24"/>
-          <w:szCs w:val="24"/>
-          <w:highlight w:val="yellow"/>
-          <w:lang w:val="en-US" w:eastAsia="fr-FR"/>
-          <w14:ligatures w14:val="none"/>
-        </w:rPr>
-        <w:t>DataFrames</w:t>
-      </w:r>
-      <w:proofErr w:type="spellEnd"/>
-      <w:r>
-        <w:rPr>
-          <w:rFonts w:ascii="Times New Roman" w:eastAsia="Times New Roman" w:hAnsi="Times New Roman" w:cs="Times New Roman"/>
-          <w:kern w:val="0"/>
-          <w:sz w:val="24"/>
-          <w:szCs w:val="24"/>
-          <w:highlight w:val="yellow"/>
-          <w:lang w:val="en-US" w:eastAsia="fr-FR"/>
-          <w14:ligatures w14:val="none"/>
-        </w:rPr>
-        <w:t xml:space="preserve"> – loading CSV, inspecting data</w:t>
+        <w:t>Day 8: Pandas DataFrames – loading CSV, inspecting data</w:t>
       </w:r>
     </w:p>
     <w:p>
@@ -948,22 +558,8 @@
           <w:lang w:val="en-US" w:eastAsia="fr-FR"/>
           <w14:ligatures w14:val="none"/>
         </w:rPr>
-        <w:t xml:space="preserve">, </w:t>
-      </w:r>
-      <w:proofErr w:type="spellStart"/>
-      <w:r>
-        <w:rPr>
-          <w:rFonts w:ascii="Times New Roman" w:eastAsia="Times New Roman" w:hAnsi="Times New Roman" w:cs="Times New Roman"/>
-          <w:kern w:val="0"/>
-          <w:sz w:val="24"/>
-          <w:szCs w:val="24"/>
-          <w:highlight w:val="yellow"/>
-          <w:lang w:val="en-US" w:eastAsia="fr-FR"/>
-          <w14:ligatures w14:val="none"/>
-        </w:rPr>
-        <w:t>pca</w:t>
-      </w:r>
-      <w:proofErr w:type="spellEnd"/>
+        <w:t>, pca</w:t>
+      </w:r>
       <w:r>
         <w:rPr>
           <w:rFonts w:ascii="Times New Roman" w:eastAsia="Times New Roman" w:hAnsi="Times New Roman" w:cs="Times New Roman"/>
@@ -1004,48 +600,8 @@
           <w:lang w:eastAsia="fr-FR"/>
           <w14:ligatures w14:val="none"/>
         </w:rPr>
-        <w:t xml:space="preserve">Day </w:t>
-      </w:r>
-      <w:proofErr w:type="gramStart"/>
-      <w:r>
-        <w:rPr>
-          <w:rFonts w:ascii="Times New Roman" w:eastAsia="Times New Roman" w:hAnsi="Times New Roman" w:cs="Times New Roman"/>
-          <w:kern w:val="0"/>
-          <w:sz w:val="24"/>
-          <w:szCs w:val="24"/>
-          <w:highlight w:val="yellow"/>
-          <w:lang w:eastAsia="fr-FR"/>
-          <w14:ligatures w14:val="none"/>
-        </w:rPr>
-        <w:t>13:</w:t>
-      </w:r>
-      <w:proofErr w:type="gramEnd"/>
-      <w:r>
-        <w:rPr>
-          <w:rFonts w:ascii="Times New Roman" w:eastAsia="Times New Roman" w:hAnsi="Times New Roman" w:cs="Times New Roman"/>
-          <w:kern w:val="0"/>
-          <w:sz w:val="24"/>
-          <w:szCs w:val="24"/>
-          <w:highlight w:val="yellow"/>
-          <w:lang w:eastAsia="fr-FR"/>
-          <w14:ligatures w14:val="none"/>
-        </w:rPr>
-        <w:t xml:space="preserve"> Matrices and </w:t>
-      </w:r>
-      <w:proofErr w:type="spellStart"/>
-      <w:r>
-        <w:rPr>
-          <w:rFonts w:ascii="Times New Roman" w:eastAsia="Times New Roman" w:hAnsi="Times New Roman" w:cs="Times New Roman"/>
-          <w:kern w:val="0"/>
-          <w:sz w:val="24"/>
-          <w:szCs w:val="24"/>
-          <w:highlight w:val="yellow"/>
-          <w:lang w:eastAsia="fr-FR"/>
-          <w14:ligatures w14:val="none"/>
-        </w:rPr>
-        <w:t>operations</w:t>
-      </w:r>
-      <w:proofErr w:type="spellEnd"/>
+        <w:t>Day 13: Matrices and operations</w:t>
+      </w:r>
     </w:p>
     <w:p>
       <w:pPr>
@@ -1103,87 +659,8 @@
           <w:lang w:eastAsia="fr-FR"/>
           <w14:ligatures w14:val="none"/>
         </w:rPr>
-        <w:t xml:space="preserve">Day </w:t>
-      </w:r>
-      <w:proofErr w:type="gramStart"/>
-      <w:r>
-        <w:rPr>
-          <w:rFonts w:ascii="Times New Roman" w:eastAsia="Times New Roman" w:hAnsi="Times New Roman" w:cs="Times New Roman"/>
-          <w:kern w:val="0"/>
-          <w:sz w:val="24"/>
-          <w:szCs w:val="24"/>
-          <w:highlight w:val="yellow"/>
-          <w:lang w:eastAsia="fr-FR"/>
-          <w14:ligatures w14:val="none"/>
-        </w:rPr>
-        <w:t>15:</w:t>
-      </w:r>
-      <w:proofErr w:type="gramEnd"/>
-      <w:r>
-        <w:rPr>
-          <w:rFonts w:ascii="Times New Roman" w:eastAsia="Times New Roman" w:hAnsi="Times New Roman" w:cs="Times New Roman"/>
-          <w:kern w:val="0"/>
-          <w:sz w:val="24"/>
-          <w:szCs w:val="24"/>
-          <w:highlight w:val="yellow"/>
-          <w:lang w:eastAsia="fr-FR"/>
-          <w14:ligatures w14:val="none"/>
-        </w:rPr>
-        <w:t xml:space="preserve"> </w:t>
-      </w:r>
-      <w:proofErr w:type="spellStart"/>
-      <w:r>
-        <w:rPr>
-          <w:rFonts w:ascii="Times New Roman" w:eastAsia="Times New Roman" w:hAnsi="Times New Roman" w:cs="Times New Roman"/>
-          <w:kern w:val="0"/>
-          <w:sz w:val="24"/>
-          <w:szCs w:val="24"/>
-          <w:highlight w:val="yellow"/>
-          <w:lang w:eastAsia="fr-FR"/>
-          <w14:ligatures w14:val="none"/>
-        </w:rPr>
-        <w:t>Plotting</w:t>
-      </w:r>
-      <w:proofErr w:type="spellEnd"/>
-      <w:r>
-        <w:rPr>
-          <w:rFonts w:ascii="Times New Roman" w:eastAsia="Times New Roman" w:hAnsi="Times New Roman" w:cs="Times New Roman"/>
-          <w:kern w:val="0"/>
-          <w:sz w:val="24"/>
-          <w:szCs w:val="24"/>
-          <w:highlight w:val="yellow"/>
-          <w:lang w:eastAsia="fr-FR"/>
-          <w14:ligatures w14:val="none"/>
-        </w:rPr>
-        <w:t xml:space="preserve"> </w:t>
-      </w:r>
-      <w:proofErr w:type="spellStart"/>
-      <w:r>
-        <w:rPr>
-          <w:rFonts w:ascii="Times New Roman" w:eastAsia="Times New Roman" w:hAnsi="Times New Roman" w:cs="Times New Roman"/>
-          <w:kern w:val="0"/>
-          <w:sz w:val="24"/>
-          <w:szCs w:val="24"/>
-          <w:highlight w:val="yellow"/>
-          <w:lang w:eastAsia="fr-FR"/>
-          <w14:ligatures w14:val="none"/>
-        </w:rPr>
-        <w:t>with</w:t>
-      </w:r>
-      <w:proofErr w:type="spellEnd"/>
-      <w:r>
-        <w:rPr>
-          <w:rFonts w:ascii="Times New Roman" w:eastAsia="Times New Roman" w:hAnsi="Times New Roman" w:cs="Times New Roman"/>
-          <w:kern w:val="0"/>
-          <w:sz w:val="24"/>
-          <w:szCs w:val="24"/>
-          <w:highlight w:val="yellow"/>
-          <w:lang w:eastAsia="fr-FR"/>
-          <w14:ligatures w14:val="none"/>
-        </w:rPr>
-        <w:t xml:space="preserve"> </w:t>
-      </w:r>
-      <w:proofErr w:type="spellStart"/>
+        <w:t xml:space="preserve">Day 15: Plotting with </w:t>
+      </w:r>
       <w:r>
         <w:rPr>
           <w:rFonts w:ascii="Courier New" w:eastAsia="Times New Roman" w:hAnsi="Courier New" w:cs="Courier New"/>
@@ -1196,7 +673,6 @@
         </w:rPr>
         <w:t>matplotlib</w:t>
       </w:r>
-      <w:proofErr w:type="spellEnd"/>
       <w:r>
         <w:rPr>
           <w:rFonts w:ascii="Times New Roman" w:eastAsia="Times New Roman" w:hAnsi="Times New Roman" w:cs="Times New Roman"/>
@@ -1209,7 +685,6 @@
         </w:rPr>
         <w:t xml:space="preserve"> &amp; </w:t>
       </w:r>
-      <w:proofErr w:type="spellStart"/>
       <w:r>
         <w:rPr>
           <w:rFonts w:ascii="Courier New" w:eastAsia="Times New Roman" w:hAnsi="Courier New" w:cs="Courier New"/>
@@ -1222,7 +697,6 @@
         </w:rPr>
         <w:t>seaborn</w:t>
       </w:r>
-      <w:proofErr w:type="spellEnd"/>
     </w:p>
     <w:p>
       <w:pPr>
@@ -1250,63 +724,7 @@
           <w:lang w:eastAsia="fr-FR"/>
           <w14:ligatures w14:val="none"/>
         </w:rPr>
-        <w:t>Days 16–</w:t>
-      </w:r>
-      <w:proofErr w:type="gramStart"/>
-      <w:r>
-        <w:rPr>
-          <w:rFonts w:ascii="Times New Roman" w:eastAsia="Times New Roman" w:hAnsi="Times New Roman" w:cs="Times New Roman"/>
-          <w:b/>
-          <w:bCs/>
-          <w:kern w:val="0"/>
-          <w:sz w:val="27"/>
-          <w:szCs w:val="27"/>
-          <w:lang w:eastAsia="fr-FR"/>
-          <w14:ligatures w14:val="none"/>
-        </w:rPr>
-        <w:t>20:</w:t>
-      </w:r>
-      <w:proofErr w:type="gramEnd"/>
-      <w:r>
-        <w:rPr>
-          <w:rFonts w:ascii="Times New Roman" w:eastAsia="Times New Roman" w:hAnsi="Times New Roman" w:cs="Times New Roman"/>
-          <w:b/>
-          <w:bCs/>
-          <w:kern w:val="0"/>
-          <w:sz w:val="27"/>
-          <w:szCs w:val="27"/>
-          <w:lang w:eastAsia="fr-FR"/>
-          <w14:ligatures w14:val="none"/>
-        </w:rPr>
-        <w:t xml:space="preserve"> Data </w:t>
-      </w:r>
-      <w:proofErr w:type="spellStart"/>
-      <w:r>
-        <w:rPr>
-          <w:rFonts w:ascii="Times New Roman" w:eastAsia="Times New Roman" w:hAnsi="Times New Roman" w:cs="Times New Roman"/>
-          <w:b/>
-          <w:bCs/>
-          <w:kern w:val="0"/>
-          <w:sz w:val="27"/>
-          <w:szCs w:val="27"/>
-          <w:lang w:eastAsia="fr-FR"/>
-          <w14:ligatures w14:val="none"/>
-        </w:rPr>
-        <w:t>Cleaning</w:t>
-      </w:r>
-      <w:proofErr w:type="spellEnd"/>
-      <w:r>
-        <w:rPr>
-          <w:rFonts w:ascii="Times New Roman" w:eastAsia="Times New Roman" w:hAnsi="Times New Roman" w:cs="Times New Roman"/>
-          <w:b/>
-          <w:bCs/>
-          <w:kern w:val="0"/>
-          <w:sz w:val="27"/>
-          <w:szCs w:val="27"/>
-          <w:lang w:eastAsia="fr-FR"/>
-          <w14:ligatures w14:val="none"/>
-        </w:rPr>
-        <w:t xml:space="preserve"> &amp; EDA</w:t>
+        <w:t>Days 16–20: Data Cleaning &amp; EDA</w:t>
       </w:r>
     </w:p>
     <w:p>
@@ -1425,20 +843,7 @@
           <w:lang w:val="en-US" w:eastAsia="fr-FR"/>
           <w14:ligatures w14:val="none"/>
         </w:rPr>
-        <w:t xml:space="preserve">Day 19: </w:t>
-      </w:r>
-      <w:proofErr w:type="gramStart"/>
-      <w:r>
-        <w:rPr>
-          <w:rFonts w:ascii="Times New Roman" w:eastAsia="Times New Roman" w:hAnsi="Times New Roman" w:cs="Times New Roman"/>
-          <w:kern w:val="0"/>
-          <w:sz w:val="24"/>
-          <w:szCs w:val="24"/>
-          <w:highlight w:val="yellow"/>
-          <w:lang w:val="en-US" w:eastAsia="fr-FR"/>
-          <w14:ligatures w14:val="none"/>
-        </w:rPr>
-        <w:t>Correlation</w:t>
+        <w:t>Day 19: Correlation</w:t>
       </w:r>
       <w:r>
         <w:rPr>
@@ -1452,7 +857,6 @@
         </w:rPr>
         <w:t>(</w:t>
       </w:r>
-      <w:proofErr w:type="gramEnd"/>
       <w:r>
         <w:rPr>
           <w:rFonts w:ascii="Times New Roman" w:eastAsia="Times New Roman" w:hAnsi="Times New Roman" w:cs="Times New Roman"/>
@@ -1536,7 +940,6 @@
         </w:rPr>
         <w:t xml:space="preserve"> </w:t>
       </w:r>
-      <w:proofErr w:type="spellStart"/>
       <w:r>
         <w:rPr>
           <w:rFonts w:ascii="Times New Roman" w:eastAsia="Times New Roman" w:hAnsi="Times New Roman" w:cs="Times New Roman"/>
@@ -1549,7 +952,6 @@
         </w:rPr>
         <w:t>groupby</w:t>
       </w:r>
-      <w:proofErr w:type="spellEnd"/>
     </w:p>
     <w:p>
       <w:pPr>
@@ -1578,9 +980,8 @@
           <w:lang w:val="en-US" w:eastAsia="fr-FR"/>
           <w14:ligatures w14:val="none"/>
         </w:rPr>
-        <w:t xml:space="preserve">Day 20: Mini project: Full EDA on Titanic </w:t>
-      </w:r>
-      <w:proofErr w:type="gramStart"/>
+        <w:t>Day 20: Mini project: Full EDA on Titanic dataset</w:t>
+      </w:r>
       <w:r>
         <w:rPr>
           <w:rFonts w:ascii="Times New Roman" w:eastAsia="Times New Roman" w:hAnsi="Times New Roman" w:cs="Times New Roman"/>
@@ -1591,32 +992,7 @@
           <w:lang w:val="en-US" w:eastAsia="fr-FR"/>
           <w14:ligatures w14:val="none"/>
         </w:rPr>
-        <w:t>dataset</w:t>
-      </w:r>
-      <w:r>
-        <w:rPr>
-          <w:rFonts w:ascii="Times New Roman" w:eastAsia="Times New Roman" w:hAnsi="Times New Roman" w:cs="Times New Roman"/>
-          <w:kern w:val="0"/>
-          <w:sz w:val="24"/>
-          <w:szCs w:val="24"/>
-          <w:highlight w:val="cyan"/>
-          <w:lang w:val="en-US" w:eastAsia="fr-FR"/>
-          <w14:ligatures w14:val="none"/>
-        </w:rPr>
-        <w:t>(</w:t>
-      </w:r>
-      <w:proofErr w:type="gramEnd"/>
-      <w:r>
-        <w:rPr>
-          <w:rFonts w:ascii="Times New Roman" w:eastAsia="Times New Roman" w:hAnsi="Times New Roman" w:cs="Times New Roman"/>
-          <w:kern w:val="0"/>
-          <w:sz w:val="24"/>
-          <w:szCs w:val="24"/>
-          <w:highlight w:val="cyan"/>
-          <w:lang w:val="en-US" w:eastAsia="fr-FR"/>
-          <w14:ligatures w14:val="none"/>
-        </w:rPr>
-        <w:t>done day 18)</w:t>
+        <w:t>(done day 18)</w:t>
       </w:r>
     </w:p>
     <w:p>
@@ -1684,35 +1060,7 @@
           <w:lang w:val="en-US" w:eastAsia="fr-FR"/>
           <w14:ligatures w14:val="none"/>
         </w:rPr>
-        <w:t xml:space="preserve"> Phase </w:t>
-      </w:r>
-      <w:proofErr w:type="gramStart"/>
-      <w:r>
-        <w:rPr>
-          <w:rFonts w:ascii="Times New Roman" w:eastAsia="Times New Roman" w:hAnsi="Times New Roman" w:cs="Times New Roman"/>
-          <w:b/>
-          <w:bCs/>
-          <w:kern w:val="0"/>
-          <w:sz w:val="36"/>
-          <w:szCs w:val="36"/>
-          <w:lang w:val="en-US" w:eastAsia="fr-FR"/>
-          <w14:ligatures w14:val="none"/>
-        </w:rPr>
-        <w:t>2:</w:t>
-      </w:r>
-      <w:proofErr w:type="gramEnd"/>
-      <w:r>
-        <w:rPr>
-          <w:rFonts w:ascii="Times New Roman" w:eastAsia="Times New Roman" w:hAnsi="Times New Roman" w:cs="Times New Roman"/>
-          <w:b/>
-          <w:bCs/>
-          <w:kern w:val="0"/>
-          <w:sz w:val="36"/>
-          <w:szCs w:val="36"/>
-          <w:lang w:val="en-US" w:eastAsia="fr-FR"/>
-          <w14:ligatures w14:val="none"/>
-        </w:rPr>
-        <w:t xml:space="preserve"> Machine Learning Basics (Days 21–50)</w:t>
+        <w:t xml:space="preserve"> Phase 2: Machine Learning Basics (Days 21–50)</w:t>
       </w:r>
     </w:p>
     <w:p>
@@ -1944,6 +1292,7 @@
           <w:lang w:val="en-US" w:eastAsia="fr-FR"/>
           <w14:ligatures w14:val="none"/>
         </w:rPr>
+        <w:lastRenderedPageBreak/>
         <w:t>Days 26–30: Linear Regression</w:t>
       </w:r>
       <w:r>
@@ -3225,9 +2574,8 @@
           <w:lang w:eastAsia="fr-FR"/>
           <w14:ligatures w14:val="none"/>
         </w:rPr>
-        <w:t>Days 31–</w:t>
-      </w:r>
-      <w:proofErr w:type="gramStart"/>
+        <w:t>Days 31–35: Classification – Logistic Regressio</w:t>
+      </w:r>
       <w:r>
         <w:rPr>
           <w:rFonts w:ascii="Times New Roman" w:eastAsia="Times New Roman" w:hAnsi="Times New Roman" w:cs="Times New Roman"/>
@@ -3239,9 +2587,8 @@
           <w:lang w:eastAsia="fr-FR"/>
           <w14:ligatures w14:val="none"/>
         </w:rPr>
-        <w:t>35:</w:t>
-      </w:r>
-      <w:proofErr w:type="gramEnd"/>
+        <w:t xml:space="preserve">n : </w:t>
+      </w:r>
       <w:r>
         <w:rPr>
           <w:rFonts w:ascii="Times New Roman" w:eastAsia="Times New Roman" w:hAnsi="Times New Roman" w:cs="Times New Roman"/>
@@ -3253,9 +2600,8 @@
           <w:lang w:eastAsia="fr-FR"/>
           <w14:ligatures w14:val="none"/>
         </w:rPr>
-        <w:t xml:space="preserve"> Classification – </w:t>
-      </w:r>
-      <w:proofErr w:type="spellStart"/>
+        <w:t>Binaire, multicla</w:t>
+      </w:r>
       <w:r>
         <w:rPr>
           <w:rFonts w:ascii="Times New Roman" w:eastAsia="Times New Roman" w:hAnsi="Times New Roman" w:cs="Times New Roman"/>
@@ -3267,104 +2613,8 @@
           <w:lang w:eastAsia="fr-FR"/>
           <w14:ligatures w14:val="none"/>
         </w:rPr>
-        <w:t>Logistic</w:t>
-      </w:r>
-      <w:proofErr w:type="spellEnd"/>
-      <w:r>
-        <w:rPr>
-          <w:rFonts w:ascii="Times New Roman" w:eastAsia="Times New Roman" w:hAnsi="Times New Roman" w:cs="Times New Roman"/>
-          <w:b/>
-          <w:bCs/>
-          <w:kern w:val="0"/>
-          <w:sz w:val="27"/>
-          <w:szCs w:val="27"/>
-          <w:lang w:eastAsia="fr-FR"/>
-          <w14:ligatures w14:val="none"/>
-        </w:rPr>
-        <w:t xml:space="preserve"> </w:t>
-      </w:r>
-      <w:proofErr w:type="spellStart"/>
-      <w:r>
-        <w:rPr>
-          <w:rFonts w:ascii="Times New Roman" w:eastAsia="Times New Roman" w:hAnsi="Times New Roman" w:cs="Times New Roman"/>
-          <w:b/>
-          <w:bCs/>
-          <w:kern w:val="0"/>
-          <w:sz w:val="27"/>
-          <w:szCs w:val="27"/>
-          <w:lang w:eastAsia="fr-FR"/>
-          <w14:ligatures w14:val="none"/>
-        </w:rPr>
-        <w:t>Regressio</w:t>
-      </w:r>
-      <w:r>
-        <w:rPr>
-          <w:rFonts w:ascii="Times New Roman" w:eastAsia="Times New Roman" w:hAnsi="Times New Roman" w:cs="Times New Roman"/>
-          <w:b/>
-          <w:bCs/>
-          <w:kern w:val="0"/>
-          <w:sz w:val="27"/>
-          <w:szCs w:val="27"/>
-          <w:lang w:eastAsia="fr-FR"/>
-          <w14:ligatures w14:val="none"/>
-        </w:rPr>
-        <w:t>n</w:t>
-      </w:r>
-      <w:proofErr w:type="spellEnd"/>
-      <w:r>
-        <w:rPr>
-          <w:rFonts w:ascii="Times New Roman" w:eastAsia="Times New Roman" w:hAnsi="Times New Roman" w:cs="Times New Roman"/>
-          <w:b/>
-          <w:bCs/>
-          <w:kern w:val="0"/>
-          <w:sz w:val="27"/>
-          <w:szCs w:val="27"/>
-          <w:lang w:eastAsia="fr-FR"/>
-          <w14:ligatures w14:val="none"/>
-        </w:rPr>
-        <w:t xml:space="preserve"> : </w:t>
-      </w:r>
-      <w:r>
-        <w:rPr>
-          <w:rFonts w:ascii="Times New Roman" w:eastAsia="Times New Roman" w:hAnsi="Times New Roman" w:cs="Times New Roman"/>
-          <w:b/>
-          <w:bCs/>
-          <w:kern w:val="0"/>
-          <w:sz w:val="27"/>
-          <w:szCs w:val="27"/>
-          <w:lang w:eastAsia="fr-FR"/>
-          <w14:ligatures w14:val="none"/>
-        </w:rPr>
-        <w:t>Binaire, multicla</w:t>
-      </w:r>
-      <w:r>
-        <w:rPr>
-          <w:rFonts w:ascii="Times New Roman" w:eastAsia="Times New Roman" w:hAnsi="Times New Roman" w:cs="Times New Roman"/>
-          <w:b/>
-          <w:bCs/>
-          <w:kern w:val="0"/>
-          <w:sz w:val="27"/>
-          <w:szCs w:val="27"/>
-          <w:lang w:eastAsia="fr-FR"/>
-          <w14:ligatures w14:val="none"/>
-        </w:rPr>
-        <w:t xml:space="preserve">sse, </w:t>
-      </w:r>
-      <w:proofErr w:type="spellStart"/>
-      <w:r>
-        <w:rPr>
-          <w:rFonts w:ascii="Times New Roman" w:eastAsia="Times New Roman" w:hAnsi="Times New Roman" w:cs="Times New Roman"/>
-          <w:b/>
-          <w:bCs/>
-          <w:kern w:val="0"/>
-          <w:sz w:val="27"/>
-          <w:szCs w:val="27"/>
-          <w:lang w:eastAsia="fr-FR"/>
-          <w14:ligatures w14:val="none"/>
-        </w:rPr>
-        <w:t>ordianle</w:t>
-      </w:r>
-      <w:proofErr w:type="spellEnd"/>
+        <w:t>sse, ordianle</w:t>
+      </w:r>
     </w:p>
     <w:p>
       <w:pPr>
@@ -3483,74 +2733,8 @@
           <w:lang w:eastAsia="fr-FR"/>
           <w14:ligatures w14:val="none"/>
         </w:rPr>
-        <w:t xml:space="preserve">Day </w:t>
-      </w:r>
-      <w:proofErr w:type="gramStart"/>
-      <w:r>
-        <w:rPr>
-          <w:rFonts w:ascii="Times New Roman" w:eastAsia="Times New Roman" w:hAnsi="Times New Roman" w:cs="Times New Roman"/>
-          <w:kern w:val="0"/>
-          <w:sz w:val="24"/>
-          <w:szCs w:val="24"/>
-          <w:highlight w:val="yellow"/>
-          <w:lang w:eastAsia="fr-FR"/>
-          <w14:ligatures w14:val="none"/>
-        </w:rPr>
-        <w:t>34:</w:t>
-      </w:r>
-      <w:proofErr w:type="gramEnd"/>
-      <w:r>
-        <w:rPr>
-          <w:rFonts w:ascii="Times New Roman" w:eastAsia="Times New Roman" w:hAnsi="Times New Roman" w:cs="Times New Roman"/>
-          <w:kern w:val="0"/>
-          <w:sz w:val="24"/>
-          <w:szCs w:val="24"/>
-          <w:highlight w:val="yellow"/>
-          <w:lang w:eastAsia="fr-FR"/>
-          <w14:ligatures w14:val="none"/>
-        </w:rPr>
-        <w:t xml:space="preserve"> </w:t>
-      </w:r>
-      <w:proofErr w:type="gramStart"/>
-      <w:r>
-        <w:rPr>
-          <w:rFonts w:ascii="Times New Roman" w:eastAsia="Times New Roman" w:hAnsi="Times New Roman" w:cs="Times New Roman"/>
-          <w:kern w:val="0"/>
-          <w:sz w:val="24"/>
-          <w:szCs w:val="24"/>
-          <w:highlight w:val="yellow"/>
-          <w:lang w:eastAsia="fr-FR"/>
-          <w14:ligatures w14:val="none"/>
-        </w:rPr>
-        <w:t>Evaluation:</w:t>
-      </w:r>
-      <w:proofErr w:type="gramEnd"/>
-      <w:r>
-        <w:rPr>
-          <w:rFonts w:ascii="Times New Roman" w:eastAsia="Times New Roman" w:hAnsi="Times New Roman" w:cs="Times New Roman"/>
-          <w:kern w:val="0"/>
-          <w:sz w:val="24"/>
-          <w:szCs w:val="24"/>
-          <w:highlight w:val="yellow"/>
-          <w:lang w:eastAsia="fr-FR"/>
-          <w14:ligatures w14:val="none"/>
-        </w:rPr>
-        <w:t xml:space="preserve"> confusion matrix, ROC </w:t>
-      </w:r>
-      <w:proofErr w:type="spellStart"/>
-      <w:r>
-        <w:rPr>
-          <w:rFonts w:ascii="Times New Roman" w:eastAsia="Times New Roman" w:hAnsi="Times New Roman" w:cs="Times New Roman"/>
-          <w:kern w:val="0"/>
-          <w:sz w:val="24"/>
-          <w:szCs w:val="24"/>
-          <w:highlight w:val="yellow"/>
-          <w:lang w:eastAsia="fr-FR"/>
-          <w14:ligatures w14:val="none"/>
-        </w:rPr>
-        <w:t>curve</w:t>
-      </w:r>
-      <w:proofErr w:type="spellEnd"/>
+        <w:t>Day 34: Evaluation: confusion matrix, ROC curve</w:t>
+      </w:r>
     </w:p>
     <w:p>
       <w:pPr>
@@ -3778,74 +2962,8 @@
           <w:lang w:eastAsia="fr-FR"/>
           <w14:ligatures w14:val="none"/>
         </w:rPr>
-        <w:t xml:space="preserve">Day </w:t>
-      </w:r>
-      <w:proofErr w:type="gramStart"/>
-      <w:r>
-        <w:rPr>
-          <w:rFonts w:ascii="Times New Roman" w:eastAsia="Times New Roman" w:hAnsi="Times New Roman" w:cs="Times New Roman"/>
-          <w:kern w:val="0"/>
-          <w:sz w:val="24"/>
-          <w:szCs w:val="24"/>
-          <w:highlight w:val="yellow"/>
-          <w:lang w:eastAsia="fr-FR"/>
-          <w14:ligatures w14:val="none"/>
-        </w:rPr>
-        <w:t>38:</w:t>
-      </w:r>
-      <w:proofErr w:type="gramEnd"/>
-      <w:r>
-        <w:rPr>
-          <w:rFonts w:ascii="Times New Roman" w:eastAsia="Times New Roman" w:hAnsi="Times New Roman" w:cs="Times New Roman"/>
-          <w:kern w:val="0"/>
-          <w:sz w:val="24"/>
-          <w:szCs w:val="24"/>
-          <w:highlight w:val="yellow"/>
-          <w:lang w:eastAsia="fr-FR"/>
-          <w14:ligatures w14:val="none"/>
-        </w:rPr>
-        <w:t xml:space="preserve"> </w:t>
-      </w:r>
-      <w:proofErr w:type="spellStart"/>
-      <w:r>
-        <w:rPr>
-          <w:rFonts w:ascii="Times New Roman" w:eastAsia="Times New Roman" w:hAnsi="Times New Roman" w:cs="Times New Roman"/>
-          <w:kern w:val="0"/>
-          <w:sz w:val="24"/>
-          <w:szCs w:val="24"/>
-          <w:highlight w:val="yellow"/>
-          <w:lang w:eastAsia="fr-FR"/>
-          <w14:ligatures w14:val="none"/>
-        </w:rPr>
-        <w:t>Overfitting</w:t>
-      </w:r>
-      <w:proofErr w:type="spellEnd"/>
-      <w:r>
-        <w:rPr>
-          <w:rFonts w:ascii="Times New Roman" w:eastAsia="Times New Roman" w:hAnsi="Times New Roman" w:cs="Times New Roman"/>
-          <w:kern w:val="0"/>
-          <w:sz w:val="24"/>
-          <w:szCs w:val="24"/>
-          <w:highlight w:val="yellow"/>
-          <w:lang w:eastAsia="fr-FR"/>
-          <w14:ligatures w14:val="none"/>
-        </w:rPr>
-        <w:t xml:space="preserve"> and </w:t>
-      </w:r>
-      <w:proofErr w:type="spellStart"/>
-      <w:r>
-        <w:rPr>
-          <w:rFonts w:ascii="Times New Roman" w:eastAsia="Times New Roman" w:hAnsi="Times New Roman" w:cs="Times New Roman"/>
-          <w:kern w:val="0"/>
-          <w:sz w:val="24"/>
-          <w:szCs w:val="24"/>
-          <w:highlight w:val="yellow"/>
-          <w:lang w:eastAsia="fr-FR"/>
-          <w14:ligatures w14:val="none"/>
-        </w:rPr>
-        <w:t>pruning</w:t>
-      </w:r>
-      <w:proofErr w:type="spellEnd"/>
+        <w:t>Day 38: Overfitting and pruning</w:t>
+      </w:r>
     </w:p>
     <w:p>
       <w:pPr>
@@ -3874,100 +2992,8 @@
           <w:lang w:eastAsia="fr-FR"/>
           <w14:ligatures w14:val="none"/>
         </w:rPr>
-        <w:t xml:space="preserve">Day </w:t>
-      </w:r>
-      <w:proofErr w:type="gramStart"/>
-      <w:r>
-        <w:rPr>
-          <w:rFonts w:ascii="Times New Roman" w:eastAsia="Times New Roman" w:hAnsi="Times New Roman" w:cs="Times New Roman"/>
-          <w:kern w:val="0"/>
-          <w:sz w:val="24"/>
-          <w:szCs w:val="24"/>
-          <w:highlight w:val="yellow"/>
-          <w:lang w:eastAsia="fr-FR"/>
-          <w14:ligatures w14:val="none"/>
-        </w:rPr>
-        <w:t>39:</w:t>
-      </w:r>
-      <w:proofErr w:type="gramEnd"/>
-      <w:r>
-        <w:rPr>
-          <w:rFonts w:ascii="Times New Roman" w:eastAsia="Times New Roman" w:hAnsi="Times New Roman" w:cs="Times New Roman"/>
-          <w:kern w:val="0"/>
-          <w:sz w:val="24"/>
-          <w:szCs w:val="24"/>
-          <w:highlight w:val="yellow"/>
-          <w:lang w:eastAsia="fr-FR"/>
-          <w14:ligatures w14:val="none"/>
-        </w:rPr>
-        <w:t xml:space="preserve"> </w:t>
-      </w:r>
-      <w:proofErr w:type="spellStart"/>
-      <w:r>
-        <w:rPr>
-          <w:rFonts w:ascii="Times New Roman" w:eastAsia="Times New Roman" w:hAnsi="Times New Roman" w:cs="Times New Roman"/>
-          <w:kern w:val="0"/>
-          <w:sz w:val="24"/>
-          <w:szCs w:val="24"/>
-          <w:highlight w:val="yellow"/>
-          <w:lang w:eastAsia="fr-FR"/>
-          <w14:ligatures w14:val="none"/>
-        </w:rPr>
-        <w:t>Visualizing</w:t>
-      </w:r>
-      <w:proofErr w:type="spellEnd"/>
-      <w:r>
-        <w:rPr>
-          <w:rFonts w:ascii="Times New Roman" w:eastAsia="Times New Roman" w:hAnsi="Times New Roman" w:cs="Times New Roman"/>
-          <w:kern w:val="0"/>
-          <w:sz w:val="24"/>
-          <w:szCs w:val="24"/>
-          <w:highlight w:val="yellow"/>
-          <w:lang w:eastAsia="fr-FR"/>
-          <w14:ligatures w14:val="none"/>
-        </w:rPr>
-        <w:t xml:space="preserve"> </w:t>
-      </w:r>
-      <w:proofErr w:type="spellStart"/>
-      <w:r>
-        <w:rPr>
-          <w:rFonts w:ascii="Times New Roman" w:eastAsia="Times New Roman" w:hAnsi="Times New Roman" w:cs="Times New Roman"/>
-          <w:kern w:val="0"/>
-          <w:sz w:val="24"/>
-          <w:szCs w:val="24"/>
-          <w:highlight w:val="yellow"/>
-          <w:lang w:eastAsia="fr-FR"/>
-          <w14:ligatures w14:val="none"/>
-        </w:rPr>
-        <w:t>decision</w:t>
-      </w:r>
-      <w:proofErr w:type="spellEnd"/>
-      <w:r>
-        <w:rPr>
-          <w:rFonts w:ascii="Times New Roman" w:eastAsia="Times New Roman" w:hAnsi="Times New Roman" w:cs="Times New Roman"/>
-          <w:kern w:val="0"/>
-          <w:sz w:val="24"/>
-          <w:szCs w:val="24"/>
-          <w:highlight w:val="yellow"/>
-          <w:lang w:eastAsia="fr-FR"/>
-          <w14:ligatures w14:val="none"/>
-        </w:rPr>
-        <w:t xml:space="preserve"> </w:t>
-      </w:r>
-      <w:proofErr w:type="spellStart"/>
-      <w:r>
-        <w:rPr>
-          <w:rFonts w:ascii="Times New Roman" w:eastAsia="Times New Roman" w:hAnsi="Times New Roman" w:cs="Times New Roman"/>
-          <w:kern w:val="0"/>
-          <w:sz w:val="24"/>
-          <w:szCs w:val="24"/>
-          <w:highlight w:val="yellow"/>
-          <w:lang w:eastAsia="fr-FR"/>
-          <w14:ligatures w14:val="none"/>
-        </w:rPr>
-        <w:t>trees</w:t>
-      </w:r>
-      <w:proofErr w:type="spellEnd"/>
+        <w:t>Day 39: Visualizing decision trees</w:t>
+      </w:r>
     </w:p>
     <w:p>
       <w:pPr>
@@ -4037,35 +3063,7 @@
           <w:lang w:eastAsia="fr-FR"/>
           <w14:ligatures w14:val="none"/>
         </w:rPr>
-        <w:t>Days 41–</w:t>
-      </w:r>
-      <w:proofErr w:type="gramStart"/>
-      <w:r>
-        <w:rPr>
-          <w:rFonts w:ascii="Times New Roman" w:eastAsia="Times New Roman" w:hAnsi="Times New Roman" w:cs="Times New Roman"/>
-          <w:b/>
-          <w:bCs/>
-          <w:kern w:val="0"/>
-          <w:sz w:val="27"/>
-          <w:szCs w:val="27"/>
-          <w:lang w:eastAsia="fr-FR"/>
-          <w14:ligatures w14:val="none"/>
-        </w:rPr>
-        <w:t>45:</w:t>
-      </w:r>
-      <w:proofErr w:type="gramEnd"/>
-      <w:r>
-        <w:rPr>
-          <w:rFonts w:ascii="Times New Roman" w:eastAsia="Times New Roman" w:hAnsi="Times New Roman" w:cs="Times New Roman"/>
-          <w:b/>
-          <w:bCs/>
-          <w:kern w:val="0"/>
-          <w:sz w:val="27"/>
-          <w:szCs w:val="27"/>
-          <w:lang w:eastAsia="fr-FR"/>
-          <w14:ligatures w14:val="none"/>
-        </w:rPr>
-        <w:t xml:space="preserve"> Ensemble Methods</w:t>
+        <w:t>Days 41–45: Ensemble Methods</w:t>
       </w:r>
     </w:p>
     <w:p>
@@ -4095,45 +3093,19 @@
           <w:lang w:val="en-US" w:eastAsia="fr-FR"/>
           <w14:ligatures w14:val="none"/>
         </w:rPr>
-        <w:t xml:space="preserve">Day 41: Random Forest – </w:t>
-      </w:r>
-      <w:proofErr w:type="gramStart"/>
-      <w:r>
-        <w:rPr>
-          <w:rFonts w:ascii="Times New Roman" w:eastAsia="Times New Roman" w:hAnsi="Times New Roman" w:cs="Times New Roman"/>
-          <w:kern w:val="0"/>
-          <w:sz w:val="24"/>
-          <w:szCs w:val="24"/>
-          <w:highlight w:val="yellow"/>
-          <w:lang w:val="en-US" w:eastAsia="fr-FR"/>
-          <w14:ligatures w14:val="none"/>
-        </w:rPr>
-        <w:t>theory</w:t>
-      </w:r>
-      <w:r>
-        <w:rPr>
-          <w:rFonts w:ascii="Times New Roman" w:eastAsia="Times New Roman" w:hAnsi="Times New Roman" w:cs="Times New Roman"/>
-          <w:kern w:val="0"/>
-          <w:sz w:val="24"/>
-          <w:szCs w:val="24"/>
-          <w:highlight w:val="yellow"/>
-          <w:lang w:val="en-US" w:eastAsia="fr-FR"/>
-          <w14:ligatures w14:val="none"/>
-        </w:rPr>
-        <w:t>(</w:t>
-      </w:r>
-      <w:proofErr w:type="gramEnd"/>
-      <w:r>
-        <w:rPr>
-          <w:rFonts w:ascii="Times New Roman" w:eastAsia="Times New Roman" w:hAnsi="Times New Roman" w:cs="Times New Roman"/>
-          <w:kern w:val="0"/>
-          <w:sz w:val="24"/>
-          <w:szCs w:val="24"/>
-          <w:highlight w:val="yellow"/>
-          <w:lang w:val="en-US" w:eastAsia="fr-FR"/>
-          <w14:ligatures w14:val="none"/>
-        </w:rPr>
-        <w:t>c</w:t>
+        <w:t>Day 41: Random Forest – theory</w:t>
+      </w:r>
+      <w:r>
+        <w:rPr>
+          <w:rFonts w:ascii="Times New Roman" w:eastAsia="Times New Roman" w:hAnsi="Times New Roman" w:cs="Times New Roman"/>
+          <w:kern w:val="0"/>
+          <w:sz w:val="24"/>
+          <w:szCs w:val="24"/>
+          <w:highlight w:val="yellow"/>
+          <w:lang w:val="en-US" w:eastAsia="fr-FR"/>
+          <w14:ligatures w14:val="none"/>
+        </w:rPr>
+        <w:t>(c</w:t>
       </w:r>
       <w:r>
         <w:rPr>
@@ -4175,22 +3147,8 @@
           <w:lang w:val="en-US" w:eastAsia="fr-FR"/>
           <w14:ligatures w14:val="none"/>
         </w:rPr>
-        <w:t xml:space="preserve">Day 42: Implement Random Forest with </w:t>
-      </w:r>
-      <w:proofErr w:type="spellStart"/>
-      <w:r>
-        <w:rPr>
-          <w:rFonts w:ascii="Times New Roman" w:eastAsia="Times New Roman" w:hAnsi="Times New Roman" w:cs="Times New Roman"/>
-          <w:kern w:val="0"/>
-          <w:sz w:val="24"/>
-          <w:szCs w:val="24"/>
-          <w:highlight w:val="yellow"/>
-          <w:lang w:val="en-US" w:eastAsia="fr-FR"/>
-          <w14:ligatures w14:val="none"/>
-        </w:rPr>
-        <w:t>sklearn</w:t>
-      </w:r>
-      <w:proofErr w:type="spellEnd"/>
+        <w:t>Day 42: Implement Random Forest with sklearn</w:t>
+      </w:r>
     </w:p>
     <w:p>
       <w:pPr>
@@ -4234,33 +3192,7 @@
           <w:lang w:val="en-US" w:eastAsia="fr-FR"/>
           <w14:ligatures w14:val="none"/>
         </w:rPr>
-        <w:t xml:space="preserve">Day 43: Gradient Boosting (intro to </w:t>
-      </w:r>
-      <w:proofErr w:type="spellStart"/>
-      <w:r>
-        <w:rPr>
-          <w:rFonts w:ascii="Times New Roman" w:eastAsia="Times New Roman" w:hAnsi="Times New Roman" w:cs="Times New Roman"/>
-          <w:kern w:val="0"/>
-          <w:sz w:val="24"/>
-          <w:szCs w:val="24"/>
-          <w:highlight w:val="yellow"/>
-          <w:lang w:val="en-US" w:eastAsia="fr-FR"/>
-          <w14:ligatures w14:val="none"/>
-        </w:rPr>
-        <w:t>XGBoost</w:t>
-      </w:r>
-      <w:proofErr w:type="spellEnd"/>
-      <w:r>
-        <w:rPr>
-          <w:rFonts w:ascii="Times New Roman" w:eastAsia="Times New Roman" w:hAnsi="Times New Roman" w:cs="Times New Roman"/>
-          <w:kern w:val="0"/>
-          <w:sz w:val="24"/>
-          <w:szCs w:val="24"/>
-          <w:highlight w:val="yellow"/>
-          <w:lang w:val="en-US" w:eastAsia="fr-FR"/>
-          <w14:ligatures w14:val="none"/>
-        </w:rPr>
-        <w:t>)</w:t>
+        <w:t>Day 43: Gradient Boosting (intro to XGBoost)</w:t>
       </w:r>
     </w:p>
     <w:p>
@@ -4290,59 +3222,7 @@
           <w:lang w:eastAsia="fr-FR"/>
           <w14:ligatures w14:val="none"/>
         </w:rPr>
-        <w:t xml:space="preserve">Day </w:t>
-      </w:r>
-      <w:proofErr w:type="gramStart"/>
-      <w:r>
-        <w:rPr>
-          <w:rFonts w:ascii="Times New Roman" w:eastAsia="Times New Roman" w:hAnsi="Times New Roman" w:cs="Times New Roman"/>
-          <w:kern w:val="0"/>
-          <w:sz w:val="24"/>
-          <w:szCs w:val="24"/>
-          <w:highlight w:val="yellow"/>
-          <w:lang w:eastAsia="fr-FR"/>
-          <w14:ligatures w14:val="none"/>
-        </w:rPr>
-        <w:t>44:</w:t>
-      </w:r>
-      <w:proofErr w:type="gramEnd"/>
-      <w:r>
-        <w:rPr>
-          <w:rFonts w:ascii="Times New Roman" w:eastAsia="Times New Roman" w:hAnsi="Times New Roman" w:cs="Times New Roman"/>
-          <w:kern w:val="0"/>
-          <w:sz w:val="24"/>
-          <w:szCs w:val="24"/>
-          <w:highlight w:val="yellow"/>
-          <w:lang w:eastAsia="fr-FR"/>
-          <w14:ligatures w14:val="none"/>
-        </w:rPr>
-        <w:t xml:space="preserve"> </w:t>
-      </w:r>
-      <w:proofErr w:type="spellStart"/>
-      <w:r>
-        <w:rPr>
-          <w:rFonts w:ascii="Times New Roman" w:eastAsia="Times New Roman" w:hAnsi="Times New Roman" w:cs="Times New Roman"/>
-          <w:kern w:val="0"/>
-          <w:sz w:val="24"/>
-          <w:szCs w:val="24"/>
-          <w:highlight w:val="yellow"/>
-          <w:lang w:eastAsia="fr-FR"/>
-          <w14:ligatures w14:val="none"/>
-        </w:rPr>
-        <w:t>Feature</w:t>
-      </w:r>
-      <w:proofErr w:type="spellEnd"/>
-      <w:r>
-        <w:rPr>
-          <w:rFonts w:ascii="Times New Roman" w:eastAsia="Times New Roman" w:hAnsi="Times New Roman" w:cs="Times New Roman"/>
-          <w:kern w:val="0"/>
-          <w:sz w:val="24"/>
-          <w:szCs w:val="24"/>
-          <w:highlight w:val="yellow"/>
-          <w:lang w:eastAsia="fr-FR"/>
-          <w14:ligatures w14:val="none"/>
-        </w:rPr>
-        <w:t xml:space="preserve"> importance</w:t>
+        <w:t>Day 44: Feature importance</w:t>
       </w:r>
     </w:p>
     <w:p>
@@ -4401,90 +3281,20 @@
           <w:lang w:eastAsia="fr-FR"/>
           <w14:ligatures w14:val="none"/>
         </w:rPr>
-        <w:t>Days 46–</w:t>
-      </w:r>
-      <w:proofErr w:type="gramStart"/>
-      <w:r>
-        <w:rPr>
-          <w:rFonts w:ascii="Times New Roman" w:eastAsia="Times New Roman" w:hAnsi="Times New Roman" w:cs="Times New Roman"/>
-          <w:b/>
-          <w:bCs/>
-          <w:kern w:val="0"/>
-          <w:sz w:val="27"/>
-          <w:szCs w:val="27"/>
-          <w:lang w:eastAsia="fr-FR"/>
-          <w14:ligatures w14:val="none"/>
-        </w:rPr>
-        <w:t>50:</w:t>
-      </w:r>
-      <w:proofErr w:type="gramEnd"/>
-      <w:r>
-        <w:rPr>
-          <w:rFonts w:ascii="Times New Roman" w:eastAsia="Times New Roman" w:hAnsi="Times New Roman" w:cs="Times New Roman"/>
-          <w:b/>
-          <w:bCs/>
-          <w:kern w:val="0"/>
-          <w:sz w:val="27"/>
-          <w:szCs w:val="27"/>
-          <w:lang w:eastAsia="fr-FR"/>
-          <w14:ligatures w14:val="none"/>
-        </w:rPr>
-        <w:t xml:space="preserve"> Model Tuning &amp; Validation</w:t>
-      </w:r>
-    </w:p>
-    <w:p>
-      <w:pPr>
-        <w:rPr>
-          <w:lang w:eastAsia="fr-FR"/>
-        </w:rPr>
-      </w:pPr>
-      <w:r>
-        <w:rPr>
-          <w:lang w:eastAsia="fr-FR"/>
-        </w:rPr>
-        <w:t xml:space="preserve">Model </w:t>
-      </w:r>
-      <w:proofErr w:type="spellStart"/>
-      <w:r>
-        <w:rPr>
-          <w:lang w:eastAsia="fr-FR"/>
-        </w:rPr>
-        <w:t>tunning</w:t>
-      </w:r>
-      <w:proofErr w:type="spellEnd"/>
-      <w:r>
-        <w:rPr>
-          <w:lang w:eastAsia="fr-FR"/>
-        </w:rPr>
-        <w:t xml:space="preserve"> : optimiser les </w:t>
-      </w:r>
-      <w:proofErr w:type="spellStart"/>
-      <w:r>
-        <w:rPr>
-          <w:lang w:eastAsia="fr-FR"/>
-        </w:rPr>
-        <w:t>hyperparametres</w:t>
-      </w:r>
-      <w:proofErr w:type="spellEnd"/>
-      <w:r>
-        <w:rPr>
-          <w:lang w:eastAsia="fr-FR"/>
-        </w:rPr>
-        <w:t xml:space="preserve"> pour améliorer les performances du </w:t>
-      </w:r>
-      <w:proofErr w:type="spellStart"/>
-      <w:r>
-        <w:rPr>
-          <w:lang w:eastAsia="fr-FR"/>
-        </w:rPr>
-        <w:t>modele</w:t>
-      </w:r>
-      <w:proofErr w:type="spellEnd"/>
-      <w:r>
-        <w:rPr>
-          <w:lang w:eastAsia="fr-FR"/>
-        </w:rPr>
-        <w:t>.</w:t>
+        <w:t>Days 46–50: Model Tuning &amp; Validation</w:t>
+      </w:r>
+    </w:p>
+    <w:p>
+      <w:pPr>
+        <w:rPr>
+          <w:lang w:eastAsia="fr-FR"/>
+        </w:rPr>
+      </w:pPr>
+      <w:r>
+        <w:rPr>
+          <w:lang w:eastAsia="fr-FR"/>
+        </w:rPr>
+        <w:t>Model tunning : optimiser les hyperparametres pour améliorer les performances du modele.</w:t>
       </w:r>
     </w:p>
     <w:p>
@@ -4643,7 +3453,6 @@
           <w14:ligatures w14:val="none"/>
         </w:rPr>
       </w:pPr>
-      <w:proofErr w:type="spellStart"/>
       <w:r>
         <w:rPr>
           <w:rFonts w:ascii="Times New Roman" w:eastAsia="Times New Roman" w:hAnsi="Times New Roman" w:cs="Times New Roman"/>
@@ -4656,22 +3465,7 @@
           <w:lang w:val="en-US" w:eastAsia="fr-FR"/>
           <w14:ligatures w14:val="none"/>
         </w:rPr>
-        <w:t>stratisfied</w:t>
-      </w:r>
-      <w:proofErr w:type="spellEnd"/>
-      <w:r>
-        <w:rPr>
-          <w:rFonts w:ascii="Times New Roman" w:eastAsia="Times New Roman" w:hAnsi="Times New Roman" w:cs="Times New Roman"/>
-          <w:b/>
-          <w:bCs/>
-          <w:kern w:val="0"/>
-          <w:sz w:val="24"/>
-          <w:szCs w:val="24"/>
-          <w:highlight w:val="green"/>
-          <w:lang w:val="en-US" w:eastAsia="fr-FR"/>
-          <w14:ligatures w14:val="none"/>
-        </w:rPr>
-        <w:t xml:space="preserve"> k-fold, </w:t>
+        <w:t xml:space="preserve">stratisfied k-fold, </w:t>
       </w:r>
     </w:p>
     <w:p>
@@ -4885,74 +3679,8 @@
           <w:lang w:eastAsia="fr-FR"/>
           <w14:ligatures w14:val="none"/>
         </w:rPr>
-        <w:t xml:space="preserve">Day </w:t>
-      </w:r>
-      <w:proofErr w:type="gramStart"/>
-      <w:r>
-        <w:rPr>
-          <w:rFonts w:ascii="Times New Roman" w:eastAsia="Times New Roman" w:hAnsi="Times New Roman" w:cs="Times New Roman"/>
-          <w:kern w:val="0"/>
-          <w:sz w:val="24"/>
-          <w:szCs w:val="24"/>
-          <w:highlight w:val="yellow"/>
-          <w:lang w:eastAsia="fr-FR"/>
-          <w14:ligatures w14:val="none"/>
-        </w:rPr>
-        <w:t>47:</w:t>
-      </w:r>
-      <w:proofErr w:type="gramEnd"/>
-      <w:r>
-        <w:rPr>
-          <w:rFonts w:ascii="Times New Roman" w:eastAsia="Times New Roman" w:hAnsi="Times New Roman" w:cs="Times New Roman"/>
-          <w:kern w:val="0"/>
-          <w:sz w:val="24"/>
-          <w:szCs w:val="24"/>
-          <w:highlight w:val="yellow"/>
-          <w:lang w:eastAsia="fr-FR"/>
-          <w14:ligatures w14:val="none"/>
-        </w:rPr>
-        <w:t xml:space="preserve"> </w:t>
-      </w:r>
-      <w:proofErr w:type="spellStart"/>
-      <w:r>
-        <w:rPr>
-          <w:rFonts w:ascii="Times New Roman" w:eastAsia="Times New Roman" w:hAnsi="Times New Roman" w:cs="Times New Roman"/>
-          <w:kern w:val="0"/>
-          <w:sz w:val="24"/>
-          <w:szCs w:val="24"/>
-          <w:highlight w:val="yellow"/>
-          <w:lang w:eastAsia="fr-FR"/>
-          <w14:ligatures w14:val="none"/>
-        </w:rPr>
-        <w:t>Grid</w:t>
-      </w:r>
-      <w:proofErr w:type="spellEnd"/>
-      <w:r>
-        <w:rPr>
-          <w:rFonts w:ascii="Times New Roman" w:eastAsia="Times New Roman" w:hAnsi="Times New Roman" w:cs="Times New Roman"/>
-          <w:kern w:val="0"/>
-          <w:sz w:val="24"/>
-          <w:szCs w:val="24"/>
-          <w:highlight w:val="yellow"/>
-          <w:lang w:eastAsia="fr-FR"/>
-          <w14:ligatures w14:val="none"/>
-        </w:rPr>
-        <w:t xml:space="preserve"> Search, </w:t>
-      </w:r>
-      <w:proofErr w:type="spellStart"/>
-      <w:r>
-        <w:rPr>
-          <w:rFonts w:ascii="Times New Roman" w:eastAsia="Times New Roman" w:hAnsi="Times New Roman" w:cs="Times New Roman"/>
-          <w:kern w:val="0"/>
-          <w:sz w:val="24"/>
-          <w:szCs w:val="24"/>
-          <w:highlight w:val="yellow"/>
-          <w:lang w:eastAsia="fr-FR"/>
-          <w14:ligatures w14:val="none"/>
-        </w:rPr>
-        <w:t>RandomizedSearch</w:t>
-      </w:r>
-      <w:proofErr w:type="spellEnd"/>
+        <w:t>Day 47: Grid Search, RandomizedSearch</w:t>
+      </w:r>
     </w:p>
     <w:p>
       <w:pPr>
@@ -4995,7 +3723,6 @@
         </w:rPr>
         <w:t xml:space="preserve">, </w:t>
       </w:r>
-      <w:proofErr w:type="spellStart"/>
       <w:r>
         <w:rPr>
           <w:rFonts w:ascii="Times New Roman" w:eastAsia="Times New Roman" w:hAnsi="Times New Roman" w:cs="Times New Roman"/>
@@ -5008,7 +3735,6 @@
         </w:rPr>
         <w:t>SelectFromModel</w:t>
       </w:r>
-      <w:proofErr w:type="spellEnd"/>
     </w:p>
     <w:p>
       <w:pPr>
@@ -5135,120 +3861,36 @@
           <w:lang w:val="en-US" w:eastAsia="fr-FR"/>
           <w14:ligatures w14:val="none"/>
         </w:rPr>
-        <w:t xml:space="preserve"> Phase </w:t>
-      </w:r>
-      <w:proofErr w:type="gramStart"/>
-      <w:r>
+        <w:t xml:space="preserve"> Phase 3: Intermediate Topics (Days 51–80)</w:t>
+      </w:r>
+    </w:p>
+    <w:p>
+      <w:pPr>
+        <w:spacing w:before="100" w:beforeAutospacing="1" w:after="100" w:afterAutospacing="1" w:line="240" w:lineRule="auto"/>
+        <w:outlineLvl w:val="2"/>
         <w:rPr>
           <w:rFonts w:ascii="Times New Roman" w:eastAsia="Times New Roman" w:hAnsi="Times New Roman" w:cs="Times New Roman"/>
           <w:b/>
           <w:bCs/>
           <w:kern w:val="0"/>
-          <w:sz w:val="36"/>
-          <w:szCs w:val="36"/>
-          <w:lang w:val="en-US" w:eastAsia="fr-FR"/>
-          <w14:ligatures w14:val="none"/>
-        </w:rPr>
-        <w:t>3:</w:t>
-      </w:r>
-      <w:proofErr w:type="gramEnd"/>
+          <w:sz w:val="27"/>
+          <w:szCs w:val="27"/>
+          <w:lang w:eastAsia="fr-FR"/>
+          <w14:ligatures w14:val="none"/>
+        </w:rPr>
+      </w:pPr>
       <w:r>
         <w:rPr>
           <w:rFonts w:ascii="Times New Roman" w:eastAsia="Times New Roman" w:hAnsi="Times New Roman" w:cs="Times New Roman"/>
           <w:b/>
           <w:bCs/>
           <w:kern w:val="0"/>
-          <w:sz w:val="36"/>
-          <w:szCs w:val="36"/>
-          <w:lang w:val="en-US" w:eastAsia="fr-FR"/>
-          <w14:ligatures w14:val="none"/>
-        </w:rPr>
-        <w:t xml:space="preserve"> Intermediate Topics (Days 51–80)</w:t>
-      </w:r>
-    </w:p>
-    <w:p>
-      <w:pPr>
-        <w:spacing w:before="100" w:beforeAutospacing="1" w:after="100" w:afterAutospacing="1" w:line="240" w:lineRule="auto"/>
-        <w:outlineLvl w:val="2"/>
-        <w:rPr>
-          <w:rFonts w:ascii="Times New Roman" w:eastAsia="Times New Roman" w:hAnsi="Times New Roman" w:cs="Times New Roman"/>
-          <w:b/>
-          <w:bCs/>
-          <w:kern w:val="0"/>
           <w:sz w:val="27"/>
           <w:szCs w:val="27"/>
           <w:lang w:eastAsia="fr-FR"/>
           <w14:ligatures w14:val="none"/>
         </w:rPr>
-      </w:pPr>
-      <w:r>
-        <w:rPr>
-          <w:rFonts w:ascii="Times New Roman" w:eastAsia="Times New Roman" w:hAnsi="Times New Roman" w:cs="Times New Roman"/>
-          <w:b/>
-          <w:bCs/>
-          <w:kern w:val="0"/>
-          <w:sz w:val="27"/>
-          <w:szCs w:val="27"/>
-          <w:lang w:eastAsia="fr-FR"/>
-          <w14:ligatures w14:val="none"/>
-        </w:rPr>
-        <w:t>Days 51–</w:t>
-      </w:r>
-      <w:proofErr w:type="gramStart"/>
-      <w:r>
-        <w:rPr>
-          <w:rFonts w:ascii="Times New Roman" w:eastAsia="Times New Roman" w:hAnsi="Times New Roman" w:cs="Times New Roman"/>
-          <w:b/>
-          <w:bCs/>
-          <w:kern w:val="0"/>
-          <w:sz w:val="27"/>
-          <w:szCs w:val="27"/>
-          <w:lang w:eastAsia="fr-FR"/>
-          <w14:ligatures w14:val="none"/>
-        </w:rPr>
-        <w:t>55:</w:t>
-      </w:r>
-      <w:proofErr w:type="gramEnd"/>
-      <w:r>
-        <w:rPr>
-          <w:rFonts w:ascii="Times New Roman" w:eastAsia="Times New Roman" w:hAnsi="Times New Roman" w:cs="Times New Roman"/>
-          <w:b/>
-          <w:bCs/>
-          <w:kern w:val="0"/>
-          <w:sz w:val="27"/>
-          <w:szCs w:val="27"/>
-          <w:lang w:eastAsia="fr-FR"/>
-          <w14:ligatures w14:val="none"/>
-        </w:rPr>
-        <w:t xml:space="preserve"> </w:t>
-      </w:r>
-      <w:proofErr w:type="spellStart"/>
-      <w:r>
-        <w:rPr>
-          <w:rFonts w:ascii="Times New Roman" w:eastAsia="Times New Roman" w:hAnsi="Times New Roman" w:cs="Times New Roman"/>
-          <w:b/>
-          <w:bCs/>
-          <w:kern w:val="0"/>
-          <w:sz w:val="27"/>
-          <w:szCs w:val="27"/>
-          <w:lang w:eastAsia="fr-FR"/>
-          <w14:ligatures w14:val="none"/>
-        </w:rPr>
-        <w:t>Unsupervised</w:t>
-      </w:r>
-      <w:proofErr w:type="spellEnd"/>
-      <w:r>
-        <w:rPr>
-          <w:rFonts w:ascii="Times New Roman" w:eastAsia="Times New Roman" w:hAnsi="Times New Roman" w:cs="Times New Roman"/>
-          <w:b/>
-          <w:bCs/>
-          <w:kern w:val="0"/>
-          <w:sz w:val="27"/>
-          <w:szCs w:val="27"/>
-          <w:lang w:eastAsia="fr-FR"/>
-          <w14:ligatures w14:val="none"/>
-        </w:rPr>
-        <w:t xml:space="preserve"> Learning</w:t>
+        <w:t>Days 51–55: Unsupervised Learning</w:t>
       </w:r>
     </w:p>
     <w:p>
@@ -5304,69 +3946,8 @@
           <w:lang w:eastAsia="fr-FR"/>
           <w14:ligatures w14:val="none"/>
         </w:rPr>
-        <w:t xml:space="preserve">Day </w:t>
-      </w:r>
-      <w:proofErr w:type="gramStart"/>
-      <w:r>
-        <w:rPr>
-          <w:rFonts w:ascii="Times New Roman" w:eastAsia="Times New Roman" w:hAnsi="Times New Roman" w:cs="Times New Roman"/>
-          <w:kern w:val="0"/>
-          <w:sz w:val="24"/>
-          <w:szCs w:val="24"/>
-          <w:lang w:eastAsia="fr-FR"/>
-          <w14:ligatures w14:val="none"/>
-        </w:rPr>
-        <w:t>52:</w:t>
-      </w:r>
-      <w:proofErr w:type="gramEnd"/>
-      <w:r>
-        <w:rPr>
-          <w:rFonts w:ascii="Times New Roman" w:eastAsia="Times New Roman" w:hAnsi="Times New Roman" w:cs="Times New Roman"/>
-          <w:kern w:val="0"/>
-          <w:sz w:val="24"/>
-          <w:szCs w:val="24"/>
-          <w:lang w:eastAsia="fr-FR"/>
-          <w14:ligatures w14:val="none"/>
-        </w:rPr>
-        <w:t xml:space="preserve"> K-</w:t>
-      </w:r>
-      <w:proofErr w:type="spellStart"/>
-      <w:r>
-        <w:rPr>
-          <w:rFonts w:ascii="Times New Roman" w:eastAsia="Times New Roman" w:hAnsi="Times New Roman" w:cs="Times New Roman"/>
-          <w:kern w:val="0"/>
-          <w:sz w:val="24"/>
-          <w:szCs w:val="24"/>
-          <w:lang w:eastAsia="fr-FR"/>
-          <w14:ligatures w14:val="none"/>
-        </w:rPr>
-        <w:t>means</w:t>
-      </w:r>
-      <w:proofErr w:type="spellEnd"/>
-      <w:r>
-        <w:rPr>
-          <w:rFonts w:ascii="Times New Roman" w:eastAsia="Times New Roman" w:hAnsi="Times New Roman" w:cs="Times New Roman"/>
-          <w:kern w:val="0"/>
-          <w:sz w:val="24"/>
-          <w:szCs w:val="24"/>
-          <w:lang w:eastAsia="fr-FR"/>
-          <w14:ligatures w14:val="none"/>
-        </w:rPr>
-        <w:t xml:space="preserve"> </w:t>
-      </w:r>
-      <w:proofErr w:type="spellStart"/>
-      <w:r>
-        <w:rPr>
-          <w:rFonts w:ascii="Times New Roman" w:eastAsia="Times New Roman" w:hAnsi="Times New Roman" w:cs="Times New Roman"/>
-          <w:kern w:val="0"/>
-          <w:sz w:val="24"/>
-          <w:szCs w:val="24"/>
-          <w:lang w:eastAsia="fr-FR"/>
-          <w14:ligatures w14:val="none"/>
-        </w:rPr>
-        <w:t>implementation</w:t>
-      </w:r>
-      <w:proofErr w:type="spellEnd"/>
+        <w:t>Day 52: K-means implementation</w:t>
+      </w:r>
     </w:p>
     <w:p>
       <w:pPr>
@@ -5393,55 +3974,7 @@
           <w:lang w:eastAsia="fr-FR"/>
           <w14:ligatures w14:val="none"/>
         </w:rPr>
-        <w:t xml:space="preserve">Day </w:t>
-      </w:r>
-      <w:proofErr w:type="gramStart"/>
-      <w:r>
-        <w:rPr>
-          <w:rFonts w:ascii="Times New Roman" w:eastAsia="Times New Roman" w:hAnsi="Times New Roman" w:cs="Times New Roman"/>
-          <w:kern w:val="0"/>
-          <w:sz w:val="24"/>
-          <w:szCs w:val="24"/>
-          <w:lang w:eastAsia="fr-FR"/>
-          <w14:ligatures w14:val="none"/>
-        </w:rPr>
-        <w:t>53:</w:t>
-      </w:r>
-      <w:proofErr w:type="gramEnd"/>
-      <w:r>
-        <w:rPr>
-          <w:rFonts w:ascii="Times New Roman" w:eastAsia="Times New Roman" w:hAnsi="Times New Roman" w:cs="Times New Roman"/>
-          <w:kern w:val="0"/>
-          <w:sz w:val="24"/>
-          <w:szCs w:val="24"/>
-          <w:lang w:eastAsia="fr-FR"/>
-          <w14:ligatures w14:val="none"/>
-        </w:rPr>
-        <w:t xml:space="preserve"> DBSCAN and </w:t>
-      </w:r>
-      <w:proofErr w:type="spellStart"/>
-      <w:r>
-        <w:rPr>
-          <w:rFonts w:ascii="Times New Roman" w:eastAsia="Times New Roman" w:hAnsi="Times New Roman" w:cs="Times New Roman"/>
-          <w:kern w:val="0"/>
-          <w:sz w:val="24"/>
-          <w:szCs w:val="24"/>
-          <w:lang w:eastAsia="fr-FR"/>
-          <w14:ligatures w14:val="none"/>
-        </w:rPr>
-        <w:t>hierarchical</w:t>
-      </w:r>
-      <w:proofErr w:type="spellEnd"/>
-      <w:r>
-        <w:rPr>
-          <w:rFonts w:ascii="Times New Roman" w:eastAsia="Times New Roman" w:hAnsi="Times New Roman" w:cs="Times New Roman"/>
-          <w:kern w:val="0"/>
-          <w:sz w:val="24"/>
-          <w:szCs w:val="24"/>
-          <w:lang w:eastAsia="fr-FR"/>
-          <w14:ligatures w14:val="none"/>
-        </w:rPr>
-        <w:t xml:space="preserve"> clustering</w:t>
+        <w:t>Day 53: DBSCAN and hierarchical clustering</w:t>
       </w:r>
     </w:p>
     <w:p>
@@ -5469,79 +4002,7 @@
           <w:lang w:eastAsia="fr-FR"/>
           <w14:ligatures w14:val="none"/>
         </w:rPr>
-        <w:t xml:space="preserve">Day </w:t>
-      </w:r>
-      <w:proofErr w:type="gramStart"/>
-      <w:r>
-        <w:rPr>
-          <w:rFonts w:ascii="Times New Roman" w:eastAsia="Times New Roman" w:hAnsi="Times New Roman" w:cs="Times New Roman"/>
-          <w:kern w:val="0"/>
-          <w:sz w:val="24"/>
-          <w:szCs w:val="24"/>
-          <w:lang w:eastAsia="fr-FR"/>
-          <w14:ligatures w14:val="none"/>
-        </w:rPr>
-        <w:t>54:</w:t>
-      </w:r>
-      <w:proofErr w:type="gramEnd"/>
-      <w:r>
-        <w:rPr>
-          <w:rFonts w:ascii="Times New Roman" w:eastAsia="Times New Roman" w:hAnsi="Times New Roman" w:cs="Times New Roman"/>
-          <w:kern w:val="0"/>
-          <w:sz w:val="24"/>
-          <w:szCs w:val="24"/>
-          <w:lang w:eastAsia="fr-FR"/>
-          <w14:ligatures w14:val="none"/>
-        </w:rPr>
-        <w:t xml:space="preserve"> </w:t>
-      </w:r>
-      <w:proofErr w:type="spellStart"/>
-      <w:r>
-        <w:rPr>
-          <w:rFonts w:ascii="Times New Roman" w:eastAsia="Times New Roman" w:hAnsi="Times New Roman" w:cs="Times New Roman"/>
-          <w:kern w:val="0"/>
-          <w:sz w:val="24"/>
-          <w:szCs w:val="24"/>
-          <w:lang w:eastAsia="fr-FR"/>
-          <w14:ligatures w14:val="none"/>
-        </w:rPr>
-        <w:t>Dimensionality</w:t>
-      </w:r>
-      <w:proofErr w:type="spellEnd"/>
-      <w:r>
-        <w:rPr>
-          <w:rFonts w:ascii="Times New Roman" w:eastAsia="Times New Roman" w:hAnsi="Times New Roman" w:cs="Times New Roman"/>
-          <w:kern w:val="0"/>
-          <w:sz w:val="24"/>
-          <w:szCs w:val="24"/>
-          <w:lang w:eastAsia="fr-FR"/>
-          <w14:ligatures w14:val="none"/>
-        </w:rPr>
-        <w:t xml:space="preserve"> </w:t>
-      </w:r>
-      <w:proofErr w:type="spellStart"/>
-      <w:r>
-        <w:rPr>
-          <w:rFonts w:ascii="Times New Roman" w:eastAsia="Times New Roman" w:hAnsi="Times New Roman" w:cs="Times New Roman"/>
-          <w:kern w:val="0"/>
-          <w:sz w:val="24"/>
-          <w:szCs w:val="24"/>
-          <w:lang w:eastAsia="fr-FR"/>
-          <w14:ligatures w14:val="none"/>
-        </w:rPr>
-        <w:t>reduction</w:t>
-      </w:r>
-      <w:proofErr w:type="spellEnd"/>
-      <w:r>
-        <w:rPr>
-          <w:rFonts w:ascii="Times New Roman" w:eastAsia="Times New Roman" w:hAnsi="Times New Roman" w:cs="Times New Roman"/>
-          <w:kern w:val="0"/>
-          <w:sz w:val="24"/>
-          <w:szCs w:val="24"/>
-          <w:lang w:eastAsia="fr-FR"/>
-          <w14:ligatures w14:val="none"/>
-        </w:rPr>
-        <w:t xml:space="preserve"> (PCA)</w:t>
+        <w:t>Day 54: Dimensionality reduction (PCA)</w:t>
       </w:r>
     </w:p>
     <w:p>
@@ -5620,63 +4081,7 @@
           <w:lang w:eastAsia="fr-FR"/>
           <w14:ligatures w14:val="none"/>
         </w:rPr>
-        <w:t>Days 56–</w:t>
-      </w:r>
-      <w:proofErr w:type="gramStart"/>
-      <w:r>
-        <w:rPr>
-          <w:rFonts w:ascii="Times New Roman" w:eastAsia="Times New Roman" w:hAnsi="Times New Roman" w:cs="Times New Roman"/>
-          <w:b/>
-          <w:bCs/>
-          <w:kern w:val="0"/>
-          <w:sz w:val="27"/>
-          <w:szCs w:val="27"/>
-          <w:lang w:eastAsia="fr-FR"/>
-          <w14:ligatures w14:val="none"/>
-        </w:rPr>
-        <w:t>60:</w:t>
-      </w:r>
-      <w:proofErr w:type="gramEnd"/>
-      <w:r>
-        <w:rPr>
-          <w:rFonts w:ascii="Times New Roman" w:eastAsia="Times New Roman" w:hAnsi="Times New Roman" w:cs="Times New Roman"/>
-          <w:b/>
-          <w:bCs/>
-          <w:kern w:val="0"/>
-          <w:sz w:val="27"/>
-          <w:szCs w:val="27"/>
-          <w:lang w:eastAsia="fr-FR"/>
-          <w14:ligatures w14:val="none"/>
-        </w:rPr>
-        <w:t xml:space="preserve"> </w:t>
-      </w:r>
-      <w:proofErr w:type="spellStart"/>
-      <w:r>
-        <w:rPr>
-          <w:rFonts w:ascii="Times New Roman" w:eastAsia="Times New Roman" w:hAnsi="Times New Roman" w:cs="Times New Roman"/>
-          <w:b/>
-          <w:bCs/>
-          <w:kern w:val="0"/>
-          <w:sz w:val="27"/>
-          <w:szCs w:val="27"/>
-          <w:lang w:eastAsia="fr-FR"/>
-          <w14:ligatures w14:val="none"/>
-        </w:rPr>
-        <w:t>Feature</w:t>
-      </w:r>
-      <w:proofErr w:type="spellEnd"/>
-      <w:r>
-        <w:rPr>
-          <w:rFonts w:ascii="Times New Roman" w:eastAsia="Times New Roman" w:hAnsi="Times New Roman" w:cs="Times New Roman"/>
-          <w:b/>
-          <w:bCs/>
-          <w:kern w:val="0"/>
-          <w:sz w:val="27"/>
-          <w:szCs w:val="27"/>
-          <w:lang w:eastAsia="fr-FR"/>
-          <w14:ligatures w14:val="none"/>
-        </w:rPr>
-        <w:t xml:space="preserve"> Engineering</w:t>
+        <w:t>Days 56–60: Feature Engineering</w:t>
       </w:r>
     </w:p>
     <w:p>
@@ -5766,48 +4171,8 @@
           <w:lang w:eastAsia="fr-FR"/>
           <w14:ligatures w14:val="none"/>
         </w:rPr>
-        <w:t xml:space="preserve">Day </w:t>
-      </w:r>
-      <w:proofErr w:type="gramStart"/>
-      <w:r>
-        <w:rPr>
-          <w:rFonts w:ascii="Times New Roman" w:eastAsia="Times New Roman" w:hAnsi="Times New Roman" w:cs="Times New Roman"/>
-          <w:kern w:val="0"/>
-          <w:sz w:val="24"/>
-          <w:szCs w:val="24"/>
-          <w:highlight w:val="yellow"/>
-          <w:lang w:eastAsia="fr-FR"/>
-          <w14:ligatures w14:val="none"/>
-        </w:rPr>
-        <w:t>58:</w:t>
-      </w:r>
-      <w:proofErr w:type="gramEnd"/>
-      <w:r>
-        <w:rPr>
-          <w:rFonts w:ascii="Times New Roman" w:eastAsia="Times New Roman" w:hAnsi="Times New Roman" w:cs="Times New Roman"/>
-          <w:kern w:val="0"/>
-          <w:sz w:val="24"/>
-          <w:szCs w:val="24"/>
-          <w:highlight w:val="yellow"/>
-          <w:lang w:eastAsia="fr-FR"/>
-          <w14:ligatures w14:val="none"/>
-        </w:rPr>
-        <w:t xml:space="preserve"> Binning, interaction </w:t>
-      </w:r>
-      <w:proofErr w:type="spellStart"/>
-      <w:r>
-        <w:rPr>
-          <w:rFonts w:ascii="Times New Roman" w:eastAsia="Times New Roman" w:hAnsi="Times New Roman" w:cs="Times New Roman"/>
-          <w:kern w:val="0"/>
-          <w:sz w:val="24"/>
-          <w:szCs w:val="24"/>
-          <w:highlight w:val="yellow"/>
-          <w:lang w:eastAsia="fr-FR"/>
-          <w14:ligatures w14:val="none"/>
-        </w:rPr>
-        <w:t>terms</w:t>
-      </w:r>
-      <w:proofErr w:type="spellEnd"/>
+        <w:t>Day 58: Binning, interaction terms</w:t>
+      </w:r>
       <w:r>
         <w:rPr>
           <w:rFonts w:ascii="Times New Roman" w:eastAsia="Times New Roman" w:hAnsi="Times New Roman" w:cs="Times New Roman"/>
@@ -5859,99 +4224,7 @@
           <w:lang w:eastAsia="fr-FR"/>
           <w14:ligatures w14:val="none"/>
         </w:rPr>
-        <w:t xml:space="preserve">c’est </w:t>
-      </w:r>
-      <w:proofErr w:type="spellStart"/>
-      <w:r>
-        <w:rPr>
-          <w:rFonts w:ascii="Times New Roman" w:eastAsia="Times New Roman" w:hAnsi="Times New Roman" w:cs="Times New Roman"/>
-          <w:kern w:val="0"/>
-          <w:sz w:val="24"/>
-          <w:szCs w:val="24"/>
-          <w:highlight w:val="yellow"/>
-          <w:lang w:eastAsia="fr-FR"/>
-          <w14:ligatures w14:val="none"/>
-        </w:rPr>
-        <w:t>render</w:t>
-      </w:r>
-      <w:proofErr w:type="spellEnd"/>
-      <w:r>
-        <w:rPr>
-          <w:rFonts w:ascii="Times New Roman" w:eastAsia="Times New Roman" w:hAnsi="Times New Roman" w:cs="Times New Roman"/>
-          <w:kern w:val="0"/>
-          <w:sz w:val="24"/>
-          <w:szCs w:val="24"/>
-          <w:highlight w:val="yellow"/>
-          <w:lang w:eastAsia="fr-FR"/>
-          <w14:ligatures w14:val="none"/>
-        </w:rPr>
-        <w:t xml:space="preserve"> une variable continue en catégorie par exemple </w:t>
-      </w:r>
-      <w:proofErr w:type="spellStart"/>
-      <w:r>
-        <w:rPr>
-          <w:rFonts w:ascii="Times New Roman" w:eastAsia="Times New Roman" w:hAnsi="Times New Roman" w:cs="Times New Roman"/>
-          <w:kern w:val="0"/>
-          <w:sz w:val="24"/>
-          <w:szCs w:val="24"/>
-          <w:highlight w:val="yellow"/>
-          <w:lang w:eastAsia="fr-FR"/>
-          <w14:ligatures w14:val="none"/>
-        </w:rPr>
-        <w:t>age</w:t>
-      </w:r>
-      <w:proofErr w:type="spellEnd"/>
-      <w:r>
-        <w:rPr>
-          <w:rFonts w:ascii="Times New Roman" w:eastAsia="Times New Roman" w:hAnsi="Times New Roman" w:cs="Times New Roman"/>
-          <w:kern w:val="0"/>
-          <w:sz w:val="24"/>
-          <w:szCs w:val="24"/>
-          <w:highlight w:val="yellow"/>
-          <w:lang w:eastAsia="fr-FR"/>
-          <w14:ligatures w14:val="none"/>
-        </w:rPr>
-        <w:t> : « jeune » = [0,20] « </w:t>
-      </w:r>
-      <w:proofErr w:type="spellStart"/>
-      <w:r>
-        <w:rPr>
-          <w:rFonts w:ascii="Times New Roman" w:eastAsia="Times New Roman" w:hAnsi="Times New Roman" w:cs="Times New Roman"/>
-          <w:kern w:val="0"/>
-          <w:sz w:val="24"/>
-          <w:szCs w:val="24"/>
-          <w:highlight w:val="yellow"/>
-          <w:lang w:eastAsia="fr-FR"/>
-          <w14:ligatures w14:val="none"/>
-        </w:rPr>
-        <w:t>adult</w:t>
-      </w:r>
-      <w:proofErr w:type="spellEnd"/>
-      <w:proofErr w:type="gramStart"/>
-      <w:r>
-        <w:rPr>
-          <w:rFonts w:ascii="Times New Roman" w:eastAsia="Times New Roman" w:hAnsi="Times New Roman" w:cs="Times New Roman"/>
-          <w:kern w:val="0"/>
-          <w:sz w:val="24"/>
-          <w:szCs w:val="24"/>
-          <w:highlight w:val="yellow"/>
-          <w:lang w:eastAsia="fr-FR"/>
-          <w14:ligatures w14:val="none"/>
-        </w:rPr>
-        <w:t> »=</w:t>
-      </w:r>
-      <w:proofErr w:type="gramEnd"/>
-      <w:r>
-        <w:rPr>
-          <w:rFonts w:ascii="Times New Roman" w:eastAsia="Times New Roman" w:hAnsi="Times New Roman" w:cs="Times New Roman"/>
-          <w:kern w:val="0"/>
-          <w:sz w:val="24"/>
-          <w:szCs w:val="24"/>
-          <w:highlight w:val="yellow"/>
-          <w:lang w:eastAsia="fr-FR"/>
-          <w14:ligatures w14:val="none"/>
-        </w:rPr>
-        <w:t xml:space="preserve"> [21,40] « senior » = [41+]</w:t>
+        <w:t>c’est render une variable continue en catégorie par exemple age : « jeune » = [0,20] « adult »= [21,40] « senior » = [41+]</w:t>
       </w:r>
     </w:p>
     <w:p>
@@ -5980,75 +4253,19 @@
           <w:lang w:eastAsia="fr-FR"/>
           <w14:ligatures w14:val="none"/>
         </w:rPr>
-        <w:t xml:space="preserve">Interaction </w:t>
-      </w:r>
-      <w:proofErr w:type="spellStart"/>
-      <w:r>
-        <w:rPr>
-          <w:rFonts w:ascii="Times New Roman" w:eastAsia="Times New Roman" w:hAnsi="Times New Roman" w:cs="Times New Roman"/>
-          <w:b/>
-          <w:bCs/>
-          <w:kern w:val="0"/>
-          <w:sz w:val="24"/>
-          <w:szCs w:val="24"/>
-          <w:highlight w:val="yellow"/>
-          <w:lang w:eastAsia="fr-FR"/>
-          <w14:ligatures w14:val="none"/>
-        </w:rPr>
-        <w:t>terms</w:t>
-      </w:r>
-      <w:proofErr w:type="spellEnd"/>
-      <w:r>
-        <w:rPr>
-          <w:rFonts w:ascii="Times New Roman" w:eastAsia="Times New Roman" w:hAnsi="Times New Roman" w:cs="Times New Roman"/>
-          <w:b/>
-          <w:bCs/>
-          <w:kern w:val="0"/>
-          <w:sz w:val="24"/>
-          <w:szCs w:val="24"/>
-          <w:highlight w:val="yellow"/>
-          <w:lang w:eastAsia="fr-FR"/>
-          <w14:ligatures w14:val="none"/>
-        </w:rPr>
-        <w:t xml:space="preserve"> </w:t>
-      </w:r>
-      <w:r>
-        <w:rPr>
-          <w:rFonts w:ascii="Times New Roman" w:eastAsia="Times New Roman" w:hAnsi="Times New Roman" w:cs="Times New Roman"/>
-          <w:kern w:val="0"/>
-          <w:sz w:val="24"/>
-          <w:szCs w:val="24"/>
-          <w:highlight w:val="yellow"/>
-          <w:lang w:eastAsia="fr-FR"/>
-          <w14:ligatures w14:val="none"/>
-        </w:rPr>
-        <w:t xml:space="preserve">c’est créer de nouvelles </w:t>
-      </w:r>
-      <w:proofErr w:type="spellStart"/>
-      <w:r>
-        <w:rPr>
-          <w:rFonts w:ascii="Times New Roman" w:eastAsia="Times New Roman" w:hAnsi="Times New Roman" w:cs="Times New Roman"/>
-          <w:kern w:val="0"/>
-          <w:sz w:val="24"/>
-          <w:szCs w:val="24"/>
-          <w:highlight w:val="yellow"/>
-          <w:lang w:eastAsia="fr-FR"/>
-          <w14:ligatures w14:val="none"/>
-        </w:rPr>
-        <w:t>features</w:t>
-      </w:r>
-      <w:proofErr w:type="spellEnd"/>
-      <w:r>
-        <w:rPr>
-          <w:rFonts w:ascii="Times New Roman" w:eastAsia="Times New Roman" w:hAnsi="Times New Roman" w:cs="Times New Roman"/>
-          <w:kern w:val="0"/>
-          <w:sz w:val="24"/>
-          <w:szCs w:val="24"/>
-          <w:highlight w:val="yellow"/>
-          <w:lang w:eastAsia="fr-FR"/>
-          <w14:ligatures w14:val="none"/>
-        </w:rPr>
-        <w:t xml:space="preserve"> par exemple </w:t>
+        <w:t xml:space="preserve">Interaction terms </w:t>
+      </w:r>
+      <w:r>
+        <w:rPr>
+          <w:rFonts w:ascii="Times New Roman" w:eastAsia="Times New Roman" w:hAnsi="Times New Roman" w:cs="Times New Roman"/>
+          <w:kern w:val="0"/>
+          <w:sz w:val="24"/>
+          <w:szCs w:val="24"/>
+          <w:highlight w:val="yellow"/>
+          <w:lang w:eastAsia="fr-FR"/>
+          <w14:ligatures w14:val="none"/>
+        </w:rPr>
+        <w:t xml:space="preserve">c’est créer de nouvelles features par exemple </w:t>
       </w:r>
     </w:p>
     <w:p>
@@ -6064,45 +4281,17 @@
           <w14:ligatures w14:val="none"/>
         </w:rPr>
       </w:pPr>
-      <w:proofErr w:type="spellStart"/>
-      <w:proofErr w:type="gramStart"/>
-      <w:r>
-        <w:rPr>
-          <w:rFonts w:ascii="Times New Roman" w:eastAsia="Times New Roman" w:hAnsi="Times New Roman" w:cs="Times New Roman"/>
-          <w:kern w:val="0"/>
-          <w:sz w:val="24"/>
-          <w:szCs w:val="24"/>
-          <w:highlight w:val="yellow"/>
-          <w:lang w:eastAsia="fr-FR"/>
-          <w14:ligatures w14:val="none"/>
-        </w:rPr>
-        <w:t>feature</w:t>
-      </w:r>
-      <w:proofErr w:type="gramEnd"/>
-      <w:r>
-        <w:rPr>
-          <w:rFonts w:ascii="Times New Roman" w:eastAsia="Times New Roman" w:hAnsi="Times New Roman" w:cs="Times New Roman"/>
-          <w:kern w:val="0"/>
-          <w:sz w:val="24"/>
-          <w:szCs w:val="24"/>
-          <w:highlight w:val="yellow"/>
-          <w:lang w:eastAsia="fr-FR"/>
-          <w14:ligatures w14:val="none"/>
-        </w:rPr>
-        <w:t>_new</w:t>
-      </w:r>
-      <w:proofErr w:type="spellEnd"/>
-      <w:r>
-        <w:rPr>
-          <w:rFonts w:ascii="Times New Roman" w:eastAsia="Times New Roman" w:hAnsi="Times New Roman" w:cs="Times New Roman"/>
-          <w:kern w:val="0"/>
-          <w:sz w:val="24"/>
-          <w:szCs w:val="24"/>
-          <w:highlight w:val="yellow"/>
-          <w:lang w:eastAsia="fr-FR"/>
-          <w14:ligatures w14:val="none"/>
-        </w:rPr>
-        <w:t xml:space="preserve"> = feature1 * feature2</w:t>
+      <w:r>
+        <w:rPr>
+          <w:rFonts w:ascii="Times New Roman" w:eastAsia="Times New Roman" w:hAnsi="Times New Roman" w:cs="Times New Roman"/>
+          <w:kern w:val="0"/>
+          <w:sz w:val="24"/>
+          <w:szCs w:val="24"/>
+          <w:highlight w:val="yellow"/>
+          <w:lang w:eastAsia="fr-FR"/>
+          <w14:ligatures w14:val="none"/>
+        </w:rPr>
+        <w:t>feature_new = feature1 * feature2</w:t>
       </w:r>
     </w:p>
     <w:p>
@@ -6132,85 +4321,7 @@
           <w:lang w:eastAsia="fr-FR"/>
           <w14:ligatures w14:val="none"/>
         </w:rPr>
-        <w:t xml:space="preserve">Day </w:t>
-      </w:r>
-      <w:proofErr w:type="gramStart"/>
-      <w:r>
-        <w:rPr>
-          <w:rFonts w:ascii="Times New Roman" w:eastAsia="Times New Roman" w:hAnsi="Times New Roman" w:cs="Times New Roman"/>
-          <w:kern w:val="0"/>
-          <w:sz w:val="24"/>
-          <w:szCs w:val="24"/>
-          <w:highlight w:val="yellow"/>
-          <w:lang w:eastAsia="fr-FR"/>
-          <w14:ligatures w14:val="none"/>
-        </w:rPr>
-        <w:t>59:</w:t>
-      </w:r>
-      <w:proofErr w:type="gramEnd"/>
-      <w:r>
-        <w:rPr>
-          <w:rFonts w:ascii="Times New Roman" w:eastAsia="Times New Roman" w:hAnsi="Times New Roman" w:cs="Times New Roman"/>
-          <w:kern w:val="0"/>
-          <w:sz w:val="24"/>
-          <w:szCs w:val="24"/>
-          <w:highlight w:val="yellow"/>
-          <w:lang w:eastAsia="fr-FR"/>
-          <w14:ligatures w14:val="none"/>
-        </w:rPr>
-        <w:t xml:space="preserve"> </w:t>
-      </w:r>
-      <w:proofErr w:type="spellStart"/>
-      <w:r>
-        <w:rPr>
-          <w:rFonts w:ascii="Times New Roman" w:eastAsia="Times New Roman" w:hAnsi="Times New Roman" w:cs="Times New Roman"/>
-          <w:kern w:val="0"/>
-          <w:sz w:val="24"/>
-          <w:szCs w:val="24"/>
-          <w:highlight w:val="yellow"/>
-          <w:lang w:eastAsia="fr-FR"/>
-          <w14:ligatures w14:val="none"/>
-        </w:rPr>
-        <w:t>Feature</w:t>
-      </w:r>
-      <w:proofErr w:type="spellEnd"/>
-      <w:r>
-        <w:rPr>
-          <w:rFonts w:ascii="Times New Roman" w:eastAsia="Times New Roman" w:hAnsi="Times New Roman" w:cs="Times New Roman"/>
-          <w:kern w:val="0"/>
-          <w:sz w:val="24"/>
-          <w:szCs w:val="24"/>
-          <w:highlight w:val="yellow"/>
-          <w:lang w:eastAsia="fr-FR"/>
-          <w14:ligatures w14:val="none"/>
-        </w:rPr>
-        <w:t xml:space="preserve"> </w:t>
-      </w:r>
-      <w:proofErr w:type="spellStart"/>
-      <w:r>
-        <w:rPr>
-          <w:rFonts w:ascii="Times New Roman" w:eastAsia="Times New Roman" w:hAnsi="Times New Roman" w:cs="Times New Roman"/>
-          <w:kern w:val="0"/>
-          <w:sz w:val="24"/>
-          <w:szCs w:val="24"/>
-          <w:highlight w:val="yellow"/>
-          <w:lang w:eastAsia="fr-FR"/>
-          <w14:ligatures w14:val="none"/>
-        </w:rPr>
-        <w:t>selection</w:t>
-      </w:r>
-      <w:proofErr w:type="spellEnd"/>
-      <w:r>
-        <w:rPr>
-          <w:rFonts w:ascii="Times New Roman" w:eastAsia="Times New Roman" w:hAnsi="Times New Roman" w:cs="Times New Roman"/>
-          <w:kern w:val="0"/>
-          <w:sz w:val="24"/>
-          <w:szCs w:val="24"/>
-          <w:highlight w:val="yellow"/>
-          <w:lang w:eastAsia="fr-FR"/>
-          <w14:ligatures w14:val="none"/>
-        </w:rPr>
-        <w:t xml:space="preserve"> techniques</w:t>
+        <w:t>Day 59: Feature selection techniques</w:t>
       </w:r>
     </w:p>
     <w:p>
@@ -6269,63 +4380,7 @@
           <w:lang w:eastAsia="fr-FR"/>
           <w14:ligatures w14:val="none"/>
         </w:rPr>
-        <w:t>Days 61–</w:t>
-      </w:r>
-      <w:proofErr w:type="gramStart"/>
-      <w:r>
-        <w:rPr>
-          <w:rFonts w:ascii="Times New Roman" w:eastAsia="Times New Roman" w:hAnsi="Times New Roman" w:cs="Times New Roman"/>
-          <w:b/>
-          <w:bCs/>
-          <w:kern w:val="0"/>
-          <w:sz w:val="27"/>
-          <w:szCs w:val="27"/>
-          <w:lang w:eastAsia="fr-FR"/>
-          <w14:ligatures w14:val="none"/>
-        </w:rPr>
-        <w:t>65:</w:t>
-      </w:r>
-      <w:proofErr w:type="gramEnd"/>
-      <w:r>
-        <w:rPr>
-          <w:rFonts w:ascii="Times New Roman" w:eastAsia="Times New Roman" w:hAnsi="Times New Roman" w:cs="Times New Roman"/>
-          <w:b/>
-          <w:bCs/>
-          <w:kern w:val="0"/>
-          <w:sz w:val="27"/>
-          <w:szCs w:val="27"/>
-          <w:lang w:eastAsia="fr-FR"/>
-          <w14:ligatures w14:val="none"/>
-        </w:rPr>
-        <w:t xml:space="preserve"> Time </w:t>
-      </w:r>
-      <w:proofErr w:type="spellStart"/>
-      <w:r>
-        <w:rPr>
-          <w:rFonts w:ascii="Times New Roman" w:eastAsia="Times New Roman" w:hAnsi="Times New Roman" w:cs="Times New Roman"/>
-          <w:b/>
-          <w:bCs/>
-          <w:kern w:val="0"/>
-          <w:sz w:val="27"/>
-          <w:szCs w:val="27"/>
-          <w:lang w:eastAsia="fr-FR"/>
-          <w14:ligatures w14:val="none"/>
-        </w:rPr>
-        <w:t>Series</w:t>
-      </w:r>
-      <w:proofErr w:type="spellEnd"/>
-      <w:r>
-        <w:rPr>
-          <w:rFonts w:ascii="Times New Roman" w:eastAsia="Times New Roman" w:hAnsi="Times New Roman" w:cs="Times New Roman"/>
-          <w:b/>
-          <w:bCs/>
-          <w:kern w:val="0"/>
-          <w:sz w:val="27"/>
-          <w:szCs w:val="27"/>
-          <w:lang w:eastAsia="fr-FR"/>
-          <w14:ligatures w14:val="none"/>
-        </w:rPr>
-        <w:t xml:space="preserve"> Basics</w:t>
+        <w:t>Days 61–65: Time Series Basics</w:t>
       </w:r>
     </w:p>
     <w:p>
@@ -6480,31 +4535,7 @@
           <w:lang w:eastAsia="fr-FR"/>
           <w14:ligatures w14:val="none"/>
         </w:rPr>
-        <w:t>Saisonnalité (</w:t>
-      </w:r>
-      <w:proofErr w:type="spellStart"/>
-      <w:r>
-        <w:rPr>
-          <w:rFonts w:eastAsia="Times New Roman" w:cstheme="minorHAnsi"/>
-          <w:kern w:val="0"/>
-          <w:sz w:val="20"/>
-          <w:szCs w:val="20"/>
-          <w:lang w:eastAsia="fr-FR"/>
-          <w14:ligatures w14:val="none"/>
-        </w:rPr>
-        <w:t>Seasonality</w:t>
-      </w:r>
-      <w:proofErr w:type="spellEnd"/>
-      <w:r>
-        <w:rPr>
-          <w:rFonts w:eastAsia="Times New Roman" w:cstheme="minorHAnsi"/>
-          <w:kern w:val="0"/>
-          <w:sz w:val="20"/>
-          <w:szCs w:val="20"/>
-          <w:lang w:eastAsia="fr-FR"/>
-          <w14:ligatures w14:val="none"/>
-        </w:rPr>
-        <w:t>)</w:t>
+        <w:t>Saisonnalité (Seasonality)</w:t>
       </w:r>
     </w:p>
     <w:p>
@@ -6642,31 +4673,7 @@
           <w:lang w:eastAsia="fr-FR"/>
           <w14:ligatures w14:val="none"/>
         </w:rPr>
-        <w:t xml:space="preserve"> : Utilisation de pandas pour la manipulation d'index temporels et </w:t>
-      </w:r>
-      <w:proofErr w:type="spellStart"/>
-      <w:r>
-        <w:rPr>
-          <w:rFonts w:eastAsia="Times New Roman" w:cstheme="minorHAnsi"/>
-          <w:kern w:val="0"/>
-          <w:sz w:val="20"/>
-          <w:szCs w:val="20"/>
-          <w:lang w:eastAsia="fr-FR"/>
-          <w14:ligatures w14:val="none"/>
-        </w:rPr>
-        <w:t>statsmodels</w:t>
-      </w:r>
-      <w:proofErr w:type="spellEnd"/>
-      <w:r>
-        <w:rPr>
-          <w:rFonts w:eastAsia="Times New Roman" w:cstheme="minorHAnsi"/>
-          <w:kern w:val="0"/>
-          <w:sz w:val="20"/>
-          <w:szCs w:val="20"/>
-          <w:lang w:eastAsia="fr-FR"/>
-          <w14:ligatures w14:val="none"/>
-        </w:rPr>
-        <w:t xml:space="preserve"> pour la décomposition.</w:t>
+        <w:t xml:space="preserve"> : Utilisation de pandas pour la manipulation d'index temporels et statsmodels pour la décomposition.</w:t>
       </w:r>
     </w:p>
     <w:p>
@@ -6903,7 +4910,6 @@
           <w:lang w:eastAsia="fr-FR"/>
           <w14:ligatures w14:val="none"/>
         </w:rPr>
-        <w:lastRenderedPageBreak/>
         <w:t>Différenciation (pour supprimer la tendance)</w:t>
       </w:r>
     </w:p>
@@ -7152,92 +5158,7 @@
           <w:lang w:eastAsia="fr-FR"/>
           <w14:ligatures w14:val="none"/>
         </w:rPr>
-        <w:t xml:space="preserve"> : SARIMA (</w:t>
-      </w:r>
-      <w:proofErr w:type="spellStart"/>
-      <w:proofErr w:type="gramStart"/>
-      <w:r>
-        <w:rPr>
-          <w:rFonts w:eastAsia="Times New Roman" w:cstheme="minorHAnsi"/>
-          <w:kern w:val="0"/>
-          <w:sz w:val="20"/>
-          <w:szCs w:val="20"/>
-          <w:lang w:eastAsia="fr-FR"/>
-          <w14:ligatures w14:val="none"/>
-        </w:rPr>
-        <w:t>p,d</w:t>
-      </w:r>
-      <w:proofErr w:type="gramEnd"/>
-      <w:r>
-        <w:rPr>
-          <w:rFonts w:eastAsia="Times New Roman" w:cstheme="minorHAnsi"/>
-          <w:kern w:val="0"/>
-          <w:sz w:val="20"/>
-          <w:szCs w:val="20"/>
-          <w:lang w:eastAsia="fr-FR"/>
-          <w14:ligatures w14:val="none"/>
-        </w:rPr>
-        <w:t>,</w:t>
-      </w:r>
-      <w:proofErr w:type="gramStart"/>
-      <w:r>
-        <w:rPr>
-          <w:rFonts w:eastAsia="Times New Roman" w:cstheme="minorHAnsi"/>
-          <w:kern w:val="0"/>
-          <w:sz w:val="20"/>
-          <w:szCs w:val="20"/>
-          <w:lang w:eastAsia="fr-FR"/>
-          <w14:ligatures w14:val="none"/>
-        </w:rPr>
-        <w:t>q</w:t>
-      </w:r>
-      <w:proofErr w:type="spellEnd"/>
-      <w:r>
-        <w:rPr>
-          <w:rFonts w:eastAsia="Times New Roman" w:cstheme="minorHAnsi"/>
-          <w:kern w:val="0"/>
-          <w:sz w:val="20"/>
-          <w:szCs w:val="20"/>
-          <w:lang w:eastAsia="fr-FR"/>
-          <w14:ligatures w14:val="none"/>
-        </w:rPr>
-        <w:t>)(P,D</w:t>
-      </w:r>
-      <w:proofErr w:type="gramEnd"/>
-      <w:r>
-        <w:rPr>
-          <w:rFonts w:eastAsia="Times New Roman" w:cstheme="minorHAnsi"/>
-          <w:kern w:val="0"/>
-          <w:sz w:val="20"/>
-          <w:szCs w:val="20"/>
-          <w:lang w:eastAsia="fr-FR"/>
-          <w14:ligatures w14:val="none"/>
-        </w:rPr>
-        <w:t>,</w:t>
-      </w:r>
-      <w:proofErr w:type="gramStart"/>
-      <w:r>
-        <w:rPr>
-          <w:rFonts w:eastAsia="Times New Roman" w:cstheme="minorHAnsi"/>
-          <w:kern w:val="0"/>
-          <w:sz w:val="20"/>
-          <w:szCs w:val="20"/>
-          <w:lang w:eastAsia="fr-FR"/>
-          <w14:ligatures w14:val="none"/>
-        </w:rPr>
-        <w:t>Q)_</w:t>
-      </w:r>
-      <w:proofErr w:type="gramEnd"/>
-      <w:r>
-        <w:rPr>
-          <w:rFonts w:eastAsia="Times New Roman" w:cstheme="minorHAnsi"/>
-          <w:kern w:val="0"/>
-          <w:sz w:val="20"/>
-          <w:szCs w:val="20"/>
-          <w:lang w:eastAsia="fr-FR"/>
-          <w14:ligatures w14:val="none"/>
-        </w:rPr>
-        <w:t>s et ARIMAX.</w:t>
+        <w:t xml:space="preserve"> : SARIMA (p,d,q)(P,D,Q)_s et ARIMAX.</w:t>
       </w:r>
     </w:p>
     <w:p>
@@ -7278,85 +5199,12 @@
           <w:lang w:eastAsia="fr-FR"/>
           <w14:ligatures w14:val="none"/>
         </w:rPr>
-        <w:t xml:space="preserve"> : Utilisation de </w:t>
-      </w:r>
-      <w:proofErr w:type="spellStart"/>
-      <w:r>
-        <w:rPr>
-          <w:rFonts w:eastAsia="Times New Roman" w:cstheme="minorHAnsi"/>
-          <w:kern w:val="0"/>
-          <w:sz w:val="20"/>
-          <w:szCs w:val="20"/>
-          <w:lang w:eastAsia="fr-FR"/>
-          <w14:ligatures w14:val="none"/>
-        </w:rPr>
-        <w:t>pmdarima</w:t>
-      </w:r>
-      <w:proofErr w:type="spellEnd"/>
-      <w:r>
-        <w:rPr>
-          <w:rFonts w:eastAsia="Times New Roman" w:cstheme="minorHAnsi"/>
-          <w:kern w:val="0"/>
-          <w:sz w:val="20"/>
-          <w:szCs w:val="20"/>
-          <w:lang w:eastAsia="fr-FR"/>
-          <w14:ligatures w14:val="none"/>
-        </w:rPr>
-        <w:t xml:space="preserve"> pour l'optimisation automatique des hyperparamètres (</w:t>
-      </w:r>
-      <w:proofErr w:type="spellStart"/>
-      <w:r>
-        <w:rPr>
-          <w:rFonts w:eastAsia="Times New Roman" w:cstheme="minorHAnsi"/>
-          <w:kern w:val="0"/>
-          <w:sz w:val="20"/>
-          <w:szCs w:val="20"/>
-          <w:lang w:eastAsia="fr-FR"/>
-          <w14:ligatures w14:val="none"/>
-        </w:rPr>
-        <w:t>auto_arima</w:t>
-      </w:r>
-      <w:proofErr w:type="spellEnd"/>
-      <w:r>
-        <w:rPr>
-          <w:rFonts w:eastAsia="Times New Roman" w:cstheme="minorHAnsi"/>
-          <w:kern w:val="0"/>
-          <w:sz w:val="20"/>
-          <w:szCs w:val="20"/>
-          <w:lang w:eastAsia="fr-FR"/>
-          <w14:ligatures w14:val="none"/>
-        </w:rPr>
-        <w:t xml:space="preserve">) et prédictions avec </w:t>
-      </w:r>
-      <w:proofErr w:type="spellStart"/>
-      <w:r>
-        <w:rPr>
-          <w:rFonts w:eastAsia="Times New Roman" w:cstheme="minorHAnsi"/>
-          <w:kern w:val="0"/>
-          <w:sz w:val="20"/>
-          <w:szCs w:val="20"/>
-          <w:lang w:eastAsia="fr-FR"/>
-          <w14:ligatures w14:val="none"/>
-        </w:rPr>
-        <w:t>statsmodels</w:t>
-      </w:r>
-      <w:proofErr w:type="spellEnd"/>
-      <w:r>
-        <w:rPr>
-          <w:rFonts w:eastAsia="Times New Roman" w:cstheme="minorHAnsi"/>
-          <w:kern w:val="0"/>
-          <w:sz w:val="20"/>
-          <w:szCs w:val="20"/>
-          <w:lang w:eastAsia="fr-FR"/>
-          <w14:ligatures w14:val="none"/>
-        </w:rPr>
-        <w:t>.</w:t>
+        <w:t xml:space="preserve"> : Utilisation de pmdarima pour l'optimisation automatique des hyperparamètres (auto_arima) et prédictions avec statsmodels.</w:t>
       </w:r>
     </w:p>
     <w:p>
       <w:pPr>
         <w:spacing w:after="0" w:line="240" w:lineRule="auto"/>
-        <w:outlineLvl w:val="2"/>
         <w:rPr>
           <w:rFonts w:eastAsia="Times New Roman" w:cstheme="minorHAnsi"/>
           <w:b/>
@@ -7376,57 +5224,98 @@
           <w:kern w:val="0"/>
           <w:sz w:val="20"/>
           <w:szCs w:val="20"/>
-          <w:lang w:eastAsia="fr-FR"/>
-          <w14:ligatures w14:val="none"/>
-        </w:rPr>
-        <w:t>Module 4 : Lissage Exponentiel et Méthodes Rapides</w:t>
+          <w:highlight w:val="yellow"/>
+          <w:lang w:eastAsia="fr-FR"/>
+          <w14:ligatures w14:val="none"/>
+        </w:rPr>
+        <w:t>Module 4 : Lissage Exponentiel</w:t>
+      </w:r>
+      <w:r>
+        <w:rPr>
+          <w:rFonts w:eastAsia="Times New Roman" w:cstheme="minorHAnsi"/>
+          <w:b/>
+          <w:bCs/>
+          <w:kern w:val="0"/>
+          <w:sz w:val="20"/>
+          <w:szCs w:val="20"/>
+          <w:highlight w:val="yellow"/>
+          <w:lang w:eastAsia="fr-FR"/>
+          <w14:ligatures w14:val="none"/>
+        </w:rPr>
+        <w:t xml:space="preserve"> </w:t>
+      </w:r>
+      <w:r>
+        <w:rPr>
+          <w:rFonts w:eastAsia="Times New Roman" w:cstheme="minorHAnsi"/>
+          <w:b/>
+          <w:bCs/>
+          <w:kern w:val="0"/>
+          <w:sz w:val="20"/>
+          <w:szCs w:val="20"/>
+          <w:highlight w:val="yellow"/>
+          <w:lang w:eastAsia="fr-FR"/>
+          <w14:ligatures w14:val="none"/>
+        </w:rPr>
+        <w:t>et Méthodes Rapides</w:t>
       </w:r>
     </w:p>
     <w:p>
       <w:pPr>
         <w:spacing w:after="0" w:line="240" w:lineRule="auto"/>
-        <w:rPr>
-          <w:rFonts w:eastAsia="Times New Roman" w:cstheme="minorHAnsi"/>
-          <w:kern w:val="0"/>
-          <w:sz w:val="20"/>
-          <w:szCs w:val="20"/>
-          <w:lang w:eastAsia="fr-FR"/>
-          <w14:ligatures w14:val="none"/>
-        </w:rPr>
-      </w:pPr>
-      <w:r>
-        <w:rPr>
-          <w:rFonts w:eastAsia="Times New Roman" w:cstheme="minorHAnsi"/>
-          <w:i/>
-          <w:iCs/>
-          <w:kern w:val="0"/>
-          <w:sz w:val="20"/>
-          <w:szCs w:val="20"/>
-          <w:lang w:eastAsia="fr-FR"/>
-          <w14:ligatures w14:val="none"/>
-        </w:rPr>
-        <w:t>Objectif : Disposer de modèles simples, robustes et efficaces pour les prévisions à court terme.</w:t>
-      </w:r>
-    </w:p>
-    <w:p>
-      <w:pPr>
+        <w:ind w:left="360"/>
+        <w:rPr>
+          <w:rFonts w:eastAsia="Times New Roman" w:cstheme="minorHAnsi"/>
+          <w:kern w:val="0"/>
+          <w:sz w:val="20"/>
+          <w:szCs w:val="20"/>
+          <w:lang w:eastAsia="fr-FR"/>
+          <w14:ligatures w14:val="none"/>
+        </w:rPr>
+      </w:pPr>
+      <w:r>
+        <w:rPr>
+          <w:rFonts w:eastAsia="Times New Roman" w:cstheme="minorHAnsi"/>
+          <w:kern w:val="0"/>
+          <w:sz w:val="20"/>
+          <w:szCs w:val="20"/>
+          <w:lang w:eastAsia="fr-FR"/>
+          <w14:ligatures w14:val="none"/>
+        </w:rPr>
+        <w:t>Objectif : Disposer de modèles simples, robustes</w:t>
+      </w:r>
+      <w:r>
+        <w:rPr>
+          <w:rFonts w:eastAsia="Times New Roman" w:cstheme="minorHAnsi"/>
+          <w:kern w:val="0"/>
+          <w:sz w:val="20"/>
+          <w:szCs w:val="20"/>
+          <w:lang w:eastAsia="fr-FR"/>
+          <w14:ligatures w14:val="none"/>
+        </w:rPr>
+        <w:t xml:space="preserve"> </w:t>
+      </w:r>
+      <w:r>
+        <w:rPr>
+          <w:rFonts w:eastAsia="Times New Roman" w:cstheme="minorHAnsi"/>
+          <w:kern w:val="0"/>
+          <w:sz w:val="20"/>
+          <w:szCs w:val="20"/>
+          <w:lang w:eastAsia="fr-FR"/>
+          <w14:ligatures w14:val="none"/>
+        </w:rPr>
+        <w:t>et efficaces pour les prévisions à court terme.</w:t>
+      </w:r>
+    </w:p>
+    <w:p>
+      <w:pPr>
+        <w:pStyle w:val="Paragraphedeliste"/>
         <w:numPr>
           <w:ilvl w:val="0"/>
-          <w:numId w:val="30"/>
+          <w:numId w:val="35"/>
         </w:numPr>
         <w:spacing w:after="0" w:line="240" w:lineRule="auto"/>
         <w:rPr>
           <w:rFonts w:eastAsia="Times New Roman" w:cstheme="minorHAnsi"/>
-          <w:kern w:val="0"/>
-          <w:sz w:val="20"/>
-          <w:szCs w:val="20"/>
-          <w:lang w:eastAsia="fr-FR"/>
-          <w14:ligatures w14:val="none"/>
-        </w:rPr>
-      </w:pPr>
-      <w:r>
-        <w:rPr>
-          <w:rFonts w:eastAsia="Times New Roman" w:cstheme="minorHAnsi"/>
           <w:b/>
           <w:bCs/>
           <w:kern w:val="0"/>
@@ -7435,35 +5324,25 @@
           <w:lang w:eastAsia="fr-FR"/>
           <w14:ligatures w14:val="none"/>
         </w:rPr>
-        <w:t>Lissage exponentiel simple</w:t>
-      </w:r>
-      <w:r>
-        <w:rPr>
-          <w:rFonts w:eastAsia="Times New Roman" w:cstheme="minorHAnsi"/>
-          <w:kern w:val="0"/>
-          <w:sz w:val="20"/>
-          <w:szCs w:val="20"/>
-          <w:lang w:eastAsia="fr-FR"/>
-          <w14:ligatures w14:val="none"/>
-        </w:rPr>
-        <w:t xml:space="preserve"> (Simple </w:t>
-      </w:r>
-      <w:proofErr w:type="spellStart"/>
-      <w:r>
-        <w:rPr>
-          <w:rFonts w:eastAsia="Times New Roman" w:cstheme="minorHAnsi"/>
-          <w:kern w:val="0"/>
-          <w:sz w:val="20"/>
-          <w:szCs w:val="20"/>
-          <w:lang w:eastAsia="fr-FR"/>
-          <w14:ligatures w14:val="none"/>
-        </w:rPr>
-        <w:t>Exponential</w:t>
-      </w:r>
-      <w:proofErr w:type="spellEnd"/>
-      <w:r>
-        <w:rPr>
-          <w:rFonts w:eastAsia="Times New Roman" w:cstheme="minorHAnsi"/>
+      </w:pPr>
+      <w:r>
+        <w:rPr>
+          <w:rFonts w:eastAsia="Times New Roman" w:cstheme="minorHAnsi"/>
+          <w:b/>
+          <w:bCs/>
+          <w:kern w:val="0"/>
+          <w:sz w:val="20"/>
+          <w:szCs w:val="20"/>
+          <w:lang w:eastAsia="fr-FR"/>
+          <w14:ligatures w14:val="none"/>
+        </w:rPr>
+        <w:t>Lissage</w:t>
+      </w:r>
+      <w:r>
+        <w:rPr>
+          <w:rFonts w:eastAsia="Times New Roman" w:cstheme="minorHAnsi"/>
+          <w:b/>
+          <w:bCs/>
           <w:kern w:val="0"/>
           <w:sz w:val="20"/>
           <w:szCs w:val="20"/>
@@ -7472,50 +5351,56 @@
         </w:rPr>
         <w:t xml:space="preserve"> </w:t>
       </w:r>
-      <w:proofErr w:type="spellStart"/>
-      <w:r>
-        <w:rPr>
-          <w:rFonts w:eastAsia="Times New Roman" w:cstheme="minorHAnsi"/>
-          <w:kern w:val="0"/>
-          <w:sz w:val="20"/>
-          <w:szCs w:val="20"/>
-          <w:lang w:eastAsia="fr-FR"/>
-          <w14:ligatures w14:val="none"/>
-        </w:rPr>
-        <w:t>Smoothing</w:t>
-      </w:r>
-      <w:proofErr w:type="spellEnd"/>
-      <w:r>
-        <w:rPr>
-          <w:rFonts w:eastAsia="Times New Roman" w:cstheme="minorHAnsi"/>
-          <w:kern w:val="0"/>
-          <w:sz w:val="20"/>
-          <w:szCs w:val="20"/>
-          <w:lang w:eastAsia="fr-FR"/>
-          <w14:ligatures w14:val="none"/>
-        </w:rPr>
-        <w:t>).</w:t>
-      </w:r>
-    </w:p>
-    <w:p>
-      <w:pPr>
+      <w:r>
+        <w:rPr>
+          <w:rFonts w:eastAsia="Times New Roman" w:cstheme="minorHAnsi"/>
+          <w:b/>
+          <w:bCs/>
+          <w:kern w:val="0"/>
+          <w:sz w:val="20"/>
+          <w:szCs w:val="20"/>
+          <w:lang w:eastAsia="fr-FR"/>
+          <w14:ligatures w14:val="none"/>
+        </w:rPr>
+        <w:t>exponentiel simple (Simple</w:t>
+      </w:r>
+      <w:r>
+        <w:rPr>
+          <w:rFonts w:eastAsia="Times New Roman" w:cstheme="minorHAnsi"/>
+          <w:b/>
+          <w:bCs/>
+          <w:kern w:val="0"/>
+          <w:sz w:val="20"/>
+          <w:szCs w:val="20"/>
+          <w:lang w:eastAsia="fr-FR"/>
+          <w14:ligatures w14:val="none"/>
+        </w:rPr>
+        <w:t xml:space="preserve"> </w:t>
+      </w:r>
+      <w:r>
+        <w:rPr>
+          <w:rFonts w:eastAsia="Times New Roman" w:cstheme="minorHAnsi"/>
+          <w:b/>
+          <w:bCs/>
+          <w:kern w:val="0"/>
+          <w:sz w:val="20"/>
+          <w:szCs w:val="20"/>
+          <w:lang w:eastAsia="fr-FR"/>
+          <w14:ligatures w14:val="none"/>
+        </w:rPr>
+        <w:t>Exponential Smoothing).</w:t>
+      </w:r>
+    </w:p>
+    <w:p>
+      <w:pPr>
+        <w:pStyle w:val="Paragraphedeliste"/>
         <w:numPr>
           <w:ilvl w:val="0"/>
-          <w:numId w:val="30"/>
+          <w:numId w:val="35"/>
         </w:numPr>
         <w:spacing w:after="0" w:line="240" w:lineRule="auto"/>
         <w:rPr>
           <w:rFonts w:eastAsia="Times New Roman" w:cstheme="minorHAnsi"/>
-          <w:kern w:val="0"/>
-          <w:sz w:val="20"/>
-          <w:szCs w:val="20"/>
-          <w:lang w:eastAsia="fr-FR"/>
-          <w14:ligatures w14:val="none"/>
-        </w:rPr>
-      </w:pPr>
-      <w:r>
-        <w:rPr>
-          <w:rFonts w:eastAsia="Times New Roman" w:cstheme="minorHAnsi"/>
           <w:b/>
           <w:bCs/>
           <w:kern w:val="0"/>
@@ -7524,19 +5409,7 @@
           <w:lang w:eastAsia="fr-FR"/>
           <w14:ligatures w14:val="none"/>
         </w:rPr>
-        <w:t>Méthode de Holt</w:t>
-      </w:r>
-      <w:r>
-        <w:rPr>
-          <w:rFonts w:eastAsia="Times New Roman" w:cstheme="minorHAnsi"/>
-          <w:kern w:val="0"/>
-          <w:sz w:val="20"/>
-          <w:szCs w:val="20"/>
-          <w:lang w:eastAsia="fr-FR"/>
-          <w14:ligatures w14:val="none"/>
-        </w:rPr>
-        <w:t xml:space="preserve"> (Tendance) et </w:t>
-      </w:r>
+      </w:pPr>
       <w:r>
         <w:rPr>
           <w:rFonts w:eastAsia="Times New Roman" w:cstheme="minorHAnsi"/>
@@ -7548,25 +5421,67 @@
           <w:lang w:eastAsia="fr-FR"/>
           <w14:ligatures w14:val="none"/>
         </w:rPr>
-        <w:t>Holt-Winters</w:t>
-      </w:r>
-      <w:r>
-        <w:rPr>
-          <w:rFonts w:eastAsia="Times New Roman" w:cstheme="minorHAnsi"/>
-          <w:kern w:val="0"/>
-          <w:sz w:val="20"/>
-          <w:szCs w:val="20"/>
-          <w:lang w:eastAsia="fr-FR"/>
-          <w14:ligatures w14:val="none"/>
-        </w:rPr>
-        <w:t xml:space="preserve"> (Tendance + Saisonnalité).</w:t>
-      </w:r>
-    </w:p>
-    <w:p>
-      <w:pPr>
+        <w:t>Méthode</w:t>
+      </w:r>
+      <w:r>
+        <w:rPr>
+          <w:rFonts w:eastAsia="Times New Roman" w:cstheme="minorHAnsi"/>
+          <w:b/>
+          <w:bCs/>
+          <w:kern w:val="0"/>
+          <w:sz w:val="20"/>
+          <w:szCs w:val="20"/>
+          <w:lang w:eastAsia="fr-FR"/>
+          <w14:ligatures w14:val="none"/>
+        </w:rPr>
+        <w:t xml:space="preserve"> de </w:t>
+      </w:r>
+      <w:r>
+        <w:rPr>
+          <w:rFonts w:eastAsia="Times New Roman" w:cstheme="minorHAnsi"/>
+          <w:b/>
+          <w:bCs/>
+          <w:kern w:val="0"/>
+          <w:sz w:val="20"/>
+          <w:szCs w:val="20"/>
+          <w:lang w:eastAsia="fr-FR"/>
+          <w14:ligatures w14:val="none"/>
+        </w:rPr>
+        <w:t>Holt</w:t>
+      </w:r>
+      <w:r>
+        <w:rPr>
+          <w:rFonts w:eastAsia="Times New Roman" w:cstheme="minorHAnsi"/>
+          <w:b/>
+          <w:bCs/>
+          <w:kern w:val="0"/>
+          <w:sz w:val="20"/>
+          <w:szCs w:val="20"/>
+          <w:lang w:eastAsia="fr-FR"/>
+          <w14:ligatures w14:val="none"/>
+        </w:rPr>
+        <w:t xml:space="preserve"> </w:t>
+      </w:r>
+      <w:r>
+        <w:rPr>
+          <w:rFonts w:eastAsia="Times New Roman" w:cstheme="minorHAnsi"/>
+          <w:b/>
+          <w:bCs/>
+          <w:kern w:val="0"/>
+          <w:sz w:val="20"/>
+          <w:szCs w:val="20"/>
+          <w:lang w:eastAsia="fr-FR"/>
+          <w14:ligatures w14:val="none"/>
+        </w:rPr>
+        <w:t>(Tendance) et Holt-Winters (Tendance + Saisonnalité).</w:t>
+      </w:r>
+    </w:p>
+    <w:p>
+      <w:pPr>
+        <w:pStyle w:val="Paragraphedeliste"/>
         <w:numPr>
           <w:ilvl w:val="0"/>
-          <w:numId w:val="30"/>
+          <w:numId w:val="35"/>
         </w:numPr>
         <w:spacing w:after="0" w:line="240" w:lineRule="auto"/>
         <w:rPr>
@@ -7600,55 +5515,7 @@
           <w:lang w:eastAsia="fr-FR"/>
           <w14:ligatures w14:val="none"/>
         </w:rPr>
-        <w:t xml:space="preserve"> : Implémentation via </w:t>
-      </w:r>
-      <w:proofErr w:type="spellStart"/>
-      <w:r>
-        <w:rPr>
-          <w:rFonts w:eastAsia="Times New Roman" w:cstheme="minorHAnsi"/>
-          <w:kern w:val="0"/>
-          <w:sz w:val="20"/>
-          <w:szCs w:val="20"/>
-          <w:lang w:eastAsia="fr-FR"/>
-          <w14:ligatures w14:val="none"/>
-        </w:rPr>
-        <w:t>ExponentialSmoothing</w:t>
-      </w:r>
-      <w:proofErr w:type="spellEnd"/>
-      <w:r>
-        <w:rPr>
-          <w:rFonts w:eastAsia="Times New Roman" w:cstheme="minorHAnsi"/>
-          <w:kern w:val="0"/>
-          <w:sz w:val="20"/>
-          <w:szCs w:val="20"/>
-          <w:lang w:eastAsia="fr-FR"/>
-          <w14:ligatures w14:val="none"/>
-        </w:rPr>
-        <w:t xml:space="preserve"> de </w:t>
-      </w:r>
-      <w:proofErr w:type="spellStart"/>
-      <w:r>
-        <w:rPr>
-          <w:rFonts w:eastAsia="Times New Roman" w:cstheme="minorHAnsi"/>
-          <w:kern w:val="0"/>
-          <w:sz w:val="20"/>
-          <w:szCs w:val="20"/>
-          <w:lang w:eastAsia="fr-FR"/>
-          <w14:ligatures w14:val="none"/>
-        </w:rPr>
-        <w:t>statsmodels</w:t>
-      </w:r>
-      <w:proofErr w:type="spellEnd"/>
-      <w:r>
-        <w:rPr>
-          <w:rFonts w:eastAsia="Times New Roman" w:cstheme="minorHAnsi"/>
-          <w:kern w:val="0"/>
-          <w:sz w:val="20"/>
-          <w:szCs w:val="20"/>
-          <w:lang w:eastAsia="fr-FR"/>
-          <w14:ligatures w14:val="none"/>
-        </w:rPr>
-        <w:t>.</w:t>
+        <w:t xml:space="preserve"> : Implémentation via ExponentialSmoothing de statsmodels.</w:t>
       </w:r>
     </w:p>
     <w:p>
@@ -7722,7 +5589,6 @@
           <w14:ligatures w14:val="none"/>
         </w:rPr>
       </w:pPr>
-      <w:proofErr w:type="spellStart"/>
       <w:r>
         <w:rPr>
           <w:rFonts w:eastAsia="Times New Roman" w:cstheme="minorHAnsi"/>
@@ -7734,21 +5600,7 @@
           <w:lang w:eastAsia="fr-FR"/>
           <w14:ligatures w14:val="none"/>
         </w:rPr>
-        <w:t>Feature</w:t>
-      </w:r>
-      <w:proofErr w:type="spellEnd"/>
-      <w:r>
-        <w:rPr>
-          <w:rFonts w:eastAsia="Times New Roman" w:cstheme="minorHAnsi"/>
-          <w:b/>
-          <w:bCs/>
-          <w:kern w:val="0"/>
-          <w:sz w:val="20"/>
-          <w:szCs w:val="20"/>
-          <w:lang w:eastAsia="fr-FR"/>
-          <w14:ligatures w14:val="none"/>
-        </w:rPr>
-        <w:t xml:space="preserve"> Engineering temporel</w:t>
+        <w:t>Feature Engineering temporel</w:t>
       </w:r>
       <w:r>
         <w:rPr>
@@ -7815,31 +5667,7 @@
           <w:lang w:eastAsia="fr-FR"/>
           <w14:ligatures w14:val="none"/>
         </w:rPr>
-        <w:t xml:space="preserve">Valeurs retardées (Lag </w:t>
-      </w:r>
-      <w:proofErr w:type="spellStart"/>
-      <w:r>
-        <w:rPr>
-          <w:rFonts w:eastAsia="Times New Roman" w:cstheme="minorHAnsi"/>
-          <w:kern w:val="0"/>
-          <w:sz w:val="20"/>
-          <w:szCs w:val="20"/>
-          <w:lang w:eastAsia="fr-FR"/>
-          <w14:ligatures w14:val="none"/>
-        </w:rPr>
-        <w:t>features</w:t>
-      </w:r>
-      <w:proofErr w:type="spellEnd"/>
-      <w:r>
-        <w:rPr>
-          <w:rFonts w:eastAsia="Times New Roman" w:cstheme="minorHAnsi"/>
-          <w:kern w:val="0"/>
-          <w:sz w:val="20"/>
-          <w:szCs w:val="20"/>
-          <w:lang w:eastAsia="fr-FR"/>
-          <w14:ligatures w14:val="none"/>
-        </w:rPr>
-        <w:t>) et moyennes mobiles.</w:t>
+        <w:t>Valeurs retardées (Lag features) et moyennes mobiles.</w:t>
       </w:r>
     </w:p>
     <w:p>
@@ -7893,70 +5721,18 @@
           <w:lang w:eastAsia="fr-FR"/>
           <w14:ligatures w14:val="none"/>
         </w:rPr>
-        <w:t xml:space="preserve">Time </w:t>
-      </w:r>
-      <w:proofErr w:type="spellStart"/>
-      <w:r>
-        <w:rPr>
-          <w:rFonts w:eastAsia="Times New Roman" w:cstheme="minorHAnsi"/>
-          <w:i/>
-          <w:iCs/>
-          <w:kern w:val="0"/>
-          <w:sz w:val="20"/>
-          <w:szCs w:val="20"/>
-          <w:lang w:eastAsia="fr-FR"/>
-          <w14:ligatures w14:val="none"/>
-        </w:rPr>
-        <w:t>Series</w:t>
-      </w:r>
-      <w:proofErr w:type="spellEnd"/>
-      <w:r>
-        <w:rPr>
-          <w:rFonts w:eastAsia="Times New Roman" w:cstheme="minorHAnsi"/>
-          <w:i/>
-          <w:iCs/>
-          <w:kern w:val="0"/>
-          <w:sz w:val="20"/>
-          <w:szCs w:val="20"/>
-          <w:lang w:eastAsia="fr-FR"/>
-          <w14:ligatures w14:val="none"/>
-        </w:rPr>
-        <w:t xml:space="preserve"> Split</w:t>
-      </w:r>
-      <w:r>
-        <w:rPr>
-          <w:rFonts w:eastAsia="Times New Roman" w:cstheme="minorHAnsi"/>
-          <w:kern w:val="0"/>
-          <w:sz w:val="20"/>
-          <w:szCs w:val="20"/>
-          <w:lang w:eastAsia="fr-FR"/>
-          <w14:ligatures w14:val="none"/>
-        </w:rPr>
-        <w:t xml:space="preserve"> (éviter le data </w:t>
-      </w:r>
-      <w:proofErr w:type="spellStart"/>
-      <w:r>
-        <w:rPr>
-          <w:rFonts w:eastAsia="Times New Roman" w:cstheme="minorHAnsi"/>
-          <w:kern w:val="0"/>
-          <w:sz w:val="20"/>
-          <w:szCs w:val="20"/>
-          <w:lang w:eastAsia="fr-FR"/>
-          <w14:ligatures w14:val="none"/>
-        </w:rPr>
-        <w:t>leakage</w:t>
-      </w:r>
-      <w:proofErr w:type="spellEnd"/>
-      <w:r>
-        <w:rPr>
-          <w:rFonts w:eastAsia="Times New Roman" w:cstheme="minorHAnsi"/>
-          <w:kern w:val="0"/>
-          <w:sz w:val="20"/>
-          <w:szCs w:val="20"/>
-          <w:lang w:eastAsia="fr-FR"/>
-          <w14:ligatures w14:val="none"/>
-        </w:rPr>
-        <w:t xml:space="preserve"> futur).</w:t>
+        <w:t>Time Series Split</w:t>
+      </w:r>
+      <w:r>
+        <w:rPr>
+          <w:rFonts w:eastAsia="Times New Roman" w:cstheme="minorHAnsi"/>
+          <w:kern w:val="0"/>
+          <w:sz w:val="20"/>
+          <w:szCs w:val="20"/>
+          <w:lang w:eastAsia="fr-FR"/>
+          <w14:ligatures w14:val="none"/>
+        </w:rPr>
+        <w:t xml:space="preserve"> (éviter le data leakage futur).</w:t>
       </w:r>
     </w:p>
     <w:p>
@@ -7997,55 +5773,7 @@
           <w:lang w:eastAsia="fr-FR"/>
           <w14:ligatures w14:val="none"/>
         </w:rPr>
-        <w:t xml:space="preserve"> : </w:t>
-      </w:r>
-      <w:proofErr w:type="spellStart"/>
-      <w:r>
-        <w:rPr>
-          <w:rFonts w:eastAsia="Times New Roman" w:cstheme="minorHAnsi"/>
-          <w:kern w:val="0"/>
-          <w:sz w:val="20"/>
-          <w:szCs w:val="20"/>
-          <w:lang w:eastAsia="fr-FR"/>
-          <w14:ligatures w14:val="none"/>
-        </w:rPr>
-        <w:t>XGBoost</w:t>
-      </w:r>
-      <w:proofErr w:type="spellEnd"/>
-      <w:r>
-        <w:rPr>
-          <w:rFonts w:eastAsia="Times New Roman" w:cstheme="minorHAnsi"/>
-          <w:kern w:val="0"/>
-          <w:sz w:val="20"/>
-          <w:szCs w:val="20"/>
-          <w:lang w:eastAsia="fr-FR"/>
-          <w14:ligatures w14:val="none"/>
-        </w:rPr>
-        <w:t xml:space="preserve">, </w:t>
-      </w:r>
-      <w:proofErr w:type="spellStart"/>
-      <w:r>
-        <w:rPr>
-          <w:rFonts w:eastAsia="Times New Roman" w:cstheme="minorHAnsi"/>
-          <w:kern w:val="0"/>
-          <w:sz w:val="20"/>
-          <w:szCs w:val="20"/>
-          <w:lang w:eastAsia="fr-FR"/>
-          <w14:ligatures w14:val="none"/>
-        </w:rPr>
-        <w:t>LightGBM</w:t>
-      </w:r>
-      <w:proofErr w:type="spellEnd"/>
-      <w:r>
-        <w:rPr>
-          <w:rFonts w:eastAsia="Times New Roman" w:cstheme="minorHAnsi"/>
-          <w:kern w:val="0"/>
-          <w:sz w:val="20"/>
-          <w:szCs w:val="20"/>
-          <w:lang w:eastAsia="fr-FR"/>
-          <w14:ligatures w14:val="none"/>
-        </w:rPr>
-        <w:t>, Random Forest appliqués aux séries temporelles.</w:t>
+        <w:t xml:space="preserve"> : XGBoost, LightGBM, Random Forest appliqués aux séries temporelles.</w:t>
       </w:r>
     </w:p>
     <w:p>
@@ -8127,55 +5855,7 @@
           <w:lang w:eastAsia="fr-FR"/>
           <w14:ligatures w14:val="none"/>
         </w:rPr>
-        <w:t xml:space="preserve"> : Construction d'un pipeline complet de Machine Learning avec </w:t>
-      </w:r>
-      <w:proofErr w:type="spellStart"/>
-      <w:r>
-        <w:rPr>
-          <w:rFonts w:eastAsia="Times New Roman" w:cstheme="minorHAnsi"/>
-          <w:kern w:val="0"/>
-          <w:sz w:val="20"/>
-          <w:szCs w:val="20"/>
-          <w:lang w:eastAsia="fr-FR"/>
-          <w14:ligatures w14:val="none"/>
-        </w:rPr>
-        <w:t>scikit</w:t>
-      </w:r>
-      <w:proofErr w:type="spellEnd"/>
-      <w:r>
-        <w:rPr>
-          <w:rFonts w:eastAsia="Times New Roman" w:cstheme="minorHAnsi"/>
-          <w:kern w:val="0"/>
-          <w:sz w:val="20"/>
-          <w:szCs w:val="20"/>
-          <w:lang w:eastAsia="fr-FR"/>
-          <w14:ligatures w14:val="none"/>
-        </w:rPr>
-        <w:t xml:space="preserve">-learn et </w:t>
-      </w:r>
-      <w:proofErr w:type="spellStart"/>
-      <w:r>
-        <w:rPr>
-          <w:rFonts w:eastAsia="Times New Roman" w:cstheme="minorHAnsi"/>
-          <w:kern w:val="0"/>
-          <w:sz w:val="20"/>
-          <w:szCs w:val="20"/>
-          <w:lang w:eastAsia="fr-FR"/>
-          <w14:ligatures w14:val="none"/>
-        </w:rPr>
-        <w:t>LightGBM</w:t>
-      </w:r>
-      <w:proofErr w:type="spellEnd"/>
-      <w:r>
-        <w:rPr>
-          <w:rFonts w:eastAsia="Times New Roman" w:cstheme="minorHAnsi"/>
-          <w:kern w:val="0"/>
-          <w:sz w:val="20"/>
-          <w:szCs w:val="20"/>
-          <w:lang w:eastAsia="fr-FR"/>
-          <w14:ligatures w14:val="none"/>
-        </w:rPr>
-        <w:t>.</w:t>
+        <w:t xml:space="preserve"> : Construction d'un pipeline complet de Machine Learning avec scikit-learn et LightGBM.</w:t>
       </w:r>
     </w:p>
     <w:p>
@@ -8271,31 +5951,7 @@
           <w:lang w:eastAsia="fr-FR"/>
           <w14:ligatures w14:val="none"/>
         </w:rPr>
-        <w:t xml:space="preserve"> : Introduction aux cellules LSTM (Long Short-</w:t>
-      </w:r>
-      <w:proofErr w:type="spellStart"/>
-      <w:r>
-        <w:rPr>
-          <w:rFonts w:eastAsia="Times New Roman" w:cstheme="minorHAnsi"/>
-          <w:kern w:val="0"/>
-          <w:sz w:val="20"/>
-          <w:szCs w:val="20"/>
-          <w:lang w:eastAsia="fr-FR"/>
-          <w14:ligatures w14:val="none"/>
-        </w:rPr>
-        <w:t>Term</w:t>
-      </w:r>
-      <w:proofErr w:type="spellEnd"/>
-      <w:r>
-        <w:rPr>
-          <w:rFonts w:eastAsia="Times New Roman" w:cstheme="minorHAnsi"/>
-          <w:kern w:val="0"/>
-          <w:sz w:val="20"/>
-          <w:szCs w:val="20"/>
-          <w:lang w:eastAsia="fr-FR"/>
-          <w14:ligatures w14:val="none"/>
-        </w:rPr>
-        <w:t xml:space="preserve"> Memory) et GRU.</w:t>
+        <w:t xml:space="preserve"> : Introduction aux cellules LSTM (Long Short-Term Memory) et GRU.</w:t>
       </w:r>
     </w:p>
     <w:p>
@@ -8336,103 +5992,7 @@
           <w:lang w:eastAsia="fr-FR"/>
           <w14:ligatures w14:val="none"/>
         </w:rPr>
-        <w:t xml:space="preserve"> : Introduction aux architectures modernes adaptées au time </w:t>
-      </w:r>
-      <w:proofErr w:type="spellStart"/>
-      <w:r>
-        <w:rPr>
-          <w:rFonts w:eastAsia="Times New Roman" w:cstheme="minorHAnsi"/>
-          <w:kern w:val="0"/>
-          <w:sz w:val="20"/>
-          <w:szCs w:val="20"/>
-          <w:lang w:eastAsia="fr-FR"/>
-          <w14:ligatures w14:val="none"/>
-        </w:rPr>
-        <w:t>series</w:t>
-      </w:r>
-      <w:proofErr w:type="spellEnd"/>
-      <w:r>
-        <w:rPr>
-          <w:rFonts w:eastAsia="Times New Roman" w:cstheme="minorHAnsi"/>
-          <w:kern w:val="0"/>
-          <w:sz w:val="20"/>
-          <w:szCs w:val="20"/>
-          <w:lang w:eastAsia="fr-FR"/>
-          <w14:ligatures w14:val="none"/>
-        </w:rPr>
-        <w:t xml:space="preserve"> </w:t>
-      </w:r>
-      <w:proofErr w:type="spellStart"/>
-      <w:r>
-        <w:rPr>
-          <w:rFonts w:eastAsia="Times New Roman" w:cstheme="minorHAnsi"/>
-          <w:kern w:val="0"/>
-          <w:sz w:val="20"/>
-          <w:szCs w:val="20"/>
-          <w:lang w:eastAsia="fr-FR"/>
-          <w14:ligatures w14:val="none"/>
-        </w:rPr>
-        <w:t>forecasting</w:t>
-      </w:r>
-      <w:proofErr w:type="spellEnd"/>
-      <w:r>
-        <w:rPr>
-          <w:rFonts w:eastAsia="Times New Roman" w:cstheme="minorHAnsi"/>
-          <w:kern w:val="0"/>
-          <w:sz w:val="20"/>
-          <w:szCs w:val="20"/>
-          <w:lang w:eastAsia="fr-FR"/>
-          <w14:ligatures w14:val="none"/>
-        </w:rPr>
-        <w:t xml:space="preserve"> (</w:t>
-      </w:r>
-      <w:proofErr w:type="gramStart"/>
-      <w:r>
-        <w:rPr>
-          <w:rFonts w:eastAsia="Times New Roman" w:cstheme="minorHAnsi"/>
-          <w:kern w:val="0"/>
-          <w:sz w:val="20"/>
-          <w:szCs w:val="20"/>
-          <w:lang w:eastAsia="fr-FR"/>
-          <w14:ligatures w14:val="none"/>
-        </w:rPr>
-        <w:t>ex:</w:t>
-      </w:r>
-      <w:proofErr w:type="gramEnd"/>
-      <w:r>
-        <w:rPr>
-          <w:rFonts w:eastAsia="Times New Roman" w:cstheme="minorHAnsi"/>
-          <w:kern w:val="0"/>
-          <w:sz w:val="20"/>
-          <w:szCs w:val="20"/>
-          <w:lang w:eastAsia="fr-FR"/>
-          <w14:ligatures w14:val="none"/>
-        </w:rPr>
-        <w:t xml:space="preserve"> </w:t>
-      </w:r>
-      <w:proofErr w:type="spellStart"/>
-      <w:r>
-        <w:rPr>
-          <w:rFonts w:eastAsia="Times New Roman" w:cstheme="minorHAnsi"/>
-          <w:kern w:val="0"/>
-          <w:sz w:val="20"/>
-          <w:szCs w:val="20"/>
-          <w:lang w:eastAsia="fr-FR"/>
-          <w14:ligatures w14:val="none"/>
-        </w:rPr>
-        <w:t>PatchTST</w:t>
-      </w:r>
-      <w:proofErr w:type="spellEnd"/>
-      <w:r>
-        <w:rPr>
-          <w:rFonts w:eastAsia="Times New Roman" w:cstheme="minorHAnsi"/>
-          <w:kern w:val="0"/>
-          <w:sz w:val="20"/>
-          <w:szCs w:val="20"/>
-          <w:lang w:eastAsia="fr-FR"/>
-          <w14:ligatures w14:val="none"/>
-        </w:rPr>
-        <w:t>).</w:t>
+        <w:t xml:space="preserve"> : Introduction aux architectures modernes adaptées au time series forecasting (ex: PatchTST).</w:t>
       </w:r>
     </w:p>
     <w:p>
@@ -8473,31 +6033,7 @@
           <w:lang w:eastAsia="fr-FR"/>
           <w14:ligatures w14:val="none"/>
         </w:rPr>
-        <w:t xml:space="preserve"> : Création d'un modèle LSTM simple avec PyTorch ou </w:t>
-      </w:r>
-      <w:proofErr w:type="spellStart"/>
-      <w:r>
-        <w:rPr>
-          <w:rFonts w:eastAsia="Times New Roman" w:cstheme="minorHAnsi"/>
-          <w:kern w:val="0"/>
-          <w:sz w:val="20"/>
-          <w:szCs w:val="20"/>
-          <w:lang w:eastAsia="fr-FR"/>
-          <w14:ligatures w14:val="none"/>
-        </w:rPr>
-        <w:t>TensorFlow</w:t>
-      </w:r>
-      <w:proofErr w:type="spellEnd"/>
-      <w:r>
-        <w:rPr>
-          <w:rFonts w:eastAsia="Times New Roman" w:cstheme="minorHAnsi"/>
-          <w:kern w:val="0"/>
-          <w:sz w:val="20"/>
-          <w:szCs w:val="20"/>
-          <w:lang w:eastAsia="fr-FR"/>
-          <w14:ligatures w14:val="none"/>
-        </w:rPr>
-        <w:t>.</w:t>
+        <w:t xml:space="preserve"> : Création d'un modèle LSTM simple avec PyTorch ou TensorFlow.</w:t>
       </w:r>
     </w:p>
     <w:p>
@@ -8593,7 +6129,31 @@
           <w:lang w:eastAsia="fr-FR"/>
           <w14:ligatures w14:val="none"/>
         </w:rPr>
-        <w:t xml:space="preserve"> : MAE, MSE, RMSE, MAPE, MASE.</w:t>
+        <w:t xml:space="preserve"> : MAE, MSE, RMSE, </w:t>
+      </w:r>
+      <w:r>
+        <w:rPr>
+          <w:rFonts w:eastAsia="Times New Roman" w:cstheme="minorHAnsi"/>
+          <w:b/>
+          <w:bCs/>
+          <w:kern w:val="0"/>
+          <w:sz w:val="20"/>
+          <w:szCs w:val="20"/>
+          <w:lang w:eastAsia="fr-FR"/>
+          <w14:ligatures w14:val="none"/>
+        </w:rPr>
+        <w:t>MAPE</w:t>
+      </w:r>
+      <w:r>
+        <w:rPr>
+          <w:rFonts w:eastAsia="Times New Roman" w:cstheme="minorHAnsi"/>
+          <w:kern w:val="0"/>
+          <w:sz w:val="20"/>
+          <w:szCs w:val="20"/>
+          <w:lang w:eastAsia="fr-FR"/>
+          <w14:ligatures w14:val="none"/>
+        </w:rPr>
+        <w:t>, MASE.</w:t>
       </w:r>
     </w:p>
     <w:p>
@@ -8653,7 +6213,6 @@
           <w14:ligatures w14:val="none"/>
         </w:rPr>
       </w:pPr>
-      <w:proofErr w:type="spellStart"/>
       <w:r>
         <w:rPr>
           <w:rFonts w:eastAsia="Times New Roman" w:cstheme="minorHAnsi"/>
@@ -8667,7 +6226,6 @@
         </w:rPr>
         <w:t>Backtesting</w:t>
       </w:r>
-      <w:proofErr w:type="spellEnd"/>
       <w:r>
         <w:rPr>
           <w:rFonts w:eastAsia="Times New Roman" w:cstheme="minorHAnsi"/>
@@ -8706,35 +6264,7 @@
           <w:lang w:eastAsia="fr-FR"/>
           <w14:ligatures w14:val="none"/>
         </w:rPr>
-        <w:t>Days 66–</w:t>
-      </w:r>
-      <w:proofErr w:type="gramStart"/>
-      <w:r>
-        <w:rPr>
-          <w:rFonts w:ascii="Times New Roman" w:eastAsia="Times New Roman" w:hAnsi="Times New Roman" w:cs="Times New Roman"/>
-          <w:b/>
-          <w:bCs/>
-          <w:kern w:val="0"/>
-          <w:sz w:val="27"/>
-          <w:szCs w:val="27"/>
-          <w:lang w:eastAsia="fr-FR"/>
-          <w14:ligatures w14:val="none"/>
-        </w:rPr>
-        <w:t>70:</w:t>
-      </w:r>
-      <w:proofErr w:type="gramEnd"/>
-      <w:r>
-        <w:rPr>
-          <w:rFonts w:ascii="Times New Roman" w:eastAsia="Times New Roman" w:hAnsi="Times New Roman" w:cs="Times New Roman"/>
-          <w:b/>
-          <w:bCs/>
-          <w:kern w:val="0"/>
-          <w:sz w:val="27"/>
-          <w:szCs w:val="27"/>
-          <w:lang w:eastAsia="fr-FR"/>
-          <w14:ligatures w14:val="none"/>
-        </w:rPr>
-        <w:t xml:space="preserve"> NLP Basics</w:t>
+        <w:t>Days 66–70: NLP Basics</w:t>
       </w:r>
     </w:p>
     <w:p>
@@ -8764,126 +6294,8 @@
           <w:lang w:eastAsia="fr-FR"/>
           <w14:ligatures w14:val="none"/>
         </w:rPr>
-        <w:t xml:space="preserve">Day </w:t>
-      </w:r>
-      <w:proofErr w:type="gramStart"/>
-      <w:r>
-        <w:rPr>
-          <w:rFonts w:ascii="Times New Roman" w:eastAsia="Times New Roman" w:hAnsi="Times New Roman" w:cs="Times New Roman"/>
-          <w:kern w:val="0"/>
-          <w:sz w:val="24"/>
-          <w:szCs w:val="24"/>
-          <w:highlight w:val="yellow"/>
-          <w:lang w:eastAsia="fr-FR"/>
-          <w14:ligatures w14:val="none"/>
-        </w:rPr>
-        <w:t>66:</w:t>
-      </w:r>
-      <w:proofErr w:type="gramEnd"/>
-      <w:r>
-        <w:rPr>
-          <w:rFonts w:ascii="Times New Roman" w:eastAsia="Times New Roman" w:hAnsi="Times New Roman" w:cs="Times New Roman"/>
-          <w:kern w:val="0"/>
-          <w:sz w:val="24"/>
-          <w:szCs w:val="24"/>
-          <w:highlight w:val="yellow"/>
-          <w:lang w:eastAsia="fr-FR"/>
-          <w14:ligatures w14:val="none"/>
-        </w:rPr>
-        <w:t xml:space="preserve"> </w:t>
-      </w:r>
-      <w:proofErr w:type="spellStart"/>
-      <w:r>
-        <w:rPr>
-          <w:rFonts w:ascii="Times New Roman" w:eastAsia="Times New Roman" w:hAnsi="Times New Roman" w:cs="Times New Roman"/>
-          <w:kern w:val="0"/>
-          <w:sz w:val="24"/>
-          <w:szCs w:val="24"/>
-          <w:highlight w:val="yellow"/>
-          <w:lang w:eastAsia="fr-FR"/>
-          <w14:ligatures w14:val="none"/>
-        </w:rPr>
-        <w:t>Text</w:t>
-      </w:r>
-      <w:proofErr w:type="spellEnd"/>
-      <w:r>
-        <w:rPr>
-          <w:rFonts w:ascii="Times New Roman" w:eastAsia="Times New Roman" w:hAnsi="Times New Roman" w:cs="Times New Roman"/>
-          <w:kern w:val="0"/>
-          <w:sz w:val="24"/>
-          <w:szCs w:val="24"/>
-          <w:highlight w:val="yellow"/>
-          <w:lang w:eastAsia="fr-FR"/>
-          <w14:ligatures w14:val="none"/>
-        </w:rPr>
-        <w:t xml:space="preserve"> </w:t>
-      </w:r>
-      <w:proofErr w:type="spellStart"/>
-      <w:r>
-        <w:rPr>
-          <w:rFonts w:ascii="Times New Roman" w:eastAsia="Times New Roman" w:hAnsi="Times New Roman" w:cs="Times New Roman"/>
-          <w:kern w:val="0"/>
-          <w:sz w:val="24"/>
-          <w:szCs w:val="24"/>
-          <w:highlight w:val="yellow"/>
-          <w:lang w:eastAsia="fr-FR"/>
-          <w14:ligatures w14:val="none"/>
-        </w:rPr>
-        <w:t>preprocessing</w:t>
-      </w:r>
-      <w:proofErr w:type="spellEnd"/>
-      <w:r>
-        <w:rPr>
-          <w:rFonts w:ascii="Times New Roman" w:eastAsia="Times New Roman" w:hAnsi="Times New Roman" w:cs="Times New Roman"/>
-          <w:kern w:val="0"/>
-          <w:sz w:val="24"/>
-          <w:szCs w:val="24"/>
-          <w:highlight w:val="yellow"/>
-          <w:lang w:eastAsia="fr-FR"/>
-          <w14:ligatures w14:val="none"/>
-        </w:rPr>
-        <w:t xml:space="preserve"> – </w:t>
-      </w:r>
-      <w:proofErr w:type="spellStart"/>
-      <w:r>
-        <w:rPr>
-          <w:rFonts w:ascii="Times New Roman" w:eastAsia="Times New Roman" w:hAnsi="Times New Roman" w:cs="Times New Roman"/>
-          <w:kern w:val="0"/>
-          <w:sz w:val="24"/>
-          <w:szCs w:val="24"/>
-          <w:highlight w:val="yellow"/>
-          <w:lang w:eastAsia="fr-FR"/>
-          <w14:ligatures w14:val="none"/>
-        </w:rPr>
-        <w:t>tokenization</w:t>
-      </w:r>
-      <w:proofErr w:type="spellEnd"/>
-      <w:r>
-        <w:rPr>
-          <w:rFonts w:ascii="Times New Roman" w:eastAsia="Times New Roman" w:hAnsi="Times New Roman" w:cs="Times New Roman"/>
-          <w:kern w:val="0"/>
-          <w:sz w:val="24"/>
-          <w:szCs w:val="24"/>
-          <w:highlight w:val="yellow"/>
-          <w:lang w:eastAsia="fr-FR"/>
-          <w14:ligatures w14:val="none"/>
-        </w:rPr>
-        <w:t xml:space="preserve">, </w:t>
-      </w:r>
-      <w:proofErr w:type="spellStart"/>
-      <w:r>
-        <w:rPr>
-          <w:rFonts w:ascii="Times New Roman" w:eastAsia="Times New Roman" w:hAnsi="Times New Roman" w:cs="Times New Roman"/>
-          <w:kern w:val="0"/>
-          <w:sz w:val="24"/>
-          <w:szCs w:val="24"/>
-          <w:highlight w:val="yellow"/>
-          <w:lang w:eastAsia="fr-FR"/>
-          <w14:ligatures w14:val="none"/>
-        </w:rPr>
-        <w:t>stopwords</w:t>
-      </w:r>
-      <w:proofErr w:type="spellEnd"/>
+        <w:t>Day 66: Text preprocessing – tokenization, stopwords</w:t>
+      </w:r>
     </w:p>
     <w:p>
       <w:pPr>
@@ -8984,74 +6396,8 @@
           <w:lang w:eastAsia="fr-FR"/>
           <w14:ligatures w14:val="none"/>
         </w:rPr>
-        <w:t xml:space="preserve">Day </w:t>
-      </w:r>
-      <w:proofErr w:type="gramStart"/>
-      <w:r>
-        <w:rPr>
-          <w:rFonts w:ascii="Times New Roman" w:eastAsia="Times New Roman" w:hAnsi="Times New Roman" w:cs="Times New Roman"/>
-          <w:kern w:val="0"/>
-          <w:sz w:val="24"/>
-          <w:szCs w:val="24"/>
-          <w:highlight w:val="yellow"/>
-          <w:lang w:eastAsia="fr-FR"/>
-          <w14:ligatures w14:val="none"/>
-        </w:rPr>
-        <w:t>69:</w:t>
-      </w:r>
-      <w:proofErr w:type="gramEnd"/>
-      <w:r>
-        <w:rPr>
-          <w:rFonts w:ascii="Times New Roman" w:eastAsia="Times New Roman" w:hAnsi="Times New Roman" w:cs="Times New Roman"/>
-          <w:kern w:val="0"/>
-          <w:sz w:val="24"/>
-          <w:szCs w:val="24"/>
-          <w:highlight w:val="yellow"/>
-          <w:lang w:eastAsia="fr-FR"/>
-          <w14:ligatures w14:val="none"/>
-        </w:rPr>
-        <w:t xml:space="preserve"> Sentiment </w:t>
-      </w:r>
-      <w:proofErr w:type="spellStart"/>
-      <w:r>
-        <w:rPr>
-          <w:rFonts w:ascii="Times New Roman" w:eastAsia="Times New Roman" w:hAnsi="Times New Roman" w:cs="Times New Roman"/>
-          <w:kern w:val="0"/>
-          <w:sz w:val="24"/>
-          <w:szCs w:val="24"/>
-          <w:highlight w:val="yellow"/>
-          <w:lang w:eastAsia="fr-FR"/>
-          <w14:ligatures w14:val="none"/>
-        </w:rPr>
-        <w:t>analysis</w:t>
-      </w:r>
-      <w:proofErr w:type="spellEnd"/>
-      <w:r>
-        <w:rPr>
-          <w:rFonts w:ascii="Times New Roman" w:eastAsia="Times New Roman" w:hAnsi="Times New Roman" w:cs="Times New Roman"/>
-          <w:kern w:val="0"/>
-          <w:sz w:val="24"/>
-          <w:szCs w:val="24"/>
-          <w:highlight w:val="yellow"/>
-          <w:lang w:eastAsia="fr-FR"/>
-          <w14:ligatures w14:val="none"/>
-        </w:rPr>
-        <w:t xml:space="preserve"> </w:t>
-      </w:r>
-      <w:proofErr w:type="spellStart"/>
-      <w:r>
-        <w:rPr>
-          <w:rFonts w:ascii="Times New Roman" w:eastAsia="Times New Roman" w:hAnsi="Times New Roman" w:cs="Times New Roman"/>
-          <w:kern w:val="0"/>
-          <w:sz w:val="24"/>
-          <w:szCs w:val="24"/>
-          <w:highlight w:val="yellow"/>
-          <w:lang w:eastAsia="fr-FR"/>
-          <w14:ligatures w14:val="none"/>
-        </w:rPr>
-        <w:t>project</w:t>
-      </w:r>
-      <w:proofErr w:type="spellEnd"/>
+        <w:t>Day 69: Sentiment analysis project</w:t>
+      </w:r>
     </w:p>
     <w:p>
       <w:pPr>
@@ -9129,35 +6475,7 @@
           <w:lang w:eastAsia="fr-FR"/>
           <w14:ligatures w14:val="none"/>
         </w:rPr>
-        <w:t>Days 71–</w:t>
-      </w:r>
-      <w:proofErr w:type="gramStart"/>
-      <w:r>
-        <w:rPr>
-          <w:rFonts w:ascii="Times New Roman" w:eastAsia="Times New Roman" w:hAnsi="Times New Roman" w:cs="Times New Roman"/>
-          <w:b/>
-          <w:bCs/>
-          <w:kern w:val="0"/>
-          <w:sz w:val="27"/>
-          <w:szCs w:val="27"/>
-          <w:lang w:eastAsia="fr-FR"/>
-          <w14:ligatures w14:val="none"/>
-        </w:rPr>
-        <w:t>75:</w:t>
-      </w:r>
-      <w:proofErr w:type="gramEnd"/>
-      <w:r>
-        <w:rPr>
-          <w:rFonts w:ascii="Times New Roman" w:eastAsia="Times New Roman" w:hAnsi="Times New Roman" w:cs="Times New Roman"/>
-          <w:b/>
-          <w:bCs/>
-          <w:kern w:val="0"/>
-          <w:sz w:val="27"/>
-          <w:szCs w:val="27"/>
-          <w:lang w:eastAsia="fr-FR"/>
-          <w14:ligatures w14:val="none"/>
-        </w:rPr>
-        <w:t xml:space="preserve"> Deep Learning Basics</w:t>
+        <w:t>Days 71–75: Deep Learning Basics</w:t>
       </w:r>
     </w:p>
     <w:p>
@@ -9189,46 +6507,18 @@
         </w:rPr>
         <w:t xml:space="preserve">Day 71: What is deep learning? </w:t>
       </w:r>
-      <w:proofErr w:type="spellStart"/>
-      <w:r>
-        <w:rPr>
-          <w:rFonts w:ascii="Times New Roman" w:eastAsia="Times New Roman" w:hAnsi="Times New Roman" w:cs="Times New Roman"/>
-          <w:kern w:val="0"/>
-          <w:sz w:val="24"/>
-          <w:szCs w:val="24"/>
-          <w:highlight w:val="yellow"/>
-          <w:lang w:eastAsia="fr-FR"/>
-          <w14:ligatures w14:val="none"/>
-        </w:rPr>
-        <w:t>Neurons</w:t>
-      </w:r>
-      <w:proofErr w:type="spellEnd"/>
-      <w:r>
-        <w:rPr>
-          <w:rFonts w:ascii="Times New Roman" w:eastAsia="Times New Roman" w:hAnsi="Times New Roman" w:cs="Times New Roman"/>
-          <w:kern w:val="0"/>
-          <w:sz w:val="24"/>
-          <w:szCs w:val="24"/>
-          <w:highlight w:val="yellow"/>
-          <w:lang w:eastAsia="fr-FR"/>
-          <w14:ligatures w14:val="none"/>
-        </w:rPr>
-        <w:t xml:space="preserve">, </w:t>
-      </w:r>
-      <w:proofErr w:type="spellStart"/>
-      <w:r>
-        <w:rPr>
-          <w:rFonts w:ascii="Times New Roman" w:eastAsia="Times New Roman" w:hAnsi="Times New Roman" w:cs="Times New Roman"/>
-          <w:kern w:val="0"/>
-          <w:sz w:val="24"/>
-          <w:szCs w:val="24"/>
-          <w:highlight w:val="yellow"/>
-          <w:lang w:eastAsia="fr-FR"/>
-          <w14:ligatures w14:val="none"/>
-        </w:rPr>
-        <w:t>layers</w:t>
-      </w:r>
-      <w:proofErr w:type="spellEnd"/>
+      <w:r>
+        <w:rPr>
+          <w:rFonts w:ascii="Times New Roman" w:eastAsia="Times New Roman" w:hAnsi="Times New Roman" w:cs="Times New Roman"/>
+          <w:kern w:val="0"/>
+          <w:sz w:val="24"/>
+          <w:szCs w:val="24"/>
+          <w:highlight w:val="yellow"/>
+          <w:lang w:eastAsia="fr-FR"/>
+          <w14:ligatures w14:val="none"/>
+        </w:rPr>
+        <w:t>Neurons, layers</w:t>
+      </w:r>
     </w:p>
     <w:p>
       <w:pPr>
@@ -9257,33 +6547,7 @@
           <w:lang w:eastAsia="fr-FR"/>
           <w14:ligatures w14:val="none"/>
         </w:rPr>
-        <w:t xml:space="preserve">Day </w:t>
-      </w:r>
-      <w:proofErr w:type="gramStart"/>
-      <w:r>
-        <w:rPr>
-          <w:rFonts w:ascii="Times New Roman" w:eastAsia="Times New Roman" w:hAnsi="Times New Roman" w:cs="Times New Roman"/>
-          <w:kern w:val="0"/>
-          <w:sz w:val="24"/>
-          <w:szCs w:val="24"/>
-          <w:highlight w:val="yellow"/>
-          <w:lang w:eastAsia="fr-FR"/>
-          <w14:ligatures w14:val="none"/>
-        </w:rPr>
-        <w:t>72:</w:t>
-      </w:r>
-      <w:proofErr w:type="gramEnd"/>
-      <w:r>
-        <w:rPr>
-          <w:rFonts w:ascii="Times New Roman" w:eastAsia="Times New Roman" w:hAnsi="Times New Roman" w:cs="Times New Roman"/>
-          <w:kern w:val="0"/>
-          <w:sz w:val="24"/>
-          <w:szCs w:val="24"/>
-          <w:highlight w:val="yellow"/>
-          <w:lang w:eastAsia="fr-FR"/>
-          <w14:ligatures w14:val="none"/>
-        </w:rPr>
-        <w:t xml:space="preserve"> Intro to PyTorch</w:t>
+        <w:t>Day 72: Intro to PyTorch</w:t>
       </w:r>
     </w:p>
     <w:p>
@@ -9343,74 +6607,8 @@
           <w:lang w:eastAsia="fr-FR"/>
           <w14:ligatures w14:val="none"/>
         </w:rPr>
-        <w:t xml:space="preserve">Day </w:t>
-      </w:r>
-      <w:proofErr w:type="gramStart"/>
-      <w:r>
-        <w:rPr>
-          <w:rFonts w:ascii="Times New Roman" w:eastAsia="Times New Roman" w:hAnsi="Times New Roman" w:cs="Times New Roman"/>
-          <w:kern w:val="0"/>
-          <w:sz w:val="24"/>
-          <w:szCs w:val="24"/>
-          <w:highlight w:val="yellow"/>
-          <w:lang w:eastAsia="fr-FR"/>
-          <w14:ligatures w14:val="none"/>
-        </w:rPr>
-        <w:t>74:</w:t>
-      </w:r>
-      <w:proofErr w:type="gramEnd"/>
-      <w:r>
-        <w:rPr>
-          <w:rFonts w:ascii="Times New Roman" w:eastAsia="Times New Roman" w:hAnsi="Times New Roman" w:cs="Times New Roman"/>
-          <w:kern w:val="0"/>
-          <w:sz w:val="24"/>
-          <w:szCs w:val="24"/>
-          <w:highlight w:val="yellow"/>
-          <w:lang w:eastAsia="fr-FR"/>
-          <w14:ligatures w14:val="none"/>
-        </w:rPr>
-        <w:t xml:space="preserve"> Training </w:t>
-      </w:r>
-      <w:proofErr w:type="spellStart"/>
-      <w:r>
-        <w:rPr>
-          <w:rFonts w:ascii="Times New Roman" w:eastAsia="Times New Roman" w:hAnsi="Times New Roman" w:cs="Times New Roman"/>
-          <w:kern w:val="0"/>
-          <w:sz w:val="24"/>
-          <w:szCs w:val="24"/>
-          <w:highlight w:val="yellow"/>
-          <w:lang w:eastAsia="fr-FR"/>
-          <w14:ligatures w14:val="none"/>
-        </w:rPr>
-        <w:t>loop</w:t>
-      </w:r>
-      <w:proofErr w:type="spellEnd"/>
-      <w:r>
-        <w:rPr>
-          <w:rFonts w:ascii="Times New Roman" w:eastAsia="Times New Roman" w:hAnsi="Times New Roman" w:cs="Times New Roman"/>
-          <w:kern w:val="0"/>
-          <w:sz w:val="24"/>
-          <w:szCs w:val="24"/>
-          <w:highlight w:val="yellow"/>
-          <w:lang w:eastAsia="fr-FR"/>
-          <w14:ligatures w14:val="none"/>
-        </w:rPr>
-        <w:t xml:space="preserve">, </w:t>
-      </w:r>
-      <w:proofErr w:type="spellStart"/>
-      <w:r>
-        <w:rPr>
-          <w:rFonts w:ascii="Times New Roman" w:eastAsia="Times New Roman" w:hAnsi="Times New Roman" w:cs="Times New Roman"/>
-          <w:kern w:val="0"/>
-          <w:sz w:val="24"/>
-          <w:szCs w:val="24"/>
-          <w:highlight w:val="yellow"/>
-          <w:lang w:eastAsia="fr-FR"/>
-          <w14:ligatures w14:val="none"/>
-        </w:rPr>
-        <w:t>backpropagation</w:t>
-      </w:r>
-      <w:proofErr w:type="spellEnd"/>
+        <w:t>Day 74: Training loop, backpropagation</w:t>
+      </w:r>
     </w:p>
     <w:p>
       <w:pPr>
@@ -9439,73 +6637,7 @@
           <w:lang w:eastAsia="fr-FR"/>
           <w14:ligatures w14:val="none"/>
         </w:rPr>
-        <w:t xml:space="preserve">Day </w:t>
-      </w:r>
-      <w:proofErr w:type="gramStart"/>
-      <w:r>
-        <w:rPr>
-          <w:rFonts w:ascii="Times New Roman" w:eastAsia="Times New Roman" w:hAnsi="Times New Roman" w:cs="Times New Roman"/>
-          <w:kern w:val="0"/>
-          <w:sz w:val="24"/>
-          <w:szCs w:val="24"/>
-          <w:highlight w:val="yellow"/>
-          <w:lang w:eastAsia="fr-FR"/>
-          <w14:ligatures w14:val="none"/>
-        </w:rPr>
-        <w:t>75:</w:t>
-      </w:r>
-      <w:proofErr w:type="gramEnd"/>
-      <w:r>
-        <w:rPr>
-          <w:rFonts w:ascii="Times New Roman" w:eastAsia="Times New Roman" w:hAnsi="Times New Roman" w:cs="Times New Roman"/>
-          <w:kern w:val="0"/>
-          <w:sz w:val="24"/>
-          <w:szCs w:val="24"/>
-          <w:highlight w:val="yellow"/>
-          <w:lang w:eastAsia="fr-FR"/>
-          <w14:ligatures w14:val="none"/>
-        </w:rPr>
-        <w:t xml:space="preserve"> Mini </w:t>
-      </w:r>
-      <w:proofErr w:type="spellStart"/>
-      <w:proofErr w:type="gramStart"/>
-      <w:r>
-        <w:rPr>
-          <w:rFonts w:ascii="Times New Roman" w:eastAsia="Times New Roman" w:hAnsi="Times New Roman" w:cs="Times New Roman"/>
-          <w:kern w:val="0"/>
-          <w:sz w:val="24"/>
-          <w:szCs w:val="24"/>
-          <w:highlight w:val="yellow"/>
-          <w:lang w:eastAsia="fr-FR"/>
-          <w14:ligatures w14:val="none"/>
-        </w:rPr>
-        <w:t>project</w:t>
-      </w:r>
-      <w:proofErr w:type="spellEnd"/>
-      <w:r>
-        <w:rPr>
-          <w:rFonts w:ascii="Times New Roman" w:eastAsia="Times New Roman" w:hAnsi="Times New Roman" w:cs="Times New Roman"/>
-          <w:kern w:val="0"/>
-          <w:sz w:val="24"/>
-          <w:szCs w:val="24"/>
-          <w:highlight w:val="yellow"/>
-          <w:lang w:eastAsia="fr-FR"/>
-          <w14:ligatures w14:val="none"/>
-        </w:rPr>
-        <w:t>:</w:t>
-      </w:r>
-      <w:proofErr w:type="gramEnd"/>
-      <w:r>
-        <w:rPr>
-          <w:rFonts w:ascii="Times New Roman" w:eastAsia="Times New Roman" w:hAnsi="Times New Roman" w:cs="Times New Roman"/>
-          <w:kern w:val="0"/>
-          <w:sz w:val="24"/>
-          <w:szCs w:val="24"/>
-          <w:highlight w:val="yellow"/>
-          <w:lang w:eastAsia="fr-FR"/>
-          <w14:ligatures w14:val="none"/>
-        </w:rPr>
-        <w:t xml:space="preserve"> Digit recognition</w:t>
+        <w:t>Day 75: Mini project: Digit recognition</w:t>
       </w:r>
     </w:p>
     <w:p>
@@ -10443,6 +7575,155 @@
     </w:lvl>
   </w:abstractNum>
   <w:abstractNum w:abstractNumId="6" w15:restartNumberingAfterBreak="0">
+    <w:nsid w:val="10193ABB"/>
+    <w:multiLevelType w:val="multilevel"/>
+    <w:tmpl w:val="C02A9DC6"/>
+    <w:lvl w:ilvl="0">
+      <w:start w:val="1"/>
+      <w:numFmt w:val="bullet"/>
+      <w:lvlText w:val=""/>
+      <w:lvlJc w:val="left"/>
+      <w:pPr>
+        <w:tabs>
+          <w:tab w:val="num" w:pos="720"/>
+        </w:tabs>
+        <w:ind w:left="720" w:hanging="360"/>
+      </w:pPr>
+      <w:rPr>
+        <w:rFonts w:ascii="Symbol" w:hAnsi="Symbol" w:hint="default"/>
+        <w:sz w:val="20"/>
+      </w:rPr>
+    </w:lvl>
+    <w:lvl w:ilvl="1" w:tentative="1">
+      <w:start w:val="1"/>
+      <w:numFmt w:val="bullet"/>
+      <w:lvlText w:val=""/>
+      <w:lvlJc w:val="left"/>
+      <w:pPr>
+        <w:tabs>
+          <w:tab w:val="num" w:pos="1440"/>
+        </w:tabs>
+        <w:ind w:left="1440" w:hanging="360"/>
+      </w:pPr>
+      <w:rPr>
+        <w:rFonts w:ascii="Symbol" w:hAnsi="Symbol" w:hint="default"/>
+        <w:sz w:val="20"/>
+      </w:rPr>
+    </w:lvl>
+    <w:lvl w:ilvl="2" w:tentative="1">
+      <w:start w:val="1"/>
+      <w:numFmt w:val="bullet"/>
+      <w:lvlText w:val=""/>
+      <w:lvlJc w:val="left"/>
+      <w:pPr>
+        <w:tabs>
+          <w:tab w:val="num" w:pos="2160"/>
+        </w:tabs>
+        <w:ind w:left="2160" w:hanging="360"/>
+      </w:pPr>
+      <w:rPr>
+        <w:rFonts w:ascii="Symbol" w:hAnsi="Symbol" w:hint="default"/>
+        <w:sz w:val="20"/>
+      </w:rPr>
+    </w:lvl>
+    <w:lvl w:ilvl="3" w:tentative="1">
+      <w:start w:val="1"/>
+      <w:numFmt w:val="bullet"/>
+      <w:lvlText w:val=""/>
+      <w:lvlJc w:val="left"/>
+      <w:pPr>
+        <w:tabs>
+          <w:tab w:val="num" w:pos="2880"/>
+        </w:tabs>
+        <w:ind w:left="2880" w:hanging="360"/>
+      </w:pPr>
+      <w:rPr>
+        <w:rFonts w:ascii="Symbol" w:hAnsi="Symbol" w:hint="default"/>
+        <w:sz w:val="20"/>
+      </w:rPr>
+    </w:lvl>
+    <w:lvl w:ilvl="4" w:tentative="1">
+      <w:start w:val="1"/>
+      <w:numFmt w:val="bullet"/>
+      <w:lvlText w:val=""/>
+      <w:lvlJc w:val="left"/>
+      <w:pPr>
+        <w:tabs>
+          <w:tab w:val="num" w:pos="3600"/>
+        </w:tabs>
+        <w:ind w:left="3600" w:hanging="360"/>
+      </w:pPr>
+      <w:rPr>
+        <w:rFonts w:ascii="Symbol" w:hAnsi="Symbol" w:hint="default"/>
+        <w:sz w:val="20"/>
+      </w:rPr>
+    </w:lvl>
+    <w:lvl w:ilvl="5" w:tentative="1">
+      <w:start w:val="1"/>
+      <w:numFmt w:val="bullet"/>
+      <w:lvlText w:val=""/>
+      <w:lvlJc w:val="left"/>
+      <w:pPr>
+        <w:tabs>
+          <w:tab w:val="num" w:pos="4320"/>
+        </w:tabs>
+        <w:ind w:left="4320" w:hanging="360"/>
+      </w:pPr>
+      <w:rPr>
+        <w:rFonts w:ascii="Symbol" w:hAnsi="Symbol" w:hint="default"/>
+        <w:sz w:val="20"/>
+      </w:rPr>
+    </w:lvl>
+    <w:lvl w:ilvl="6" w:tentative="1">
+      <w:start w:val="1"/>
+      <w:numFmt w:val="bullet"/>
+      <w:lvlText w:val=""/>
+      <w:lvlJc w:val="left"/>
+      <w:pPr>
+        <w:tabs>
+          <w:tab w:val="num" w:pos="5040"/>
+        </w:tabs>
+        <w:ind w:left="5040" w:hanging="360"/>
+      </w:pPr>
+      <w:rPr>
+        <w:rFonts w:ascii="Symbol" w:hAnsi="Symbol" w:hint="default"/>
+        <w:sz w:val="20"/>
+      </w:rPr>
+    </w:lvl>
+    <w:lvl w:ilvl="7" w:tentative="1">
+      <w:start w:val="1"/>
+      <w:numFmt w:val="bullet"/>
+      <w:lvlText w:val=""/>
+      <w:lvlJc w:val="left"/>
+      <w:pPr>
+        <w:tabs>
+          <w:tab w:val="num" w:pos="5760"/>
+        </w:tabs>
+        <w:ind w:left="5760" w:hanging="360"/>
+      </w:pPr>
+      <w:rPr>
+        <w:rFonts w:ascii="Symbol" w:hAnsi="Symbol" w:hint="default"/>
+        <w:sz w:val="20"/>
+      </w:rPr>
+    </w:lvl>
+    <w:lvl w:ilvl="8" w:tentative="1">
+      <w:start w:val="1"/>
+      <w:numFmt w:val="bullet"/>
+      <w:lvlText w:val=""/>
+      <w:lvlJc w:val="left"/>
+      <w:pPr>
+        <w:tabs>
+          <w:tab w:val="num" w:pos="6480"/>
+        </w:tabs>
+        <w:ind w:left="6480" w:hanging="360"/>
+      </w:pPr>
+      <w:rPr>
+        <w:rFonts w:ascii="Symbol" w:hAnsi="Symbol" w:hint="default"/>
+        <w:sz w:val="20"/>
+      </w:rPr>
+    </w:lvl>
+  </w:abstractNum>
+  <w:abstractNum w:abstractNumId="7" w15:restartNumberingAfterBreak="0">
     <w:nsid w:val="1F3439CF"/>
     <w:multiLevelType w:val="multilevel"/>
     <w:tmpl w:val="03E251E4"/>
@@ -10591,7 +7872,7 @@
       </w:rPr>
     </w:lvl>
   </w:abstractNum>
-  <w:abstractNum w:abstractNumId="7" w15:restartNumberingAfterBreak="0">
+  <w:abstractNum w:abstractNumId="8" w15:restartNumberingAfterBreak="0">
     <w:nsid w:val="2A0B18EF"/>
     <w:multiLevelType w:val="multilevel"/>
     <w:tmpl w:val="A1FE297C"/>
@@ -10740,7 +8021,7 @@
       </w:rPr>
     </w:lvl>
   </w:abstractNum>
-  <w:abstractNum w:abstractNumId="8" w15:restartNumberingAfterBreak="0">
+  <w:abstractNum w:abstractNumId="9" w15:restartNumberingAfterBreak="0">
     <w:nsid w:val="2A6D4F8F"/>
     <w:multiLevelType w:val="multilevel"/>
     <w:tmpl w:val="CA8E2F6C"/>
@@ -10889,7 +8170,7 @@
       </w:rPr>
     </w:lvl>
   </w:abstractNum>
-  <w:abstractNum w:abstractNumId="9" w15:restartNumberingAfterBreak="0">
+  <w:abstractNum w:abstractNumId="10" w15:restartNumberingAfterBreak="0">
     <w:nsid w:val="2B440BB0"/>
     <w:multiLevelType w:val="multilevel"/>
     <w:tmpl w:val="C4AA6924"/>
@@ -11038,7 +8319,7 @@
       </w:rPr>
     </w:lvl>
   </w:abstractNum>
-  <w:abstractNum w:abstractNumId="10" w15:restartNumberingAfterBreak="0">
+  <w:abstractNum w:abstractNumId="11" w15:restartNumberingAfterBreak="0">
     <w:nsid w:val="2C85342D"/>
     <w:multiLevelType w:val="multilevel"/>
     <w:tmpl w:val="BD120FD8"/>
@@ -11187,7 +8468,7 @@
       </w:rPr>
     </w:lvl>
   </w:abstractNum>
-  <w:abstractNum w:abstractNumId="11" w15:restartNumberingAfterBreak="0">
+  <w:abstractNum w:abstractNumId="12" w15:restartNumberingAfterBreak="0">
     <w:nsid w:val="2CFD0F6F"/>
     <w:multiLevelType w:val="multilevel"/>
     <w:tmpl w:val="95241BD0"/>
@@ -11336,7 +8617,7 @@
       </w:rPr>
     </w:lvl>
   </w:abstractNum>
-  <w:abstractNum w:abstractNumId="12" w15:restartNumberingAfterBreak="0">
+  <w:abstractNum w:abstractNumId="13" w15:restartNumberingAfterBreak="0">
     <w:nsid w:val="319E2522"/>
     <w:multiLevelType w:val="hybridMultilevel"/>
     <w:tmpl w:val="A4C46684"/>
@@ -11422,7 +8703,7 @@
       </w:pPr>
     </w:lvl>
   </w:abstractNum>
-  <w:abstractNum w:abstractNumId="13" w15:restartNumberingAfterBreak="0">
+  <w:abstractNum w:abstractNumId="14" w15:restartNumberingAfterBreak="0">
     <w:nsid w:val="32314E43"/>
     <w:multiLevelType w:val="multilevel"/>
     <w:tmpl w:val="6DFE445C"/>
@@ -11571,7 +8852,7 @@
       </w:rPr>
     </w:lvl>
   </w:abstractNum>
-  <w:abstractNum w:abstractNumId="14" w15:restartNumberingAfterBreak="0">
+  <w:abstractNum w:abstractNumId="15" w15:restartNumberingAfterBreak="0">
     <w:nsid w:val="37306EE6"/>
     <w:multiLevelType w:val="multilevel"/>
     <w:tmpl w:val="58B45C42"/>
@@ -11720,7 +9001,7 @@
       </w:rPr>
     </w:lvl>
   </w:abstractNum>
-  <w:abstractNum w:abstractNumId="15" w15:restartNumberingAfterBreak="0">
+  <w:abstractNum w:abstractNumId="16" w15:restartNumberingAfterBreak="0">
     <w:nsid w:val="39C038B1"/>
     <w:multiLevelType w:val="multilevel"/>
     <w:tmpl w:val="2BA83B04"/>
@@ -11869,7 +9150,7 @@
       </w:rPr>
     </w:lvl>
   </w:abstractNum>
-  <w:abstractNum w:abstractNumId="16" w15:restartNumberingAfterBreak="0">
+  <w:abstractNum w:abstractNumId="17" w15:restartNumberingAfterBreak="0">
     <w:nsid w:val="3D6F0EA4"/>
     <w:multiLevelType w:val="multilevel"/>
     <w:tmpl w:val="BDF03F3C"/>
@@ -12018,7 +9299,7 @@
       </w:rPr>
     </w:lvl>
   </w:abstractNum>
-  <w:abstractNum w:abstractNumId="17" w15:restartNumberingAfterBreak="0">
+  <w:abstractNum w:abstractNumId="18" w15:restartNumberingAfterBreak="0">
     <w:nsid w:val="3D9D618F"/>
     <w:multiLevelType w:val="multilevel"/>
     <w:tmpl w:val="C4AA6924"/>
@@ -12167,7 +9448,7 @@
       </w:rPr>
     </w:lvl>
   </w:abstractNum>
-  <w:abstractNum w:abstractNumId="18" w15:restartNumberingAfterBreak="0">
+  <w:abstractNum w:abstractNumId="19" w15:restartNumberingAfterBreak="0">
     <w:nsid w:val="3E7013D6"/>
     <w:multiLevelType w:val="multilevel"/>
     <w:tmpl w:val="74A45D22"/>
@@ -12316,7 +9597,7 @@
       </w:rPr>
     </w:lvl>
   </w:abstractNum>
-  <w:abstractNum w:abstractNumId="19" w15:restartNumberingAfterBreak="0">
+  <w:abstractNum w:abstractNumId="20" w15:restartNumberingAfterBreak="0">
     <w:nsid w:val="403C08E2"/>
     <w:multiLevelType w:val="multilevel"/>
     <w:tmpl w:val="FB6288E0"/>
@@ -12465,7 +9746,7 @@
       </w:rPr>
     </w:lvl>
   </w:abstractNum>
-  <w:abstractNum w:abstractNumId="20" w15:restartNumberingAfterBreak="0">
+  <w:abstractNum w:abstractNumId="21" w15:restartNumberingAfterBreak="0">
     <w:nsid w:val="41506B1E"/>
     <w:multiLevelType w:val="multilevel"/>
     <w:tmpl w:val="C4AA6924"/>
@@ -12614,7 +9895,7 @@
       </w:rPr>
     </w:lvl>
   </w:abstractNum>
-  <w:abstractNum w:abstractNumId="21" w15:restartNumberingAfterBreak="0">
+  <w:abstractNum w:abstractNumId="22" w15:restartNumberingAfterBreak="0">
     <w:nsid w:val="46A85515"/>
     <w:multiLevelType w:val="multilevel"/>
     <w:tmpl w:val="8D6CE70C"/>
@@ -12763,7 +10044,7 @@
       </w:rPr>
     </w:lvl>
   </w:abstractNum>
-  <w:abstractNum w:abstractNumId="22" w15:restartNumberingAfterBreak="0">
+  <w:abstractNum w:abstractNumId="23" w15:restartNumberingAfterBreak="0">
     <w:nsid w:val="48425E02"/>
     <w:multiLevelType w:val="multilevel"/>
     <w:tmpl w:val="9DBA5C14"/>
@@ -12912,7 +10193,7 @@
       </w:rPr>
     </w:lvl>
   </w:abstractNum>
-  <w:abstractNum w:abstractNumId="23" w15:restartNumberingAfterBreak="0">
+  <w:abstractNum w:abstractNumId="24" w15:restartNumberingAfterBreak="0">
     <w:nsid w:val="4A765645"/>
     <w:multiLevelType w:val="multilevel"/>
     <w:tmpl w:val="C4AA6924"/>
@@ -13061,7 +10342,7 @@
       </w:rPr>
     </w:lvl>
   </w:abstractNum>
-  <w:abstractNum w:abstractNumId="24" w15:restartNumberingAfterBreak="0">
+  <w:abstractNum w:abstractNumId="25" w15:restartNumberingAfterBreak="0">
     <w:nsid w:val="4E414EC2"/>
     <w:multiLevelType w:val="multilevel"/>
     <w:tmpl w:val="6BBA3D38"/>
@@ -13210,7 +10491,7 @@
       </w:rPr>
     </w:lvl>
   </w:abstractNum>
-  <w:abstractNum w:abstractNumId="25" w15:restartNumberingAfterBreak="0">
+  <w:abstractNum w:abstractNumId="26" w15:restartNumberingAfterBreak="0">
     <w:nsid w:val="5443533E"/>
     <w:multiLevelType w:val="multilevel"/>
     <w:tmpl w:val="8446EBBC"/>
@@ -13359,7 +10640,7 @@
       </w:rPr>
     </w:lvl>
   </w:abstractNum>
-  <w:abstractNum w:abstractNumId="26" w15:restartNumberingAfterBreak="0">
+  <w:abstractNum w:abstractNumId="27" w15:restartNumberingAfterBreak="0">
     <w:nsid w:val="5DE44008"/>
     <w:multiLevelType w:val="multilevel"/>
     <w:tmpl w:val="C4AA6924"/>
@@ -13508,7 +10789,7 @@
       </w:rPr>
     </w:lvl>
   </w:abstractNum>
-  <w:abstractNum w:abstractNumId="27" w15:restartNumberingAfterBreak="0">
+  <w:abstractNum w:abstractNumId="28" w15:restartNumberingAfterBreak="0">
     <w:nsid w:val="5E953EED"/>
     <w:multiLevelType w:val="multilevel"/>
     <w:tmpl w:val="A71ECE4C"/>
@@ -13657,7 +10938,156 @@
       </w:rPr>
     </w:lvl>
   </w:abstractNum>
-  <w:abstractNum w:abstractNumId="28" w15:restartNumberingAfterBreak="0">
+  <w:abstractNum w:abstractNumId="29" w15:restartNumberingAfterBreak="0">
+    <w:nsid w:val="5F3E1104"/>
+    <w:multiLevelType w:val="multilevel"/>
+    <w:tmpl w:val="C4AA6924"/>
+    <w:lvl w:ilvl="0">
+      <w:start w:val="1"/>
+      <w:numFmt w:val="bullet"/>
+      <w:lvlText w:val=""/>
+      <w:lvlJc w:val="left"/>
+      <w:pPr>
+        <w:tabs>
+          <w:tab w:val="num" w:pos="720"/>
+        </w:tabs>
+        <w:ind w:left="720" w:hanging="360"/>
+      </w:pPr>
+      <w:rPr>
+        <w:rFonts w:ascii="Symbol" w:hAnsi="Symbol" w:hint="default"/>
+        <w:sz w:val="20"/>
+      </w:rPr>
+    </w:lvl>
+    <w:lvl w:ilvl="1" w:tentative="1">
+      <w:start w:val="1"/>
+      <w:numFmt w:val="bullet"/>
+      <w:lvlText w:val="o"/>
+      <w:lvlJc w:val="left"/>
+      <w:pPr>
+        <w:tabs>
+          <w:tab w:val="num" w:pos="1440"/>
+        </w:tabs>
+        <w:ind w:left="1440" w:hanging="360"/>
+      </w:pPr>
+      <w:rPr>
+        <w:rFonts w:ascii="Courier New" w:hAnsi="Courier New" w:hint="default"/>
+        <w:sz w:val="20"/>
+      </w:rPr>
+    </w:lvl>
+    <w:lvl w:ilvl="2" w:tentative="1">
+      <w:start w:val="1"/>
+      <w:numFmt w:val="bullet"/>
+      <w:lvlText w:val=""/>
+      <w:lvlJc w:val="left"/>
+      <w:pPr>
+        <w:tabs>
+          <w:tab w:val="num" w:pos="2160"/>
+        </w:tabs>
+        <w:ind w:left="2160" w:hanging="360"/>
+      </w:pPr>
+      <w:rPr>
+        <w:rFonts w:ascii="Wingdings" w:hAnsi="Wingdings" w:hint="default"/>
+        <w:sz w:val="20"/>
+      </w:rPr>
+    </w:lvl>
+    <w:lvl w:ilvl="3" w:tentative="1">
+      <w:start w:val="1"/>
+      <w:numFmt w:val="bullet"/>
+      <w:lvlText w:val=""/>
+      <w:lvlJc w:val="left"/>
+      <w:pPr>
+        <w:tabs>
+          <w:tab w:val="num" w:pos="2880"/>
+        </w:tabs>
+        <w:ind w:left="2880" w:hanging="360"/>
+      </w:pPr>
+      <w:rPr>
+        <w:rFonts w:ascii="Wingdings" w:hAnsi="Wingdings" w:hint="default"/>
+        <w:sz w:val="20"/>
+      </w:rPr>
+    </w:lvl>
+    <w:lvl w:ilvl="4" w:tentative="1">
+      <w:start w:val="1"/>
+      <w:numFmt w:val="bullet"/>
+      <w:lvlText w:val=""/>
+      <w:lvlJc w:val="left"/>
+      <w:pPr>
+        <w:tabs>
+          <w:tab w:val="num" w:pos="3600"/>
+        </w:tabs>
+        <w:ind w:left="3600" w:hanging="360"/>
+      </w:pPr>
+      <w:rPr>
+        <w:rFonts w:ascii="Wingdings" w:hAnsi="Wingdings" w:hint="default"/>
+        <w:sz w:val="20"/>
+      </w:rPr>
+    </w:lvl>
+    <w:lvl w:ilvl="5" w:tentative="1">
+      <w:start w:val="1"/>
+      <w:numFmt w:val="bullet"/>
+      <w:lvlText w:val=""/>
+      <w:lvlJc w:val="left"/>
+      <w:pPr>
+        <w:tabs>
+          <w:tab w:val="num" w:pos="4320"/>
+        </w:tabs>
+        <w:ind w:left="4320" w:hanging="360"/>
+      </w:pPr>
+      <w:rPr>
+        <w:rFonts w:ascii="Wingdings" w:hAnsi="Wingdings" w:hint="default"/>
+        <w:sz w:val="20"/>
+      </w:rPr>
+    </w:lvl>
+    <w:lvl w:ilvl="6" w:tentative="1">
+      <w:start w:val="1"/>
+      <w:numFmt w:val="bullet"/>
+      <w:lvlText w:val=""/>
+      <w:lvlJc w:val="left"/>
+      <w:pPr>
+        <w:tabs>
+          <w:tab w:val="num" w:pos="5040"/>
+        </w:tabs>
+        <w:ind w:left="5040" w:hanging="360"/>
+      </w:pPr>
+      <w:rPr>
+        <w:rFonts w:ascii="Wingdings" w:hAnsi="Wingdings" w:hint="default"/>
+        <w:sz w:val="20"/>
+      </w:rPr>
+    </w:lvl>
+    <w:lvl w:ilvl="7" w:tentative="1">
+      <w:start w:val="1"/>
+      <w:numFmt w:val="bullet"/>
+      <w:lvlText w:val=""/>
+      <w:lvlJc w:val="left"/>
+      <w:pPr>
+        <w:tabs>
+          <w:tab w:val="num" w:pos="5760"/>
+        </w:tabs>
+        <w:ind w:left="5760" w:hanging="360"/>
+      </w:pPr>
+      <w:rPr>
+        <w:rFonts w:ascii="Wingdings" w:hAnsi="Wingdings" w:hint="default"/>
+        <w:sz w:val="20"/>
+      </w:rPr>
+    </w:lvl>
+    <w:lvl w:ilvl="8" w:tentative="1">
+      <w:start w:val="1"/>
+      <w:numFmt w:val="bullet"/>
+      <w:lvlText w:val=""/>
+      <w:lvlJc w:val="left"/>
+      <w:pPr>
+        <w:tabs>
+          <w:tab w:val="num" w:pos="6480"/>
+        </w:tabs>
+        <w:ind w:left="6480" w:hanging="360"/>
+      </w:pPr>
+      <w:rPr>
+        <w:rFonts w:ascii="Wingdings" w:hAnsi="Wingdings" w:hint="default"/>
+        <w:sz w:val="20"/>
+      </w:rPr>
+    </w:lvl>
+  </w:abstractNum>
+  <w:abstractNum w:abstractNumId="30" w15:restartNumberingAfterBreak="0">
     <w:nsid w:val="609C14FA"/>
     <w:multiLevelType w:val="multilevel"/>
     <w:tmpl w:val="DB1A14BA"/>
@@ -13806,7 +11236,7 @@
       </w:rPr>
     </w:lvl>
   </w:abstractNum>
-  <w:abstractNum w:abstractNumId="29" w15:restartNumberingAfterBreak="0">
+  <w:abstractNum w:abstractNumId="31" w15:restartNumberingAfterBreak="0">
     <w:nsid w:val="69F818B0"/>
     <w:multiLevelType w:val="multilevel"/>
     <w:tmpl w:val="997E2736"/>
@@ -13955,7 +11385,7 @@
       </w:rPr>
     </w:lvl>
   </w:abstractNum>
-  <w:abstractNum w:abstractNumId="30" w15:restartNumberingAfterBreak="0">
+  <w:abstractNum w:abstractNumId="32" w15:restartNumberingAfterBreak="0">
     <w:nsid w:val="714E15DA"/>
     <w:multiLevelType w:val="multilevel"/>
     <w:tmpl w:val="C4AA6924"/>
@@ -14104,7 +11534,7 @@
       </w:rPr>
     </w:lvl>
   </w:abstractNum>
-  <w:abstractNum w:abstractNumId="31" w15:restartNumberingAfterBreak="0">
+  <w:abstractNum w:abstractNumId="33" w15:restartNumberingAfterBreak="0">
     <w:nsid w:val="76377025"/>
     <w:multiLevelType w:val="multilevel"/>
     <w:tmpl w:val="C4AA6924"/>
@@ -14253,7 +11683,7 @@
       </w:rPr>
     </w:lvl>
   </w:abstractNum>
-  <w:abstractNum w:abstractNumId="32" w15:restartNumberingAfterBreak="0">
+  <w:abstractNum w:abstractNumId="34" w15:restartNumberingAfterBreak="0">
     <w:nsid w:val="7C576E51"/>
     <w:multiLevelType w:val="multilevel"/>
     <w:tmpl w:val="B64ACDBC"/>
@@ -14406,73 +11836,73 @@
     <w:abstractNumId w:val="4"/>
   </w:num>
   <w:num w:numId="2" w16cid:durableId="1586569769">
-    <w:abstractNumId w:val="14"/>
+    <w:abstractNumId w:val="15"/>
   </w:num>
   <w:num w:numId="3" w16cid:durableId="1779371563">
-    <w:abstractNumId w:val="7"/>
+    <w:abstractNumId w:val="8"/>
   </w:num>
   <w:num w:numId="4" w16cid:durableId="1204370127">
-    <w:abstractNumId w:val="19"/>
+    <w:abstractNumId w:val="20"/>
   </w:num>
   <w:num w:numId="5" w16cid:durableId="1751196124">
-    <w:abstractNumId w:val="29"/>
+    <w:abstractNumId w:val="31"/>
   </w:num>
   <w:num w:numId="6" w16cid:durableId="1074426143">
-    <w:abstractNumId w:val="18"/>
+    <w:abstractNumId w:val="19"/>
   </w:num>
   <w:num w:numId="7" w16cid:durableId="57048577">
     <w:abstractNumId w:val="3"/>
   </w:num>
   <w:num w:numId="8" w16cid:durableId="815874802">
-    <w:abstractNumId w:val="15"/>
+    <w:abstractNumId w:val="16"/>
   </w:num>
   <w:num w:numId="9" w16cid:durableId="92941787">
     <w:abstractNumId w:val="1"/>
   </w:num>
   <w:num w:numId="10" w16cid:durableId="669068450">
+    <w:abstractNumId w:val="26"/>
+  </w:num>
+  <w:num w:numId="11" w16cid:durableId="667290534">
+    <w:abstractNumId w:val="34"/>
+  </w:num>
+  <w:num w:numId="12" w16cid:durableId="226839535">
+    <w:abstractNumId w:val="7"/>
+  </w:num>
+  <w:num w:numId="13" w16cid:durableId="2059235817">
+    <w:abstractNumId w:val="24"/>
+  </w:num>
+  <w:num w:numId="14" w16cid:durableId="829562467">
+    <w:abstractNumId w:val="17"/>
+  </w:num>
+  <w:num w:numId="15" w16cid:durableId="1148400394">
+    <w:abstractNumId w:val="30"/>
+  </w:num>
+  <w:num w:numId="16" w16cid:durableId="1835878333">
     <w:abstractNumId w:val="25"/>
   </w:num>
-  <w:num w:numId="11" w16cid:durableId="667290534">
-    <w:abstractNumId w:val="32"/>
+  <w:num w:numId="17" w16cid:durableId="1793818157">
+    <w:abstractNumId w:val="28"/>
   </w:num>
-  <w:num w:numId="12" w16cid:durableId="226839535">
-    <w:abstractNumId w:val="6"/>
+  <w:num w:numId="18" w16cid:durableId="916941765">
+    <w:abstractNumId w:val="22"/>
   </w:num>
-  <w:num w:numId="13" w16cid:durableId="2059235817">
+  <w:num w:numId="19" w16cid:durableId="1829982507">
+    <w:abstractNumId w:val="14"/>
+  </w:num>
+  <w:num w:numId="20" w16cid:durableId="1882934644">
     <w:abstractNumId w:val="23"/>
   </w:num>
-  <w:num w:numId="14" w16cid:durableId="829562467">
-    <w:abstractNumId w:val="16"/>
-  </w:num>
-  <w:num w:numId="15" w16cid:durableId="1148400394">
-    <w:abstractNumId w:val="28"/>
-  </w:num>
-  <w:num w:numId="16" w16cid:durableId="1835878333">
-    <w:abstractNumId w:val="24"/>
-  </w:num>
-  <w:num w:numId="17" w16cid:durableId="1793818157">
-    <w:abstractNumId w:val="27"/>
-  </w:num>
-  <w:num w:numId="18" w16cid:durableId="916941765">
-    <w:abstractNumId w:val="21"/>
-  </w:num>
-  <w:num w:numId="19" w16cid:durableId="1829982507">
-    <w:abstractNumId w:val="13"/>
-  </w:num>
-  <w:num w:numId="20" w16cid:durableId="1882934644">
-    <w:abstractNumId w:val="22"/>
-  </w:num>
   <w:num w:numId="21" w16cid:durableId="324482125">
-    <w:abstractNumId w:val="10"/>
+    <w:abstractNumId w:val="11"/>
   </w:num>
   <w:num w:numId="22" w16cid:durableId="1477064731">
-    <w:abstractNumId w:val="8"/>
+    <w:abstractNumId w:val="9"/>
   </w:num>
   <w:num w:numId="23" w16cid:durableId="850295434">
-    <w:abstractNumId w:val="11"/>
+    <w:abstractNumId w:val="12"/>
   </w:num>
   <w:num w:numId="24" w16cid:durableId="657005186">
-    <w:abstractNumId w:val="12"/>
+    <w:abstractNumId w:val="13"/>
   </w:num>
   <w:num w:numId="25" w16cid:durableId="1349327198">
     <w:abstractNumId w:val="2"/>
@@ -14481,25 +11911,31 @@
     <w:abstractNumId w:val="0"/>
   </w:num>
   <w:num w:numId="27" w16cid:durableId="68619342">
-    <w:abstractNumId w:val="31"/>
+    <w:abstractNumId w:val="33"/>
   </w:num>
   <w:num w:numId="28" w16cid:durableId="1697845139">
-    <w:abstractNumId w:val="17"/>
+    <w:abstractNumId w:val="18"/>
   </w:num>
   <w:num w:numId="29" w16cid:durableId="412825670">
-    <w:abstractNumId w:val="9"/>
+    <w:abstractNumId w:val="10"/>
   </w:num>
   <w:num w:numId="30" w16cid:durableId="70390740">
     <w:abstractNumId w:val="5"/>
   </w:num>
   <w:num w:numId="31" w16cid:durableId="1915624695">
-    <w:abstractNumId w:val="30"/>
+    <w:abstractNumId w:val="32"/>
   </w:num>
   <w:num w:numId="32" w16cid:durableId="769812801">
-    <w:abstractNumId w:val="26"/>
+    <w:abstractNumId w:val="27"/>
   </w:num>
   <w:num w:numId="33" w16cid:durableId="458493004">
-    <w:abstractNumId w:val="20"/>
+    <w:abstractNumId w:val="21"/>
+  </w:num>
+  <w:num w:numId="34" w16cid:durableId="736629046">
+    <w:abstractNumId w:val="6"/>
+  </w:num>
+  <w:num w:numId="35" w16cid:durableId="1041705775">
+    <w:abstractNumId w:val="29"/>
   </w:num>
 </w:numbering>
 </file>
@@ -15106,7 +12542,6 @@
   <w:style w:type="character" w:default="1" w:styleId="Policepardfaut">
     <w:name w:val="Default Paragraph Font"/>
     <w:uiPriority w:val="1"/>
-    <w:semiHidden/>
     <w:unhideWhenUsed/>
   </w:style>
   <w:style w:type="table" w:default="1" w:styleId="TableauNormal">

</xml_diff>

<commit_message>
Approche machine learning pour les séries temporelles
</commit_message>
<xml_diff>
--- a/Plan.docx
+++ b/Plan.docx
@@ -1292,7 +1292,6 @@
           <w:lang w:val="en-US" w:eastAsia="fr-FR"/>
           <w14:ligatures w14:val="none"/>
         </w:rPr>
-        <w:lastRenderedPageBreak/>
         <w:t>Days 26–30: Linear Regression</w:t>
       </w:r>
       <w:r>
@@ -4415,6 +4414,22 @@
     </w:p>
     <w:p>
       <w:pPr>
+        <w:spacing w:after="0" w:line="240" w:lineRule="auto"/>
+        <w:outlineLvl w:val="2"/>
+        <w:rPr>
+          <w:rFonts w:eastAsia="Times New Roman" w:cstheme="minorHAnsi"/>
+          <w:b/>
+          <w:bCs/>
+          <w:kern w:val="0"/>
+          <w:sz w:val="20"/>
+          <w:szCs w:val="20"/>
+          <w:lang w:eastAsia="fr-FR"/>
+          <w14:ligatures w14:val="none"/>
+        </w:rPr>
+      </w:pPr>
+    </w:p>
+    <w:p>
+      <w:pPr>
         <w:numPr>
           <w:ilvl w:val="0"/>
           <w:numId w:val="27"/>
@@ -4438,7 +4453,18 @@
           <w:lang w:eastAsia="fr-FR"/>
           <w14:ligatures w14:val="none"/>
         </w:rPr>
-        <w:t xml:space="preserve"> Qu'est-ce qu'une série temporelle ? </w:t>
+        <w:t xml:space="preserve"> </w:t>
+      </w:r>
+      <w:r>
+        <w:rPr>
+          <w:rFonts w:eastAsia="Times New Roman" w:cstheme="minorHAnsi"/>
+          <w:kern w:val="0"/>
+          <w:sz w:val="20"/>
+          <w:szCs w:val="20"/>
+          <w:lang w:eastAsia="fr-FR"/>
+          <w14:ligatures w14:val="none"/>
+        </w:rPr>
+        <w:t xml:space="preserve">Qu'est-ce qu'une série temporelle ? </w:t>
       </w:r>
     </w:p>
     <w:p>
@@ -4679,6 +4705,21 @@
     <w:p>
       <w:pPr>
         <w:spacing w:after="0" w:line="240" w:lineRule="auto"/>
+        <w:ind w:left="720"/>
+        <w:rPr>
+          <w:rFonts w:eastAsia="Times New Roman" w:cstheme="minorHAnsi"/>
+          <w:kern w:val="0"/>
+          <w:sz w:val="20"/>
+          <w:szCs w:val="20"/>
+          <w:highlight w:val="green"/>
+          <w:lang w:eastAsia="fr-FR"/>
+          <w14:ligatures w14:val="none"/>
+        </w:rPr>
+      </w:pPr>
+    </w:p>
+    <w:p>
+      <w:pPr>
+        <w:spacing w:after="0" w:line="240" w:lineRule="auto"/>
         <w:outlineLvl w:val="2"/>
         <w:rPr>
           <w:rFonts w:eastAsia="Times New Roman" w:cstheme="minorHAnsi"/>
@@ -4705,6 +4746,22 @@
         </w:rPr>
         <w:t>Module 2 : Stationnarité et Outils Mathématiques</w:t>
       </w:r>
+    </w:p>
+    <w:p>
+      <w:pPr>
+        <w:spacing w:after="0" w:line="240" w:lineRule="auto"/>
+        <w:outlineLvl w:val="2"/>
+        <w:rPr>
+          <w:rFonts w:eastAsia="Times New Roman" w:cstheme="minorHAnsi"/>
+          <w:b/>
+          <w:bCs/>
+          <w:kern w:val="0"/>
+          <w:sz w:val="20"/>
+          <w:szCs w:val="20"/>
+          <w:lang w:eastAsia="fr-FR"/>
+          <w14:ligatures w14:val="none"/>
+        </w:rPr>
+      </w:pPr>
     </w:p>
     <w:p>
       <w:pPr>
@@ -4813,6 +4870,7 @@
           <w:lang w:eastAsia="fr-FR"/>
           <w14:ligatures w14:val="none"/>
         </w:rPr>
+        <w:lastRenderedPageBreak/>
         <w:t>Test de Dickey-Augmenté (ADF)</w:t>
       </w:r>
     </w:p>
@@ -4985,6 +5043,21 @@
     <w:p>
       <w:pPr>
         <w:spacing w:after="0" w:line="240" w:lineRule="auto"/>
+        <w:ind w:left="720"/>
+        <w:rPr>
+          <w:rFonts w:eastAsia="Times New Roman" w:cstheme="minorHAnsi"/>
+          <w:kern w:val="0"/>
+          <w:sz w:val="20"/>
+          <w:szCs w:val="20"/>
+          <w:highlight w:val="green"/>
+          <w:lang w:eastAsia="fr-FR"/>
+          <w14:ligatures w14:val="none"/>
+        </w:rPr>
+      </w:pPr>
+    </w:p>
+    <w:p>
+      <w:pPr>
+        <w:spacing w:after="0" w:line="240" w:lineRule="auto"/>
         <w:outlineLvl w:val="2"/>
         <w:rPr>
           <w:rFonts w:eastAsia="Times New Roman" w:cstheme="minorHAnsi"/>
@@ -5011,6 +5084,22 @@
         </w:rPr>
         <w:t>Module 3 : Modèles Statistiques Traditionnels (ARIMA &amp; Friends)</w:t>
       </w:r>
+    </w:p>
+    <w:p>
+      <w:pPr>
+        <w:spacing w:after="0" w:line="240" w:lineRule="auto"/>
+        <w:outlineLvl w:val="2"/>
+        <w:rPr>
+          <w:rFonts w:eastAsia="Times New Roman" w:cstheme="minorHAnsi"/>
+          <w:b/>
+          <w:bCs/>
+          <w:kern w:val="0"/>
+          <w:sz w:val="20"/>
+          <w:szCs w:val="20"/>
+          <w:lang w:eastAsia="fr-FR"/>
+          <w14:ligatures w14:val="none"/>
+        </w:rPr>
+      </w:pPr>
     </w:p>
     <w:p>
       <w:pPr>
@@ -5205,6 +5294,21 @@
     <w:p>
       <w:pPr>
         <w:spacing w:after="0" w:line="240" w:lineRule="auto"/>
+        <w:ind w:left="720"/>
+        <w:rPr>
+          <w:rFonts w:eastAsia="Times New Roman" w:cstheme="minorHAnsi"/>
+          <w:kern w:val="0"/>
+          <w:sz w:val="20"/>
+          <w:szCs w:val="20"/>
+          <w:highlight w:val="green"/>
+          <w:lang w:eastAsia="fr-FR"/>
+          <w14:ligatures w14:val="none"/>
+        </w:rPr>
+      </w:pPr>
+    </w:p>
+    <w:p>
+      <w:pPr>
+        <w:spacing w:after="0" w:line="240" w:lineRule="auto"/>
         <w:rPr>
           <w:rFonts w:eastAsia="Times New Roman" w:cstheme="minorHAnsi"/>
           <w:b/>
@@ -5228,9 +5332,12 @@
           <w:lang w:eastAsia="fr-FR"/>
           <w14:ligatures w14:val="none"/>
         </w:rPr>
-        <w:t>Module 4 : Lissage Exponentiel</w:t>
-      </w:r>
-      <w:r>
+        <w:t>Module 4 : Lissage Exponentiel et Méthodes Rapides</w:t>
+      </w:r>
+    </w:p>
+    <w:p>
+      <w:pPr>
+        <w:spacing w:after="0" w:line="240" w:lineRule="auto"/>
         <w:rPr>
           <w:rFonts w:eastAsia="Times New Roman" w:cstheme="minorHAnsi"/>
           <w:b/>
@@ -5238,26 +5345,10 @@
           <w:kern w:val="0"/>
           <w:sz w:val="20"/>
           <w:szCs w:val="20"/>
-          <w:highlight w:val="yellow"/>
-          <w:lang w:eastAsia="fr-FR"/>
-          <w14:ligatures w14:val="none"/>
-        </w:rPr>
-        <w:t xml:space="preserve"> </w:t>
-      </w:r>
-      <w:r>
-        <w:rPr>
-          <w:rFonts w:eastAsia="Times New Roman" w:cstheme="minorHAnsi"/>
-          <w:b/>
-          <w:bCs/>
-          <w:kern w:val="0"/>
-          <w:sz w:val="20"/>
-          <w:szCs w:val="20"/>
-          <w:highlight w:val="yellow"/>
-          <w:lang w:eastAsia="fr-FR"/>
-          <w14:ligatures w14:val="none"/>
-        </w:rPr>
-        <w:t>et Méthodes Rapides</w:t>
-      </w:r>
+          <w:lang w:eastAsia="fr-FR"/>
+          <w14:ligatures w14:val="none"/>
+        </w:rPr>
+      </w:pPr>
     </w:p>
     <w:p>
       <w:pPr>
@@ -5281,29 +5372,7 @@
           <w:lang w:eastAsia="fr-FR"/>
           <w14:ligatures w14:val="none"/>
         </w:rPr>
-        <w:t>Objectif : Disposer de modèles simples, robustes</w:t>
-      </w:r>
-      <w:r>
-        <w:rPr>
-          <w:rFonts w:eastAsia="Times New Roman" w:cstheme="minorHAnsi"/>
-          <w:kern w:val="0"/>
-          <w:sz w:val="20"/>
-          <w:szCs w:val="20"/>
-          <w:lang w:eastAsia="fr-FR"/>
-          <w14:ligatures w14:val="none"/>
-        </w:rPr>
-        <w:t xml:space="preserve"> </w:t>
-      </w:r>
-      <w:r>
-        <w:rPr>
-          <w:rFonts w:eastAsia="Times New Roman" w:cstheme="minorHAnsi"/>
-          <w:kern w:val="0"/>
-          <w:sz w:val="20"/>
-          <w:szCs w:val="20"/>
-          <w:lang w:eastAsia="fr-FR"/>
-          <w14:ligatures w14:val="none"/>
-        </w:rPr>
-        <w:t>et efficaces pour les prévisions à court terme.</w:t>
+        <w:t>Objectif : Disposer de modèles simples, robustes et efficaces pour les prévisions à court terme.</w:t>
       </w:r>
     </w:p>
     <w:p>
@@ -5336,59 +5405,7 @@
           <w:lang w:eastAsia="fr-FR"/>
           <w14:ligatures w14:val="none"/>
         </w:rPr>
-        <w:t>Lissage</w:t>
-      </w:r>
-      <w:r>
-        <w:rPr>
-          <w:rFonts w:eastAsia="Times New Roman" w:cstheme="minorHAnsi"/>
-          <w:b/>
-          <w:bCs/>
-          <w:kern w:val="0"/>
-          <w:sz w:val="20"/>
-          <w:szCs w:val="20"/>
-          <w:lang w:eastAsia="fr-FR"/>
-          <w14:ligatures w14:val="none"/>
-        </w:rPr>
-        <w:t xml:space="preserve"> </w:t>
-      </w:r>
-      <w:r>
-        <w:rPr>
-          <w:rFonts w:eastAsia="Times New Roman" w:cstheme="minorHAnsi"/>
-          <w:b/>
-          <w:bCs/>
-          <w:kern w:val="0"/>
-          <w:sz w:val="20"/>
-          <w:szCs w:val="20"/>
-          <w:lang w:eastAsia="fr-FR"/>
-          <w14:ligatures w14:val="none"/>
-        </w:rPr>
-        <w:t>exponentiel simple (Simple</w:t>
-      </w:r>
-      <w:r>
-        <w:rPr>
-          <w:rFonts w:eastAsia="Times New Roman" w:cstheme="minorHAnsi"/>
-          <w:b/>
-          <w:bCs/>
-          <w:kern w:val="0"/>
-          <w:sz w:val="20"/>
-          <w:szCs w:val="20"/>
-          <w:lang w:eastAsia="fr-FR"/>
-          <w14:ligatures w14:val="none"/>
-        </w:rPr>
-        <w:t xml:space="preserve"> </w:t>
-      </w:r>
-      <w:r>
-        <w:rPr>
-          <w:rFonts w:eastAsia="Times New Roman" w:cstheme="minorHAnsi"/>
-          <w:b/>
-          <w:bCs/>
-          <w:kern w:val="0"/>
-          <w:sz w:val="20"/>
-          <w:szCs w:val="20"/>
-          <w:lang w:eastAsia="fr-FR"/>
-          <w14:ligatures w14:val="none"/>
-        </w:rPr>
-        <w:t>Exponential Smoothing).</w:t>
+        <w:t>Lissage exponentiel simple (Simple Exponential Smoothing).</w:t>
       </w:r>
     </w:p>
     <w:p>
@@ -5421,59 +5438,7 @@
           <w:lang w:eastAsia="fr-FR"/>
           <w14:ligatures w14:val="none"/>
         </w:rPr>
-        <w:t>Méthode</w:t>
-      </w:r>
-      <w:r>
-        <w:rPr>
-          <w:rFonts w:eastAsia="Times New Roman" w:cstheme="minorHAnsi"/>
-          <w:b/>
-          <w:bCs/>
-          <w:kern w:val="0"/>
-          <w:sz w:val="20"/>
-          <w:szCs w:val="20"/>
-          <w:lang w:eastAsia="fr-FR"/>
-          <w14:ligatures w14:val="none"/>
-        </w:rPr>
-        <w:t xml:space="preserve"> de </w:t>
-      </w:r>
-      <w:r>
-        <w:rPr>
-          <w:rFonts w:eastAsia="Times New Roman" w:cstheme="minorHAnsi"/>
-          <w:b/>
-          <w:bCs/>
-          <w:kern w:val="0"/>
-          <w:sz w:val="20"/>
-          <w:szCs w:val="20"/>
-          <w:lang w:eastAsia="fr-FR"/>
-          <w14:ligatures w14:val="none"/>
-        </w:rPr>
-        <w:t>Holt</w:t>
-      </w:r>
-      <w:r>
-        <w:rPr>
-          <w:rFonts w:eastAsia="Times New Roman" w:cstheme="minorHAnsi"/>
-          <w:b/>
-          <w:bCs/>
-          <w:kern w:val="0"/>
-          <w:sz w:val="20"/>
-          <w:szCs w:val="20"/>
-          <w:lang w:eastAsia="fr-FR"/>
-          <w14:ligatures w14:val="none"/>
-        </w:rPr>
-        <w:t xml:space="preserve"> </w:t>
-      </w:r>
-      <w:r>
-        <w:rPr>
-          <w:rFonts w:eastAsia="Times New Roman" w:cstheme="minorHAnsi"/>
-          <w:b/>
-          <w:bCs/>
-          <w:kern w:val="0"/>
-          <w:sz w:val="20"/>
-          <w:szCs w:val="20"/>
-          <w:lang w:eastAsia="fr-FR"/>
-          <w14:ligatures w14:val="none"/>
-        </w:rPr>
-        <w:t>(Tendance) et Holt-Winters (Tendance + Saisonnalité).</w:t>
+        <w:t>Méthode de Holt (Tendance) et Holt-Winters (Tendance + Saisonnalité).</w:t>
       </w:r>
     </w:p>
     <w:p>
@@ -5520,6 +5485,20 @@
     </w:p>
     <w:p>
       <w:pPr>
+        <w:pStyle w:val="Paragraphedeliste"/>
+        <w:spacing w:after="0" w:line="240" w:lineRule="auto"/>
+        <w:rPr>
+          <w:rFonts w:eastAsia="Times New Roman" w:cstheme="minorHAnsi"/>
+          <w:kern w:val="0"/>
+          <w:sz w:val="20"/>
+          <w:szCs w:val="20"/>
+          <w:lang w:eastAsia="fr-FR"/>
+          <w14:ligatures w14:val="none"/>
+        </w:rPr>
+      </w:pPr>
+    </w:p>
+    <w:p>
+      <w:pPr>
         <w:spacing w:after="0" w:line="240" w:lineRule="auto"/>
         <w:outlineLvl w:val="2"/>
         <w:rPr>
@@ -5541,11 +5520,28 @@
           <w:kern w:val="0"/>
           <w:sz w:val="20"/>
           <w:szCs w:val="20"/>
+          <w:highlight w:val="yellow"/>
           <w:lang w:eastAsia="fr-FR"/>
           <w14:ligatures w14:val="none"/>
         </w:rPr>
         <w:t>Module 5 : Approche Machine Learning pour les Séries Temporelles</w:t>
       </w:r>
+    </w:p>
+    <w:p>
+      <w:pPr>
+        <w:spacing w:after="0" w:line="240" w:lineRule="auto"/>
+        <w:outlineLvl w:val="2"/>
+        <w:rPr>
+          <w:rFonts w:eastAsia="Times New Roman" w:cstheme="minorHAnsi"/>
+          <w:b/>
+          <w:bCs/>
+          <w:kern w:val="0"/>
+          <w:sz w:val="20"/>
+          <w:szCs w:val="20"/>
+          <w:lang w:eastAsia="fr-FR"/>
+          <w14:ligatures w14:val="none"/>
+        </w:rPr>
+      </w:pPr>
     </w:p>
     <w:p>
       <w:pPr>
@@ -5732,7 +5728,29 @@
           <w:lang w:eastAsia="fr-FR"/>
           <w14:ligatures w14:val="none"/>
         </w:rPr>
-        <w:t xml:space="preserve"> (éviter le data leakage futur).</w:t>
+        <w:t xml:space="preserve"> (</w:t>
+      </w:r>
+      <w:r>
+        <w:rPr>
+          <w:rFonts w:eastAsia="Times New Roman" w:cstheme="minorHAnsi"/>
+          <w:kern w:val="0"/>
+          <w:sz w:val="20"/>
+          <w:szCs w:val="20"/>
+          <w:lang w:eastAsia="fr-FR"/>
+          <w14:ligatures w14:val="none"/>
+        </w:rPr>
+        <w:t xml:space="preserve">pour </w:t>
+      </w:r>
+      <w:r>
+        <w:rPr>
+          <w:rFonts w:eastAsia="Times New Roman" w:cstheme="minorHAnsi"/>
+          <w:kern w:val="0"/>
+          <w:sz w:val="20"/>
+          <w:szCs w:val="20"/>
+          <w:lang w:eastAsia="fr-FR"/>
+          <w14:ligatures w14:val="none"/>
+        </w:rPr>
+        <w:t>éviter le data leakage futur).</w:t>
       </w:r>
     </w:p>
     <w:p>
@@ -5762,101 +5780,55 @@
           <w:lang w:eastAsia="fr-FR"/>
           <w14:ligatures w14:val="none"/>
         </w:rPr>
-        <w:t>Modèles supervisés</w:t>
-      </w:r>
-      <w:r>
-        <w:rPr>
-          <w:rFonts w:eastAsia="Times New Roman" w:cstheme="minorHAnsi"/>
-          <w:kern w:val="0"/>
-          <w:sz w:val="20"/>
-          <w:szCs w:val="20"/>
-          <w:lang w:eastAsia="fr-FR"/>
-          <w14:ligatures w14:val="none"/>
-        </w:rPr>
-        <w:t xml:space="preserve"> : XGBoost, LightGBM, Random Forest appliqués aux séries temporelles.</w:t>
-      </w:r>
-    </w:p>
-    <w:p>
-      <w:pPr>
-        <w:numPr>
-          <w:ilvl w:val="0"/>
-          <w:numId w:val="31"/>
-        </w:numPr>
+        <w:t>Pratique (Python)</w:t>
+      </w:r>
+      <w:r>
+        <w:rPr>
+          <w:rFonts w:eastAsia="Times New Roman" w:cstheme="minorHAnsi"/>
+          <w:kern w:val="0"/>
+          <w:sz w:val="20"/>
+          <w:szCs w:val="20"/>
+          <w:lang w:eastAsia="fr-FR"/>
+          <w14:ligatures w14:val="none"/>
+        </w:rPr>
+        <w:t xml:space="preserve"> : Construction d'un pipeline complet de Machine Learning avec scikit-learn</w:t>
+      </w:r>
+      <w:r>
+        <w:rPr>
+          <w:rFonts w:eastAsia="Times New Roman" w:cstheme="minorHAnsi"/>
+          <w:kern w:val="0"/>
+          <w:sz w:val="20"/>
+          <w:szCs w:val="20"/>
+          <w:lang w:eastAsia="fr-FR"/>
+          <w14:ligatures w14:val="none"/>
+        </w:rPr>
+        <w:t xml:space="preserve"> et Random Forest</w:t>
+      </w:r>
+      <w:r>
+        <w:rPr>
+          <w:rFonts w:eastAsia="Times New Roman" w:cstheme="minorHAnsi"/>
+          <w:kern w:val="0"/>
+          <w:sz w:val="20"/>
+          <w:szCs w:val="20"/>
+          <w:lang w:eastAsia="fr-FR"/>
+          <w14:ligatures w14:val="none"/>
+        </w:rPr>
+        <w:t>.</w:t>
+      </w:r>
+    </w:p>
+    <w:p>
+      <w:pPr>
         <w:spacing w:after="0" w:line="240" w:lineRule="auto"/>
-        <w:rPr>
-          <w:rFonts w:eastAsia="Times New Roman" w:cstheme="minorHAnsi"/>
-          <w:kern w:val="0"/>
-          <w:sz w:val="20"/>
-          <w:szCs w:val="20"/>
-          <w:lang w:eastAsia="fr-FR"/>
-          <w14:ligatures w14:val="none"/>
-        </w:rPr>
-      </w:pPr>
-      <w:r>
-        <w:rPr>
-          <w:rFonts w:eastAsia="Times New Roman" w:cstheme="minorHAnsi"/>
-          <w:b/>
-          <w:bCs/>
-          <w:kern w:val="0"/>
-          <w:sz w:val="20"/>
-          <w:szCs w:val="20"/>
-          <w:lang w:eastAsia="fr-FR"/>
-          <w14:ligatures w14:val="none"/>
-        </w:rPr>
-        <w:t>Prophet</w:t>
-      </w:r>
-      <w:r>
-        <w:rPr>
-          <w:rFonts w:eastAsia="Times New Roman" w:cstheme="minorHAnsi"/>
-          <w:kern w:val="0"/>
-          <w:sz w:val="20"/>
-          <w:szCs w:val="20"/>
-          <w:lang w:eastAsia="fr-FR"/>
-          <w14:ligatures w14:val="none"/>
-        </w:rPr>
-        <w:t xml:space="preserve"> (par Meta) : Modèle additif décomposable basé sur la régression non-linéaire.</w:t>
-      </w:r>
-    </w:p>
-    <w:p>
-      <w:pPr>
-        <w:numPr>
-          <w:ilvl w:val="0"/>
-          <w:numId w:val="31"/>
-        </w:numPr>
-        <w:spacing w:after="0" w:line="240" w:lineRule="auto"/>
-        <w:rPr>
-          <w:rFonts w:eastAsia="Times New Roman" w:cstheme="minorHAnsi"/>
-          <w:kern w:val="0"/>
-          <w:sz w:val="20"/>
-          <w:szCs w:val="20"/>
-          <w:lang w:eastAsia="fr-FR"/>
-          <w14:ligatures w14:val="none"/>
-        </w:rPr>
-      </w:pPr>
-      <w:r>
-        <w:rPr>
-          <w:rFonts w:eastAsia="Times New Roman" w:cstheme="minorHAnsi"/>
-          <w:b/>
-          <w:bCs/>
-          <w:kern w:val="0"/>
-          <w:sz w:val="20"/>
-          <w:szCs w:val="20"/>
-          <w:lang w:eastAsia="fr-FR"/>
-          <w14:ligatures w14:val="none"/>
-        </w:rPr>
-        <w:t>Pratique (Python)</w:t>
-      </w:r>
-      <w:r>
-        <w:rPr>
-          <w:rFonts w:eastAsia="Times New Roman" w:cstheme="minorHAnsi"/>
-          <w:kern w:val="0"/>
-          <w:sz w:val="20"/>
-          <w:szCs w:val="20"/>
-          <w:lang w:eastAsia="fr-FR"/>
-          <w14:ligatures w14:val="none"/>
-        </w:rPr>
-        <w:t xml:space="preserve"> : Construction d'un pipeline complet de Machine Learning avec scikit-learn et LightGBM.</w:t>
-      </w:r>
+        <w:ind w:left="720"/>
+        <w:rPr>
+          <w:rFonts w:eastAsia="Times New Roman" w:cstheme="minorHAnsi"/>
+          <w:kern w:val="0"/>
+          <w:sz w:val="20"/>
+          <w:szCs w:val="20"/>
+          <w:lang w:eastAsia="fr-FR"/>
+          <w14:ligatures w14:val="none"/>
+        </w:rPr>
+      </w:pPr>
     </w:p>
     <w:p>
       <w:pPr>
@@ -5940,37 +5912,112 @@
           <w:lang w:eastAsia="fr-FR"/>
           <w14:ligatures w14:val="none"/>
         </w:rPr>
-        <w:t>Réseaux récurrents (RNN)</w:t>
-      </w:r>
-      <w:r>
-        <w:rPr>
-          <w:rFonts w:eastAsia="Times New Roman" w:cstheme="minorHAnsi"/>
-          <w:kern w:val="0"/>
-          <w:sz w:val="20"/>
-          <w:szCs w:val="20"/>
-          <w:lang w:eastAsia="fr-FR"/>
-          <w14:ligatures w14:val="none"/>
-        </w:rPr>
-        <w:t xml:space="preserve"> : Introduction aux cellules LSTM (Long Short-Term Memory) et GRU.</w:t>
-      </w:r>
-    </w:p>
-    <w:p>
-      <w:pPr>
-        <w:numPr>
-          <w:ilvl w:val="0"/>
-          <w:numId w:val="32"/>
-        </w:numPr>
+        <w:t>Pratique (Python)</w:t>
+      </w:r>
+      <w:r>
+        <w:rPr>
+          <w:rFonts w:eastAsia="Times New Roman" w:cstheme="minorHAnsi"/>
+          <w:kern w:val="0"/>
+          <w:sz w:val="20"/>
+          <w:szCs w:val="20"/>
+          <w:lang w:eastAsia="fr-FR"/>
+          <w14:ligatures w14:val="none"/>
+        </w:rPr>
+        <w:t xml:space="preserve"> : Création d</w:t>
+      </w:r>
+      <w:r>
+        <w:rPr>
+          <w:rFonts w:eastAsia="Times New Roman" w:cstheme="minorHAnsi"/>
+          <w:kern w:val="0"/>
+          <w:sz w:val="20"/>
+          <w:szCs w:val="20"/>
+          <w:lang w:eastAsia="fr-FR"/>
+          <w14:ligatures w14:val="none"/>
+        </w:rPr>
+        <w:t>es</w:t>
+      </w:r>
+      <w:r>
+        <w:rPr>
+          <w:rFonts w:eastAsia="Times New Roman" w:cstheme="minorHAnsi"/>
+          <w:kern w:val="0"/>
+          <w:sz w:val="20"/>
+          <w:szCs w:val="20"/>
+          <w:lang w:eastAsia="fr-FR"/>
+          <w14:ligatures w14:val="none"/>
+        </w:rPr>
+        <w:t xml:space="preserve"> modèle</w:t>
+      </w:r>
+      <w:r>
+        <w:rPr>
+          <w:rFonts w:eastAsia="Times New Roman" w:cstheme="minorHAnsi"/>
+          <w:kern w:val="0"/>
+          <w:sz w:val="20"/>
+          <w:szCs w:val="20"/>
+          <w:lang w:eastAsia="fr-FR"/>
+          <w14:ligatures w14:val="none"/>
+        </w:rPr>
+        <w:t xml:space="preserve">s : </w:t>
+      </w:r>
+      <w:r>
+        <w:rPr>
+          <w:rFonts w:eastAsia="Times New Roman" w:cstheme="minorHAnsi"/>
+          <w:kern w:val="0"/>
+          <w:sz w:val="20"/>
+          <w:szCs w:val="20"/>
+          <w:lang w:eastAsia="fr-FR"/>
+          <w14:ligatures w14:val="none"/>
+        </w:rPr>
+        <w:t xml:space="preserve"> LSTM </w:t>
+      </w:r>
+      <w:r>
+        <w:rPr>
+          <w:rFonts w:eastAsia="Times New Roman" w:cstheme="minorHAnsi"/>
+          <w:kern w:val="0"/>
+          <w:sz w:val="20"/>
+          <w:szCs w:val="20"/>
+          <w:lang w:eastAsia="fr-FR"/>
+          <w14:ligatures w14:val="none"/>
+        </w:rPr>
+        <w:t xml:space="preserve">GRU Transformers </w:t>
+      </w:r>
+      <w:r>
+        <w:rPr>
+          <w:rFonts w:eastAsia="Times New Roman" w:cstheme="minorHAnsi"/>
+          <w:kern w:val="0"/>
+          <w:sz w:val="20"/>
+          <w:szCs w:val="20"/>
+          <w:lang w:eastAsia="fr-FR"/>
+          <w14:ligatures w14:val="none"/>
+        </w:rPr>
+        <w:t>simple avec PyTorch</w:t>
+      </w:r>
+      <w:r>
+        <w:rPr>
+          <w:rFonts w:eastAsia="Times New Roman" w:cstheme="minorHAnsi"/>
+          <w:kern w:val="0"/>
+          <w:sz w:val="20"/>
+          <w:szCs w:val="20"/>
+          <w:lang w:eastAsia="fr-FR"/>
+          <w14:ligatures w14:val="none"/>
+        </w:rPr>
+        <w:t xml:space="preserve"> sur une série temporelle</w:t>
+      </w:r>
+      <w:r>
+        <w:rPr>
+          <w:rFonts w:eastAsia="Times New Roman" w:cstheme="minorHAnsi"/>
+          <w:kern w:val="0"/>
+          <w:sz w:val="20"/>
+          <w:szCs w:val="20"/>
+          <w:lang w:eastAsia="fr-FR"/>
+          <w14:ligatures w14:val="none"/>
+        </w:rPr>
+        <w:t>.</w:t>
+      </w:r>
+    </w:p>
+    <w:p>
+      <w:pPr>
         <w:spacing w:after="0" w:line="240" w:lineRule="auto"/>
-        <w:rPr>
-          <w:rFonts w:eastAsia="Times New Roman" w:cstheme="minorHAnsi"/>
-          <w:kern w:val="0"/>
-          <w:sz w:val="20"/>
-          <w:szCs w:val="20"/>
-          <w:lang w:eastAsia="fr-FR"/>
-          <w14:ligatures w14:val="none"/>
-        </w:rPr>
-      </w:pPr>
-      <w:r>
+        <w:outlineLvl w:val="2"/>
         <w:rPr>
           <w:rFonts w:eastAsia="Times New Roman" w:cstheme="minorHAnsi"/>
           <w:b/>
@@ -5981,35 +6028,6 @@
           <w:lang w:eastAsia="fr-FR"/>
           <w14:ligatures w14:val="none"/>
         </w:rPr>
-        <w:t>Approches Transformers</w:t>
-      </w:r>
-      <w:r>
-        <w:rPr>
-          <w:rFonts w:eastAsia="Times New Roman" w:cstheme="minorHAnsi"/>
-          <w:kern w:val="0"/>
-          <w:sz w:val="20"/>
-          <w:szCs w:val="20"/>
-          <w:lang w:eastAsia="fr-FR"/>
-          <w14:ligatures w14:val="none"/>
-        </w:rPr>
-        <w:t xml:space="preserve"> : Introduction aux architectures modernes adaptées au time series forecasting (ex: PatchTST).</w:t>
-      </w:r>
-    </w:p>
-    <w:p>
-      <w:pPr>
-        <w:numPr>
-          <w:ilvl w:val="0"/>
-          <w:numId w:val="32"/>
-        </w:numPr>
-        <w:spacing w:after="0" w:line="240" w:lineRule="auto"/>
-        <w:rPr>
-          <w:rFonts w:eastAsia="Times New Roman" w:cstheme="minorHAnsi"/>
-          <w:kern w:val="0"/>
-          <w:sz w:val="20"/>
-          <w:szCs w:val="20"/>
-          <w:lang w:eastAsia="fr-FR"/>
-          <w14:ligatures w14:val="none"/>
-        </w:rPr>
       </w:pPr>
       <w:r>
         <w:rPr>
@@ -6022,46 +6040,6 @@
           <w:lang w:eastAsia="fr-FR"/>
           <w14:ligatures w14:val="none"/>
         </w:rPr>
-        <w:t>Pratique (Python)</w:t>
-      </w:r>
-      <w:r>
-        <w:rPr>
-          <w:rFonts w:eastAsia="Times New Roman" w:cstheme="minorHAnsi"/>
-          <w:kern w:val="0"/>
-          <w:sz w:val="20"/>
-          <w:szCs w:val="20"/>
-          <w:lang w:eastAsia="fr-FR"/>
-          <w14:ligatures w14:val="none"/>
-        </w:rPr>
-        <w:t xml:space="preserve"> : Création d'un modèle LSTM simple avec PyTorch ou TensorFlow.</w:t>
-      </w:r>
-    </w:p>
-    <w:p>
-      <w:pPr>
-        <w:spacing w:after="0" w:line="240" w:lineRule="auto"/>
-        <w:outlineLvl w:val="2"/>
-        <w:rPr>
-          <w:rFonts w:eastAsia="Times New Roman" w:cstheme="minorHAnsi"/>
-          <w:b/>
-          <w:bCs/>
-          <w:kern w:val="0"/>
-          <w:sz w:val="20"/>
-          <w:szCs w:val="20"/>
-          <w:lang w:eastAsia="fr-FR"/>
-          <w14:ligatures w14:val="none"/>
-        </w:rPr>
-      </w:pPr>
-      <w:r>
-        <w:rPr>
-          <w:rFonts w:eastAsia="Times New Roman" w:cstheme="minorHAnsi"/>
-          <w:b/>
-          <w:bCs/>
-          <w:kern w:val="0"/>
-          <w:sz w:val="20"/>
-          <w:szCs w:val="20"/>
-          <w:lang w:eastAsia="fr-FR"/>
-          <w14:ligatures w14:val="none"/>
-        </w:rPr>
         <w:t>Module 7 : Évaluation et Bonnes Pratiques en Production</w:t>
       </w:r>
     </w:p>
@@ -6088,7 +6066,7 @@
           <w:lang w:eastAsia="fr-FR"/>
           <w14:ligatures w14:val="none"/>
         </w:rPr>
-        <w:t>Objectif : Mesurer la performance de nos modèles et les déployer proprement.</w:t>
+        <w:t>Objectif : Mesurer la performance des modèles et les déployer proprement.</w:t>
       </w:r>
     </w:p>
     <w:p>
@@ -12542,6 +12520,7 @@
   <w:style w:type="character" w:default="1" w:styleId="Policepardfaut">
     <w:name w:val="Default Paragraph Font"/>
     <w:uiPriority w:val="1"/>
+    <w:semiHidden/>
     <w:unhideWhenUsed/>
   </w:style>
   <w:style w:type="table" w:default="1" w:styleId="TableauNormal">

</xml_diff>

<commit_message>
deep learning et les séries temporelles
</commit_message>
<xml_diff>
--- a/Plan.docx
+++ b/Plan.docx
@@ -57,7 +57,35 @@
           <w:lang w:eastAsia="fr-FR"/>
           <w14:ligatures w14:val="none"/>
         </w:rPr>
-        <w:t>Days 1–5: Python for Data Science</w:t>
+        <w:t>Days 1–</w:t>
+      </w:r>
+      <w:proofErr w:type="gramStart"/>
+      <w:r>
+        <w:rPr>
+          <w:rFonts w:ascii="Times New Roman" w:eastAsia="Times New Roman" w:hAnsi="Times New Roman" w:cs="Times New Roman"/>
+          <w:b/>
+          <w:bCs/>
+          <w:kern w:val="0"/>
+          <w:sz w:val="27"/>
+          <w:szCs w:val="27"/>
+          <w:lang w:eastAsia="fr-FR"/>
+          <w14:ligatures w14:val="none"/>
+        </w:rPr>
+        <w:t>5:</w:t>
+      </w:r>
+      <w:proofErr w:type="gramEnd"/>
+      <w:r>
+        <w:rPr>
+          <w:rFonts w:ascii="Times New Roman" w:eastAsia="Times New Roman" w:hAnsi="Times New Roman" w:cs="Times New Roman"/>
+          <w:b/>
+          <w:bCs/>
+          <w:kern w:val="0"/>
+          <w:sz w:val="27"/>
+          <w:szCs w:val="27"/>
+          <w:lang w:eastAsia="fr-FR"/>
+          <w14:ligatures w14:val="none"/>
+        </w:rPr>
+        <w:t xml:space="preserve"> Python for Data Science</w:t>
       </w:r>
     </w:p>
     <w:p>
@@ -117,8 +145,100 @@
           <w:lang w:eastAsia="fr-FR"/>
           <w14:ligatures w14:val="none"/>
         </w:rPr>
-        <w:t>Day 2: Lists, dictionaries, sets, tuples – practice exercises</w:t>
-      </w:r>
+        <w:t xml:space="preserve">Day </w:t>
+      </w:r>
+      <w:proofErr w:type="gramStart"/>
+      <w:r>
+        <w:rPr>
+          <w:rFonts w:ascii="Times New Roman" w:eastAsia="Times New Roman" w:hAnsi="Times New Roman" w:cs="Times New Roman"/>
+          <w:kern w:val="0"/>
+          <w:sz w:val="24"/>
+          <w:szCs w:val="24"/>
+          <w:highlight w:val="yellow"/>
+          <w:lang w:eastAsia="fr-FR"/>
+          <w14:ligatures w14:val="none"/>
+        </w:rPr>
+        <w:t>2:</w:t>
+      </w:r>
+      <w:proofErr w:type="gramEnd"/>
+      <w:r>
+        <w:rPr>
+          <w:rFonts w:ascii="Times New Roman" w:eastAsia="Times New Roman" w:hAnsi="Times New Roman" w:cs="Times New Roman"/>
+          <w:kern w:val="0"/>
+          <w:sz w:val="24"/>
+          <w:szCs w:val="24"/>
+          <w:highlight w:val="yellow"/>
+          <w:lang w:eastAsia="fr-FR"/>
+          <w14:ligatures w14:val="none"/>
+        </w:rPr>
+        <w:t xml:space="preserve"> </w:t>
+      </w:r>
+      <w:proofErr w:type="spellStart"/>
+      <w:r>
+        <w:rPr>
+          <w:rFonts w:ascii="Times New Roman" w:eastAsia="Times New Roman" w:hAnsi="Times New Roman" w:cs="Times New Roman"/>
+          <w:kern w:val="0"/>
+          <w:sz w:val="24"/>
+          <w:szCs w:val="24"/>
+          <w:highlight w:val="yellow"/>
+          <w:lang w:eastAsia="fr-FR"/>
+          <w14:ligatures w14:val="none"/>
+        </w:rPr>
+        <w:t>Lists</w:t>
+      </w:r>
+      <w:proofErr w:type="spellEnd"/>
+      <w:r>
+        <w:rPr>
+          <w:rFonts w:ascii="Times New Roman" w:eastAsia="Times New Roman" w:hAnsi="Times New Roman" w:cs="Times New Roman"/>
+          <w:kern w:val="0"/>
+          <w:sz w:val="24"/>
+          <w:szCs w:val="24"/>
+          <w:highlight w:val="yellow"/>
+          <w:lang w:eastAsia="fr-FR"/>
+          <w14:ligatures w14:val="none"/>
+        </w:rPr>
+        <w:t xml:space="preserve">, </w:t>
+      </w:r>
+      <w:proofErr w:type="spellStart"/>
+      <w:r>
+        <w:rPr>
+          <w:rFonts w:ascii="Times New Roman" w:eastAsia="Times New Roman" w:hAnsi="Times New Roman" w:cs="Times New Roman"/>
+          <w:kern w:val="0"/>
+          <w:sz w:val="24"/>
+          <w:szCs w:val="24"/>
+          <w:highlight w:val="yellow"/>
+          <w:lang w:eastAsia="fr-FR"/>
+          <w14:ligatures w14:val="none"/>
+        </w:rPr>
+        <w:t>dictionaries</w:t>
+      </w:r>
+      <w:proofErr w:type="spellEnd"/>
+      <w:r>
+        <w:rPr>
+          <w:rFonts w:ascii="Times New Roman" w:eastAsia="Times New Roman" w:hAnsi="Times New Roman" w:cs="Times New Roman"/>
+          <w:kern w:val="0"/>
+          <w:sz w:val="24"/>
+          <w:szCs w:val="24"/>
+          <w:highlight w:val="yellow"/>
+          <w:lang w:eastAsia="fr-FR"/>
+          <w14:ligatures w14:val="none"/>
+        </w:rPr>
+        <w:t xml:space="preserve">, sets, tuples – practice </w:t>
+      </w:r>
+      <w:proofErr w:type="spellStart"/>
+      <w:r>
+        <w:rPr>
+          <w:rFonts w:ascii="Times New Roman" w:eastAsia="Times New Roman" w:hAnsi="Times New Roman" w:cs="Times New Roman"/>
+          <w:kern w:val="0"/>
+          <w:sz w:val="24"/>
+          <w:szCs w:val="24"/>
+          <w:highlight w:val="yellow"/>
+          <w:lang w:eastAsia="fr-FR"/>
+          <w14:ligatures w14:val="none"/>
+        </w:rPr>
+        <w:t>exercises</w:t>
+      </w:r>
+      <w:proofErr w:type="spellEnd"/>
     </w:p>
     <w:p>
       <w:pPr>
@@ -177,7 +297,33 @@
           <w:lang w:val="en-US" w:eastAsia="fr-FR"/>
           <w14:ligatures w14:val="none"/>
         </w:rPr>
-        <w:t>Day 4: File handling, modules, intro to Jupyter Notebook</w:t>
+        <w:t xml:space="preserve">Day 4: File handling, modules, intro to </w:t>
+      </w:r>
+      <w:proofErr w:type="spellStart"/>
+      <w:r>
+        <w:rPr>
+          <w:rFonts w:ascii="Times New Roman" w:eastAsia="Times New Roman" w:hAnsi="Times New Roman" w:cs="Times New Roman"/>
+          <w:kern w:val="0"/>
+          <w:sz w:val="24"/>
+          <w:szCs w:val="24"/>
+          <w:highlight w:val="yellow"/>
+          <w:lang w:val="en-US" w:eastAsia="fr-FR"/>
+          <w14:ligatures w14:val="none"/>
+        </w:rPr>
+        <w:t>Jupyter</w:t>
+      </w:r>
+      <w:proofErr w:type="spellEnd"/>
+      <w:r>
+        <w:rPr>
+          <w:rFonts w:ascii="Times New Roman" w:eastAsia="Times New Roman" w:hAnsi="Times New Roman" w:cs="Times New Roman"/>
+          <w:kern w:val="0"/>
+          <w:sz w:val="24"/>
+          <w:szCs w:val="24"/>
+          <w:highlight w:val="yellow"/>
+          <w:lang w:val="en-US" w:eastAsia="fr-FR"/>
+          <w14:ligatures w14:val="none"/>
+        </w:rPr>
+        <w:t xml:space="preserve"> Notebook</w:t>
       </w:r>
     </w:p>
     <w:p>
@@ -236,7 +382,63 @@
           <w:lang w:eastAsia="fr-FR"/>
           <w14:ligatures w14:val="none"/>
         </w:rPr>
-        <w:t>Days 6–10: Numpy &amp; Pandas</w:t>
+        <w:t>Days 6–</w:t>
+      </w:r>
+      <w:proofErr w:type="gramStart"/>
+      <w:r>
+        <w:rPr>
+          <w:rFonts w:ascii="Times New Roman" w:eastAsia="Times New Roman" w:hAnsi="Times New Roman" w:cs="Times New Roman"/>
+          <w:b/>
+          <w:bCs/>
+          <w:kern w:val="0"/>
+          <w:sz w:val="27"/>
+          <w:szCs w:val="27"/>
+          <w:lang w:eastAsia="fr-FR"/>
+          <w14:ligatures w14:val="none"/>
+        </w:rPr>
+        <w:t>10:</w:t>
+      </w:r>
+      <w:proofErr w:type="gramEnd"/>
+      <w:r>
+        <w:rPr>
+          <w:rFonts w:ascii="Times New Roman" w:eastAsia="Times New Roman" w:hAnsi="Times New Roman" w:cs="Times New Roman"/>
+          <w:b/>
+          <w:bCs/>
+          <w:kern w:val="0"/>
+          <w:sz w:val="27"/>
+          <w:szCs w:val="27"/>
+          <w:lang w:eastAsia="fr-FR"/>
+          <w14:ligatures w14:val="none"/>
+        </w:rPr>
+        <w:t xml:space="preserve"> </w:t>
+      </w:r>
+      <w:proofErr w:type="spellStart"/>
+      <w:r>
+        <w:rPr>
+          <w:rFonts w:ascii="Times New Roman" w:eastAsia="Times New Roman" w:hAnsi="Times New Roman" w:cs="Times New Roman"/>
+          <w:b/>
+          <w:bCs/>
+          <w:kern w:val="0"/>
+          <w:sz w:val="27"/>
+          <w:szCs w:val="27"/>
+          <w:lang w:eastAsia="fr-FR"/>
+          <w14:ligatures w14:val="none"/>
+        </w:rPr>
+        <w:t>Numpy</w:t>
+      </w:r>
+      <w:proofErr w:type="spellEnd"/>
+      <w:r>
+        <w:rPr>
+          <w:rFonts w:ascii="Times New Roman" w:eastAsia="Times New Roman" w:hAnsi="Times New Roman" w:cs="Times New Roman"/>
+          <w:b/>
+          <w:bCs/>
+          <w:kern w:val="0"/>
+          <w:sz w:val="27"/>
+          <w:szCs w:val="27"/>
+          <w:lang w:eastAsia="fr-FR"/>
+          <w14:ligatures w14:val="none"/>
+        </w:rPr>
+        <w:t xml:space="preserve"> &amp; Pandas</w:t>
       </w:r>
     </w:p>
     <w:p>
@@ -266,7 +468,111 @@
           <w:lang w:eastAsia="fr-FR"/>
           <w14:ligatures w14:val="none"/>
         </w:rPr>
-        <w:t>Day 6: NumPy arrays, operations, broadcasting</w:t>
+        <w:t xml:space="preserve">Day </w:t>
+      </w:r>
+      <w:proofErr w:type="gramStart"/>
+      <w:r>
+        <w:rPr>
+          <w:rFonts w:ascii="Times New Roman" w:eastAsia="Times New Roman" w:hAnsi="Times New Roman" w:cs="Times New Roman"/>
+          <w:kern w:val="0"/>
+          <w:sz w:val="24"/>
+          <w:szCs w:val="24"/>
+          <w:highlight w:val="yellow"/>
+          <w:lang w:eastAsia="fr-FR"/>
+          <w14:ligatures w14:val="none"/>
+        </w:rPr>
+        <w:t>6:</w:t>
+      </w:r>
+      <w:proofErr w:type="gramEnd"/>
+      <w:r>
+        <w:rPr>
+          <w:rFonts w:ascii="Times New Roman" w:eastAsia="Times New Roman" w:hAnsi="Times New Roman" w:cs="Times New Roman"/>
+          <w:kern w:val="0"/>
+          <w:sz w:val="24"/>
+          <w:szCs w:val="24"/>
+          <w:highlight w:val="yellow"/>
+          <w:lang w:eastAsia="fr-FR"/>
+          <w14:ligatures w14:val="none"/>
+        </w:rPr>
+        <w:t xml:space="preserve"> </w:t>
+      </w:r>
+      <w:proofErr w:type="spellStart"/>
+      <w:r>
+        <w:rPr>
+          <w:rFonts w:ascii="Times New Roman" w:eastAsia="Times New Roman" w:hAnsi="Times New Roman" w:cs="Times New Roman"/>
+          <w:kern w:val="0"/>
+          <w:sz w:val="24"/>
+          <w:szCs w:val="24"/>
+          <w:highlight w:val="yellow"/>
+          <w:lang w:eastAsia="fr-FR"/>
+          <w14:ligatures w14:val="none"/>
+        </w:rPr>
+        <w:t>NumPy</w:t>
+      </w:r>
+      <w:proofErr w:type="spellEnd"/>
+      <w:r>
+        <w:rPr>
+          <w:rFonts w:ascii="Times New Roman" w:eastAsia="Times New Roman" w:hAnsi="Times New Roman" w:cs="Times New Roman"/>
+          <w:kern w:val="0"/>
+          <w:sz w:val="24"/>
+          <w:szCs w:val="24"/>
+          <w:highlight w:val="yellow"/>
+          <w:lang w:eastAsia="fr-FR"/>
+          <w14:ligatures w14:val="none"/>
+        </w:rPr>
+        <w:t xml:space="preserve"> </w:t>
+      </w:r>
+      <w:proofErr w:type="spellStart"/>
+      <w:r>
+        <w:rPr>
+          <w:rFonts w:ascii="Times New Roman" w:eastAsia="Times New Roman" w:hAnsi="Times New Roman" w:cs="Times New Roman"/>
+          <w:kern w:val="0"/>
+          <w:sz w:val="24"/>
+          <w:szCs w:val="24"/>
+          <w:highlight w:val="yellow"/>
+          <w:lang w:eastAsia="fr-FR"/>
+          <w14:ligatures w14:val="none"/>
+        </w:rPr>
+        <w:t>arrays</w:t>
+      </w:r>
+      <w:proofErr w:type="spellEnd"/>
+      <w:r>
+        <w:rPr>
+          <w:rFonts w:ascii="Times New Roman" w:eastAsia="Times New Roman" w:hAnsi="Times New Roman" w:cs="Times New Roman"/>
+          <w:kern w:val="0"/>
+          <w:sz w:val="24"/>
+          <w:szCs w:val="24"/>
+          <w:highlight w:val="yellow"/>
+          <w:lang w:eastAsia="fr-FR"/>
+          <w14:ligatures w14:val="none"/>
+        </w:rPr>
+        <w:t xml:space="preserve">, </w:t>
+      </w:r>
+      <w:proofErr w:type="spellStart"/>
+      <w:r>
+        <w:rPr>
+          <w:rFonts w:ascii="Times New Roman" w:eastAsia="Times New Roman" w:hAnsi="Times New Roman" w:cs="Times New Roman"/>
+          <w:kern w:val="0"/>
+          <w:sz w:val="24"/>
+          <w:szCs w:val="24"/>
+          <w:highlight w:val="yellow"/>
+          <w:lang w:eastAsia="fr-FR"/>
+          <w14:ligatures w14:val="none"/>
+        </w:rPr>
+        <w:t>operations</w:t>
+      </w:r>
+      <w:proofErr w:type="spellEnd"/>
+      <w:r>
+        <w:rPr>
+          <w:rFonts w:ascii="Times New Roman" w:eastAsia="Times New Roman" w:hAnsi="Times New Roman" w:cs="Times New Roman"/>
+          <w:kern w:val="0"/>
+          <w:sz w:val="24"/>
+          <w:szCs w:val="24"/>
+          <w:highlight w:val="yellow"/>
+          <w:lang w:eastAsia="fr-FR"/>
+          <w14:ligatures w14:val="none"/>
+        </w:rPr>
+        <w:t>, broadcasting</w:t>
       </w:r>
     </w:p>
     <w:p>
@@ -331,8 +637,66 @@
           <w:lang w:val="en-US" w:eastAsia="fr-FR"/>
           <w14:ligatures w14:val="none"/>
         </w:rPr>
-        <w:t>+ Practise mini project of numpy</w:t>
-      </w:r>
+        <w:t xml:space="preserve">+ </w:t>
+      </w:r>
+      <w:proofErr w:type="spellStart"/>
+      <w:r>
+        <w:rPr>
+          <w:rFonts w:ascii="Times New Roman" w:eastAsia="Times New Roman" w:hAnsi="Times New Roman" w:cs="Times New Roman"/>
+          <w:b/>
+          <w:bCs/>
+          <w:i/>
+          <w:iCs/>
+          <w:color w:val="EE0000"/>
+          <w:kern w:val="0"/>
+          <w:sz w:val="32"/>
+          <w:szCs w:val="32"/>
+          <w:highlight w:val="yellow"/>
+          <w:u w:val="single"/>
+          <w:lang w:val="en-US" w:eastAsia="fr-FR"/>
+          <w14:ligatures w14:val="none"/>
+        </w:rPr>
+        <w:t>Practise</w:t>
+      </w:r>
+      <w:proofErr w:type="spellEnd"/>
+      <w:r>
+        <w:rPr>
+          <w:rFonts w:ascii="Times New Roman" w:eastAsia="Times New Roman" w:hAnsi="Times New Roman" w:cs="Times New Roman"/>
+          <w:b/>
+          <w:bCs/>
+          <w:i/>
+          <w:iCs/>
+          <w:color w:val="EE0000"/>
+          <w:kern w:val="0"/>
+          <w:sz w:val="32"/>
+          <w:szCs w:val="32"/>
+          <w:highlight w:val="yellow"/>
+          <w:u w:val="single"/>
+          <w:lang w:val="en-US" w:eastAsia="fr-FR"/>
+          <w14:ligatures w14:val="none"/>
+        </w:rPr>
+        <w:t xml:space="preserve"> mini project of </w:t>
+      </w:r>
+      <w:proofErr w:type="spellStart"/>
+      <w:r>
+        <w:rPr>
+          <w:rFonts w:ascii="Times New Roman" w:eastAsia="Times New Roman" w:hAnsi="Times New Roman" w:cs="Times New Roman"/>
+          <w:b/>
+          <w:bCs/>
+          <w:i/>
+          <w:iCs/>
+          <w:color w:val="EE0000"/>
+          <w:kern w:val="0"/>
+          <w:sz w:val="32"/>
+          <w:szCs w:val="32"/>
+          <w:highlight w:val="yellow"/>
+          <w:u w:val="single"/>
+          <w:lang w:val="en-US" w:eastAsia="fr-FR"/>
+          <w14:ligatures w14:val="none"/>
+        </w:rPr>
+        <w:t>numpy</w:t>
+      </w:r>
+      <w:proofErr w:type="spellEnd"/>
     </w:p>
     <w:p>
       <w:pPr>
@@ -361,7 +725,33 @@
           <w:lang w:val="en-US" w:eastAsia="fr-FR"/>
           <w14:ligatures w14:val="none"/>
         </w:rPr>
-        <w:t>Day 8: Pandas DataFrames – loading CSV, inspecting data</w:t>
+        <w:t xml:space="preserve">Day 8: Pandas </w:t>
+      </w:r>
+      <w:proofErr w:type="spellStart"/>
+      <w:r>
+        <w:rPr>
+          <w:rFonts w:ascii="Times New Roman" w:eastAsia="Times New Roman" w:hAnsi="Times New Roman" w:cs="Times New Roman"/>
+          <w:kern w:val="0"/>
+          <w:sz w:val="24"/>
+          <w:szCs w:val="24"/>
+          <w:highlight w:val="yellow"/>
+          <w:lang w:val="en-US" w:eastAsia="fr-FR"/>
+          <w14:ligatures w14:val="none"/>
+        </w:rPr>
+        <w:t>DataFrames</w:t>
+      </w:r>
+      <w:proofErr w:type="spellEnd"/>
+      <w:r>
+        <w:rPr>
+          <w:rFonts w:ascii="Times New Roman" w:eastAsia="Times New Roman" w:hAnsi="Times New Roman" w:cs="Times New Roman"/>
+          <w:kern w:val="0"/>
+          <w:sz w:val="24"/>
+          <w:szCs w:val="24"/>
+          <w:highlight w:val="yellow"/>
+          <w:lang w:val="en-US" w:eastAsia="fr-FR"/>
+          <w14:ligatures w14:val="none"/>
+        </w:rPr>
+        <w:t xml:space="preserve"> – loading CSV, inspecting data</w:t>
       </w:r>
     </w:p>
     <w:p>
@@ -558,8 +948,22 @@
           <w:lang w:val="en-US" w:eastAsia="fr-FR"/>
           <w14:ligatures w14:val="none"/>
         </w:rPr>
-        <w:t>, pca</w:t>
-      </w:r>
+        <w:t xml:space="preserve">, </w:t>
+      </w:r>
+      <w:proofErr w:type="spellStart"/>
+      <w:r>
+        <w:rPr>
+          <w:rFonts w:ascii="Times New Roman" w:eastAsia="Times New Roman" w:hAnsi="Times New Roman" w:cs="Times New Roman"/>
+          <w:kern w:val="0"/>
+          <w:sz w:val="24"/>
+          <w:szCs w:val="24"/>
+          <w:highlight w:val="yellow"/>
+          <w:lang w:val="en-US" w:eastAsia="fr-FR"/>
+          <w14:ligatures w14:val="none"/>
+        </w:rPr>
+        <w:t>pca</w:t>
+      </w:r>
+      <w:proofErr w:type="spellEnd"/>
       <w:r>
         <w:rPr>
           <w:rFonts w:ascii="Times New Roman" w:eastAsia="Times New Roman" w:hAnsi="Times New Roman" w:cs="Times New Roman"/>
@@ -600,8 +1004,48 @@
           <w:lang w:eastAsia="fr-FR"/>
           <w14:ligatures w14:val="none"/>
         </w:rPr>
-        <w:t>Day 13: Matrices and operations</w:t>
-      </w:r>
+        <w:t xml:space="preserve">Day </w:t>
+      </w:r>
+      <w:proofErr w:type="gramStart"/>
+      <w:r>
+        <w:rPr>
+          <w:rFonts w:ascii="Times New Roman" w:eastAsia="Times New Roman" w:hAnsi="Times New Roman" w:cs="Times New Roman"/>
+          <w:kern w:val="0"/>
+          <w:sz w:val="24"/>
+          <w:szCs w:val="24"/>
+          <w:highlight w:val="yellow"/>
+          <w:lang w:eastAsia="fr-FR"/>
+          <w14:ligatures w14:val="none"/>
+        </w:rPr>
+        <w:t>13:</w:t>
+      </w:r>
+      <w:proofErr w:type="gramEnd"/>
+      <w:r>
+        <w:rPr>
+          <w:rFonts w:ascii="Times New Roman" w:eastAsia="Times New Roman" w:hAnsi="Times New Roman" w:cs="Times New Roman"/>
+          <w:kern w:val="0"/>
+          <w:sz w:val="24"/>
+          <w:szCs w:val="24"/>
+          <w:highlight w:val="yellow"/>
+          <w:lang w:eastAsia="fr-FR"/>
+          <w14:ligatures w14:val="none"/>
+        </w:rPr>
+        <w:t xml:space="preserve"> Matrices and </w:t>
+      </w:r>
+      <w:proofErr w:type="spellStart"/>
+      <w:r>
+        <w:rPr>
+          <w:rFonts w:ascii="Times New Roman" w:eastAsia="Times New Roman" w:hAnsi="Times New Roman" w:cs="Times New Roman"/>
+          <w:kern w:val="0"/>
+          <w:sz w:val="24"/>
+          <w:szCs w:val="24"/>
+          <w:highlight w:val="yellow"/>
+          <w:lang w:eastAsia="fr-FR"/>
+          <w14:ligatures w14:val="none"/>
+        </w:rPr>
+        <w:t>operations</w:t>
+      </w:r>
+      <w:proofErr w:type="spellEnd"/>
     </w:p>
     <w:p>
       <w:pPr>
@@ -659,8 +1103,87 @@
           <w:lang w:eastAsia="fr-FR"/>
           <w14:ligatures w14:val="none"/>
         </w:rPr>
-        <w:t xml:space="preserve">Day 15: Plotting with </w:t>
-      </w:r>
+        <w:t xml:space="preserve">Day </w:t>
+      </w:r>
+      <w:proofErr w:type="gramStart"/>
+      <w:r>
+        <w:rPr>
+          <w:rFonts w:ascii="Times New Roman" w:eastAsia="Times New Roman" w:hAnsi="Times New Roman" w:cs="Times New Roman"/>
+          <w:kern w:val="0"/>
+          <w:sz w:val="24"/>
+          <w:szCs w:val="24"/>
+          <w:highlight w:val="yellow"/>
+          <w:lang w:eastAsia="fr-FR"/>
+          <w14:ligatures w14:val="none"/>
+        </w:rPr>
+        <w:t>15:</w:t>
+      </w:r>
+      <w:proofErr w:type="gramEnd"/>
+      <w:r>
+        <w:rPr>
+          <w:rFonts w:ascii="Times New Roman" w:eastAsia="Times New Roman" w:hAnsi="Times New Roman" w:cs="Times New Roman"/>
+          <w:kern w:val="0"/>
+          <w:sz w:val="24"/>
+          <w:szCs w:val="24"/>
+          <w:highlight w:val="yellow"/>
+          <w:lang w:eastAsia="fr-FR"/>
+          <w14:ligatures w14:val="none"/>
+        </w:rPr>
+        <w:t xml:space="preserve"> </w:t>
+      </w:r>
+      <w:proofErr w:type="spellStart"/>
+      <w:r>
+        <w:rPr>
+          <w:rFonts w:ascii="Times New Roman" w:eastAsia="Times New Roman" w:hAnsi="Times New Roman" w:cs="Times New Roman"/>
+          <w:kern w:val="0"/>
+          <w:sz w:val="24"/>
+          <w:szCs w:val="24"/>
+          <w:highlight w:val="yellow"/>
+          <w:lang w:eastAsia="fr-FR"/>
+          <w14:ligatures w14:val="none"/>
+        </w:rPr>
+        <w:t>Plotting</w:t>
+      </w:r>
+      <w:proofErr w:type="spellEnd"/>
+      <w:r>
+        <w:rPr>
+          <w:rFonts w:ascii="Times New Roman" w:eastAsia="Times New Roman" w:hAnsi="Times New Roman" w:cs="Times New Roman"/>
+          <w:kern w:val="0"/>
+          <w:sz w:val="24"/>
+          <w:szCs w:val="24"/>
+          <w:highlight w:val="yellow"/>
+          <w:lang w:eastAsia="fr-FR"/>
+          <w14:ligatures w14:val="none"/>
+        </w:rPr>
+        <w:t xml:space="preserve"> </w:t>
+      </w:r>
+      <w:proofErr w:type="spellStart"/>
+      <w:r>
+        <w:rPr>
+          <w:rFonts w:ascii="Times New Roman" w:eastAsia="Times New Roman" w:hAnsi="Times New Roman" w:cs="Times New Roman"/>
+          <w:kern w:val="0"/>
+          <w:sz w:val="24"/>
+          <w:szCs w:val="24"/>
+          <w:highlight w:val="yellow"/>
+          <w:lang w:eastAsia="fr-FR"/>
+          <w14:ligatures w14:val="none"/>
+        </w:rPr>
+        <w:t>with</w:t>
+      </w:r>
+      <w:proofErr w:type="spellEnd"/>
+      <w:r>
+        <w:rPr>
+          <w:rFonts w:ascii="Times New Roman" w:eastAsia="Times New Roman" w:hAnsi="Times New Roman" w:cs="Times New Roman"/>
+          <w:kern w:val="0"/>
+          <w:sz w:val="24"/>
+          <w:szCs w:val="24"/>
+          <w:highlight w:val="yellow"/>
+          <w:lang w:eastAsia="fr-FR"/>
+          <w14:ligatures w14:val="none"/>
+        </w:rPr>
+        <w:t xml:space="preserve"> </w:t>
+      </w:r>
+      <w:proofErr w:type="spellStart"/>
       <w:r>
         <w:rPr>
           <w:rFonts w:ascii="Courier New" w:eastAsia="Times New Roman" w:hAnsi="Courier New" w:cs="Courier New"/>
@@ -673,6 +1196,7 @@
         </w:rPr>
         <w:t>matplotlib</w:t>
       </w:r>
+      <w:proofErr w:type="spellEnd"/>
       <w:r>
         <w:rPr>
           <w:rFonts w:ascii="Times New Roman" w:eastAsia="Times New Roman" w:hAnsi="Times New Roman" w:cs="Times New Roman"/>
@@ -685,6 +1209,7 @@
         </w:rPr>
         <w:t xml:space="preserve"> &amp; </w:t>
       </w:r>
+      <w:proofErr w:type="spellStart"/>
       <w:r>
         <w:rPr>
           <w:rFonts w:ascii="Courier New" w:eastAsia="Times New Roman" w:hAnsi="Courier New" w:cs="Courier New"/>
@@ -697,6 +1222,7 @@
         </w:rPr>
         <w:t>seaborn</w:t>
       </w:r>
+      <w:proofErr w:type="spellEnd"/>
     </w:p>
     <w:p>
       <w:pPr>
@@ -724,7 +1250,63 @@
           <w:lang w:eastAsia="fr-FR"/>
           <w14:ligatures w14:val="none"/>
         </w:rPr>
-        <w:t>Days 16–20: Data Cleaning &amp; EDA</w:t>
+        <w:t>Days 16–</w:t>
+      </w:r>
+      <w:proofErr w:type="gramStart"/>
+      <w:r>
+        <w:rPr>
+          <w:rFonts w:ascii="Times New Roman" w:eastAsia="Times New Roman" w:hAnsi="Times New Roman" w:cs="Times New Roman"/>
+          <w:b/>
+          <w:bCs/>
+          <w:kern w:val="0"/>
+          <w:sz w:val="27"/>
+          <w:szCs w:val="27"/>
+          <w:lang w:eastAsia="fr-FR"/>
+          <w14:ligatures w14:val="none"/>
+        </w:rPr>
+        <w:t>20:</w:t>
+      </w:r>
+      <w:proofErr w:type="gramEnd"/>
+      <w:r>
+        <w:rPr>
+          <w:rFonts w:ascii="Times New Roman" w:eastAsia="Times New Roman" w:hAnsi="Times New Roman" w:cs="Times New Roman"/>
+          <w:b/>
+          <w:bCs/>
+          <w:kern w:val="0"/>
+          <w:sz w:val="27"/>
+          <w:szCs w:val="27"/>
+          <w:lang w:eastAsia="fr-FR"/>
+          <w14:ligatures w14:val="none"/>
+        </w:rPr>
+        <w:t xml:space="preserve"> Data </w:t>
+      </w:r>
+      <w:proofErr w:type="spellStart"/>
+      <w:r>
+        <w:rPr>
+          <w:rFonts w:ascii="Times New Roman" w:eastAsia="Times New Roman" w:hAnsi="Times New Roman" w:cs="Times New Roman"/>
+          <w:b/>
+          <w:bCs/>
+          <w:kern w:val="0"/>
+          <w:sz w:val="27"/>
+          <w:szCs w:val="27"/>
+          <w:lang w:eastAsia="fr-FR"/>
+          <w14:ligatures w14:val="none"/>
+        </w:rPr>
+        <w:t>Cleaning</w:t>
+      </w:r>
+      <w:proofErr w:type="spellEnd"/>
+      <w:r>
+        <w:rPr>
+          <w:rFonts w:ascii="Times New Roman" w:eastAsia="Times New Roman" w:hAnsi="Times New Roman" w:cs="Times New Roman"/>
+          <w:b/>
+          <w:bCs/>
+          <w:kern w:val="0"/>
+          <w:sz w:val="27"/>
+          <w:szCs w:val="27"/>
+          <w:lang w:eastAsia="fr-FR"/>
+          <w14:ligatures w14:val="none"/>
+        </w:rPr>
+        <w:t xml:space="preserve"> &amp; EDA</w:t>
       </w:r>
     </w:p>
     <w:p>
@@ -843,7 +1425,20 @@
           <w:lang w:val="en-US" w:eastAsia="fr-FR"/>
           <w14:ligatures w14:val="none"/>
         </w:rPr>
-        <w:t>Day 19: Correlation</w:t>
+        <w:t xml:space="preserve">Day 19: </w:t>
+      </w:r>
+      <w:proofErr w:type="gramStart"/>
+      <w:r>
+        <w:rPr>
+          <w:rFonts w:ascii="Times New Roman" w:eastAsia="Times New Roman" w:hAnsi="Times New Roman" w:cs="Times New Roman"/>
+          <w:kern w:val="0"/>
+          <w:sz w:val="24"/>
+          <w:szCs w:val="24"/>
+          <w:highlight w:val="yellow"/>
+          <w:lang w:val="en-US" w:eastAsia="fr-FR"/>
+          <w14:ligatures w14:val="none"/>
+        </w:rPr>
+        <w:t>Correlation</w:t>
       </w:r>
       <w:r>
         <w:rPr>
@@ -857,6 +1452,7 @@
         </w:rPr>
         <w:t>(</w:t>
       </w:r>
+      <w:proofErr w:type="gramEnd"/>
       <w:r>
         <w:rPr>
           <w:rFonts w:ascii="Times New Roman" w:eastAsia="Times New Roman" w:hAnsi="Times New Roman" w:cs="Times New Roman"/>
@@ -940,6 +1536,7 @@
         </w:rPr>
         <w:t xml:space="preserve"> </w:t>
       </w:r>
+      <w:proofErr w:type="spellStart"/>
       <w:r>
         <w:rPr>
           <w:rFonts w:ascii="Times New Roman" w:eastAsia="Times New Roman" w:hAnsi="Times New Roman" w:cs="Times New Roman"/>
@@ -952,6 +1549,7 @@
         </w:rPr>
         <w:t>groupby</w:t>
       </w:r>
+      <w:proofErr w:type="spellEnd"/>
     </w:p>
     <w:p>
       <w:pPr>
@@ -980,8 +1578,9 @@
           <w:lang w:val="en-US" w:eastAsia="fr-FR"/>
           <w14:ligatures w14:val="none"/>
         </w:rPr>
-        <w:t>Day 20: Mini project: Full EDA on Titanic dataset</w:t>
-      </w:r>
+        <w:t xml:space="preserve">Day 20: Mini project: Full EDA on Titanic </w:t>
+      </w:r>
+      <w:proofErr w:type="gramStart"/>
       <w:r>
         <w:rPr>
           <w:rFonts w:ascii="Times New Roman" w:eastAsia="Times New Roman" w:hAnsi="Times New Roman" w:cs="Times New Roman"/>
@@ -992,7 +1591,32 @@
           <w:lang w:val="en-US" w:eastAsia="fr-FR"/>
           <w14:ligatures w14:val="none"/>
         </w:rPr>
-        <w:t>(done day 18)</w:t>
+        <w:t>dataset</w:t>
+      </w:r>
+      <w:r>
+        <w:rPr>
+          <w:rFonts w:ascii="Times New Roman" w:eastAsia="Times New Roman" w:hAnsi="Times New Roman" w:cs="Times New Roman"/>
+          <w:kern w:val="0"/>
+          <w:sz w:val="24"/>
+          <w:szCs w:val="24"/>
+          <w:highlight w:val="cyan"/>
+          <w:lang w:val="en-US" w:eastAsia="fr-FR"/>
+          <w14:ligatures w14:val="none"/>
+        </w:rPr>
+        <w:t>(</w:t>
+      </w:r>
+      <w:proofErr w:type="gramEnd"/>
+      <w:r>
+        <w:rPr>
+          <w:rFonts w:ascii="Times New Roman" w:eastAsia="Times New Roman" w:hAnsi="Times New Roman" w:cs="Times New Roman"/>
+          <w:kern w:val="0"/>
+          <w:sz w:val="24"/>
+          <w:szCs w:val="24"/>
+          <w:highlight w:val="cyan"/>
+          <w:lang w:val="en-US" w:eastAsia="fr-FR"/>
+          <w14:ligatures w14:val="none"/>
+        </w:rPr>
+        <w:t>done day 18)</w:t>
       </w:r>
     </w:p>
     <w:p>
@@ -1060,7 +1684,35 @@
           <w:lang w:val="en-US" w:eastAsia="fr-FR"/>
           <w14:ligatures w14:val="none"/>
         </w:rPr>
-        <w:t xml:space="preserve"> Phase 2: Machine Learning Basics (Days 21–50)</w:t>
+        <w:t xml:space="preserve"> Phase </w:t>
+      </w:r>
+      <w:proofErr w:type="gramStart"/>
+      <w:r>
+        <w:rPr>
+          <w:rFonts w:ascii="Times New Roman" w:eastAsia="Times New Roman" w:hAnsi="Times New Roman" w:cs="Times New Roman"/>
+          <w:b/>
+          <w:bCs/>
+          <w:kern w:val="0"/>
+          <w:sz w:val="36"/>
+          <w:szCs w:val="36"/>
+          <w:lang w:val="en-US" w:eastAsia="fr-FR"/>
+          <w14:ligatures w14:val="none"/>
+        </w:rPr>
+        <w:t>2:</w:t>
+      </w:r>
+      <w:proofErr w:type="gramEnd"/>
+      <w:r>
+        <w:rPr>
+          <w:rFonts w:ascii="Times New Roman" w:eastAsia="Times New Roman" w:hAnsi="Times New Roman" w:cs="Times New Roman"/>
+          <w:b/>
+          <w:bCs/>
+          <w:kern w:val="0"/>
+          <w:sz w:val="36"/>
+          <w:szCs w:val="36"/>
+          <w:lang w:val="en-US" w:eastAsia="fr-FR"/>
+          <w14:ligatures w14:val="none"/>
+        </w:rPr>
+        <w:t xml:space="preserve"> Machine Learning Basics (Days 21–50)</w:t>
       </w:r>
     </w:p>
     <w:p>
@@ -2573,8 +3225,9 @@
           <w:lang w:eastAsia="fr-FR"/>
           <w14:ligatures w14:val="none"/>
         </w:rPr>
-        <w:t>Days 31–35: Classification – Logistic Regressio</w:t>
-      </w:r>
+        <w:t>Days 31–</w:t>
+      </w:r>
+      <w:proofErr w:type="gramStart"/>
       <w:r>
         <w:rPr>
           <w:rFonts w:ascii="Times New Roman" w:eastAsia="Times New Roman" w:hAnsi="Times New Roman" w:cs="Times New Roman"/>
@@ -2586,8 +3239,9 @@
           <w:lang w:eastAsia="fr-FR"/>
           <w14:ligatures w14:val="none"/>
         </w:rPr>
-        <w:t xml:space="preserve">n : </w:t>
-      </w:r>
+        <w:t>35:</w:t>
+      </w:r>
+      <w:proofErr w:type="gramEnd"/>
       <w:r>
         <w:rPr>
           <w:rFonts w:ascii="Times New Roman" w:eastAsia="Times New Roman" w:hAnsi="Times New Roman" w:cs="Times New Roman"/>
@@ -2599,8 +3253,9 @@
           <w:lang w:eastAsia="fr-FR"/>
           <w14:ligatures w14:val="none"/>
         </w:rPr>
-        <w:t>Binaire, multicla</w:t>
-      </w:r>
+        <w:t xml:space="preserve"> Classification – </w:t>
+      </w:r>
+      <w:proofErr w:type="spellStart"/>
       <w:r>
         <w:rPr>
           <w:rFonts w:ascii="Times New Roman" w:eastAsia="Times New Roman" w:hAnsi="Times New Roman" w:cs="Times New Roman"/>
@@ -2612,8 +3267,104 @@
           <w:lang w:eastAsia="fr-FR"/>
           <w14:ligatures w14:val="none"/>
         </w:rPr>
-        <w:t>sse, ordianle</w:t>
-      </w:r>
+        <w:t>Logistic</w:t>
+      </w:r>
+      <w:proofErr w:type="spellEnd"/>
+      <w:r>
+        <w:rPr>
+          <w:rFonts w:ascii="Times New Roman" w:eastAsia="Times New Roman" w:hAnsi="Times New Roman" w:cs="Times New Roman"/>
+          <w:b/>
+          <w:bCs/>
+          <w:kern w:val="0"/>
+          <w:sz w:val="27"/>
+          <w:szCs w:val="27"/>
+          <w:lang w:eastAsia="fr-FR"/>
+          <w14:ligatures w14:val="none"/>
+        </w:rPr>
+        <w:t xml:space="preserve"> </w:t>
+      </w:r>
+      <w:proofErr w:type="spellStart"/>
+      <w:r>
+        <w:rPr>
+          <w:rFonts w:ascii="Times New Roman" w:eastAsia="Times New Roman" w:hAnsi="Times New Roman" w:cs="Times New Roman"/>
+          <w:b/>
+          <w:bCs/>
+          <w:kern w:val="0"/>
+          <w:sz w:val="27"/>
+          <w:szCs w:val="27"/>
+          <w:lang w:eastAsia="fr-FR"/>
+          <w14:ligatures w14:val="none"/>
+        </w:rPr>
+        <w:t>Regressio</w:t>
+      </w:r>
+      <w:r>
+        <w:rPr>
+          <w:rFonts w:ascii="Times New Roman" w:eastAsia="Times New Roman" w:hAnsi="Times New Roman" w:cs="Times New Roman"/>
+          <w:b/>
+          <w:bCs/>
+          <w:kern w:val="0"/>
+          <w:sz w:val="27"/>
+          <w:szCs w:val="27"/>
+          <w:lang w:eastAsia="fr-FR"/>
+          <w14:ligatures w14:val="none"/>
+        </w:rPr>
+        <w:t>n</w:t>
+      </w:r>
+      <w:proofErr w:type="spellEnd"/>
+      <w:r>
+        <w:rPr>
+          <w:rFonts w:ascii="Times New Roman" w:eastAsia="Times New Roman" w:hAnsi="Times New Roman" w:cs="Times New Roman"/>
+          <w:b/>
+          <w:bCs/>
+          <w:kern w:val="0"/>
+          <w:sz w:val="27"/>
+          <w:szCs w:val="27"/>
+          <w:lang w:eastAsia="fr-FR"/>
+          <w14:ligatures w14:val="none"/>
+        </w:rPr>
+        <w:t xml:space="preserve"> : </w:t>
+      </w:r>
+      <w:r>
+        <w:rPr>
+          <w:rFonts w:ascii="Times New Roman" w:eastAsia="Times New Roman" w:hAnsi="Times New Roman" w:cs="Times New Roman"/>
+          <w:b/>
+          <w:bCs/>
+          <w:kern w:val="0"/>
+          <w:sz w:val="27"/>
+          <w:szCs w:val="27"/>
+          <w:lang w:eastAsia="fr-FR"/>
+          <w14:ligatures w14:val="none"/>
+        </w:rPr>
+        <w:t>Binaire, multicla</w:t>
+      </w:r>
+      <w:r>
+        <w:rPr>
+          <w:rFonts w:ascii="Times New Roman" w:eastAsia="Times New Roman" w:hAnsi="Times New Roman" w:cs="Times New Roman"/>
+          <w:b/>
+          <w:bCs/>
+          <w:kern w:val="0"/>
+          <w:sz w:val="27"/>
+          <w:szCs w:val="27"/>
+          <w:lang w:eastAsia="fr-FR"/>
+          <w14:ligatures w14:val="none"/>
+        </w:rPr>
+        <w:t xml:space="preserve">sse, </w:t>
+      </w:r>
+      <w:proofErr w:type="spellStart"/>
+      <w:r>
+        <w:rPr>
+          <w:rFonts w:ascii="Times New Roman" w:eastAsia="Times New Roman" w:hAnsi="Times New Roman" w:cs="Times New Roman"/>
+          <w:b/>
+          <w:bCs/>
+          <w:kern w:val="0"/>
+          <w:sz w:val="27"/>
+          <w:szCs w:val="27"/>
+          <w:lang w:eastAsia="fr-FR"/>
+          <w14:ligatures w14:val="none"/>
+        </w:rPr>
+        <w:t>ordianle</w:t>
+      </w:r>
+      <w:proofErr w:type="spellEnd"/>
     </w:p>
     <w:p>
       <w:pPr>
@@ -2732,8 +3483,74 @@
           <w:lang w:eastAsia="fr-FR"/>
           <w14:ligatures w14:val="none"/>
         </w:rPr>
-        <w:t>Day 34: Evaluation: confusion matrix, ROC curve</w:t>
-      </w:r>
+        <w:t xml:space="preserve">Day </w:t>
+      </w:r>
+      <w:proofErr w:type="gramStart"/>
+      <w:r>
+        <w:rPr>
+          <w:rFonts w:ascii="Times New Roman" w:eastAsia="Times New Roman" w:hAnsi="Times New Roman" w:cs="Times New Roman"/>
+          <w:kern w:val="0"/>
+          <w:sz w:val="24"/>
+          <w:szCs w:val="24"/>
+          <w:highlight w:val="yellow"/>
+          <w:lang w:eastAsia="fr-FR"/>
+          <w14:ligatures w14:val="none"/>
+        </w:rPr>
+        <w:t>34:</w:t>
+      </w:r>
+      <w:proofErr w:type="gramEnd"/>
+      <w:r>
+        <w:rPr>
+          <w:rFonts w:ascii="Times New Roman" w:eastAsia="Times New Roman" w:hAnsi="Times New Roman" w:cs="Times New Roman"/>
+          <w:kern w:val="0"/>
+          <w:sz w:val="24"/>
+          <w:szCs w:val="24"/>
+          <w:highlight w:val="yellow"/>
+          <w:lang w:eastAsia="fr-FR"/>
+          <w14:ligatures w14:val="none"/>
+        </w:rPr>
+        <w:t xml:space="preserve"> </w:t>
+      </w:r>
+      <w:proofErr w:type="gramStart"/>
+      <w:r>
+        <w:rPr>
+          <w:rFonts w:ascii="Times New Roman" w:eastAsia="Times New Roman" w:hAnsi="Times New Roman" w:cs="Times New Roman"/>
+          <w:kern w:val="0"/>
+          <w:sz w:val="24"/>
+          <w:szCs w:val="24"/>
+          <w:highlight w:val="yellow"/>
+          <w:lang w:eastAsia="fr-FR"/>
+          <w14:ligatures w14:val="none"/>
+        </w:rPr>
+        <w:t>Evaluation:</w:t>
+      </w:r>
+      <w:proofErr w:type="gramEnd"/>
+      <w:r>
+        <w:rPr>
+          <w:rFonts w:ascii="Times New Roman" w:eastAsia="Times New Roman" w:hAnsi="Times New Roman" w:cs="Times New Roman"/>
+          <w:kern w:val="0"/>
+          <w:sz w:val="24"/>
+          <w:szCs w:val="24"/>
+          <w:highlight w:val="yellow"/>
+          <w:lang w:eastAsia="fr-FR"/>
+          <w14:ligatures w14:val="none"/>
+        </w:rPr>
+        <w:t xml:space="preserve"> confusion matrix, ROC </w:t>
+      </w:r>
+      <w:proofErr w:type="spellStart"/>
+      <w:r>
+        <w:rPr>
+          <w:rFonts w:ascii="Times New Roman" w:eastAsia="Times New Roman" w:hAnsi="Times New Roman" w:cs="Times New Roman"/>
+          <w:kern w:val="0"/>
+          <w:sz w:val="24"/>
+          <w:szCs w:val="24"/>
+          <w:highlight w:val="yellow"/>
+          <w:lang w:eastAsia="fr-FR"/>
+          <w14:ligatures w14:val="none"/>
+        </w:rPr>
+        <w:t>curve</w:t>
+      </w:r>
+      <w:proofErr w:type="spellEnd"/>
     </w:p>
     <w:p>
       <w:pPr>
@@ -2961,8 +3778,74 @@
           <w:lang w:eastAsia="fr-FR"/>
           <w14:ligatures w14:val="none"/>
         </w:rPr>
-        <w:t>Day 38: Overfitting and pruning</w:t>
-      </w:r>
+        <w:t xml:space="preserve">Day </w:t>
+      </w:r>
+      <w:proofErr w:type="gramStart"/>
+      <w:r>
+        <w:rPr>
+          <w:rFonts w:ascii="Times New Roman" w:eastAsia="Times New Roman" w:hAnsi="Times New Roman" w:cs="Times New Roman"/>
+          <w:kern w:val="0"/>
+          <w:sz w:val="24"/>
+          <w:szCs w:val="24"/>
+          <w:highlight w:val="yellow"/>
+          <w:lang w:eastAsia="fr-FR"/>
+          <w14:ligatures w14:val="none"/>
+        </w:rPr>
+        <w:t>38:</w:t>
+      </w:r>
+      <w:proofErr w:type="gramEnd"/>
+      <w:r>
+        <w:rPr>
+          <w:rFonts w:ascii="Times New Roman" w:eastAsia="Times New Roman" w:hAnsi="Times New Roman" w:cs="Times New Roman"/>
+          <w:kern w:val="0"/>
+          <w:sz w:val="24"/>
+          <w:szCs w:val="24"/>
+          <w:highlight w:val="yellow"/>
+          <w:lang w:eastAsia="fr-FR"/>
+          <w14:ligatures w14:val="none"/>
+        </w:rPr>
+        <w:t xml:space="preserve"> </w:t>
+      </w:r>
+      <w:proofErr w:type="spellStart"/>
+      <w:r>
+        <w:rPr>
+          <w:rFonts w:ascii="Times New Roman" w:eastAsia="Times New Roman" w:hAnsi="Times New Roman" w:cs="Times New Roman"/>
+          <w:kern w:val="0"/>
+          <w:sz w:val="24"/>
+          <w:szCs w:val="24"/>
+          <w:highlight w:val="yellow"/>
+          <w:lang w:eastAsia="fr-FR"/>
+          <w14:ligatures w14:val="none"/>
+        </w:rPr>
+        <w:t>Overfitting</w:t>
+      </w:r>
+      <w:proofErr w:type="spellEnd"/>
+      <w:r>
+        <w:rPr>
+          <w:rFonts w:ascii="Times New Roman" w:eastAsia="Times New Roman" w:hAnsi="Times New Roman" w:cs="Times New Roman"/>
+          <w:kern w:val="0"/>
+          <w:sz w:val="24"/>
+          <w:szCs w:val="24"/>
+          <w:highlight w:val="yellow"/>
+          <w:lang w:eastAsia="fr-FR"/>
+          <w14:ligatures w14:val="none"/>
+        </w:rPr>
+        <w:t xml:space="preserve"> and </w:t>
+      </w:r>
+      <w:proofErr w:type="spellStart"/>
+      <w:r>
+        <w:rPr>
+          <w:rFonts w:ascii="Times New Roman" w:eastAsia="Times New Roman" w:hAnsi="Times New Roman" w:cs="Times New Roman"/>
+          <w:kern w:val="0"/>
+          <w:sz w:val="24"/>
+          <w:szCs w:val="24"/>
+          <w:highlight w:val="yellow"/>
+          <w:lang w:eastAsia="fr-FR"/>
+          <w14:ligatures w14:val="none"/>
+        </w:rPr>
+        <w:t>pruning</w:t>
+      </w:r>
+      <w:proofErr w:type="spellEnd"/>
     </w:p>
     <w:p>
       <w:pPr>
@@ -2991,8 +3874,100 @@
           <w:lang w:eastAsia="fr-FR"/>
           <w14:ligatures w14:val="none"/>
         </w:rPr>
-        <w:t>Day 39: Visualizing decision trees</w:t>
-      </w:r>
+        <w:t xml:space="preserve">Day </w:t>
+      </w:r>
+      <w:proofErr w:type="gramStart"/>
+      <w:r>
+        <w:rPr>
+          <w:rFonts w:ascii="Times New Roman" w:eastAsia="Times New Roman" w:hAnsi="Times New Roman" w:cs="Times New Roman"/>
+          <w:kern w:val="0"/>
+          <w:sz w:val="24"/>
+          <w:szCs w:val="24"/>
+          <w:highlight w:val="yellow"/>
+          <w:lang w:eastAsia="fr-FR"/>
+          <w14:ligatures w14:val="none"/>
+        </w:rPr>
+        <w:t>39:</w:t>
+      </w:r>
+      <w:proofErr w:type="gramEnd"/>
+      <w:r>
+        <w:rPr>
+          <w:rFonts w:ascii="Times New Roman" w:eastAsia="Times New Roman" w:hAnsi="Times New Roman" w:cs="Times New Roman"/>
+          <w:kern w:val="0"/>
+          <w:sz w:val="24"/>
+          <w:szCs w:val="24"/>
+          <w:highlight w:val="yellow"/>
+          <w:lang w:eastAsia="fr-FR"/>
+          <w14:ligatures w14:val="none"/>
+        </w:rPr>
+        <w:t xml:space="preserve"> </w:t>
+      </w:r>
+      <w:proofErr w:type="spellStart"/>
+      <w:r>
+        <w:rPr>
+          <w:rFonts w:ascii="Times New Roman" w:eastAsia="Times New Roman" w:hAnsi="Times New Roman" w:cs="Times New Roman"/>
+          <w:kern w:val="0"/>
+          <w:sz w:val="24"/>
+          <w:szCs w:val="24"/>
+          <w:highlight w:val="yellow"/>
+          <w:lang w:eastAsia="fr-FR"/>
+          <w14:ligatures w14:val="none"/>
+        </w:rPr>
+        <w:t>Visualizing</w:t>
+      </w:r>
+      <w:proofErr w:type="spellEnd"/>
+      <w:r>
+        <w:rPr>
+          <w:rFonts w:ascii="Times New Roman" w:eastAsia="Times New Roman" w:hAnsi="Times New Roman" w:cs="Times New Roman"/>
+          <w:kern w:val="0"/>
+          <w:sz w:val="24"/>
+          <w:szCs w:val="24"/>
+          <w:highlight w:val="yellow"/>
+          <w:lang w:eastAsia="fr-FR"/>
+          <w14:ligatures w14:val="none"/>
+        </w:rPr>
+        <w:t xml:space="preserve"> </w:t>
+      </w:r>
+      <w:proofErr w:type="spellStart"/>
+      <w:r>
+        <w:rPr>
+          <w:rFonts w:ascii="Times New Roman" w:eastAsia="Times New Roman" w:hAnsi="Times New Roman" w:cs="Times New Roman"/>
+          <w:kern w:val="0"/>
+          <w:sz w:val="24"/>
+          <w:szCs w:val="24"/>
+          <w:highlight w:val="yellow"/>
+          <w:lang w:eastAsia="fr-FR"/>
+          <w14:ligatures w14:val="none"/>
+        </w:rPr>
+        <w:t>decision</w:t>
+      </w:r>
+      <w:proofErr w:type="spellEnd"/>
+      <w:r>
+        <w:rPr>
+          <w:rFonts w:ascii="Times New Roman" w:eastAsia="Times New Roman" w:hAnsi="Times New Roman" w:cs="Times New Roman"/>
+          <w:kern w:val="0"/>
+          <w:sz w:val="24"/>
+          <w:szCs w:val="24"/>
+          <w:highlight w:val="yellow"/>
+          <w:lang w:eastAsia="fr-FR"/>
+          <w14:ligatures w14:val="none"/>
+        </w:rPr>
+        <w:t xml:space="preserve"> </w:t>
+      </w:r>
+      <w:proofErr w:type="spellStart"/>
+      <w:r>
+        <w:rPr>
+          <w:rFonts w:ascii="Times New Roman" w:eastAsia="Times New Roman" w:hAnsi="Times New Roman" w:cs="Times New Roman"/>
+          <w:kern w:val="0"/>
+          <w:sz w:val="24"/>
+          <w:szCs w:val="24"/>
+          <w:highlight w:val="yellow"/>
+          <w:lang w:eastAsia="fr-FR"/>
+          <w14:ligatures w14:val="none"/>
+        </w:rPr>
+        <w:t>trees</w:t>
+      </w:r>
+      <w:proofErr w:type="spellEnd"/>
     </w:p>
     <w:p>
       <w:pPr>
@@ -3062,7 +4037,35 @@
           <w:lang w:eastAsia="fr-FR"/>
           <w14:ligatures w14:val="none"/>
         </w:rPr>
-        <w:t>Days 41–45: Ensemble Methods</w:t>
+        <w:t>Days 41–</w:t>
+      </w:r>
+      <w:proofErr w:type="gramStart"/>
+      <w:r>
+        <w:rPr>
+          <w:rFonts w:ascii="Times New Roman" w:eastAsia="Times New Roman" w:hAnsi="Times New Roman" w:cs="Times New Roman"/>
+          <w:b/>
+          <w:bCs/>
+          <w:kern w:val="0"/>
+          <w:sz w:val="27"/>
+          <w:szCs w:val="27"/>
+          <w:lang w:eastAsia="fr-FR"/>
+          <w14:ligatures w14:val="none"/>
+        </w:rPr>
+        <w:t>45:</w:t>
+      </w:r>
+      <w:proofErr w:type="gramEnd"/>
+      <w:r>
+        <w:rPr>
+          <w:rFonts w:ascii="Times New Roman" w:eastAsia="Times New Roman" w:hAnsi="Times New Roman" w:cs="Times New Roman"/>
+          <w:b/>
+          <w:bCs/>
+          <w:kern w:val="0"/>
+          <w:sz w:val="27"/>
+          <w:szCs w:val="27"/>
+          <w:lang w:eastAsia="fr-FR"/>
+          <w14:ligatures w14:val="none"/>
+        </w:rPr>
+        <w:t xml:space="preserve"> Ensemble Methods</w:t>
       </w:r>
     </w:p>
     <w:p>
@@ -3092,19 +4095,45 @@
           <w:lang w:val="en-US" w:eastAsia="fr-FR"/>
           <w14:ligatures w14:val="none"/>
         </w:rPr>
-        <w:t>Day 41: Random Forest – theory</w:t>
-      </w:r>
-      <w:r>
-        <w:rPr>
-          <w:rFonts w:ascii="Times New Roman" w:eastAsia="Times New Roman" w:hAnsi="Times New Roman" w:cs="Times New Roman"/>
-          <w:kern w:val="0"/>
-          <w:sz w:val="24"/>
-          <w:szCs w:val="24"/>
-          <w:highlight w:val="yellow"/>
-          <w:lang w:val="en-US" w:eastAsia="fr-FR"/>
-          <w14:ligatures w14:val="none"/>
-        </w:rPr>
-        <w:t>(c</w:t>
+        <w:t xml:space="preserve">Day 41: Random Forest – </w:t>
+      </w:r>
+      <w:proofErr w:type="gramStart"/>
+      <w:r>
+        <w:rPr>
+          <w:rFonts w:ascii="Times New Roman" w:eastAsia="Times New Roman" w:hAnsi="Times New Roman" w:cs="Times New Roman"/>
+          <w:kern w:val="0"/>
+          <w:sz w:val="24"/>
+          <w:szCs w:val="24"/>
+          <w:highlight w:val="yellow"/>
+          <w:lang w:val="en-US" w:eastAsia="fr-FR"/>
+          <w14:ligatures w14:val="none"/>
+        </w:rPr>
+        <w:t>theory</w:t>
+      </w:r>
+      <w:r>
+        <w:rPr>
+          <w:rFonts w:ascii="Times New Roman" w:eastAsia="Times New Roman" w:hAnsi="Times New Roman" w:cs="Times New Roman"/>
+          <w:kern w:val="0"/>
+          <w:sz w:val="24"/>
+          <w:szCs w:val="24"/>
+          <w:highlight w:val="yellow"/>
+          <w:lang w:val="en-US" w:eastAsia="fr-FR"/>
+          <w14:ligatures w14:val="none"/>
+        </w:rPr>
+        <w:t>(</w:t>
+      </w:r>
+      <w:proofErr w:type="gramEnd"/>
+      <w:r>
+        <w:rPr>
+          <w:rFonts w:ascii="Times New Roman" w:eastAsia="Times New Roman" w:hAnsi="Times New Roman" w:cs="Times New Roman"/>
+          <w:kern w:val="0"/>
+          <w:sz w:val="24"/>
+          <w:szCs w:val="24"/>
+          <w:highlight w:val="yellow"/>
+          <w:lang w:val="en-US" w:eastAsia="fr-FR"/>
+          <w14:ligatures w14:val="none"/>
+        </w:rPr>
+        <w:t>c</w:t>
       </w:r>
       <w:r>
         <w:rPr>
@@ -3146,8 +4175,22 @@
           <w:lang w:val="en-US" w:eastAsia="fr-FR"/>
           <w14:ligatures w14:val="none"/>
         </w:rPr>
-        <w:t>Day 42: Implement Random Forest with sklearn</w:t>
-      </w:r>
+        <w:t xml:space="preserve">Day 42: Implement Random Forest with </w:t>
+      </w:r>
+      <w:proofErr w:type="spellStart"/>
+      <w:r>
+        <w:rPr>
+          <w:rFonts w:ascii="Times New Roman" w:eastAsia="Times New Roman" w:hAnsi="Times New Roman" w:cs="Times New Roman"/>
+          <w:kern w:val="0"/>
+          <w:sz w:val="24"/>
+          <w:szCs w:val="24"/>
+          <w:highlight w:val="yellow"/>
+          <w:lang w:val="en-US" w:eastAsia="fr-FR"/>
+          <w14:ligatures w14:val="none"/>
+        </w:rPr>
+        <w:t>sklearn</w:t>
+      </w:r>
+      <w:proofErr w:type="spellEnd"/>
     </w:p>
     <w:p>
       <w:pPr>
@@ -3191,7 +4234,33 @@
           <w:lang w:val="en-US" w:eastAsia="fr-FR"/>
           <w14:ligatures w14:val="none"/>
         </w:rPr>
-        <w:t>Day 43: Gradient Boosting (intro to XGBoost)</w:t>
+        <w:t xml:space="preserve">Day 43: Gradient Boosting (intro to </w:t>
+      </w:r>
+      <w:proofErr w:type="spellStart"/>
+      <w:r>
+        <w:rPr>
+          <w:rFonts w:ascii="Times New Roman" w:eastAsia="Times New Roman" w:hAnsi="Times New Roman" w:cs="Times New Roman"/>
+          <w:kern w:val="0"/>
+          <w:sz w:val="24"/>
+          <w:szCs w:val="24"/>
+          <w:highlight w:val="yellow"/>
+          <w:lang w:val="en-US" w:eastAsia="fr-FR"/>
+          <w14:ligatures w14:val="none"/>
+        </w:rPr>
+        <w:t>XGBoost</w:t>
+      </w:r>
+      <w:proofErr w:type="spellEnd"/>
+      <w:r>
+        <w:rPr>
+          <w:rFonts w:ascii="Times New Roman" w:eastAsia="Times New Roman" w:hAnsi="Times New Roman" w:cs="Times New Roman"/>
+          <w:kern w:val="0"/>
+          <w:sz w:val="24"/>
+          <w:szCs w:val="24"/>
+          <w:highlight w:val="yellow"/>
+          <w:lang w:val="en-US" w:eastAsia="fr-FR"/>
+          <w14:ligatures w14:val="none"/>
+        </w:rPr>
+        <w:t>)</w:t>
       </w:r>
     </w:p>
     <w:p>
@@ -3221,7 +4290,59 @@
           <w:lang w:eastAsia="fr-FR"/>
           <w14:ligatures w14:val="none"/>
         </w:rPr>
-        <w:t>Day 44: Feature importance</w:t>
+        <w:t xml:space="preserve">Day </w:t>
+      </w:r>
+      <w:proofErr w:type="gramStart"/>
+      <w:r>
+        <w:rPr>
+          <w:rFonts w:ascii="Times New Roman" w:eastAsia="Times New Roman" w:hAnsi="Times New Roman" w:cs="Times New Roman"/>
+          <w:kern w:val="0"/>
+          <w:sz w:val="24"/>
+          <w:szCs w:val="24"/>
+          <w:highlight w:val="yellow"/>
+          <w:lang w:eastAsia="fr-FR"/>
+          <w14:ligatures w14:val="none"/>
+        </w:rPr>
+        <w:t>44:</w:t>
+      </w:r>
+      <w:proofErr w:type="gramEnd"/>
+      <w:r>
+        <w:rPr>
+          <w:rFonts w:ascii="Times New Roman" w:eastAsia="Times New Roman" w:hAnsi="Times New Roman" w:cs="Times New Roman"/>
+          <w:kern w:val="0"/>
+          <w:sz w:val="24"/>
+          <w:szCs w:val="24"/>
+          <w:highlight w:val="yellow"/>
+          <w:lang w:eastAsia="fr-FR"/>
+          <w14:ligatures w14:val="none"/>
+        </w:rPr>
+        <w:t xml:space="preserve"> </w:t>
+      </w:r>
+      <w:proofErr w:type="spellStart"/>
+      <w:r>
+        <w:rPr>
+          <w:rFonts w:ascii="Times New Roman" w:eastAsia="Times New Roman" w:hAnsi="Times New Roman" w:cs="Times New Roman"/>
+          <w:kern w:val="0"/>
+          <w:sz w:val="24"/>
+          <w:szCs w:val="24"/>
+          <w:highlight w:val="yellow"/>
+          <w:lang w:eastAsia="fr-FR"/>
+          <w14:ligatures w14:val="none"/>
+        </w:rPr>
+        <w:t>Feature</w:t>
+      </w:r>
+      <w:proofErr w:type="spellEnd"/>
+      <w:r>
+        <w:rPr>
+          <w:rFonts w:ascii="Times New Roman" w:eastAsia="Times New Roman" w:hAnsi="Times New Roman" w:cs="Times New Roman"/>
+          <w:kern w:val="0"/>
+          <w:sz w:val="24"/>
+          <w:szCs w:val="24"/>
+          <w:highlight w:val="yellow"/>
+          <w:lang w:eastAsia="fr-FR"/>
+          <w14:ligatures w14:val="none"/>
+        </w:rPr>
+        <w:t xml:space="preserve"> importance</w:t>
       </w:r>
     </w:p>
     <w:p>
@@ -3280,20 +4401,90 @@
           <w:lang w:eastAsia="fr-FR"/>
           <w14:ligatures w14:val="none"/>
         </w:rPr>
-        <w:t>Days 46–50: Model Tuning &amp; Validation</w:t>
-      </w:r>
-    </w:p>
-    <w:p>
-      <w:pPr>
-        <w:rPr>
-          <w:lang w:eastAsia="fr-FR"/>
-        </w:rPr>
-      </w:pPr>
-      <w:r>
-        <w:rPr>
-          <w:lang w:eastAsia="fr-FR"/>
-        </w:rPr>
-        <w:t>Model tunning : optimiser les hyperparametres pour améliorer les performances du modele.</w:t>
+        <w:t>Days 46–</w:t>
+      </w:r>
+      <w:proofErr w:type="gramStart"/>
+      <w:r>
+        <w:rPr>
+          <w:rFonts w:ascii="Times New Roman" w:eastAsia="Times New Roman" w:hAnsi="Times New Roman" w:cs="Times New Roman"/>
+          <w:b/>
+          <w:bCs/>
+          <w:kern w:val="0"/>
+          <w:sz w:val="27"/>
+          <w:szCs w:val="27"/>
+          <w:lang w:eastAsia="fr-FR"/>
+          <w14:ligatures w14:val="none"/>
+        </w:rPr>
+        <w:t>50:</w:t>
+      </w:r>
+      <w:proofErr w:type="gramEnd"/>
+      <w:r>
+        <w:rPr>
+          <w:rFonts w:ascii="Times New Roman" w:eastAsia="Times New Roman" w:hAnsi="Times New Roman" w:cs="Times New Roman"/>
+          <w:b/>
+          <w:bCs/>
+          <w:kern w:val="0"/>
+          <w:sz w:val="27"/>
+          <w:szCs w:val="27"/>
+          <w:lang w:eastAsia="fr-FR"/>
+          <w14:ligatures w14:val="none"/>
+        </w:rPr>
+        <w:t xml:space="preserve"> Model Tuning &amp; Validation</w:t>
+      </w:r>
+    </w:p>
+    <w:p>
+      <w:pPr>
+        <w:rPr>
+          <w:lang w:eastAsia="fr-FR"/>
+        </w:rPr>
+      </w:pPr>
+      <w:r>
+        <w:rPr>
+          <w:lang w:eastAsia="fr-FR"/>
+        </w:rPr>
+        <w:t xml:space="preserve">Model </w:t>
+      </w:r>
+      <w:proofErr w:type="spellStart"/>
+      <w:r>
+        <w:rPr>
+          <w:lang w:eastAsia="fr-FR"/>
+        </w:rPr>
+        <w:t>tunning</w:t>
+      </w:r>
+      <w:proofErr w:type="spellEnd"/>
+      <w:r>
+        <w:rPr>
+          <w:lang w:eastAsia="fr-FR"/>
+        </w:rPr>
+        <w:t xml:space="preserve"> : optimiser les </w:t>
+      </w:r>
+      <w:proofErr w:type="spellStart"/>
+      <w:r>
+        <w:rPr>
+          <w:lang w:eastAsia="fr-FR"/>
+        </w:rPr>
+        <w:t>hyperparametres</w:t>
+      </w:r>
+      <w:proofErr w:type="spellEnd"/>
+      <w:r>
+        <w:rPr>
+          <w:lang w:eastAsia="fr-FR"/>
+        </w:rPr>
+        <w:t xml:space="preserve"> pour améliorer les performances du </w:t>
+      </w:r>
+      <w:proofErr w:type="spellStart"/>
+      <w:r>
+        <w:rPr>
+          <w:lang w:eastAsia="fr-FR"/>
+        </w:rPr>
+        <w:t>modele</w:t>
+      </w:r>
+      <w:proofErr w:type="spellEnd"/>
+      <w:r>
+        <w:rPr>
+          <w:lang w:eastAsia="fr-FR"/>
+        </w:rPr>
+        <w:t>.</w:t>
       </w:r>
     </w:p>
     <w:p>
@@ -3452,6 +4643,7 @@
           <w14:ligatures w14:val="none"/>
         </w:rPr>
       </w:pPr>
+      <w:proofErr w:type="spellStart"/>
       <w:r>
         <w:rPr>
           <w:rFonts w:ascii="Times New Roman" w:eastAsia="Times New Roman" w:hAnsi="Times New Roman" w:cs="Times New Roman"/>
@@ -3464,7 +4656,22 @@
           <w:lang w:val="en-US" w:eastAsia="fr-FR"/>
           <w14:ligatures w14:val="none"/>
         </w:rPr>
-        <w:t xml:space="preserve">stratisfied k-fold, </w:t>
+        <w:t>stratisfied</w:t>
+      </w:r>
+      <w:proofErr w:type="spellEnd"/>
+      <w:r>
+        <w:rPr>
+          <w:rFonts w:ascii="Times New Roman" w:eastAsia="Times New Roman" w:hAnsi="Times New Roman" w:cs="Times New Roman"/>
+          <w:b/>
+          <w:bCs/>
+          <w:kern w:val="0"/>
+          <w:sz w:val="24"/>
+          <w:szCs w:val="24"/>
+          <w:highlight w:val="green"/>
+          <w:lang w:val="en-US" w:eastAsia="fr-FR"/>
+          <w14:ligatures w14:val="none"/>
+        </w:rPr>
+        <w:t xml:space="preserve"> k-fold, </w:t>
       </w:r>
     </w:p>
     <w:p>
@@ -3678,8 +4885,74 @@
           <w:lang w:eastAsia="fr-FR"/>
           <w14:ligatures w14:val="none"/>
         </w:rPr>
-        <w:t>Day 47: Grid Search, RandomizedSearch</w:t>
-      </w:r>
+        <w:t xml:space="preserve">Day </w:t>
+      </w:r>
+      <w:proofErr w:type="gramStart"/>
+      <w:r>
+        <w:rPr>
+          <w:rFonts w:ascii="Times New Roman" w:eastAsia="Times New Roman" w:hAnsi="Times New Roman" w:cs="Times New Roman"/>
+          <w:kern w:val="0"/>
+          <w:sz w:val="24"/>
+          <w:szCs w:val="24"/>
+          <w:highlight w:val="yellow"/>
+          <w:lang w:eastAsia="fr-FR"/>
+          <w14:ligatures w14:val="none"/>
+        </w:rPr>
+        <w:t>47:</w:t>
+      </w:r>
+      <w:proofErr w:type="gramEnd"/>
+      <w:r>
+        <w:rPr>
+          <w:rFonts w:ascii="Times New Roman" w:eastAsia="Times New Roman" w:hAnsi="Times New Roman" w:cs="Times New Roman"/>
+          <w:kern w:val="0"/>
+          <w:sz w:val="24"/>
+          <w:szCs w:val="24"/>
+          <w:highlight w:val="yellow"/>
+          <w:lang w:eastAsia="fr-FR"/>
+          <w14:ligatures w14:val="none"/>
+        </w:rPr>
+        <w:t xml:space="preserve"> </w:t>
+      </w:r>
+      <w:proofErr w:type="spellStart"/>
+      <w:r>
+        <w:rPr>
+          <w:rFonts w:ascii="Times New Roman" w:eastAsia="Times New Roman" w:hAnsi="Times New Roman" w:cs="Times New Roman"/>
+          <w:kern w:val="0"/>
+          <w:sz w:val="24"/>
+          <w:szCs w:val="24"/>
+          <w:highlight w:val="yellow"/>
+          <w:lang w:eastAsia="fr-FR"/>
+          <w14:ligatures w14:val="none"/>
+        </w:rPr>
+        <w:t>Grid</w:t>
+      </w:r>
+      <w:proofErr w:type="spellEnd"/>
+      <w:r>
+        <w:rPr>
+          <w:rFonts w:ascii="Times New Roman" w:eastAsia="Times New Roman" w:hAnsi="Times New Roman" w:cs="Times New Roman"/>
+          <w:kern w:val="0"/>
+          <w:sz w:val="24"/>
+          <w:szCs w:val="24"/>
+          <w:highlight w:val="yellow"/>
+          <w:lang w:eastAsia="fr-FR"/>
+          <w14:ligatures w14:val="none"/>
+        </w:rPr>
+        <w:t xml:space="preserve"> Search, </w:t>
+      </w:r>
+      <w:proofErr w:type="spellStart"/>
+      <w:r>
+        <w:rPr>
+          <w:rFonts w:ascii="Times New Roman" w:eastAsia="Times New Roman" w:hAnsi="Times New Roman" w:cs="Times New Roman"/>
+          <w:kern w:val="0"/>
+          <w:sz w:val="24"/>
+          <w:szCs w:val="24"/>
+          <w:highlight w:val="yellow"/>
+          <w:lang w:eastAsia="fr-FR"/>
+          <w14:ligatures w14:val="none"/>
+        </w:rPr>
+        <w:t>RandomizedSearch</w:t>
+      </w:r>
+      <w:proofErr w:type="spellEnd"/>
     </w:p>
     <w:p>
       <w:pPr>
@@ -3722,6 +4995,7 @@
         </w:rPr>
         <w:t xml:space="preserve">, </w:t>
       </w:r>
+      <w:proofErr w:type="spellStart"/>
       <w:r>
         <w:rPr>
           <w:rFonts w:ascii="Times New Roman" w:eastAsia="Times New Roman" w:hAnsi="Times New Roman" w:cs="Times New Roman"/>
@@ -3734,6 +5008,7 @@
         </w:rPr>
         <w:t>SelectFromModel</w:t>
       </w:r>
+      <w:proofErr w:type="spellEnd"/>
     </w:p>
     <w:p>
       <w:pPr>
@@ -3860,7 +5135,35 @@
           <w:lang w:val="en-US" w:eastAsia="fr-FR"/>
           <w14:ligatures w14:val="none"/>
         </w:rPr>
-        <w:t xml:space="preserve"> Phase 3: Intermediate Topics (Days 51–80)</w:t>
+        <w:t xml:space="preserve"> Phase </w:t>
+      </w:r>
+      <w:proofErr w:type="gramStart"/>
+      <w:r>
+        <w:rPr>
+          <w:rFonts w:ascii="Times New Roman" w:eastAsia="Times New Roman" w:hAnsi="Times New Roman" w:cs="Times New Roman"/>
+          <w:b/>
+          <w:bCs/>
+          <w:kern w:val="0"/>
+          <w:sz w:val="36"/>
+          <w:szCs w:val="36"/>
+          <w:lang w:val="en-US" w:eastAsia="fr-FR"/>
+          <w14:ligatures w14:val="none"/>
+        </w:rPr>
+        <w:t>3:</w:t>
+      </w:r>
+      <w:proofErr w:type="gramEnd"/>
+      <w:r>
+        <w:rPr>
+          <w:rFonts w:ascii="Times New Roman" w:eastAsia="Times New Roman" w:hAnsi="Times New Roman" w:cs="Times New Roman"/>
+          <w:b/>
+          <w:bCs/>
+          <w:kern w:val="0"/>
+          <w:sz w:val="36"/>
+          <w:szCs w:val="36"/>
+          <w:lang w:val="en-US" w:eastAsia="fr-FR"/>
+          <w14:ligatures w14:val="none"/>
+        </w:rPr>
+        <w:t xml:space="preserve"> Intermediate Topics (Days 51–80)</w:t>
       </w:r>
     </w:p>
     <w:p>
@@ -3889,7 +5192,63 @@
           <w:lang w:eastAsia="fr-FR"/>
           <w14:ligatures w14:val="none"/>
         </w:rPr>
-        <w:t>Days 51–55: Unsupervised Learning</w:t>
+        <w:t>Days 51–</w:t>
+      </w:r>
+      <w:proofErr w:type="gramStart"/>
+      <w:r>
+        <w:rPr>
+          <w:rFonts w:ascii="Times New Roman" w:eastAsia="Times New Roman" w:hAnsi="Times New Roman" w:cs="Times New Roman"/>
+          <w:b/>
+          <w:bCs/>
+          <w:kern w:val="0"/>
+          <w:sz w:val="27"/>
+          <w:szCs w:val="27"/>
+          <w:lang w:eastAsia="fr-FR"/>
+          <w14:ligatures w14:val="none"/>
+        </w:rPr>
+        <w:t>55:</w:t>
+      </w:r>
+      <w:proofErr w:type="gramEnd"/>
+      <w:r>
+        <w:rPr>
+          <w:rFonts w:ascii="Times New Roman" w:eastAsia="Times New Roman" w:hAnsi="Times New Roman" w:cs="Times New Roman"/>
+          <w:b/>
+          <w:bCs/>
+          <w:kern w:val="0"/>
+          <w:sz w:val="27"/>
+          <w:szCs w:val="27"/>
+          <w:lang w:eastAsia="fr-FR"/>
+          <w14:ligatures w14:val="none"/>
+        </w:rPr>
+        <w:t xml:space="preserve"> </w:t>
+      </w:r>
+      <w:proofErr w:type="spellStart"/>
+      <w:r>
+        <w:rPr>
+          <w:rFonts w:ascii="Times New Roman" w:eastAsia="Times New Roman" w:hAnsi="Times New Roman" w:cs="Times New Roman"/>
+          <w:b/>
+          <w:bCs/>
+          <w:kern w:val="0"/>
+          <w:sz w:val="27"/>
+          <w:szCs w:val="27"/>
+          <w:lang w:eastAsia="fr-FR"/>
+          <w14:ligatures w14:val="none"/>
+        </w:rPr>
+        <w:t>Unsupervised</w:t>
+      </w:r>
+      <w:proofErr w:type="spellEnd"/>
+      <w:r>
+        <w:rPr>
+          <w:rFonts w:ascii="Times New Roman" w:eastAsia="Times New Roman" w:hAnsi="Times New Roman" w:cs="Times New Roman"/>
+          <w:b/>
+          <w:bCs/>
+          <w:kern w:val="0"/>
+          <w:sz w:val="27"/>
+          <w:szCs w:val="27"/>
+          <w:lang w:eastAsia="fr-FR"/>
+          <w14:ligatures w14:val="none"/>
+        </w:rPr>
+        <w:t xml:space="preserve"> Learning</w:t>
       </w:r>
     </w:p>
     <w:p>
@@ -3945,8 +5304,69 @@
           <w:lang w:eastAsia="fr-FR"/>
           <w14:ligatures w14:val="none"/>
         </w:rPr>
-        <w:t>Day 52: K-means implementation</w:t>
-      </w:r>
+        <w:t xml:space="preserve">Day </w:t>
+      </w:r>
+      <w:proofErr w:type="gramStart"/>
+      <w:r>
+        <w:rPr>
+          <w:rFonts w:ascii="Times New Roman" w:eastAsia="Times New Roman" w:hAnsi="Times New Roman" w:cs="Times New Roman"/>
+          <w:kern w:val="0"/>
+          <w:sz w:val="24"/>
+          <w:szCs w:val="24"/>
+          <w:lang w:eastAsia="fr-FR"/>
+          <w14:ligatures w14:val="none"/>
+        </w:rPr>
+        <w:t>52:</w:t>
+      </w:r>
+      <w:proofErr w:type="gramEnd"/>
+      <w:r>
+        <w:rPr>
+          <w:rFonts w:ascii="Times New Roman" w:eastAsia="Times New Roman" w:hAnsi="Times New Roman" w:cs="Times New Roman"/>
+          <w:kern w:val="0"/>
+          <w:sz w:val="24"/>
+          <w:szCs w:val="24"/>
+          <w:lang w:eastAsia="fr-FR"/>
+          <w14:ligatures w14:val="none"/>
+        </w:rPr>
+        <w:t xml:space="preserve"> K-</w:t>
+      </w:r>
+      <w:proofErr w:type="spellStart"/>
+      <w:r>
+        <w:rPr>
+          <w:rFonts w:ascii="Times New Roman" w:eastAsia="Times New Roman" w:hAnsi="Times New Roman" w:cs="Times New Roman"/>
+          <w:kern w:val="0"/>
+          <w:sz w:val="24"/>
+          <w:szCs w:val="24"/>
+          <w:lang w:eastAsia="fr-FR"/>
+          <w14:ligatures w14:val="none"/>
+        </w:rPr>
+        <w:t>means</w:t>
+      </w:r>
+      <w:proofErr w:type="spellEnd"/>
+      <w:r>
+        <w:rPr>
+          <w:rFonts w:ascii="Times New Roman" w:eastAsia="Times New Roman" w:hAnsi="Times New Roman" w:cs="Times New Roman"/>
+          <w:kern w:val="0"/>
+          <w:sz w:val="24"/>
+          <w:szCs w:val="24"/>
+          <w:lang w:eastAsia="fr-FR"/>
+          <w14:ligatures w14:val="none"/>
+        </w:rPr>
+        <w:t xml:space="preserve"> </w:t>
+      </w:r>
+      <w:proofErr w:type="spellStart"/>
+      <w:r>
+        <w:rPr>
+          <w:rFonts w:ascii="Times New Roman" w:eastAsia="Times New Roman" w:hAnsi="Times New Roman" w:cs="Times New Roman"/>
+          <w:kern w:val="0"/>
+          <w:sz w:val="24"/>
+          <w:szCs w:val="24"/>
+          <w:lang w:eastAsia="fr-FR"/>
+          <w14:ligatures w14:val="none"/>
+        </w:rPr>
+        <w:t>implementation</w:t>
+      </w:r>
+      <w:proofErr w:type="spellEnd"/>
     </w:p>
     <w:p>
       <w:pPr>
@@ -3973,7 +5393,55 @@
           <w:lang w:eastAsia="fr-FR"/>
           <w14:ligatures w14:val="none"/>
         </w:rPr>
-        <w:t>Day 53: DBSCAN and hierarchical clustering</w:t>
+        <w:t xml:space="preserve">Day </w:t>
+      </w:r>
+      <w:proofErr w:type="gramStart"/>
+      <w:r>
+        <w:rPr>
+          <w:rFonts w:ascii="Times New Roman" w:eastAsia="Times New Roman" w:hAnsi="Times New Roman" w:cs="Times New Roman"/>
+          <w:kern w:val="0"/>
+          <w:sz w:val="24"/>
+          <w:szCs w:val="24"/>
+          <w:lang w:eastAsia="fr-FR"/>
+          <w14:ligatures w14:val="none"/>
+        </w:rPr>
+        <w:t>53:</w:t>
+      </w:r>
+      <w:proofErr w:type="gramEnd"/>
+      <w:r>
+        <w:rPr>
+          <w:rFonts w:ascii="Times New Roman" w:eastAsia="Times New Roman" w:hAnsi="Times New Roman" w:cs="Times New Roman"/>
+          <w:kern w:val="0"/>
+          <w:sz w:val="24"/>
+          <w:szCs w:val="24"/>
+          <w:lang w:eastAsia="fr-FR"/>
+          <w14:ligatures w14:val="none"/>
+        </w:rPr>
+        <w:t xml:space="preserve"> DBSCAN and </w:t>
+      </w:r>
+      <w:proofErr w:type="spellStart"/>
+      <w:r>
+        <w:rPr>
+          <w:rFonts w:ascii="Times New Roman" w:eastAsia="Times New Roman" w:hAnsi="Times New Roman" w:cs="Times New Roman"/>
+          <w:kern w:val="0"/>
+          <w:sz w:val="24"/>
+          <w:szCs w:val="24"/>
+          <w:lang w:eastAsia="fr-FR"/>
+          <w14:ligatures w14:val="none"/>
+        </w:rPr>
+        <w:t>hierarchical</w:t>
+      </w:r>
+      <w:proofErr w:type="spellEnd"/>
+      <w:r>
+        <w:rPr>
+          <w:rFonts w:ascii="Times New Roman" w:eastAsia="Times New Roman" w:hAnsi="Times New Roman" w:cs="Times New Roman"/>
+          <w:kern w:val="0"/>
+          <w:sz w:val="24"/>
+          <w:szCs w:val="24"/>
+          <w:lang w:eastAsia="fr-FR"/>
+          <w14:ligatures w14:val="none"/>
+        </w:rPr>
+        <w:t xml:space="preserve"> clustering</w:t>
       </w:r>
     </w:p>
     <w:p>
@@ -4001,7 +5469,79 @@
           <w:lang w:eastAsia="fr-FR"/>
           <w14:ligatures w14:val="none"/>
         </w:rPr>
-        <w:t>Day 54: Dimensionality reduction (PCA)</w:t>
+        <w:t xml:space="preserve">Day </w:t>
+      </w:r>
+      <w:proofErr w:type="gramStart"/>
+      <w:r>
+        <w:rPr>
+          <w:rFonts w:ascii="Times New Roman" w:eastAsia="Times New Roman" w:hAnsi="Times New Roman" w:cs="Times New Roman"/>
+          <w:kern w:val="0"/>
+          <w:sz w:val="24"/>
+          <w:szCs w:val="24"/>
+          <w:lang w:eastAsia="fr-FR"/>
+          <w14:ligatures w14:val="none"/>
+        </w:rPr>
+        <w:t>54:</w:t>
+      </w:r>
+      <w:proofErr w:type="gramEnd"/>
+      <w:r>
+        <w:rPr>
+          <w:rFonts w:ascii="Times New Roman" w:eastAsia="Times New Roman" w:hAnsi="Times New Roman" w:cs="Times New Roman"/>
+          <w:kern w:val="0"/>
+          <w:sz w:val="24"/>
+          <w:szCs w:val="24"/>
+          <w:lang w:eastAsia="fr-FR"/>
+          <w14:ligatures w14:val="none"/>
+        </w:rPr>
+        <w:t xml:space="preserve"> </w:t>
+      </w:r>
+      <w:proofErr w:type="spellStart"/>
+      <w:r>
+        <w:rPr>
+          <w:rFonts w:ascii="Times New Roman" w:eastAsia="Times New Roman" w:hAnsi="Times New Roman" w:cs="Times New Roman"/>
+          <w:kern w:val="0"/>
+          <w:sz w:val="24"/>
+          <w:szCs w:val="24"/>
+          <w:lang w:eastAsia="fr-FR"/>
+          <w14:ligatures w14:val="none"/>
+        </w:rPr>
+        <w:t>Dimensionality</w:t>
+      </w:r>
+      <w:proofErr w:type="spellEnd"/>
+      <w:r>
+        <w:rPr>
+          <w:rFonts w:ascii="Times New Roman" w:eastAsia="Times New Roman" w:hAnsi="Times New Roman" w:cs="Times New Roman"/>
+          <w:kern w:val="0"/>
+          <w:sz w:val="24"/>
+          <w:szCs w:val="24"/>
+          <w:lang w:eastAsia="fr-FR"/>
+          <w14:ligatures w14:val="none"/>
+        </w:rPr>
+        <w:t xml:space="preserve"> </w:t>
+      </w:r>
+      <w:proofErr w:type="spellStart"/>
+      <w:r>
+        <w:rPr>
+          <w:rFonts w:ascii="Times New Roman" w:eastAsia="Times New Roman" w:hAnsi="Times New Roman" w:cs="Times New Roman"/>
+          <w:kern w:val="0"/>
+          <w:sz w:val="24"/>
+          <w:szCs w:val="24"/>
+          <w:lang w:eastAsia="fr-FR"/>
+          <w14:ligatures w14:val="none"/>
+        </w:rPr>
+        <w:t>reduction</w:t>
+      </w:r>
+      <w:proofErr w:type="spellEnd"/>
+      <w:r>
+        <w:rPr>
+          <w:rFonts w:ascii="Times New Roman" w:eastAsia="Times New Roman" w:hAnsi="Times New Roman" w:cs="Times New Roman"/>
+          <w:kern w:val="0"/>
+          <w:sz w:val="24"/>
+          <w:szCs w:val="24"/>
+          <w:lang w:eastAsia="fr-FR"/>
+          <w14:ligatures w14:val="none"/>
+        </w:rPr>
+        <w:t xml:space="preserve"> (PCA)</w:t>
       </w:r>
     </w:p>
     <w:p>
@@ -4080,7 +5620,63 @@
           <w:lang w:eastAsia="fr-FR"/>
           <w14:ligatures w14:val="none"/>
         </w:rPr>
-        <w:t>Days 56–60: Feature Engineering</w:t>
+        <w:t>Days 56–</w:t>
+      </w:r>
+      <w:proofErr w:type="gramStart"/>
+      <w:r>
+        <w:rPr>
+          <w:rFonts w:ascii="Times New Roman" w:eastAsia="Times New Roman" w:hAnsi="Times New Roman" w:cs="Times New Roman"/>
+          <w:b/>
+          <w:bCs/>
+          <w:kern w:val="0"/>
+          <w:sz w:val="27"/>
+          <w:szCs w:val="27"/>
+          <w:lang w:eastAsia="fr-FR"/>
+          <w14:ligatures w14:val="none"/>
+        </w:rPr>
+        <w:t>60:</w:t>
+      </w:r>
+      <w:proofErr w:type="gramEnd"/>
+      <w:r>
+        <w:rPr>
+          <w:rFonts w:ascii="Times New Roman" w:eastAsia="Times New Roman" w:hAnsi="Times New Roman" w:cs="Times New Roman"/>
+          <w:b/>
+          <w:bCs/>
+          <w:kern w:val="0"/>
+          <w:sz w:val="27"/>
+          <w:szCs w:val="27"/>
+          <w:lang w:eastAsia="fr-FR"/>
+          <w14:ligatures w14:val="none"/>
+        </w:rPr>
+        <w:t xml:space="preserve"> </w:t>
+      </w:r>
+      <w:proofErr w:type="spellStart"/>
+      <w:r>
+        <w:rPr>
+          <w:rFonts w:ascii="Times New Roman" w:eastAsia="Times New Roman" w:hAnsi="Times New Roman" w:cs="Times New Roman"/>
+          <w:b/>
+          <w:bCs/>
+          <w:kern w:val="0"/>
+          <w:sz w:val="27"/>
+          <w:szCs w:val="27"/>
+          <w:lang w:eastAsia="fr-FR"/>
+          <w14:ligatures w14:val="none"/>
+        </w:rPr>
+        <w:t>Feature</w:t>
+      </w:r>
+      <w:proofErr w:type="spellEnd"/>
+      <w:r>
+        <w:rPr>
+          <w:rFonts w:ascii="Times New Roman" w:eastAsia="Times New Roman" w:hAnsi="Times New Roman" w:cs="Times New Roman"/>
+          <w:b/>
+          <w:bCs/>
+          <w:kern w:val="0"/>
+          <w:sz w:val="27"/>
+          <w:szCs w:val="27"/>
+          <w:lang w:eastAsia="fr-FR"/>
+          <w14:ligatures w14:val="none"/>
+        </w:rPr>
+        <w:t xml:space="preserve"> Engineering</w:t>
       </w:r>
     </w:p>
     <w:p>
@@ -4170,8 +5766,48 @@
           <w:lang w:eastAsia="fr-FR"/>
           <w14:ligatures w14:val="none"/>
         </w:rPr>
-        <w:t>Day 58: Binning, interaction terms</w:t>
-      </w:r>
+        <w:t xml:space="preserve">Day </w:t>
+      </w:r>
+      <w:proofErr w:type="gramStart"/>
+      <w:r>
+        <w:rPr>
+          <w:rFonts w:ascii="Times New Roman" w:eastAsia="Times New Roman" w:hAnsi="Times New Roman" w:cs="Times New Roman"/>
+          <w:kern w:val="0"/>
+          <w:sz w:val="24"/>
+          <w:szCs w:val="24"/>
+          <w:highlight w:val="yellow"/>
+          <w:lang w:eastAsia="fr-FR"/>
+          <w14:ligatures w14:val="none"/>
+        </w:rPr>
+        <w:t>58:</w:t>
+      </w:r>
+      <w:proofErr w:type="gramEnd"/>
+      <w:r>
+        <w:rPr>
+          <w:rFonts w:ascii="Times New Roman" w:eastAsia="Times New Roman" w:hAnsi="Times New Roman" w:cs="Times New Roman"/>
+          <w:kern w:val="0"/>
+          <w:sz w:val="24"/>
+          <w:szCs w:val="24"/>
+          <w:highlight w:val="yellow"/>
+          <w:lang w:eastAsia="fr-FR"/>
+          <w14:ligatures w14:val="none"/>
+        </w:rPr>
+        <w:t xml:space="preserve"> Binning, interaction </w:t>
+      </w:r>
+      <w:proofErr w:type="spellStart"/>
+      <w:r>
+        <w:rPr>
+          <w:rFonts w:ascii="Times New Roman" w:eastAsia="Times New Roman" w:hAnsi="Times New Roman" w:cs="Times New Roman"/>
+          <w:kern w:val="0"/>
+          <w:sz w:val="24"/>
+          <w:szCs w:val="24"/>
+          <w:highlight w:val="yellow"/>
+          <w:lang w:eastAsia="fr-FR"/>
+          <w14:ligatures w14:val="none"/>
+        </w:rPr>
+        <w:t>terms</w:t>
+      </w:r>
+      <w:proofErr w:type="spellEnd"/>
       <w:r>
         <w:rPr>
           <w:rFonts w:ascii="Times New Roman" w:eastAsia="Times New Roman" w:hAnsi="Times New Roman" w:cs="Times New Roman"/>
@@ -4223,7 +5859,99 @@
           <w:lang w:eastAsia="fr-FR"/>
           <w14:ligatures w14:val="none"/>
         </w:rPr>
-        <w:t>c’est render une variable continue en catégorie par exemple age : « jeune » = [0,20] « adult »= [21,40] « senior » = [41+]</w:t>
+        <w:t xml:space="preserve">c’est </w:t>
+      </w:r>
+      <w:proofErr w:type="spellStart"/>
+      <w:r>
+        <w:rPr>
+          <w:rFonts w:ascii="Times New Roman" w:eastAsia="Times New Roman" w:hAnsi="Times New Roman" w:cs="Times New Roman"/>
+          <w:kern w:val="0"/>
+          <w:sz w:val="24"/>
+          <w:szCs w:val="24"/>
+          <w:highlight w:val="yellow"/>
+          <w:lang w:eastAsia="fr-FR"/>
+          <w14:ligatures w14:val="none"/>
+        </w:rPr>
+        <w:t>render</w:t>
+      </w:r>
+      <w:proofErr w:type="spellEnd"/>
+      <w:r>
+        <w:rPr>
+          <w:rFonts w:ascii="Times New Roman" w:eastAsia="Times New Roman" w:hAnsi="Times New Roman" w:cs="Times New Roman"/>
+          <w:kern w:val="0"/>
+          <w:sz w:val="24"/>
+          <w:szCs w:val="24"/>
+          <w:highlight w:val="yellow"/>
+          <w:lang w:eastAsia="fr-FR"/>
+          <w14:ligatures w14:val="none"/>
+        </w:rPr>
+        <w:t xml:space="preserve"> une variable continue en catégorie par exemple </w:t>
+      </w:r>
+      <w:proofErr w:type="spellStart"/>
+      <w:r>
+        <w:rPr>
+          <w:rFonts w:ascii="Times New Roman" w:eastAsia="Times New Roman" w:hAnsi="Times New Roman" w:cs="Times New Roman"/>
+          <w:kern w:val="0"/>
+          <w:sz w:val="24"/>
+          <w:szCs w:val="24"/>
+          <w:highlight w:val="yellow"/>
+          <w:lang w:eastAsia="fr-FR"/>
+          <w14:ligatures w14:val="none"/>
+        </w:rPr>
+        <w:t>age</w:t>
+      </w:r>
+      <w:proofErr w:type="spellEnd"/>
+      <w:r>
+        <w:rPr>
+          <w:rFonts w:ascii="Times New Roman" w:eastAsia="Times New Roman" w:hAnsi="Times New Roman" w:cs="Times New Roman"/>
+          <w:kern w:val="0"/>
+          <w:sz w:val="24"/>
+          <w:szCs w:val="24"/>
+          <w:highlight w:val="yellow"/>
+          <w:lang w:eastAsia="fr-FR"/>
+          <w14:ligatures w14:val="none"/>
+        </w:rPr>
+        <w:t> : « jeune » = [0,20] « </w:t>
+      </w:r>
+      <w:proofErr w:type="spellStart"/>
+      <w:r>
+        <w:rPr>
+          <w:rFonts w:ascii="Times New Roman" w:eastAsia="Times New Roman" w:hAnsi="Times New Roman" w:cs="Times New Roman"/>
+          <w:kern w:val="0"/>
+          <w:sz w:val="24"/>
+          <w:szCs w:val="24"/>
+          <w:highlight w:val="yellow"/>
+          <w:lang w:eastAsia="fr-FR"/>
+          <w14:ligatures w14:val="none"/>
+        </w:rPr>
+        <w:t>adult</w:t>
+      </w:r>
+      <w:proofErr w:type="spellEnd"/>
+      <w:proofErr w:type="gramStart"/>
+      <w:r>
+        <w:rPr>
+          <w:rFonts w:ascii="Times New Roman" w:eastAsia="Times New Roman" w:hAnsi="Times New Roman" w:cs="Times New Roman"/>
+          <w:kern w:val="0"/>
+          <w:sz w:val="24"/>
+          <w:szCs w:val="24"/>
+          <w:highlight w:val="yellow"/>
+          <w:lang w:eastAsia="fr-FR"/>
+          <w14:ligatures w14:val="none"/>
+        </w:rPr>
+        <w:t> »=</w:t>
+      </w:r>
+      <w:proofErr w:type="gramEnd"/>
+      <w:r>
+        <w:rPr>
+          <w:rFonts w:ascii="Times New Roman" w:eastAsia="Times New Roman" w:hAnsi="Times New Roman" w:cs="Times New Roman"/>
+          <w:kern w:val="0"/>
+          <w:sz w:val="24"/>
+          <w:szCs w:val="24"/>
+          <w:highlight w:val="yellow"/>
+          <w:lang w:eastAsia="fr-FR"/>
+          <w14:ligatures w14:val="none"/>
+        </w:rPr>
+        <w:t xml:space="preserve"> [21,40] « senior » = [41+]</w:t>
       </w:r>
     </w:p>
     <w:p>
@@ -4252,19 +5980,75 @@
           <w:lang w:eastAsia="fr-FR"/>
           <w14:ligatures w14:val="none"/>
         </w:rPr>
-        <w:t xml:space="preserve">Interaction terms </w:t>
-      </w:r>
-      <w:r>
-        <w:rPr>
-          <w:rFonts w:ascii="Times New Roman" w:eastAsia="Times New Roman" w:hAnsi="Times New Roman" w:cs="Times New Roman"/>
-          <w:kern w:val="0"/>
-          <w:sz w:val="24"/>
-          <w:szCs w:val="24"/>
-          <w:highlight w:val="yellow"/>
-          <w:lang w:eastAsia="fr-FR"/>
-          <w14:ligatures w14:val="none"/>
-        </w:rPr>
-        <w:t xml:space="preserve">c’est créer de nouvelles features par exemple </w:t>
+        <w:t xml:space="preserve">Interaction </w:t>
+      </w:r>
+      <w:proofErr w:type="spellStart"/>
+      <w:r>
+        <w:rPr>
+          <w:rFonts w:ascii="Times New Roman" w:eastAsia="Times New Roman" w:hAnsi="Times New Roman" w:cs="Times New Roman"/>
+          <w:b/>
+          <w:bCs/>
+          <w:kern w:val="0"/>
+          <w:sz w:val="24"/>
+          <w:szCs w:val="24"/>
+          <w:highlight w:val="yellow"/>
+          <w:lang w:eastAsia="fr-FR"/>
+          <w14:ligatures w14:val="none"/>
+        </w:rPr>
+        <w:t>terms</w:t>
+      </w:r>
+      <w:proofErr w:type="spellEnd"/>
+      <w:r>
+        <w:rPr>
+          <w:rFonts w:ascii="Times New Roman" w:eastAsia="Times New Roman" w:hAnsi="Times New Roman" w:cs="Times New Roman"/>
+          <w:b/>
+          <w:bCs/>
+          <w:kern w:val="0"/>
+          <w:sz w:val="24"/>
+          <w:szCs w:val="24"/>
+          <w:highlight w:val="yellow"/>
+          <w:lang w:eastAsia="fr-FR"/>
+          <w14:ligatures w14:val="none"/>
+        </w:rPr>
+        <w:t xml:space="preserve"> </w:t>
+      </w:r>
+      <w:r>
+        <w:rPr>
+          <w:rFonts w:ascii="Times New Roman" w:eastAsia="Times New Roman" w:hAnsi="Times New Roman" w:cs="Times New Roman"/>
+          <w:kern w:val="0"/>
+          <w:sz w:val="24"/>
+          <w:szCs w:val="24"/>
+          <w:highlight w:val="yellow"/>
+          <w:lang w:eastAsia="fr-FR"/>
+          <w14:ligatures w14:val="none"/>
+        </w:rPr>
+        <w:t xml:space="preserve">c’est créer de nouvelles </w:t>
+      </w:r>
+      <w:proofErr w:type="spellStart"/>
+      <w:r>
+        <w:rPr>
+          <w:rFonts w:ascii="Times New Roman" w:eastAsia="Times New Roman" w:hAnsi="Times New Roman" w:cs="Times New Roman"/>
+          <w:kern w:val="0"/>
+          <w:sz w:val="24"/>
+          <w:szCs w:val="24"/>
+          <w:highlight w:val="yellow"/>
+          <w:lang w:eastAsia="fr-FR"/>
+          <w14:ligatures w14:val="none"/>
+        </w:rPr>
+        <w:t>features</w:t>
+      </w:r>
+      <w:proofErr w:type="spellEnd"/>
+      <w:r>
+        <w:rPr>
+          <w:rFonts w:ascii="Times New Roman" w:eastAsia="Times New Roman" w:hAnsi="Times New Roman" w:cs="Times New Roman"/>
+          <w:kern w:val="0"/>
+          <w:sz w:val="24"/>
+          <w:szCs w:val="24"/>
+          <w:highlight w:val="yellow"/>
+          <w:lang w:eastAsia="fr-FR"/>
+          <w14:ligatures w14:val="none"/>
+        </w:rPr>
+        <w:t xml:space="preserve"> par exemple </w:t>
       </w:r>
     </w:p>
     <w:p>
@@ -4280,17 +6064,45 @@
           <w14:ligatures w14:val="none"/>
         </w:rPr>
       </w:pPr>
-      <w:r>
-        <w:rPr>
-          <w:rFonts w:ascii="Times New Roman" w:eastAsia="Times New Roman" w:hAnsi="Times New Roman" w:cs="Times New Roman"/>
-          <w:kern w:val="0"/>
-          <w:sz w:val="24"/>
-          <w:szCs w:val="24"/>
-          <w:highlight w:val="yellow"/>
-          <w:lang w:eastAsia="fr-FR"/>
-          <w14:ligatures w14:val="none"/>
-        </w:rPr>
-        <w:t>feature_new = feature1 * feature2</w:t>
+      <w:proofErr w:type="spellStart"/>
+      <w:proofErr w:type="gramStart"/>
+      <w:r>
+        <w:rPr>
+          <w:rFonts w:ascii="Times New Roman" w:eastAsia="Times New Roman" w:hAnsi="Times New Roman" w:cs="Times New Roman"/>
+          <w:kern w:val="0"/>
+          <w:sz w:val="24"/>
+          <w:szCs w:val="24"/>
+          <w:highlight w:val="yellow"/>
+          <w:lang w:eastAsia="fr-FR"/>
+          <w14:ligatures w14:val="none"/>
+        </w:rPr>
+        <w:t>feature</w:t>
+      </w:r>
+      <w:proofErr w:type="gramEnd"/>
+      <w:r>
+        <w:rPr>
+          <w:rFonts w:ascii="Times New Roman" w:eastAsia="Times New Roman" w:hAnsi="Times New Roman" w:cs="Times New Roman"/>
+          <w:kern w:val="0"/>
+          <w:sz w:val="24"/>
+          <w:szCs w:val="24"/>
+          <w:highlight w:val="yellow"/>
+          <w:lang w:eastAsia="fr-FR"/>
+          <w14:ligatures w14:val="none"/>
+        </w:rPr>
+        <w:t>_new</w:t>
+      </w:r>
+      <w:proofErr w:type="spellEnd"/>
+      <w:r>
+        <w:rPr>
+          <w:rFonts w:ascii="Times New Roman" w:eastAsia="Times New Roman" w:hAnsi="Times New Roman" w:cs="Times New Roman"/>
+          <w:kern w:val="0"/>
+          <w:sz w:val="24"/>
+          <w:szCs w:val="24"/>
+          <w:highlight w:val="yellow"/>
+          <w:lang w:eastAsia="fr-FR"/>
+          <w14:ligatures w14:val="none"/>
+        </w:rPr>
+        <w:t xml:space="preserve"> = feature1 * feature2</w:t>
       </w:r>
     </w:p>
     <w:p>
@@ -4320,7 +6132,85 @@
           <w:lang w:eastAsia="fr-FR"/>
           <w14:ligatures w14:val="none"/>
         </w:rPr>
-        <w:t>Day 59: Feature selection techniques</w:t>
+        <w:t xml:space="preserve">Day </w:t>
+      </w:r>
+      <w:proofErr w:type="gramStart"/>
+      <w:r>
+        <w:rPr>
+          <w:rFonts w:ascii="Times New Roman" w:eastAsia="Times New Roman" w:hAnsi="Times New Roman" w:cs="Times New Roman"/>
+          <w:kern w:val="0"/>
+          <w:sz w:val="24"/>
+          <w:szCs w:val="24"/>
+          <w:highlight w:val="yellow"/>
+          <w:lang w:eastAsia="fr-FR"/>
+          <w14:ligatures w14:val="none"/>
+        </w:rPr>
+        <w:t>59:</w:t>
+      </w:r>
+      <w:proofErr w:type="gramEnd"/>
+      <w:r>
+        <w:rPr>
+          <w:rFonts w:ascii="Times New Roman" w:eastAsia="Times New Roman" w:hAnsi="Times New Roman" w:cs="Times New Roman"/>
+          <w:kern w:val="0"/>
+          <w:sz w:val="24"/>
+          <w:szCs w:val="24"/>
+          <w:highlight w:val="yellow"/>
+          <w:lang w:eastAsia="fr-FR"/>
+          <w14:ligatures w14:val="none"/>
+        </w:rPr>
+        <w:t xml:space="preserve"> </w:t>
+      </w:r>
+      <w:proofErr w:type="spellStart"/>
+      <w:r>
+        <w:rPr>
+          <w:rFonts w:ascii="Times New Roman" w:eastAsia="Times New Roman" w:hAnsi="Times New Roman" w:cs="Times New Roman"/>
+          <w:kern w:val="0"/>
+          <w:sz w:val="24"/>
+          <w:szCs w:val="24"/>
+          <w:highlight w:val="yellow"/>
+          <w:lang w:eastAsia="fr-FR"/>
+          <w14:ligatures w14:val="none"/>
+        </w:rPr>
+        <w:t>Feature</w:t>
+      </w:r>
+      <w:proofErr w:type="spellEnd"/>
+      <w:r>
+        <w:rPr>
+          <w:rFonts w:ascii="Times New Roman" w:eastAsia="Times New Roman" w:hAnsi="Times New Roman" w:cs="Times New Roman"/>
+          <w:kern w:val="0"/>
+          <w:sz w:val="24"/>
+          <w:szCs w:val="24"/>
+          <w:highlight w:val="yellow"/>
+          <w:lang w:eastAsia="fr-FR"/>
+          <w14:ligatures w14:val="none"/>
+        </w:rPr>
+        <w:t xml:space="preserve"> </w:t>
+      </w:r>
+      <w:proofErr w:type="spellStart"/>
+      <w:r>
+        <w:rPr>
+          <w:rFonts w:ascii="Times New Roman" w:eastAsia="Times New Roman" w:hAnsi="Times New Roman" w:cs="Times New Roman"/>
+          <w:kern w:val="0"/>
+          <w:sz w:val="24"/>
+          <w:szCs w:val="24"/>
+          <w:highlight w:val="yellow"/>
+          <w:lang w:eastAsia="fr-FR"/>
+          <w14:ligatures w14:val="none"/>
+        </w:rPr>
+        <w:t>selection</w:t>
+      </w:r>
+      <w:proofErr w:type="spellEnd"/>
+      <w:r>
+        <w:rPr>
+          <w:rFonts w:ascii="Times New Roman" w:eastAsia="Times New Roman" w:hAnsi="Times New Roman" w:cs="Times New Roman"/>
+          <w:kern w:val="0"/>
+          <w:sz w:val="24"/>
+          <w:szCs w:val="24"/>
+          <w:highlight w:val="yellow"/>
+          <w:lang w:eastAsia="fr-FR"/>
+          <w14:ligatures w14:val="none"/>
+        </w:rPr>
+        <w:t xml:space="preserve"> techniques</w:t>
       </w:r>
     </w:p>
     <w:p>
@@ -4379,7 +6269,63 @@
           <w:lang w:eastAsia="fr-FR"/>
           <w14:ligatures w14:val="none"/>
         </w:rPr>
-        <w:t>Days 61–65: Time Series Basics</w:t>
+        <w:t>Days 61–</w:t>
+      </w:r>
+      <w:proofErr w:type="gramStart"/>
+      <w:r>
+        <w:rPr>
+          <w:rFonts w:ascii="Times New Roman" w:eastAsia="Times New Roman" w:hAnsi="Times New Roman" w:cs="Times New Roman"/>
+          <w:b/>
+          <w:bCs/>
+          <w:kern w:val="0"/>
+          <w:sz w:val="27"/>
+          <w:szCs w:val="27"/>
+          <w:lang w:eastAsia="fr-FR"/>
+          <w14:ligatures w14:val="none"/>
+        </w:rPr>
+        <w:t>65:</w:t>
+      </w:r>
+      <w:proofErr w:type="gramEnd"/>
+      <w:r>
+        <w:rPr>
+          <w:rFonts w:ascii="Times New Roman" w:eastAsia="Times New Roman" w:hAnsi="Times New Roman" w:cs="Times New Roman"/>
+          <w:b/>
+          <w:bCs/>
+          <w:kern w:val="0"/>
+          <w:sz w:val="27"/>
+          <w:szCs w:val="27"/>
+          <w:lang w:eastAsia="fr-FR"/>
+          <w14:ligatures w14:val="none"/>
+        </w:rPr>
+        <w:t xml:space="preserve"> Time </w:t>
+      </w:r>
+      <w:proofErr w:type="spellStart"/>
+      <w:r>
+        <w:rPr>
+          <w:rFonts w:ascii="Times New Roman" w:eastAsia="Times New Roman" w:hAnsi="Times New Roman" w:cs="Times New Roman"/>
+          <w:b/>
+          <w:bCs/>
+          <w:kern w:val="0"/>
+          <w:sz w:val="27"/>
+          <w:szCs w:val="27"/>
+          <w:lang w:eastAsia="fr-FR"/>
+          <w14:ligatures w14:val="none"/>
+        </w:rPr>
+        <w:t>Series</w:t>
+      </w:r>
+      <w:proofErr w:type="spellEnd"/>
+      <w:r>
+        <w:rPr>
+          <w:rFonts w:ascii="Times New Roman" w:eastAsia="Times New Roman" w:hAnsi="Times New Roman" w:cs="Times New Roman"/>
+          <w:b/>
+          <w:bCs/>
+          <w:kern w:val="0"/>
+          <w:sz w:val="27"/>
+          <w:szCs w:val="27"/>
+          <w:lang w:eastAsia="fr-FR"/>
+          <w14:ligatures w14:val="none"/>
+        </w:rPr>
+        <w:t xml:space="preserve"> Basics</w:t>
       </w:r>
     </w:p>
     <w:p>
@@ -4561,7 +6507,31 @@
           <w:lang w:eastAsia="fr-FR"/>
           <w14:ligatures w14:val="none"/>
         </w:rPr>
-        <w:t>Saisonnalité (Seasonality)</w:t>
+        <w:t>Saisonnalité (</w:t>
+      </w:r>
+      <w:proofErr w:type="spellStart"/>
+      <w:r>
+        <w:rPr>
+          <w:rFonts w:eastAsia="Times New Roman" w:cstheme="minorHAnsi"/>
+          <w:kern w:val="0"/>
+          <w:sz w:val="20"/>
+          <w:szCs w:val="20"/>
+          <w:lang w:eastAsia="fr-FR"/>
+          <w14:ligatures w14:val="none"/>
+        </w:rPr>
+        <w:t>Seasonality</w:t>
+      </w:r>
+      <w:proofErr w:type="spellEnd"/>
+      <w:r>
+        <w:rPr>
+          <w:rFonts w:eastAsia="Times New Roman" w:cstheme="minorHAnsi"/>
+          <w:kern w:val="0"/>
+          <w:sz w:val="20"/>
+          <w:szCs w:val="20"/>
+          <w:lang w:eastAsia="fr-FR"/>
+          <w14:ligatures w14:val="none"/>
+        </w:rPr>
+        <w:t>)</w:t>
       </w:r>
     </w:p>
     <w:p>
@@ -4699,7 +6669,31 @@
           <w:lang w:eastAsia="fr-FR"/>
           <w14:ligatures w14:val="none"/>
         </w:rPr>
-        <w:t xml:space="preserve"> : Utilisation de pandas pour la manipulation d'index temporels et statsmodels pour la décomposition.</w:t>
+        <w:t xml:space="preserve"> : Utilisation de pandas pour la manipulation d'index temporels et </w:t>
+      </w:r>
+      <w:proofErr w:type="spellStart"/>
+      <w:r>
+        <w:rPr>
+          <w:rFonts w:eastAsia="Times New Roman" w:cstheme="minorHAnsi"/>
+          <w:kern w:val="0"/>
+          <w:sz w:val="20"/>
+          <w:szCs w:val="20"/>
+          <w:lang w:eastAsia="fr-FR"/>
+          <w14:ligatures w14:val="none"/>
+        </w:rPr>
+        <w:t>statsmodels</w:t>
+      </w:r>
+      <w:proofErr w:type="spellEnd"/>
+      <w:r>
+        <w:rPr>
+          <w:rFonts w:eastAsia="Times New Roman" w:cstheme="minorHAnsi"/>
+          <w:kern w:val="0"/>
+          <w:sz w:val="20"/>
+          <w:szCs w:val="20"/>
+          <w:lang w:eastAsia="fr-FR"/>
+          <w14:ligatures w14:val="none"/>
+        </w:rPr>
+        <w:t xml:space="preserve"> pour la décomposition.</w:t>
       </w:r>
     </w:p>
     <w:p>
@@ -5247,7 +7241,92 @@
           <w:lang w:eastAsia="fr-FR"/>
           <w14:ligatures w14:val="none"/>
         </w:rPr>
-        <w:t xml:space="preserve"> : SARIMA (p,d,q)(P,D,Q)_s et ARIMAX.</w:t>
+        <w:t xml:space="preserve"> : SARIMA (</w:t>
+      </w:r>
+      <w:proofErr w:type="spellStart"/>
+      <w:proofErr w:type="gramStart"/>
+      <w:r>
+        <w:rPr>
+          <w:rFonts w:eastAsia="Times New Roman" w:cstheme="minorHAnsi"/>
+          <w:kern w:val="0"/>
+          <w:sz w:val="20"/>
+          <w:szCs w:val="20"/>
+          <w:lang w:eastAsia="fr-FR"/>
+          <w14:ligatures w14:val="none"/>
+        </w:rPr>
+        <w:t>p,d</w:t>
+      </w:r>
+      <w:proofErr w:type="gramEnd"/>
+      <w:r>
+        <w:rPr>
+          <w:rFonts w:eastAsia="Times New Roman" w:cstheme="minorHAnsi"/>
+          <w:kern w:val="0"/>
+          <w:sz w:val="20"/>
+          <w:szCs w:val="20"/>
+          <w:lang w:eastAsia="fr-FR"/>
+          <w14:ligatures w14:val="none"/>
+        </w:rPr>
+        <w:t>,</w:t>
+      </w:r>
+      <w:proofErr w:type="gramStart"/>
+      <w:r>
+        <w:rPr>
+          <w:rFonts w:eastAsia="Times New Roman" w:cstheme="minorHAnsi"/>
+          <w:kern w:val="0"/>
+          <w:sz w:val="20"/>
+          <w:szCs w:val="20"/>
+          <w:lang w:eastAsia="fr-FR"/>
+          <w14:ligatures w14:val="none"/>
+        </w:rPr>
+        <w:t>q</w:t>
+      </w:r>
+      <w:proofErr w:type="spellEnd"/>
+      <w:r>
+        <w:rPr>
+          <w:rFonts w:eastAsia="Times New Roman" w:cstheme="minorHAnsi"/>
+          <w:kern w:val="0"/>
+          <w:sz w:val="20"/>
+          <w:szCs w:val="20"/>
+          <w:lang w:eastAsia="fr-FR"/>
+          <w14:ligatures w14:val="none"/>
+        </w:rPr>
+        <w:t>)(P,D</w:t>
+      </w:r>
+      <w:proofErr w:type="gramEnd"/>
+      <w:r>
+        <w:rPr>
+          <w:rFonts w:eastAsia="Times New Roman" w:cstheme="minorHAnsi"/>
+          <w:kern w:val="0"/>
+          <w:sz w:val="20"/>
+          <w:szCs w:val="20"/>
+          <w:lang w:eastAsia="fr-FR"/>
+          <w14:ligatures w14:val="none"/>
+        </w:rPr>
+        <w:t>,</w:t>
+      </w:r>
+      <w:proofErr w:type="gramStart"/>
+      <w:r>
+        <w:rPr>
+          <w:rFonts w:eastAsia="Times New Roman" w:cstheme="minorHAnsi"/>
+          <w:kern w:val="0"/>
+          <w:sz w:val="20"/>
+          <w:szCs w:val="20"/>
+          <w:lang w:eastAsia="fr-FR"/>
+          <w14:ligatures w14:val="none"/>
+        </w:rPr>
+        <w:t>Q)_</w:t>
+      </w:r>
+      <w:proofErr w:type="gramEnd"/>
+      <w:r>
+        <w:rPr>
+          <w:rFonts w:eastAsia="Times New Roman" w:cstheme="minorHAnsi"/>
+          <w:kern w:val="0"/>
+          <w:sz w:val="20"/>
+          <w:szCs w:val="20"/>
+          <w:lang w:eastAsia="fr-FR"/>
+          <w14:ligatures w14:val="none"/>
+        </w:rPr>
+        <w:t>s et ARIMAX.</w:t>
       </w:r>
     </w:p>
     <w:p>
@@ -5288,7 +7367,79 @@
           <w:lang w:eastAsia="fr-FR"/>
           <w14:ligatures w14:val="none"/>
         </w:rPr>
-        <w:t xml:space="preserve"> : Utilisation de pmdarima pour l'optimisation automatique des hyperparamètres (auto_arima) et prédictions avec statsmodels.</w:t>
+        <w:t xml:space="preserve"> : Utilisation de </w:t>
+      </w:r>
+      <w:proofErr w:type="spellStart"/>
+      <w:r>
+        <w:rPr>
+          <w:rFonts w:eastAsia="Times New Roman" w:cstheme="minorHAnsi"/>
+          <w:kern w:val="0"/>
+          <w:sz w:val="20"/>
+          <w:szCs w:val="20"/>
+          <w:lang w:eastAsia="fr-FR"/>
+          <w14:ligatures w14:val="none"/>
+        </w:rPr>
+        <w:t>pmdarima</w:t>
+      </w:r>
+      <w:proofErr w:type="spellEnd"/>
+      <w:r>
+        <w:rPr>
+          <w:rFonts w:eastAsia="Times New Roman" w:cstheme="minorHAnsi"/>
+          <w:kern w:val="0"/>
+          <w:sz w:val="20"/>
+          <w:szCs w:val="20"/>
+          <w:lang w:eastAsia="fr-FR"/>
+          <w14:ligatures w14:val="none"/>
+        </w:rPr>
+        <w:t xml:space="preserve"> pour l'optimisation automatique des hyperparamètres (</w:t>
+      </w:r>
+      <w:proofErr w:type="spellStart"/>
+      <w:r>
+        <w:rPr>
+          <w:rFonts w:eastAsia="Times New Roman" w:cstheme="minorHAnsi"/>
+          <w:kern w:val="0"/>
+          <w:sz w:val="20"/>
+          <w:szCs w:val="20"/>
+          <w:lang w:eastAsia="fr-FR"/>
+          <w14:ligatures w14:val="none"/>
+        </w:rPr>
+        <w:t>auto_arima</w:t>
+      </w:r>
+      <w:proofErr w:type="spellEnd"/>
+      <w:r>
+        <w:rPr>
+          <w:rFonts w:eastAsia="Times New Roman" w:cstheme="minorHAnsi"/>
+          <w:kern w:val="0"/>
+          <w:sz w:val="20"/>
+          <w:szCs w:val="20"/>
+          <w:lang w:eastAsia="fr-FR"/>
+          <w14:ligatures w14:val="none"/>
+        </w:rPr>
+        <w:t xml:space="preserve">) et prédictions avec </w:t>
+      </w:r>
+      <w:proofErr w:type="spellStart"/>
+      <w:r>
+        <w:rPr>
+          <w:rFonts w:eastAsia="Times New Roman" w:cstheme="minorHAnsi"/>
+          <w:kern w:val="0"/>
+          <w:sz w:val="20"/>
+          <w:szCs w:val="20"/>
+          <w:lang w:eastAsia="fr-FR"/>
+          <w14:ligatures w14:val="none"/>
+        </w:rPr>
+        <w:t>statsmodels</w:t>
+      </w:r>
+      <w:proofErr w:type="spellEnd"/>
+      <w:r>
+        <w:rPr>
+          <w:rFonts w:eastAsia="Times New Roman" w:cstheme="minorHAnsi"/>
+          <w:kern w:val="0"/>
+          <w:sz w:val="20"/>
+          <w:szCs w:val="20"/>
+          <w:lang w:eastAsia="fr-FR"/>
+          <w14:ligatures w14:val="none"/>
+        </w:rPr>
+        <w:t>.</w:t>
       </w:r>
     </w:p>
     <w:p>
@@ -5405,7 +7556,63 @@
           <w:lang w:eastAsia="fr-FR"/>
           <w14:ligatures w14:val="none"/>
         </w:rPr>
-        <w:t>Lissage exponentiel simple (Simple Exponential Smoothing).</w:t>
+        <w:t xml:space="preserve">Lissage exponentiel simple (Simple </w:t>
+      </w:r>
+      <w:proofErr w:type="spellStart"/>
+      <w:r>
+        <w:rPr>
+          <w:rFonts w:eastAsia="Times New Roman" w:cstheme="minorHAnsi"/>
+          <w:b/>
+          <w:bCs/>
+          <w:kern w:val="0"/>
+          <w:sz w:val="20"/>
+          <w:szCs w:val="20"/>
+          <w:lang w:eastAsia="fr-FR"/>
+          <w14:ligatures w14:val="none"/>
+        </w:rPr>
+        <w:t>Exponential</w:t>
+      </w:r>
+      <w:proofErr w:type="spellEnd"/>
+      <w:r>
+        <w:rPr>
+          <w:rFonts w:eastAsia="Times New Roman" w:cstheme="minorHAnsi"/>
+          <w:b/>
+          <w:bCs/>
+          <w:kern w:val="0"/>
+          <w:sz w:val="20"/>
+          <w:szCs w:val="20"/>
+          <w:lang w:eastAsia="fr-FR"/>
+          <w14:ligatures w14:val="none"/>
+        </w:rPr>
+        <w:t xml:space="preserve"> </w:t>
+      </w:r>
+      <w:proofErr w:type="spellStart"/>
+      <w:r>
+        <w:rPr>
+          <w:rFonts w:eastAsia="Times New Roman" w:cstheme="minorHAnsi"/>
+          <w:b/>
+          <w:bCs/>
+          <w:kern w:val="0"/>
+          <w:sz w:val="20"/>
+          <w:szCs w:val="20"/>
+          <w:lang w:eastAsia="fr-FR"/>
+          <w14:ligatures w14:val="none"/>
+        </w:rPr>
+        <w:t>Smoothing</w:t>
+      </w:r>
+      <w:proofErr w:type="spellEnd"/>
+      <w:r>
+        <w:rPr>
+          <w:rFonts w:eastAsia="Times New Roman" w:cstheme="minorHAnsi"/>
+          <w:b/>
+          <w:bCs/>
+          <w:kern w:val="0"/>
+          <w:sz w:val="20"/>
+          <w:szCs w:val="20"/>
+          <w:lang w:eastAsia="fr-FR"/>
+          <w14:ligatures w14:val="none"/>
+        </w:rPr>
+        <w:t>).</w:t>
       </w:r>
     </w:p>
     <w:p>
@@ -5480,7 +7687,55 @@
           <w:lang w:eastAsia="fr-FR"/>
           <w14:ligatures w14:val="none"/>
         </w:rPr>
-        <w:t xml:space="preserve"> : Implémentation via ExponentialSmoothing de statsmodels.</w:t>
+        <w:t xml:space="preserve"> : Implémentation via </w:t>
+      </w:r>
+      <w:proofErr w:type="spellStart"/>
+      <w:r>
+        <w:rPr>
+          <w:rFonts w:eastAsia="Times New Roman" w:cstheme="minorHAnsi"/>
+          <w:kern w:val="0"/>
+          <w:sz w:val="20"/>
+          <w:szCs w:val="20"/>
+          <w:lang w:eastAsia="fr-FR"/>
+          <w14:ligatures w14:val="none"/>
+        </w:rPr>
+        <w:t>ExponentialSmoothing</w:t>
+      </w:r>
+      <w:proofErr w:type="spellEnd"/>
+      <w:r>
+        <w:rPr>
+          <w:rFonts w:eastAsia="Times New Roman" w:cstheme="minorHAnsi"/>
+          <w:kern w:val="0"/>
+          <w:sz w:val="20"/>
+          <w:szCs w:val="20"/>
+          <w:lang w:eastAsia="fr-FR"/>
+          <w14:ligatures w14:val="none"/>
+        </w:rPr>
+        <w:t xml:space="preserve"> de </w:t>
+      </w:r>
+      <w:proofErr w:type="spellStart"/>
+      <w:r>
+        <w:rPr>
+          <w:rFonts w:eastAsia="Times New Roman" w:cstheme="minorHAnsi"/>
+          <w:kern w:val="0"/>
+          <w:sz w:val="20"/>
+          <w:szCs w:val="20"/>
+          <w:lang w:eastAsia="fr-FR"/>
+          <w14:ligatures w14:val="none"/>
+        </w:rPr>
+        <w:t>statsmodels</w:t>
+      </w:r>
+      <w:proofErr w:type="spellEnd"/>
+      <w:r>
+        <w:rPr>
+          <w:rFonts w:eastAsia="Times New Roman" w:cstheme="minorHAnsi"/>
+          <w:kern w:val="0"/>
+          <w:sz w:val="20"/>
+          <w:szCs w:val="20"/>
+          <w:lang w:eastAsia="fr-FR"/>
+          <w14:ligatures w14:val="none"/>
+        </w:rPr>
+        <w:t>.</w:t>
       </w:r>
     </w:p>
     <w:p>
@@ -5585,18 +7840,33 @@
           <w14:ligatures w14:val="none"/>
         </w:rPr>
       </w:pPr>
-      <w:r>
-        <w:rPr>
-          <w:rFonts w:eastAsia="Times New Roman" w:cstheme="minorHAnsi"/>
-          <w:b/>
-          <w:bCs/>
-          <w:kern w:val="0"/>
-          <w:sz w:val="20"/>
-          <w:szCs w:val="20"/>
-          <w:lang w:eastAsia="fr-FR"/>
-          <w14:ligatures w14:val="none"/>
-        </w:rPr>
-        <w:t>Feature Engineering temporel</w:t>
+      <w:proofErr w:type="spellStart"/>
+      <w:r>
+        <w:rPr>
+          <w:rFonts w:eastAsia="Times New Roman" w:cstheme="minorHAnsi"/>
+          <w:b/>
+          <w:bCs/>
+          <w:kern w:val="0"/>
+          <w:sz w:val="20"/>
+          <w:szCs w:val="20"/>
+          <w:lang w:eastAsia="fr-FR"/>
+          <w14:ligatures w14:val="none"/>
+        </w:rPr>
+        <w:t>Feature</w:t>
+      </w:r>
+      <w:proofErr w:type="spellEnd"/>
+      <w:r>
+        <w:rPr>
+          <w:rFonts w:eastAsia="Times New Roman" w:cstheme="minorHAnsi"/>
+          <w:b/>
+          <w:bCs/>
+          <w:kern w:val="0"/>
+          <w:sz w:val="20"/>
+          <w:szCs w:val="20"/>
+          <w:lang w:eastAsia="fr-FR"/>
+          <w14:ligatures w14:val="none"/>
+        </w:rPr>
+        <w:t xml:space="preserve"> Engineering temporel</w:t>
       </w:r>
       <w:r>
         <w:rPr>
@@ -5663,7 +7933,31 @@
           <w:lang w:eastAsia="fr-FR"/>
           <w14:ligatures w14:val="none"/>
         </w:rPr>
-        <w:t>Valeurs retardées (Lag features) et moyennes mobiles.</w:t>
+        <w:t xml:space="preserve">Valeurs retardées (Lag </w:t>
+      </w:r>
+      <w:proofErr w:type="spellStart"/>
+      <w:r>
+        <w:rPr>
+          <w:rFonts w:eastAsia="Times New Roman" w:cstheme="minorHAnsi"/>
+          <w:kern w:val="0"/>
+          <w:sz w:val="20"/>
+          <w:szCs w:val="20"/>
+          <w:lang w:eastAsia="fr-FR"/>
+          <w14:ligatures w14:val="none"/>
+        </w:rPr>
+        <w:t>features</w:t>
+      </w:r>
+      <w:proofErr w:type="spellEnd"/>
+      <w:r>
+        <w:rPr>
+          <w:rFonts w:eastAsia="Times New Roman" w:cstheme="minorHAnsi"/>
+          <w:kern w:val="0"/>
+          <w:sz w:val="20"/>
+          <w:szCs w:val="20"/>
+          <w:lang w:eastAsia="fr-FR"/>
+          <w14:ligatures w14:val="none"/>
+        </w:rPr>
+        <w:t>) et moyennes mobiles.</w:t>
       </w:r>
     </w:p>
     <w:p>
@@ -5717,7 +8011,35 @@
           <w:lang w:eastAsia="fr-FR"/>
           <w14:ligatures w14:val="none"/>
         </w:rPr>
-        <w:t>Time Series Split</w:t>
+        <w:t xml:space="preserve">Time </w:t>
+      </w:r>
+      <w:proofErr w:type="spellStart"/>
+      <w:r>
+        <w:rPr>
+          <w:rFonts w:eastAsia="Times New Roman" w:cstheme="minorHAnsi"/>
+          <w:i/>
+          <w:iCs/>
+          <w:kern w:val="0"/>
+          <w:sz w:val="20"/>
+          <w:szCs w:val="20"/>
+          <w:lang w:eastAsia="fr-FR"/>
+          <w14:ligatures w14:val="none"/>
+        </w:rPr>
+        <w:t>Series</w:t>
+      </w:r>
+      <w:proofErr w:type="spellEnd"/>
+      <w:r>
+        <w:rPr>
+          <w:rFonts w:eastAsia="Times New Roman" w:cstheme="minorHAnsi"/>
+          <w:i/>
+          <w:iCs/>
+          <w:kern w:val="0"/>
+          <w:sz w:val="20"/>
+          <w:szCs w:val="20"/>
+          <w:lang w:eastAsia="fr-FR"/>
+          <w14:ligatures w14:val="none"/>
+        </w:rPr>
+        <w:t xml:space="preserve"> Split</w:t>
       </w:r>
       <w:r>
         <w:rPr>
@@ -5750,7 +8072,31 @@
           <w:lang w:eastAsia="fr-FR"/>
           <w14:ligatures w14:val="none"/>
         </w:rPr>
-        <w:t>éviter le data leakage futur).</w:t>
+        <w:t xml:space="preserve">éviter le data </w:t>
+      </w:r>
+      <w:proofErr w:type="spellStart"/>
+      <w:r>
+        <w:rPr>
+          <w:rFonts w:eastAsia="Times New Roman" w:cstheme="minorHAnsi"/>
+          <w:kern w:val="0"/>
+          <w:sz w:val="20"/>
+          <w:szCs w:val="20"/>
+          <w:lang w:eastAsia="fr-FR"/>
+          <w14:ligatures w14:val="none"/>
+        </w:rPr>
+        <w:t>leakage</w:t>
+      </w:r>
+      <w:proofErr w:type="spellEnd"/>
+      <w:r>
+        <w:rPr>
+          <w:rFonts w:eastAsia="Times New Roman" w:cstheme="minorHAnsi"/>
+          <w:kern w:val="0"/>
+          <w:sz w:val="20"/>
+          <w:szCs w:val="20"/>
+          <w:lang w:eastAsia="fr-FR"/>
+          <w14:ligatures w14:val="none"/>
+        </w:rPr>
+        <w:t xml:space="preserve"> futur).</w:t>
       </w:r>
     </w:p>
     <w:p>
@@ -5791,7 +8137,31 @@
           <w:lang w:eastAsia="fr-FR"/>
           <w14:ligatures w14:val="none"/>
         </w:rPr>
-        <w:t xml:space="preserve"> : Construction d'un pipeline complet de Machine Learning avec scikit-learn</w:t>
+        <w:t xml:space="preserve"> : Construction d'un pipeline complet de Machine Learning avec </w:t>
+      </w:r>
+      <w:proofErr w:type="spellStart"/>
+      <w:r>
+        <w:rPr>
+          <w:rFonts w:eastAsia="Times New Roman" w:cstheme="minorHAnsi"/>
+          <w:kern w:val="0"/>
+          <w:sz w:val="20"/>
+          <w:szCs w:val="20"/>
+          <w:lang w:eastAsia="fr-FR"/>
+          <w14:ligatures w14:val="none"/>
+        </w:rPr>
+        <w:t>scikit</w:t>
+      </w:r>
+      <w:proofErr w:type="spellEnd"/>
+      <w:r>
+        <w:rPr>
+          <w:rFonts w:eastAsia="Times New Roman" w:cstheme="minorHAnsi"/>
+          <w:kern w:val="0"/>
+          <w:sz w:val="20"/>
+          <w:szCs w:val="20"/>
+          <w:lang w:eastAsia="fr-FR"/>
+          <w14:ligatures w14:val="none"/>
+        </w:rPr>
+        <w:t>-learn</w:t>
       </w:r>
       <w:r>
         <w:rPr>
@@ -5853,6 +8223,7 @@
           <w:kern w:val="0"/>
           <w:sz w:val="20"/>
           <w:szCs w:val="20"/>
+          <w:highlight w:val="yellow"/>
           <w:lang w:eastAsia="fr-FR"/>
           <w14:ligatures w14:val="none"/>
         </w:rPr>
@@ -6037,6 +8408,7 @@
           <w:kern w:val="0"/>
           <w:sz w:val="20"/>
           <w:szCs w:val="20"/>
+          <w:highlight w:val="yellow"/>
           <w:lang w:eastAsia="fr-FR"/>
           <w14:ligatures w14:val="none"/>
         </w:rPr>
@@ -6191,6 +8563,7 @@
           <w14:ligatures w14:val="none"/>
         </w:rPr>
       </w:pPr>
+      <w:proofErr w:type="spellStart"/>
       <w:r>
         <w:rPr>
           <w:rFonts w:eastAsia="Times New Roman" w:cstheme="minorHAnsi"/>
@@ -6204,6 +8577,7 @@
         </w:rPr>
         <w:t>Backtesting</w:t>
       </w:r>
+      <w:proofErr w:type="spellEnd"/>
       <w:r>
         <w:rPr>
           <w:rFonts w:eastAsia="Times New Roman" w:cstheme="minorHAnsi"/>
@@ -6242,7 +8616,35 @@
           <w:lang w:eastAsia="fr-FR"/>
           <w14:ligatures w14:val="none"/>
         </w:rPr>
-        <w:t>Days 66–70: NLP Basics</w:t>
+        <w:t>Days 66–</w:t>
+      </w:r>
+      <w:proofErr w:type="gramStart"/>
+      <w:r>
+        <w:rPr>
+          <w:rFonts w:ascii="Times New Roman" w:eastAsia="Times New Roman" w:hAnsi="Times New Roman" w:cs="Times New Roman"/>
+          <w:b/>
+          <w:bCs/>
+          <w:kern w:val="0"/>
+          <w:sz w:val="27"/>
+          <w:szCs w:val="27"/>
+          <w:lang w:eastAsia="fr-FR"/>
+          <w14:ligatures w14:val="none"/>
+        </w:rPr>
+        <w:t>70:</w:t>
+      </w:r>
+      <w:proofErr w:type="gramEnd"/>
+      <w:r>
+        <w:rPr>
+          <w:rFonts w:ascii="Times New Roman" w:eastAsia="Times New Roman" w:hAnsi="Times New Roman" w:cs="Times New Roman"/>
+          <w:b/>
+          <w:bCs/>
+          <w:kern w:val="0"/>
+          <w:sz w:val="27"/>
+          <w:szCs w:val="27"/>
+          <w:lang w:eastAsia="fr-FR"/>
+          <w14:ligatures w14:val="none"/>
+        </w:rPr>
+        <w:t xml:space="preserve"> NLP Basics</w:t>
       </w:r>
     </w:p>
     <w:p>
@@ -6272,8 +8674,126 @@
           <w:lang w:eastAsia="fr-FR"/>
           <w14:ligatures w14:val="none"/>
         </w:rPr>
-        <w:t>Day 66: Text preprocessing – tokenization, stopwords</w:t>
-      </w:r>
+        <w:t xml:space="preserve">Day </w:t>
+      </w:r>
+      <w:proofErr w:type="gramStart"/>
+      <w:r>
+        <w:rPr>
+          <w:rFonts w:ascii="Times New Roman" w:eastAsia="Times New Roman" w:hAnsi="Times New Roman" w:cs="Times New Roman"/>
+          <w:kern w:val="0"/>
+          <w:sz w:val="24"/>
+          <w:szCs w:val="24"/>
+          <w:highlight w:val="yellow"/>
+          <w:lang w:eastAsia="fr-FR"/>
+          <w14:ligatures w14:val="none"/>
+        </w:rPr>
+        <w:t>66:</w:t>
+      </w:r>
+      <w:proofErr w:type="gramEnd"/>
+      <w:r>
+        <w:rPr>
+          <w:rFonts w:ascii="Times New Roman" w:eastAsia="Times New Roman" w:hAnsi="Times New Roman" w:cs="Times New Roman"/>
+          <w:kern w:val="0"/>
+          <w:sz w:val="24"/>
+          <w:szCs w:val="24"/>
+          <w:highlight w:val="yellow"/>
+          <w:lang w:eastAsia="fr-FR"/>
+          <w14:ligatures w14:val="none"/>
+        </w:rPr>
+        <w:t xml:space="preserve"> </w:t>
+      </w:r>
+      <w:proofErr w:type="spellStart"/>
+      <w:r>
+        <w:rPr>
+          <w:rFonts w:ascii="Times New Roman" w:eastAsia="Times New Roman" w:hAnsi="Times New Roman" w:cs="Times New Roman"/>
+          <w:kern w:val="0"/>
+          <w:sz w:val="24"/>
+          <w:szCs w:val="24"/>
+          <w:highlight w:val="yellow"/>
+          <w:lang w:eastAsia="fr-FR"/>
+          <w14:ligatures w14:val="none"/>
+        </w:rPr>
+        <w:t>Text</w:t>
+      </w:r>
+      <w:proofErr w:type="spellEnd"/>
+      <w:r>
+        <w:rPr>
+          <w:rFonts w:ascii="Times New Roman" w:eastAsia="Times New Roman" w:hAnsi="Times New Roman" w:cs="Times New Roman"/>
+          <w:kern w:val="0"/>
+          <w:sz w:val="24"/>
+          <w:szCs w:val="24"/>
+          <w:highlight w:val="yellow"/>
+          <w:lang w:eastAsia="fr-FR"/>
+          <w14:ligatures w14:val="none"/>
+        </w:rPr>
+        <w:t xml:space="preserve"> </w:t>
+      </w:r>
+      <w:proofErr w:type="spellStart"/>
+      <w:r>
+        <w:rPr>
+          <w:rFonts w:ascii="Times New Roman" w:eastAsia="Times New Roman" w:hAnsi="Times New Roman" w:cs="Times New Roman"/>
+          <w:kern w:val="0"/>
+          <w:sz w:val="24"/>
+          <w:szCs w:val="24"/>
+          <w:highlight w:val="yellow"/>
+          <w:lang w:eastAsia="fr-FR"/>
+          <w14:ligatures w14:val="none"/>
+        </w:rPr>
+        <w:t>preprocessing</w:t>
+      </w:r>
+      <w:proofErr w:type="spellEnd"/>
+      <w:r>
+        <w:rPr>
+          <w:rFonts w:ascii="Times New Roman" w:eastAsia="Times New Roman" w:hAnsi="Times New Roman" w:cs="Times New Roman"/>
+          <w:kern w:val="0"/>
+          <w:sz w:val="24"/>
+          <w:szCs w:val="24"/>
+          <w:highlight w:val="yellow"/>
+          <w:lang w:eastAsia="fr-FR"/>
+          <w14:ligatures w14:val="none"/>
+        </w:rPr>
+        <w:t xml:space="preserve"> – </w:t>
+      </w:r>
+      <w:proofErr w:type="spellStart"/>
+      <w:r>
+        <w:rPr>
+          <w:rFonts w:ascii="Times New Roman" w:eastAsia="Times New Roman" w:hAnsi="Times New Roman" w:cs="Times New Roman"/>
+          <w:kern w:val="0"/>
+          <w:sz w:val="24"/>
+          <w:szCs w:val="24"/>
+          <w:highlight w:val="yellow"/>
+          <w:lang w:eastAsia="fr-FR"/>
+          <w14:ligatures w14:val="none"/>
+        </w:rPr>
+        <w:t>tokenization</w:t>
+      </w:r>
+      <w:proofErr w:type="spellEnd"/>
+      <w:r>
+        <w:rPr>
+          <w:rFonts w:ascii="Times New Roman" w:eastAsia="Times New Roman" w:hAnsi="Times New Roman" w:cs="Times New Roman"/>
+          <w:kern w:val="0"/>
+          <w:sz w:val="24"/>
+          <w:szCs w:val="24"/>
+          <w:highlight w:val="yellow"/>
+          <w:lang w:eastAsia="fr-FR"/>
+          <w14:ligatures w14:val="none"/>
+        </w:rPr>
+        <w:t xml:space="preserve">, </w:t>
+      </w:r>
+      <w:proofErr w:type="spellStart"/>
+      <w:r>
+        <w:rPr>
+          <w:rFonts w:ascii="Times New Roman" w:eastAsia="Times New Roman" w:hAnsi="Times New Roman" w:cs="Times New Roman"/>
+          <w:kern w:val="0"/>
+          <w:sz w:val="24"/>
+          <w:szCs w:val="24"/>
+          <w:highlight w:val="yellow"/>
+          <w:lang w:eastAsia="fr-FR"/>
+          <w14:ligatures w14:val="none"/>
+        </w:rPr>
+        <w:t>stopwords</w:t>
+      </w:r>
+      <w:proofErr w:type="spellEnd"/>
     </w:p>
     <w:p>
       <w:pPr>
@@ -6374,8 +8894,74 @@
           <w:lang w:eastAsia="fr-FR"/>
           <w14:ligatures w14:val="none"/>
         </w:rPr>
-        <w:t>Day 69: Sentiment analysis project</w:t>
-      </w:r>
+        <w:t xml:space="preserve">Day </w:t>
+      </w:r>
+      <w:proofErr w:type="gramStart"/>
+      <w:r>
+        <w:rPr>
+          <w:rFonts w:ascii="Times New Roman" w:eastAsia="Times New Roman" w:hAnsi="Times New Roman" w:cs="Times New Roman"/>
+          <w:kern w:val="0"/>
+          <w:sz w:val="24"/>
+          <w:szCs w:val="24"/>
+          <w:highlight w:val="yellow"/>
+          <w:lang w:eastAsia="fr-FR"/>
+          <w14:ligatures w14:val="none"/>
+        </w:rPr>
+        <w:t>69:</w:t>
+      </w:r>
+      <w:proofErr w:type="gramEnd"/>
+      <w:r>
+        <w:rPr>
+          <w:rFonts w:ascii="Times New Roman" w:eastAsia="Times New Roman" w:hAnsi="Times New Roman" w:cs="Times New Roman"/>
+          <w:kern w:val="0"/>
+          <w:sz w:val="24"/>
+          <w:szCs w:val="24"/>
+          <w:highlight w:val="yellow"/>
+          <w:lang w:eastAsia="fr-FR"/>
+          <w14:ligatures w14:val="none"/>
+        </w:rPr>
+        <w:t xml:space="preserve"> Sentiment </w:t>
+      </w:r>
+      <w:proofErr w:type="spellStart"/>
+      <w:r>
+        <w:rPr>
+          <w:rFonts w:ascii="Times New Roman" w:eastAsia="Times New Roman" w:hAnsi="Times New Roman" w:cs="Times New Roman"/>
+          <w:kern w:val="0"/>
+          <w:sz w:val="24"/>
+          <w:szCs w:val="24"/>
+          <w:highlight w:val="yellow"/>
+          <w:lang w:eastAsia="fr-FR"/>
+          <w14:ligatures w14:val="none"/>
+        </w:rPr>
+        <w:t>analysis</w:t>
+      </w:r>
+      <w:proofErr w:type="spellEnd"/>
+      <w:r>
+        <w:rPr>
+          <w:rFonts w:ascii="Times New Roman" w:eastAsia="Times New Roman" w:hAnsi="Times New Roman" w:cs="Times New Roman"/>
+          <w:kern w:val="0"/>
+          <w:sz w:val="24"/>
+          <w:szCs w:val="24"/>
+          <w:highlight w:val="yellow"/>
+          <w:lang w:eastAsia="fr-FR"/>
+          <w14:ligatures w14:val="none"/>
+        </w:rPr>
+        <w:t xml:space="preserve"> </w:t>
+      </w:r>
+      <w:proofErr w:type="spellStart"/>
+      <w:r>
+        <w:rPr>
+          <w:rFonts w:ascii="Times New Roman" w:eastAsia="Times New Roman" w:hAnsi="Times New Roman" w:cs="Times New Roman"/>
+          <w:kern w:val="0"/>
+          <w:sz w:val="24"/>
+          <w:szCs w:val="24"/>
+          <w:highlight w:val="yellow"/>
+          <w:lang w:eastAsia="fr-FR"/>
+          <w14:ligatures w14:val="none"/>
+        </w:rPr>
+        <w:t>project</w:t>
+      </w:r>
+      <w:proofErr w:type="spellEnd"/>
     </w:p>
     <w:p>
       <w:pPr>
@@ -6453,7 +9039,35 @@
           <w:lang w:eastAsia="fr-FR"/>
           <w14:ligatures w14:val="none"/>
         </w:rPr>
-        <w:t>Days 71–75: Deep Learning Basics</w:t>
+        <w:t>Days 71–</w:t>
+      </w:r>
+      <w:proofErr w:type="gramStart"/>
+      <w:r>
+        <w:rPr>
+          <w:rFonts w:ascii="Times New Roman" w:eastAsia="Times New Roman" w:hAnsi="Times New Roman" w:cs="Times New Roman"/>
+          <w:b/>
+          <w:bCs/>
+          <w:kern w:val="0"/>
+          <w:sz w:val="27"/>
+          <w:szCs w:val="27"/>
+          <w:lang w:eastAsia="fr-FR"/>
+          <w14:ligatures w14:val="none"/>
+        </w:rPr>
+        <w:t>75:</w:t>
+      </w:r>
+      <w:proofErr w:type="gramEnd"/>
+      <w:r>
+        <w:rPr>
+          <w:rFonts w:ascii="Times New Roman" w:eastAsia="Times New Roman" w:hAnsi="Times New Roman" w:cs="Times New Roman"/>
+          <w:b/>
+          <w:bCs/>
+          <w:kern w:val="0"/>
+          <w:sz w:val="27"/>
+          <w:szCs w:val="27"/>
+          <w:lang w:eastAsia="fr-FR"/>
+          <w14:ligatures w14:val="none"/>
+        </w:rPr>
+        <w:t xml:space="preserve"> Deep Learning Basics</w:t>
       </w:r>
     </w:p>
     <w:p>
@@ -6485,18 +9099,46 @@
         </w:rPr>
         <w:t xml:space="preserve">Day 71: What is deep learning? </w:t>
       </w:r>
-      <w:r>
-        <w:rPr>
-          <w:rFonts w:ascii="Times New Roman" w:eastAsia="Times New Roman" w:hAnsi="Times New Roman" w:cs="Times New Roman"/>
-          <w:kern w:val="0"/>
-          <w:sz w:val="24"/>
-          <w:szCs w:val="24"/>
-          <w:highlight w:val="yellow"/>
-          <w:lang w:eastAsia="fr-FR"/>
-          <w14:ligatures w14:val="none"/>
-        </w:rPr>
-        <w:t>Neurons, layers</w:t>
-      </w:r>
+      <w:proofErr w:type="spellStart"/>
+      <w:r>
+        <w:rPr>
+          <w:rFonts w:ascii="Times New Roman" w:eastAsia="Times New Roman" w:hAnsi="Times New Roman" w:cs="Times New Roman"/>
+          <w:kern w:val="0"/>
+          <w:sz w:val="24"/>
+          <w:szCs w:val="24"/>
+          <w:highlight w:val="yellow"/>
+          <w:lang w:eastAsia="fr-FR"/>
+          <w14:ligatures w14:val="none"/>
+        </w:rPr>
+        <w:t>Neurons</w:t>
+      </w:r>
+      <w:proofErr w:type="spellEnd"/>
+      <w:r>
+        <w:rPr>
+          <w:rFonts w:ascii="Times New Roman" w:eastAsia="Times New Roman" w:hAnsi="Times New Roman" w:cs="Times New Roman"/>
+          <w:kern w:val="0"/>
+          <w:sz w:val="24"/>
+          <w:szCs w:val="24"/>
+          <w:highlight w:val="yellow"/>
+          <w:lang w:eastAsia="fr-FR"/>
+          <w14:ligatures w14:val="none"/>
+        </w:rPr>
+        <w:t xml:space="preserve">, </w:t>
+      </w:r>
+      <w:proofErr w:type="spellStart"/>
+      <w:r>
+        <w:rPr>
+          <w:rFonts w:ascii="Times New Roman" w:eastAsia="Times New Roman" w:hAnsi="Times New Roman" w:cs="Times New Roman"/>
+          <w:kern w:val="0"/>
+          <w:sz w:val="24"/>
+          <w:szCs w:val="24"/>
+          <w:highlight w:val="yellow"/>
+          <w:lang w:eastAsia="fr-FR"/>
+          <w14:ligatures w14:val="none"/>
+        </w:rPr>
+        <w:t>layers</w:t>
+      </w:r>
+      <w:proofErr w:type="spellEnd"/>
     </w:p>
     <w:p>
       <w:pPr>
@@ -6525,7 +9167,33 @@
           <w:lang w:eastAsia="fr-FR"/>
           <w14:ligatures w14:val="none"/>
         </w:rPr>
-        <w:t>Day 72: Intro to PyTorch</w:t>
+        <w:t xml:space="preserve">Day </w:t>
+      </w:r>
+      <w:proofErr w:type="gramStart"/>
+      <w:r>
+        <w:rPr>
+          <w:rFonts w:ascii="Times New Roman" w:eastAsia="Times New Roman" w:hAnsi="Times New Roman" w:cs="Times New Roman"/>
+          <w:kern w:val="0"/>
+          <w:sz w:val="24"/>
+          <w:szCs w:val="24"/>
+          <w:highlight w:val="yellow"/>
+          <w:lang w:eastAsia="fr-FR"/>
+          <w14:ligatures w14:val="none"/>
+        </w:rPr>
+        <w:t>72:</w:t>
+      </w:r>
+      <w:proofErr w:type="gramEnd"/>
+      <w:r>
+        <w:rPr>
+          <w:rFonts w:ascii="Times New Roman" w:eastAsia="Times New Roman" w:hAnsi="Times New Roman" w:cs="Times New Roman"/>
+          <w:kern w:val="0"/>
+          <w:sz w:val="24"/>
+          <w:szCs w:val="24"/>
+          <w:highlight w:val="yellow"/>
+          <w:lang w:eastAsia="fr-FR"/>
+          <w14:ligatures w14:val="none"/>
+        </w:rPr>
+        <w:t xml:space="preserve"> Intro to PyTorch</w:t>
       </w:r>
     </w:p>
     <w:p>
@@ -6585,8 +9253,74 @@
           <w:lang w:eastAsia="fr-FR"/>
           <w14:ligatures w14:val="none"/>
         </w:rPr>
-        <w:t>Day 74: Training loop, backpropagation</w:t>
-      </w:r>
+        <w:t xml:space="preserve">Day </w:t>
+      </w:r>
+      <w:proofErr w:type="gramStart"/>
+      <w:r>
+        <w:rPr>
+          <w:rFonts w:ascii="Times New Roman" w:eastAsia="Times New Roman" w:hAnsi="Times New Roman" w:cs="Times New Roman"/>
+          <w:kern w:val="0"/>
+          <w:sz w:val="24"/>
+          <w:szCs w:val="24"/>
+          <w:highlight w:val="yellow"/>
+          <w:lang w:eastAsia="fr-FR"/>
+          <w14:ligatures w14:val="none"/>
+        </w:rPr>
+        <w:t>74:</w:t>
+      </w:r>
+      <w:proofErr w:type="gramEnd"/>
+      <w:r>
+        <w:rPr>
+          <w:rFonts w:ascii="Times New Roman" w:eastAsia="Times New Roman" w:hAnsi="Times New Roman" w:cs="Times New Roman"/>
+          <w:kern w:val="0"/>
+          <w:sz w:val="24"/>
+          <w:szCs w:val="24"/>
+          <w:highlight w:val="yellow"/>
+          <w:lang w:eastAsia="fr-FR"/>
+          <w14:ligatures w14:val="none"/>
+        </w:rPr>
+        <w:t xml:space="preserve"> Training </w:t>
+      </w:r>
+      <w:proofErr w:type="spellStart"/>
+      <w:r>
+        <w:rPr>
+          <w:rFonts w:ascii="Times New Roman" w:eastAsia="Times New Roman" w:hAnsi="Times New Roman" w:cs="Times New Roman"/>
+          <w:kern w:val="0"/>
+          <w:sz w:val="24"/>
+          <w:szCs w:val="24"/>
+          <w:highlight w:val="yellow"/>
+          <w:lang w:eastAsia="fr-FR"/>
+          <w14:ligatures w14:val="none"/>
+        </w:rPr>
+        <w:t>loop</w:t>
+      </w:r>
+      <w:proofErr w:type="spellEnd"/>
+      <w:r>
+        <w:rPr>
+          <w:rFonts w:ascii="Times New Roman" w:eastAsia="Times New Roman" w:hAnsi="Times New Roman" w:cs="Times New Roman"/>
+          <w:kern w:val="0"/>
+          <w:sz w:val="24"/>
+          <w:szCs w:val="24"/>
+          <w:highlight w:val="yellow"/>
+          <w:lang w:eastAsia="fr-FR"/>
+          <w14:ligatures w14:val="none"/>
+        </w:rPr>
+        <w:t xml:space="preserve">, </w:t>
+      </w:r>
+      <w:proofErr w:type="spellStart"/>
+      <w:r>
+        <w:rPr>
+          <w:rFonts w:ascii="Times New Roman" w:eastAsia="Times New Roman" w:hAnsi="Times New Roman" w:cs="Times New Roman"/>
+          <w:kern w:val="0"/>
+          <w:sz w:val="24"/>
+          <w:szCs w:val="24"/>
+          <w:highlight w:val="yellow"/>
+          <w:lang w:eastAsia="fr-FR"/>
+          <w14:ligatures w14:val="none"/>
+        </w:rPr>
+        <w:t>backpropagation</w:t>
+      </w:r>
+      <w:proofErr w:type="spellEnd"/>
     </w:p>
     <w:p>
       <w:pPr>
@@ -6615,7 +9349,73 @@
           <w:lang w:eastAsia="fr-FR"/>
           <w14:ligatures w14:val="none"/>
         </w:rPr>
-        <w:t>Day 75: Mini project: Digit recognition</w:t>
+        <w:t xml:space="preserve">Day </w:t>
+      </w:r>
+      <w:proofErr w:type="gramStart"/>
+      <w:r>
+        <w:rPr>
+          <w:rFonts w:ascii="Times New Roman" w:eastAsia="Times New Roman" w:hAnsi="Times New Roman" w:cs="Times New Roman"/>
+          <w:kern w:val="0"/>
+          <w:sz w:val="24"/>
+          <w:szCs w:val="24"/>
+          <w:highlight w:val="yellow"/>
+          <w:lang w:eastAsia="fr-FR"/>
+          <w14:ligatures w14:val="none"/>
+        </w:rPr>
+        <w:t>75:</w:t>
+      </w:r>
+      <w:proofErr w:type="gramEnd"/>
+      <w:r>
+        <w:rPr>
+          <w:rFonts w:ascii="Times New Roman" w:eastAsia="Times New Roman" w:hAnsi="Times New Roman" w:cs="Times New Roman"/>
+          <w:kern w:val="0"/>
+          <w:sz w:val="24"/>
+          <w:szCs w:val="24"/>
+          <w:highlight w:val="yellow"/>
+          <w:lang w:eastAsia="fr-FR"/>
+          <w14:ligatures w14:val="none"/>
+        </w:rPr>
+        <w:t xml:space="preserve"> Mini </w:t>
+      </w:r>
+      <w:proofErr w:type="spellStart"/>
+      <w:proofErr w:type="gramStart"/>
+      <w:r>
+        <w:rPr>
+          <w:rFonts w:ascii="Times New Roman" w:eastAsia="Times New Roman" w:hAnsi="Times New Roman" w:cs="Times New Roman"/>
+          <w:kern w:val="0"/>
+          <w:sz w:val="24"/>
+          <w:szCs w:val="24"/>
+          <w:highlight w:val="yellow"/>
+          <w:lang w:eastAsia="fr-FR"/>
+          <w14:ligatures w14:val="none"/>
+        </w:rPr>
+        <w:t>project</w:t>
+      </w:r>
+      <w:proofErr w:type="spellEnd"/>
+      <w:r>
+        <w:rPr>
+          <w:rFonts w:ascii="Times New Roman" w:eastAsia="Times New Roman" w:hAnsi="Times New Roman" w:cs="Times New Roman"/>
+          <w:kern w:val="0"/>
+          <w:sz w:val="24"/>
+          <w:szCs w:val="24"/>
+          <w:highlight w:val="yellow"/>
+          <w:lang w:eastAsia="fr-FR"/>
+          <w14:ligatures w14:val="none"/>
+        </w:rPr>
+        <w:t>:</w:t>
+      </w:r>
+      <w:proofErr w:type="gramEnd"/>
+      <w:r>
+        <w:rPr>
+          <w:rFonts w:ascii="Times New Roman" w:eastAsia="Times New Roman" w:hAnsi="Times New Roman" w:cs="Times New Roman"/>
+          <w:kern w:val="0"/>
+          <w:sz w:val="24"/>
+          <w:szCs w:val="24"/>
+          <w:highlight w:val="yellow"/>
+          <w:lang w:eastAsia="fr-FR"/>
+          <w14:ligatures w14:val="none"/>
+        </w:rPr>
+        <w:t xml:space="preserve"> Digit recognition</w:t>
       </w:r>
     </w:p>
     <w:p>

</xml_diff>